<commit_message>
Add global report source appendix
</commit_message>
<xml_diff>
--- a/output/docx/alina-global-hypothesis-report-v1.docx
+++ b/output/docx/alina-global-hypothesis-report-v1.docx
@@ -31,7 +31,7 @@
     </w:p>
     <w:p>
       <w:r>
-        <w:t>Собрано: 2026-05-31T14:47:49.952Z</w:t>
+        <w:t>Собрано: 2026-05-31T14:58:04.771Z</w:t>
       </w:r>
     </w:p>
     <w:p>
@@ -59,7 +59,7 @@
     </w:p>
     <w:p>
       <w:r>
-        <w:t>На текущем этапе собрано 67,525 raw source rows, 36,694 dedup rows и 451 локальных артефактов. Эти данные нужны не для того, чтобы объявить продукт доказанным, а для последовательной проверки: существует ли рынок, есть ли деньги, насколько плотна конкуренция, где может быть белое пятно, кто аудитория и какую MVP-петлю надо тестировать.</w:t>
+        <w:t>На текущем этапе собрано 67,525 raw source rows, 36,694 dedup rows и 454 локальных артефактов. Эти данные нужны не для того, чтобы объявить продукт доказанным, а для последовательной проверки: существует ли рынок, есть ли деньги, насколько плотна конкуренция, где может быть белое пятно, кто аудитория и какую MVP-петлю надо тестировать.</w:t>
       </w:r>
     </w:p>
     <w:p>
@@ -7101,6 +7101,1160 @@
         <w:pStyle w:val="Heading1"/>
       </w:pPr>
       <w:r>
+        <w:t>ИСТОЧНИКИ И ГРАНИЦЫ ДОКАЗАТЕЛЬСТВ</w:t>
+      </w:r>
+    </w:p>
+    <w:p>
+      <w:r>
+        <w:t>Ниже зафиксирована короткая связка claim -&gt; evidence -&gt; boundary для этой мировой версии отчета. Это не полный manifest всех файлов, а читательский слой: он показывает, какие утверждения можно читать как desk/source support, а какие нельзя усиливать без ручных walkthrough, интервью, прототипных сессий или WTP-проверки.</w:t>
+      </w:r>
+    </w:p>
+    <w:tbl>
+      <w:tblPr>
+        <w:tblW w:type="dxa" w:w="9360"/>
+        <w:jc w:val="left"/>
+        <w:tblLayout w:type="fixed"/>
+        <w:tblLook w:firstColumn="1" w:firstRow="1" w:lastColumn="0" w:lastRow="0" w:noHBand="0" w:noVBand="1" w:val="04A0"/>
+        <w:tblInd w:w="120" w:type="dxa"/>
+        <w:tblBorders>
+          <w:top w:val="single" w:sz="4" w:space="0" w:color="CBD5E1"/>
+          <w:left w:val="single" w:sz="4" w:space="0" w:color="CBD5E1"/>
+          <w:bottom w:val="single" w:sz="4" w:space="0" w:color="CBD5E1"/>
+          <w:right w:val="single" w:sz="4" w:space="0" w:color="CBD5E1"/>
+          <w:insideH w:val="single" w:sz="4" w:space="0" w:color="CBD5E1"/>
+          <w:insideV w:val="single" w:sz="4" w:space="0" w:color="CBD5E1"/>
+        </w:tblBorders>
+      </w:tblPr>
+      <w:tblGrid>
+        <w:gridCol w:w="1872"/>
+        <w:gridCol w:w="1872"/>
+        <w:gridCol w:w="1872"/>
+        <w:gridCol w:w="1872"/>
+        <w:gridCol w:w="1872"/>
+      </w:tblGrid>
+      <w:tr>
+        <w:tc>
+          <w:tcPr>
+            <w:tcW w:type="dxa" w:w="2376"/>
+            <w:vAlign w:val="center"/>
+            <w:tcMar>
+              <w:top w:w="80" w:type="dxa"/>
+              <w:start w:w="120" w:type="dxa"/>
+              <w:bottom w:w="80" w:type="dxa"/>
+              <w:end w:w="120" w:type="dxa"/>
+            </w:tcMar>
+            <w:shd w:fill="E8EEF5"/>
+          </w:tcPr>
+          <w:p>
+            <w:pPr>
+              <w:spacing w:after="0"/>
+              <w:jc w:val="left"/>
+            </w:pPr>
+            <w:r>
+              <w:rPr>
+                <w:rFonts w:ascii="Arial" w:hAnsi="Arial" w:eastAsia="Arial"/>
+                <w:b/>
+                <w:color w:val="111827"/>
+                <w:sz w:val="16"/>
+              </w:rPr>
+              <w:t>Claim</w:t>
+            </w:r>
+          </w:p>
+        </w:tc>
+        <w:tc>
+          <w:tcPr>
+            <w:tcW w:type="dxa" w:w="1224"/>
+            <w:vAlign w:val="center"/>
+            <w:tcMar>
+              <w:top w:w="80" w:type="dxa"/>
+              <w:start w:w="120" w:type="dxa"/>
+              <w:bottom w:w="80" w:type="dxa"/>
+              <w:end w:w="120" w:type="dxa"/>
+            </w:tcMar>
+            <w:shd w:fill="E8EEF5"/>
+          </w:tcPr>
+          <w:p>
+            <w:pPr>
+              <w:spacing w:after="0"/>
+              <w:jc w:val="left"/>
+            </w:pPr>
+            <w:r>
+              <w:rPr>
+                <w:rFonts w:ascii="Arial" w:hAnsi="Arial" w:eastAsia="Arial"/>
+                <w:b/>
+                <w:color w:val="111827"/>
+                <w:sz w:val="16"/>
+              </w:rPr>
+              <w:t>Раздел</w:t>
+            </w:r>
+          </w:p>
+        </w:tc>
+        <w:tc>
+          <w:tcPr>
+            <w:tcW w:type="dxa" w:w="1224"/>
+            <w:vAlign w:val="center"/>
+            <w:tcMar>
+              <w:top w:w="80" w:type="dxa"/>
+              <w:start w:w="120" w:type="dxa"/>
+              <w:bottom w:w="80" w:type="dxa"/>
+              <w:end w:w="120" w:type="dxa"/>
+            </w:tcMar>
+            <w:shd w:fill="E8EEF5"/>
+          </w:tcPr>
+          <w:p>
+            <w:pPr>
+              <w:spacing w:after="0"/>
+              <w:jc w:val="left"/>
+            </w:pPr>
+            <w:r>
+              <w:rPr>
+                <w:rFonts w:ascii="Arial" w:hAnsi="Arial" w:eastAsia="Arial"/>
+                <w:b/>
+                <w:color w:val="111827"/>
+                <w:sz w:val="16"/>
+              </w:rPr>
+              <w:t>Статус</w:t>
+            </w:r>
+          </w:p>
+        </w:tc>
+        <w:tc>
+          <w:tcPr>
+            <w:tcW w:type="dxa" w:w="1944"/>
+            <w:vAlign w:val="center"/>
+            <w:tcMar>
+              <w:top w:w="80" w:type="dxa"/>
+              <w:start w:w="120" w:type="dxa"/>
+              <w:bottom w:w="80" w:type="dxa"/>
+              <w:end w:w="120" w:type="dxa"/>
+            </w:tcMar>
+            <w:shd w:fill="E8EEF5"/>
+          </w:tcPr>
+          <w:p>
+            <w:pPr>
+              <w:spacing w:after="0"/>
+              <w:jc w:val="left"/>
+            </w:pPr>
+            <w:r>
+              <w:rPr>
+                <w:rFonts w:ascii="Arial" w:hAnsi="Arial" w:eastAsia="Arial"/>
+                <w:b/>
+                <w:color w:val="111827"/>
+                <w:sz w:val="16"/>
+              </w:rPr>
+              <w:t>Метрика</w:t>
+            </w:r>
+          </w:p>
+        </w:tc>
+        <w:tc>
+          <w:tcPr>
+            <w:tcW w:type="dxa" w:w="2592"/>
+            <w:vAlign w:val="center"/>
+            <w:tcMar>
+              <w:top w:w="80" w:type="dxa"/>
+              <w:start w:w="120" w:type="dxa"/>
+              <w:bottom w:w="80" w:type="dxa"/>
+              <w:end w:w="120" w:type="dxa"/>
+            </w:tcMar>
+            <w:shd w:fill="E8EEF5"/>
+          </w:tcPr>
+          <w:p>
+            <w:pPr>
+              <w:spacing w:after="0"/>
+              <w:jc w:val="left"/>
+            </w:pPr>
+            <w:r>
+              <w:rPr>
+                <w:rFonts w:ascii="Arial" w:hAnsi="Arial" w:eastAsia="Arial"/>
+                <w:b/>
+                <w:color w:val="111827"/>
+                <w:sz w:val="16"/>
+              </w:rPr>
+              <w:t>Граница</w:t>
+            </w:r>
+          </w:p>
+        </w:tc>
+      </w:tr>
+      <w:tr>
+        <w:tc>
+          <w:tcPr>
+            <w:tcW w:type="dxa" w:w="2376"/>
+            <w:vAlign w:val="center"/>
+            <w:tcMar>
+              <w:top w:w="80" w:type="dxa"/>
+              <w:start w:w="120" w:type="dxa"/>
+              <w:bottom w:w="80" w:type="dxa"/>
+              <w:end w:w="120" w:type="dxa"/>
+            </w:tcMar>
+          </w:tcPr>
+          <w:p>
+            <w:pPr>
+              <w:spacing w:after="0"/>
+              <w:jc w:val="left"/>
+            </w:pPr>
+            <w:r>
+              <w:rPr>
+                <w:rFonts w:ascii="Arial" w:hAnsi="Arial" w:eastAsia="Arial"/>
+                <w:b w:val="0"/>
+                <w:color w:val="111827"/>
+                <w:sz w:val="16"/>
+              </w:rPr>
+              <w:t>SRC_01_PROJECT_AND_SCALE</w:t>
+            </w:r>
+          </w:p>
+        </w:tc>
+        <w:tc>
+          <w:tcPr>
+            <w:tcW w:type="dxa" w:w="1224"/>
+            <w:vAlign w:val="center"/>
+            <w:tcMar>
+              <w:top w:w="80" w:type="dxa"/>
+              <w:start w:w="120" w:type="dxa"/>
+              <w:bottom w:w="80" w:type="dxa"/>
+              <w:end w:w="120" w:type="dxa"/>
+            </w:tcMar>
+          </w:tcPr>
+          <w:p>
+            <w:pPr>
+              <w:spacing w:after="0"/>
+              <w:jc w:val="left"/>
+            </w:pPr>
+            <w:r>
+              <w:rPr>
+                <w:rFonts w:ascii="Arial" w:hAnsi="Arial" w:eastAsia="Arial"/>
+                <w:b w:val="0"/>
+                <w:color w:val="111827"/>
+                <w:sz w:val="16"/>
+              </w:rPr>
+              <w:t>Описание проекта и гипотеза #1</w:t>
+            </w:r>
+          </w:p>
+        </w:tc>
+        <w:tc>
+          <w:tcPr>
+            <w:tcW w:type="dxa" w:w="1224"/>
+            <w:vAlign w:val="center"/>
+            <w:tcMar>
+              <w:top w:w="80" w:type="dxa"/>
+              <w:start w:w="120" w:type="dxa"/>
+              <w:bottom w:w="80" w:type="dxa"/>
+              <w:end w:w="120" w:type="dxa"/>
+            </w:tcMar>
+          </w:tcPr>
+          <w:p>
+            <w:pPr>
+              <w:spacing w:after="0"/>
+              <w:jc w:val="left"/>
+            </w:pPr>
+            <w:r>
+              <w:rPr>
+                <w:rFonts w:ascii="Arial" w:hAnsi="Arial" w:eastAsia="Arial"/>
+                <w:b w:val="0"/>
+                <w:color w:val="111827"/>
+                <w:sz w:val="16"/>
+              </w:rPr>
+              <w:t>доказано как исследовательский слой</w:t>
+            </w:r>
+          </w:p>
+        </w:tc>
+        <w:tc>
+          <w:tcPr>
+            <w:tcW w:type="dxa" w:w="1944"/>
+            <w:vAlign w:val="center"/>
+            <w:tcMar>
+              <w:top w:w="80" w:type="dxa"/>
+              <w:start w:w="120" w:type="dxa"/>
+              <w:bottom w:w="80" w:type="dxa"/>
+              <w:end w:w="120" w:type="dxa"/>
+            </w:tcMar>
+          </w:tcPr>
+          <w:p>
+            <w:pPr>
+              <w:spacing w:after="0"/>
+              <w:jc w:val="left"/>
+            </w:pPr>
+            <w:r>
+              <w:rPr>
+                <w:rFonts w:ascii="Arial" w:hAnsi="Arial" w:eastAsia="Arial"/>
+                <w:b w:val="0"/>
+                <w:color w:val="111827"/>
+                <w:sz w:val="16"/>
+              </w:rPr>
+              <w:t>67525 cross-source raw rows; 36694 cross-source dedup rows; 39 coverage cells; 11 strong and 12 medium source/market cells</w:t>
+            </w:r>
+          </w:p>
+        </w:tc>
+        <w:tc>
+          <w:tcPr>
+            <w:tcW w:type="dxa" w:w="2592"/>
+            <w:vAlign w:val="center"/>
+            <w:tcMar>
+              <w:top w:w="80" w:type="dxa"/>
+              <w:start w:w="120" w:type="dxa"/>
+              <w:bottom w:w="80" w:type="dxa"/>
+              <w:end w:w="120" w:type="dxa"/>
+            </w:tcMar>
+          </w:tcPr>
+          <w:p>
+            <w:pPr>
+              <w:spacing w:after="0"/>
+              <w:jc w:val="left"/>
+            </w:pPr>
+            <w:r>
+              <w:rPr>
+                <w:rFonts w:ascii="Arial" w:hAnsi="Arial" w:eastAsia="Arial"/>
+                <w:b w:val="0"/>
+                <w:color w:val="111827"/>
+                <w:sz w:val="16"/>
+              </w:rPr>
+              <w:t>Это source/discovery coverage, а не ручная проверка каждого конкурента и не proof спроса.</w:t>
+            </w:r>
+          </w:p>
+        </w:tc>
+      </w:tr>
+      <w:tr>
+        <w:tc>
+          <w:tcPr>
+            <w:tcW w:type="dxa" w:w="2376"/>
+            <w:vAlign w:val="center"/>
+            <w:tcMar>
+              <w:top w:w="80" w:type="dxa"/>
+              <w:start w:w="120" w:type="dxa"/>
+              <w:bottom w:w="80" w:type="dxa"/>
+              <w:end w:w="120" w:type="dxa"/>
+            </w:tcMar>
+            <w:shd w:fill="F8FAFC"/>
+          </w:tcPr>
+          <w:p>
+            <w:pPr>
+              <w:spacing w:after="0"/>
+              <w:jc w:val="left"/>
+            </w:pPr>
+            <w:r>
+              <w:rPr>
+                <w:rFonts w:ascii="Arial" w:hAnsi="Arial" w:eastAsia="Arial"/>
+                <w:b w:val="0"/>
+                <w:color w:val="111827"/>
+                <w:sz w:val="16"/>
+              </w:rPr>
+              <w:t>SRC_02_MARKET_SIZING</w:t>
+            </w:r>
+          </w:p>
+        </w:tc>
+        <w:tc>
+          <w:tcPr>
+            <w:tcW w:type="dxa" w:w="1224"/>
+            <w:vAlign w:val="center"/>
+            <w:tcMar>
+              <w:top w:w="80" w:type="dxa"/>
+              <w:start w:w="120" w:type="dxa"/>
+              <w:bottom w:w="80" w:type="dxa"/>
+              <w:end w:w="120" w:type="dxa"/>
+            </w:tcMar>
+            <w:shd w:fill="F8FAFC"/>
+          </w:tcPr>
+          <w:p>
+            <w:pPr>
+              <w:spacing w:after="0"/>
+              <w:jc w:val="left"/>
+            </w:pPr>
+            <w:r>
+              <w:rPr>
+                <w:rFonts w:ascii="Arial" w:hAnsi="Arial" w:eastAsia="Arial"/>
+                <w:b w:val="0"/>
+                <w:color w:val="111827"/>
+                <w:sz w:val="16"/>
+              </w:rPr>
+              <w:t>Определение мировых целевых рынков и гипотеза #2</w:t>
+            </w:r>
+          </w:p>
+        </w:tc>
+        <w:tc>
+          <w:tcPr>
+            <w:tcW w:type="dxa" w:w="1224"/>
+            <w:vAlign w:val="center"/>
+            <w:tcMar>
+              <w:top w:w="80" w:type="dxa"/>
+              <w:start w:w="120" w:type="dxa"/>
+              <w:bottom w:w="80" w:type="dxa"/>
+              <w:end w:w="120" w:type="dxa"/>
+            </w:tcMar>
+            <w:shd w:fill="F8FAFC"/>
+          </w:tcPr>
+          <w:p>
+            <w:pPr>
+              <w:spacing w:after="0"/>
+              <w:jc w:val="left"/>
+            </w:pPr>
+            <w:r>
+              <w:rPr>
+                <w:rFonts w:ascii="Arial" w:hAnsi="Arial" w:eastAsia="Arial"/>
+                <w:b w:val="0"/>
+                <w:color w:val="111827"/>
+                <w:sz w:val="16"/>
+              </w:rPr>
+              <w:t>поддержано направленно, но не финальный revenue/WTP proof</w:t>
+            </w:r>
+          </w:p>
+        </w:tc>
+        <w:tc>
+          <w:tcPr>
+            <w:tcW w:type="dxa" w:w="1944"/>
+            <w:vAlign w:val="center"/>
+            <w:tcMar>
+              <w:top w:w="80" w:type="dxa"/>
+              <w:start w:w="120" w:type="dxa"/>
+              <w:bottom w:w="80" w:type="dxa"/>
+              <w:end w:w="120" w:type="dxa"/>
+            </w:tcMar>
+            <w:shd w:fill="F8FAFC"/>
+          </w:tcPr>
+          <w:p>
+            <w:pPr>
+              <w:spacing w:after="0"/>
+              <w:jc w:val="left"/>
+            </w:pPr>
+            <w:r>
+              <w:rPr>
+                <w:rFonts w:ascii="Arial" w:hAnsi="Arial" w:eastAsia="Arial"/>
+                <w:b w:val="0"/>
+                <w:color w:val="111827"/>
+                <w:sz w:val="16"/>
+              </w:rPr>
+              <w:t>6 market rows; 3 strong and 1 medium directional money cases</w:t>
+            </w:r>
+          </w:p>
+        </w:tc>
+        <w:tc>
+          <w:tcPr>
+            <w:tcW w:type="dxa" w:w="2592"/>
+            <w:vAlign w:val="center"/>
+            <w:tcMar>
+              <w:top w:w="80" w:type="dxa"/>
+              <w:start w:w="120" w:type="dxa"/>
+              <w:bottom w:w="80" w:type="dxa"/>
+              <w:end w:w="120" w:type="dxa"/>
+            </w:tcMar>
+            <w:shd w:fill="F8FAFC"/>
+          </w:tcPr>
+          <w:p>
+            <w:pPr>
+              <w:spacing w:after="0"/>
+              <w:jc w:val="left"/>
+            </w:pPr>
+            <w:r>
+              <w:rPr>
+                <w:rFonts w:ascii="Arial" w:hAnsi="Arial" w:eastAsia="Arial"/>
+                <w:b w:val="0"/>
+                <w:color w:val="111827"/>
+                <w:sz w:val="16"/>
+              </w:rPr>
+              <w:t>Market reports часто broad-category/paywalled; использовать как range-based sizing, не как прогноз выручки Alina.</w:t>
+            </w:r>
+          </w:p>
+        </w:tc>
+      </w:tr>
+      <w:tr>
+        <w:tc>
+          <w:tcPr>
+            <w:tcW w:type="dxa" w:w="2376"/>
+            <w:vAlign w:val="center"/>
+            <w:tcMar>
+              <w:top w:w="80" w:type="dxa"/>
+              <w:start w:w="120" w:type="dxa"/>
+              <w:bottom w:w="80" w:type="dxa"/>
+              <w:end w:w="120" w:type="dxa"/>
+            </w:tcMar>
+          </w:tcPr>
+          <w:p>
+            <w:pPr>
+              <w:spacing w:after="0"/>
+              <w:jc w:val="left"/>
+            </w:pPr>
+            <w:r>
+              <w:rPr>
+                <w:rFonts w:ascii="Arial" w:hAnsi="Arial" w:eastAsia="Arial"/>
+                <w:b w:val="0"/>
+                <w:color w:val="111827"/>
+                <w:sz w:val="16"/>
+              </w:rPr>
+              <w:t>SRC_03_COMPETITORS</w:t>
+            </w:r>
+          </w:p>
+        </w:tc>
+        <w:tc>
+          <w:tcPr>
+            <w:tcW w:type="dxa" w:w="1224"/>
+            <w:vAlign w:val="center"/>
+            <w:tcMar>
+              <w:top w:w="80" w:type="dxa"/>
+              <w:start w:w="120" w:type="dxa"/>
+              <w:bottom w:w="80" w:type="dxa"/>
+              <w:end w:w="120" w:type="dxa"/>
+            </w:tcMar>
+          </w:tcPr>
+          <w:p>
+            <w:pPr>
+              <w:spacing w:after="0"/>
+              <w:jc w:val="left"/>
+            </w:pPr>
+            <w:r>
+              <w:rPr>
+                <w:rFonts w:ascii="Arial" w:hAnsi="Arial" w:eastAsia="Arial"/>
+                <w:b w:val="0"/>
+                <w:color w:val="111827"/>
+                <w:sz w:val="16"/>
+              </w:rPr>
+              <w:t>Определение конкурентов и гипотеза #3</w:t>
+            </w:r>
+          </w:p>
+        </w:tc>
+        <w:tc>
+          <w:tcPr>
+            <w:tcW w:type="dxa" w:w="1224"/>
+            <w:vAlign w:val="center"/>
+            <w:tcMar>
+              <w:top w:w="80" w:type="dxa"/>
+              <w:start w:w="120" w:type="dxa"/>
+              <w:bottom w:w="80" w:type="dxa"/>
+              <w:end w:w="120" w:type="dxa"/>
+            </w:tcMar>
+          </w:tcPr>
+          <w:p>
+            <w:pPr>
+              <w:spacing w:after="0"/>
+              <w:jc w:val="left"/>
+            </w:pPr>
+            <w:r>
+              <w:rPr>
+                <w:rFonts w:ascii="Arial" w:hAnsi="Arial" w:eastAsia="Arial"/>
+                <w:b w:val="0"/>
+                <w:color w:val="111827"/>
+                <w:sz w:val="16"/>
+              </w:rPr>
+              <w:t>готово к проверке, gate открыт</w:t>
+            </w:r>
+          </w:p>
+        </w:tc>
+        <w:tc>
+          <w:tcPr>
+            <w:tcW w:type="dxa" w:w="1944"/>
+            <w:vAlign w:val="center"/>
+            <w:tcMar>
+              <w:top w:w="80" w:type="dxa"/>
+              <w:start w:w="120" w:type="dxa"/>
+              <w:bottom w:w="80" w:type="dxa"/>
+              <w:end w:w="120" w:type="dxa"/>
+            </w:tcMar>
+          </w:tcPr>
+          <w:p>
+            <w:pPr>
+              <w:spacing w:after="0"/>
+              <w:jc w:val="left"/>
+            </w:pPr>
+            <w:r>
+              <w:rPr>
+                <w:rFonts w:ascii="Arial" w:hAnsi="Arial" w:eastAsia="Arial"/>
+                <w:b w:val="0"/>
+                <w:color w:val="111827"/>
+                <w:sz w:val="16"/>
+              </w:rPr>
+              <w:t>100 top-candidate rows; 90 primary apps; 12 P0 inspection targets; 12 public listings inspected</w:t>
+            </w:r>
+          </w:p>
+        </w:tc>
+        <w:tc>
+          <w:tcPr>
+            <w:tcW w:type="dxa" w:w="2592"/>
+            <w:vAlign w:val="center"/>
+            <w:tcMar>
+              <w:top w:w="80" w:type="dxa"/>
+              <w:start w:w="120" w:type="dxa"/>
+              <w:bottom w:w="80" w:type="dxa"/>
+              <w:end w:w="120" w:type="dxa"/>
+            </w:tcMar>
+          </w:tcPr>
+          <w:p>
+            <w:pPr>
+              <w:spacing w:after="0"/>
+              <w:jc w:val="left"/>
+            </w:pPr>
+            <w:r>
+              <w:rPr>
+                <w:rFonts w:ascii="Arial" w:hAnsi="Arial" w:eastAsia="Arial"/>
+                <w:b w:val="0"/>
+                <w:color w:val="111827"/>
+                <w:sz w:val="16"/>
+              </w:rPr>
+              <w:t>Public listings и scorecards не заменяют app/onboarding walkthrough screenshots.</w:t>
+            </w:r>
+          </w:p>
+        </w:tc>
+      </w:tr>
+      <w:tr>
+        <w:tc>
+          <w:tcPr>
+            <w:tcW w:type="dxa" w:w="2376"/>
+            <w:vAlign w:val="center"/>
+            <w:tcMar>
+              <w:top w:w="80" w:type="dxa"/>
+              <w:start w:w="120" w:type="dxa"/>
+              <w:bottom w:w="80" w:type="dxa"/>
+              <w:end w:w="120" w:type="dxa"/>
+            </w:tcMar>
+            <w:shd w:fill="F8FAFC"/>
+          </w:tcPr>
+          <w:p>
+            <w:pPr>
+              <w:spacing w:after="0"/>
+              <w:jc w:val="left"/>
+            </w:pPr>
+            <w:r>
+              <w:rPr>
+                <w:rFonts w:ascii="Arial" w:hAnsi="Arial" w:eastAsia="Arial"/>
+                <w:b w:val="0"/>
+                <w:color w:val="111827"/>
+                <w:sz w:val="16"/>
+              </w:rPr>
+              <w:t>SRC_04_WHITESPACE</w:t>
+            </w:r>
+          </w:p>
+        </w:tc>
+        <w:tc>
+          <w:tcPr>
+            <w:tcW w:type="dxa" w:w="1224"/>
+            <w:vAlign w:val="center"/>
+            <w:tcMar>
+              <w:top w:w="80" w:type="dxa"/>
+              <w:start w:w="120" w:type="dxa"/>
+              <w:bottom w:w="80" w:type="dxa"/>
+              <w:end w:w="120" w:type="dxa"/>
+            </w:tcMar>
+            <w:shd w:fill="F8FAFC"/>
+          </w:tcPr>
+          <w:p>
+            <w:pPr>
+              <w:spacing w:after="0"/>
+              <w:jc w:val="left"/>
+            </w:pPr>
+            <w:r>
+              <w:rPr>
+                <w:rFonts w:ascii="Arial" w:hAnsi="Arial" w:eastAsia="Arial"/>
+                <w:b w:val="0"/>
+                <w:color w:val="111827"/>
+                <w:sz w:val="16"/>
+              </w:rPr>
+              <w:t>Где дыры и возможность отличиться</w:t>
+            </w:r>
+          </w:p>
+        </w:tc>
+        <w:tc>
+          <w:tcPr>
+            <w:tcW w:type="dxa" w:w="1224"/>
+            <w:vAlign w:val="center"/>
+            <w:tcMar>
+              <w:top w:w="80" w:type="dxa"/>
+              <w:start w:w="120" w:type="dxa"/>
+              <w:bottom w:w="80" w:type="dxa"/>
+              <w:end w:w="120" w:type="dxa"/>
+            </w:tcMar>
+            <w:shd w:fill="F8FAFC"/>
+          </w:tcPr>
+          <w:p>
+            <w:pPr>
+              <w:spacing w:after="0"/>
+              <w:jc w:val="left"/>
+            </w:pPr>
+            <w:r>
+              <w:rPr>
+                <w:rFonts w:ascii="Arial" w:hAnsi="Arial" w:eastAsia="Arial"/>
+                <w:b w:val="0"/>
+                <w:color w:val="111827"/>
+                <w:sz w:val="16"/>
+              </w:rPr>
+              <w:t>поддержано направленно, но не финально доказано</w:t>
+            </w:r>
+          </w:p>
+        </w:tc>
+        <w:tc>
+          <w:tcPr>
+            <w:tcW w:type="dxa" w:w="1944"/>
+            <w:vAlign w:val="center"/>
+            <w:tcMar>
+              <w:top w:w="80" w:type="dxa"/>
+              <w:start w:w="120" w:type="dxa"/>
+              <w:bottom w:w="80" w:type="dxa"/>
+              <w:end w:w="120" w:type="dxa"/>
+            </w:tcMar>
+            <w:shd w:fill="F8FAFC"/>
+          </w:tcPr>
+          <w:p>
+            <w:pPr>
+              <w:spacing w:after="0"/>
+              <w:jc w:val="left"/>
+            </w:pPr>
+            <w:r>
+              <w:rPr>
+                <w:rFonts w:ascii="Arial" w:hAnsi="Arial" w:eastAsia="Arial"/>
+                <w:b w:val="0"/>
+                <w:color w:val="111827"/>
+                <w:sz w:val="16"/>
+              </w:rPr>
+              <w:t>1/100 strict behavior-tied progression signals; 6 cross-source saturation markets; 2 benchmark-only markets; 12 P0 apps queued</w:t>
+            </w:r>
+          </w:p>
+        </w:tc>
+        <w:tc>
+          <w:tcPr>
+            <w:tcW w:type="dxa" w:w="2592"/>
+            <w:vAlign w:val="center"/>
+            <w:tcMar>
+              <w:top w:w="80" w:type="dxa"/>
+              <w:start w:w="120" w:type="dxa"/>
+              <w:bottom w:w="80" w:type="dxa"/>
+              <w:end w:w="120" w:type="dxa"/>
+            </w:tcMar>
+            <w:shd w:fill="F8FAFC"/>
+          </w:tcPr>
+          <w:p>
+            <w:pPr>
+              <w:spacing w:after="0"/>
+              <w:jc w:val="left"/>
+            </w:pPr>
+            <w:r>
+              <w:rPr>
+                <w:rFonts w:ascii="Arial" w:hAnsi="Arial" w:eastAsia="Arial"/>
+                <w:b w:val="0"/>
+                <w:color w:val="111827"/>
+                <w:sz w:val="16"/>
+              </w:rPr>
+              <w:t>Whitespace нельзя апгрейдить без manual walkthrough и final verdict_after_inspection.</w:t>
+            </w:r>
+          </w:p>
+        </w:tc>
+      </w:tr>
+      <w:tr>
+        <w:tc>
+          <w:tcPr>
+            <w:tcW w:type="dxa" w:w="2376"/>
+            <w:vAlign w:val="center"/>
+            <w:tcMar>
+              <w:top w:w="80" w:type="dxa"/>
+              <w:start w:w="120" w:type="dxa"/>
+              <w:bottom w:w="80" w:type="dxa"/>
+              <w:end w:w="120" w:type="dxa"/>
+            </w:tcMar>
+          </w:tcPr>
+          <w:p>
+            <w:pPr>
+              <w:spacing w:after="0"/>
+              <w:jc w:val="left"/>
+            </w:pPr>
+            <w:r>
+              <w:rPr>
+                <w:rFonts w:ascii="Arial" w:hAnsi="Arial" w:eastAsia="Arial"/>
+                <w:b w:val="0"/>
+                <w:color w:val="111827"/>
+                <w:sz w:val="16"/>
+              </w:rPr>
+              <w:t>SRC_05_AUDIENCE</w:t>
+            </w:r>
+          </w:p>
+        </w:tc>
+        <w:tc>
+          <w:tcPr>
+            <w:tcW w:type="dxa" w:w="1224"/>
+            <w:vAlign w:val="center"/>
+            <w:tcMar>
+              <w:top w:w="80" w:type="dxa"/>
+              <w:start w:w="120" w:type="dxa"/>
+              <w:bottom w:w="80" w:type="dxa"/>
+              <w:end w:w="120" w:type="dxa"/>
+            </w:tcMar>
+          </w:tcPr>
+          <w:p>
+            <w:pPr>
+              <w:spacing w:after="0"/>
+              <w:jc w:val="left"/>
+            </w:pPr>
+            <w:r>
+              <w:rPr>
+                <w:rFonts w:ascii="Arial" w:hAnsi="Arial" w:eastAsia="Arial"/>
+                <w:b w:val="0"/>
+                <w:color w:val="111827"/>
+                <w:sz w:val="16"/>
+              </w:rPr>
+              <w:t>Аудитория, интервью и гипотеза #4</w:t>
+            </w:r>
+          </w:p>
+        </w:tc>
+        <w:tc>
+          <w:tcPr>
+            <w:tcW w:type="dxa" w:w="1224"/>
+            <w:vAlign w:val="center"/>
+            <w:tcMar>
+              <w:top w:w="80" w:type="dxa"/>
+              <w:start w:w="120" w:type="dxa"/>
+              <w:bottom w:w="80" w:type="dxa"/>
+              <w:end w:w="120" w:type="dxa"/>
+            </w:tcMar>
+          </w:tcPr>
+          <w:p>
+            <w:pPr>
+              <w:spacing w:after="0"/>
+              <w:jc w:val="left"/>
+            </w:pPr>
+            <w:r>
+              <w:rPr>
+                <w:rFonts w:ascii="Arial" w:hAnsi="Arial" w:eastAsia="Arial"/>
+                <w:b w:val="0"/>
+                <w:color w:val="111827"/>
+                <w:sz w:val="16"/>
+              </w:rPr>
+              <w:t>поддержано направленно, но не финально доказано</w:t>
+            </w:r>
+          </w:p>
+        </w:tc>
+        <w:tc>
+          <w:tcPr>
+            <w:tcW w:type="dxa" w:w="1944"/>
+            <w:vAlign w:val="center"/>
+            <w:tcMar>
+              <w:top w:w="80" w:type="dxa"/>
+              <w:start w:w="120" w:type="dxa"/>
+              <w:bottom w:w="80" w:type="dxa"/>
+              <w:end w:w="120" w:type="dxa"/>
+            </w:tcMar>
+          </w:tcPr>
+          <w:p>
+            <w:pPr>
+              <w:spacing w:after="0"/>
+              <w:jc w:val="left"/>
+            </w:pPr>
+            <w:r>
+              <w:rPr>
+                <w:rFonts w:ascii="Arial" w:hAnsi="Arial" w:eastAsia="Arial"/>
+                <w:b w:val="0"/>
+                <w:color w:val="111827"/>
+                <w:sz w:val="16"/>
+              </w:rPr>
+              <w:t>20492 audience signal rows; 294 community/referral rows; 2339 coded Reddit mention rows; 1852 Reddit manual-read queue rows; 574 Reddit capture rows; 6 ICP segment hypotheses; 36 ICP validation tests; 24 ICP recruiting bridge rows</w:t>
+            </w:r>
+          </w:p>
+        </w:tc>
+        <w:tc>
+          <w:tcPr>
+            <w:tcW w:type="dxa" w:w="2592"/>
+            <w:vAlign w:val="center"/>
+            <w:tcMar>
+              <w:top w:w="80" w:type="dxa"/>
+              <w:start w:w="120" w:type="dxa"/>
+              <w:bottom w:w="80" w:type="dxa"/>
+              <w:end w:w="120" w:type="dxa"/>
+            </w:tcMar>
+          </w:tcPr>
+          <w:p>
+            <w:pPr>
+              <w:spacing w:after="0"/>
+              <w:jc w:val="left"/>
+            </w:pPr>
+            <w:r>
+              <w:rPr>
+                <w:rFonts w:ascii="Arial" w:hAnsi="Arial" w:eastAsia="Arial"/>
+                <w:b w:val="0"/>
+                <w:color w:val="111827"/>
+                <w:sz w:val="16"/>
+              </w:rPr>
+              <w:t>Audience rows и Reddit/forum signals не являются representative survey и не заменяют recent-behavior interviews.</w:t>
+            </w:r>
+          </w:p>
+        </w:tc>
+      </w:tr>
+      <w:tr>
+        <w:tc>
+          <w:tcPr>
+            <w:tcW w:type="dxa" w:w="2376"/>
+            <w:vAlign w:val="center"/>
+            <w:tcMar>
+              <w:top w:w="80" w:type="dxa"/>
+              <w:start w:w="120" w:type="dxa"/>
+              <w:bottom w:w="80" w:type="dxa"/>
+              <w:end w:w="120" w:type="dxa"/>
+            </w:tcMar>
+            <w:shd w:fill="F8FAFC"/>
+          </w:tcPr>
+          <w:p>
+            <w:pPr>
+              <w:spacing w:after="0"/>
+              <w:jc w:val="left"/>
+            </w:pPr>
+            <w:r>
+              <w:rPr>
+                <w:rFonts w:ascii="Arial" w:hAnsi="Arial" w:eastAsia="Arial"/>
+                <w:b w:val="0"/>
+                <w:color w:val="111827"/>
+                <w:sz w:val="16"/>
+              </w:rPr>
+              <w:t>SRC_06_PRODUCT_CORE</w:t>
+            </w:r>
+          </w:p>
+        </w:tc>
+        <w:tc>
+          <w:tcPr>
+            <w:tcW w:type="dxa" w:w="1224"/>
+            <w:vAlign w:val="center"/>
+            <w:tcMar>
+              <w:top w:w="80" w:type="dxa"/>
+              <w:start w:w="120" w:type="dxa"/>
+              <w:bottom w:w="80" w:type="dxa"/>
+              <w:end w:w="120" w:type="dxa"/>
+            </w:tcMar>
+            <w:shd w:fill="F8FAFC"/>
+          </w:tcPr>
+          <w:p>
+            <w:pPr>
+              <w:spacing w:after="0"/>
+              <w:jc w:val="left"/>
+            </w:pPr>
+            <w:r>
+              <w:rPr>
+                <w:rFonts w:ascii="Arial" w:hAnsi="Arial" w:eastAsia="Arial"/>
+                <w:b w:val="0"/>
+                <w:color w:val="111827"/>
+                <w:sz w:val="16"/>
+              </w:rPr>
+              <w:t>Итоговая модель продукта и гипотеза #5</w:t>
+            </w:r>
+          </w:p>
+        </w:tc>
+        <w:tc>
+          <w:tcPr>
+            <w:tcW w:type="dxa" w:w="1224"/>
+            <w:vAlign w:val="center"/>
+            <w:tcMar>
+              <w:top w:w="80" w:type="dxa"/>
+              <w:start w:w="120" w:type="dxa"/>
+              <w:bottom w:w="80" w:type="dxa"/>
+              <w:end w:w="120" w:type="dxa"/>
+            </w:tcMar>
+            <w:shd w:fill="F8FAFC"/>
+          </w:tcPr>
+          <w:p>
+            <w:pPr>
+              <w:spacing w:after="0"/>
+              <w:jc w:val="left"/>
+            </w:pPr>
+            <w:r>
+              <w:rPr>
+                <w:rFonts w:ascii="Arial" w:hAnsi="Arial" w:eastAsia="Arial"/>
+                <w:b w:val="0"/>
+                <w:color w:val="111827"/>
+                <w:sz w:val="16"/>
+              </w:rPr>
+              <w:t>поддержано направленно, но не финально доказано</w:t>
+            </w:r>
+          </w:p>
+        </w:tc>
+        <w:tc>
+          <w:tcPr>
+            <w:tcW w:type="dxa" w:w="1944"/>
+            <w:vAlign w:val="center"/>
+            <w:tcMar>
+              <w:top w:w="80" w:type="dxa"/>
+              <w:start w:w="120" w:type="dxa"/>
+              <w:bottom w:w="80" w:type="dxa"/>
+              <w:end w:w="120" w:type="dxa"/>
+            </w:tcMar>
+            <w:shd w:fill="F8FAFC"/>
+          </w:tcPr>
+          <w:p>
+            <w:pPr>
+              <w:spacing w:after="0"/>
+              <w:jc w:val="left"/>
+            </w:pPr>
+            <w:r>
+              <w:rPr>
+                <w:rFonts w:ascii="Arial" w:hAnsi="Arial" w:eastAsia="Arial"/>
+                <w:b w:val="0"/>
+                <w:color w:val="111827"/>
+                <w:sz w:val="16"/>
+              </w:rPr>
+              <w:t>12552 feature matrix rows; 100 product-core rows; 8 prototype screens</w:t>
+            </w:r>
+          </w:p>
+        </w:tc>
+        <w:tc>
+          <w:tcPr>
+            <w:tcW w:type="dxa" w:w="2592"/>
+            <w:vAlign w:val="center"/>
+            <w:tcMar>
+              <w:top w:w="80" w:type="dxa"/>
+              <w:start w:w="120" w:type="dxa"/>
+              <w:bottom w:w="80" w:type="dxa"/>
+              <w:end w:w="120" w:type="dxa"/>
+            </w:tcMar>
+            <w:shd w:fill="F8FAFC"/>
+          </w:tcPr>
+          <w:p>
+            <w:pPr>
+              <w:spacing w:after="0"/>
+              <w:jc w:val="left"/>
+            </w:pPr>
+            <w:r>
+              <w:rPr>
+                <w:rFonts w:ascii="Arial" w:hAnsi="Arial" w:eastAsia="Arial"/>
+                <w:b w:val="0"/>
+                <w:color w:val="111827"/>
+                <w:sz w:val="16"/>
+              </w:rPr>
+              <w:t>Product core не считается доказанным без заполненных prototype_session_capture_sheet и scorecard.</w:t>
+            </w:r>
+          </w:p>
+        </w:tc>
+      </w:tr>
+      <w:tr>
+        <w:tc>
+          <w:tcPr>
+            <w:tcW w:type="dxa" w:w="2376"/>
+            <w:vAlign w:val="center"/>
+            <w:tcMar>
+              <w:top w:w="80" w:type="dxa"/>
+              <w:start w:w="120" w:type="dxa"/>
+              <w:bottom w:w="80" w:type="dxa"/>
+              <w:end w:w="120" w:type="dxa"/>
+            </w:tcMar>
+          </w:tcPr>
+          <w:p>
+            <w:pPr>
+              <w:spacing w:after="0"/>
+              <w:jc w:val="left"/>
+            </w:pPr>
+            <w:r>
+              <w:rPr>
+                <w:rFonts w:ascii="Arial" w:hAnsi="Arial" w:eastAsia="Arial"/>
+                <w:b w:val="0"/>
+                <w:color w:val="111827"/>
+                <w:sz w:val="16"/>
+              </w:rPr>
+              <w:t>SRC_07_PROVENANCE</w:t>
+            </w:r>
+          </w:p>
+        </w:tc>
+        <w:tc>
+          <w:tcPr>
+            <w:tcW w:type="dxa" w:w="1224"/>
+            <w:vAlign w:val="center"/>
+            <w:tcMar>
+              <w:top w:w="80" w:type="dxa"/>
+              <w:start w:w="120" w:type="dxa"/>
+              <w:bottom w:w="80" w:type="dxa"/>
+              <w:end w:w="120" w:type="dxa"/>
+            </w:tcMar>
+          </w:tcPr>
+          <w:p>
+            <w:pPr>
+              <w:spacing w:after="0"/>
+              <w:jc w:val="left"/>
+            </w:pPr>
+            <w:r>
+              <w:rPr>
+                <w:rFonts w:ascii="Arial" w:hAnsi="Arial" w:eastAsia="Arial"/>
+                <w:b w:val="0"/>
+                <w:color w:val="111827"/>
+                <w:sz w:val="16"/>
+              </w:rPr>
+              <w:t>Источники и границы доказательств</w:t>
+            </w:r>
+          </w:p>
+        </w:tc>
+        <w:tc>
+          <w:tcPr>
+            <w:tcW w:type="dxa" w:w="1224"/>
+            <w:vAlign w:val="center"/>
+            <w:tcMar>
+              <w:top w:w="80" w:type="dxa"/>
+              <w:start w:w="120" w:type="dxa"/>
+              <w:bottom w:w="80" w:type="dxa"/>
+              <w:end w:w="120" w:type="dxa"/>
+            </w:tcMar>
+          </w:tcPr>
+          <w:p>
+            <w:pPr>
+              <w:spacing w:after="0"/>
+              <w:jc w:val="left"/>
+            </w:pPr>
+            <w:r>
+              <w:rPr>
+                <w:rFonts w:ascii="Arial" w:hAnsi="Arial" w:eastAsia="Arial"/>
+                <w:b w:val="0"/>
+                <w:color w:val="111827"/>
+                <w:sz w:val="16"/>
+              </w:rPr>
+              <w:t>доказано как исследовательский слой</w:t>
+            </w:r>
+          </w:p>
+        </w:tc>
+        <w:tc>
+          <w:tcPr>
+            <w:tcW w:type="dxa" w:w="1944"/>
+            <w:vAlign w:val="center"/>
+            <w:tcMar>
+              <w:top w:w="80" w:type="dxa"/>
+              <w:start w:w="120" w:type="dxa"/>
+              <w:bottom w:w="80" w:type="dxa"/>
+              <w:end w:w="120" w:type="dxa"/>
+            </w:tcMar>
+          </w:tcPr>
+          <w:p>
+            <w:pPr>
+              <w:spacing w:after="0"/>
+              <w:jc w:val="left"/>
+            </w:pPr>
+            <w:r>
+              <w:rPr>
+                <w:rFonts w:ascii="Arial" w:hAnsi="Arial" w:eastAsia="Arial"/>
+                <w:b w:val="0"/>
+                <w:color w:val="111827"/>
+                <w:sz w:val="16"/>
+              </w:rPr>
+              <w:t>454 manifest artifacts; missing=0</w:t>
+            </w:r>
+          </w:p>
+        </w:tc>
+        <w:tc>
+          <w:tcPr>
+            <w:tcW w:type="dxa" w:w="2592"/>
+            <w:vAlign w:val="center"/>
+            <w:tcMar>
+              <w:top w:w="80" w:type="dxa"/>
+              <w:start w:w="120" w:type="dxa"/>
+              <w:bottom w:w="80" w:type="dxa"/>
+              <w:end w:w="120" w:type="dxa"/>
+            </w:tcMar>
+          </w:tcPr>
+          <w:p>
+            <w:pPr>
+              <w:spacing w:after="0"/>
+              <w:jc w:val="left"/>
+            </w:pPr>
+            <w:r>
+              <w:rPr>
+                <w:rFonts w:ascii="Arial" w:hAnsi="Arial" w:eastAsia="Arial"/>
+                <w:b w:val="0"/>
+                <w:color w:val="111827"/>
+                <w:sz w:val="16"/>
+              </w:rPr>
+              <w:t>Manifest доказывает наличие файлов и хэши, но не заменяет содержательную валидацию claims.</w:t>
+            </w:r>
+          </w:p>
+        </w:tc>
+      </w:tr>
+    </w:tbl>
+    <w:p/>
+    <w:p>
+      <w:pPr>
+        <w:pStyle w:val="Heading1"/>
+      </w:pPr>
+      <w:r>
         <w:t>БЫСТРЫЕ ВЫВОДЫ ДЛЯ СТРАТЕГИИ</w:t>
       </w:r>
     </w:p>
@@ -7173,6 +8327,15 @@
       </w:pPr>
       <w:r>
         <w:t>output/pdf/alina-global-hypothesis-report-v1.pdf</w:t>
+      </w:r>
+    </w:p>
+    <w:p>
+      <w:pPr>
+        <w:pStyle w:val="ListBullet"/>
+        <w:spacing w:after="80"/>
+      </w:pPr>
+      <w:r>
+        <w:t>data_processed/global_hypothesis_source_appendix.csv</w:t>
       </w:r>
     </w:p>
     <w:p>

</xml_diff>

<commit_message>
Add global hypothesis validation protocol
</commit_message>
<xml_diff>
--- a/output/docx/alina-global-hypothesis-report-v1.docx
+++ b/output/docx/alina-global-hypothesis-report-v1.docx
@@ -31,7 +31,7 @@
     </w:p>
     <w:p>
       <w:r>
-        <w:t>Собрано: 2026-05-31T14:58:04.771Z</w:t>
+        <w:t>Собрано: 2026-05-31T15:04:22.840Z</w:t>
       </w:r>
     </w:p>
     <w:p>
@@ -59,7 +59,7 @@
     </w:p>
     <w:p>
       <w:r>
-        <w:t>На текущем этапе собрано 67,525 raw source rows, 36,694 dedup rows и 454 локальных артефактов. Эти данные нужны не для того, чтобы объявить продукт доказанным, а для последовательной проверки: существует ли рынок, есть ли деньги, насколько плотна конкуренция, где может быть белое пятно, кто аудитория и какую MVP-петлю надо тестировать.</w:t>
+        <w:t>На текущем этапе собрано 67,525 raw source rows, 36,694 dedup rows и 455 локальных артефактов. Эти данные нужны не для того, чтобы объявить продукт доказанным, а для последовательной проверки: существует ли рынок, есть ли деньги, насколько плотна конкуренция, где может быть белое пятно, кто аудитория и какую MVP-петлю надо тестировать.</w:t>
       </w:r>
     </w:p>
     <w:p>
@@ -1819,7 +1819,7 @@
     </w:p>
     <w:p>
       <w:r>
-        <w:t>В отличие от образца по Telegram-mini-app, здесь сценарии входа не завязаны на один канал. Для Alina логичнее рассматривать несколько мировых consumer-entry сценариев. Первый сценарий - пользователь приходит из состояния тревоги, усталости или перегруза и ищет короткий reset. Второй сценарий - пользователь приходит из self-improvement контекста: он хочет двигаться вперед, но устал от жестких streak и сложных систем. Третий сценарий - пользователь приходит из spiritual/meaning контекста и хочет не просто читать интерпретацию, а превратить ее в действие. Четвертый сценарий - пользователь приходит через avatar/identity интерес и хочет видеть, что версия себя меняется. Пятый сценарий - пользователь возвращается через мягкую progression-механику, если она не выглядит как манипулятивная игра.</w:t>
+        <w:t>Сценарии входа для Alina не завязаны на один канал. Логичнее рассматривать несколько мировых consumer-entry сценариев. Первый сценарий - пользователь приходит из состояния тревоги, усталости или перегруза и ищет короткий reset. Второй сценарий - пользователь приходит из self-improvement контекста: он хочет двигаться вперед, но устал от жестких streak и сложных систем. Третий сценарий - пользователь приходит из spiritual/meaning контекста и хочет не просто читать интерпретацию, а превратить ее в действие. Четвертый сценарий - пользователь приходит через avatar/identity интерес и хочет видеть, что версия себя меняется. Пятый сценарий - пользователь возвращается через мягкую progression-механику, если она не выглядит как манипулятивная игра.</w:t>
       </w:r>
     </w:p>
     <w:p>
@@ -7101,6 +7101,1720 @@
         <w:pStyle w:val="Heading1"/>
       </w:pPr>
       <w:r>
+        <w:t>СПИСОК ВОПРОСОВ И ПРОВЕРОК ДЛЯ СЛЕДУЮЩЕГО ЭТАПА</w:t>
+      </w:r>
+    </w:p>
+    <w:p>
+      <w:r>
+        <w:t>Следующий слой исследования должен собираться как evidence protocol. По каждой гипотезе нужно заранее определить вопрос, наблюдение, артефакт и правило понижения уверенности. Если нет capture row, скриншота, цитаты, цены, walkthrough-заметки или scorecard-метрики, то гипотеза не апгрейдится.</w:t>
+      </w:r>
+    </w:p>
+    <w:tbl>
+      <w:tblPr>
+        <w:tblW w:type="dxa" w:w="9360"/>
+        <w:jc w:val="left"/>
+        <w:tblLayout w:type="fixed"/>
+        <w:tblLook w:firstColumn="1" w:firstRow="1" w:lastColumn="0" w:lastRow="0" w:noHBand="0" w:noVBand="1" w:val="04A0"/>
+        <w:tblInd w:w="120" w:type="dxa"/>
+        <w:tblBorders>
+          <w:top w:val="single" w:sz="4" w:space="0" w:color="CBD5E1"/>
+          <w:left w:val="single" w:sz="4" w:space="0" w:color="CBD5E1"/>
+          <w:bottom w:val="single" w:sz="4" w:space="0" w:color="CBD5E1"/>
+          <w:right w:val="single" w:sz="4" w:space="0" w:color="CBD5E1"/>
+          <w:insideH w:val="single" w:sz="4" w:space="0" w:color="CBD5E1"/>
+          <w:insideV w:val="single" w:sz="4" w:space="0" w:color="CBD5E1"/>
+        </w:tblBorders>
+      </w:tblPr>
+      <w:tblGrid>
+        <w:gridCol w:w="1560"/>
+        <w:gridCol w:w="1560"/>
+        <w:gridCol w:w="1560"/>
+        <w:gridCol w:w="1560"/>
+        <w:gridCol w:w="1560"/>
+        <w:gridCol w:w="1560"/>
+      </w:tblGrid>
+      <w:tr>
+        <w:tc>
+          <w:tcPr>
+            <w:tcW w:type="dxa" w:w="1560"/>
+            <w:vAlign w:val="center"/>
+            <w:tcMar>
+              <w:top w:w="80" w:type="dxa"/>
+              <w:start w:w="120" w:type="dxa"/>
+              <w:bottom w:w="80" w:type="dxa"/>
+              <w:end w:w="120" w:type="dxa"/>
+            </w:tcMar>
+            <w:shd w:fill="E8EEF5"/>
+          </w:tcPr>
+          <w:p>
+            <w:pPr>
+              <w:spacing w:after="0"/>
+              <w:jc w:val="left"/>
+            </w:pPr>
+            <w:r>
+              <w:rPr>
+                <w:rFonts w:ascii="Arial" w:hAnsi="Arial" w:eastAsia="Arial"/>
+                <w:b/>
+                <w:color w:val="111827"/>
+                <w:sz w:val="16"/>
+              </w:rPr>
+              <w:t>Гипотеза</w:t>
+            </w:r>
+          </w:p>
+        </w:tc>
+        <w:tc>
+          <w:tcPr>
+            <w:tcW w:type="dxa" w:w="1560"/>
+            <w:vAlign w:val="center"/>
+            <w:tcMar>
+              <w:top w:w="80" w:type="dxa"/>
+              <w:start w:w="120" w:type="dxa"/>
+              <w:bottom w:w="80" w:type="dxa"/>
+              <w:end w:w="120" w:type="dxa"/>
+            </w:tcMar>
+            <w:shd w:fill="E8EEF5"/>
+          </w:tcPr>
+          <w:p>
+            <w:pPr>
+              <w:spacing w:after="0"/>
+              <w:jc w:val="left"/>
+            </w:pPr>
+            <w:r>
+              <w:rPr>
+                <w:rFonts w:ascii="Arial" w:hAnsi="Arial" w:eastAsia="Arial"/>
+                <w:b/>
+                <w:color w:val="111827"/>
+                <w:sz w:val="16"/>
+              </w:rPr>
+              <w:t>Блок</w:t>
+            </w:r>
+          </w:p>
+        </w:tc>
+        <w:tc>
+          <w:tcPr>
+            <w:tcW w:type="dxa" w:w="1560"/>
+            <w:vAlign w:val="center"/>
+            <w:tcMar>
+              <w:top w:w="80" w:type="dxa"/>
+              <w:start w:w="120" w:type="dxa"/>
+              <w:bottom w:w="80" w:type="dxa"/>
+              <w:end w:w="120" w:type="dxa"/>
+            </w:tcMar>
+            <w:shd w:fill="E8EEF5"/>
+          </w:tcPr>
+          <w:p>
+            <w:pPr>
+              <w:spacing w:after="0"/>
+              <w:jc w:val="left"/>
+            </w:pPr>
+            <w:r>
+              <w:rPr>
+                <w:rFonts w:ascii="Arial" w:hAnsi="Arial" w:eastAsia="Arial"/>
+                <w:b/>
+                <w:color w:val="111827"/>
+                <w:sz w:val="16"/>
+              </w:rPr>
+              <w:t>Вопрос / проверка</w:t>
+            </w:r>
+          </w:p>
+        </w:tc>
+        <w:tc>
+          <w:tcPr>
+            <w:tcW w:type="dxa" w:w="1560"/>
+            <w:vAlign w:val="center"/>
+            <w:tcMar>
+              <w:top w:w="80" w:type="dxa"/>
+              <w:start w:w="120" w:type="dxa"/>
+              <w:bottom w:w="80" w:type="dxa"/>
+              <w:end w:w="120" w:type="dxa"/>
+            </w:tcMar>
+            <w:shd w:fill="E8EEF5"/>
+          </w:tcPr>
+          <w:p>
+            <w:pPr>
+              <w:spacing w:after="0"/>
+              <w:jc w:val="left"/>
+            </w:pPr>
+            <w:r>
+              <w:rPr>
+                <w:rFonts w:ascii="Arial" w:hAnsi="Arial" w:eastAsia="Arial"/>
+                <w:b/>
+                <w:color w:val="111827"/>
+                <w:sz w:val="16"/>
+              </w:rPr>
+              <w:t>Что сохранить</w:t>
+            </w:r>
+          </w:p>
+        </w:tc>
+        <w:tc>
+          <w:tcPr>
+            <w:tcW w:type="dxa" w:w="1560"/>
+            <w:vAlign w:val="center"/>
+            <w:tcMar>
+              <w:top w:w="80" w:type="dxa"/>
+              <w:start w:w="120" w:type="dxa"/>
+              <w:bottom w:w="80" w:type="dxa"/>
+              <w:end w:w="120" w:type="dxa"/>
+            </w:tcMar>
+            <w:shd w:fill="E8EEF5"/>
+          </w:tcPr>
+          <w:p>
+            <w:pPr>
+              <w:spacing w:after="0"/>
+              <w:jc w:val="left"/>
+            </w:pPr>
+            <w:r>
+              <w:rPr>
+                <w:rFonts w:ascii="Arial" w:hAnsi="Arial" w:eastAsia="Arial"/>
+                <w:b/>
+                <w:color w:val="111827"/>
+                <w:sz w:val="16"/>
+              </w:rPr>
+              <w:t>Сигнал усиления</w:t>
+            </w:r>
+          </w:p>
+        </w:tc>
+        <w:tc>
+          <w:tcPr>
+            <w:tcW w:type="dxa" w:w="1560"/>
+            <w:vAlign w:val="center"/>
+            <w:tcMar>
+              <w:top w:w="80" w:type="dxa"/>
+              <w:start w:w="120" w:type="dxa"/>
+              <w:bottom w:w="80" w:type="dxa"/>
+              <w:end w:w="120" w:type="dxa"/>
+            </w:tcMar>
+            <w:shd w:fill="E8EEF5"/>
+          </w:tcPr>
+          <w:p>
+            <w:pPr>
+              <w:spacing w:after="0"/>
+              <w:jc w:val="left"/>
+            </w:pPr>
+            <w:r>
+              <w:rPr>
+                <w:rFonts w:ascii="Arial" w:hAnsi="Arial" w:eastAsia="Arial"/>
+                <w:b/>
+                <w:color w:val="111827"/>
+                <w:sz w:val="16"/>
+              </w:rPr>
+              <w:t>Сигнал ослабления</w:t>
+            </w:r>
+          </w:p>
+        </w:tc>
+      </w:tr>
+      <w:tr>
+        <w:tc>
+          <w:tcPr>
+            <w:tcW w:type="dxa" w:w="1560"/>
+            <w:vAlign w:val="center"/>
+            <w:tcMar>
+              <w:top w:w="80" w:type="dxa"/>
+              <w:start w:w="120" w:type="dxa"/>
+              <w:bottom w:w="80" w:type="dxa"/>
+              <w:end w:w="120" w:type="dxa"/>
+            </w:tcMar>
+          </w:tcPr>
+          <w:p>
+            <w:pPr>
+              <w:spacing w:after="0"/>
+              <w:jc w:val="left"/>
+            </w:pPr>
+            <w:r>
+              <w:rPr>
+                <w:rFonts w:ascii="Arial" w:hAnsi="Arial" w:eastAsia="Arial"/>
+                <w:b w:val="0"/>
+                <w:color w:val="111827"/>
+                <w:sz w:val="16"/>
+              </w:rPr>
+              <w:t>H1</w:t>
+            </w:r>
+          </w:p>
+        </w:tc>
+        <w:tc>
+          <w:tcPr>
+            <w:tcW w:type="dxa" w:w="1560"/>
+            <w:vAlign w:val="center"/>
+            <w:tcMar>
+              <w:top w:w="80" w:type="dxa"/>
+              <w:start w:w="120" w:type="dxa"/>
+              <w:bottom w:w="80" w:type="dxa"/>
+              <w:end w:w="120" w:type="dxa"/>
+            </w:tcMar>
+          </w:tcPr>
+          <w:p>
+            <w:pPr>
+              <w:spacing w:after="0"/>
+              <w:jc w:val="left"/>
+            </w:pPr>
+            <w:r>
+              <w:rPr>
+                <w:rFonts w:ascii="Arial" w:hAnsi="Arial" w:eastAsia="Arial"/>
+                <w:b w:val="0"/>
+                <w:color w:val="111827"/>
+                <w:sz w:val="16"/>
+              </w:rPr>
+              <w:t>Форма продукта и hidden-clone риск</w:t>
+            </w:r>
+          </w:p>
+        </w:tc>
+        <w:tc>
+          <w:tcPr>
+            <w:tcW w:type="dxa" w:w="1560"/>
+            <w:vAlign w:val="center"/>
+            <w:tcMar>
+              <w:top w:w="80" w:type="dxa"/>
+              <w:start w:w="120" w:type="dxa"/>
+              <w:bottom w:w="80" w:type="dxa"/>
+              <w:end w:w="120" w:type="dxa"/>
+            </w:tcMar>
+          </w:tcPr>
+          <w:p>
+            <w:pPr>
+              <w:spacing w:after="0"/>
+              <w:jc w:val="left"/>
+            </w:pPr>
+            <w:r>
+              <w:rPr>
+                <w:rFonts w:ascii="Arial" w:hAnsi="Arial" w:eastAsia="Arial"/>
+                <w:b w:val="0"/>
+                <w:color w:val="111827"/>
+                <w:sz w:val="16"/>
+              </w:rPr>
+              <w:t>Открой P0-конкурента от первого экрана до первого value moment: есть ли там связка личный смысл -&gt; маленькое действие -&gt; reset -&gt; видимый progress/avatar feedback?</w:t>
+            </w:r>
+          </w:p>
+        </w:tc>
+        <w:tc>
+          <w:tcPr>
+            <w:tcW w:type="dxa" w:w="1560"/>
+            <w:vAlign w:val="center"/>
+            <w:tcMar>
+              <w:top w:w="80" w:type="dxa"/>
+              <w:start w:w="120" w:type="dxa"/>
+              <w:bottom w:w="80" w:type="dxa"/>
+              <w:end w:w="120" w:type="dxa"/>
+            </w:tcMar>
+          </w:tcPr>
+          <w:p>
+            <w:pPr>
+              <w:spacing w:after="0"/>
+              <w:jc w:val="left"/>
+            </w:pPr>
+            <w:r>
+              <w:rPr>
+                <w:rFonts w:ascii="Arial" w:hAnsi="Arial" w:eastAsia="Arial"/>
+                <w:b w:val="0"/>
+                <w:color w:val="111827"/>
+                <w:sz w:val="16"/>
+              </w:rPr>
+              <w:t>listing screenshot / onboarding first value / first action / progress/avatar feedback / paywall/free boundary / inspector notes</w:t>
+            </w:r>
+          </w:p>
+        </w:tc>
+        <w:tc>
+          <w:tcPr>
+            <w:tcW w:type="dxa" w:w="1560"/>
+            <w:vAlign w:val="center"/>
+            <w:tcMar>
+              <w:top w:w="80" w:type="dxa"/>
+              <w:start w:w="120" w:type="dxa"/>
+              <w:bottom w:w="80" w:type="dxa"/>
+              <w:end w:w="120" w:type="dxa"/>
+            </w:tcMar>
+          </w:tcPr>
+          <w:p>
+            <w:pPr>
+              <w:spacing w:after="0"/>
+              <w:jc w:val="left"/>
+            </w:pPr>
+            <w:r>
+              <w:rPr>
+                <w:rFonts w:ascii="Arial" w:hAnsi="Arial" w:eastAsia="Arial"/>
+                <w:b w:val="0"/>
+                <w:color w:val="111827"/>
+                <w:sz w:val="16"/>
+              </w:rPr>
+              <w:t>Минимум пять P0-приложений вручную прошли все walkthrough-слоты, и полный скрытый клон Alina не найден.</w:t>
+            </w:r>
+          </w:p>
+        </w:tc>
+        <w:tc>
+          <w:tcPr>
+            <w:tcW w:type="dxa" w:w="1560"/>
+            <w:vAlign w:val="center"/>
+            <w:tcMar>
+              <w:top w:w="80" w:type="dxa"/>
+              <w:start w:w="120" w:type="dxa"/>
+              <w:bottom w:w="80" w:type="dxa"/>
+              <w:end w:w="120" w:type="dxa"/>
+            </w:tcMar>
+          </w:tcPr>
+          <w:p>
+            <w:pPr>
+              <w:spacing w:after="0"/>
+              <w:jc w:val="left"/>
+            </w:pPr>
+            <w:r>
+              <w:rPr>
+                <w:rFonts w:ascii="Arial" w:hAnsi="Arial" w:eastAsia="Arial"/>
+                <w:b w:val="0"/>
+                <w:color w:val="111827"/>
+                <w:sz w:val="16"/>
+              </w:rPr>
+              <w:t>Любой P0-конкурент уже владеет полной петлей Alina с причинностью action -&gt; identity/avatar.</w:t>
+            </w:r>
+          </w:p>
+        </w:tc>
+      </w:tr>
+      <w:tr>
+        <w:tc>
+          <w:tcPr>
+            <w:tcW w:type="dxa" w:w="1560"/>
+            <w:vAlign w:val="center"/>
+            <w:tcMar>
+              <w:top w:w="80" w:type="dxa"/>
+              <w:start w:w="120" w:type="dxa"/>
+              <w:bottom w:w="80" w:type="dxa"/>
+              <w:end w:w="120" w:type="dxa"/>
+            </w:tcMar>
+            <w:shd w:fill="F8FAFC"/>
+          </w:tcPr>
+          <w:p>
+            <w:pPr>
+              <w:spacing w:after="0"/>
+              <w:jc w:val="left"/>
+            </w:pPr>
+            <w:r>
+              <w:rPr>
+                <w:rFonts w:ascii="Arial" w:hAnsi="Arial" w:eastAsia="Arial"/>
+                <w:b w:val="0"/>
+                <w:color w:val="111827"/>
+                <w:sz w:val="16"/>
+              </w:rPr>
+              <w:t>H2</w:t>
+            </w:r>
+          </w:p>
+        </w:tc>
+        <w:tc>
+          <w:tcPr>
+            <w:tcW w:type="dxa" w:w="1560"/>
+            <w:vAlign w:val="center"/>
+            <w:tcMar>
+              <w:top w:w="80" w:type="dxa"/>
+              <w:start w:w="120" w:type="dxa"/>
+              <w:bottom w:w="80" w:type="dxa"/>
+              <w:end w:w="120" w:type="dxa"/>
+            </w:tcMar>
+            <w:shd w:fill="F8FAFC"/>
+          </w:tcPr>
+          <w:p>
+            <w:pPr>
+              <w:spacing w:after="0"/>
+              <w:jc w:val="left"/>
+            </w:pPr>
+            <w:r>
+              <w:rPr>
+                <w:rFonts w:ascii="Arial" w:hAnsi="Arial" w:eastAsia="Arial"/>
+                <w:b w:val="0"/>
+                <w:color w:val="111827"/>
+                <w:sz w:val="16"/>
+              </w:rPr>
+              <w:t>Деньги и willingness-to-pay</w:t>
+            </w:r>
+          </w:p>
+        </w:tc>
+        <w:tc>
+          <w:tcPr>
+            <w:tcW w:type="dxa" w:w="1560"/>
+            <w:vAlign w:val="center"/>
+            <w:tcMar>
+              <w:top w:w="80" w:type="dxa"/>
+              <w:start w:w="120" w:type="dxa"/>
+              <w:bottom w:w="80" w:type="dxa"/>
+              <w:end w:w="120" w:type="dxa"/>
+            </w:tcMar>
+            <w:shd w:fill="F8FAFC"/>
+          </w:tcPr>
+          <w:p>
+            <w:pPr>
+              <w:spacing w:after="0"/>
+              <w:jc w:val="left"/>
+            </w:pPr>
+            <w:r>
+              <w:rPr>
+                <w:rFonts w:ascii="Arial" w:hAnsi="Arial" w:eastAsia="Arial"/>
+                <w:b w:val="0"/>
+                <w:color w:val="111827"/>
+                <w:sz w:val="16"/>
+              </w:rPr>
+              <w:t>В каждом high-money конкуренте зафиксируй, где появляется первый честный paywall: до value moment или после него, какая цена, trial, годовая скидка и какая именно depth продается.</w:t>
+            </w:r>
+          </w:p>
+        </w:tc>
+        <w:tc>
+          <w:tcPr>
+            <w:tcW w:type="dxa" w:w="1560"/>
+            <w:vAlign w:val="center"/>
+            <w:tcMar>
+              <w:top w:w="80" w:type="dxa"/>
+              <w:start w:w="120" w:type="dxa"/>
+              <w:bottom w:w="80" w:type="dxa"/>
+              <w:end w:w="120" w:type="dxa"/>
+            </w:tcMar>
+            <w:shd w:fill="F8FAFC"/>
+          </w:tcPr>
+          <w:p>
+            <w:pPr>
+              <w:spacing w:after="0"/>
+              <w:jc w:val="left"/>
+            </w:pPr>
+            <w:r>
+              <w:rPr>
+                <w:rFonts w:ascii="Arial" w:hAnsi="Arial" w:eastAsia="Arial"/>
+                <w:b w:val="0"/>
+                <w:color w:val="111827"/>
+                <w:sz w:val="16"/>
+              </w:rPr>
+              <w:t>public pricing screenshot / app/product match / trial length / monthly/annual price / first meaningful paywall boundary</w:t>
+            </w:r>
+          </w:p>
+        </w:tc>
+        <w:tc>
+          <w:tcPr>
+            <w:tcW w:type="dxa" w:w="1560"/>
+            <w:vAlign w:val="center"/>
+            <w:tcMar>
+              <w:top w:w="80" w:type="dxa"/>
+              <w:start w:w="120" w:type="dxa"/>
+              <w:bottom w:w="80" w:type="dxa"/>
+              <w:end w:w="120" w:type="dxa"/>
+            </w:tcMar>
+            <w:shd w:fill="F8FAFC"/>
+          </w:tcPr>
+          <w:p>
+            <w:pPr>
+              <w:spacing w:after="0"/>
+              <w:jc w:val="left"/>
+            </w:pPr>
+            <w:r>
+              <w:rPr>
+                <w:rFonts w:ascii="Arial" w:hAnsi="Arial" w:eastAsia="Arial"/>
+                <w:b w:val="0"/>
+                <w:color w:val="111827"/>
+                <w:sz w:val="16"/>
+              </w:rPr>
+              <w:t>Для high-money конкурентов подтверждены цена, trial, граница paywall и связь платной глубины с похожей пользовательской работой.</w:t>
+            </w:r>
+          </w:p>
+        </w:tc>
+        <w:tc>
+          <w:tcPr>
+            <w:tcW w:type="dxa" w:w="1560"/>
+            <w:vAlign w:val="center"/>
+            <w:tcMar>
+              <w:top w:w="80" w:type="dxa"/>
+              <w:start w:w="120" w:type="dxa"/>
+              <w:bottom w:w="80" w:type="dxa"/>
+              <w:end w:w="120" w:type="dxa"/>
+            </w:tcMar>
+            <w:shd w:fill="F8FAFC"/>
+          </w:tcPr>
+          <w:p>
+            <w:pPr>
+              <w:spacing w:after="0"/>
+              <w:jc w:val="left"/>
+            </w:pPr>
+            <w:r>
+              <w:rPr>
+                <w:rFonts w:ascii="Arial" w:hAnsi="Arial" w:eastAsia="Arial"/>
+                <w:b w:val="0"/>
+                <w:color w:val="111827"/>
+                <w:sz w:val="16"/>
+              </w:rPr>
+              <w:t>Платные сигналы относятся к нерелевантным продуктам, parent pages, login-gated страницам или paywall появляется до понятной ценности.</w:t>
+            </w:r>
+          </w:p>
+        </w:tc>
+      </w:tr>
+      <w:tr>
+        <w:tc>
+          <w:tcPr>
+            <w:tcW w:type="dxa" w:w="1560"/>
+            <w:vAlign w:val="center"/>
+            <w:tcMar>
+              <w:top w:w="80" w:type="dxa"/>
+              <w:start w:w="120" w:type="dxa"/>
+              <w:bottom w:w="80" w:type="dxa"/>
+              <w:end w:w="120" w:type="dxa"/>
+            </w:tcMar>
+          </w:tcPr>
+          <w:p>
+            <w:pPr>
+              <w:spacing w:after="0"/>
+              <w:jc w:val="left"/>
+            </w:pPr>
+            <w:r>
+              <w:rPr>
+                <w:rFonts w:ascii="Arial" w:hAnsi="Arial" w:eastAsia="Arial"/>
+                <w:b w:val="0"/>
+                <w:color w:val="111827"/>
+                <w:sz w:val="16"/>
+              </w:rPr>
+              <w:t>H2</w:t>
+            </w:r>
+          </w:p>
+        </w:tc>
+        <w:tc>
+          <w:tcPr>
+            <w:tcW w:type="dxa" w:w="1560"/>
+            <w:vAlign w:val="center"/>
+            <w:tcMar>
+              <w:top w:w="80" w:type="dxa"/>
+              <w:start w:w="120" w:type="dxa"/>
+              <w:bottom w:w="80" w:type="dxa"/>
+              <w:end w:w="120" w:type="dxa"/>
+            </w:tcMar>
+          </w:tcPr>
+          <w:p>
+            <w:pPr>
+              <w:spacing w:after="0"/>
+              <w:jc w:val="left"/>
+            </w:pPr>
+            <w:r>
+              <w:rPr>
+                <w:rFonts w:ascii="Arial" w:hAnsi="Arial" w:eastAsia="Arial"/>
+                <w:b w:val="0"/>
+                <w:color w:val="111827"/>
+                <w:sz w:val="16"/>
+              </w:rPr>
+              <w:t>Деньги и willingness-to-pay</w:t>
+            </w:r>
+          </w:p>
+        </w:tc>
+        <w:tc>
+          <w:tcPr>
+            <w:tcW w:type="dxa" w:w="1560"/>
+            <w:vAlign w:val="center"/>
+            <w:tcMar>
+              <w:top w:w="80" w:type="dxa"/>
+              <w:start w:w="120" w:type="dxa"/>
+              <w:bottom w:w="80" w:type="dxa"/>
+              <w:end w:w="120" w:type="dxa"/>
+            </w:tcMar>
+          </w:tcPr>
+          <w:p>
+            <w:pPr>
+              <w:spacing w:after="0"/>
+              <w:jc w:val="left"/>
+            </w:pPr>
+            <w:r>
+              <w:rPr>
+                <w:rFonts w:ascii="Arial" w:hAnsi="Arial" w:eastAsia="Arial"/>
+                <w:b w:val="0"/>
+                <w:color w:val="111827"/>
+                <w:sz w:val="16"/>
+              </w:rPr>
+              <w:t>За что ты уже платишь в этой зоне и что должно случиться бесплатно, чтобы подписка стала честной?</w:t>
+            </w:r>
+          </w:p>
+        </w:tc>
+        <w:tc>
+          <w:tcPr>
+            <w:tcW w:type="dxa" w:w="1560"/>
+            <w:vAlign w:val="center"/>
+            <w:tcMar>
+              <w:top w:w="80" w:type="dxa"/>
+              <w:start w:w="120" w:type="dxa"/>
+              <w:bottom w:w="80" w:type="dxa"/>
+              <w:end w:w="120" w:type="dxa"/>
+            </w:tcMar>
+          </w:tcPr>
+          <w:p>
+            <w:pPr>
+              <w:spacing w:after="0"/>
+              <w:jc w:val="left"/>
+            </w:pPr>
+            <w:r>
+              <w:rPr>
+                <w:rFonts w:ascii="Arial" w:hAnsi="Arial" w:eastAsia="Arial"/>
+                <w:b w:val="0"/>
+                <w:color w:val="111827"/>
+                <w:sz w:val="16"/>
+              </w:rPr>
+              <w:t>free_value_moment/paid_depth_feature/acceptable_price_range/friend_explanation/return_trigger</w:t>
+            </w:r>
+          </w:p>
+        </w:tc>
+        <w:tc>
+          <w:tcPr>
+            <w:tcW w:type="dxa" w:w="1560"/>
+            <w:vAlign w:val="center"/>
+            <w:tcMar>
+              <w:top w:w="80" w:type="dxa"/>
+              <w:start w:w="120" w:type="dxa"/>
+              <w:bottom w:w="80" w:type="dxa"/>
+              <w:end w:w="120" w:type="dxa"/>
+            </w:tcMar>
+          </w:tcPr>
+          <w:p>
+            <w:pPr>
+              <w:spacing w:after="0"/>
+              <w:jc w:val="left"/>
+            </w:pPr>
+            <w:r>
+              <w:rPr>
+                <w:rFonts w:ascii="Arial" w:hAnsi="Arial" w:eastAsia="Arial"/>
+                <w:b w:val="0"/>
+                <w:color w:val="111827"/>
+                <w:sz w:val="16"/>
+              </w:rPr>
+              <w:t>участник называет paid depth после free value moment и может объяснить продукт своими словами</w:t>
+            </w:r>
+          </w:p>
+        </w:tc>
+        <w:tc>
+          <w:tcPr>
+            <w:tcW w:type="dxa" w:w="1560"/>
+            <w:vAlign w:val="center"/>
+            <w:tcMar>
+              <w:top w:w="80" w:type="dxa"/>
+              <w:start w:w="120" w:type="dxa"/>
+              <w:bottom w:w="80" w:type="dxa"/>
+              <w:end w:w="120" w:type="dxa"/>
+            </w:tcMar>
+          </w:tcPr>
+          <w:p>
+            <w:pPr>
+              <w:spacing w:after="0"/>
+              <w:jc w:val="left"/>
+            </w:pPr>
+            <w:r>
+              <w:rPr>
+                <w:rFonts w:ascii="Arial" w:hAnsi="Arial" w:eastAsia="Arial"/>
+                <w:b w:val="0"/>
+                <w:color w:val="111827"/>
+                <w:sz w:val="16"/>
+              </w:rPr>
+              <w:t>вся ценность ожидается бесплатно, paid depth не связана с loop, или продукт невозможно пересказать</w:t>
+            </w:r>
+          </w:p>
+        </w:tc>
+      </w:tr>
+      <w:tr>
+        <w:tc>
+          <w:tcPr>
+            <w:tcW w:type="dxa" w:w="1560"/>
+            <w:vAlign w:val="center"/>
+            <w:tcMar>
+              <w:top w:w="80" w:type="dxa"/>
+              <w:start w:w="120" w:type="dxa"/>
+              <w:bottom w:w="80" w:type="dxa"/>
+              <w:end w:w="120" w:type="dxa"/>
+            </w:tcMar>
+            <w:shd w:fill="F8FAFC"/>
+          </w:tcPr>
+          <w:p>
+            <w:pPr>
+              <w:spacing w:after="0"/>
+              <w:jc w:val="left"/>
+            </w:pPr>
+            <w:r>
+              <w:rPr>
+                <w:rFonts w:ascii="Arial" w:hAnsi="Arial" w:eastAsia="Arial"/>
+                <w:b w:val="0"/>
+                <w:color w:val="111827"/>
+                <w:sz w:val="16"/>
+              </w:rPr>
+              <w:t>H3</w:t>
+            </w:r>
+          </w:p>
+        </w:tc>
+        <w:tc>
+          <w:tcPr>
+            <w:tcW w:type="dxa" w:w="1560"/>
+            <w:vAlign w:val="center"/>
+            <w:tcMar>
+              <w:top w:w="80" w:type="dxa"/>
+              <w:start w:w="120" w:type="dxa"/>
+              <w:bottom w:w="80" w:type="dxa"/>
+              <w:end w:w="120" w:type="dxa"/>
+            </w:tcMar>
+            <w:shd w:fill="F8FAFC"/>
+          </w:tcPr>
+          <w:p>
+            <w:pPr>
+              <w:spacing w:after="0"/>
+              <w:jc w:val="left"/>
+            </w:pPr>
+            <w:r>
+              <w:rPr>
+                <w:rFonts w:ascii="Arial" w:hAnsi="Arial" w:eastAsia="Arial"/>
+                <w:b w:val="0"/>
+                <w:color w:val="111827"/>
+                <w:sz w:val="16"/>
+              </w:rPr>
+              <w:t>Белое пятно и отличие</w:t>
+            </w:r>
+          </w:p>
+        </w:tc>
+        <w:tc>
+          <w:tcPr>
+            <w:tcW w:type="dxa" w:w="1560"/>
+            <w:vAlign w:val="center"/>
+            <w:tcMar>
+              <w:top w:w="80" w:type="dxa"/>
+              <w:start w:w="120" w:type="dxa"/>
+              <w:bottom w:w="80" w:type="dxa"/>
+              <w:end w:w="120" w:type="dxa"/>
+            </w:tcMar>
+            <w:shd w:fill="F8FAFC"/>
+          </w:tcPr>
+          <w:p>
+            <w:pPr>
+              <w:spacing w:after="0"/>
+              <w:jc w:val="left"/>
+            </w:pPr>
+            <w:r>
+              <w:rPr>
+                <w:rFonts w:ascii="Arial" w:hAnsi="Arial" w:eastAsia="Arial"/>
+                <w:b w:val="0"/>
+                <w:color w:val="111827"/>
+                <w:sz w:val="16"/>
+              </w:rPr>
+              <w:t>После walkthrough конкурента выпиши, что именно он закрывает: meaning, action, reset, visual progress, identity/avatar, causality. Где петля разрывается?</w:t>
+            </w:r>
+          </w:p>
+        </w:tc>
+        <w:tc>
+          <w:tcPr>
+            <w:tcW w:type="dxa" w:w="1560"/>
+            <w:vAlign w:val="center"/>
+            <w:tcMar>
+              <w:top w:w="80" w:type="dxa"/>
+              <w:start w:w="120" w:type="dxa"/>
+              <w:bottom w:w="80" w:type="dxa"/>
+              <w:end w:w="120" w:type="dxa"/>
+            </w:tcMar>
+            <w:shd w:fill="F8FAFC"/>
+          </w:tcPr>
+          <w:p>
+            <w:pPr>
+              <w:spacing w:after="0"/>
+              <w:jc w:val="left"/>
+            </w:pPr>
+            <w:r>
+              <w:rPr>
+                <w:rFonts w:ascii="Arial" w:hAnsi="Arial" w:eastAsia="Arial"/>
+                <w:b w:val="0"/>
+                <w:color w:val="111827"/>
+                <w:sz w:val="16"/>
+              </w:rPr>
+              <w:t>listing screenshot / onboarding first value / first action / progress/avatar feedback / paywall/free boundary / inspector notes</w:t>
+            </w:r>
+          </w:p>
+        </w:tc>
+        <w:tc>
+          <w:tcPr>
+            <w:tcW w:type="dxa" w:w="1560"/>
+            <w:vAlign w:val="center"/>
+            <w:tcMar>
+              <w:top w:w="80" w:type="dxa"/>
+              <w:start w:w="120" w:type="dxa"/>
+              <w:bottom w:w="80" w:type="dxa"/>
+              <w:end w:w="120" w:type="dxa"/>
+            </w:tcMar>
+            <w:shd w:fill="F8FAFC"/>
+          </w:tcPr>
+          <w:p>
+            <w:pPr>
+              <w:spacing w:after="0"/>
+              <w:jc w:val="left"/>
+            </w:pPr>
+            <w:r>
+              <w:rPr>
+                <w:rFonts w:ascii="Arial" w:hAnsi="Arial" w:eastAsia="Arial"/>
+                <w:b w:val="0"/>
+                <w:color w:val="111827"/>
+                <w:sz w:val="16"/>
+              </w:rPr>
+              <w:t>Ручной walkthrough подтверждает, что behavior-tied identity/avatar progression остается редкой среди high-risk substitutes.</w:t>
+            </w:r>
+          </w:p>
+        </w:tc>
+        <w:tc>
+          <w:tcPr>
+            <w:tcW w:type="dxa" w:w="1560"/>
+            <w:vAlign w:val="center"/>
+            <w:tcMar>
+              <w:top w:w="80" w:type="dxa"/>
+              <w:start w:w="120" w:type="dxa"/>
+              <w:bottom w:w="80" w:type="dxa"/>
+              <w:end w:w="120" w:type="dxa"/>
+            </w:tcMar>
+            <w:shd w:fill="F8FAFC"/>
+          </w:tcPr>
+          <w:p>
+            <w:pPr>
+              <w:spacing w:after="0"/>
+              <w:jc w:val="left"/>
+            </w:pPr>
+            <w:r>
+              <w:rPr>
+                <w:rFonts w:ascii="Arial" w:hAnsi="Arial" w:eastAsia="Arial"/>
+                <w:b w:val="0"/>
+                <w:color w:val="111827"/>
+                <w:sz w:val="16"/>
+              </w:rPr>
+              <w:t>Walkthrough показывает распространенные full-loop substitutes или подтверждает скрытый клон.</w:t>
+            </w:r>
+          </w:p>
+        </w:tc>
+      </w:tr>
+      <w:tr>
+        <w:tc>
+          <w:tcPr>
+            <w:tcW w:type="dxa" w:w="1560"/>
+            <w:vAlign w:val="center"/>
+            <w:tcMar>
+              <w:top w:w="80" w:type="dxa"/>
+              <w:start w:w="120" w:type="dxa"/>
+              <w:bottom w:w="80" w:type="dxa"/>
+              <w:end w:w="120" w:type="dxa"/>
+            </w:tcMar>
+          </w:tcPr>
+          <w:p>
+            <w:pPr>
+              <w:spacing w:after="0"/>
+              <w:jc w:val="left"/>
+            </w:pPr>
+            <w:r>
+              <w:rPr>
+                <w:rFonts w:ascii="Arial" w:hAnsi="Arial" w:eastAsia="Arial"/>
+                <w:b w:val="0"/>
+                <w:color w:val="111827"/>
+                <w:sz w:val="16"/>
+              </w:rPr>
+              <w:t>H4</w:t>
+            </w:r>
+          </w:p>
+        </w:tc>
+        <w:tc>
+          <w:tcPr>
+            <w:tcW w:type="dxa" w:w="1560"/>
+            <w:vAlign w:val="center"/>
+            <w:tcMar>
+              <w:top w:w="80" w:type="dxa"/>
+              <w:start w:w="120" w:type="dxa"/>
+              <w:bottom w:w="80" w:type="dxa"/>
+              <w:end w:w="120" w:type="dxa"/>
+            </w:tcMar>
+          </w:tcPr>
+          <w:p>
+            <w:pPr>
+              <w:spacing w:after="0"/>
+              <w:jc w:val="left"/>
+            </w:pPr>
+            <w:r>
+              <w:rPr>
+                <w:rFonts w:ascii="Arial" w:hAnsi="Arial" w:eastAsia="Arial"/>
+                <w:b w:val="0"/>
+                <w:color w:val="111827"/>
+                <w:sz w:val="16"/>
+              </w:rPr>
+              <w:t>Конкурентное преимущество в прототипе</w:t>
+            </w:r>
+          </w:p>
+        </w:tc>
+        <w:tc>
+          <w:tcPr>
+            <w:tcW w:type="dxa" w:w="1560"/>
+            <w:vAlign w:val="center"/>
+            <w:tcMar>
+              <w:top w:w="80" w:type="dxa"/>
+              <w:start w:w="120" w:type="dxa"/>
+              <w:bottom w:w="80" w:type="dxa"/>
+              <w:end w:w="120" w:type="dxa"/>
+            </w:tcMar>
+          </w:tcPr>
+          <w:p>
+            <w:pPr>
+              <w:spacing w:after="0"/>
+              <w:jc w:val="left"/>
+            </w:pPr>
+            <w:r>
+              <w:rPr>
+                <w:rFonts w:ascii="Arial" w:hAnsi="Arial" w:eastAsia="Arial"/>
+                <w:b w:val="0"/>
+                <w:color w:val="111827"/>
+                <w:sz w:val="16"/>
+              </w:rPr>
+              <w:t>На экране изменения спросить: что изменилось, почему это изменилось и какое действие это вызвало?</w:t>
+            </w:r>
+          </w:p>
+        </w:tc>
+        <w:tc>
+          <w:tcPr>
+            <w:tcW w:type="dxa" w:w="1560"/>
+            <w:vAlign w:val="center"/>
+            <w:tcMar>
+              <w:top w:w="80" w:type="dxa"/>
+              <w:start w:w="120" w:type="dxa"/>
+              <w:bottom w:w="80" w:type="dxa"/>
+              <w:end w:w="120" w:type="dxa"/>
+            </w:tcMar>
+          </w:tcPr>
+          <w:p>
+            <w:pPr>
+              <w:spacing w:after="0"/>
+              <w:jc w:val="left"/>
+            </w:pPr>
+            <w:r>
+              <w:rPr>
+                <w:rFonts w:ascii="Arial" w:hAnsi="Arial" w:eastAsia="Arial"/>
+                <w:b w:val="0"/>
+                <w:color w:val="111827"/>
+                <w:sz w:val="16"/>
+              </w:rPr>
+              <w:t>completion_time_seconds/comprehension_yes_no/meaning_lift_1_5/differentiation_1_5/return_intent_1_5/verbatim_quote/fatal_objection</w:t>
+            </w:r>
+          </w:p>
+        </w:tc>
+        <w:tc>
+          <w:tcPr>
+            <w:tcW w:type="dxa" w:w="1560"/>
+            <w:vAlign w:val="center"/>
+            <w:tcMar>
+              <w:top w:w="80" w:type="dxa"/>
+              <w:start w:w="120" w:type="dxa"/>
+              <w:bottom w:w="80" w:type="dxa"/>
+              <w:end w:w="120" w:type="dxa"/>
+            </w:tcMar>
+          </w:tcPr>
+          <w:p>
+            <w:pPr>
+              <w:spacing w:after="0"/>
+              <w:jc w:val="left"/>
+            </w:pPr>
+            <w:r>
+              <w:rPr>
+                <w:rFonts w:ascii="Arial" w:hAnsi="Arial" w:eastAsia="Arial"/>
+                <w:b w:val="0"/>
+                <w:color w:val="111827"/>
+                <w:sz w:val="16"/>
+              </w:rPr>
+              <w:t>Не менее 80% участников прототипа правильно объясняют причинность personal meaning -&gt; action -&gt; avatar/progress.</w:t>
+            </w:r>
+          </w:p>
+        </w:tc>
+        <w:tc>
+          <w:tcPr>
+            <w:tcW w:type="dxa" w:w="1560"/>
+            <w:vAlign w:val="center"/>
+            <w:tcMar>
+              <w:top w:w="80" w:type="dxa"/>
+              <w:start w:w="120" w:type="dxa"/>
+              <w:bottom w:w="80" w:type="dxa"/>
+              <w:end w:w="120" w:type="dxa"/>
+            </w:tcMar>
+          </w:tcPr>
+          <w:p>
+            <w:pPr>
+              <w:spacing w:after="0"/>
+              <w:jc w:val="left"/>
+            </w:pPr>
+            <w:r>
+              <w:rPr>
+                <w:rFonts w:ascii="Arial" w:hAnsi="Arial" w:eastAsia="Arial"/>
+                <w:b w:val="0"/>
+                <w:color w:val="111827"/>
+                <w:sz w:val="16"/>
+              </w:rPr>
+              <w:t>Менее 50% участников могут объяснить причинную петлю без подсказки.</w:t>
+            </w:r>
+          </w:p>
+        </w:tc>
+      </w:tr>
+      <w:tr>
+        <w:tc>
+          <w:tcPr>
+            <w:tcW w:type="dxa" w:w="1560"/>
+            <w:vAlign w:val="center"/>
+            <w:tcMar>
+              <w:top w:w="80" w:type="dxa"/>
+              <w:start w:w="120" w:type="dxa"/>
+              <w:bottom w:w="80" w:type="dxa"/>
+              <w:end w:w="120" w:type="dxa"/>
+            </w:tcMar>
+            <w:shd w:fill="F8FAFC"/>
+          </w:tcPr>
+          <w:p>
+            <w:pPr>
+              <w:spacing w:after="0"/>
+              <w:jc w:val="left"/>
+            </w:pPr>
+            <w:r>
+              <w:rPr>
+                <w:rFonts w:ascii="Arial" w:hAnsi="Arial" w:eastAsia="Arial"/>
+                <w:b w:val="0"/>
+                <w:color w:val="111827"/>
+                <w:sz w:val="16"/>
+              </w:rPr>
+              <w:t>H5</w:t>
+            </w:r>
+          </w:p>
+        </w:tc>
+        <w:tc>
+          <w:tcPr>
+            <w:tcW w:type="dxa" w:w="1560"/>
+            <w:vAlign w:val="center"/>
+            <w:tcMar>
+              <w:top w:w="80" w:type="dxa"/>
+              <w:start w:w="120" w:type="dxa"/>
+              <w:bottom w:w="80" w:type="dxa"/>
+              <w:end w:w="120" w:type="dxa"/>
+            </w:tcMar>
+            <w:shd w:fill="F8FAFC"/>
+          </w:tcPr>
+          <w:p>
+            <w:pPr>
+              <w:spacing w:after="0"/>
+              <w:jc w:val="left"/>
+            </w:pPr>
+            <w:r>
+              <w:rPr>
+                <w:rFonts w:ascii="Arial" w:hAnsi="Arial" w:eastAsia="Arial"/>
+                <w:b w:val="0"/>
+                <w:color w:val="111827"/>
+                <w:sz w:val="16"/>
+              </w:rPr>
+              <w:t>Аудитория и recent behavior</w:t>
+            </w:r>
+          </w:p>
+        </w:tc>
+        <w:tc>
+          <w:tcPr>
+            <w:tcW w:type="dxa" w:w="1560"/>
+            <w:vAlign w:val="center"/>
+            <w:tcMar>
+              <w:top w:w="80" w:type="dxa"/>
+              <w:start w:w="120" w:type="dxa"/>
+              <w:bottom w:w="80" w:type="dxa"/>
+              <w:end w:w="120" w:type="dxa"/>
+            </w:tcMar>
+            <w:shd w:fill="F8FAFC"/>
+          </w:tcPr>
+          <w:p>
+            <w:pPr>
+              <w:spacing w:after="0"/>
+              <w:jc w:val="left"/>
+            </w:pPr>
+            <w:r>
+              <w:rPr>
+                <w:rFonts w:ascii="Arial" w:hAnsi="Arial" w:eastAsia="Arial"/>
+                <w:b w:val="0"/>
+                <w:color w:val="111827"/>
+                <w:sz w:val="16"/>
+              </w:rPr>
+              <w:t>Какие приложения, ритуалы, дневники, игры, guidance tools, коучи или avatar-продукты ты реально использовал за последние 30 дней, и что запустило последнее использование?</w:t>
+            </w:r>
+          </w:p>
+        </w:tc>
+        <w:tc>
+          <w:tcPr>
+            <w:tcW w:type="dxa" w:w="1560"/>
+            <w:vAlign w:val="center"/>
+            <w:tcMar>
+              <w:top w:w="80" w:type="dxa"/>
+              <w:start w:w="120" w:type="dxa"/>
+              <w:bottom w:w="80" w:type="dxa"/>
+              <w:end w:w="120" w:type="dxa"/>
+            </w:tcMar>
+            <w:shd w:fill="F8FAFC"/>
+          </w:tcPr>
+          <w:p>
+            <w:pPr>
+              <w:spacing w:after="0"/>
+              <w:jc w:val="left"/>
+            </w:pPr>
+            <w:r>
+              <w:rPr>
+                <w:rFonts w:ascii="Arial" w:hAnsi="Arial" w:eastAsia="Arial"/>
+                <w:b w:val="0"/>
+                <w:color w:val="111827"/>
+                <w:sz w:val="16"/>
+              </w:rPr>
+              <w:t>recent_behavior_match/current_tool/trigger_of_last_use/segment_fit_yes_no</w:t>
+            </w:r>
+          </w:p>
+        </w:tc>
+        <w:tc>
+          <w:tcPr>
+            <w:tcW w:type="dxa" w:w="1560"/>
+            <w:vAlign w:val="center"/>
+            <w:tcMar>
+              <w:top w:w="80" w:type="dxa"/>
+              <w:start w:w="120" w:type="dxa"/>
+              <w:bottom w:w="80" w:type="dxa"/>
+              <w:end w:w="120" w:type="dxa"/>
+            </w:tcMar>
+            <w:shd w:fill="F8FAFC"/>
+          </w:tcPr>
+          <w:p>
+            <w:pPr>
+              <w:spacing w:after="0"/>
+              <w:jc w:val="left"/>
+            </w:pPr>
+            <w:r>
+              <w:rPr>
+                <w:rFonts w:ascii="Arial" w:hAnsi="Arial" w:eastAsia="Arial"/>
+                <w:b w:val="0"/>
+                <w:color w:val="111827"/>
+                <w:sz w:val="16"/>
+              </w:rPr>
+              <w:t>есть recent behavior и конкретный триггер последнего использования</w:t>
+            </w:r>
+          </w:p>
+        </w:tc>
+        <w:tc>
+          <w:tcPr>
+            <w:tcW w:type="dxa" w:w="1560"/>
+            <w:vAlign w:val="center"/>
+            <w:tcMar>
+              <w:top w:w="80" w:type="dxa"/>
+              <w:start w:w="120" w:type="dxa"/>
+              <w:bottom w:w="80" w:type="dxa"/>
+              <w:end w:w="120" w:type="dxa"/>
+            </w:tcMar>
+            <w:shd w:fill="F8FAFC"/>
+          </w:tcPr>
+          <w:p>
+            <w:pPr>
+              <w:spacing w:after="0"/>
+              <w:jc w:val="left"/>
+            </w:pPr>
+            <w:r>
+              <w:rPr>
+                <w:rFonts w:ascii="Arial" w:hAnsi="Arial" w:eastAsia="Arial"/>
+                <w:b w:val="0"/>
+                <w:color w:val="111827"/>
+                <w:sz w:val="16"/>
+              </w:rPr>
+              <w:t>поведение абстрактное, давно не было, или сегмент выбран по вкусу исследователя</w:t>
+            </w:r>
+          </w:p>
+        </w:tc>
+      </w:tr>
+      <w:tr>
+        <w:tc>
+          <w:tcPr>
+            <w:tcW w:type="dxa" w:w="1560"/>
+            <w:vAlign w:val="center"/>
+            <w:tcMar>
+              <w:top w:w="80" w:type="dxa"/>
+              <w:start w:w="120" w:type="dxa"/>
+              <w:bottom w:w="80" w:type="dxa"/>
+              <w:end w:w="120" w:type="dxa"/>
+            </w:tcMar>
+          </w:tcPr>
+          <w:p>
+            <w:pPr>
+              <w:spacing w:after="0"/>
+              <w:jc w:val="left"/>
+            </w:pPr>
+            <w:r>
+              <w:rPr>
+                <w:rFonts w:ascii="Arial" w:hAnsi="Arial" w:eastAsia="Arial"/>
+                <w:b w:val="0"/>
+                <w:color w:val="111827"/>
+                <w:sz w:val="16"/>
+              </w:rPr>
+              <w:t>H5</w:t>
+            </w:r>
+          </w:p>
+        </w:tc>
+        <w:tc>
+          <w:tcPr>
+            <w:tcW w:type="dxa" w:w="1560"/>
+            <w:vAlign w:val="center"/>
+            <w:tcMar>
+              <w:top w:w="80" w:type="dxa"/>
+              <w:start w:w="120" w:type="dxa"/>
+              <w:bottom w:w="80" w:type="dxa"/>
+              <w:end w:w="120" w:type="dxa"/>
+            </w:tcMar>
+          </w:tcPr>
+          <w:p>
+            <w:pPr>
+              <w:spacing w:after="0"/>
+              <w:jc w:val="left"/>
+            </w:pPr>
+            <w:r>
+              <w:rPr>
+                <w:rFonts w:ascii="Arial" w:hAnsi="Arial" w:eastAsia="Arial"/>
+                <w:b w:val="0"/>
+                <w:color w:val="111827"/>
+                <w:sz w:val="16"/>
+              </w:rPr>
+              <w:t>Аудитория и current workaround</w:t>
+            </w:r>
+          </w:p>
+        </w:tc>
+        <w:tc>
+          <w:tcPr>
+            <w:tcW w:type="dxa" w:w="1560"/>
+            <w:vAlign w:val="center"/>
+            <w:tcMar>
+              <w:top w:w="80" w:type="dxa"/>
+              <w:start w:w="120" w:type="dxa"/>
+              <w:bottom w:w="80" w:type="dxa"/>
+              <w:end w:w="120" w:type="dxa"/>
+            </w:tcMar>
+          </w:tcPr>
+          <w:p>
+            <w:pPr>
+              <w:spacing w:after="0"/>
+              <w:jc w:val="left"/>
+            </w:pPr>
+            <w:r>
+              <w:rPr>
+                <w:rFonts w:ascii="Arial" w:hAnsi="Arial" w:eastAsia="Arial"/>
+                <w:b w:val="0"/>
+                <w:color w:val="111827"/>
+                <w:sz w:val="16"/>
+              </w:rPr>
+              <w:t>Расскажи про последний реальный момент, когда тебе нужно было превратить личный смысл, состояние или внутренний сигнал в одно приземленное действие на сегодня.</w:t>
+            </w:r>
+          </w:p>
+        </w:tc>
+        <w:tc>
+          <w:tcPr>
+            <w:tcW w:type="dxa" w:w="1560"/>
+            <w:vAlign w:val="center"/>
+            <w:tcMar>
+              <w:top w:w="80" w:type="dxa"/>
+              <w:start w:w="120" w:type="dxa"/>
+              <w:bottom w:w="80" w:type="dxa"/>
+              <w:end w:w="120" w:type="dxa"/>
+            </w:tcMar>
+          </w:tcPr>
+          <w:p>
+            <w:pPr>
+              <w:spacing w:after="0"/>
+              <w:jc w:val="left"/>
+            </w:pPr>
+            <w:r>
+              <w:rPr>
+                <w:rFonts w:ascii="Arial" w:hAnsi="Arial" w:eastAsia="Arial"/>
+                <w:b w:val="0"/>
+                <w:color w:val="111827"/>
+                <w:sz w:val="16"/>
+              </w:rPr>
+              <w:t>specific_episode/workaround/pain_intensity_1_5/verbatim_language/rejected_patterns</w:t>
+            </w:r>
+          </w:p>
+        </w:tc>
+        <w:tc>
+          <w:tcPr>
+            <w:tcW w:type="dxa" w:w="1560"/>
+            <w:vAlign w:val="center"/>
+            <w:tcMar>
+              <w:top w:w="80" w:type="dxa"/>
+              <w:start w:w="120" w:type="dxa"/>
+              <w:bottom w:w="80" w:type="dxa"/>
+              <w:end w:w="120" w:type="dxa"/>
+            </w:tcMar>
+          </w:tcPr>
+          <w:p>
+            <w:pPr>
+              <w:spacing w:after="0"/>
+              <w:jc w:val="left"/>
+            </w:pPr>
+            <w:r>
+              <w:rPr>
+                <w:rFonts w:ascii="Arial" w:hAnsi="Arial" w:eastAsia="Arial"/>
+                <w:b w:val="0"/>
+                <w:color w:val="111827"/>
+                <w:sz w:val="16"/>
+              </w:rPr>
+              <w:t>участник рассказывает конкретный эпизод, current workaround и язык боли без наводки</w:t>
+            </w:r>
+          </w:p>
+        </w:tc>
+        <w:tc>
+          <w:tcPr>
+            <w:tcW w:type="dxa" w:w="1560"/>
+            <w:vAlign w:val="center"/>
+            <w:tcMar>
+              <w:top w:w="80" w:type="dxa"/>
+              <w:start w:w="120" w:type="dxa"/>
+              <w:bottom w:w="80" w:type="dxa"/>
+              <w:end w:w="120" w:type="dxa"/>
+            </w:tcMar>
+          </w:tcPr>
+          <w:p>
+            <w:pPr>
+              <w:spacing w:after="0"/>
+              <w:jc w:val="left"/>
+            </w:pPr>
+            <w:r>
+              <w:rPr>
+                <w:rFonts w:ascii="Arial" w:hAnsi="Arial" w:eastAsia="Arial"/>
+                <w:b w:val="0"/>
+                <w:color w:val="111827"/>
+                <w:sz w:val="16"/>
+              </w:rPr>
+              <w:t>участник рассуждает теоретически или проблема оказывается слабее текущих альтернатив</w:t>
+            </w:r>
+          </w:p>
+        </w:tc>
+      </w:tr>
+      <w:tr>
+        <w:tc>
+          <w:tcPr>
+            <w:tcW w:type="dxa" w:w="1560"/>
+            <w:vAlign w:val="center"/>
+            <w:tcMar>
+              <w:top w:w="80" w:type="dxa"/>
+              <w:start w:w="120" w:type="dxa"/>
+              <w:bottom w:w="80" w:type="dxa"/>
+              <w:end w:w="120" w:type="dxa"/>
+            </w:tcMar>
+            <w:shd w:fill="F8FAFC"/>
+          </w:tcPr>
+          <w:p>
+            <w:pPr>
+              <w:spacing w:after="0"/>
+              <w:jc w:val="left"/>
+            </w:pPr>
+            <w:r>
+              <w:rPr>
+                <w:rFonts w:ascii="Arial" w:hAnsi="Arial" w:eastAsia="Arial"/>
+                <w:b w:val="0"/>
+                <w:color w:val="111827"/>
+                <w:sz w:val="16"/>
+              </w:rPr>
+              <w:t>H6</w:t>
+            </w:r>
+          </w:p>
+        </w:tc>
+        <w:tc>
+          <w:tcPr>
+            <w:tcW w:type="dxa" w:w="1560"/>
+            <w:vAlign w:val="center"/>
+            <w:tcMar>
+              <w:top w:w="80" w:type="dxa"/>
+              <w:start w:w="120" w:type="dxa"/>
+              <w:bottom w:w="80" w:type="dxa"/>
+              <w:end w:w="120" w:type="dxa"/>
+            </w:tcMar>
+            <w:shd w:fill="F8FAFC"/>
+          </w:tcPr>
+          <w:p>
+            <w:pPr>
+              <w:spacing w:after="0"/>
+              <w:jc w:val="left"/>
+            </w:pPr>
+            <w:r>
+              <w:rPr>
+                <w:rFonts w:ascii="Arial" w:hAnsi="Arial" w:eastAsia="Arial"/>
+                <w:b w:val="0"/>
+                <w:color w:val="111827"/>
+                <w:sz w:val="16"/>
+              </w:rPr>
+              <w:t>MVP-петля и продуктовое ядро</w:t>
+            </w:r>
+          </w:p>
+        </w:tc>
+        <w:tc>
+          <w:tcPr>
+            <w:tcW w:type="dxa" w:w="1560"/>
+            <w:vAlign w:val="center"/>
+            <w:tcMar>
+              <w:top w:w="80" w:type="dxa"/>
+              <w:start w:w="120" w:type="dxa"/>
+              <w:bottom w:w="80" w:type="dxa"/>
+              <w:end w:w="120" w:type="dxa"/>
+            </w:tcMar>
+            <w:shd w:fill="F8FAFC"/>
+          </w:tcPr>
+          <w:p>
+            <w:pPr>
+              <w:spacing w:after="0"/>
+              <w:jc w:val="left"/>
+            </w:pPr>
+            <w:r>
+              <w:rPr>
+                <w:rFonts w:ascii="Arial" w:hAnsi="Arial" w:eastAsia="Arial"/>
+                <w:b w:val="0"/>
+                <w:color w:val="111827"/>
+                <w:sz w:val="16"/>
+              </w:rPr>
+              <w:t>Пройди прототип от entry до tomorrow hook и попроси участника своими словами назвать продукт: что это, зачем он нужен и почему он может быть нужен завтра?</w:t>
+            </w:r>
+          </w:p>
+        </w:tc>
+        <w:tc>
+          <w:tcPr>
+            <w:tcW w:type="dxa" w:w="1560"/>
+            <w:vAlign w:val="center"/>
+            <w:tcMar>
+              <w:top w:w="80" w:type="dxa"/>
+              <w:start w:w="120" w:type="dxa"/>
+              <w:bottom w:w="80" w:type="dxa"/>
+              <w:end w:w="120" w:type="dxa"/>
+            </w:tcMar>
+            <w:shd w:fill="F8FAFC"/>
+          </w:tcPr>
+          <w:p>
+            <w:pPr>
+              <w:spacing w:after="0"/>
+              <w:jc w:val="left"/>
+            </w:pPr>
+            <w:r>
+              <w:rPr>
+                <w:rFonts w:ascii="Arial" w:hAnsi="Arial" w:eastAsia="Arial"/>
+                <w:b w:val="0"/>
+                <w:color w:val="111827"/>
+                <w:sz w:val="16"/>
+              </w:rPr>
+              <w:t>completion_time_seconds/comprehension_yes_no/meaning_lift_1_5/differentiation_1_5/return_intent_1_5/verbatim_quote/fatal_objection</w:t>
+            </w:r>
+          </w:p>
+        </w:tc>
+        <w:tc>
+          <w:tcPr>
+            <w:tcW w:type="dxa" w:w="1560"/>
+            <w:vAlign w:val="center"/>
+            <w:tcMar>
+              <w:top w:w="80" w:type="dxa"/>
+              <w:start w:w="120" w:type="dxa"/>
+              <w:bottom w:w="80" w:type="dxa"/>
+              <w:end w:w="120" w:type="dxa"/>
+            </w:tcMar>
+            <w:shd w:fill="F8FAFC"/>
+          </w:tcPr>
+          <w:p>
+            <w:pPr>
+              <w:spacing w:after="0"/>
+              <w:jc w:val="left"/>
+            </w:pPr>
+            <w:r>
+              <w:rPr>
+                <w:rFonts w:ascii="Arial" w:hAnsi="Arial" w:eastAsia="Arial"/>
+                <w:b w:val="0"/>
+                <w:color w:val="111827"/>
+                <w:sz w:val="16"/>
+              </w:rPr>
+              <w:t>MVP-петля остается понятной после прототипных сессий и обновления конкурентных walkthrough.</w:t>
+            </w:r>
+          </w:p>
+        </w:tc>
+        <w:tc>
+          <w:tcPr>
+            <w:tcW w:type="dxa" w:w="1560"/>
+            <w:vAlign w:val="center"/>
+            <w:tcMar>
+              <w:top w:w="80" w:type="dxa"/>
+              <w:start w:w="120" w:type="dxa"/>
+              <w:bottom w:w="80" w:type="dxa"/>
+              <w:end w:w="120" w:type="dxa"/>
+            </w:tcMar>
+            <w:shd w:fill="F8FAFC"/>
+          </w:tcPr>
+          <w:p>
+            <w:pPr>
+              <w:spacing w:after="0"/>
+              <w:jc w:val="left"/>
+            </w:pPr>
+            <w:r>
+              <w:rPr>
+                <w:rFonts w:ascii="Arial" w:hAnsi="Arial" w:eastAsia="Arial"/>
+                <w:b w:val="0"/>
+                <w:color w:val="111827"/>
+                <w:sz w:val="16"/>
+              </w:rPr>
+              <w:t>Петля требует слишком много трения или контента, либо пользователи не могут объяснить причинность.</w:t>
+            </w:r>
+          </w:p>
+        </w:tc>
+      </w:tr>
+      <w:tr>
+        <w:tc>
+          <w:tcPr>
+            <w:tcW w:type="dxa" w:w="1560"/>
+            <w:vAlign w:val="center"/>
+            <w:tcMar>
+              <w:top w:w="80" w:type="dxa"/>
+              <w:start w:w="120" w:type="dxa"/>
+              <w:bottom w:w="80" w:type="dxa"/>
+              <w:end w:w="120" w:type="dxa"/>
+            </w:tcMar>
+          </w:tcPr>
+          <w:p>
+            <w:pPr>
+              <w:spacing w:after="0"/>
+              <w:jc w:val="left"/>
+            </w:pPr>
+            <w:r>
+              <w:rPr>
+                <w:rFonts w:ascii="Arial" w:hAnsi="Arial" w:eastAsia="Arial"/>
+                <w:b w:val="0"/>
+                <w:color w:val="111827"/>
+                <w:sz w:val="16"/>
+              </w:rPr>
+              <w:t>H4/H5/H6</w:t>
+            </w:r>
+          </w:p>
+        </w:tc>
+        <w:tc>
+          <w:tcPr>
+            <w:tcW w:type="dxa" w:w="1560"/>
+            <w:vAlign w:val="center"/>
+            <w:tcMar>
+              <w:top w:w="80" w:type="dxa"/>
+              <w:start w:w="120" w:type="dxa"/>
+              <w:bottom w:w="80" w:type="dxa"/>
+              <w:end w:w="120" w:type="dxa"/>
+            </w:tcMar>
+          </w:tcPr>
+          <w:p>
+            <w:pPr>
+              <w:spacing w:after="0"/>
+              <w:jc w:val="left"/>
+            </w:pPr>
+            <w:r>
+              <w:rPr>
+                <w:rFonts w:ascii="Arial" w:hAnsi="Arial" w:eastAsia="Arial"/>
+                <w:b w:val="0"/>
+                <w:color w:val="111827"/>
+                <w:sz w:val="16"/>
+              </w:rPr>
+              <w:t>Trust, safety и границы обещания</w:t>
+            </w:r>
+          </w:p>
+        </w:tc>
+        <w:tc>
+          <w:tcPr>
+            <w:tcW w:type="dxa" w:w="1560"/>
+            <w:vAlign w:val="center"/>
+            <w:tcMar>
+              <w:top w:w="80" w:type="dxa"/>
+              <w:start w:w="120" w:type="dxa"/>
+              <w:bottom w:w="80" w:type="dxa"/>
+              <w:end w:w="120" w:type="dxa"/>
+            </w:tcMar>
+          </w:tcPr>
+          <w:p>
+            <w:pPr>
+              <w:spacing w:after="0"/>
+              <w:jc w:val="left"/>
+            </w:pPr>
+            <w:r>
+              <w:rPr>
+                <w:rFonts w:ascii="Arial" w:hAnsi="Arial" w:eastAsia="Arial"/>
+                <w:b w:val="0"/>
+                <w:color w:val="111827"/>
+                <w:sz w:val="16"/>
+              </w:rPr>
+              <w:t>Что сделало бы такой продукт небезопасным, cringe, манипулятивным или не для тебя?</w:t>
+            </w:r>
+          </w:p>
+        </w:tc>
+        <w:tc>
+          <w:tcPr>
+            <w:tcW w:type="dxa" w:w="1560"/>
+            <w:vAlign w:val="center"/>
+            <w:tcMar>
+              <w:top w:w="80" w:type="dxa"/>
+              <w:start w:w="120" w:type="dxa"/>
+              <w:bottom w:w="80" w:type="dxa"/>
+              <w:end w:w="120" w:type="dxa"/>
+            </w:tcMar>
+          </w:tcPr>
+          <w:p>
+            <w:pPr>
+              <w:spacing w:after="0"/>
+              <w:jc w:val="left"/>
+            </w:pPr>
+            <w:r>
+              <w:rPr>
+                <w:rFonts w:ascii="Arial" w:hAnsi="Arial" w:eastAsia="Arial"/>
+                <w:b w:val="0"/>
+                <w:color w:val="111827"/>
+                <w:sz w:val="16"/>
+              </w:rPr>
+              <w:t>top_objection/trust_boundary/unsafe_phrase/manipulation_signal/participant_control_needed</w:t>
+            </w:r>
+          </w:p>
+        </w:tc>
+        <w:tc>
+          <w:tcPr>
+            <w:tcW w:type="dxa" w:w="1560"/>
+            <w:vAlign w:val="center"/>
+            <w:tcMar>
+              <w:top w:w="80" w:type="dxa"/>
+              <w:start w:w="120" w:type="dxa"/>
+              <w:bottom w:w="80" w:type="dxa"/>
+              <w:end w:w="120" w:type="dxa"/>
+            </w:tcMar>
+          </w:tcPr>
+          <w:p>
+            <w:pPr>
+              <w:spacing w:after="0"/>
+              <w:jc w:val="left"/>
+            </w:pPr>
+            <w:r>
+              <w:rPr>
+                <w:rFonts w:ascii="Arial" w:hAnsi="Arial" w:eastAsia="Arial"/>
+                <w:b w:val="0"/>
+                <w:color w:val="111827"/>
+                <w:sz w:val="16"/>
+              </w:rPr>
+              <w:t>Если Alina честно ограничивает обещания и дает контролируемое мягкое guidance, она может избежать части риска spiritual/AI/self-help продуктов.</w:t>
+            </w:r>
+          </w:p>
+        </w:tc>
+        <w:tc>
+          <w:tcPr>
+            <w:tcW w:type="dxa" w:w="1560"/>
+            <w:vAlign w:val="center"/>
+            <w:tcMar>
+              <w:top w:w="80" w:type="dxa"/>
+              <w:start w:w="120" w:type="dxa"/>
+              <w:bottom w:w="80" w:type="dxa"/>
+              <w:end w:w="120" w:type="dxa"/>
+            </w:tcMar>
+          </w:tcPr>
+          <w:p>
+            <w:pPr>
+              <w:spacing w:after="0"/>
+              <w:jc w:val="left"/>
+            </w:pPr>
+            <w:r>
+              <w:rPr>
+                <w:rFonts w:ascii="Arial" w:hAnsi="Arial" w:eastAsia="Arial"/>
+                <w:b w:val="0"/>
+                <w:color w:val="111827"/>
+                <w:sz w:val="16"/>
+              </w:rPr>
+              <w:t>Ослабить H4/H6 немедленно, если возникает повторяющийся fatal trust/safety objection.</w:t>
+            </w:r>
+          </w:p>
+        </w:tc>
+      </w:tr>
+    </w:tbl>
+    <w:p/>
+    <w:p>
+      <w:r>
+        <w:t>Такой порядок удерживает исследование от преждевременного вывода: сначала формулируется гипотеза, затем показывается рынок, затем конкуренты, затем открытые сомнения, затем интервью/прототип и только после этого обновляется решение. Для мирового рынка это особенно важно: объем данных большой, но решение должно приниматься не по размеру базы, а по тому, выдерживает ли продуктовая петля ручные проверки.</w:t>
+      </w:r>
+    </w:p>
+    <w:p>
+      <w:pPr>
+        <w:pStyle w:val="Heading1"/>
+      </w:pPr>
+      <w:r>
         <w:t>ИСТОЧНИКИ И ГРАНИЦЫ ДОКАЗАТЕЛЬСТВ</w:t>
       </w:r>
     </w:p>
@@ -8216,7 +9930,7 @@
                 <w:color w:val="111827"/>
                 <w:sz w:val="16"/>
               </w:rPr>
-              <w:t>454 manifest artifacts; missing=0</w:t>
+              <w:t>455 manifest artifacts; missing=0</w:t>
             </w:r>
           </w:p>
         </w:tc>
@@ -8300,7 +10014,7 @@
         <w:spacing w:after="80"/>
       </w:pPr>
       <w:r>
-        <w:t>Финальный документ можно собирать в стиле предоставленного образца: гипотеза -&gt; рынки -&gt; конкуренты -&gt; интервью -&gt; уточнение гипотезы -&gt; MVP -&gt; вопросы -&gt; вывод.</w:t>
+        <w:t>Дальше исследование должно идти в строгой последовательности: гипотеза -&gt; рынки -&gt; конкуренты -&gt; интервью -&gt; уточнение гипотезы -&gt; MVP -&gt; вопросы -&gt; вывод.</w:t>
       </w:r>
     </w:p>
     <w:p>
@@ -8336,6 +10050,15 @@
       </w:pPr>
       <w:r>
         <w:t>data_processed/global_hypothesis_source_appendix.csv</w:t>
+      </w:r>
+    </w:p>
+    <w:p>
+      <w:pPr>
+        <w:pStyle w:val="ListBullet"/>
+        <w:spacing w:after="80"/>
+      </w:pPr>
+      <w:r>
+        <w:t>data_processed/global_hypothesis_validation_questionnaire.csv</w:t>
       </w:r>
     </w:p>
     <w:p>

</xml_diff>

<commit_message>
Add global evidence gate snapshot
</commit_message>
<xml_diff>
--- a/output/docx/alina-global-hypothesis-report-v1.docx
+++ b/output/docx/alina-global-hypothesis-report-v1.docx
@@ -31,7 +31,7 @@
     </w:p>
     <w:p>
       <w:r>
-        <w:t>Собрано: 2026-05-31T15:04:22.840Z</w:t>
+        <w:t>Собрано: 2026-05-31T15:08:22.216Z</w:t>
       </w:r>
     </w:p>
     <w:p>
@@ -59,7 +59,1417 @@
     </w:p>
     <w:p>
       <w:r>
-        <w:t>На текущем этапе собрано 67,525 raw source rows, 36,694 dedup rows и 455 локальных артефактов. Эти данные нужны не для того, чтобы объявить продукт доказанным, а для последовательной проверки: существует ли рынок, есть ли деньги, насколько плотна конкуренция, где может быть белое пятно, кто аудитория и какую MVP-петлю надо тестировать.</w:t>
+        <w:t>На текущем этапе собрано 67,525 сырьевых source-строк, 36,694 уникализированных строк и 456 локальных артефактов. Эти данные нужны не для того, чтобы объявить продукт доказанным, а для последовательной проверки: существует ли рынок, есть ли деньги, насколько плотна конкуренция, где может быть белое пятно, кто аудитория и какую MVP-петлю надо тестировать.</w:t>
+      </w:r>
+    </w:p>
+    <w:p>
+      <w:pPr>
+        <w:pStyle w:val="Heading1"/>
+      </w:pPr>
+      <w:r>
+        <w:t>ТЕКУЩИЙ СТАТУС ДОКАЗАТЕЛЬСТВ</w:t>
+      </w:r>
+    </w:p>
+    <w:p>
+      <w:r>
+        <w:t>На этом этапе исследование уже масштабное как база источников, но еще не завершенное как наблюдаемая валидация. Поэтому главный вывод должен звучать аккуратно: кабинетный ресерч подтверждает, что направление стоит проверять, но большинство гипотез пока нельзя переводить в “доказано”. Ниже показано, какие ворота уже имеют наблюдаемые строки, а где пока есть только подготовленный пакет для ручной проверки.</w:t>
+      </w:r>
+    </w:p>
+    <w:tbl>
+      <w:tblPr>
+        <w:tblW w:type="dxa" w:w="9360"/>
+        <w:jc w:val="left"/>
+        <w:tblLayout w:type="fixed"/>
+        <w:tblLook w:firstColumn="1" w:firstRow="1" w:lastColumn="0" w:lastRow="0" w:noHBand="0" w:noVBand="1" w:val="04A0"/>
+        <w:tblInd w:w="120" w:type="dxa"/>
+        <w:tblBorders>
+          <w:top w:val="single" w:sz="4" w:space="0" w:color="CBD5E1"/>
+          <w:left w:val="single" w:sz="4" w:space="0" w:color="CBD5E1"/>
+          <w:bottom w:val="single" w:sz="4" w:space="0" w:color="CBD5E1"/>
+          <w:right w:val="single" w:sz="4" w:space="0" w:color="CBD5E1"/>
+          <w:insideH w:val="single" w:sz="4" w:space="0" w:color="CBD5E1"/>
+          <w:insideV w:val="single" w:sz="4" w:space="0" w:color="CBD5E1"/>
+        </w:tblBorders>
+      </w:tblPr>
+      <w:tblGrid>
+        <w:gridCol w:w="1337"/>
+        <w:gridCol w:w="1337"/>
+        <w:gridCol w:w="1337"/>
+        <w:gridCol w:w="1337"/>
+        <w:gridCol w:w="1337"/>
+        <w:gridCol w:w="1337"/>
+        <w:gridCol w:w="1337"/>
+      </w:tblGrid>
+      <w:tr>
+        <w:tc>
+          <w:tcPr>
+            <w:tcW w:type="dxa" w:w="1337"/>
+            <w:vAlign w:val="center"/>
+            <w:tcMar>
+              <w:top w:w="80" w:type="dxa"/>
+              <w:start w:w="120" w:type="dxa"/>
+              <w:bottom w:w="80" w:type="dxa"/>
+              <w:end w:w="120" w:type="dxa"/>
+            </w:tcMar>
+            <w:shd w:fill="E8EEF5"/>
+          </w:tcPr>
+          <w:p>
+            <w:pPr>
+              <w:spacing w:after="0"/>
+              <w:jc w:val="left"/>
+            </w:pPr>
+            <w:r>
+              <w:rPr>
+                <w:rFonts w:ascii="Arial" w:hAnsi="Arial" w:eastAsia="Arial"/>
+                <w:b/>
+                <w:color w:val="111827"/>
+                <w:sz w:val="16"/>
+              </w:rPr>
+              <w:t>Гипотеза</w:t>
+            </w:r>
+          </w:p>
+        </w:tc>
+        <w:tc>
+          <w:tcPr>
+            <w:tcW w:type="dxa" w:w="1337"/>
+            <w:vAlign w:val="center"/>
+            <w:tcMar>
+              <w:top w:w="80" w:type="dxa"/>
+              <w:start w:w="120" w:type="dxa"/>
+              <w:bottom w:w="80" w:type="dxa"/>
+              <w:end w:w="120" w:type="dxa"/>
+            </w:tcMar>
+            <w:shd w:fill="E8EEF5"/>
+          </w:tcPr>
+          <w:p>
+            <w:pPr>
+              <w:spacing w:after="0"/>
+              <w:jc w:val="left"/>
+            </w:pPr>
+            <w:r>
+              <w:rPr>
+                <w:rFonts w:ascii="Arial" w:hAnsi="Arial" w:eastAsia="Arial"/>
+                <w:b/>
+                <w:color w:val="111827"/>
+                <w:sz w:val="16"/>
+              </w:rPr>
+              <w:t>Что проверяем</w:t>
+            </w:r>
+          </w:p>
+        </w:tc>
+        <w:tc>
+          <w:tcPr>
+            <w:tcW w:type="dxa" w:w="1337"/>
+            <w:vAlign w:val="center"/>
+            <w:tcMar>
+              <w:top w:w="80" w:type="dxa"/>
+              <w:start w:w="120" w:type="dxa"/>
+              <w:bottom w:w="80" w:type="dxa"/>
+              <w:end w:w="120" w:type="dxa"/>
+            </w:tcMar>
+            <w:shd w:fill="E8EEF5"/>
+          </w:tcPr>
+          <w:p>
+            <w:pPr>
+              <w:spacing w:after="0"/>
+              <w:jc w:val="left"/>
+            </w:pPr>
+            <w:r>
+              <w:rPr>
+                <w:rFonts w:ascii="Arial" w:hAnsi="Arial" w:eastAsia="Arial"/>
+                <w:b/>
+                <w:color w:val="111827"/>
+                <w:sz w:val="16"/>
+              </w:rPr>
+              <w:t>Поток проверки</w:t>
+            </w:r>
+          </w:p>
+        </w:tc>
+        <w:tc>
+          <w:tcPr>
+            <w:tcW w:type="dxa" w:w="1337"/>
+            <w:vAlign w:val="center"/>
+            <w:tcMar>
+              <w:top w:w="80" w:type="dxa"/>
+              <w:start w:w="120" w:type="dxa"/>
+              <w:bottom w:w="80" w:type="dxa"/>
+              <w:end w:w="120" w:type="dxa"/>
+            </w:tcMar>
+            <w:shd w:fill="E8EEF5"/>
+          </w:tcPr>
+          <w:p>
+            <w:pPr>
+              <w:spacing w:after="0"/>
+              <w:jc w:val="left"/>
+            </w:pPr>
+            <w:r>
+              <w:rPr>
+                <w:rFonts w:ascii="Arial" w:hAnsi="Arial" w:eastAsia="Arial"/>
+                <w:b/>
+                <w:color w:val="111827"/>
+                <w:sz w:val="16"/>
+              </w:rPr>
+              <w:t>Статус</w:t>
+            </w:r>
+          </w:p>
+        </w:tc>
+        <w:tc>
+          <w:tcPr>
+            <w:tcW w:type="dxa" w:w="1337"/>
+            <w:vAlign w:val="center"/>
+            <w:tcMar>
+              <w:top w:w="80" w:type="dxa"/>
+              <w:start w:w="120" w:type="dxa"/>
+              <w:bottom w:w="80" w:type="dxa"/>
+              <w:end w:w="120" w:type="dxa"/>
+            </w:tcMar>
+            <w:shd w:fill="E8EEF5"/>
+          </w:tcPr>
+          <w:p>
+            <w:pPr>
+              <w:spacing w:after="0"/>
+              <w:jc w:val="left"/>
+            </w:pPr>
+            <w:r>
+              <w:rPr>
+                <w:rFonts w:ascii="Arial" w:hAnsi="Arial" w:eastAsia="Arial"/>
+                <w:b/>
+                <w:color w:val="111827"/>
+                <w:sz w:val="16"/>
+              </w:rPr>
+              <w:t>Заполнено / нужно</w:t>
+            </w:r>
+          </w:p>
+        </w:tc>
+        <w:tc>
+          <w:tcPr>
+            <w:tcW w:type="dxa" w:w="1337"/>
+            <w:vAlign w:val="center"/>
+            <w:tcMar>
+              <w:top w:w="80" w:type="dxa"/>
+              <w:start w:w="120" w:type="dxa"/>
+              <w:bottom w:w="80" w:type="dxa"/>
+              <w:end w:w="120" w:type="dxa"/>
+            </w:tcMar>
+            <w:shd w:fill="E8EEF5"/>
+          </w:tcPr>
+          <w:p>
+            <w:pPr>
+              <w:spacing w:after="0"/>
+              <w:jc w:val="left"/>
+            </w:pPr>
+            <w:r>
+              <w:rPr>
+                <w:rFonts w:ascii="Arial" w:hAnsi="Arial" w:eastAsia="Arial"/>
+                <w:b/>
+                <w:color w:val="111827"/>
+                <w:sz w:val="16"/>
+              </w:rPr>
+              <w:t>Успехи / порог</w:t>
+            </w:r>
+          </w:p>
+        </w:tc>
+        <w:tc>
+          <w:tcPr>
+            <w:tcW w:type="dxa" w:w="1337"/>
+            <w:vAlign w:val="center"/>
+            <w:tcMar>
+              <w:top w:w="80" w:type="dxa"/>
+              <w:start w:w="120" w:type="dxa"/>
+              <w:bottom w:w="80" w:type="dxa"/>
+              <w:end w:w="120" w:type="dxa"/>
+            </w:tcMar>
+            <w:shd w:fill="E8EEF5"/>
+          </w:tcPr>
+          <w:p>
+            <w:pPr>
+              <w:spacing w:after="0"/>
+              <w:jc w:val="left"/>
+            </w:pPr>
+            <w:r>
+              <w:rPr>
+                <w:rFonts w:ascii="Arial" w:hAnsi="Arial" w:eastAsia="Arial"/>
+                <w:b/>
+                <w:color w:val="111827"/>
+                <w:sz w:val="16"/>
+              </w:rPr>
+              <w:t>Решение сейчас</w:t>
+            </w:r>
+          </w:p>
+        </w:tc>
+      </w:tr>
+      <w:tr>
+        <w:tc>
+          <w:tcPr>
+            <w:tcW w:type="dxa" w:w="1337"/>
+            <w:vAlign w:val="center"/>
+            <w:tcMar>
+              <w:top w:w="80" w:type="dxa"/>
+              <w:start w:w="120" w:type="dxa"/>
+              <w:bottom w:w="80" w:type="dxa"/>
+              <w:end w:w="120" w:type="dxa"/>
+            </w:tcMar>
+          </w:tcPr>
+          <w:p>
+            <w:pPr>
+              <w:spacing w:after="0"/>
+              <w:jc w:val="left"/>
+            </w:pPr>
+            <w:r>
+              <w:rPr>
+                <w:rFonts w:ascii="Arial" w:hAnsi="Arial" w:eastAsia="Arial"/>
+                <w:b w:val="0"/>
+                <w:color w:val="111827"/>
+                <w:sz w:val="16"/>
+              </w:rPr>
+              <w:t>H1</w:t>
+            </w:r>
+          </w:p>
+        </w:tc>
+        <w:tc>
+          <w:tcPr>
+            <w:tcW w:type="dxa" w:w="1337"/>
+            <w:vAlign w:val="center"/>
+            <w:tcMar>
+              <w:top w:w="80" w:type="dxa"/>
+              <w:start w:w="120" w:type="dxa"/>
+              <w:bottom w:w="80" w:type="dxa"/>
+              <w:end w:w="120" w:type="dxa"/>
+            </w:tcMar>
+          </w:tcPr>
+          <w:p>
+            <w:pPr>
+              <w:spacing w:after="0"/>
+              <w:jc w:val="left"/>
+            </w:pPr>
+            <w:r>
+              <w:rPr>
+                <w:rFonts w:ascii="Arial" w:hAnsi="Arial" w:eastAsia="Arial"/>
+                <w:b w:val="0"/>
+                <w:color w:val="111827"/>
+                <w:sz w:val="16"/>
+              </w:rPr>
+              <w:t>форма продукта существует</w:t>
+            </w:r>
+          </w:p>
+        </w:tc>
+        <w:tc>
+          <w:tcPr>
+            <w:tcW w:type="dxa" w:w="1337"/>
+            <w:vAlign w:val="center"/>
+            <w:tcMar>
+              <w:top w:w="80" w:type="dxa"/>
+              <w:start w:w="120" w:type="dxa"/>
+              <w:bottom w:w="80" w:type="dxa"/>
+              <w:end w:w="120" w:type="dxa"/>
+            </w:tcMar>
+          </w:tcPr>
+          <w:p>
+            <w:pPr>
+              <w:spacing w:after="0"/>
+              <w:jc w:val="left"/>
+            </w:pPr>
+            <w:r>
+              <w:rPr>
+                <w:rFonts w:ascii="Arial" w:hAnsi="Arial" w:eastAsia="Arial"/>
+                <w:b w:val="0"/>
+                <w:color w:val="111827"/>
+                <w:sz w:val="16"/>
+              </w:rPr>
+              <w:t>ручной walkthrough конкурентов</w:t>
+            </w:r>
+          </w:p>
+        </w:tc>
+        <w:tc>
+          <w:tcPr>
+            <w:tcW w:type="dxa" w:w="1337"/>
+            <w:vAlign w:val="center"/>
+            <w:tcMar>
+              <w:top w:w="80" w:type="dxa"/>
+              <w:start w:w="120" w:type="dxa"/>
+              <w:bottom w:w="80" w:type="dxa"/>
+              <w:end w:w="120" w:type="dxa"/>
+            </w:tcMar>
+          </w:tcPr>
+          <w:p>
+            <w:pPr>
+              <w:spacing w:after="0"/>
+              <w:jc w:val="left"/>
+            </w:pPr>
+            <w:r>
+              <w:rPr>
+                <w:rFonts w:ascii="Arial" w:hAnsi="Arial" w:eastAsia="Arial"/>
+                <w:b w:val="0"/>
+                <w:color w:val="111827"/>
+                <w:sz w:val="16"/>
+              </w:rPr>
+              <w:t>не начато</w:t>
+            </w:r>
+          </w:p>
+        </w:tc>
+        <w:tc>
+          <w:tcPr>
+            <w:tcW w:type="dxa" w:w="1337"/>
+            <w:vAlign w:val="center"/>
+            <w:tcMar>
+              <w:top w:w="80" w:type="dxa"/>
+              <w:start w:w="120" w:type="dxa"/>
+              <w:bottom w:w="80" w:type="dxa"/>
+              <w:end w:w="120" w:type="dxa"/>
+            </w:tcMar>
+          </w:tcPr>
+          <w:p>
+            <w:pPr>
+              <w:spacing w:after="0"/>
+              <w:jc w:val="left"/>
+            </w:pPr>
+            <w:r>
+              <w:rPr>
+                <w:rFonts w:ascii="Arial" w:hAnsi="Arial" w:eastAsia="Arial"/>
+                <w:b w:val="0"/>
+                <w:color w:val="111827"/>
+                <w:sz w:val="16"/>
+              </w:rPr>
+              <w:t>0 / 60</w:t>
+            </w:r>
+          </w:p>
+        </w:tc>
+        <w:tc>
+          <w:tcPr>
+            <w:tcW w:type="dxa" w:w="1337"/>
+            <w:vAlign w:val="center"/>
+            <w:tcMar>
+              <w:top w:w="80" w:type="dxa"/>
+              <w:start w:w="120" w:type="dxa"/>
+              <w:bottom w:w="80" w:type="dxa"/>
+              <w:end w:w="120" w:type="dxa"/>
+            </w:tcMar>
+          </w:tcPr>
+          <w:p>
+            <w:pPr>
+              <w:spacing w:after="0"/>
+              <w:jc w:val="left"/>
+            </w:pPr>
+            <w:r>
+              <w:rPr>
+                <w:rFonts w:ascii="Arial" w:hAnsi="Arial" w:eastAsia="Arial"/>
+                <w:b w:val="0"/>
+                <w:color w:val="111827"/>
+                <w:sz w:val="16"/>
+              </w:rPr>
+              <w:t>0 / 25</w:t>
+            </w:r>
+          </w:p>
+        </w:tc>
+        <w:tc>
+          <w:tcPr>
+            <w:tcW w:type="dxa" w:w="1337"/>
+            <w:vAlign w:val="center"/>
+            <w:tcMar>
+              <w:top w:w="80" w:type="dxa"/>
+              <w:start w:w="120" w:type="dxa"/>
+              <w:bottom w:w="80" w:type="dxa"/>
+              <w:end w:w="120" w:type="dxa"/>
+            </w:tcMar>
+          </w:tcPr>
+          <w:p>
+            <w:pPr>
+              <w:spacing w:after="0"/>
+              <w:jc w:val="left"/>
+            </w:pPr>
+            <w:r>
+              <w:rPr>
+                <w:rFonts w:ascii="Arial" w:hAnsi="Arial" w:eastAsia="Arial"/>
+                <w:b w:val="0"/>
+                <w:color w:val="111827"/>
+                <w:sz w:val="16"/>
+              </w:rPr>
+              <w:t>оставить hold_validate</w:t>
+            </w:r>
+          </w:p>
+        </w:tc>
+      </w:tr>
+      <w:tr>
+        <w:tc>
+          <w:tcPr>
+            <w:tcW w:type="dxa" w:w="1337"/>
+            <w:vAlign w:val="center"/>
+            <w:tcMar>
+              <w:top w:w="80" w:type="dxa"/>
+              <w:start w:w="120" w:type="dxa"/>
+              <w:bottom w:w="80" w:type="dxa"/>
+              <w:end w:w="120" w:type="dxa"/>
+            </w:tcMar>
+            <w:shd w:fill="F8FAFC"/>
+          </w:tcPr>
+          <w:p>
+            <w:pPr>
+              <w:spacing w:after="0"/>
+              <w:jc w:val="left"/>
+            </w:pPr>
+            <w:r>
+              <w:rPr>
+                <w:rFonts w:ascii="Arial" w:hAnsi="Arial" w:eastAsia="Arial"/>
+                <w:b w:val="0"/>
+                <w:color w:val="111827"/>
+                <w:sz w:val="16"/>
+              </w:rPr>
+              <w:t>H3</w:t>
+            </w:r>
+          </w:p>
+        </w:tc>
+        <w:tc>
+          <w:tcPr>
+            <w:tcW w:type="dxa" w:w="1337"/>
+            <w:vAlign w:val="center"/>
+            <w:tcMar>
+              <w:top w:w="80" w:type="dxa"/>
+              <w:start w:w="120" w:type="dxa"/>
+              <w:bottom w:w="80" w:type="dxa"/>
+              <w:end w:w="120" w:type="dxa"/>
+            </w:tcMar>
+            <w:shd w:fill="F8FAFC"/>
+          </w:tcPr>
+          <w:p>
+            <w:pPr>
+              <w:spacing w:after="0"/>
+              <w:jc w:val="left"/>
+            </w:pPr>
+            <w:r>
+              <w:rPr>
+                <w:rFonts w:ascii="Arial" w:hAnsi="Arial" w:eastAsia="Arial"/>
+                <w:b w:val="0"/>
+                <w:color w:val="111827"/>
+                <w:sz w:val="16"/>
+              </w:rPr>
+              <w:t>есть узкое белое пятно</w:t>
+            </w:r>
+          </w:p>
+        </w:tc>
+        <w:tc>
+          <w:tcPr>
+            <w:tcW w:type="dxa" w:w="1337"/>
+            <w:vAlign w:val="center"/>
+            <w:tcMar>
+              <w:top w:w="80" w:type="dxa"/>
+              <w:start w:w="120" w:type="dxa"/>
+              <w:bottom w:w="80" w:type="dxa"/>
+              <w:end w:w="120" w:type="dxa"/>
+            </w:tcMar>
+            <w:shd w:fill="F8FAFC"/>
+          </w:tcPr>
+          <w:p>
+            <w:pPr>
+              <w:spacing w:after="0"/>
+              <w:jc w:val="left"/>
+            </w:pPr>
+            <w:r>
+              <w:rPr>
+                <w:rFonts w:ascii="Arial" w:hAnsi="Arial" w:eastAsia="Arial"/>
+                <w:b w:val="0"/>
+                <w:color w:val="111827"/>
+                <w:sz w:val="16"/>
+              </w:rPr>
+              <w:t>ручной walkthrough конкурентов</w:t>
+            </w:r>
+          </w:p>
+        </w:tc>
+        <w:tc>
+          <w:tcPr>
+            <w:tcW w:type="dxa" w:w="1337"/>
+            <w:vAlign w:val="center"/>
+            <w:tcMar>
+              <w:top w:w="80" w:type="dxa"/>
+              <w:start w:w="120" w:type="dxa"/>
+              <w:bottom w:w="80" w:type="dxa"/>
+              <w:end w:w="120" w:type="dxa"/>
+            </w:tcMar>
+            <w:shd w:fill="F8FAFC"/>
+          </w:tcPr>
+          <w:p>
+            <w:pPr>
+              <w:spacing w:after="0"/>
+              <w:jc w:val="left"/>
+            </w:pPr>
+            <w:r>
+              <w:rPr>
+                <w:rFonts w:ascii="Arial" w:hAnsi="Arial" w:eastAsia="Arial"/>
+                <w:b w:val="0"/>
+                <w:color w:val="111827"/>
+                <w:sz w:val="16"/>
+              </w:rPr>
+              <w:t>не начато</w:t>
+            </w:r>
+          </w:p>
+        </w:tc>
+        <w:tc>
+          <w:tcPr>
+            <w:tcW w:type="dxa" w:w="1337"/>
+            <w:vAlign w:val="center"/>
+            <w:tcMar>
+              <w:top w:w="80" w:type="dxa"/>
+              <w:start w:w="120" w:type="dxa"/>
+              <w:bottom w:w="80" w:type="dxa"/>
+              <w:end w:w="120" w:type="dxa"/>
+            </w:tcMar>
+            <w:shd w:fill="F8FAFC"/>
+          </w:tcPr>
+          <w:p>
+            <w:pPr>
+              <w:spacing w:after="0"/>
+              <w:jc w:val="left"/>
+            </w:pPr>
+            <w:r>
+              <w:rPr>
+                <w:rFonts w:ascii="Arial" w:hAnsi="Arial" w:eastAsia="Arial"/>
+                <w:b w:val="0"/>
+                <w:color w:val="111827"/>
+                <w:sz w:val="16"/>
+              </w:rPr>
+              <w:t>0 / 60</w:t>
+            </w:r>
+          </w:p>
+        </w:tc>
+        <w:tc>
+          <w:tcPr>
+            <w:tcW w:type="dxa" w:w="1337"/>
+            <w:vAlign w:val="center"/>
+            <w:tcMar>
+              <w:top w:w="80" w:type="dxa"/>
+              <w:start w:w="120" w:type="dxa"/>
+              <w:bottom w:w="80" w:type="dxa"/>
+              <w:end w:w="120" w:type="dxa"/>
+            </w:tcMar>
+            <w:shd w:fill="F8FAFC"/>
+          </w:tcPr>
+          <w:p>
+            <w:pPr>
+              <w:spacing w:after="0"/>
+              <w:jc w:val="left"/>
+            </w:pPr>
+            <w:r>
+              <w:rPr>
+                <w:rFonts w:ascii="Arial" w:hAnsi="Arial" w:eastAsia="Arial"/>
+                <w:b w:val="0"/>
+                <w:color w:val="111827"/>
+                <w:sz w:val="16"/>
+              </w:rPr>
+              <w:t>0 / 25</w:t>
+            </w:r>
+          </w:p>
+        </w:tc>
+        <w:tc>
+          <w:tcPr>
+            <w:tcW w:type="dxa" w:w="1337"/>
+            <w:vAlign w:val="center"/>
+            <w:tcMar>
+              <w:top w:w="80" w:type="dxa"/>
+              <w:start w:w="120" w:type="dxa"/>
+              <w:bottom w:w="80" w:type="dxa"/>
+              <w:end w:w="120" w:type="dxa"/>
+            </w:tcMar>
+            <w:shd w:fill="F8FAFC"/>
+          </w:tcPr>
+          <w:p>
+            <w:pPr>
+              <w:spacing w:after="0"/>
+              <w:jc w:val="left"/>
+            </w:pPr>
+            <w:r>
+              <w:rPr>
+                <w:rFonts w:ascii="Arial" w:hAnsi="Arial" w:eastAsia="Arial"/>
+                <w:b w:val="0"/>
+                <w:color w:val="111827"/>
+                <w:sz w:val="16"/>
+              </w:rPr>
+              <w:t>оставить hold_validate</w:t>
+            </w:r>
+          </w:p>
+        </w:tc>
+      </w:tr>
+      <w:tr>
+        <w:tc>
+          <w:tcPr>
+            <w:tcW w:type="dxa" w:w="1337"/>
+            <w:vAlign w:val="center"/>
+            <w:tcMar>
+              <w:top w:w="80" w:type="dxa"/>
+              <w:start w:w="120" w:type="dxa"/>
+              <w:bottom w:w="80" w:type="dxa"/>
+              <w:end w:w="120" w:type="dxa"/>
+            </w:tcMar>
+          </w:tcPr>
+          <w:p>
+            <w:pPr>
+              <w:spacing w:after="0"/>
+              <w:jc w:val="left"/>
+            </w:pPr>
+            <w:r>
+              <w:rPr>
+                <w:rFonts w:ascii="Arial" w:hAnsi="Arial" w:eastAsia="Arial"/>
+                <w:b w:val="0"/>
+                <w:color w:val="111827"/>
+                <w:sz w:val="16"/>
+              </w:rPr>
+              <w:t>H2</w:t>
+            </w:r>
+          </w:p>
+        </w:tc>
+        <w:tc>
+          <w:tcPr>
+            <w:tcW w:type="dxa" w:w="1337"/>
+            <w:vAlign w:val="center"/>
+            <w:tcMar>
+              <w:top w:w="80" w:type="dxa"/>
+              <w:start w:w="120" w:type="dxa"/>
+              <w:bottom w:w="80" w:type="dxa"/>
+              <w:end w:w="120" w:type="dxa"/>
+            </w:tcMar>
+          </w:tcPr>
+          <w:p>
+            <w:pPr>
+              <w:spacing w:after="0"/>
+              <w:jc w:val="left"/>
+            </w:pPr>
+            <w:r>
+              <w:rPr>
+                <w:rFonts w:ascii="Arial" w:hAnsi="Arial" w:eastAsia="Arial"/>
+                <w:b w:val="0"/>
+                <w:color w:val="111827"/>
+                <w:sz w:val="16"/>
+              </w:rPr>
+              <w:t>в рынках есть деньги</w:t>
+            </w:r>
+          </w:p>
+        </w:tc>
+        <w:tc>
+          <w:tcPr>
+            <w:tcW w:type="dxa" w:w="1337"/>
+            <w:vAlign w:val="center"/>
+            <w:tcMar>
+              <w:top w:w="80" w:type="dxa"/>
+              <w:start w:w="120" w:type="dxa"/>
+              <w:bottom w:w="80" w:type="dxa"/>
+              <w:end w:w="120" w:type="dxa"/>
+            </w:tcMar>
+          </w:tcPr>
+          <w:p>
+            <w:pPr>
+              <w:spacing w:after="0"/>
+              <w:jc w:val="left"/>
+            </w:pPr>
+            <w:r>
+              <w:rPr>
+                <w:rFonts w:ascii="Arial" w:hAnsi="Arial" w:eastAsia="Arial"/>
+                <w:b w:val="0"/>
+                <w:color w:val="111827"/>
+                <w:sz w:val="16"/>
+              </w:rPr>
+              <w:t>проверка paywall и платной глубины</w:t>
+            </w:r>
+          </w:p>
+        </w:tc>
+        <w:tc>
+          <w:tcPr>
+            <w:tcW w:type="dxa" w:w="1337"/>
+            <w:vAlign w:val="center"/>
+            <w:tcMar>
+              <w:top w:w="80" w:type="dxa"/>
+              <w:start w:w="120" w:type="dxa"/>
+              <w:bottom w:w="80" w:type="dxa"/>
+              <w:end w:w="120" w:type="dxa"/>
+            </w:tcMar>
+          </w:tcPr>
+          <w:p>
+            <w:pPr>
+              <w:spacing w:after="0"/>
+              <w:jc w:val="left"/>
+            </w:pPr>
+            <w:r>
+              <w:rPr>
+                <w:rFonts w:ascii="Arial" w:hAnsi="Arial" w:eastAsia="Arial"/>
+                <w:b w:val="0"/>
+                <w:color w:val="111827"/>
+                <w:sz w:val="16"/>
+              </w:rPr>
+              <w:t>начато, но доказательств недостаточно</w:t>
+            </w:r>
+          </w:p>
+        </w:tc>
+        <w:tc>
+          <w:tcPr>
+            <w:tcW w:type="dxa" w:w="1337"/>
+            <w:vAlign w:val="center"/>
+            <w:tcMar>
+              <w:top w:w="80" w:type="dxa"/>
+              <w:start w:w="120" w:type="dxa"/>
+              <w:bottom w:w="80" w:type="dxa"/>
+              <w:end w:w="120" w:type="dxa"/>
+            </w:tcMar>
+          </w:tcPr>
+          <w:p>
+            <w:pPr>
+              <w:spacing w:after="0"/>
+              <w:jc w:val="left"/>
+            </w:pPr>
+            <w:r>
+              <w:rPr>
+                <w:rFonts w:ascii="Arial" w:hAnsi="Arial" w:eastAsia="Arial"/>
+                <w:b w:val="0"/>
+                <w:color w:val="111827"/>
+                <w:sz w:val="16"/>
+              </w:rPr>
+              <w:t>8 / 40</w:t>
+            </w:r>
+          </w:p>
+        </w:tc>
+        <w:tc>
+          <w:tcPr>
+            <w:tcW w:type="dxa" w:w="1337"/>
+            <w:vAlign w:val="center"/>
+            <w:tcMar>
+              <w:top w:w="80" w:type="dxa"/>
+              <w:start w:w="120" w:type="dxa"/>
+              <w:bottom w:w="80" w:type="dxa"/>
+              <w:end w:w="120" w:type="dxa"/>
+            </w:tcMar>
+          </w:tcPr>
+          <w:p>
+            <w:pPr>
+              <w:spacing w:after="0"/>
+              <w:jc w:val="left"/>
+            </w:pPr>
+            <w:r>
+              <w:rPr>
+                <w:rFonts w:ascii="Arial" w:hAnsi="Arial" w:eastAsia="Arial"/>
+                <w:b w:val="0"/>
+                <w:color w:val="111827"/>
+                <w:sz w:val="16"/>
+              </w:rPr>
+              <w:t>8 / 12</w:t>
+            </w:r>
+          </w:p>
+        </w:tc>
+        <w:tc>
+          <w:tcPr>
+            <w:tcW w:type="dxa" w:w="1337"/>
+            <w:vAlign w:val="center"/>
+            <w:tcMar>
+              <w:top w:w="80" w:type="dxa"/>
+              <w:start w:w="120" w:type="dxa"/>
+              <w:bottom w:w="80" w:type="dxa"/>
+              <w:end w:w="120" w:type="dxa"/>
+            </w:tcMar>
+          </w:tcPr>
+          <w:p>
+            <w:pPr>
+              <w:spacing w:after="0"/>
+              <w:jc w:val="left"/>
+            </w:pPr>
+            <w:r>
+              <w:rPr>
+                <w:rFonts w:ascii="Arial" w:hAnsi="Arial" w:eastAsia="Arial"/>
+                <w:b w:val="0"/>
+                <w:color w:val="111827"/>
+                <w:sz w:val="16"/>
+              </w:rPr>
+              <w:t>оставить hold_validate</w:t>
+            </w:r>
+          </w:p>
+        </w:tc>
+      </w:tr>
+      <w:tr>
+        <w:tc>
+          <w:tcPr>
+            <w:tcW w:type="dxa" w:w="1337"/>
+            <w:vAlign w:val="center"/>
+            <w:tcMar>
+              <w:top w:w="80" w:type="dxa"/>
+              <w:start w:w="120" w:type="dxa"/>
+              <w:bottom w:w="80" w:type="dxa"/>
+              <w:end w:w="120" w:type="dxa"/>
+            </w:tcMar>
+            <w:shd w:fill="F8FAFC"/>
+          </w:tcPr>
+          <w:p>
+            <w:pPr>
+              <w:spacing w:after="0"/>
+              <w:jc w:val="left"/>
+            </w:pPr>
+            <w:r>
+              <w:rPr>
+                <w:rFonts w:ascii="Arial" w:hAnsi="Arial" w:eastAsia="Arial"/>
+                <w:b w:val="0"/>
+                <w:color w:val="111827"/>
+                <w:sz w:val="16"/>
+              </w:rPr>
+              <w:t>H5</w:t>
+            </w:r>
+          </w:p>
+        </w:tc>
+        <w:tc>
+          <w:tcPr>
+            <w:tcW w:type="dxa" w:w="1337"/>
+            <w:vAlign w:val="center"/>
+            <w:tcMar>
+              <w:top w:w="80" w:type="dxa"/>
+              <w:start w:w="120" w:type="dxa"/>
+              <w:bottom w:w="80" w:type="dxa"/>
+              <w:end w:w="120" w:type="dxa"/>
+            </w:tcMar>
+            <w:shd w:fill="F8FAFC"/>
+          </w:tcPr>
+          <w:p>
+            <w:pPr>
+              <w:spacing w:after="0"/>
+              <w:jc w:val="left"/>
+            </w:pPr>
+            <w:r>
+              <w:rPr>
+                <w:rFonts w:ascii="Arial" w:hAnsi="Arial" w:eastAsia="Arial"/>
+                <w:b w:val="0"/>
+                <w:color w:val="111827"/>
+                <w:sz w:val="16"/>
+              </w:rPr>
+              <w:t>общая аудитория существует</w:t>
+            </w:r>
+          </w:p>
+        </w:tc>
+        <w:tc>
+          <w:tcPr>
+            <w:tcW w:type="dxa" w:w="1337"/>
+            <w:vAlign w:val="center"/>
+            <w:tcMar>
+              <w:top w:w="80" w:type="dxa"/>
+              <w:start w:w="120" w:type="dxa"/>
+              <w:bottom w:w="80" w:type="dxa"/>
+              <w:end w:w="120" w:type="dxa"/>
+            </w:tcMar>
+            <w:shd w:fill="F8FAFC"/>
+          </w:tcPr>
+          <w:p>
+            <w:pPr>
+              <w:spacing w:after="0"/>
+              <w:jc w:val="left"/>
+            </w:pPr>
+            <w:r>
+              <w:rPr>
+                <w:rFonts w:ascii="Arial" w:hAnsi="Arial" w:eastAsia="Arial"/>
+                <w:b w:val="0"/>
+                <w:color w:val="111827"/>
+                <w:sz w:val="16"/>
+              </w:rPr>
+              <w:t>интервью ICP и recent behavior</w:t>
+            </w:r>
+          </w:p>
+        </w:tc>
+        <w:tc>
+          <w:tcPr>
+            <w:tcW w:type="dxa" w:w="1337"/>
+            <w:vAlign w:val="center"/>
+            <w:tcMar>
+              <w:top w:w="80" w:type="dxa"/>
+              <w:start w:w="120" w:type="dxa"/>
+              <w:bottom w:w="80" w:type="dxa"/>
+              <w:end w:w="120" w:type="dxa"/>
+            </w:tcMar>
+            <w:shd w:fill="F8FAFC"/>
+          </w:tcPr>
+          <w:p>
+            <w:pPr>
+              <w:spacing w:after="0"/>
+              <w:jc w:val="left"/>
+            </w:pPr>
+            <w:r>
+              <w:rPr>
+                <w:rFonts w:ascii="Arial" w:hAnsi="Arial" w:eastAsia="Arial"/>
+                <w:b w:val="0"/>
+                <w:color w:val="111827"/>
+                <w:sz w:val="16"/>
+              </w:rPr>
+              <w:t>не начато</w:t>
+            </w:r>
+          </w:p>
+        </w:tc>
+        <w:tc>
+          <w:tcPr>
+            <w:tcW w:type="dxa" w:w="1337"/>
+            <w:vAlign w:val="center"/>
+            <w:tcMar>
+              <w:top w:w="80" w:type="dxa"/>
+              <w:start w:w="120" w:type="dxa"/>
+              <w:bottom w:w="80" w:type="dxa"/>
+              <w:end w:w="120" w:type="dxa"/>
+            </w:tcMar>
+            <w:shd w:fill="F8FAFC"/>
+          </w:tcPr>
+          <w:p>
+            <w:pPr>
+              <w:spacing w:after="0"/>
+              <w:jc w:val="left"/>
+            </w:pPr>
+            <w:r>
+              <w:rPr>
+                <w:rFonts w:ascii="Arial" w:hAnsi="Arial" w:eastAsia="Arial"/>
+                <w:b w:val="0"/>
+                <w:color w:val="111827"/>
+                <w:sz w:val="16"/>
+              </w:rPr>
+              <w:t>0 / 96</w:t>
+            </w:r>
+          </w:p>
+        </w:tc>
+        <w:tc>
+          <w:tcPr>
+            <w:tcW w:type="dxa" w:w="1337"/>
+            <w:vAlign w:val="center"/>
+            <w:tcMar>
+              <w:top w:w="80" w:type="dxa"/>
+              <w:start w:w="120" w:type="dxa"/>
+              <w:bottom w:w="80" w:type="dxa"/>
+              <w:end w:w="120" w:type="dxa"/>
+            </w:tcMar>
+            <w:shd w:fill="F8FAFC"/>
+          </w:tcPr>
+          <w:p>
+            <w:pPr>
+              <w:spacing w:after="0"/>
+              <w:jc w:val="left"/>
+            </w:pPr>
+            <w:r>
+              <w:rPr>
+                <w:rFonts w:ascii="Arial" w:hAnsi="Arial" w:eastAsia="Arial"/>
+                <w:b w:val="0"/>
+                <w:color w:val="111827"/>
+                <w:sz w:val="16"/>
+              </w:rPr>
+              <w:t>0 / 30</w:t>
+            </w:r>
+          </w:p>
+        </w:tc>
+        <w:tc>
+          <w:tcPr>
+            <w:tcW w:type="dxa" w:w="1337"/>
+            <w:vAlign w:val="center"/>
+            <w:tcMar>
+              <w:top w:w="80" w:type="dxa"/>
+              <w:start w:w="120" w:type="dxa"/>
+              <w:bottom w:w="80" w:type="dxa"/>
+              <w:end w:w="120" w:type="dxa"/>
+            </w:tcMar>
+            <w:shd w:fill="F8FAFC"/>
+          </w:tcPr>
+          <w:p>
+            <w:pPr>
+              <w:spacing w:after="0"/>
+              <w:jc w:val="left"/>
+            </w:pPr>
+            <w:r>
+              <w:rPr>
+                <w:rFonts w:ascii="Arial" w:hAnsi="Arial" w:eastAsia="Arial"/>
+                <w:b w:val="0"/>
+                <w:color w:val="111827"/>
+                <w:sz w:val="16"/>
+              </w:rPr>
+              <w:t>оставить hold_validate</w:t>
+            </w:r>
+          </w:p>
+        </w:tc>
+      </w:tr>
+      <w:tr>
+        <w:tc>
+          <w:tcPr>
+            <w:tcW w:type="dxa" w:w="1337"/>
+            <w:vAlign w:val="center"/>
+            <w:tcMar>
+              <w:top w:w="80" w:type="dxa"/>
+              <w:start w:w="120" w:type="dxa"/>
+              <w:bottom w:w="80" w:type="dxa"/>
+              <w:end w:w="120" w:type="dxa"/>
+            </w:tcMar>
+          </w:tcPr>
+          <w:p>
+            <w:pPr>
+              <w:spacing w:after="0"/>
+              <w:jc w:val="left"/>
+            </w:pPr>
+            <w:r>
+              <w:rPr>
+                <w:rFonts w:ascii="Arial" w:hAnsi="Arial" w:eastAsia="Arial"/>
+                <w:b w:val="0"/>
+                <w:color w:val="111827"/>
+                <w:sz w:val="16"/>
+              </w:rPr>
+              <w:t>H4</w:t>
+            </w:r>
+          </w:p>
+        </w:tc>
+        <w:tc>
+          <w:tcPr>
+            <w:tcW w:type="dxa" w:w="1337"/>
+            <w:vAlign w:val="center"/>
+            <w:tcMar>
+              <w:top w:w="80" w:type="dxa"/>
+              <w:start w:w="120" w:type="dxa"/>
+              <w:bottom w:w="80" w:type="dxa"/>
+              <w:end w:w="120" w:type="dxa"/>
+            </w:tcMar>
+          </w:tcPr>
+          <w:p>
+            <w:pPr>
+              <w:spacing w:after="0"/>
+              <w:jc w:val="left"/>
+            </w:pPr>
+            <w:r>
+              <w:rPr>
+                <w:rFonts w:ascii="Arial" w:hAnsi="Arial" w:eastAsia="Arial"/>
+                <w:b w:val="0"/>
+                <w:color w:val="111827"/>
+                <w:sz w:val="16"/>
+              </w:rPr>
+              <w:t>конкурентное преимущество правдоподобно</w:t>
+            </w:r>
+          </w:p>
+        </w:tc>
+        <w:tc>
+          <w:tcPr>
+            <w:tcW w:type="dxa" w:w="1337"/>
+            <w:vAlign w:val="center"/>
+            <w:tcMar>
+              <w:top w:w="80" w:type="dxa"/>
+              <w:start w:w="120" w:type="dxa"/>
+              <w:bottom w:w="80" w:type="dxa"/>
+              <w:end w:w="120" w:type="dxa"/>
+            </w:tcMar>
+          </w:tcPr>
+          <w:p>
+            <w:pPr>
+              <w:spacing w:after="0"/>
+              <w:jc w:val="left"/>
+            </w:pPr>
+            <w:r>
+              <w:rPr>
+                <w:rFonts w:ascii="Arial" w:hAnsi="Arial" w:eastAsia="Arial"/>
+                <w:b w:val="0"/>
+                <w:color w:val="111827"/>
+                <w:sz w:val="16"/>
+              </w:rPr>
+              <w:t>прототипные сессии и scorecard</w:t>
+            </w:r>
+          </w:p>
+        </w:tc>
+        <w:tc>
+          <w:tcPr>
+            <w:tcW w:type="dxa" w:w="1337"/>
+            <w:vAlign w:val="center"/>
+            <w:tcMar>
+              <w:top w:w="80" w:type="dxa"/>
+              <w:start w:w="120" w:type="dxa"/>
+              <w:bottom w:w="80" w:type="dxa"/>
+              <w:end w:w="120" w:type="dxa"/>
+            </w:tcMar>
+          </w:tcPr>
+          <w:p>
+            <w:pPr>
+              <w:spacing w:after="0"/>
+              <w:jc w:val="left"/>
+            </w:pPr>
+            <w:r>
+              <w:rPr>
+                <w:rFonts w:ascii="Arial" w:hAnsi="Arial" w:eastAsia="Arial"/>
+                <w:b w:val="0"/>
+                <w:color w:val="111827"/>
+                <w:sz w:val="16"/>
+              </w:rPr>
+              <w:t>не начато</w:t>
+            </w:r>
+          </w:p>
+        </w:tc>
+        <w:tc>
+          <w:tcPr>
+            <w:tcW w:type="dxa" w:w="1337"/>
+            <w:vAlign w:val="center"/>
+            <w:tcMar>
+              <w:top w:w="80" w:type="dxa"/>
+              <w:start w:w="120" w:type="dxa"/>
+              <w:bottom w:w="80" w:type="dxa"/>
+              <w:end w:w="120" w:type="dxa"/>
+            </w:tcMar>
+          </w:tcPr>
+          <w:p>
+            <w:pPr>
+              <w:spacing w:after="0"/>
+              <w:jc w:val="left"/>
+            </w:pPr>
+            <w:r>
+              <w:rPr>
+                <w:rFonts w:ascii="Arial" w:hAnsi="Arial" w:eastAsia="Arial"/>
+                <w:b w:val="0"/>
+                <w:color w:val="111827"/>
+                <w:sz w:val="16"/>
+              </w:rPr>
+              <w:t>0 / 80</w:t>
+            </w:r>
+          </w:p>
+        </w:tc>
+        <w:tc>
+          <w:tcPr>
+            <w:tcW w:type="dxa" w:w="1337"/>
+            <w:vAlign w:val="center"/>
+            <w:tcMar>
+              <w:top w:w="80" w:type="dxa"/>
+              <w:start w:w="120" w:type="dxa"/>
+              <w:bottom w:w="80" w:type="dxa"/>
+              <w:end w:w="120" w:type="dxa"/>
+            </w:tcMar>
+          </w:tcPr>
+          <w:p>
+            <w:pPr>
+              <w:spacing w:after="0"/>
+              <w:jc w:val="left"/>
+            </w:pPr>
+            <w:r>
+              <w:rPr>
+                <w:rFonts w:ascii="Arial" w:hAnsi="Arial" w:eastAsia="Arial"/>
+                <w:b w:val="0"/>
+                <w:color w:val="111827"/>
+                <w:sz w:val="16"/>
+              </w:rPr>
+              <w:t>0 / 32</w:t>
+            </w:r>
+          </w:p>
+        </w:tc>
+        <w:tc>
+          <w:tcPr>
+            <w:tcW w:type="dxa" w:w="1337"/>
+            <w:vAlign w:val="center"/>
+            <w:tcMar>
+              <w:top w:w="80" w:type="dxa"/>
+              <w:start w:w="120" w:type="dxa"/>
+              <w:bottom w:w="80" w:type="dxa"/>
+              <w:end w:w="120" w:type="dxa"/>
+            </w:tcMar>
+          </w:tcPr>
+          <w:p>
+            <w:pPr>
+              <w:spacing w:after="0"/>
+              <w:jc w:val="left"/>
+            </w:pPr>
+            <w:r>
+              <w:rPr>
+                <w:rFonts w:ascii="Arial" w:hAnsi="Arial" w:eastAsia="Arial"/>
+                <w:b w:val="0"/>
+                <w:color w:val="111827"/>
+                <w:sz w:val="16"/>
+              </w:rPr>
+              <w:t>оставить hold_validate</w:t>
+            </w:r>
+          </w:p>
+        </w:tc>
+      </w:tr>
+      <w:tr>
+        <w:tc>
+          <w:tcPr>
+            <w:tcW w:type="dxa" w:w="1337"/>
+            <w:vAlign w:val="center"/>
+            <w:tcMar>
+              <w:top w:w="80" w:type="dxa"/>
+              <w:start w:w="120" w:type="dxa"/>
+              <w:bottom w:w="80" w:type="dxa"/>
+              <w:end w:w="120" w:type="dxa"/>
+            </w:tcMar>
+            <w:shd w:fill="F8FAFC"/>
+          </w:tcPr>
+          <w:p>
+            <w:pPr>
+              <w:spacing w:after="0"/>
+              <w:jc w:val="left"/>
+            </w:pPr>
+            <w:r>
+              <w:rPr>
+                <w:rFonts w:ascii="Arial" w:hAnsi="Arial" w:eastAsia="Arial"/>
+                <w:b w:val="0"/>
+                <w:color w:val="111827"/>
+                <w:sz w:val="16"/>
+              </w:rPr>
+              <w:t>H6</w:t>
+            </w:r>
+          </w:p>
+        </w:tc>
+        <w:tc>
+          <w:tcPr>
+            <w:tcW w:type="dxa" w:w="1337"/>
+            <w:vAlign w:val="center"/>
+            <w:tcMar>
+              <w:top w:w="80" w:type="dxa"/>
+              <w:start w:w="120" w:type="dxa"/>
+              <w:bottom w:w="80" w:type="dxa"/>
+              <w:end w:w="120" w:type="dxa"/>
+            </w:tcMar>
+            <w:shd w:fill="F8FAFC"/>
+          </w:tcPr>
+          <w:p>
+            <w:pPr>
+              <w:spacing w:after="0"/>
+              <w:jc w:val="left"/>
+            </w:pPr>
+            <w:r>
+              <w:rPr>
+                <w:rFonts w:ascii="Arial" w:hAnsi="Arial" w:eastAsia="Arial"/>
+                <w:b w:val="0"/>
+                <w:color w:val="111827"/>
+                <w:sz w:val="16"/>
+              </w:rPr>
+              <w:t>продуктовое ядро можно определить</w:t>
+            </w:r>
+          </w:p>
+        </w:tc>
+        <w:tc>
+          <w:tcPr>
+            <w:tcW w:type="dxa" w:w="1337"/>
+            <w:vAlign w:val="center"/>
+            <w:tcMar>
+              <w:top w:w="80" w:type="dxa"/>
+              <w:start w:w="120" w:type="dxa"/>
+              <w:bottom w:w="80" w:type="dxa"/>
+              <w:end w:w="120" w:type="dxa"/>
+            </w:tcMar>
+            <w:shd w:fill="F8FAFC"/>
+          </w:tcPr>
+          <w:p>
+            <w:pPr>
+              <w:spacing w:after="0"/>
+              <w:jc w:val="left"/>
+            </w:pPr>
+            <w:r>
+              <w:rPr>
+                <w:rFonts w:ascii="Arial" w:hAnsi="Arial" w:eastAsia="Arial"/>
+                <w:b w:val="0"/>
+                <w:color w:val="111827"/>
+                <w:sz w:val="16"/>
+              </w:rPr>
+              <w:t>прототипные сессии и scorecard</w:t>
+            </w:r>
+          </w:p>
+        </w:tc>
+        <w:tc>
+          <w:tcPr>
+            <w:tcW w:type="dxa" w:w="1337"/>
+            <w:vAlign w:val="center"/>
+            <w:tcMar>
+              <w:top w:w="80" w:type="dxa"/>
+              <w:start w:w="120" w:type="dxa"/>
+              <w:bottom w:w="80" w:type="dxa"/>
+              <w:end w:w="120" w:type="dxa"/>
+            </w:tcMar>
+            <w:shd w:fill="F8FAFC"/>
+          </w:tcPr>
+          <w:p>
+            <w:pPr>
+              <w:spacing w:after="0"/>
+              <w:jc w:val="left"/>
+            </w:pPr>
+            <w:r>
+              <w:rPr>
+                <w:rFonts w:ascii="Arial" w:hAnsi="Arial" w:eastAsia="Arial"/>
+                <w:b w:val="0"/>
+                <w:color w:val="111827"/>
+                <w:sz w:val="16"/>
+              </w:rPr>
+              <w:t>не начато</w:t>
+            </w:r>
+          </w:p>
+        </w:tc>
+        <w:tc>
+          <w:tcPr>
+            <w:tcW w:type="dxa" w:w="1337"/>
+            <w:vAlign w:val="center"/>
+            <w:tcMar>
+              <w:top w:w="80" w:type="dxa"/>
+              <w:start w:w="120" w:type="dxa"/>
+              <w:bottom w:w="80" w:type="dxa"/>
+              <w:end w:w="120" w:type="dxa"/>
+            </w:tcMar>
+            <w:shd w:fill="F8FAFC"/>
+          </w:tcPr>
+          <w:p>
+            <w:pPr>
+              <w:spacing w:after="0"/>
+              <w:jc w:val="left"/>
+            </w:pPr>
+            <w:r>
+              <w:rPr>
+                <w:rFonts w:ascii="Arial" w:hAnsi="Arial" w:eastAsia="Arial"/>
+                <w:b w:val="0"/>
+                <w:color w:val="111827"/>
+                <w:sz w:val="16"/>
+              </w:rPr>
+              <w:t>0 / 80</w:t>
+            </w:r>
+          </w:p>
+        </w:tc>
+        <w:tc>
+          <w:tcPr>
+            <w:tcW w:type="dxa" w:w="1337"/>
+            <w:vAlign w:val="center"/>
+            <w:tcMar>
+              <w:top w:w="80" w:type="dxa"/>
+              <w:start w:w="120" w:type="dxa"/>
+              <w:bottom w:w="80" w:type="dxa"/>
+              <w:end w:w="120" w:type="dxa"/>
+            </w:tcMar>
+            <w:shd w:fill="F8FAFC"/>
+          </w:tcPr>
+          <w:p>
+            <w:pPr>
+              <w:spacing w:after="0"/>
+              <w:jc w:val="left"/>
+            </w:pPr>
+            <w:r>
+              <w:rPr>
+                <w:rFonts w:ascii="Arial" w:hAnsi="Arial" w:eastAsia="Arial"/>
+                <w:b w:val="0"/>
+                <w:color w:val="111827"/>
+                <w:sz w:val="16"/>
+              </w:rPr>
+              <w:t>0 / 32</w:t>
+            </w:r>
+          </w:p>
+        </w:tc>
+        <w:tc>
+          <w:tcPr>
+            <w:tcW w:type="dxa" w:w="1337"/>
+            <w:vAlign w:val="center"/>
+            <w:tcMar>
+              <w:top w:w="80" w:type="dxa"/>
+              <w:start w:w="120" w:type="dxa"/>
+              <w:bottom w:w="80" w:type="dxa"/>
+              <w:end w:w="120" w:type="dxa"/>
+            </w:tcMar>
+            <w:shd w:fill="F8FAFC"/>
+          </w:tcPr>
+          <w:p>
+            <w:pPr>
+              <w:spacing w:after="0"/>
+              <w:jc w:val="left"/>
+            </w:pPr>
+            <w:r>
+              <w:rPr>
+                <w:rFonts w:ascii="Arial" w:hAnsi="Arial" w:eastAsia="Arial"/>
+                <w:b w:val="0"/>
+                <w:color w:val="111827"/>
+                <w:sz w:val="16"/>
+              </w:rPr>
+              <w:t>оставить hold_validate</w:t>
+            </w:r>
+          </w:p>
+        </w:tc>
+      </w:tr>
+    </w:tbl>
+    <w:p/>
+    <w:p>
+      <w:r>
+        <w:t>Практически это означает следующее: H2 уже имеет 8 заполненных paid-flow строк из 40, но еще ниже минимального порога; H1, H3, H4, H5 и H6 остаются в hold_validate, потому что по ним нет наблюдаемых capture rows. Это не слабость отчета, а защита от преждевременного вывода: большой массив конкурентов и источников показывает, куда идти, но не заменяет walkthrough, интервью и прототипные сессии.</w:t>
       </w:r>
     </w:p>
     <w:p>
@@ -1046,7 +2456,7 @@
                 <w:color w:val="111827"/>
                 <w:sz w:val="16"/>
               </w:rPr>
-              <w:t>Money verdict</w:t>
+              <w:t>Денежный вывод</w:t>
             </w:r>
           </w:p>
         </w:tc>
@@ -1185,7 +2595,7 @@
                 <w:color w:val="111827"/>
                 <w:sz w:val="16"/>
               </w:rPr>
-              <w:t>strong_directional_money_case</w:t>
+              <w:t>сильный направленный money case</w:t>
             </w:r>
           </w:p>
         </w:tc>
@@ -1325,7 +2735,7 @@
                 <w:color w:val="111827"/>
                 <w:sz w:val="16"/>
               </w:rPr>
-              <w:t>strong_directional_money_case</w:t>
+              <w:t>сильный направленный money case</w:t>
             </w:r>
           </w:p>
         </w:tc>
@@ -1464,7 +2874,7 @@
                 <w:color w:val="111827"/>
                 <w:sz w:val="16"/>
               </w:rPr>
-              <w:t>strong_directional_money_case</w:t>
+              <w:t>сильный направленный money case</w:t>
             </w:r>
           </w:p>
         </w:tc>
@@ -1604,7 +3014,7 @@
                 <w:color w:val="111827"/>
                 <w:sz w:val="16"/>
               </w:rPr>
-              <w:t>medium_directional_money_case</w:t>
+              <w:t>средний направленный money case</w:t>
             </w:r>
           </w:p>
         </w:tc>
@@ -1743,7 +3153,7 @@
                 <w:color w:val="111827"/>
                 <w:sz w:val="16"/>
               </w:rPr>
-              <w:t>benchmark_money_visible_not_direct_tam</w:t>
+              <w:t>деньги видны, но это benchmark, не прямой TAM</w:t>
             </w:r>
           </w:p>
         </w:tc>
@@ -2110,7 +3520,7 @@
                 <w:color w:val="111827"/>
                 <w:sz w:val="16"/>
               </w:rPr>
-              <w:t>strong_bottom_up_money_proxy</w:t>
+              <w:t>сильный bottom-up proxy</w:t>
             </w:r>
           </w:p>
         </w:tc>
@@ -2251,7 +3661,7 @@
                 <w:color w:val="111827"/>
                 <w:sz w:val="16"/>
               </w:rPr>
-              <w:t>strong_bottom_up_money_proxy</w:t>
+              <w:t>сильный bottom-up proxy</w:t>
             </w:r>
           </w:p>
         </w:tc>
@@ -2389,7 +3799,7 @@
                 <w:color w:val="111827"/>
                 <w:sz w:val="16"/>
               </w:rPr>
-              <w:t>strong_bottom_up_money_proxy</w:t>
+              <w:t>сильный bottom-up proxy</w:t>
             </w:r>
           </w:p>
         </w:tc>
@@ -2530,7 +3940,7 @@
                 <w:color w:val="111827"/>
                 <w:sz w:val="16"/>
               </w:rPr>
-              <w:t>strong_bottom_up_money_proxy</w:t>
+              <w:t>сильный bottom-up proxy</w:t>
             </w:r>
           </w:p>
         </w:tc>
@@ -2668,7 +4078,7 @@
                 <w:color w:val="111827"/>
                 <w:sz w:val="16"/>
               </w:rPr>
-              <w:t>strong_bottom_up_money_proxy</w:t>
+              <w:t>сильный bottom-up proxy</w:t>
             </w:r>
           </w:p>
         </w:tc>
@@ -2809,7 +4219,7 @@
                 <w:color w:val="111827"/>
                 <w:sz w:val="16"/>
               </w:rPr>
-              <w:t>strong_bottom_up_money_proxy</w:t>
+              <w:t>сильный bottom-up proxy</w:t>
             </w:r>
           </w:p>
         </w:tc>
@@ -2947,7 +4357,7 @@
                 <w:color w:val="111827"/>
                 <w:sz w:val="16"/>
               </w:rPr>
-              <w:t>medium_bottom_up_money_proxy</w:t>
+              <w:t>средний bottom-up proxy</w:t>
             </w:r>
           </w:p>
         </w:tc>
@@ -3088,7 +4498,7 @@
                 <w:color w:val="111827"/>
                 <w:sz w:val="16"/>
               </w:rPr>
-              <w:t>medium_bottom_up_money_proxy</w:t>
+              <w:t>средний bottom-up proxy</w:t>
             </w:r>
           </w:p>
         </w:tc>
@@ -3226,7 +4636,7 @@
                 <w:color w:val="111827"/>
                 <w:sz w:val="16"/>
               </w:rPr>
-              <w:t>medium_bottom_up_money_proxy</w:t>
+              <w:t>средний bottom-up proxy</w:t>
             </w:r>
           </w:p>
         </w:tc>
@@ -3367,7 +4777,7 @@
                 <w:color w:val="111827"/>
                 <w:sz w:val="16"/>
               </w:rPr>
-              <w:t>medium_bottom_up_money_proxy</w:t>
+              <w:t>средний bottom-up proxy</w:t>
             </w:r>
           </w:p>
         </w:tc>
@@ -3505,7 +4915,7 @@
                 <w:color w:val="111827"/>
                 <w:sz w:val="16"/>
               </w:rPr>
-              <w:t>medium_bottom_up_money_proxy</w:t>
+              <w:t>средний bottom-up proxy</w:t>
             </w:r>
           </w:p>
         </w:tc>
@@ -3646,7 +5056,7 @@
                 <w:color w:val="111827"/>
                 <w:sz w:val="16"/>
               </w:rPr>
-              <w:t>strong_bottom_up_money_proxy</w:t>
+              <w:t>сильный bottom-up proxy</w:t>
             </w:r>
           </w:p>
         </w:tc>
@@ -9930,7 +11340,7 @@
                 <w:color w:val="111827"/>
                 <w:sz w:val="16"/>
               </w:rPr>
-              <w:t>455 manifest artifacts; missing=0</w:t>
+              <w:t>456 manifest artifacts; missing=0</w:t>
             </w:r>
           </w:p>
         </w:tc>
@@ -10059,6 +11469,15 @@
       </w:pPr>
       <w:r>
         <w:t>data_processed/global_hypothesis_validation_questionnaire.csv</w:t>
+      </w:r>
+    </w:p>
+    <w:p>
+      <w:pPr>
+        <w:pStyle w:val="ListBullet"/>
+        <w:spacing w:after="80"/>
+      </w:pPr>
+      <w:r>
+        <w:t>data_processed/global_hypothesis_gate_snapshot.csv</w:t>
       </w:r>
     </w:p>
     <w:p>

</xml_diff>

<commit_message>
Add global next validation backlog
</commit_message>
<xml_diff>
--- a/output/docx/alina-global-hypothesis-report-v1.docx
+++ b/output/docx/alina-global-hypothesis-report-v1.docx
@@ -31,7 +31,7 @@
     </w:p>
     <w:p>
       <w:r>
-        <w:t>Собрано: 2026-05-31T15:08:22.216Z</w:t>
+        <w:t>Собрано: 2026-05-31T15:13:25.939Z</w:t>
       </w:r>
     </w:p>
     <w:p>
@@ -59,7 +59,7 @@
     </w:p>
     <w:p>
       <w:r>
-        <w:t>На текущем этапе собрано 67,525 сырьевых source-строк, 36,694 уникализированных строк и 456 локальных артефактов. Эти данные нужны не для того, чтобы объявить продукт доказанным, а для последовательной проверки: существует ли рынок, есть ли деньги, насколько плотна конкуренция, где может быть белое пятно, кто аудитория и какую MVP-петлю надо тестировать.</w:t>
+        <w:t>На текущем этапе собрано 67,525 сырьевых source-строк, 36,694 уникализированных строк и 459 локальных артефактов. Эти данные нужны не для того, чтобы объявить продукт доказанным, а для последовательной проверки: существует ли рынок, есть ли деньги, насколько плотна конкуренция, где может быть белое пятно, кто аудитория и какую MVP-петлю надо тестировать.</w:t>
       </w:r>
     </w:p>
     <w:p>
@@ -10225,6 +10225,2558 @@
         <w:pStyle w:val="Heading1"/>
       </w:pPr>
       <w:r>
+        <w:t>БЛИЖАЙШАЯ ОЧЕРЕДЬ ВАЛИДАЦИИ</w:t>
+      </w:r>
+    </w:p>
+    <w:p>
+      <w:r>
+        <w:t>Чтобы следующий шаг был исполнимым, из общего command center выделена короткая P0-очередь. Она начинается с hidden-clone walkthrough конкурентов, затем добирает paid-flow evidence, потом проверяет ICP recent behavior и только после этого переводит прототип в scorecard. Такой порядок сохраняет причинность исследования: сначала убираем риск “это уже существует”, затем проверяем деньги, затем аудиторию, затем преимущество продукта.</w:t>
+      </w:r>
+    </w:p>
+    <w:tbl>
+      <w:tblPr>
+        <w:tblW w:type="dxa" w:w="9360"/>
+        <w:jc w:val="left"/>
+        <w:tblLayout w:type="fixed"/>
+        <w:tblLook w:firstColumn="1" w:firstRow="1" w:lastColumn="0" w:lastRow="0" w:noHBand="0" w:noVBand="1" w:val="04A0"/>
+        <w:tblInd w:w="120" w:type="dxa"/>
+        <w:tblBorders>
+          <w:top w:val="single" w:sz="4" w:space="0" w:color="CBD5E1"/>
+          <w:left w:val="single" w:sz="4" w:space="0" w:color="CBD5E1"/>
+          <w:bottom w:val="single" w:sz="4" w:space="0" w:color="CBD5E1"/>
+          <w:right w:val="single" w:sz="4" w:space="0" w:color="CBD5E1"/>
+          <w:insideH w:val="single" w:sz="4" w:space="0" w:color="CBD5E1"/>
+          <w:insideV w:val="single" w:sz="4" w:space="0" w:color="CBD5E1"/>
+        </w:tblBorders>
+      </w:tblPr>
+      <w:tblGrid>
+        <w:gridCol w:w="1560"/>
+        <w:gridCol w:w="1560"/>
+        <w:gridCol w:w="1560"/>
+        <w:gridCol w:w="1560"/>
+        <w:gridCol w:w="1560"/>
+        <w:gridCol w:w="1560"/>
+      </w:tblGrid>
+      <w:tr>
+        <w:tc>
+          <w:tcPr>
+            <w:tcW w:type="dxa" w:w="1560"/>
+            <w:vAlign w:val="center"/>
+            <w:tcMar>
+              <w:top w:w="80" w:type="dxa"/>
+              <w:start w:w="120" w:type="dxa"/>
+              <w:bottom w:w="80" w:type="dxa"/>
+              <w:end w:w="120" w:type="dxa"/>
+            </w:tcMar>
+            <w:shd w:fill="E8EEF5"/>
+          </w:tcPr>
+          <w:p>
+            <w:pPr>
+              <w:spacing w:after="0"/>
+              <w:jc w:val="left"/>
+            </w:pPr>
+            <w:r>
+              <w:rPr>
+                <w:rFonts w:ascii="Arial" w:hAnsi="Arial" w:eastAsia="Arial"/>
+                <w:b/>
+                <w:color w:val="111827"/>
+                <w:sz w:val="16"/>
+              </w:rPr>
+              <w:t>#</w:t>
+            </w:r>
+          </w:p>
+        </w:tc>
+        <w:tc>
+          <w:tcPr>
+            <w:tcW w:type="dxa" w:w="1560"/>
+            <w:vAlign w:val="center"/>
+            <w:tcMar>
+              <w:top w:w="80" w:type="dxa"/>
+              <w:start w:w="120" w:type="dxa"/>
+              <w:bottom w:w="80" w:type="dxa"/>
+              <w:end w:w="120" w:type="dxa"/>
+            </w:tcMar>
+            <w:shd w:fill="E8EEF5"/>
+          </w:tcPr>
+          <w:p>
+            <w:pPr>
+              <w:spacing w:after="0"/>
+              <w:jc w:val="left"/>
+            </w:pPr>
+            <w:r>
+              <w:rPr>
+                <w:rFonts w:ascii="Arial" w:hAnsi="Arial" w:eastAsia="Arial"/>
+                <w:b/>
+                <w:color w:val="111827"/>
+                <w:sz w:val="16"/>
+              </w:rPr>
+              <w:t>Поток</w:t>
+            </w:r>
+          </w:p>
+        </w:tc>
+        <w:tc>
+          <w:tcPr>
+            <w:tcW w:type="dxa" w:w="1560"/>
+            <w:vAlign w:val="center"/>
+            <w:tcMar>
+              <w:top w:w="80" w:type="dxa"/>
+              <w:start w:w="120" w:type="dxa"/>
+              <w:bottom w:w="80" w:type="dxa"/>
+              <w:end w:w="120" w:type="dxa"/>
+            </w:tcMar>
+            <w:shd w:fill="E8EEF5"/>
+          </w:tcPr>
+          <w:p>
+            <w:pPr>
+              <w:spacing w:after="0"/>
+              <w:jc w:val="left"/>
+            </w:pPr>
+            <w:r>
+              <w:rPr>
+                <w:rFonts w:ascii="Arial" w:hAnsi="Arial" w:eastAsia="Arial"/>
+                <w:b/>
+                <w:color w:val="111827"/>
+                <w:sz w:val="16"/>
+              </w:rPr>
+              <w:t>Цель</w:t>
+            </w:r>
+          </w:p>
+        </w:tc>
+        <w:tc>
+          <w:tcPr>
+            <w:tcW w:type="dxa" w:w="1560"/>
+            <w:vAlign w:val="center"/>
+            <w:tcMar>
+              <w:top w:w="80" w:type="dxa"/>
+              <w:start w:w="120" w:type="dxa"/>
+              <w:bottom w:w="80" w:type="dxa"/>
+              <w:end w:w="120" w:type="dxa"/>
+            </w:tcMar>
+            <w:shd w:fill="E8EEF5"/>
+          </w:tcPr>
+          <w:p>
+            <w:pPr>
+              <w:spacing w:after="0"/>
+              <w:jc w:val="left"/>
+            </w:pPr>
+            <w:r>
+              <w:rPr>
+                <w:rFonts w:ascii="Arial" w:hAnsi="Arial" w:eastAsia="Arial"/>
+                <w:b/>
+                <w:color w:val="111827"/>
+                <w:sz w:val="16"/>
+              </w:rPr>
+              <w:t>Гипотезы</w:t>
+            </w:r>
+          </w:p>
+        </w:tc>
+        <w:tc>
+          <w:tcPr>
+            <w:tcW w:type="dxa" w:w="1560"/>
+            <w:vAlign w:val="center"/>
+            <w:tcMar>
+              <w:top w:w="80" w:type="dxa"/>
+              <w:start w:w="120" w:type="dxa"/>
+              <w:bottom w:w="80" w:type="dxa"/>
+              <w:end w:w="120" w:type="dxa"/>
+            </w:tcMar>
+            <w:shd w:fill="E8EEF5"/>
+          </w:tcPr>
+          <w:p>
+            <w:pPr>
+              <w:spacing w:after="0"/>
+              <w:jc w:val="left"/>
+            </w:pPr>
+            <w:r>
+              <w:rPr>
+                <w:rFonts w:ascii="Arial" w:hAnsi="Arial" w:eastAsia="Arial"/>
+                <w:b/>
+                <w:color w:val="111827"/>
+                <w:sz w:val="16"/>
+              </w:rPr>
+              <w:t>Что сделать</w:t>
+            </w:r>
+          </w:p>
+        </w:tc>
+        <w:tc>
+          <w:tcPr>
+            <w:tcW w:type="dxa" w:w="1560"/>
+            <w:vAlign w:val="center"/>
+            <w:tcMar>
+              <w:top w:w="80" w:type="dxa"/>
+              <w:start w:w="120" w:type="dxa"/>
+              <w:bottom w:w="80" w:type="dxa"/>
+              <w:end w:w="120" w:type="dxa"/>
+            </w:tcMar>
+            <w:shd w:fill="E8EEF5"/>
+          </w:tcPr>
+          <w:p>
+            <w:pPr>
+              <w:spacing w:after="0"/>
+              <w:jc w:val="left"/>
+            </w:pPr>
+            <w:r>
+              <w:rPr>
+                <w:rFonts w:ascii="Arial" w:hAnsi="Arial" w:eastAsia="Arial"/>
+                <w:b/>
+                <w:color w:val="111827"/>
+                <w:sz w:val="16"/>
+              </w:rPr>
+              <w:t>Куда писать evidence</w:t>
+            </w:r>
+          </w:p>
+        </w:tc>
+      </w:tr>
+      <w:tr>
+        <w:tc>
+          <w:tcPr>
+            <w:tcW w:type="dxa" w:w="1560"/>
+            <w:vAlign w:val="center"/>
+            <w:tcMar>
+              <w:top w:w="80" w:type="dxa"/>
+              <w:start w:w="120" w:type="dxa"/>
+              <w:bottom w:w="80" w:type="dxa"/>
+              <w:end w:w="120" w:type="dxa"/>
+            </w:tcMar>
+          </w:tcPr>
+          <w:p>
+            <w:pPr>
+              <w:spacing w:after="0"/>
+              <w:jc w:val="left"/>
+            </w:pPr>
+            <w:r>
+              <w:rPr>
+                <w:rFonts w:ascii="Arial" w:hAnsi="Arial" w:eastAsia="Arial"/>
+                <w:b w:val="0"/>
+                <w:color w:val="111827"/>
+                <w:sz w:val="16"/>
+              </w:rPr>
+              <w:t>1</w:t>
+            </w:r>
+          </w:p>
+        </w:tc>
+        <w:tc>
+          <w:tcPr>
+            <w:tcW w:type="dxa" w:w="1560"/>
+            <w:vAlign w:val="center"/>
+            <w:tcMar>
+              <w:top w:w="80" w:type="dxa"/>
+              <w:start w:w="120" w:type="dxa"/>
+              <w:bottom w:w="80" w:type="dxa"/>
+              <w:end w:w="120" w:type="dxa"/>
+            </w:tcMar>
+          </w:tcPr>
+          <w:p>
+            <w:pPr>
+              <w:spacing w:after="0"/>
+              <w:jc w:val="left"/>
+            </w:pPr>
+            <w:r>
+              <w:rPr>
+                <w:rFonts w:ascii="Arial" w:hAnsi="Arial" w:eastAsia="Arial"/>
+                <w:b w:val="0"/>
+                <w:color w:val="111827"/>
+                <w:sz w:val="16"/>
+              </w:rPr>
+              <w:t>walkthrough конкурентов</w:t>
+            </w:r>
+          </w:p>
+        </w:tc>
+        <w:tc>
+          <w:tcPr>
+            <w:tcW w:type="dxa" w:w="1560"/>
+            <w:vAlign w:val="center"/>
+            <w:tcMar>
+              <w:top w:w="80" w:type="dxa"/>
+              <w:start w:w="120" w:type="dxa"/>
+              <w:bottom w:w="80" w:type="dxa"/>
+              <w:end w:w="120" w:type="dxa"/>
+            </w:tcMar>
+          </w:tcPr>
+          <w:p>
+            <w:pPr>
+              <w:spacing w:after="0"/>
+              <w:jc w:val="left"/>
+            </w:pPr>
+            <w:r>
+              <w:rPr>
+                <w:rFonts w:ascii="Arial" w:hAnsi="Arial" w:eastAsia="Arial"/>
+                <w:b w:val="0"/>
+                <w:color w:val="111827"/>
+                <w:sz w:val="16"/>
+              </w:rPr>
+              <w:t>Shepherd: Spiritual Bible BFF</w:t>
+            </w:r>
+          </w:p>
+        </w:tc>
+        <w:tc>
+          <w:tcPr>
+            <w:tcW w:type="dxa" w:w="1560"/>
+            <w:vAlign w:val="center"/>
+            <w:tcMar>
+              <w:top w:w="80" w:type="dxa"/>
+              <w:start w:w="120" w:type="dxa"/>
+              <w:bottom w:w="80" w:type="dxa"/>
+              <w:end w:w="120" w:type="dxa"/>
+            </w:tcMar>
+          </w:tcPr>
+          <w:p>
+            <w:pPr>
+              <w:spacing w:after="0"/>
+              <w:jc w:val="left"/>
+            </w:pPr>
+            <w:r>
+              <w:rPr>
+                <w:rFonts w:ascii="Arial" w:hAnsi="Arial" w:eastAsia="Arial"/>
+                <w:b w:val="0"/>
+                <w:color w:val="111827"/>
+                <w:sz w:val="16"/>
+              </w:rPr>
+              <w:t>H1/H3</w:t>
+            </w:r>
+          </w:p>
+        </w:tc>
+        <w:tc>
+          <w:tcPr>
+            <w:tcW w:type="dxa" w:w="1560"/>
+            <w:vAlign w:val="center"/>
+            <w:tcMar>
+              <w:top w:w="80" w:type="dxa"/>
+              <w:start w:w="120" w:type="dxa"/>
+              <w:bottom w:w="80" w:type="dxa"/>
+              <w:end w:w="120" w:type="dxa"/>
+            </w:tcMar>
+          </w:tcPr>
+          <w:p>
+            <w:pPr>
+              <w:spacing w:after="0"/>
+              <w:jc w:val="left"/>
+            </w:pPr>
+            <w:r>
+              <w:rPr>
+                <w:rFonts w:ascii="Arial" w:hAnsi="Arial" w:eastAsia="Arial"/>
+                <w:b w:val="0"/>
+                <w:color w:val="111827"/>
+                <w:sz w:val="16"/>
+              </w:rPr>
+              <w:t>открыть listing/app, сохранить 5 слотов скриншотов, записать full-loop/directness/causality verdict</w:t>
+            </w:r>
+          </w:p>
+        </w:tc>
+        <w:tc>
+          <w:tcPr>
+            <w:tcW w:type="dxa" w:w="1560"/>
+            <w:vAlign w:val="center"/>
+            <w:tcMar>
+              <w:top w:w="80" w:type="dxa"/>
+              <w:start w:w="120" w:type="dxa"/>
+              <w:bottom w:w="80" w:type="dxa"/>
+              <w:end w:w="120" w:type="dxa"/>
+            </w:tcMar>
+          </w:tcPr>
+          <w:p>
+            <w:pPr>
+              <w:spacing w:after="0"/>
+              <w:jc w:val="left"/>
+            </w:pPr>
+            <w:r>
+              <w:rPr>
+                <w:rFonts w:ascii="Arial" w:hAnsi="Arial" w:eastAsia="Arial"/>
+                <w:b w:val="0"/>
+                <w:color w:val="111827"/>
+                <w:sz w:val="16"/>
+              </w:rPr>
+              <w:t>data_processed/manual_competitor_inspection_packet.csv</w:t>
+            </w:r>
+          </w:p>
+        </w:tc>
+      </w:tr>
+      <w:tr>
+        <w:tc>
+          <w:tcPr>
+            <w:tcW w:type="dxa" w:w="1560"/>
+            <w:vAlign w:val="center"/>
+            <w:tcMar>
+              <w:top w:w="80" w:type="dxa"/>
+              <w:start w:w="120" w:type="dxa"/>
+              <w:bottom w:w="80" w:type="dxa"/>
+              <w:end w:w="120" w:type="dxa"/>
+            </w:tcMar>
+            <w:shd w:fill="F8FAFC"/>
+          </w:tcPr>
+          <w:p>
+            <w:pPr>
+              <w:spacing w:after="0"/>
+              <w:jc w:val="left"/>
+            </w:pPr>
+            <w:r>
+              <w:rPr>
+                <w:rFonts w:ascii="Arial" w:hAnsi="Arial" w:eastAsia="Arial"/>
+                <w:b w:val="0"/>
+                <w:color w:val="111827"/>
+                <w:sz w:val="16"/>
+              </w:rPr>
+              <w:t>2</w:t>
+            </w:r>
+          </w:p>
+        </w:tc>
+        <w:tc>
+          <w:tcPr>
+            <w:tcW w:type="dxa" w:w="1560"/>
+            <w:vAlign w:val="center"/>
+            <w:tcMar>
+              <w:top w:w="80" w:type="dxa"/>
+              <w:start w:w="120" w:type="dxa"/>
+              <w:bottom w:w="80" w:type="dxa"/>
+              <w:end w:w="120" w:type="dxa"/>
+            </w:tcMar>
+            <w:shd w:fill="F8FAFC"/>
+          </w:tcPr>
+          <w:p>
+            <w:pPr>
+              <w:spacing w:after="0"/>
+              <w:jc w:val="left"/>
+            </w:pPr>
+            <w:r>
+              <w:rPr>
+                <w:rFonts w:ascii="Arial" w:hAnsi="Arial" w:eastAsia="Arial"/>
+                <w:b w:val="0"/>
+                <w:color w:val="111827"/>
+                <w:sz w:val="16"/>
+              </w:rPr>
+              <w:t>walkthrough конкурентов</w:t>
+            </w:r>
+          </w:p>
+        </w:tc>
+        <w:tc>
+          <w:tcPr>
+            <w:tcW w:type="dxa" w:w="1560"/>
+            <w:vAlign w:val="center"/>
+            <w:tcMar>
+              <w:top w:w="80" w:type="dxa"/>
+              <w:start w:w="120" w:type="dxa"/>
+              <w:bottom w:w="80" w:type="dxa"/>
+              <w:end w:w="120" w:type="dxa"/>
+            </w:tcMar>
+            <w:shd w:fill="F8FAFC"/>
+          </w:tcPr>
+          <w:p>
+            <w:pPr>
+              <w:spacing w:after="0"/>
+              <w:jc w:val="left"/>
+            </w:pPr>
+            <w:r>
+              <w:rPr>
+                <w:rFonts w:ascii="Arial" w:hAnsi="Arial" w:eastAsia="Arial"/>
+                <w:b w:val="0"/>
+                <w:color w:val="111827"/>
+                <w:sz w:val="16"/>
+              </w:rPr>
+              <w:t>Zing AI: Home &amp; Gym Workouts</w:t>
+            </w:r>
+          </w:p>
+        </w:tc>
+        <w:tc>
+          <w:tcPr>
+            <w:tcW w:type="dxa" w:w="1560"/>
+            <w:vAlign w:val="center"/>
+            <w:tcMar>
+              <w:top w:w="80" w:type="dxa"/>
+              <w:start w:w="120" w:type="dxa"/>
+              <w:bottom w:w="80" w:type="dxa"/>
+              <w:end w:w="120" w:type="dxa"/>
+            </w:tcMar>
+            <w:shd w:fill="F8FAFC"/>
+          </w:tcPr>
+          <w:p>
+            <w:pPr>
+              <w:spacing w:after="0"/>
+              <w:jc w:val="left"/>
+            </w:pPr>
+            <w:r>
+              <w:rPr>
+                <w:rFonts w:ascii="Arial" w:hAnsi="Arial" w:eastAsia="Arial"/>
+                <w:b w:val="0"/>
+                <w:color w:val="111827"/>
+                <w:sz w:val="16"/>
+              </w:rPr>
+              <w:t>H1/H3</w:t>
+            </w:r>
+          </w:p>
+        </w:tc>
+        <w:tc>
+          <w:tcPr>
+            <w:tcW w:type="dxa" w:w="1560"/>
+            <w:vAlign w:val="center"/>
+            <w:tcMar>
+              <w:top w:w="80" w:type="dxa"/>
+              <w:start w:w="120" w:type="dxa"/>
+              <w:bottom w:w="80" w:type="dxa"/>
+              <w:end w:w="120" w:type="dxa"/>
+            </w:tcMar>
+            <w:shd w:fill="F8FAFC"/>
+          </w:tcPr>
+          <w:p>
+            <w:pPr>
+              <w:spacing w:after="0"/>
+              <w:jc w:val="left"/>
+            </w:pPr>
+            <w:r>
+              <w:rPr>
+                <w:rFonts w:ascii="Arial" w:hAnsi="Arial" w:eastAsia="Arial"/>
+                <w:b w:val="0"/>
+                <w:color w:val="111827"/>
+                <w:sz w:val="16"/>
+              </w:rPr>
+              <w:t>открыть listing/app, сохранить 5 слотов скриншотов, записать full-loop/directness/causality verdict</w:t>
+            </w:r>
+          </w:p>
+        </w:tc>
+        <w:tc>
+          <w:tcPr>
+            <w:tcW w:type="dxa" w:w="1560"/>
+            <w:vAlign w:val="center"/>
+            <w:tcMar>
+              <w:top w:w="80" w:type="dxa"/>
+              <w:start w:w="120" w:type="dxa"/>
+              <w:bottom w:w="80" w:type="dxa"/>
+              <w:end w:w="120" w:type="dxa"/>
+            </w:tcMar>
+            <w:shd w:fill="F8FAFC"/>
+          </w:tcPr>
+          <w:p>
+            <w:pPr>
+              <w:spacing w:after="0"/>
+              <w:jc w:val="left"/>
+            </w:pPr>
+            <w:r>
+              <w:rPr>
+                <w:rFonts w:ascii="Arial" w:hAnsi="Arial" w:eastAsia="Arial"/>
+                <w:b w:val="0"/>
+                <w:color w:val="111827"/>
+                <w:sz w:val="16"/>
+              </w:rPr>
+              <w:t>data_processed/manual_competitor_inspection_packet.csv</w:t>
+            </w:r>
+          </w:p>
+        </w:tc>
+      </w:tr>
+      <w:tr>
+        <w:tc>
+          <w:tcPr>
+            <w:tcW w:type="dxa" w:w="1560"/>
+            <w:vAlign w:val="center"/>
+            <w:tcMar>
+              <w:top w:w="80" w:type="dxa"/>
+              <w:start w:w="120" w:type="dxa"/>
+              <w:bottom w:w="80" w:type="dxa"/>
+              <w:end w:w="120" w:type="dxa"/>
+            </w:tcMar>
+          </w:tcPr>
+          <w:p>
+            <w:pPr>
+              <w:spacing w:after="0"/>
+              <w:jc w:val="left"/>
+            </w:pPr>
+            <w:r>
+              <w:rPr>
+                <w:rFonts w:ascii="Arial" w:hAnsi="Arial" w:eastAsia="Arial"/>
+                <w:b w:val="0"/>
+                <w:color w:val="111827"/>
+                <w:sz w:val="16"/>
+              </w:rPr>
+              <w:t>3</w:t>
+            </w:r>
+          </w:p>
+        </w:tc>
+        <w:tc>
+          <w:tcPr>
+            <w:tcW w:type="dxa" w:w="1560"/>
+            <w:vAlign w:val="center"/>
+            <w:tcMar>
+              <w:top w:w="80" w:type="dxa"/>
+              <w:start w:w="120" w:type="dxa"/>
+              <w:bottom w:w="80" w:type="dxa"/>
+              <w:end w:w="120" w:type="dxa"/>
+            </w:tcMar>
+          </w:tcPr>
+          <w:p>
+            <w:pPr>
+              <w:spacing w:after="0"/>
+              <w:jc w:val="left"/>
+            </w:pPr>
+            <w:r>
+              <w:rPr>
+                <w:rFonts w:ascii="Arial" w:hAnsi="Arial" w:eastAsia="Arial"/>
+                <w:b w:val="0"/>
+                <w:color w:val="111827"/>
+                <w:sz w:val="16"/>
+              </w:rPr>
+              <w:t>walkthrough конкурентов</w:t>
+            </w:r>
+          </w:p>
+        </w:tc>
+        <w:tc>
+          <w:tcPr>
+            <w:tcW w:type="dxa" w:w="1560"/>
+            <w:vAlign w:val="center"/>
+            <w:tcMar>
+              <w:top w:w="80" w:type="dxa"/>
+              <w:start w:w="120" w:type="dxa"/>
+              <w:bottom w:w="80" w:type="dxa"/>
+              <w:end w:w="120" w:type="dxa"/>
+            </w:tcMar>
+          </w:tcPr>
+          <w:p>
+            <w:pPr>
+              <w:spacing w:after="0"/>
+              <w:jc w:val="left"/>
+            </w:pPr>
+            <w:r>
+              <w:rPr>
+                <w:rFonts w:ascii="Arial" w:hAnsi="Arial" w:eastAsia="Arial"/>
+                <w:b w:val="0"/>
+                <w:color w:val="111827"/>
+                <w:sz w:val="16"/>
+              </w:rPr>
+              <w:t>Miracle Morning Routine</w:t>
+            </w:r>
+          </w:p>
+        </w:tc>
+        <w:tc>
+          <w:tcPr>
+            <w:tcW w:type="dxa" w:w="1560"/>
+            <w:vAlign w:val="center"/>
+            <w:tcMar>
+              <w:top w:w="80" w:type="dxa"/>
+              <w:start w:w="120" w:type="dxa"/>
+              <w:bottom w:w="80" w:type="dxa"/>
+              <w:end w:w="120" w:type="dxa"/>
+            </w:tcMar>
+          </w:tcPr>
+          <w:p>
+            <w:pPr>
+              <w:spacing w:after="0"/>
+              <w:jc w:val="left"/>
+            </w:pPr>
+            <w:r>
+              <w:rPr>
+                <w:rFonts w:ascii="Arial" w:hAnsi="Arial" w:eastAsia="Arial"/>
+                <w:b w:val="0"/>
+                <w:color w:val="111827"/>
+                <w:sz w:val="16"/>
+              </w:rPr>
+              <w:t>H1/H3</w:t>
+            </w:r>
+          </w:p>
+        </w:tc>
+        <w:tc>
+          <w:tcPr>
+            <w:tcW w:type="dxa" w:w="1560"/>
+            <w:vAlign w:val="center"/>
+            <w:tcMar>
+              <w:top w:w="80" w:type="dxa"/>
+              <w:start w:w="120" w:type="dxa"/>
+              <w:bottom w:w="80" w:type="dxa"/>
+              <w:end w:w="120" w:type="dxa"/>
+            </w:tcMar>
+          </w:tcPr>
+          <w:p>
+            <w:pPr>
+              <w:spacing w:after="0"/>
+              <w:jc w:val="left"/>
+            </w:pPr>
+            <w:r>
+              <w:rPr>
+                <w:rFonts w:ascii="Arial" w:hAnsi="Arial" w:eastAsia="Arial"/>
+                <w:b w:val="0"/>
+                <w:color w:val="111827"/>
+                <w:sz w:val="16"/>
+              </w:rPr>
+              <w:t>открыть listing/app, сохранить 5 слотов скриншотов, записать full-loop/directness/causality verdict</w:t>
+            </w:r>
+          </w:p>
+        </w:tc>
+        <w:tc>
+          <w:tcPr>
+            <w:tcW w:type="dxa" w:w="1560"/>
+            <w:vAlign w:val="center"/>
+            <w:tcMar>
+              <w:top w:w="80" w:type="dxa"/>
+              <w:start w:w="120" w:type="dxa"/>
+              <w:bottom w:w="80" w:type="dxa"/>
+              <w:end w:w="120" w:type="dxa"/>
+            </w:tcMar>
+          </w:tcPr>
+          <w:p>
+            <w:pPr>
+              <w:spacing w:after="0"/>
+              <w:jc w:val="left"/>
+            </w:pPr>
+            <w:r>
+              <w:rPr>
+                <w:rFonts w:ascii="Arial" w:hAnsi="Arial" w:eastAsia="Arial"/>
+                <w:b w:val="0"/>
+                <w:color w:val="111827"/>
+                <w:sz w:val="16"/>
+              </w:rPr>
+              <w:t>data_processed/manual_competitor_inspection_packet.csv</w:t>
+            </w:r>
+          </w:p>
+        </w:tc>
+      </w:tr>
+      <w:tr>
+        <w:tc>
+          <w:tcPr>
+            <w:tcW w:type="dxa" w:w="1560"/>
+            <w:vAlign w:val="center"/>
+            <w:tcMar>
+              <w:top w:w="80" w:type="dxa"/>
+              <w:start w:w="120" w:type="dxa"/>
+              <w:bottom w:w="80" w:type="dxa"/>
+              <w:end w:w="120" w:type="dxa"/>
+            </w:tcMar>
+            <w:shd w:fill="F8FAFC"/>
+          </w:tcPr>
+          <w:p>
+            <w:pPr>
+              <w:spacing w:after="0"/>
+              <w:jc w:val="left"/>
+            </w:pPr>
+            <w:r>
+              <w:rPr>
+                <w:rFonts w:ascii="Arial" w:hAnsi="Arial" w:eastAsia="Arial"/>
+                <w:b w:val="0"/>
+                <w:color w:val="111827"/>
+                <w:sz w:val="16"/>
+              </w:rPr>
+              <w:t>4</w:t>
+            </w:r>
+          </w:p>
+        </w:tc>
+        <w:tc>
+          <w:tcPr>
+            <w:tcW w:type="dxa" w:w="1560"/>
+            <w:vAlign w:val="center"/>
+            <w:tcMar>
+              <w:top w:w="80" w:type="dxa"/>
+              <w:start w:w="120" w:type="dxa"/>
+              <w:bottom w:w="80" w:type="dxa"/>
+              <w:end w:w="120" w:type="dxa"/>
+            </w:tcMar>
+            <w:shd w:fill="F8FAFC"/>
+          </w:tcPr>
+          <w:p>
+            <w:pPr>
+              <w:spacing w:after="0"/>
+              <w:jc w:val="left"/>
+            </w:pPr>
+            <w:r>
+              <w:rPr>
+                <w:rFonts w:ascii="Arial" w:hAnsi="Arial" w:eastAsia="Arial"/>
+                <w:b w:val="0"/>
+                <w:color w:val="111827"/>
+                <w:sz w:val="16"/>
+              </w:rPr>
+              <w:t>walkthrough конкурентов</w:t>
+            </w:r>
+          </w:p>
+        </w:tc>
+        <w:tc>
+          <w:tcPr>
+            <w:tcW w:type="dxa" w:w="1560"/>
+            <w:vAlign w:val="center"/>
+            <w:tcMar>
+              <w:top w:w="80" w:type="dxa"/>
+              <w:start w:w="120" w:type="dxa"/>
+              <w:bottom w:w="80" w:type="dxa"/>
+              <w:end w:w="120" w:type="dxa"/>
+            </w:tcMar>
+            <w:shd w:fill="F8FAFC"/>
+          </w:tcPr>
+          <w:p>
+            <w:pPr>
+              <w:spacing w:after="0"/>
+              <w:jc w:val="left"/>
+            </w:pPr>
+            <w:r>
+              <w:rPr>
+                <w:rFonts w:ascii="Arial" w:hAnsi="Arial" w:eastAsia="Arial"/>
+                <w:b w:val="0"/>
+                <w:color w:val="111827"/>
+                <w:sz w:val="16"/>
+              </w:rPr>
+              <w:t>EVOLVE: Transform Your Life</w:t>
+            </w:r>
+          </w:p>
+        </w:tc>
+        <w:tc>
+          <w:tcPr>
+            <w:tcW w:type="dxa" w:w="1560"/>
+            <w:vAlign w:val="center"/>
+            <w:tcMar>
+              <w:top w:w="80" w:type="dxa"/>
+              <w:start w:w="120" w:type="dxa"/>
+              <w:bottom w:w="80" w:type="dxa"/>
+              <w:end w:w="120" w:type="dxa"/>
+            </w:tcMar>
+            <w:shd w:fill="F8FAFC"/>
+          </w:tcPr>
+          <w:p>
+            <w:pPr>
+              <w:spacing w:after="0"/>
+              <w:jc w:val="left"/>
+            </w:pPr>
+            <w:r>
+              <w:rPr>
+                <w:rFonts w:ascii="Arial" w:hAnsi="Arial" w:eastAsia="Arial"/>
+                <w:b w:val="0"/>
+                <w:color w:val="111827"/>
+                <w:sz w:val="16"/>
+              </w:rPr>
+              <w:t>H1/H3</w:t>
+            </w:r>
+          </w:p>
+        </w:tc>
+        <w:tc>
+          <w:tcPr>
+            <w:tcW w:type="dxa" w:w="1560"/>
+            <w:vAlign w:val="center"/>
+            <w:tcMar>
+              <w:top w:w="80" w:type="dxa"/>
+              <w:start w:w="120" w:type="dxa"/>
+              <w:bottom w:w="80" w:type="dxa"/>
+              <w:end w:w="120" w:type="dxa"/>
+            </w:tcMar>
+            <w:shd w:fill="F8FAFC"/>
+          </w:tcPr>
+          <w:p>
+            <w:pPr>
+              <w:spacing w:after="0"/>
+              <w:jc w:val="left"/>
+            </w:pPr>
+            <w:r>
+              <w:rPr>
+                <w:rFonts w:ascii="Arial" w:hAnsi="Arial" w:eastAsia="Arial"/>
+                <w:b w:val="0"/>
+                <w:color w:val="111827"/>
+                <w:sz w:val="16"/>
+              </w:rPr>
+              <w:t>открыть listing/app, сохранить 5 слотов скриншотов, записать full-loop/directness/causality verdict</w:t>
+            </w:r>
+          </w:p>
+        </w:tc>
+        <w:tc>
+          <w:tcPr>
+            <w:tcW w:type="dxa" w:w="1560"/>
+            <w:vAlign w:val="center"/>
+            <w:tcMar>
+              <w:top w:w="80" w:type="dxa"/>
+              <w:start w:w="120" w:type="dxa"/>
+              <w:bottom w:w="80" w:type="dxa"/>
+              <w:end w:w="120" w:type="dxa"/>
+            </w:tcMar>
+            <w:shd w:fill="F8FAFC"/>
+          </w:tcPr>
+          <w:p>
+            <w:pPr>
+              <w:spacing w:after="0"/>
+              <w:jc w:val="left"/>
+            </w:pPr>
+            <w:r>
+              <w:rPr>
+                <w:rFonts w:ascii="Arial" w:hAnsi="Arial" w:eastAsia="Arial"/>
+                <w:b w:val="0"/>
+                <w:color w:val="111827"/>
+                <w:sz w:val="16"/>
+              </w:rPr>
+              <w:t>data_processed/manual_competitor_inspection_packet.csv</w:t>
+            </w:r>
+          </w:p>
+        </w:tc>
+      </w:tr>
+      <w:tr>
+        <w:tc>
+          <w:tcPr>
+            <w:tcW w:type="dxa" w:w="1560"/>
+            <w:vAlign w:val="center"/>
+            <w:tcMar>
+              <w:top w:w="80" w:type="dxa"/>
+              <w:start w:w="120" w:type="dxa"/>
+              <w:bottom w:w="80" w:type="dxa"/>
+              <w:end w:w="120" w:type="dxa"/>
+            </w:tcMar>
+          </w:tcPr>
+          <w:p>
+            <w:pPr>
+              <w:spacing w:after="0"/>
+              <w:jc w:val="left"/>
+            </w:pPr>
+            <w:r>
+              <w:rPr>
+                <w:rFonts w:ascii="Arial" w:hAnsi="Arial" w:eastAsia="Arial"/>
+                <w:b w:val="0"/>
+                <w:color w:val="111827"/>
+                <w:sz w:val="16"/>
+              </w:rPr>
+              <w:t>5</w:t>
+            </w:r>
+          </w:p>
+        </w:tc>
+        <w:tc>
+          <w:tcPr>
+            <w:tcW w:type="dxa" w:w="1560"/>
+            <w:vAlign w:val="center"/>
+            <w:tcMar>
+              <w:top w:w="80" w:type="dxa"/>
+              <w:start w:w="120" w:type="dxa"/>
+              <w:bottom w:w="80" w:type="dxa"/>
+              <w:end w:w="120" w:type="dxa"/>
+            </w:tcMar>
+          </w:tcPr>
+          <w:p>
+            <w:pPr>
+              <w:spacing w:after="0"/>
+              <w:jc w:val="left"/>
+            </w:pPr>
+            <w:r>
+              <w:rPr>
+                <w:rFonts w:ascii="Arial" w:hAnsi="Arial" w:eastAsia="Arial"/>
+                <w:b w:val="0"/>
+                <w:color w:val="111827"/>
+                <w:sz w:val="16"/>
+              </w:rPr>
+              <w:t>walkthrough конкурентов</w:t>
+            </w:r>
+          </w:p>
+        </w:tc>
+        <w:tc>
+          <w:tcPr>
+            <w:tcW w:type="dxa" w:w="1560"/>
+            <w:vAlign w:val="center"/>
+            <w:tcMar>
+              <w:top w:w="80" w:type="dxa"/>
+              <w:start w:w="120" w:type="dxa"/>
+              <w:bottom w:w="80" w:type="dxa"/>
+              <w:end w:w="120" w:type="dxa"/>
+            </w:tcMar>
+          </w:tcPr>
+          <w:p>
+            <w:pPr>
+              <w:spacing w:after="0"/>
+              <w:jc w:val="left"/>
+            </w:pPr>
+            <w:r>
+              <w:rPr>
+                <w:rFonts w:ascii="Arial" w:hAnsi="Arial" w:eastAsia="Arial"/>
+                <w:b w:val="0"/>
+                <w:color w:val="111827"/>
+                <w:sz w:val="16"/>
+              </w:rPr>
+              <w:t>Daily Yoga: Yoga for Fitness®</w:t>
+            </w:r>
+          </w:p>
+        </w:tc>
+        <w:tc>
+          <w:tcPr>
+            <w:tcW w:type="dxa" w:w="1560"/>
+            <w:vAlign w:val="center"/>
+            <w:tcMar>
+              <w:top w:w="80" w:type="dxa"/>
+              <w:start w:w="120" w:type="dxa"/>
+              <w:bottom w:w="80" w:type="dxa"/>
+              <w:end w:w="120" w:type="dxa"/>
+            </w:tcMar>
+          </w:tcPr>
+          <w:p>
+            <w:pPr>
+              <w:spacing w:after="0"/>
+              <w:jc w:val="left"/>
+            </w:pPr>
+            <w:r>
+              <w:rPr>
+                <w:rFonts w:ascii="Arial" w:hAnsi="Arial" w:eastAsia="Arial"/>
+                <w:b w:val="0"/>
+                <w:color w:val="111827"/>
+                <w:sz w:val="16"/>
+              </w:rPr>
+              <w:t>H1/H3</w:t>
+            </w:r>
+          </w:p>
+        </w:tc>
+        <w:tc>
+          <w:tcPr>
+            <w:tcW w:type="dxa" w:w="1560"/>
+            <w:vAlign w:val="center"/>
+            <w:tcMar>
+              <w:top w:w="80" w:type="dxa"/>
+              <w:start w:w="120" w:type="dxa"/>
+              <w:bottom w:w="80" w:type="dxa"/>
+              <w:end w:w="120" w:type="dxa"/>
+            </w:tcMar>
+          </w:tcPr>
+          <w:p>
+            <w:pPr>
+              <w:spacing w:after="0"/>
+              <w:jc w:val="left"/>
+            </w:pPr>
+            <w:r>
+              <w:rPr>
+                <w:rFonts w:ascii="Arial" w:hAnsi="Arial" w:eastAsia="Arial"/>
+                <w:b w:val="0"/>
+                <w:color w:val="111827"/>
+                <w:sz w:val="16"/>
+              </w:rPr>
+              <w:t>открыть listing/app, сохранить 5 слотов скриншотов, записать full-loop/directness/causality verdict</w:t>
+            </w:r>
+          </w:p>
+        </w:tc>
+        <w:tc>
+          <w:tcPr>
+            <w:tcW w:type="dxa" w:w="1560"/>
+            <w:vAlign w:val="center"/>
+            <w:tcMar>
+              <w:top w:w="80" w:type="dxa"/>
+              <w:start w:w="120" w:type="dxa"/>
+              <w:bottom w:w="80" w:type="dxa"/>
+              <w:end w:w="120" w:type="dxa"/>
+            </w:tcMar>
+          </w:tcPr>
+          <w:p>
+            <w:pPr>
+              <w:spacing w:after="0"/>
+              <w:jc w:val="left"/>
+            </w:pPr>
+            <w:r>
+              <w:rPr>
+                <w:rFonts w:ascii="Arial" w:hAnsi="Arial" w:eastAsia="Arial"/>
+                <w:b w:val="0"/>
+                <w:color w:val="111827"/>
+                <w:sz w:val="16"/>
+              </w:rPr>
+              <w:t>data_processed/manual_competitor_inspection_packet.csv</w:t>
+            </w:r>
+          </w:p>
+        </w:tc>
+      </w:tr>
+      <w:tr>
+        <w:tc>
+          <w:tcPr>
+            <w:tcW w:type="dxa" w:w="1560"/>
+            <w:vAlign w:val="center"/>
+            <w:tcMar>
+              <w:top w:w="80" w:type="dxa"/>
+              <w:start w:w="120" w:type="dxa"/>
+              <w:bottom w:w="80" w:type="dxa"/>
+              <w:end w:w="120" w:type="dxa"/>
+            </w:tcMar>
+            <w:shd w:fill="F8FAFC"/>
+          </w:tcPr>
+          <w:p>
+            <w:pPr>
+              <w:spacing w:after="0"/>
+              <w:jc w:val="left"/>
+            </w:pPr>
+            <w:r>
+              <w:rPr>
+                <w:rFonts w:ascii="Arial" w:hAnsi="Arial" w:eastAsia="Arial"/>
+                <w:b w:val="0"/>
+                <w:color w:val="111827"/>
+                <w:sz w:val="16"/>
+              </w:rPr>
+              <w:t>6</w:t>
+            </w:r>
+          </w:p>
+        </w:tc>
+        <w:tc>
+          <w:tcPr>
+            <w:tcW w:type="dxa" w:w="1560"/>
+            <w:vAlign w:val="center"/>
+            <w:tcMar>
+              <w:top w:w="80" w:type="dxa"/>
+              <w:start w:w="120" w:type="dxa"/>
+              <w:bottom w:w="80" w:type="dxa"/>
+              <w:end w:w="120" w:type="dxa"/>
+            </w:tcMar>
+            <w:shd w:fill="F8FAFC"/>
+          </w:tcPr>
+          <w:p>
+            <w:pPr>
+              <w:spacing w:after="0"/>
+              <w:jc w:val="left"/>
+            </w:pPr>
+            <w:r>
+              <w:rPr>
+                <w:rFonts w:ascii="Arial" w:hAnsi="Arial" w:eastAsia="Arial"/>
+                <w:b w:val="0"/>
+                <w:color w:val="111827"/>
+                <w:sz w:val="16"/>
+              </w:rPr>
+              <w:t>paywall и деньги</w:t>
+            </w:r>
+          </w:p>
+        </w:tc>
+        <w:tc>
+          <w:tcPr>
+            <w:tcW w:type="dxa" w:w="1560"/>
+            <w:vAlign w:val="center"/>
+            <w:tcMar>
+              <w:top w:w="80" w:type="dxa"/>
+              <w:start w:w="120" w:type="dxa"/>
+              <w:bottom w:w="80" w:type="dxa"/>
+              <w:end w:w="120" w:type="dxa"/>
+            </w:tcMar>
+            <w:shd w:fill="F8FAFC"/>
+          </w:tcPr>
+          <w:p>
+            <w:pPr>
+              <w:spacing w:after="0"/>
+              <w:jc w:val="left"/>
+            </w:pPr>
+            <w:r>
+              <w:rPr>
+                <w:rFonts w:ascii="Arial" w:hAnsi="Arial" w:eastAsia="Arial"/>
+                <w:b w:val="0"/>
+                <w:color w:val="111827"/>
+                <w:sz w:val="16"/>
+              </w:rPr>
+              <w:t>Character AI: Chat, Talk, Text</w:t>
+            </w:r>
+          </w:p>
+        </w:tc>
+        <w:tc>
+          <w:tcPr>
+            <w:tcW w:type="dxa" w:w="1560"/>
+            <w:vAlign w:val="center"/>
+            <w:tcMar>
+              <w:top w:w="80" w:type="dxa"/>
+              <w:start w:w="120" w:type="dxa"/>
+              <w:bottom w:w="80" w:type="dxa"/>
+              <w:end w:w="120" w:type="dxa"/>
+            </w:tcMar>
+            <w:shd w:fill="F8FAFC"/>
+          </w:tcPr>
+          <w:p>
+            <w:pPr>
+              <w:spacing w:after="0"/>
+              <w:jc w:val="left"/>
+            </w:pPr>
+            <w:r>
+              <w:rPr>
+                <w:rFonts w:ascii="Arial" w:hAnsi="Arial" w:eastAsia="Arial"/>
+                <w:b w:val="0"/>
+                <w:color w:val="111827"/>
+                <w:sz w:val="16"/>
+              </w:rPr>
+              <w:t>H2</w:t>
+            </w:r>
+          </w:p>
+        </w:tc>
+        <w:tc>
+          <w:tcPr>
+            <w:tcW w:type="dxa" w:w="1560"/>
+            <w:vAlign w:val="center"/>
+            <w:tcMar>
+              <w:top w:w="80" w:type="dxa"/>
+              <w:start w:w="120" w:type="dxa"/>
+              <w:bottom w:w="80" w:type="dxa"/>
+              <w:end w:w="120" w:type="dxa"/>
+            </w:tcMar>
+            <w:shd w:fill="F8FAFC"/>
+          </w:tcPr>
+          <w:p>
+            <w:pPr>
+              <w:spacing w:after="0"/>
+              <w:jc w:val="left"/>
+            </w:pPr>
+            <w:r>
+              <w:rPr>
+                <w:rFonts w:ascii="Arial" w:hAnsi="Arial" w:eastAsia="Arial"/>
+                <w:b w:val="0"/>
+                <w:color w:val="111827"/>
+                <w:sz w:val="16"/>
+              </w:rPr>
+              <w:t>проверить screenshot/source, подтвердить цену, trial, product-match и границу первого paywall</w:t>
+            </w:r>
+          </w:p>
+        </w:tc>
+        <w:tc>
+          <w:tcPr>
+            <w:tcW w:type="dxa" w:w="1560"/>
+            <w:vAlign w:val="center"/>
+            <w:tcMar>
+              <w:top w:w="80" w:type="dxa"/>
+              <w:start w:w="120" w:type="dxa"/>
+              <w:bottom w:w="80" w:type="dxa"/>
+              <w:end w:w="120" w:type="dxa"/>
+            </w:tcMar>
+            <w:shd w:fill="F8FAFC"/>
+          </w:tcPr>
+          <w:p>
+            <w:pPr>
+              <w:spacing w:after="0"/>
+              <w:jc w:val="left"/>
+            </w:pPr>
+            <w:r>
+              <w:rPr>
+                <w:rFonts w:ascii="Arial" w:hAnsi="Arial" w:eastAsia="Arial"/>
+                <w:b w:val="0"/>
+                <w:color w:val="111827"/>
+                <w:sz w:val="16"/>
+              </w:rPr>
+              <w:t>data_processed/web_paywall_visual_adjudication.csv</w:t>
+            </w:r>
+          </w:p>
+        </w:tc>
+      </w:tr>
+      <w:tr>
+        <w:tc>
+          <w:tcPr>
+            <w:tcW w:type="dxa" w:w="1560"/>
+            <w:vAlign w:val="center"/>
+            <w:tcMar>
+              <w:top w:w="80" w:type="dxa"/>
+              <w:start w:w="120" w:type="dxa"/>
+              <w:bottom w:w="80" w:type="dxa"/>
+              <w:end w:w="120" w:type="dxa"/>
+            </w:tcMar>
+          </w:tcPr>
+          <w:p>
+            <w:pPr>
+              <w:spacing w:after="0"/>
+              <w:jc w:val="left"/>
+            </w:pPr>
+            <w:r>
+              <w:rPr>
+                <w:rFonts w:ascii="Arial" w:hAnsi="Arial" w:eastAsia="Arial"/>
+                <w:b w:val="0"/>
+                <w:color w:val="111827"/>
+                <w:sz w:val="16"/>
+              </w:rPr>
+              <w:t>7</w:t>
+            </w:r>
+          </w:p>
+        </w:tc>
+        <w:tc>
+          <w:tcPr>
+            <w:tcW w:type="dxa" w:w="1560"/>
+            <w:vAlign w:val="center"/>
+            <w:tcMar>
+              <w:top w:w="80" w:type="dxa"/>
+              <w:start w:w="120" w:type="dxa"/>
+              <w:bottom w:w="80" w:type="dxa"/>
+              <w:end w:w="120" w:type="dxa"/>
+            </w:tcMar>
+          </w:tcPr>
+          <w:p>
+            <w:pPr>
+              <w:spacing w:after="0"/>
+              <w:jc w:val="left"/>
+            </w:pPr>
+            <w:r>
+              <w:rPr>
+                <w:rFonts w:ascii="Arial" w:hAnsi="Arial" w:eastAsia="Arial"/>
+                <w:b w:val="0"/>
+                <w:color w:val="111827"/>
+                <w:sz w:val="16"/>
+              </w:rPr>
+              <w:t>paywall и деньги</w:t>
+            </w:r>
+          </w:p>
+        </w:tc>
+        <w:tc>
+          <w:tcPr>
+            <w:tcW w:type="dxa" w:w="1560"/>
+            <w:vAlign w:val="center"/>
+            <w:tcMar>
+              <w:top w:w="80" w:type="dxa"/>
+              <w:start w:w="120" w:type="dxa"/>
+              <w:bottom w:w="80" w:type="dxa"/>
+              <w:end w:w="120" w:type="dxa"/>
+            </w:tcMar>
+          </w:tcPr>
+          <w:p>
+            <w:pPr>
+              <w:spacing w:after="0"/>
+              <w:jc w:val="left"/>
+            </w:pPr>
+            <w:r>
+              <w:rPr>
+                <w:rFonts w:ascii="Arial" w:hAnsi="Arial" w:eastAsia="Arial"/>
+                <w:b w:val="0"/>
+                <w:color w:val="111827"/>
+                <w:sz w:val="16"/>
+              </w:rPr>
+              <w:t>Headspace: Sleep &amp; Meditate</w:t>
+            </w:r>
+          </w:p>
+        </w:tc>
+        <w:tc>
+          <w:tcPr>
+            <w:tcW w:type="dxa" w:w="1560"/>
+            <w:vAlign w:val="center"/>
+            <w:tcMar>
+              <w:top w:w="80" w:type="dxa"/>
+              <w:start w:w="120" w:type="dxa"/>
+              <w:bottom w:w="80" w:type="dxa"/>
+              <w:end w:w="120" w:type="dxa"/>
+            </w:tcMar>
+          </w:tcPr>
+          <w:p>
+            <w:pPr>
+              <w:spacing w:after="0"/>
+              <w:jc w:val="left"/>
+            </w:pPr>
+            <w:r>
+              <w:rPr>
+                <w:rFonts w:ascii="Arial" w:hAnsi="Arial" w:eastAsia="Arial"/>
+                <w:b w:val="0"/>
+                <w:color w:val="111827"/>
+                <w:sz w:val="16"/>
+              </w:rPr>
+              <w:t>H2</w:t>
+            </w:r>
+          </w:p>
+        </w:tc>
+        <w:tc>
+          <w:tcPr>
+            <w:tcW w:type="dxa" w:w="1560"/>
+            <w:vAlign w:val="center"/>
+            <w:tcMar>
+              <w:top w:w="80" w:type="dxa"/>
+              <w:start w:w="120" w:type="dxa"/>
+              <w:bottom w:w="80" w:type="dxa"/>
+              <w:end w:w="120" w:type="dxa"/>
+            </w:tcMar>
+          </w:tcPr>
+          <w:p>
+            <w:pPr>
+              <w:spacing w:after="0"/>
+              <w:jc w:val="left"/>
+            </w:pPr>
+            <w:r>
+              <w:rPr>
+                <w:rFonts w:ascii="Arial" w:hAnsi="Arial" w:eastAsia="Arial"/>
+                <w:b w:val="0"/>
+                <w:color w:val="111827"/>
+                <w:sz w:val="16"/>
+              </w:rPr>
+              <w:t>проверить screenshot/source, подтвердить цену, trial, product-match и границу первого paywall</w:t>
+            </w:r>
+          </w:p>
+        </w:tc>
+        <w:tc>
+          <w:tcPr>
+            <w:tcW w:type="dxa" w:w="1560"/>
+            <w:vAlign w:val="center"/>
+            <w:tcMar>
+              <w:top w:w="80" w:type="dxa"/>
+              <w:start w:w="120" w:type="dxa"/>
+              <w:bottom w:w="80" w:type="dxa"/>
+              <w:end w:w="120" w:type="dxa"/>
+            </w:tcMar>
+          </w:tcPr>
+          <w:p>
+            <w:pPr>
+              <w:spacing w:after="0"/>
+              <w:jc w:val="left"/>
+            </w:pPr>
+            <w:r>
+              <w:rPr>
+                <w:rFonts w:ascii="Arial" w:hAnsi="Arial" w:eastAsia="Arial"/>
+                <w:b w:val="0"/>
+                <w:color w:val="111827"/>
+                <w:sz w:val="16"/>
+              </w:rPr>
+              <w:t>data_processed/web_paywall_visual_adjudication.csv</w:t>
+            </w:r>
+          </w:p>
+        </w:tc>
+      </w:tr>
+      <w:tr>
+        <w:tc>
+          <w:tcPr>
+            <w:tcW w:type="dxa" w:w="1560"/>
+            <w:vAlign w:val="center"/>
+            <w:tcMar>
+              <w:top w:w="80" w:type="dxa"/>
+              <w:start w:w="120" w:type="dxa"/>
+              <w:bottom w:w="80" w:type="dxa"/>
+              <w:end w:w="120" w:type="dxa"/>
+            </w:tcMar>
+            <w:shd w:fill="F8FAFC"/>
+          </w:tcPr>
+          <w:p>
+            <w:pPr>
+              <w:spacing w:after="0"/>
+              <w:jc w:val="left"/>
+            </w:pPr>
+            <w:r>
+              <w:rPr>
+                <w:rFonts w:ascii="Arial" w:hAnsi="Arial" w:eastAsia="Arial"/>
+                <w:b w:val="0"/>
+                <w:color w:val="111827"/>
+                <w:sz w:val="16"/>
+              </w:rPr>
+              <w:t>8</w:t>
+            </w:r>
+          </w:p>
+        </w:tc>
+        <w:tc>
+          <w:tcPr>
+            <w:tcW w:type="dxa" w:w="1560"/>
+            <w:vAlign w:val="center"/>
+            <w:tcMar>
+              <w:top w:w="80" w:type="dxa"/>
+              <w:start w:w="120" w:type="dxa"/>
+              <w:bottom w:w="80" w:type="dxa"/>
+              <w:end w:w="120" w:type="dxa"/>
+            </w:tcMar>
+            <w:shd w:fill="F8FAFC"/>
+          </w:tcPr>
+          <w:p>
+            <w:pPr>
+              <w:spacing w:after="0"/>
+              <w:jc w:val="left"/>
+            </w:pPr>
+            <w:r>
+              <w:rPr>
+                <w:rFonts w:ascii="Arial" w:hAnsi="Arial" w:eastAsia="Arial"/>
+                <w:b w:val="0"/>
+                <w:color w:val="111827"/>
+                <w:sz w:val="16"/>
+              </w:rPr>
+              <w:t>paywall и деньги</w:t>
+            </w:r>
+          </w:p>
+        </w:tc>
+        <w:tc>
+          <w:tcPr>
+            <w:tcW w:type="dxa" w:w="1560"/>
+            <w:vAlign w:val="center"/>
+            <w:tcMar>
+              <w:top w:w="80" w:type="dxa"/>
+              <w:start w:w="120" w:type="dxa"/>
+              <w:bottom w:w="80" w:type="dxa"/>
+              <w:end w:w="120" w:type="dxa"/>
+            </w:tcMar>
+            <w:shd w:fill="F8FAFC"/>
+          </w:tcPr>
+          <w:p>
+            <w:pPr>
+              <w:spacing w:after="0"/>
+              <w:jc w:val="left"/>
+            </w:pPr>
+            <w:r>
+              <w:rPr>
+                <w:rFonts w:ascii="Arial" w:hAnsi="Arial" w:eastAsia="Arial"/>
+                <w:b w:val="0"/>
+                <w:color w:val="111827"/>
+                <w:sz w:val="16"/>
+              </w:rPr>
+              <w:t>Meditopia: Sleep &amp; Meditation</w:t>
+            </w:r>
+          </w:p>
+        </w:tc>
+        <w:tc>
+          <w:tcPr>
+            <w:tcW w:type="dxa" w:w="1560"/>
+            <w:vAlign w:val="center"/>
+            <w:tcMar>
+              <w:top w:w="80" w:type="dxa"/>
+              <w:start w:w="120" w:type="dxa"/>
+              <w:bottom w:w="80" w:type="dxa"/>
+              <w:end w:w="120" w:type="dxa"/>
+            </w:tcMar>
+            <w:shd w:fill="F8FAFC"/>
+          </w:tcPr>
+          <w:p>
+            <w:pPr>
+              <w:spacing w:after="0"/>
+              <w:jc w:val="left"/>
+            </w:pPr>
+            <w:r>
+              <w:rPr>
+                <w:rFonts w:ascii="Arial" w:hAnsi="Arial" w:eastAsia="Arial"/>
+                <w:b w:val="0"/>
+                <w:color w:val="111827"/>
+                <w:sz w:val="16"/>
+              </w:rPr>
+              <w:t>H2</w:t>
+            </w:r>
+          </w:p>
+        </w:tc>
+        <w:tc>
+          <w:tcPr>
+            <w:tcW w:type="dxa" w:w="1560"/>
+            <w:vAlign w:val="center"/>
+            <w:tcMar>
+              <w:top w:w="80" w:type="dxa"/>
+              <w:start w:w="120" w:type="dxa"/>
+              <w:bottom w:w="80" w:type="dxa"/>
+              <w:end w:w="120" w:type="dxa"/>
+            </w:tcMar>
+            <w:shd w:fill="F8FAFC"/>
+          </w:tcPr>
+          <w:p>
+            <w:pPr>
+              <w:spacing w:after="0"/>
+              <w:jc w:val="left"/>
+            </w:pPr>
+            <w:r>
+              <w:rPr>
+                <w:rFonts w:ascii="Arial" w:hAnsi="Arial" w:eastAsia="Arial"/>
+                <w:b w:val="0"/>
+                <w:color w:val="111827"/>
+                <w:sz w:val="16"/>
+              </w:rPr>
+              <w:t>проверить screenshot/source, подтвердить цену, trial, product-match и границу первого paywall</w:t>
+            </w:r>
+          </w:p>
+        </w:tc>
+        <w:tc>
+          <w:tcPr>
+            <w:tcW w:type="dxa" w:w="1560"/>
+            <w:vAlign w:val="center"/>
+            <w:tcMar>
+              <w:top w:w="80" w:type="dxa"/>
+              <w:start w:w="120" w:type="dxa"/>
+              <w:bottom w:w="80" w:type="dxa"/>
+              <w:end w:w="120" w:type="dxa"/>
+            </w:tcMar>
+            <w:shd w:fill="F8FAFC"/>
+          </w:tcPr>
+          <w:p>
+            <w:pPr>
+              <w:spacing w:after="0"/>
+              <w:jc w:val="left"/>
+            </w:pPr>
+            <w:r>
+              <w:rPr>
+                <w:rFonts w:ascii="Arial" w:hAnsi="Arial" w:eastAsia="Arial"/>
+                <w:b w:val="0"/>
+                <w:color w:val="111827"/>
+                <w:sz w:val="16"/>
+              </w:rPr>
+              <w:t>data_processed/web_paywall_visual_adjudication.csv</w:t>
+            </w:r>
+          </w:p>
+        </w:tc>
+      </w:tr>
+      <w:tr>
+        <w:tc>
+          <w:tcPr>
+            <w:tcW w:type="dxa" w:w="1560"/>
+            <w:vAlign w:val="center"/>
+            <w:tcMar>
+              <w:top w:w="80" w:type="dxa"/>
+              <w:start w:w="120" w:type="dxa"/>
+              <w:bottom w:w="80" w:type="dxa"/>
+              <w:end w:w="120" w:type="dxa"/>
+            </w:tcMar>
+          </w:tcPr>
+          <w:p>
+            <w:pPr>
+              <w:spacing w:after="0"/>
+              <w:jc w:val="left"/>
+            </w:pPr>
+            <w:r>
+              <w:rPr>
+                <w:rFonts w:ascii="Arial" w:hAnsi="Arial" w:eastAsia="Arial"/>
+                <w:b w:val="0"/>
+                <w:color w:val="111827"/>
+                <w:sz w:val="16"/>
+              </w:rPr>
+              <w:t>9</w:t>
+            </w:r>
+          </w:p>
+        </w:tc>
+        <w:tc>
+          <w:tcPr>
+            <w:tcW w:type="dxa" w:w="1560"/>
+            <w:vAlign w:val="center"/>
+            <w:tcMar>
+              <w:top w:w="80" w:type="dxa"/>
+              <w:start w:w="120" w:type="dxa"/>
+              <w:bottom w:w="80" w:type="dxa"/>
+              <w:end w:w="120" w:type="dxa"/>
+            </w:tcMar>
+          </w:tcPr>
+          <w:p>
+            <w:pPr>
+              <w:spacing w:after="0"/>
+              <w:jc w:val="left"/>
+            </w:pPr>
+            <w:r>
+              <w:rPr>
+                <w:rFonts w:ascii="Arial" w:hAnsi="Arial" w:eastAsia="Arial"/>
+                <w:b w:val="0"/>
+                <w:color w:val="111827"/>
+                <w:sz w:val="16"/>
+              </w:rPr>
+              <w:t>paywall и деньги</w:t>
+            </w:r>
+          </w:p>
+        </w:tc>
+        <w:tc>
+          <w:tcPr>
+            <w:tcW w:type="dxa" w:w="1560"/>
+            <w:vAlign w:val="center"/>
+            <w:tcMar>
+              <w:top w:w="80" w:type="dxa"/>
+              <w:start w:w="120" w:type="dxa"/>
+              <w:bottom w:w="80" w:type="dxa"/>
+              <w:end w:w="120" w:type="dxa"/>
+            </w:tcMar>
+          </w:tcPr>
+          <w:p>
+            <w:pPr>
+              <w:spacing w:after="0"/>
+              <w:jc w:val="left"/>
+            </w:pPr>
+            <w:r>
+              <w:rPr>
+                <w:rFonts w:ascii="Arial" w:hAnsi="Arial" w:eastAsia="Arial"/>
+                <w:b w:val="0"/>
+                <w:color w:val="111827"/>
+                <w:sz w:val="16"/>
+              </w:rPr>
+              <w:t>Nebula: Spiritual Guidance</w:t>
+            </w:r>
+          </w:p>
+        </w:tc>
+        <w:tc>
+          <w:tcPr>
+            <w:tcW w:type="dxa" w:w="1560"/>
+            <w:vAlign w:val="center"/>
+            <w:tcMar>
+              <w:top w:w="80" w:type="dxa"/>
+              <w:start w:w="120" w:type="dxa"/>
+              <w:bottom w:w="80" w:type="dxa"/>
+              <w:end w:w="120" w:type="dxa"/>
+            </w:tcMar>
+          </w:tcPr>
+          <w:p>
+            <w:pPr>
+              <w:spacing w:after="0"/>
+              <w:jc w:val="left"/>
+            </w:pPr>
+            <w:r>
+              <w:rPr>
+                <w:rFonts w:ascii="Arial" w:hAnsi="Arial" w:eastAsia="Arial"/>
+                <w:b w:val="0"/>
+                <w:color w:val="111827"/>
+                <w:sz w:val="16"/>
+              </w:rPr>
+              <w:t>H2</w:t>
+            </w:r>
+          </w:p>
+        </w:tc>
+        <w:tc>
+          <w:tcPr>
+            <w:tcW w:type="dxa" w:w="1560"/>
+            <w:vAlign w:val="center"/>
+            <w:tcMar>
+              <w:top w:w="80" w:type="dxa"/>
+              <w:start w:w="120" w:type="dxa"/>
+              <w:bottom w:w="80" w:type="dxa"/>
+              <w:end w:w="120" w:type="dxa"/>
+            </w:tcMar>
+          </w:tcPr>
+          <w:p>
+            <w:pPr>
+              <w:spacing w:after="0"/>
+              <w:jc w:val="left"/>
+            </w:pPr>
+            <w:r>
+              <w:rPr>
+                <w:rFonts w:ascii="Arial" w:hAnsi="Arial" w:eastAsia="Arial"/>
+                <w:b w:val="0"/>
+                <w:color w:val="111827"/>
+                <w:sz w:val="16"/>
+              </w:rPr>
+              <w:t>проверить screenshot/source, подтвердить цену, trial, product-match и границу первого paywall</w:t>
+            </w:r>
+          </w:p>
+        </w:tc>
+        <w:tc>
+          <w:tcPr>
+            <w:tcW w:type="dxa" w:w="1560"/>
+            <w:vAlign w:val="center"/>
+            <w:tcMar>
+              <w:top w:w="80" w:type="dxa"/>
+              <w:start w:w="120" w:type="dxa"/>
+              <w:bottom w:w="80" w:type="dxa"/>
+              <w:end w:w="120" w:type="dxa"/>
+            </w:tcMar>
+          </w:tcPr>
+          <w:p>
+            <w:pPr>
+              <w:spacing w:after="0"/>
+              <w:jc w:val="left"/>
+            </w:pPr>
+            <w:r>
+              <w:rPr>
+                <w:rFonts w:ascii="Arial" w:hAnsi="Arial" w:eastAsia="Arial"/>
+                <w:b w:val="0"/>
+                <w:color w:val="111827"/>
+                <w:sz w:val="16"/>
+              </w:rPr>
+              <w:t>data_processed/web_paywall_visual_adjudication.csv</w:t>
+            </w:r>
+          </w:p>
+        </w:tc>
+      </w:tr>
+      <w:tr>
+        <w:tc>
+          <w:tcPr>
+            <w:tcW w:type="dxa" w:w="1560"/>
+            <w:vAlign w:val="center"/>
+            <w:tcMar>
+              <w:top w:w="80" w:type="dxa"/>
+              <w:start w:w="120" w:type="dxa"/>
+              <w:bottom w:w="80" w:type="dxa"/>
+              <w:end w:w="120" w:type="dxa"/>
+            </w:tcMar>
+            <w:shd w:fill="F8FAFC"/>
+          </w:tcPr>
+          <w:p>
+            <w:pPr>
+              <w:spacing w:after="0"/>
+              <w:jc w:val="left"/>
+            </w:pPr>
+            <w:r>
+              <w:rPr>
+                <w:rFonts w:ascii="Arial" w:hAnsi="Arial" w:eastAsia="Arial"/>
+                <w:b w:val="0"/>
+                <w:color w:val="111827"/>
+                <w:sz w:val="16"/>
+              </w:rPr>
+              <w:t>10</w:t>
+            </w:r>
+          </w:p>
+        </w:tc>
+        <w:tc>
+          <w:tcPr>
+            <w:tcW w:type="dxa" w:w="1560"/>
+            <w:vAlign w:val="center"/>
+            <w:tcMar>
+              <w:top w:w="80" w:type="dxa"/>
+              <w:start w:w="120" w:type="dxa"/>
+              <w:bottom w:w="80" w:type="dxa"/>
+              <w:end w:w="120" w:type="dxa"/>
+            </w:tcMar>
+            <w:shd w:fill="F8FAFC"/>
+          </w:tcPr>
+          <w:p>
+            <w:pPr>
+              <w:spacing w:after="0"/>
+              <w:jc w:val="left"/>
+            </w:pPr>
+            <w:r>
+              <w:rPr>
+                <w:rFonts w:ascii="Arial" w:hAnsi="Arial" w:eastAsia="Arial"/>
+                <w:b w:val="0"/>
+                <w:color w:val="111827"/>
+                <w:sz w:val="16"/>
+              </w:rPr>
+              <w:t>paywall и деньги</w:t>
+            </w:r>
+          </w:p>
+        </w:tc>
+        <w:tc>
+          <w:tcPr>
+            <w:tcW w:type="dxa" w:w="1560"/>
+            <w:vAlign w:val="center"/>
+            <w:tcMar>
+              <w:top w:w="80" w:type="dxa"/>
+              <w:start w:w="120" w:type="dxa"/>
+              <w:bottom w:w="80" w:type="dxa"/>
+              <w:end w:w="120" w:type="dxa"/>
+            </w:tcMar>
+            <w:shd w:fill="F8FAFC"/>
+          </w:tcPr>
+          <w:p>
+            <w:pPr>
+              <w:spacing w:after="0"/>
+              <w:jc w:val="left"/>
+            </w:pPr>
+            <w:r>
+              <w:rPr>
+                <w:rFonts w:ascii="Arial" w:hAnsi="Arial" w:eastAsia="Arial"/>
+                <w:b w:val="0"/>
+                <w:color w:val="111827"/>
+                <w:sz w:val="16"/>
+              </w:rPr>
+              <w:t>Carrom Pool: Disc Game</w:t>
+            </w:r>
+          </w:p>
+        </w:tc>
+        <w:tc>
+          <w:tcPr>
+            <w:tcW w:type="dxa" w:w="1560"/>
+            <w:vAlign w:val="center"/>
+            <w:tcMar>
+              <w:top w:w="80" w:type="dxa"/>
+              <w:start w:w="120" w:type="dxa"/>
+              <w:bottom w:w="80" w:type="dxa"/>
+              <w:end w:w="120" w:type="dxa"/>
+            </w:tcMar>
+            <w:shd w:fill="F8FAFC"/>
+          </w:tcPr>
+          <w:p>
+            <w:pPr>
+              <w:spacing w:after="0"/>
+              <w:jc w:val="left"/>
+            </w:pPr>
+            <w:r>
+              <w:rPr>
+                <w:rFonts w:ascii="Arial" w:hAnsi="Arial" w:eastAsia="Arial"/>
+                <w:b w:val="0"/>
+                <w:color w:val="111827"/>
+                <w:sz w:val="16"/>
+              </w:rPr>
+              <w:t>H2</w:t>
+            </w:r>
+          </w:p>
+        </w:tc>
+        <w:tc>
+          <w:tcPr>
+            <w:tcW w:type="dxa" w:w="1560"/>
+            <w:vAlign w:val="center"/>
+            <w:tcMar>
+              <w:top w:w="80" w:type="dxa"/>
+              <w:start w:w="120" w:type="dxa"/>
+              <w:bottom w:w="80" w:type="dxa"/>
+              <w:end w:w="120" w:type="dxa"/>
+            </w:tcMar>
+            <w:shd w:fill="F8FAFC"/>
+          </w:tcPr>
+          <w:p>
+            <w:pPr>
+              <w:spacing w:after="0"/>
+              <w:jc w:val="left"/>
+            </w:pPr>
+            <w:r>
+              <w:rPr>
+                <w:rFonts w:ascii="Arial" w:hAnsi="Arial" w:eastAsia="Arial"/>
+                <w:b w:val="0"/>
+                <w:color w:val="111827"/>
+                <w:sz w:val="16"/>
+              </w:rPr>
+              <w:t>проверить screenshot/source, подтвердить цену, trial, product-match и границу первого paywall</w:t>
+            </w:r>
+          </w:p>
+        </w:tc>
+        <w:tc>
+          <w:tcPr>
+            <w:tcW w:type="dxa" w:w="1560"/>
+            <w:vAlign w:val="center"/>
+            <w:tcMar>
+              <w:top w:w="80" w:type="dxa"/>
+              <w:start w:w="120" w:type="dxa"/>
+              <w:bottom w:w="80" w:type="dxa"/>
+              <w:end w:w="120" w:type="dxa"/>
+            </w:tcMar>
+            <w:shd w:fill="F8FAFC"/>
+          </w:tcPr>
+          <w:p>
+            <w:pPr>
+              <w:spacing w:after="0"/>
+              <w:jc w:val="left"/>
+            </w:pPr>
+            <w:r>
+              <w:rPr>
+                <w:rFonts w:ascii="Arial" w:hAnsi="Arial" w:eastAsia="Arial"/>
+                <w:b w:val="0"/>
+                <w:color w:val="111827"/>
+                <w:sz w:val="16"/>
+              </w:rPr>
+              <w:t>data_processed/web_paywall_visual_adjudication.csv</w:t>
+            </w:r>
+          </w:p>
+        </w:tc>
+      </w:tr>
+      <w:tr>
+        <w:tc>
+          <w:tcPr>
+            <w:tcW w:type="dxa" w:w="1560"/>
+            <w:vAlign w:val="center"/>
+            <w:tcMar>
+              <w:top w:w="80" w:type="dxa"/>
+              <w:start w:w="120" w:type="dxa"/>
+              <w:bottom w:w="80" w:type="dxa"/>
+              <w:end w:w="120" w:type="dxa"/>
+            </w:tcMar>
+          </w:tcPr>
+          <w:p>
+            <w:pPr>
+              <w:spacing w:after="0"/>
+              <w:jc w:val="left"/>
+            </w:pPr>
+            <w:r>
+              <w:rPr>
+                <w:rFonts w:ascii="Arial" w:hAnsi="Arial" w:eastAsia="Arial"/>
+                <w:b w:val="0"/>
+                <w:color w:val="111827"/>
+                <w:sz w:val="16"/>
+              </w:rPr>
+              <w:t>11</w:t>
+            </w:r>
+          </w:p>
+        </w:tc>
+        <w:tc>
+          <w:tcPr>
+            <w:tcW w:type="dxa" w:w="1560"/>
+            <w:vAlign w:val="center"/>
+            <w:tcMar>
+              <w:top w:w="80" w:type="dxa"/>
+              <w:start w:w="120" w:type="dxa"/>
+              <w:bottom w:w="80" w:type="dxa"/>
+              <w:end w:w="120" w:type="dxa"/>
+            </w:tcMar>
+          </w:tcPr>
+          <w:p>
+            <w:pPr>
+              <w:spacing w:after="0"/>
+              <w:jc w:val="left"/>
+            </w:pPr>
+            <w:r>
+              <w:rPr>
+                <w:rFonts w:ascii="Arial" w:hAnsi="Arial" w:eastAsia="Arial"/>
+                <w:b w:val="0"/>
+                <w:color w:val="111827"/>
+                <w:sz w:val="16"/>
+              </w:rPr>
+              <w:t>ICP интервью</w:t>
+            </w:r>
+          </w:p>
+        </w:tc>
+        <w:tc>
+          <w:tcPr>
+            <w:tcW w:type="dxa" w:w="1560"/>
+            <w:vAlign w:val="center"/>
+            <w:tcMar>
+              <w:top w:w="80" w:type="dxa"/>
+              <w:start w:w="120" w:type="dxa"/>
+              <w:bottom w:w="80" w:type="dxa"/>
+              <w:end w:w="120" w:type="dxa"/>
+            </w:tcMar>
+          </w:tcPr>
+          <w:p>
+            <w:pPr>
+              <w:spacing w:after="0"/>
+              <w:jc w:val="left"/>
+            </w:pPr>
+            <w:r>
+              <w:rPr>
+                <w:rFonts w:ascii="Arial" w:hAnsi="Arial" w:eastAsia="Arial"/>
+                <w:b w:val="0"/>
+                <w:color w:val="111827"/>
+                <w:sz w:val="16"/>
+              </w:rPr>
+              <w:t>Spiritual self-improvers / screener</w:t>
+            </w:r>
+          </w:p>
+        </w:tc>
+        <w:tc>
+          <w:tcPr>
+            <w:tcW w:type="dxa" w:w="1560"/>
+            <w:vAlign w:val="center"/>
+            <w:tcMar>
+              <w:top w:w="80" w:type="dxa"/>
+              <w:start w:w="120" w:type="dxa"/>
+              <w:bottom w:w="80" w:type="dxa"/>
+              <w:end w:w="120" w:type="dxa"/>
+            </w:tcMar>
+          </w:tcPr>
+          <w:p>
+            <w:pPr>
+              <w:spacing w:after="0"/>
+              <w:jc w:val="left"/>
+            </w:pPr>
+            <w:r>
+              <w:rPr>
+                <w:rFonts w:ascii="Arial" w:hAnsi="Arial" w:eastAsia="Arial"/>
+                <w:b w:val="0"/>
+                <w:color w:val="111827"/>
+                <w:sz w:val="16"/>
+              </w:rPr>
+              <w:t>H5/H6</w:t>
+            </w:r>
+          </w:p>
+        </w:tc>
+        <w:tc>
+          <w:tcPr>
+            <w:tcW w:type="dxa" w:w="1560"/>
+            <w:vAlign w:val="center"/>
+            <w:tcMar>
+              <w:top w:w="80" w:type="dxa"/>
+              <w:start w:w="120" w:type="dxa"/>
+              <w:bottom w:w="80" w:type="dxa"/>
+              <w:end w:w="120" w:type="dxa"/>
+            </w:tcMar>
+          </w:tcPr>
+          <w:p>
+            <w:pPr>
+              <w:spacing w:after="0"/>
+              <w:jc w:val="left"/>
+            </w:pPr>
+            <w:r>
+              <w:rPr>
+                <w:rFonts w:ascii="Arial" w:hAnsi="Arial" w:eastAsia="Arial"/>
+                <w:b w:val="0"/>
+                <w:color w:val="111827"/>
+                <w:sz w:val="16"/>
+              </w:rPr>
+              <w:t>спросить, какие приложения/ритуалы/дневники/коучи/avatar-tools участник использовал за 30 дней и что запустило последнее использование</w:t>
+            </w:r>
+          </w:p>
+        </w:tc>
+        <w:tc>
+          <w:tcPr>
+            <w:tcW w:type="dxa" w:w="1560"/>
+            <w:vAlign w:val="center"/>
+            <w:tcMar>
+              <w:top w:w="80" w:type="dxa"/>
+              <w:start w:w="120" w:type="dxa"/>
+              <w:bottom w:w="80" w:type="dxa"/>
+              <w:end w:w="120" w:type="dxa"/>
+            </w:tcMar>
+          </w:tcPr>
+          <w:p>
+            <w:pPr>
+              <w:spacing w:after="0"/>
+              <w:jc w:val="left"/>
+            </w:pPr>
+            <w:r>
+              <w:rPr>
+                <w:rFonts w:ascii="Arial" w:hAnsi="Arial" w:eastAsia="Arial"/>
+                <w:b w:val="0"/>
+                <w:color w:val="111827"/>
+                <w:sz w:val="16"/>
+              </w:rPr>
+              <w:t>data_processed/icp_validation_test_plan.csv</w:t>
+            </w:r>
+          </w:p>
+        </w:tc>
+      </w:tr>
+      <w:tr>
+        <w:tc>
+          <w:tcPr>
+            <w:tcW w:type="dxa" w:w="1560"/>
+            <w:vAlign w:val="center"/>
+            <w:tcMar>
+              <w:top w:w="80" w:type="dxa"/>
+              <w:start w:w="120" w:type="dxa"/>
+              <w:bottom w:w="80" w:type="dxa"/>
+              <w:end w:w="120" w:type="dxa"/>
+            </w:tcMar>
+            <w:shd w:fill="F8FAFC"/>
+          </w:tcPr>
+          <w:p>
+            <w:pPr>
+              <w:spacing w:after="0"/>
+              <w:jc w:val="left"/>
+            </w:pPr>
+            <w:r>
+              <w:rPr>
+                <w:rFonts w:ascii="Arial" w:hAnsi="Arial" w:eastAsia="Arial"/>
+                <w:b w:val="0"/>
+                <w:color w:val="111827"/>
+                <w:sz w:val="16"/>
+              </w:rPr>
+              <w:t>12</w:t>
+            </w:r>
+          </w:p>
+        </w:tc>
+        <w:tc>
+          <w:tcPr>
+            <w:tcW w:type="dxa" w:w="1560"/>
+            <w:vAlign w:val="center"/>
+            <w:tcMar>
+              <w:top w:w="80" w:type="dxa"/>
+              <w:start w:w="120" w:type="dxa"/>
+              <w:bottom w:w="80" w:type="dxa"/>
+              <w:end w:w="120" w:type="dxa"/>
+            </w:tcMar>
+            <w:shd w:fill="F8FAFC"/>
+          </w:tcPr>
+          <w:p>
+            <w:pPr>
+              <w:spacing w:after="0"/>
+              <w:jc w:val="left"/>
+            </w:pPr>
+            <w:r>
+              <w:rPr>
+                <w:rFonts w:ascii="Arial" w:hAnsi="Arial" w:eastAsia="Arial"/>
+                <w:b w:val="0"/>
+                <w:color w:val="111827"/>
+                <w:sz w:val="16"/>
+              </w:rPr>
+              <w:t>ICP интервью</w:t>
+            </w:r>
+          </w:p>
+        </w:tc>
+        <w:tc>
+          <w:tcPr>
+            <w:tcW w:type="dxa" w:w="1560"/>
+            <w:vAlign w:val="center"/>
+            <w:tcMar>
+              <w:top w:w="80" w:type="dxa"/>
+              <w:start w:w="120" w:type="dxa"/>
+              <w:bottom w:w="80" w:type="dxa"/>
+              <w:end w:w="120" w:type="dxa"/>
+            </w:tcMar>
+            <w:shd w:fill="F8FAFC"/>
+          </w:tcPr>
+          <w:p>
+            <w:pPr>
+              <w:spacing w:after="0"/>
+              <w:jc w:val="left"/>
+            </w:pPr>
+            <w:r>
+              <w:rPr>
+                <w:rFonts w:ascii="Arial" w:hAnsi="Arial" w:eastAsia="Arial"/>
+                <w:b w:val="0"/>
+                <w:color w:val="111827"/>
+                <w:sz w:val="16"/>
+              </w:rPr>
+              <w:t>Spiritual self-improvers / problem_interview</w:t>
+            </w:r>
+          </w:p>
+        </w:tc>
+        <w:tc>
+          <w:tcPr>
+            <w:tcW w:type="dxa" w:w="1560"/>
+            <w:vAlign w:val="center"/>
+            <w:tcMar>
+              <w:top w:w="80" w:type="dxa"/>
+              <w:start w:w="120" w:type="dxa"/>
+              <w:bottom w:w="80" w:type="dxa"/>
+              <w:end w:w="120" w:type="dxa"/>
+            </w:tcMar>
+            <w:shd w:fill="F8FAFC"/>
+          </w:tcPr>
+          <w:p>
+            <w:pPr>
+              <w:spacing w:after="0"/>
+              <w:jc w:val="left"/>
+            </w:pPr>
+            <w:r>
+              <w:rPr>
+                <w:rFonts w:ascii="Arial" w:hAnsi="Arial" w:eastAsia="Arial"/>
+                <w:b w:val="0"/>
+                <w:color w:val="111827"/>
+                <w:sz w:val="16"/>
+              </w:rPr>
+              <w:t>H5/H6</w:t>
+            </w:r>
+          </w:p>
+        </w:tc>
+        <w:tc>
+          <w:tcPr>
+            <w:tcW w:type="dxa" w:w="1560"/>
+            <w:vAlign w:val="center"/>
+            <w:tcMar>
+              <w:top w:w="80" w:type="dxa"/>
+              <w:start w:w="120" w:type="dxa"/>
+              <w:bottom w:w="80" w:type="dxa"/>
+              <w:end w:w="120" w:type="dxa"/>
+            </w:tcMar>
+            <w:shd w:fill="F8FAFC"/>
+          </w:tcPr>
+          <w:p>
+            <w:pPr>
+              <w:spacing w:after="0"/>
+              <w:jc w:val="left"/>
+            </w:pPr>
+            <w:r>
+              <w:rPr>
+                <w:rFonts w:ascii="Arial" w:hAnsi="Arial" w:eastAsia="Arial"/>
+                <w:b w:val="0"/>
+                <w:color w:val="111827"/>
+                <w:sz w:val="16"/>
+              </w:rPr>
+              <w:t>разобрать последний реальный эпизод, current workaround, эмоциональную ставку и точный язык боли</w:t>
+            </w:r>
+          </w:p>
+        </w:tc>
+        <w:tc>
+          <w:tcPr>
+            <w:tcW w:type="dxa" w:w="1560"/>
+            <w:vAlign w:val="center"/>
+            <w:tcMar>
+              <w:top w:w="80" w:type="dxa"/>
+              <w:start w:w="120" w:type="dxa"/>
+              <w:bottom w:w="80" w:type="dxa"/>
+              <w:end w:w="120" w:type="dxa"/>
+            </w:tcMar>
+            <w:shd w:fill="F8FAFC"/>
+          </w:tcPr>
+          <w:p>
+            <w:pPr>
+              <w:spacing w:after="0"/>
+              <w:jc w:val="left"/>
+            </w:pPr>
+            <w:r>
+              <w:rPr>
+                <w:rFonts w:ascii="Arial" w:hAnsi="Arial" w:eastAsia="Arial"/>
+                <w:b w:val="0"/>
+                <w:color w:val="111827"/>
+                <w:sz w:val="16"/>
+              </w:rPr>
+              <w:t>data_processed/icp_validation_test_plan.csv</w:t>
+            </w:r>
+          </w:p>
+        </w:tc>
+      </w:tr>
+      <w:tr>
+        <w:tc>
+          <w:tcPr>
+            <w:tcW w:type="dxa" w:w="1560"/>
+            <w:vAlign w:val="center"/>
+            <w:tcMar>
+              <w:top w:w="80" w:type="dxa"/>
+              <w:start w:w="120" w:type="dxa"/>
+              <w:bottom w:w="80" w:type="dxa"/>
+              <w:end w:w="120" w:type="dxa"/>
+            </w:tcMar>
+          </w:tcPr>
+          <w:p>
+            <w:pPr>
+              <w:spacing w:after="0"/>
+              <w:jc w:val="left"/>
+            </w:pPr>
+            <w:r>
+              <w:rPr>
+                <w:rFonts w:ascii="Arial" w:hAnsi="Arial" w:eastAsia="Arial"/>
+                <w:b w:val="0"/>
+                <w:color w:val="111827"/>
+                <w:sz w:val="16"/>
+              </w:rPr>
+              <w:t>13</w:t>
+            </w:r>
+          </w:p>
+        </w:tc>
+        <w:tc>
+          <w:tcPr>
+            <w:tcW w:type="dxa" w:w="1560"/>
+            <w:vAlign w:val="center"/>
+            <w:tcMar>
+              <w:top w:w="80" w:type="dxa"/>
+              <w:start w:w="120" w:type="dxa"/>
+              <w:bottom w:w="80" w:type="dxa"/>
+              <w:end w:w="120" w:type="dxa"/>
+            </w:tcMar>
+          </w:tcPr>
+          <w:p>
+            <w:pPr>
+              <w:spacing w:after="0"/>
+              <w:jc w:val="left"/>
+            </w:pPr>
+            <w:r>
+              <w:rPr>
+                <w:rFonts w:ascii="Arial" w:hAnsi="Arial" w:eastAsia="Arial"/>
+                <w:b w:val="0"/>
+                <w:color w:val="111827"/>
+                <w:sz w:val="16"/>
+              </w:rPr>
+              <w:t>ICP интервью</w:t>
+            </w:r>
+          </w:p>
+        </w:tc>
+        <w:tc>
+          <w:tcPr>
+            <w:tcW w:type="dxa" w:w="1560"/>
+            <w:vAlign w:val="center"/>
+            <w:tcMar>
+              <w:top w:w="80" w:type="dxa"/>
+              <w:start w:w="120" w:type="dxa"/>
+              <w:bottom w:w="80" w:type="dxa"/>
+              <w:end w:w="120" w:type="dxa"/>
+            </w:tcMar>
+          </w:tcPr>
+          <w:p>
+            <w:pPr>
+              <w:spacing w:after="0"/>
+              <w:jc w:val="left"/>
+            </w:pPr>
+            <w:r>
+              <w:rPr>
+                <w:rFonts w:ascii="Arial" w:hAnsi="Arial" w:eastAsia="Arial"/>
+                <w:b w:val="0"/>
+                <w:color w:val="111827"/>
+                <w:sz w:val="16"/>
+              </w:rPr>
+              <w:t>Spiritual self-improvers / prototype_loop</w:t>
+            </w:r>
+          </w:p>
+        </w:tc>
+        <w:tc>
+          <w:tcPr>
+            <w:tcW w:type="dxa" w:w="1560"/>
+            <w:vAlign w:val="center"/>
+            <w:tcMar>
+              <w:top w:w="80" w:type="dxa"/>
+              <w:start w:w="120" w:type="dxa"/>
+              <w:bottom w:w="80" w:type="dxa"/>
+              <w:end w:w="120" w:type="dxa"/>
+            </w:tcMar>
+          </w:tcPr>
+          <w:p>
+            <w:pPr>
+              <w:spacing w:after="0"/>
+              <w:jc w:val="left"/>
+            </w:pPr>
+            <w:r>
+              <w:rPr>
+                <w:rFonts w:ascii="Arial" w:hAnsi="Arial" w:eastAsia="Arial"/>
+                <w:b w:val="0"/>
+                <w:color w:val="111827"/>
+                <w:sz w:val="16"/>
+              </w:rPr>
+              <w:t>H5/H6</w:t>
+            </w:r>
+          </w:p>
+        </w:tc>
+        <w:tc>
+          <w:tcPr>
+            <w:tcW w:type="dxa" w:w="1560"/>
+            <w:vAlign w:val="center"/>
+            <w:tcMar>
+              <w:top w:w="80" w:type="dxa"/>
+              <w:start w:w="120" w:type="dxa"/>
+              <w:bottom w:w="80" w:type="dxa"/>
+              <w:end w:w="120" w:type="dxa"/>
+            </w:tcMar>
+          </w:tcPr>
+          <w:p>
+            <w:pPr>
+              <w:spacing w:after="0"/>
+              <w:jc w:val="left"/>
+            </w:pPr>
+            <w:r>
+              <w:rPr>
+                <w:rFonts w:ascii="Arial" w:hAnsi="Arial" w:eastAsia="Arial"/>
+                <w:b w:val="0"/>
+                <w:color w:val="111827"/>
+                <w:sz w:val="16"/>
+              </w:rPr>
+              <w:t>показать простую петлю meaning -&gt; action -&gt; reset -&gt; avatar/progress -&gt; tomorrow hook и попросить участника narrate flow</w:t>
+            </w:r>
+          </w:p>
+        </w:tc>
+        <w:tc>
+          <w:tcPr>
+            <w:tcW w:type="dxa" w:w="1560"/>
+            <w:vAlign w:val="center"/>
+            <w:tcMar>
+              <w:top w:w="80" w:type="dxa"/>
+              <w:start w:w="120" w:type="dxa"/>
+              <w:bottom w:w="80" w:type="dxa"/>
+              <w:end w:w="120" w:type="dxa"/>
+            </w:tcMar>
+          </w:tcPr>
+          <w:p>
+            <w:pPr>
+              <w:spacing w:after="0"/>
+              <w:jc w:val="left"/>
+            </w:pPr>
+            <w:r>
+              <w:rPr>
+                <w:rFonts w:ascii="Arial" w:hAnsi="Arial" w:eastAsia="Arial"/>
+                <w:b w:val="0"/>
+                <w:color w:val="111827"/>
+                <w:sz w:val="16"/>
+              </w:rPr>
+              <w:t>data_processed/icp_validation_test_plan.csv</w:t>
+            </w:r>
+          </w:p>
+        </w:tc>
+      </w:tr>
+      <w:tr>
+        <w:tc>
+          <w:tcPr>
+            <w:tcW w:type="dxa" w:w="1560"/>
+            <w:vAlign w:val="center"/>
+            <w:tcMar>
+              <w:top w:w="80" w:type="dxa"/>
+              <w:start w:w="120" w:type="dxa"/>
+              <w:bottom w:w="80" w:type="dxa"/>
+              <w:end w:w="120" w:type="dxa"/>
+            </w:tcMar>
+            <w:shd w:fill="F8FAFC"/>
+          </w:tcPr>
+          <w:p>
+            <w:pPr>
+              <w:spacing w:after="0"/>
+              <w:jc w:val="left"/>
+            </w:pPr>
+            <w:r>
+              <w:rPr>
+                <w:rFonts w:ascii="Arial" w:hAnsi="Arial" w:eastAsia="Arial"/>
+                <w:b w:val="0"/>
+                <w:color w:val="111827"/>
+                <w:sz w:val="16"/>
+              </w:rPr>
+              <w:t>14</w:t>
+            </w:r>
+          </w:p>
+        </w:tc>
+        <w:tc>
+          <w:tcPr>
+            <w:tcW w:type="dxa" w:w="1560"/>
+            <w:vAlign w:val="center"/>
+            <w:tcMar>
+              <w:top w:w="80" w:type="dxa"/>
+              <w:start w:w="120" w:type="dxa"/>
+              <w:bottom w:w="80" w:type="dxa"/>
+              <w:end w:w="120" w:type="dxa"/>
+            </w:tcMar>
+            <w:shd w:fill="F8FAFC"/>
+          </w:tcPr>
+          <w:p>
+            <w:pPr>
+              <w:spacing w:after="0"/>
+              <w:jc w:val="left"/>
+            </w:pPr>
+            <w:r>
+              <w:rPr>
+                <w:rFonts w:ascii="Arial" w:hAnsi="Arial" w:eastAsia="Arial"/>
+                <w:b w:val="0"/>
+                <w:color w:val="111827"/>
+                <w:sz w:val="16"/>
+              </w:rPr>
+              <w:t>ICP интервью</w:t>
+            </w:r>
+          </w:p>
+        </w:tc>
+        <w:tc>
+          <w:tcPr>
+            <w:tcW w:type="dxa" w:w="1560"/>
+            <w:vAlign w:val="center"/>
+            <w:tcMar>
+              <w:top w:w="80" w:type="dxa"/>
+              <w:start w:w="120" w:type="dxa"/>
+              <w:bottom w:w="80" w:type="dxa"/>
+              <w:end w:w="120" w:type="dxa"/>
+            </w:tcMar>
+            <w:shd w:fill="F8FAFC"/>
+          </w:tcPr>
+          <w:p>
+            <w:pPr>
+              <w:spacing w:after="0"/>
+              <w:jc w:val="left"/>
+            </w:pPr>
+            <w:r>
+              <w:rPr>
+                <w:rFonts w:ascii="Arial" w:hAnsi="Arial" w:eastAsia="Arial"/>
+                <w:b w:val="0"/>
+                <w:color w:val="111827"/>
+                <w:sz w:val="16"/>
+              </w:rPr>
+              <w:t>Spiritual self-improvers / positioning_test</w:t>
+            </w:r>
+          </w:p>
+        </w:tc>
+        <w:tc>
+          <w:tcPr>
+            <w:tcW w:type="dxa" w:w="1560"/>
+            <w:vAlign w:val="center"/>
+            <w:tcMar>
+              <w:top w:w="80" w:type="dxa"/>
+              <w:start w:w="120" w:type="dxa"/>
+              <w:bottom w:w="80" w:type="dxa"/>
+              <w:end w:w="120" w:type="dxa"/>
+            </w:tcMar>
+            <w:shd w:fill="F8FAFC"/>
+          </w:tcPr>
+          <w:p>
+            <w:pPr>
+              <w:spacing w:after="0"/>
+              <w:jc w:val="left"/>
+            </w:pPr>
+            <w:r>
+              <w:rPr>
+                <w:rFonts w:ascii="Arial" w:hAnsi="Arial" w:eastAsia="Arial"/>
+                <w:b w:val="0"/>
+                <w:color w:val="111827"/>
+                <w:sz w:val="16"/>
+              </w:rPr>
+              <w:t>H5/H6</w:t>
+            </w:r>
+          </w:p>
+        </w:tc>
+        <w:tc>
+          <w:tcPr>
+            <w:tcW w:type="dxa" w:w="1560"/>
+            <w:vAlign w:val="center"/>
+            <w:tcMar>
+              <w:top w:w="80" w:type="dxa"/>
+              <w:start w:w="120" w:type="dxa"/>
+              <w:bottom w:w="80" w:type="dxa"/>
+              <w:end w:w="120" w:type="dxa"/>
+            </w:tcMar>
+            <w:shd w:fill="F8FAFC"/>
+          </w:tcPr>
+          <w:p>
+            <w:pPr>
+              <w:spacing w:after="0"/>
+              <w:jc w:val="left"/>
+            </w:pPr>
+            <w:r>
+              <w:rPr>
+                <w:rFonts w:ascii="Arial" w:hAnsi="Arial" w:eastAsia="Arial"/>
+                <w:b w:val="0"/>
+                <w:color w:val="111827"/>
+                <w:sz w:val="16"/>
+              </w:rPr>
+              <w:t>сравнить current tool, generic habit/coach и Alina angle; записать, что участник выбрал бы первым и почему</w:t>
+            </w:r>
+          </w:p>
+        </w:tc>
+        <w:tc>
+          <w:tcPr>
+            <w:tcW w:type="dxa" w:w="1560"/>
+            <w:vAlign w:val="center"/>
+            <w:tcMar>
+              <w:top w:w="80" w:type="dxa"/>
+              <w:start w:w="120" w:type="dxa"/>
+              <w:bottom w:w="80" w:type="dxa"/>
+              <w:end w:w="120" w:type="dxa"/>
+            </w:tcMar>
+            <w:shd w:fill="F8FAFC"/>
+          </w:tcPr>
+          <w:p>
+            <w:pPr>
+              <w:spacing w:after="0"/>
+              <w:jc w:val="left"/>
+            </w:pPr>
+            <w:r>
+              <w:rPr>
+                <w:rFonts w:ascii="Arial" w:hAnsi="Arial" w:eastAsia="Arial"/>
+                <w:b w:val="0"/>
+                <w:color w:val="111827"/>
+                <w:sz w:val="16"/>
+              </w:rPr>
+              <w:t>data_processed/icp_validation_test_plan.csv</w:t>
+            </w:r>
+          </w:p>
+        </w:tc>
+      </w:tr>
+    </w:tbl>
+    <w:p/>
+    <w:p>
+      <w:r>
+        <w:t>Эта очередь не заменяет полный validation command center. Она нужна как первый рабочий слой для следующих 12-24 часов: если заполнить хотя бы первые manual walkthrough и paid-flow задачи, отчет начнет переходить от desk evidence к наблюдаемым доказательствам.</w:t>
+      </w:r>
+    </w:p>
+    <w:p>
+      <w:pPr>
+        <w:pStyle w:val="Heading1"/>
+      </w:pPr>
+      <w:r>
         <w:t>ИСТОЧНИКИ И ГРАНИЦЫ ДОКАЗАТЕЛЬСТВ</w:t>
       </w:r>
     </w:p>
@@ -11340,7 +13892,7 @@
                 <w:color w:val="111827"/>
                 <w:sz w:val="16"/>
               </w:rPr>
-              <w:t>456 manifest artifacts; missing=0</w:t>
+              <w:t>459 manifest artifacts; missing=0</w:t>
             </w:r>
           </w:p>
         </w:tc>
@@ -11478,6 +14030,15 @@
       </w:pPr>
       <w:r>
         <w:t>data_processed/global_hypothesis_gate_snapshot.csv</w:t>
+      </w:r>
+    </w:p>
+    <w:p>
+      <w:pPr>
+        <w:pStyle w:val="ListBullet"/>
+        <w:spacing w:after="80"/>
+      </w:pPr>
+      <w:r>
+        <w:t>data_processed/global_next_validation_backlog.csv</w:t>
       </w:r>
     </w:p>
     <w:p>

</xml_diff>

<commit_message>
Add global market sizing methodology
</commit_message>
<xml_diff>
--- a/output/docx/alina-global-hypothesis-report-v1.docx
+++ b/output/docx/alina-global-hypothesis-report-v1.docx
@@ -31,7 +31,7 @@
     </w:p>
     <w:p>
       <w:r>
-        <w:t>Собрано: 2026-05-31T15:13:25.939Z</w:t>
+        <w:t>Собрано: 2026-05-31T15:19:47.884Z</w:t>
       </w:r>
     </w:p>
     <w:p>
@@ -59,7 +59,7 @@
     </w:p>
     <w:p>
       <w:r>
-        <w:t>На текущем этапе собрано 67,525 сырьевых source-строк, 36,694 уникализированных строк и 459 локальных артефактов. Эти данные нужны не для того, чтобы объявить продукт доказанным, а для последовательной проверки: существует ли рынок, есть ли деньги, насколько плотна конкуренция, где может быть белое пятно, кто аудитория и какую MVP-петлю надо тестировать.</w:t>
+        <w:t>На текущем этапе собрано 67,525 сырьевых source-строк, 36,694 уникализированных строк и 462 локальных артефактов. Эти данные нужны не для того, чтобы объявить продукт доказанным, а для последовательной проверки: существует ли рынок, есть ли деньги, насколько плотна конкуренция, где может быть белое пятно, кто аудитория и какую MVP-петлю надо тестировать.</w:t>
       </w:r>
     </w:p>
     <w:p>
@@ -3219,6 +3219,2619 @@
         <w:t>Intersection SAM в текущей модели равен $202M. Это рабочая мировая рамка для дальнейшей проверки, а не обещание revenue. Локальный paid-flow signoff сейчас заполнен на 8 строках; H2 gate имеет статус in_progress_insufficient_evidence, потому что нужны еще in-app paywall walkthrough и willingness-to-pay evidence.</w:t>
       </w:r>
     </w:p>
+    <w:p>
+      <w:pPr>
+        <w:pStyle w:val="Heading1"/>
+      </w:pPr>
+      <w:r>
+        <w:t>МЕТОДОЛОГИЯ TAM/SAM/SOM</w:t>
+      </w:r>
+    </w:p>
+    <w:p>
+      <w:r>
+        <w:t>Рыночная модель Alina намеренно построена как диапазон, а не как одна “красивая” цифра. Она разделяет широкий TAM, serviceable SAM, confidence-weighted SAM и bottom-up stress-сценарии. Такой подход нужен, потому что Alina находится на пересечении нескольких adjacent-рынков, а не внутри одной готовой категории market report.</w:t>
+      </w:r>
+    </w:p>
+    <w:p>
+      <w:r>
+        <w:t>Базовая формула top-down: TAM base умножается на serviceable share и дает SAM base. Затем SAM дополнительно умножается на confidence/directness weight, чтобы не смешивать прямые adjacent-рынки, широкие adjacent-рынки и benchmark-механику. Отдельно используется bottom-up stress: reachable users * activation rate * paid conversion * ARPPU. Этот слой нужен не для прогноза выручки, а для проверки, какой масштаб начинает иметь смысл при разных уровнях distribution, retention и willingness-to-pay.</w:t>
+      </w:r>
+    </w:p>
+    <w:tbl>
+      <w:tblPr>
+        <w:tblW w:type="dxa" w:w="9360"/>
+        <w:jc w:val="left"/>
+        <w:tblLayout w:type="fixed"/>
+        <w:tblLook w:firstColumn="1" w:firstRow="1" w:lastColumn="0" w:lastRow="0" w:noHBand="0" w:noVBand="1" w:val="04A0"/>
+        <w:tblInd w:w="120" w:type="dxa"/>
+        <w:tblBorders>
+          <w:top w:val="single" w:sz="4" w:space="0" w:color="CBD5E1"/>
+          <w:left w:val="single" w:sz="4" w:space="0" w:color="CBD5E1"/>
+          <w:bottom w:val="single" w:sz="4" w:space="0" w:color="CBD5E1"/>
+          <w:right w:val="single" w:sz="4" w:space="0" w:color="CBD5E1"/>
+          <w:insideH w:val="single" w:sz="4" w:space="0" w:color="CBD5E1"/>
+          <w:insideV w:val="single" w:sz="4" w:space="0" w:color="CBD5E1"/>
+        </w:tblBorders>
+      </w:tblPr>
+      <w:tblGrid>
+        <w:gridCol w:w="1560"/>
+        <w:gridCol w:w="1560"/>
+        <w:gridCol w:w="1560"/>
+        <w:gridCol w:w="1560"/>
+        <w:gridCol w:w="1560"/>
+        <w:gridCol w:w="1560"/>
+      </w:tblGrid>
+      <w:tr>
+        <w:tc>
+          <w:tcPr>
+            <w:tcW w:type="dxa" w:w="1560"/>
+            <w:vAlign w:val="center"/>
+            <w:tcMar>
+              <w:top w:w="80" w:type="dxa"/>
+              <w:start w:w="120" w:type="dxa"/>
+              <w:bottom w:w="80" w:type="dxa"/>
+              <w:end w:w="120" w:type="dxa"/>
+            </w:tcMar>
+            <w:shd w:fill="E8EEF5"/>
+          </w:tcPr>
+          <w:p>
+            <w:pPr>
+              <w:spacing w:after="0"/>
+              <w:jc w:val="left"/>
+            </w:pPr>
+            <w:r>
+              <w:rPr>
+                <w:rFonts w:ascii="Arial" w:hAnsi="Arial" w:eastAsia="Arial"/>
+                <w:b/>
+                <w:color w:val="111827"/>
+                <w:sz w:val="16"/>
+              </w:rPr>
+              <w:t>Pillar</w:t>
+            </w:r>
+          </w:p>
+        </w:tc>
+        <w:tc>
+          <w:tcPr>
+            <w:tcW w:type="dxa" w:w="1560"/>
+            <w:vAlign w:val="center"/>
+            <w:tcMar>
+              <w:top w:w="80" w:type="dxa"/>
+              <w:start w:w="120" w:type="dxa"/>
+              <w:bottom w:w="80" w:type="dxa"/>
+              <w:end w:w="120" w:type="dxa"/>
+            </w:tcMar>
+            <w:shd w:fill="E8EEF5"/>
+          </w:tcPr>
+          <w:p>
+            <w:pPr>
+              <w:spacing w:after="0"/>
+              <w:jc w:val="left"/>
+            </w:pPr>
+            <w:r>
+              <w:rPr>
+                <w:rFonts w:ascii="Arial" w:hAnsi="Arial" w:eastAsia="Arial"/>
+                <w:b/>
+                <w:color w:val="111827"/>
+                <w:sz w:val="16"/>
+              </w:rPr>
+              <w:t>Какой тип рынка</w:t>
+            </w:r>
+          </w:p>
+        </w:tc>
+        <w:tc>
+          <w:tcPr>
+            <w:tcW w:type="dxa" w:w="1560"/>
+            <w:vAlign w:val="center"/>
+            <w:tcMar>
+              <w:top w:w="80" w:type="dxa"/>
+              <w:start w:w="120" w:type="dxa"/>
+              <w:bottom w:w="80" w:type="dxa"/>
+              <w:end w:w="120" w:type="dxa"/>
+            </w:tcMar>
+            <w:shd w:fill="E8EEF5"/>
+          </w:tcPr>
+          <w:p>
+            <w:pPr>
+              <w:spacing w:after="0"/>
+              <w:jc w:val="left"/>
+            </w:pPr>
+            <w:r>
+              <w:rPr>
+                <w:rFonts w:ascii="Arial" w:hAnsi="Arial" w:eastAsia="Arial"/>
+                <w:b/>
+                <w:color w:val="111827"/>
+                <w:sz w:val="16"/>
+              </w:rPr>
+              <w:t>SAM base</w:t>
+            </w:r>
+          </w:p>
+        </w:tc>
+        <w:tc>
+          <w:tcPr>
+            <w:tcW w:type="dxa" w:w="1560"/>
+            <w:vAlign w:val="center"/>
+            <w:tcMar>
+              <w:top w:w="80" w:type="dxa"/>
+              <w:start w:w="120" w:type="dxa"/>
+              <w:bottom w:w="80" w:type="dxa"/>
+              <w:end w:w="120" w:type="dxa"/>
+            </w:tcMar>
+            <w:shd w:fill="E8EEF5"/>
+          </w:tcPr>
+          <w:p>
+            <w:pPr>
+              <w:spacing w:after="0"/>
+              <w:jc w:val="left"/>
+            </w:pPr>
+            <w:r>
+              <w:rPr>
+                <w:rFonts w:ascii="Arial" w:hAnsi="Arial" w:eastAsia="Arial"/>
+                <w:b/>
+                <w:color w:val="111827"/>
+                <w:sz w:val="16"/>
+              </w:rPr>
+              <w:t>Weighted SAM</w:t>
+            </w:r>
+          </w:p>
+        </w:tc>
+        <w:tc>
+          <w:tcPr>
+            <w:tcW w:type="dxa" w:w="1560"/>
+            <w:vAlign w:val="center"/>
+            <w:tcMar>
+              <w:top w:w="80" w:type="dxa"/>
+              <w:start w:w="120" w:type="dxa"/>
+              <w:bottom w:w="80" w:type="dxa"/>
+              <w:end w:w="120" w:type="dxa"/>
+            </w:tcMar>
+            <w:shd w:fill="E8EEF5"/>
+          </w:tcPr>
+          <w:p>
+            <w:pPr>
+              <w:spacing w:after="0"/>
+              <w:jc w:val="left"/>
+            </w:pPr>
+            <w:r>
+              <w:rPr>
+                <w:rFonts w:ascii="Arial" w:hAnsi="Arial" w:eastAsia="Arial"/>
+                <w:b/>
+                <w:color w:val="111827"/>
+                <w:sz w:val="16"/>
+              </w:rPr>
+              <w:t>Риск модели</w:t>
+            </w:r>
+          </w:p>
+        </w:tc>
+        <w:tc>
+          <w:tcPr>
+            <w:tcW w:type="dxa" w:w="1560"/>
+            <w:vAlign w:val="center"/>
+            <w:tcMar>
+              <w:top w:w="80" w:type="dxa"/>
+              <w:start w:w="120" w:type="dxa"/>
+              <w:bottom w:w="80" w:type="dxa"/>
+              <w:end w:w="120" w:type="dxa"/>
+            </w:tcMar>
+            <w:shd w:fill="E8EEF5"/>
+          </w:tcPr>
+          <w:p>
+            <w:pPr>
+              <w:spacing w:after="0"/>
+              <w:jc w:val="left"/>
+            </w:pPr>
+            <w:r>
+              <w:rPr>
+                <w:rFonts w:ascii="Arial" w:hAnsi="Arial" w:eastAsia="Arial"/>
+                <w:b/>
+                <w:color w:val="111827"/>
+                <w:sz w:val="16"/>
+              </w:rPr>
+              <w:t>Как читать</w:t>
+            </w:r>
+          </w:p>
+        </w:tc>
+      </w:tr>
+      <w:tr>
+        <w:tc>
+          <w:tcPr>
+            <w:tcW w:type="dxa" w:w="1560"/>
+            <w:vAlign w:val="center"/>
+            <w:tcMar>
+              <w:top w:w="80" w:type="dxa"/>
+              <w:start w:w="120" w:type="dxa"/>
+              <w:bottom w:w="80" w:type="dxa"/>
+              <w:end w:w="120" w:type="dxa"/>
+            </w:tcMar>
+          </w:tcPr>
+          <w:p>
+            <w:pPr>
+              <w:spacing w:after="0"/>
+              <w:jc w:val="left"/>
+            </w:pPr>
+            <w:r>
+              <w:rPr>
+                <w:rFonts w:ascii="Arial" w:hAnsi="Arial" w:eastAsia="Arial"/>
+                <w:b w:val="0"/>
+                <w:color w:val="111827"/>
+                <w:sz w:val="16"/>
+              </w:rPr>
+              <w:t>gaming</w:t>
+            </w:r>
+          </w:p>
+        </w:tc>
+        <w:tc>
+          <w:tcPr>
+            <w:tcW w:type="dxa" w:w="1560"/>
+            <w:vAlign w:val="center"/>
+            <w:tcMar>
+              <w:top w:w="80" w:type="dxa"/>
+              <w:start w:w="120" w:type="dxa"/>
+              <w:bottom w:w="80" w:type="dxa"/>
+              <w:end w:w="120" w:type="dxa"/>
+            </w:tcMar>
+          </w:tcPr>
+          <w:p>
+            <w:pPr>
+              <w:spacing w:after="0"/>
+              <w:jc w:val="left"/>
+            </w:pPr>
+            <w:r>
+              <w:rPr>
+                <w:rFonts w:ascii="Arial" w:hAnsi="Arial" w:eastAsia="Arial"/>
+                <w:b w:val="0"/>
+                <w:color w:val="111827"/>
+                <w:sz w:val="16"/>
+              </w:rPr>
+              <w:t>benchmark механик, не прямой TAM</w:t>
+            </w:r>
+          </w:p>
+        </w:tc>
+        <w:tc>
+          <w:tcPr>
+            <w:tcW w:type="dxa" w:w="1560"/>
+            <w:vAlign w:val="center"/>
+            <w:tcMar>
+              <w:top w:w="80" w:type="dxa"/>
+              <w:start w:w="120" w:type="dxa"/>
+              <w:bottom w:w="80" w:type="dxa"/>
+              <w:end w:w="120" w:type="dxa"/>
+            </w:tcMar>
+          </w:tcPr>
+          <w:p>
+            <w:pPr>
+              <w:spacing w:after="0"/>
+              <w:jc w:val="left"/>
+            </w:pPr>
+            <w:r>
+              <w:rPr>
+                <w:rFonts w:ascii="Arial" w:hAnsi="Arial" w:eastAsia="Arial"/>
+                <w:b w:val="0"/>
+                <w:color w:val="111827"/>
+                <w:sz w:val="16"/>
+              </w:rPr>
+              <w:t>$671M</w:t>
+            </w:r>
+          </w:p>
+        </w:tc>
+        <w:tc>
+          <w:tcPr>
+            <w:tcW w:type="dxa" w:w="1560"/>
+            <w:vAlign w:val="center"/>
+            <w:tcMar>
+              <w:top w:w="80" w:type="dxa"/>
+              <w:start w:w="120" w:type="dxa"/>
+              <w:bottom w:w="80" w:type="dxa"/>
+              <w:end w:w="120" w:type="dxa"/>
+            </w:tcMar>
+          </w:tcPr>
+          <w:p>
+            <w:pPr>
+              <w:spacing w:after="0"/>
+              <w:jc w:val="left"/>
+            </w:pPr>
+            <w:r>
+              <w:rPr>
+                <w:rFonts w:ascii="Arial" w:hAnsi="Arial" w:eastAsia="Arial"/>
+                <w:b w:val="0"/>
+                <w:color w:val="111827"/>
+                <w:sz w:val="16"/>
+              </w:rPr>
+              <w:t>$470M</w:t>
+            </w:r>
+          </w:p>
+        </w:tc>
+        <w:tc>
+          <w:tcPr>
+            <w:tcW w:type="dxa" w:w="1560"/>
+            <w:vAlign w:val="center"/>
+            <w:tcMar>
+              <w:top w:w="80" w:type="dxa"/>
+              <w:start w:w="120" w:type="dxa"/>
+              <w:bottom w:w="80" w:type="dxa"/>
+              <w:end w:w="120" w:type="dxa"/>
+            </w:tcMar>
+          </w:tcPr>
+          <w:p>
+            <w:pPr>
+              <w:spacing w:after="0"/>
+              <w:jc w:val="left"/>
+            </w:pPr>
+            <w:r>
+              <w:rPr>
+                <w:rFonts w:ascii="Arial" w:hAnsi="Arial" w:eastAsia="Arial"/>
+                <w:b w:val="0"/>
+                <w:color w:val="111827"/>
+                <w:sz w:val="16"/>
+              </w:rPr>
+              <w:t>не считать прямым рынком Alina</w:t>
+            </w:r>
+          </w:p>
+        </w:tc>
+        <w:tc>
+          <w:tcPr>
+            <w:tcW w:type="dxa" w:w="1560"/>
+            <w:vAlign w:val="center"/>
+            <w:tcMar>
+              <w:top w:w="80" w:type="dxa"/>
+              <w:start w:w="120" w:type="dxa"/>
+              <w:bottom w:w="80" w:type="dxa"/>
+              <w:end w:w="120" w:type="dxa"/>
+            </w:tcMar>
+          </w:tcPr>
+          <w:p>
+            <w:pPr>
+              <w:spacing w:after="0"/>
+              <w:jc w:val="left"/>
+            </w:pPr>
+            <w:r>
+              <w:rPr>
+                <w:rFonts w:ascii="Arial" w:hAnsi="Arial" w:eastAsia="Arial"/>
+                <w:b w:val="0"/>
+                <w:color w:val="111827"/>
+                <w:sz w:val="16"/>
+              </w:rPr>
+              <w:t>использовать только как benchmark retention/progression/monetization mechanics, не включать в прямой TAM Alina</w:t>
+            </w:r>
+          </w:p>
+        </w:tc>
+      </w:tr>
+      <w:tr>
+        <w:tc>
+          <w:tcPr>
+            <w:tcW w:type="dxa" w:w="1560"/>
+            <w:vAlign w:val="center"/>
+            <w:tcMar>
+              <w:top w:w="80" w:type="dxa"/>
+              <w:start w:w="120" w:type="dxa"/>
+              <w:bottom w:w="80" w:type="dxa"/>
+              <w:end w:w="120" w:type="dxa"/>
+            </w:tcMar>
+            <w:shd w:fill="F8FAFC"/>
+          </w:tcPr>
+          <w:p>
+            <w:pPr>
+              <w:spacing w:after="0"/>
+              <w:jc w:val="left"/>
+            </w:pPr>
+            <w:r>
+              <w:rPr>
+                <w:rFonts w:ascii="Arial" w:hAnsi="Arial" w:eastAsia="Arial"/>
+                <w:b w:val="0"/>
+                <w:color w:val="111827"/>
+                <w:sz w:val="16"/>
+              </w:rPr>
+              <w:t>astrology_esoterics</w:t>
+            </w:r>
+          </w:p>
+        </w:tc>
+        <w:tc>
+          <w:tcPr>
+            <w:tcW w:type="dxa" w:w="1560"/>
+            <w:vAlign w:val="center"/>
+            <w:tcMar>
+              <w:top w:w="80" w:type="dxa"/>
+              <w:start w:w="120" w:type="dxa"/>
+              <w:bottom w:w="80" w:type="dxa"/>
+              <w:end w:w="120" w:type="dxa"/>
+            </w:tcMar>
+            <w:shd w:fill="F8FAFC"/>
+          </w:tcPr>
+          <w:p>
+            <w:pPr>
+              <w:spacing w:after="0"/>
+              <w:jc w:val="left"/>
+            </w:pPr>
+            <w:r>
+              <w:rPr>
+                <w:rFonts w:ascii="Arial" w:hAnsi="Arial" w:eastAsia="Arial"/>
+                <w:b w:val="0"/>
+                <w:color w:val="111827"/>
+                <w:sz w:val="16"/>
+              </w:rPr>
+              <w:t>прямой adjacent-рынок</w:t>
+            </w:r>
+          </w:p>
+        </w:tc>
+        <w:tc>
+          <w:tcPr>
+            <w:tcW w:type="dxa" w:w="1560"/>
+            <w:vAlign w:val="center"/>
+            <w:tcMar>
+              <w:top w:w="80" w:type="dxa"/>
+              <w:start w:w="120" w:type="dxa"/>
+              <w:bottom w:w="80" w:type="dxa"/>
+              <w:end w:w="120" w:type="dxa"/>
+            </w:tcMar>
+            <w:shd w:fill="F8FAFC"/>
+          </w:tcPr>
+          <w:p>
+            <w:pPr>
+              <w:spacing w:after="0"/>
+              <w:jc w:val="left"/>
+            </w:pPr>
+            <w:r>
+              <w:rPr>
+                <w:rFonts w:ascii="Arial" w:hAnsi="Arial" w:eastAsia="Arial"/>
+                <w:b w:val="0"/>
+                <w:color w:val="111827"/>
+                <w:sz w:val="16"/>
+              </w:rPr>
+              <w:t>$374M</w:t>
+            </w:r>
+          </w:p>
+        </w:tc>
+        <w:tc>
+          <w:tcPr>
+            <w:tcW w:type="dxa" w:w="1560"/>
+            <w:vAlign w:val="center"/>
+            <w:tcMar>
+              <w:top w:w="80" w:type="dxa"/>
+              <w:start w:w="120" w:type="dxa"/>
+              <w:bottom w:w="80" w:type="dxa"/>
+              <w:end w:w="120" w:type="dxa"/>
+            </w:tcMar>
+            <w:shd w:fill="F8FAFC"/>
+          </w:tcPr>
+          <w:p>
+            <w:pPr>
+              <w:spacing w:after="0"/>
+              <w:jc w:val="left"/>
+            </w:pPr>
+            <w:r>
+              <w:rPr>
+                <w:rFonts w:ascii="Arial" w:hAnsi="Arial" w:eastAsia="Arial"/>
+                <w:b w:val="0"/>
+                <w:color w:val="111827"/>
+                <w:sz w:val="16"/>
+              </w:rPr>
+              <w:t>$262M</w:t>
+            </w:r>
+          </w:p>
+        </w:tc>
+        <w:tc>
+          <w:tcPr>
+            <w:tcW w:type="dxa" w:w="1560"/>
+            <w:vAlign w:val="center"/>
+            <w:tcMar>
+              <w:top w:w="80" w:type="dxa"/>
+              <w:start w:w="120" w:type="dxa"/>
+              <w:bottom w:w="80" w:type="dxa"/>
+              <w:end w:w="120" w:type="dxa"/>
+            </w:tcMar>
+            <w:shd w:fill="F8FAFC"/>
+          </w:tcPr>
+          <w:p>
+            <w:pPr>
+              <w:spacing w:after="0"/>
+              <w:jc w:val="left"/>
+            </w:pPr>
+            <w:r>
+              <w:rPr>
+                <w:rFonts w:ascii="Arial" w:hAnsi="Arial" w:eastAsia="Arial"/>
+                <w:b w:val="0"/>
+                <w:color w:val="111827"/>
+                <w:sz w:val="16"/>
+              </w:rPr>
+              <w:t>поддержано proxy, но нужен ручной paid-flow/WTP</w:t>
+            </w:r>
+          </w:p>
+        </w:tc>
+        <w:tc>
+          <w:tcPr>
+            <w:tcW w:type="dxa" w:w="1560"/>
+            <w:vAlign w:val="center"/>
+            <w:tcMar>
+              <w:top w:w="80" w:type="dxa"/>
+              <w:start w:w="120" w:type="dxa"/>
+              <w:bottom w:w="80" w:type="dxa"/>
+              <w:end w:w="120" w:type="dxa"/>
+            </w:tcMar>
+            <w:shd w:fill="F8FAFC"/>
+          </w:tcPr>
+          <w:p>
+            <w:pPr>
+              <w:spacing w:after="0"/>
+              <w:jc w:val="left"/>
+            </w:pPr>
+            <w:r>
+              <w:rPr>
+                <w:rFonts w:ascii="Arial" w:hAnsi="Arial" w:eastAsia="Arial"/>
+                <w:b w:val="0"/>
+                <w:color w:val="111827"/>
+                <w:sz w:val="16"/>
+              </w:rPr>
+              <w:t>использовать как directional market-money anchor до ручного paywall, ICP и WTP evidence</w:t>
+            </w:r>
+          </w:p>
+        </w:tc>
+      </w:tr>
+      <w:tr>
+        <w:tc>
+          <w:tcPr>
+            <w:tcW w:type="dxa" w:w="1560"/>
+            <w:vAlign w:val="center"/>
+            <w:tcMar>
+              <w:top w:w="80" w:type="dxa"/>
+              <w:start w:w="120" w:type="dxa"/>
+              <w:bottom w:w="80" w:type="dxa"/>
+              <w:end w:w="120" w:type="dxa"/>
+            </w:tcMar>
+          </w:tcPr>
+          <w:p>
+            <w:pPr>
+              <w:spacing w:after="0"/>
+              <w:jc w:val="left"/>
+            </w:pPr>
+            <w:r>
+              <w:rPr>
+                <w:rFonts w:ascii="Arial" w:hAnsi="Arial" w:eastAsia="Arial"/>
+                <w:b w:val="0"/>
+                <w:color w:val="111827"/>
+                <w:sz w:val="16"/>
+              </w:rPr>
+              <w:t>avatar_identity</w:t>
+            </w:r>
+          </w:p>
+        </w:tc>
+        <w:tc>
+          <w:tcPr>
+            <w:tcW w:type="dxa" w:w="1560"/>
+            <w:vAlign w:val="center"/>
+            <w:tcMar>
+              <w:top w:w="80" w:type="dxa"/>
+              <w:start w:w="120" w:type="dxa"/>
+              <w:bottom w:w="80" w:type="dxa"/>
+              <w:end w:w="120" w:type="dxa"/>
+            </w:tcMar>
+          </w:tcPr>
+          <w:p>
+            <w:pPr>
+              <w:spacing w:after="0"/>
+              <w:jc w:val="left"/>
+            </w:pPr>
+            <w:r>
+              <w:rPr>
+                <w:rFonts w:ascii="Arial" w:hAnsi="Arial" w:eastAsia="Arial"/>
+                <w:b w:val="0"/>
+                <w:color w:val="111827"/>
+                <w:sz w:val="16"/>
+              </w:rPr>
+              <w:t>широкий adjacent-рынок с сильным consumer-discount</w:t>
+            </w:r>
+          </w:p>
+        </w:tc>
+        <w:tc>
+          <w:tcPr>
+            <w:tcW w:type="dxa" w:w="1560"/>
+            <w:vAlign w:val="center"/>
+            <w:tcMar>
+              <w:top w:w="80" w:type="dxa"/>
+              <w:start w:w="120" w:type="dxa"/>
+              <w:bottom w:w="80" w:type="dxa"/>
+              <w:end w:w="120" w:type="dxa"/>
+            </w:tcMar>
+          </w:tcPr>
+          <w:p>
+            <w:pPr>
+              <w:spacing w:after="0"/>
+              <w:jc w:val="left"/>
+            </w:pPr>
+            <w:r>
+              <w:rPr>
+                <w:rFonts w:ascii="Arial" w:hAnsi="Arial" w:eastAsia="Arial"/>
+                <w:b w:val="0"/>
+                <w:color w:val="111827"/>
+                <w:sz w:val="16"/>
+              </w:rPr>
+              <w:t>$420M</w:t>
+            </w:r>
+          </w:p>
+        </w:tc>
+        <w:tc>
+          <w:tcPr>
+            <w:tcW w:type="dxa" w:w="1560"/>
+            <w:vAlign w:val="center"/>
+            <w:tcMar>
+              <w:top w:w="80" w:type="dxa"/>
+              <w:start w:w="120" w:type="dxa"/>
+              <w:bottom w:w="80" w:type="dxa"/>
+              <w:end w:w="120" w:type="dxa"/>
+            </w:tcMar>
+          </w:tcPr>
+          <w:p>
+            <w:pPr>
+              <w:spacing w:after="0"/>
+              <w:jc w:val="left"/>
+            </w:pPr>
+            <w:r>
+              <w:rPr>
+                <w:rFonts w:ascii="Arial" w:hAnsi="Arial" w:eastAsia="Arial"/>
+                <w:b w:val="0"/>
+                <w:color w:val="111827"/>
+                <w:sz w:val="16"/>
+              </w:rPr>
+              <w:t>$294M</w:t>
+            </w:r>
+          </w:p>
+        </w:tc>
+        <w:tc>
+          <w:tcPr>
+            <w:tcW w:type="dxa" w:w="1560"/>
+            <w:vAlign w:val="center"/>
+            <w:tcMar>
+              <w:top w:w="80" w:type="dxa"/>
+              <w:start w:w="120" w:type="dxa"/>
+              <w:bottom w:w="80" w:type="dxa"/>
+              <w:end w:w="120" w:type="dxa"/>
+            </w:tcMar>
+          </w:tcPr>
+          <w:p>
+            <w:pPr>
+              <w:spacing w:after="0"/>
+              <w:jc w:val="left"/>
+            </w:pPr>
+            <w:r>
+              <w:rPr>
+                <w:rFonts w:ascii="Arial" w:hAnsi="Arial" w:eastAsia="Arial"/>
+                <w:b w:val="0"/>
+                <w:color w:val="111827"/>
+                <w:sz w:val="16"/>
+              </w:rPr>
+              <w:t>поддержано proxy, но нужен ручной paid-flow/WTP</w:t>
+            </w:r>
+          </w:p>
+        </w:tc>
+        <w:tc>
+          <w:tcPr>
+            <w:tcW w:type="dxa" w:w="1560"/>
+            <w:vAlign w:val="center"/>
+            <w:tcMar>
+              <w:top w:w="80" w:type="dxa"/>
+              <w:start w:w="120" w:type="dxa"/>
+              <w:bottom w:w="80" w:type="dxa"/>
+              <w:end w:w="120" w:type="dxa"/>
+            </w:tcMar>
+          </w:tcPr>
+          <w:p>
+            <w:pPr>
+              <w:spacing w:after="0"/>
+              <w:jc w:val="left"/>
+            </w:pPr>
+            <w:r>
+              <w:rPr>
+                <w:rFonts w:ascii="Arial" w:hAnsi="Arial" w:eastAsia="Arial"/>
+                <w:b w:val="0"/>
+                <w:color w:val="111827"/>
+                <w:sz w:val="16"/>
+              </w:rPr>
+              <w:t>использовать как money context с сильным consumer/self-improvement discount</w:t>
+            </w:r>
+          </w:p>
+        </w:tc>
+      </w:tr>
+      <w:tr>
+        <w:tc>
+          <w:tcPr>
+            <w:tcW w:type="dxa" w:w="1560"/>
+            <w:vAlign w:val="center"/>
+            <w:tcMar>
+              <w:top w:w="80" w:type="dxa"/>
+              <w:start w:w="120" w:type="dxa"/>
+              <w:bottom w:w="80" w:type="dxa"/>
+              <w:end w:w="120" w:type="dxa"/>
+            </w:tcMar>
+            <w:shd w:fill="F8FAFC"/>
+          </w:tcPr>
+          <w:p>
+            <w:pPr>
+              <w:spacing w:after="0"/>
+              <w:jc w:val="left"/>
+            </w:pPr>
+            <w:r>
+              <w:rPr>
+                <w:rFonts w:ascii="Arial" w:hAnsi="Arial" w:eastAsia="Arial"/>
+                <w:b w:val="0"/>
+                <w:color w:val="111827"/>
+                <w:sz w:val="16"/>
+              </w:rPr>
+              <w:t>coaching</w:t>
+            </w:r>
+          </w:p>
+        </w:tc>
+        <w:tc>
+          <w:tcPr>
+            <w:tcW w:type="dxa" w:w="1560"/>
+            <w:vAlign w:val="center"/>
+            <w:tcMar>
+              <w:top w:w="80" w:type="dxa"/>
+              <w:start w:w="120" w:type="dxa"/>
+              <w:bottom w:w="80" w:type="dxa"/>
+              <w:end w:w="120" w:type="dxa"/>
+            </w:tcMar>
+            <w:shd w:fill="F8FAFC"/>
+          </w:tcPr>
+          <w:p>
+            <w:pPr>
+              <w:spacing w:after="0"/>
+              <w:jc w:val="left"/>
+            </w:pPr>
+            <w:r>
+              <w:rPr>
+                <w:rFonts w:ascii="Arial" w:hAnsi="Arial" w:eastAsia="Arial"/>
+                <w:b w:val="0"/>
+                <w:color w:val="111827"/>
+                <w:sz w:val="16"/>
+              </w:rPr>
+              <w:t>прямой adjacent-рынок</w:t>
+            </w:r>
+          </w:p>
+        </w:tc>
+        <w:tc>
+          <w:tcPr>
+            <w:tcW w:type="dxa" w:w="1560"/>
+            <w:vAlign w:val="center"/>
+            <w:tcMar>
+              <w:top w:w="80" w:type="dxa"/>
+              <w:start w:w="120" w:type="dxa"/>
+              <w:bottom w:w="80" w:type="dxa"/>
+              <w:end w:w="120" w:type="dxa"/>
+            </w:tcMar>
+            <w:shd w:fill="F8FAFC"/>
+          </w:tcPr>
+          <w:p>
+            <w:pPr>
+              <w:spacing w:after="0"/>
+              <w:jc w:val="left"/>
+            </w:pPr>
+            <w:r>
+              <w:rPr>
+                <w:rFonts w:ascii="Arial" w:hAnsi="Arial" w:eastAsia="Arial"/>
+                <w:b w:val="0"/>
+                <w:color w:val="111827"/>
+                <w:sz w:val="16"/>
+              </w:rPr>
+              <w:t>$300M</w:t>
+            </w:r>
+          </w:p>
+        </w:tc>
+        <w:tc>
+          <w:tcPr>
+            <w:tcW w:type="dxa" w:w="1560"/>
+            <w:vAlign w:val="center"/>
+            <w:tcMar>
+              <w:top w:w="80" w:type="dxa"/>
+              <w:start w:w="120" w:type="dxa"/>
+              <w:bottom w:w="80" w:type="dxa"/>
+              <w:end w:w="120" w:type="dxa"/>
+            </w:tcMar>
+            <w:shd w:fill="F8FAFC"/>
+          </w:tcPr>
+          <w:p>
+            <w:pPr>
+              <w:spacing w:after="0"/>
+              <w:jc w:val="left"/>
+            </w:pPr>
+            <w:r>
+              <w:rPr>
+                <w:rFonts w:ascii="Arial" w:hAnsi="Arial" w:eastAsia="Arial"/>
+                <w:b w:val="0"/>
+                <w:color w:val="111827"/>
+                <w:sz w:val="16"/>
+              </w:rPr>
+              <w:t>$210M</w:t>
+            </w:r>
+          </w:p>
+        </w:tc>
+        <w:tc>
+          <w:tcPr>
+            <w:tcW w:type="dxa" w:w="1560"/>
+            <w:vAlign w:val="center"/>
+            <w:tcMar>
+              <w:top w:w="80" w:type="dxa"/>
+              <w:start w:w="120" w:type="dxa"/>
+              <w:bottom w:w="80" w:type="dxa"/>
+              <w:end w:w="120" w:type="dxa"/>
+            </w:tcMar>
+            <w:shd w:fill="F8FAFC"/>
+          </w:tcPr>
+          <w:p>
+            <w:pPr>
+              <w:spacing w:after="0"/>
+              <w:jc w:val="left"/>
+            </w:pPr>
+            <w:r>
+              <w:rPr>
+                <w:rFonts w:ascii="Arial" w:hAnsi="Arial" w:eastAsia="Arial"/>
+                <w:b w:val="0"/>
+                <w:color w:val="111827"/>
+                <w:sz w:val="16"/>
+              </w:rPr>
+              <w:t>широкий диапазон источников, нужен conservative range</w:t>
+            </w:r>
+          </w:p>
+        </w:tc>
+        <w:tc>
+          <w:tcPr>
+            <w:tcW w:type="dxa" w:w="1560"/>
+            <w:vAlign w:val="center"/>
+            <w:tcMar>
+              <w:top w:w="80" w:type="dxa"/>
+              <w:start w:w="120" w:type="dxa"/>
+              <w:bottom w:w="80" w:type="dxa"/>
+              <w:end w:w="120" w:type="dxa"/>
+            </w:tcMar>
+            <w:shd w:fill="F8FAFC"/>
+          </w:tcPr>
+          <w:p>
+            <w:pPr>
+              <w:spacing w:after="0"/>
+              <w:jc w:val="left"/>
+            </w:pPr>
+            <w:r>
+              <w:rPr>
+                <w:rFonts w:ascii="Arial" w:hAnsi="Arial" w:eastAsia="Arial"/>
+                <w:b w:val="0"/>
+                <w:color w:val="111827"/>
+                <w:sz w:val="16"/>
+              </w:rPr>
+              <w:t>использовать как directional market-money anchor до ручного paywall, ICP и WTP evidence</w:t>
+            </w:r>
+          </w:p>
+        </w:tc>
+      </w:tr>
+      <w:tr>
+        <w:tc>
+          <w:tcPr>
+            <w:tcW w:type="dxa" w:w="1560"/>
+            <w:vAlign w:val="center"/>
+            <w:tcMar>
+              <w:top w:w="80" w:type="dxa"/>
+              <w:start w:w="120" w:type="dxa"/>
+              <w:bottom w:w="80" w:type="dxa"/>
+              <w:end w:w="120" w:type="dxa"/>
+            </w:tcMar>
+          </w:tcPr>
+          <w:p>
+            <w:pPr>
+              <w:spacing w:after="0"/>
+              <w:jc w:val="left"/>
+            </w:pPr>
+            <w:r>
+              <w:rPr>
+                <w:rFonts w:ascii="Arial" w:hAnsi="Arial" w:eastAsia="Arial"/>
+                <w:b w:val="0"/>
+                <w:color w:val="111827"/>
+                <w:sz w:val="16"/>
+              </w:rPr>
+              <w:t>mindfulness</w:t>
+            </w:r>
+          </w:p>
+        </w:tc>
+        <w:tc>
+          <w:tcPr>
+            <w:tcW w:type="dxa" w:w="1560"/>
+            <w:vAlign w:val="center"/>
+            <w:tcMar>
+              <w:top w:w="80" w:type="dxa"/>
+              <w:start w:w="120" w:type="dxa"/>
+              <w:bottom w:w="80" w:type="dxa"/>
+              <w:end w:w="120" w:type="dxa"/>
+            </w:tcMar>
+          </w:tcPr>
+          <w:p>
+            <w:pPr>
+              <w:spacing w:after="0"/>
+              <w:jc w:val="left"/>
+            </w:pPr>
+            <w:r>
+              <w:rPr>
+                <w:rFonts w:ascii="Arial" w:hAnsi="Arial" w:eastAsia="Arial"/>
+                <w:b w:val="0"/>
+                <w:color w:val="111827"/>
+                <w:sz w:val="16"/>
+              </w:rPr>
+              <w:t>прямой adjacent-рынок</w:t>
+            </w:r>
+          </w:p>
+        </w:tc>
+        <w:tc>
+          <w:tcPr>
+            <w:tcW w:type="dxa" w:w="1560"/>
+            <w:vAlign w:val="center"/>
+            <w:tcMar>
+              <w:top w:w="80" w:type="dxa"/>
+              <w:start w:w="120" w:type="dxa"/>
+              <w:bottom w:w="80" w:type="dxa"/>
+              <w:end w:w="120" w:type="dxa"/>
+            </w:tcMar>
+          </w:tcPr>
+          <w:p>
+            <w:pPr>
+              <w:spacing w:after="0"/>
+              <w:jc w:val="left"/>
+            </w:pPr>
+            <w:r>
+              <w:rPr>
+                <w:rFonts w:ascii="Arial" w:hAnsi="Arial" w:eastAsia="Arial"/>
+                <w:b w:val="0"/>
+                <w:color w:val="111827"/>
+                <w:sz w:val="16"/>
+              </w:rPr>
+              <w:t>$252M</w:t>
+            </w:r>
+          </w:p>
+        </w:tc>
+        <w:tc>
+          <w:tcPr>
+            <w:tcW w:type="dxa" w:w="1560"/>
+            <w:vAlign w:val="center"/>
+            <w:tcMar>
+              <w:top w:w="80" w:type="dxa"/>
+              <w:start w:w="120" w:type="dxa"/>
+              <w:bottom w:w="80" w:type="dxa"/>
+              <w:end w:w="120" w:type="dxa"/>
+            </w:tcMar>
+          </w:tcPr>
+          <w:p>
+            <w:pPr>
+              <w:spacing w:after="0"/>
+              <w:jc w:val="left"/>
+            </w:pPr>
+            <w:r>
+              <w:rPr>
+                <w:rFonts w:ascii="Arial" w:hAnsi="Arial" w:eastAsia="Arial"/>
+                <w:b w:val="0"/>
+                <w:color w:val="111827"/>
+                <w:sz w:val="16"/>
+              </w:rPr>
+              <w:t>$176M</w:t>
+            </w:r>
+          </w:p>
+        </w:tc>
+        <w:tc>
+          <w:tcPr>
+            <w:tcW w:type="dxa" w:w="1560"/>
+            <w:vAlign w:val="center"/>
+            <w:tcMar>
+              <w:top w:w="80" w:type="dxa"/>
+              <w:start w:w="120" w:type="dxa"/>
+              <w:bottom w:w="80" w:type="dxa"/>
+              <w:end w:w="120" w:type="dxa"/>
+            </w:tcMar>
+          </w:tcPr>
+          <w:p>
+            <w:pPr>
+              <w:spacing w:after="0"/>
+              <w:jc w:val="left"/>
+            </w:pPr>
+            <w:r>
+              <w:rPr>
+                <w:rFonts w:ascii="Arial" w:hAnsi="Arial" w:eastAsia="Arial"/>
+                <w:b w:val="0"/>
+                <w:color w:val="111827"/>
+                <w:sz w:val="16"/>
+              </w:rPr>
+              <w:t>поддержано proxy, но нужен ручной paid-flow/WTP</w:t>
+            </w:r>
+          </w:p>
+        </w:tc>
+        <w:tc>
+          <w:tcPr>
+            <w:tcW w:type="dxa" w:w="1560"/>
+            <w:vAlign w:val="center"/>
+            <w:tcMar>
+              <w:top w:w="80" w:type="dxa"/>
+              <w:start w:w="120" w:type="dxa"/>
+              <w:bottom w:w="80" w:type="dxa"/>
+              <w:end w:w="120" w:type="dxa"/>
+            </w:tcMar>
+          </w:tcPr>
+          <w:p>
+            <w:pPr>
+              <w:spacing w:after="0"/>
+              <w:jc w:val="left"/>
+            </w:pPr>
+            <w:r>
+              <w:rPr>
+                <w:rFonts w:ascii="Arial" w:hAnsi="Arial" w:eastAsia="Arial"/>
+                <w:b w:val="0"/>
+                <w:color w:val="111827"/>
+                <w:sz w:val="16"/>
+              </w:rPr>
+              <w:t>использовать как directional market-money anchor до ручного paywall, ICP и WTP evidence</w:t>
+            </w:r>
+          </w:p>
+        </w:tc>
+      </w:tr>
+      <w:tr>
+        <w:tc>
+          <w:tcPr>
+            <w:tcW w:type="dxa" w:w="1560"/>
+            <w:vAlign w:val="center"/>
+            <w:tcMar>
+              <w:top w:w="80" w:type="dxa"/>
+              <w:start w:w="120" w:type="dxa"/>
+              <w:bottom w:w="80" w:type="dxa"/>
+              <w:end w:w="120" w:type="dxa"/>
+            </w:tcMar>
+            <w:shd w:fill="F8FAFC"/>
+          </w:tcPr>
+          <w:p>
+            <w:pPr>
+              <w:spacing w:after="0"/>
+              <w:jc w:val="left"/>
+            </w:pPr>
+            <w:r>
+              <w:rPr>
+                <w:rFonts w:ascii="Arial" w:hAnsi="Arial" w:eastAsia="Arial"/>
+                <w:b w:val="0"/>
+                <w:color w:val="111827"/>
+                <w:sz w:val="16"/>
+              </w:rPr>
+              <w:t>intersection</w:t>
+            </w:r>
+          </w:p>
+        </w:tc>
+        <w:tc>
+          <w:tcPr>
+            <w:tcW w:type="dxa" w:w="1560"/>
+            <w:vAlign w:val="center"/>
+            <w:tcMar>
+              <w:top w:w="80" w:type="dxa"/>
+              <w:start w:w="120" w:type="dxa"/>
+              <w:bottom w:w="80" w:type="dxa"/>
+              <w:end w:w="120" w:type="dxa"/>
+            </w:tcMar>
+            <w:shd w:fill="F8FAFC"/>
+          </w:tcPr>
+          <w:p>
+            <w:pPr>
+              <w:spacing w:after="0"/>
+              <w:jc w:val="left"/>
+            </w:pPr>
+            <w:r>
+              <w:rPr>
+                <w:rFonts w:ascii="Arial" w:hAnsi="Arial" w:eastAsia="Arial"/>
+                <w:b w:val="0"/>
+                <w:color w:val="111827"/>
+                <w:sz w:val="16"/>
+              </w:rPr>
+              <w:t>расчетное пересечение Alina</w:t>
+            </w:r>
+          </w:p>
+        </w:tc>
+        <w:tc>
+          <w:tcPr>
+            <w:tcW w:type="dxa" w:w="1560"/>
+            <w:vAlign w:val="center"/>
+            <w:tcMar>
+              <w:top w:w="80" w:type="dxa"/>
+              <w:start w:w="120" w:type="dxa"/>
+              <w:bottom w:w="80" w:type="dxa"/>
+              <w:end w:w="120" w:type="dxa"/>
+            </w:tcMar>
+            <w:shd w:fill="F8FAFC"/>
+          </w:tcPr>
+          <w:p>
+            <w:pPr>
+              <w:spacing w:after="0"/>
+              <w:jc w:val="left"/>
+            </w:pPr>
+            <w:r>
+              <w:rPr>
+                <w:rFonts w:ascii="Arial" w:hAnsi="Arial" w:eastAsia="Arial"/>
+                <w:b w:val="0"/>
+                <w:color w:val="111827"/>
+                <w:sz w:val="16"/>
+              </w:rPr>
+              <w:t>$202M</w:t>
+            </w:r>
+          </w:p>
+        </w:tc>
+        <w:tc>
+          <w:tcPr>
+            <w:tcW w:type="dxa" w:w="1560"/>
+            <w:vAlign w:val="center"/>
+            <w:tcMar>
+              <w:top w:w="80" w:type="dxa"/>
+              <w:start w:w="120" w:type="dxa"/>
+              <w:bottom w:w="80" w:type="dxa"/>
+              <w:end w:w="120" w:type="dxa"/>
+            </w:tcMar>
+            <w:shd w:fill="F8FAFC"/>
+          </w:tcPr>
+          <w:p>
+            <w:pPr>
+              <w:spacing w:after="0"/>
+              <w:jc w:val="left"/>
+            </w:pPr>
+            <w:r>
+              <w:rPr>
+                <w:rFonts w:ascii="Arial" w:hAnsi="Arial" w:eastAsia="Arial"/>
+                <w:b w:val="0"/>
+                <w:color w:val="111827"/>
+                <w:sz w:val="16"/>
+              </w:rPr>
+              <w:t>$80.8M</w:t>
+            </w:r>
+          </w:p>
+        </w:tc>
+        <w:tc>
+          <w:tcPr>
+            <w:tcW w:type="dxa" w:w="1560"/>
+            <w:vAlign w:val="center"/>
+            <w:tcMar>
+              <w:top w:w="80" w:type="dxa"/>
+              <w:start w:w="120" w:type="dxa"/>
+              <w:bottom w:w="80" w:type="dxa"/>
+              <w:end w:w="120" w:type="dxa"/>
+            </w:tcMar>
+            <w:shd w:fill="F8FAFC"/>
+          </w:tcPr>
+          <w:p>
+            <w:pPr>
+              <w:spacing w:after="0"/>
+              <w:jc w:val="left"/>
+            </w:pPr>
+            <w:r>
+              <w:rPr>
+                <w:rFonts w:ascii="Arial" w:hAnsi="Arial" w:eastAsia="Arial"/>
+                <w:b w:val="0"/>
+                <w:color w:val="111827"/>
+                <w:sz w:val="16"/>
+              </w:rPr>
+              <w:t>модельное пересечение, высокий риск завысить claim</w:t>
+            </w:r>
+          </w:p>
+        </w:tc>
+        <w:tc>
+          <w:tcPr>
+            <w:tcW w:type="dxa" w:w="1560"/>
+            <w:vAlign w:val="center"/>
+            <w:tcMar>
+              <w:top w:w="80" w:type="dxa"/>
+              <w:start w:w="120" w:type="dxa"/>
+              <w:bottom w:w="80" w:type="dxa"/>
+              <w:end w:w="120" w:type="dxa"/>
+            </w:tcMar>
+            <w:shd w:fill="F8FAFC"/>
+          </w:tcPr>
+          <w:p>
+            <w:pPr>
+              <w:spacing w:after="0"/>
+              <w:jc w:val="left"/>
+            </w:pPr>
+            <w:r>
+              <w:rPr>
+                <w:rFonts w:ascii="Arial" w:hAnsi="Arial" w:eastAsia="Arial"/>
+                <w:b w:val="0"/>
+                <w:color w:val="111827"/>
+                <w:sz w:val="16"/>
+              </w:rPr>
+              <w:t>читать как рабочий modeled SAM для проверки, а не как прогноз выручки или investor-grade market claim</w:t>
+            </w:r>
+          </w:p>
+        </w:tc>
+      </w:tr>
+    </w:tbl>
+    <w:p/>
+    <w:p>
+      <w:r>
+        <w:t>Для H2 это означает жесткую границу: TAM/SAM/SOM доказывает, что рынок достаточно интересен для проверки, но не доказывает, что Alina заработает эти деньги. H2 можно усиливать только после product-matched paid-flow signoff, willingness-to-pay в ICP-интервью и paid-depth signal в прототипных сессиях.</w:t>
+      </w:r>
+    </w:p>
+    <w:tbl>
+      <w:tblPr>
+        <w:tblW w:type="dxa" w:w="9360"/>
+        <w:jc w:val="left"/>
+        <w:tblLayout w:type="fixed"/>
+        <w:tblLook w:firstColumn="1" w:firstRow="1" w:lastColumn="0" w:lastRow="0" w:noHBand="0" w:noVBand="1" w:val="04A0"/>
+        <w:tblInd w:w="120" w:type="dxa"/>
+        <w:tblBorders>
+          <w:top w:val="single" w:sz="4" w:space="0" w:color="CBD5E1"/>
+          <w:left w:val="single" w:sz="4" w:space="0" w:color="CBD5E1"/>
+          <w:bottom w:val="single" w:sz="4" w:space="0" w:color="CBD5E1"/>
+          <w:right w:val="single" w:sz="4" w:space="0" w:color="CBD5E1"/>
+          <w:insideH w:val="single" w:sz="4" w:space="0" w:color="CBD5E1"/>
+          <w:insideV w:val="single" w:sz="4" w:space="0" w:color="CBD5E1"/>
+        </w:tblBorders>
+      </w:tblPr>
+      <w:tblGrid>
+        <w:gridCol w:w="1337"/>
+        <w:gridCol w:w="1337"/>
+        <w:gridCol w:w="1337"/>
+        <w:gridCol w:w="1337"/>
+        <w:gridCol w:w="1337"/>
+        <w:gridCol w:w="1337"/>
+        <w:gridCol w:w="1337"/>
+      </w:tblGrid>
+      <w:tr>
+        <w:tc>
+          <w:tcPr>
+            <w:tcW w:type="dxa" w:w="1337"/>
+            <w:vAlign w:val="center"/>
+            <w:tcMar>
+              <w:top w:w="80" w:type="dxa"/>
+              <w:start w:w="120" w:type="dxa"/>
+              <w:bottom w:w="80" w:type="dxa"/>
+              <w:end w:w="120" w:type="dxa"/>
+            </w:tcMar>
+            <w:shd w:fill="E8EEF5"/>
+          </w:tcPr>
+          <w:p>
+            <w:pPr>
+              <w:spacing w:after="0"/>
+              <w:jc w:val="left"/>
+            </w:pPr>
+            <w:r>
+              <w:rPr>
+                <w:rFonts w:ascii="Arial" w:hAnsi="Arial" w:eastAsia="Arial"/>
+                <w:b/>
+                <w:color w:val="111827"/>
+                <w:sz w:val="16"/>
+              </w:rPr>
+              <w:t>Сценарий</w:t>
+            </w:r>
+          </w:p>
+        </w:tc>
+        <w:tc>
+          <w:tcPr>
+            <w:tcW w:type="dxa" w:w="1337"/>
+            <w:vAlign w:val="center"/>
+            <w:tcMar>
+              <w:top w:w="80" w:type="dxa"/>
+              <w:start w:w="120" w:type="dxa"/>
+              <w:bottom w:w="80" w:type="dxa"/>
+              <w:end w:w="120" w:type="dxa"/>
+            </w:tcMar>
+            <w:shd w:fill="E8EEF5"/>
+          </w:tcPr>
+          <w:p>
+            <w:pPr>
+              <w:spacing w:after="0"/>
+              <w:jc w:val="left"/>
+            </w:pPr>
+            <w:r>
+              <w:rPr>
+                <w:rFonts w:ascii="Arial" w:hAnsi="Arial" w:eastAsia="Arial"/>
+                <w:b/>
+                <w:color w:val="111827"/>
+                <w:sz w:val="16"/>
+              </w:rPr>
+              <w:t>Reachable users</w:t>
+            </w:r>
+          </w:p>
+        </w:tc>
+        <w:tc>
+          <w:tcPr>
+            <w:tcW w:type="dxa" w:w="1337"/>
+            <w:vAlign w:val="center"/>
+            <w:tcMar>
+              <w:top w:w="80" w:type="dxa"/>
+              <w:start w:w="120" w:type="dxa"/>
+              <w:bottom w:w="80" w:type="dxa"/>
+              <w:end w:w="120" w:type="dxa"/>
+            </w:tcMar>
+            <w:shd w:fill="E8EEF5"/>
+          </w:tcPr>
+          <w:p>
+            <w:pPr>
+              <w:spacing w:after="0"/>
+              <w:jc w:val="left"/>
+            </w:pPr>
+            <w:r>
+              <w:rPr>
+                <w:rFonts w:ascii="Arial" w:hAnsi="Arial" w:eastAsia="Arial"/>
+                <w:b/>
+                <w:color w:val="111827"/>
+                <w:sz w:val="16"/>
+              </w:rPr>
+              <w:t>Activation</w:t>
+            </w:r>
+          </w:p>
+        </w:tc>
+        <w:tc>
+          <w:tcPr>
+            <w:tcW w:type="dxa" w:w="1337"/>
+            <w:vAlign w:val="center"/>
+            <w:tcMar>
+              <w:top w:w="80" w:type="dxa"/>
+              <w:start w:w="120" w:type="dxa"/>
+              <w:bottom w:w="80" w:type="dxa"/>
+              <w:end w:w="120" w:type="dxa"/>
+            </w:tcMar>
+            <w:shd w:fill="E8EEF5"/>
+          </w:tcPr>
+          <w:p>
+            <w:pPr>
+              <w:spacing w:after="0"/>
+              <w:jc w:val="left"/>
+            </w:pPr>
+            <w:r>
+              <w:rPr>
+                <w:rFonts w:ascii="Arial" w:hAnsi="Arial" w:eastAsia="Arial"/>
+                <w:b/>
+                <w:color w:val="111827"/>
+                <w:sz w:val="16"/>
+              </w:rPr>
+              <w:t>Paid conv</w:t>
+            </w:r>
+          </w:p>
+        </w:tc>
+        <w:tc>
+          <w:tcPr>
+            <w:tcW w:type="dxa" w:w="1337"/>
+            <w:vAlign w:val="center"/>
+            <w:tcMar>
+              <w:top w:w="80" w:type="dxa"/>
+              <w:start w:w="120" w:type="dxa"/>
+              <w:bottom w:w="80" w:type="dxa"/>
+              <w:end w:w="120" w:type="dxa"/>
+            </w:tcMar>
+            <w:shd w:fill="E8EEF5"/>
+          </w:tcPr>
+          <w:p>
+            <w:pPr>
+              <w:spacing w:after="0"/>
+              <w:jc w:val="left"/>
+            </w:pPr>
+            <w:r>
+              <w:rPr>
+                <w:rFonts w:ascii="Arial" w:hAnsi="Arial" w:eastAsia="Arial"/>
+                <w:b/>
+                <w:color w:val="111827"/>
+                <w:sz w:val="16"/>
+              </w:rPr>
+              <w:t>ARPPU</w:t>
+            </w:r>
+          </w:p>
+        </w:tc>
+        <w:tc>
+          <w:tcPr>
+            <w:tcW w:type="dxa" w:w="1337"/>
+            <w:vAlign w:val="center"/>
+            <w:tcMar>
+              <w:top w:w="80" w:type="dxa"/>
+              <w:start w:w="120" w:type="dxa"/>
+              <w:bottom w:w="80" w:type="dxa"/>
+              <w:end w:w="120" w:type="dxa"/>
+            </w:tcMar>
+            <w:shd w:fill="E8EEF5"/>
+          </w:tcPr>
+          <w:p>
+            <w:pPr>
+              <w:spacing w:after="0"/>
+              <w:jc w:val="left"/>
+            </w:pPr>
+            <w:r>
+              <w:rPr>
+                <w:rFonts w:ascii="Arial" w:hAnsi="Arial" w:eastAsia="Arial"/>
+                <w:b/>
+                <w:color w:val="111827"/>
+                <w:sz w:val="16"/>
+              </w:rPr>
+              <w:t>Annual revenue</w:t>
+            </w:r>
+          </w:p>
+        </w:tc>
+        <w:tc>
+          <w:tcPr>
+            <w:tcW w:type="dxa" w:w="1337"/>
+            <w:vAlign w:val="center"/>
+            <w:tcMar>
+              <w:top w:w="80" w:type="dxa"/>
+              <w:start w:w="120" w:type="dxa"/>
+              <w:bottom w:w="80" w:type="dxa"/>
+              <w:end w:w="120" w:type="dxa"/>
+            </w:tcMar>
+            <w:shd w:fill="E8EEF5"/>
+          </w:tcPr>
+          <w:p>
+            <w:pPr>
+              <w:spacing w:after="0"/>
+              <w:jc w:val="left"/>
+            </w:pPr>
+            <w:r>
+              <w:rPr>
+                <w:rFonts w:ascii="Arial" w:hAnsi="Arial" w:eastAsia="Arial"/>
+                <w:b/>
+                <w:color w:val="111827"/>
+                <w:sz w:val="16"/>
+              </w:rPr>
+              <w:t>Как читать</w:t>
+            </w:r>
+          </w:p>
+        </w:tc>
+      </w:tr>
+      <w:tr>
+        <w:tc>
+          <w:tcPr>
+            <w:tcW w:type="dxa" w:w="1337"/>
+            <w:vAlign w:val="center"/>
+            <w:tcMar>
+              <w:top w:w="80" w:type="dxa"/>
+              <w:start w:w="120" w:type="dxa"/>
+              <w:bottom w:w="80" w:type="dxa"/>
+              <w:end w:w="120" w:type="dxa"/>
+            </w:tcMar>
+          </w:tcPr>
+          <w:p>
+            <w:pPr>
+              <w:spacing w:after="0"/>
+              <w:jc w:val="left"/>
+            </w:pPr>
+            <w:r>
+              <w:rPr>
+                <w:rFonts w:ascii="Arial" w:hAnsi="Arial" w:eastAsia="Arial"/>
+                <w:b w:val="0"/>
+                <w:color w:val="111827"/>
+                <w:sz w:val="16"/>
+              </w:rPr>
+              <w:t>defensive</w:t>
+            </w:r>
+          </w:p>
+        </w:tc>
+        <w:tc>
+          <w:tcPr>
+            <w:tcW w:type="dxa" w:w="1337"/>
+            <w:vAlign w:val="center"/>
+            <w:tcMar>
+              <w:top w:w="80" w:type="dxa"/>
+              <w:start w:w="120" w:type="dxa"/>
+              <w:bottom w:w="80" w:type="dxa"/>
+              <w:end w:w="120" w:type="dxa"/>
+            </w:tcMar>
+          </w:tcPr>
+          <w:p>
+            <w:pPr>
+              <w:spacing w:after="0"/>
+              <w:jc w:val="left"/>
+            </w:pPr>
+            <w:r>
+              <w:rPr>
+                <w:rFonts w:ascii="Arial" w:hAnsi="Arial" w:eastAsia="Arial"/>
+                <w:b w:val="0"/>
+                <w:color w:val="111827"/>
+                <w:sz w:val="16"/>
+              </w:rPr>
+              <w:t>100,000</w:t>
+            </w:r>
+          </w:p>
+        </w:tc>
+        <w:tc>
+          <w:tcPr>
+            <w:tcW w:type="dxa" w:w="1337"/>
+            <w:vAlign w:val="center"/>
+            <w:tcMar>
+              <w:top w:w="80" w:type="dxa"/>
+              <w:start w:w="120" w:type="dxa"/>
+              <w:bottom w:w="80" w:type="dxa"/>
+              <w:end w:w="120" w:type="dxa"/>
+            </w:tcMar>
+          </w:tcPr>
+          <w:p>
+            <w:pPr>
+              <w:spacing w:after="0"/>
+              <w:jc w:val="left"/>
+            </w:pPr>
+            <w:r>
+              <w:rPr>
+                <w:rFonts w:ascii="Arial" w:hAnsi="Arial" w:eastAsia="Arial"/>
+                <w:b w:val="0"/>
+                <w:color w:val="111827"/>
+                <w:sz w:val="16"/>
+              </w:rPr>
+              <w:t>25%</w:t>
+            </w:r>
+          </w:p>
+        </w:tc>
+        <w:tc>
+          <w:tcPr>
+            <w:tcW w:type="dxa" w:w="1337"/>
+            <w:vAlign w:val="center"/>
+            <w:tcMar>
+              <w:top w:w="80" w:type="dxa"/>
+              <w:start w:w="120" w:type="dxa"/>
+              <w:bottom w:w="80" w:type="dxa"/>
+              <w:end w:w="120" w:type="dxa"/>
+            </w:tcMar>
+          </w:tcPr>
+          <w:p>
+            <w:pPr>
+              <w:spacing w:after="0"/>
+              <w:jc w:val="left"/>
+            </w:pPr>
+            <w:r>
+              <w:rPr>
+                <w:rFonts w:ascii="Arial" w:hAnsi="Arial" w:eastAsia="Arial"/>
+                <w:b w:val="0"/>
+                <w:color w:val="111827"/>
+                <w:sz w:val="16"/>
+              </w:rPr>
+              <w:t>2%</w:t>
+            </w:r>
+          </w:p>
+        </w:tc>
+        <w:tc>
+          <w:tcPr>
+            <w:tcW w:type="dxa" w:w="1337"/>
+            <w:vAlign w:val="center"/>
+            <w:tcMar>
+              <w:top w:w="80" w:type="dxa"/>
+              <w:start w:w="120" w:type="dxa"/>
+              <w:bottom w:w="80" w:type="dxa"/>
+              <w:end w:w="120" w:type="dxa"/>
+            </w:tcMar>
+          </w:tcPr>
+          <w:p>
+            <w:pPr>
+              <w:spacing w:after="0"/>
+              <w:jc w:val="left"/>
+            </w:pPr>
+            <w:r>
+              <w:rPr>
+                <w:rFonts w:ascii="Arial" w:hAnsi="Arial" w:eastAsia="Arial"/>
+                <w:b w:val="0"/>
+                <w:color w:val="111827"/>
+                <w:sz w:val="16"/>
+              </w:rPr>
+              <w:t>$50</w:t>
+            </w:r>
+          </w:p>
+        </w:tc>
+        <w:tc>
+          <w:tcPr>
+            <w:tcW w:type="dxa" w:w="1337"/>
+            <w:vAlign w:val="center"/>
+            <w:tcMar>
+              <w:top w:w="80" w:type="dxa"/>
+              <w:start w:w="120" w:type="dxa"/>
+              <w:bottom w:w="80" w:type="dxa"/>
+              <w:end w:w="120" w:type="dxa"/>
+            </w:tcMar>
+          </w:tcPr>
+          <w:p>
+            <w:pPr>
+              <w:spacing w:after="0"/>
+              <w:jc w:val="left"/>
+            </w:pPr>
+            <w:r>
+              <w:rPr>
+                <w:rFonts w:ascii="Arial" w:hAnsi="Arial" w:eastAsia="Arial"/>
+                <w:b w:val="0"/>
+                <w:color w:val="111827"/>
+                <w:sz w:val="16"/>
+              </w:rPr>
+              <w:t>$25,000</w:t>
+            </w:r>
+          </w:p>
+        </w:tc>
+        <w:tc>
+          <w:tcPr>
+            <w:tcW w:type="dxa" w:w="1337"/>
+            <w:vAlign w:val="center"/>
+            <w:tcMar>
+              <w:top w:w="80" w:type="dxa"/>
+              <w:start w:w="120" w:type="dxa"/>
+              <w:bottom w:w="80" w:type="dxa"/>
+              <w:end w:w="120" w:type="dxa"/>
+            </w:tcMar>
+          </w:tcPr>
+          <w:p>
+            <w:pPr>
+              <w:spacing w:after="0"/>
+              <w:jc w:val="left"/>
+            </w:pPr>
+            <w:r>
+              <w:rPr>
+                <w:rFonts w:ascii="Arial" w:hAnsi="Arial" w:eastAsia="Arial"/>
+                <w:b w:val="0"/>
+                <w:color w:val="111827"/>
+                <w:sz w:val="16"/>
+              </w:rPr>
+              <w:t>маленький validation business, полезен для проверки, но не для venture claim</w:t>
+            </w:r>
+          </w:p>
+        </w:tc>
+      </w:tr>
+      <w:tr>
+        <w:tc>
+          <w:tcPr>
+            <w:tcW w:type="dxa" w:w="1337"/>
+            <w:vAlign w:val="center"/>
+            <w:tcMar>
+              <w:top w:w="80" w:type="dxa"/>
+              <w:start w:w="120" w:type="dxa"/>
+              <w:bottom w:w="80" w:type="dxa"/>
+              <w:end w:w="120" w:type="dxa"/>
+            </w:tcMar>
+            <w:shd w:fill="F8FAFC"/>
+          </w:tcPr>
+          <w:p>
+            <w:pPr>
+              <w:spacing w:after="0"/>
+              <w:jc w:val="left"/>
+            </w:pPr>
+            <w:r>
+              <w:rPr>
+                <w:rFonts w:ascii="Arial" w:hAnsi="Arial" w:eastAsia="Arial"/>
+                <w:b w:val="0"/>
+                <w:color w:val="111827"/>
+                <w:sz w:val="16"/>
+              </w:rPr>
+              <w:t>conservative</w:t>
+            </w:r>
+          </w:p>
+        </w:tc>
+        <w:tc>
+          <w:tcPr>
+            <w:tcW w:type="dxa" w:w="1337"/>
+            <w:vAlign w:val="center"/>
+            <w:tcMar>
+              <w:top w:w="80" w:type="dxa"/>
+              <w:start w:w="120" w:type="dxa"/>
+              <w:bottom w:w="80" w:type="dxa"/>
+              <w:end w:w="120" w:type="dxa"/>
+            </w:tcMar>
+            <w:shd w:fill="F8FAFC"/>
+          </w:tcPr>
+          <w:p>
+            <w:pPr>
+              <w:spacing w:after="0"/>
+              <w:jc w:val="left"/>
+            </w:pPr>
+            <w:r>
+              <w:rPr>
+                <w:rFonts w:ascii="Arial" w:hAnsi="Arial" w:eastAsia="Arial"/>
+                <w:b w:val="0"/>
+                <w:color w:val="111827"/>
+                <w:sz w:val="16"/>
+              </w:rPr>
+              <w:t>250,000</w:t>
+            </w:r>
+          </w:p>
+        </w:tc>
+        <w:tc>
+          <w:tcPr>
+            <w:tcW w:type="dxa" w:w="1337"/>
+            <w:vAlign w:val="center"/>
+            <w:tcMar>
+              <w:top w:w="80" w:type="dxa"/>
+              <w:start w:w="120" w:type="dxa"/>
+              <w:bottom w:w="80" w:type="dxa"/>
+              <w:end w:w="120" w:type="dxa"/>
+            </w:tcMar>
+            <w:shd w:fill="F8FAFC"/>
+          </w:tcPr>
+          <w:p>
+            <w:pPr>
+              <w:spacing w:after="0"/>
+              <w:jc w:val="left"/>
+            </w:pPr>
+            <w:r>
+              <w:rPr>
+                <w:rFonts w:ascii="Arial" w:hAnsi="Arial" w:eastAsia="Arial"/>
+                <w:b w:val="0"/>
+                <w:color w:val="111827"/>
+                <w:sz w:val="16"/>
+              </w:rPr>
+              <w:t>32%</w:t>
+            </w:r>
+          </w:p>
+        </w:tc>
+        <w:tc>
+          <w:tcPr>
+            <w:tcW w:type="dxa" w:w="1337"/>
+            <w:vAlign w:val="center"/>
+            <w:tcMar>
+              <w:top w:w="80" w:type="dxa"/>
+              <w:start w:w="120" w:type="dxa"/>
+              <w:bottom w:w="80" w:type="dxa"/>
+              <w:end w:w="120" w:type="dxa"/>
+            </w:tcMar>
+            <w:shd w:fill="F8FAFC"/>
+          </w:tcPr>
+          <w:p>
+            <w:pPr>
+              <w:spacing w:after="0"/>
+              <w:jc w:val="left"/>
+            </w:pPr>
+            <w:r>
+              <w:rPr>
+                <w:rFonts w:ascii="Arial" w:hAnsi="Arial" w:eastAsia="Arial"/>
+                <w:b w:val="0"/>
+                <w:color w:val="111827"/>
+                <w:sz w:val="16"/>
+              </w:rPr>
+              <w:t>3%</w:t>
+            </w:r>
+          </w:p>
+        </w:tc>
+        <w:tc>
+          <w:tcPr>
+            <w:tcW w:type="dxa" w:w="1337"/>
+            <w:vAlign w:val="center"/>
+            <w:tcMar>
+              <w:top w:w="80" w:type="dxa"/>
+              <w:start w:w="120" w:type="dxa"/>
+              <w:bottom w:w="80" w:type="dxa"/>
+              <w:end w:w="120" w:type="dxa"/>
+            </w:tcMar>
+            <w:shd w:fill="F8FAFC"/>
+          </w:tcPr>
+          <w:p>
+            <w:pPr>
+              <w:spacing w:after="0"/>
+              <w:jc w:val="left"/>
+            </w:pPr>
+            <w:r>
+              <w:rPr>
+                <w:rFonts w:ascii="Arial" w:hAnsi="Arial" w:eastAsia="Arial"/>
+                <w:b w:val="0"/>
+                <w:color w:val="111827"/>
+                <w:sz w:val="16"/>
+              </w:rPr>
+              <w:t>$60</w:t>
+            </w:r>
+          </w:p>
+        </w:tc>
+        <w:tc>
+          <w:tcPr>
+            <w:tcW w:type="dxa" w:w="1337"/>
+            <w:vAlign w:val="center"/>
+            <w:tcMar>
+              <w:top w:w="80" w:type="dxa"/>
+              <w:start w:w="120" w:type="dxa"/>
+              <w:bottom w:w="80" w:type="dxa"/>
+              <w:end w:w="120" w:type="dxa"/>
+            </w:tcMar>
+            <w:shd w:fill="F8FAFC"/>
+          </w:tcPr>
+          <w:p>
+            <w:pPr>
+              <w:spacing w:after="0"/>
+              <w:jc w:val="left"/>
+            </w:pPr>
+            <w:r>
+              <w:rPr>
+                <w:rFonts w:ascii="Arial" w:hAnsi="Arial" w:eastAsia="Arial"/>
+                <w:b w:val="0"/>
+                <w:color w:val="111827"/>
+                <w:sz w:val="16"/>
+              </w:rPr>
+              <w:t>$144,000</w:t>
+            </w:r>
+          </w:p>
+        </w:tc>
+        <w:tc>
+          <w:tcPr>
+            <w:tcW w:type="dxa" w:w="1337"/>
+            <w:vAlign w:val="center"/>
+            <w:tcMar>
+              <w:top w:w="80" w:type="dxa"/>
+              <w:start w:w="120" w:type="dxa"/>
+              <w:bottom w:w="80" w:type="dxa"/>
+              <w:end w:w="120" w:type="dxa"/>
+            </w:tcMar>
+            <w:shd w:fill="F8FAFC"/>
+          </w:tcPr>
+          <w:p>
+            <w:pPr>
+              <w:spacing w:after="0"/>
+              <w:jc w:val="left"/>
+            </w:pPr>
+            <w:r>
+              <w:rPr>
+                <w:rFonts w:ascii="Arial" w:hAnsi="Arial" w:eastAsia="Arial"/>
+                <w:b w:val="0"/>
+                <w:color w:val="111827"/>
+                <w:sz w:val="16"/>
+              </w:rPr>
+              <w:t>ранний нишевый бизнес, имеет смысл при сильной удерживаемости</w:t>
+            </w:r>
+          </w:p>
+        </w:tc>
+      </w:tr>
+      <w:tr>
+        <w:tc>
+          <w:tcPr>
+            <w:tcW w:type="dxa" w:w="1337"/>
+            <w:vAlign w:val="center"/>
+            <w:tcMar>
+              <w:top w:w="80" w:type="dxa"/>
+              <w:start w:w="120" w:type="dxa"/>
+              <w:bottom w:w="80" w:type="dxa"/>
+              <w:end w:w="120" w:type="dxa"/>
+            </w:tcMar>
+          </w:tcPr>
+          <w:p>
+            <w:pPr>
+              <w:spacing w:after="0"/>
+              <w:jc w:val="left"/>
+            </w:pPr>
+            <w:r>
+              <w:rPr>
+                <w:rFonts w:ascii="Arial" w:hAnsi="Arial" w:eastAsia="Arial"/>
+                <w:b w:val="0"/>
+                <w:color w:val="111827"/>
+                <w:sz w:val="16"/>
+              </w:rPr>
+              <w:t>base</w:t>
+            </w:r>
+          </w:p>
+        </w:tc>
+        <w:tc>
+          <w:tcPr>
+            <w:tcW w:type="dxa" w:w="1337"/>
+            <w:vAlign w:val="center"/>
+            <w:tcMar>
+              <w:top w:w="80" w:type="dxa"/>
+              <w:start w:w="120" w:type="dxa"/>
+              <w:bottom w:w="80" w:type="dxa"/>
+              <w:end w:w="120" w:type="dxa"/>
+            </w:tcMar>
+          </w:tcPr>
+          <w:p>
+            <w:pPr>
+              <w:spacing w:after="0"/>
+              <w:jc w:val="left"/>
+            </w:pPr>
+            <w:r>
+              <w:rPr>
+                <w:rFonts w:ascii="Arial" w:hAnsi="Arial" w:eastAsia="Arial"/>
+                <w:b w:val="0"/>
+                <w:color w:val="111827"/>
+                <w:sz w:val="16"/>
+              </w:rPr>
+              <w:t>1,000,000</w:t>
+            </w:r>
+          </w:p>
+        </w:tc>
+        <w:tc>
+          <w:tcPr>
+            <w:tcW w:type="dxa" w:w="1337"/>
+            <w:vAlign w:val="center"/>
+            <w:tcMar>
+              <w:top w:w="80" w:type="dxa"/>
+              <w:start w:w="120" w:type="dxa"/>
+              <w:bottom w:w="80" w:type="dxa"/>
+              <w:end w:w="120" w:type="dxa"/>
+            </w:tcMar>
+          </w:tcPr>
+          <w:p>
+            <w:pPr>
+              <w:spacing w:after="0"/>
+              <w:jc w:val="left"/>
+            </w:pPr>
+            <w:r>
+              <w:rPr>
+                <w:rFonts w:ascii="Arial" w:hAnsi="Arial" w:eastAsia="Arial"/>
+                <w:b w:val="0"/>
+                <w:color w:val="111827"/>
+                <w:sz w:val="16"/>
+              </w:rPr>
+              <w:t>40%</w:t>
+            </w:r>
+          </w:p>
+        </w:tc>
+        <w:tc>
+          <w:tcPr>
+            <w:tcW w:type="dxa" w:w="1337"/>
+            <w:vAlign w:val="center"/>
+            <w:tcMar>
+              <w:top w:w="80" w:type="dxa"/>
+              <w:start w:w="120" w:type="dxa"/>
+              <w:bottom w:w="80" w:type="dxa"/>
+              <w:end w:w="120" w:type="dxa"/>
+            </w:tcMar>
+          </w:tcPr>
+          <w:p>
+            <w:pPr>
+              <w:spacing w:after="0"/>
+              <w:jc w:val="left"/>
+            </w:pPr>
+            <w:r>
+              <w:rPr>
+                <w:rFonts w:ascii="Arial" w:hAnsi="Arial" w:eastAsia="Arial"/>
+                <w:b w:val="0"/>
+                <w:color w:val="111827"/>
+                <w:sz w:val="16"/>
+              </w:rPr>
+              <w:t>5%</w:t>
+            </w:r>
+          </w:p>
+        </w:tc>
+        <w:tc>
+          <w:tcPr>
+            <w:tcW w:type="dxa" w:w="1337"/>
+            <w:vAlign w:val="center"/>
+            <w:tcMar>
+              <w:top w:w="80" w:type="dxa"/>
+              <w:start w:w="120" w:type="dxa"/>
+              <w:bottom w:w="80" w:type="dxa"/>
+              <w:end w:w="120" w:type="dxa"/>
+            </w:tcMar>
+          </w:tcPr>
+          <w:p>
+            <w:pPr>
+              <w:spacing w:after="0"/>
+              <w:jc w:val="left"/>
+            </w:pPr>
+            <w:r>
+              <w:rPr>
+                <w:rFonts w:ascii="Arial" w:hAnsi="Arial" w:eastAsia="Arial"/>
+                <w:b w:val="0"/>
+                <w:color w:val="111827"/>
+                <w:sz w:val="16"/>
+              </w:rPr>
+              <w:t>$80</w:t>
+            </w:r>
+          </w:p>
+        </w:tc>
+        <w:tc>
+          <w:tcPr>
+            <w:tcW w:type="dxa" w:w="1337"/>
+            <w:vAlign w:val="center"/>
+            <w:tcMar>
+              <w:top w:w="80" w:type="dxa"/>
+              <w:start w:w="120" w:type="dxa"/>
+              <w:bottom w:w="80" w:type="dxa"/>
+              <w:end w:w="120" w:type="dxa"/>
+            </w:tcMar>
+          </w:tcPr>
+          <w:p>
+            <w:pPr>
+              <w:spacing w:after="0"/>
+              <w:jc w:val="left"/>
+            </w:pPr>
+            <w:r>
+              <w:rPr>
+                <w:rFonts w:ascii="Arial" w:hAnsi="Arial" w:eastAsia="Arial"/>
+                <w:b w:val="0"/>
+                <w:color w:val="111827"/>
+                <w:sz w:val="16"/>
+              </w:rPr>
+              <w:t>$1.6M</w:t>
+            </w:r>
+          </w:p>
+        </w:tc>
+        <w:tc>
+          <w:tcPr>
+            <w:tcW w:type="dxa" w:w="1337"/>
+            <w:vAlign w:val="center"/>
+            <w:tcMar>
+              <w:top w:w="80" w:type="dxa"/>
+              <w:start w:w="120" w:type="dxa"/>
+              <w:bottom w:w="80" w:type="dxa"/>
+              <w:end w:w="120" w:type="dxa"/>
+            </w:tcMar>
+          </w:tcPr>
+          <w:p>
+            <w:pPr>
+              <w:spacing w:after="0"/>
+              <w:jc w:val="left"/>
+            </w:pPr>
+            <w:r>
+              <w:rPr>
+                <w:rFonts w:ascii="Arial" w:hAnsi="Arial" w:eastAsia="Arial"/>
+                <w:b w:val="0"/>
+                <w:color w:val="111827"/>
+                <w:sz w:val="16"/>
+              </w:rPr>
+              <w:t>ранний нишевый бизнес, имеет смысл при сильной удерживаемости</w:t>
+            </w:r>
+          </w:p>
+        </w:tc>
+      </w:tr>
+      <w:tr>
+        <w:tc>
+          <w:tcPr>
+            <w:tcW w:type="dxa" w:w="1337"/>
+            <w:vAlign w:val="center"/>
+            <w:tcMar>
+              <w:top w:w="80" w:type="dxa"/>
+              <w:start w:w="120" w:type="dxa"/>
+              <w:bottom w:w="80" w:type="dxa"/>
+              <w:end w:w="120" w:type="dxa"/>
+            </w:tcMar>
+            <w:shd w:fill="F8FAFC"/>
+          </w:tcPr>
+          <w:p>
+            <w:pPr>
+              <w:spacing w:after="0"/>
+              <w:jc w:val="left"/>
+            </w:pPr>
+            <w:r>
+              <w:rPr>
+                <w:rFonts w:ascii="Arial" w:hAnsi="Arial" w:eastAsia="Arial"/>
+                <w:b w:val="0"/>
+                <w:color w:val="111827"/>
+                <w:sz w:val="16"/>
+              </w:rPr>
+              <w:t>strong_niche</w:t>
+            </w:r>
+          </w:p>
+        </w:tc>
+        <w:tc>
+          <w:tcPr>
+            <w:tcW w:type="dxa" w:w="1337"/>
+            <w:vAlign w:val="center"/>
+            <w:tcMar>
+              <w:top w:w="80" w:type="dxa"/>
+              <w:start w:w="120" w:type="dxa"/>
+              <w:bottom w:w="80" w:type="dxa"/>
+              <w:end w:w="120" w:type="dxa"/>
+            </w:tcMar>
+            <w:shd w:fill="F8FAFC"/>
+          </w:tcPr>
+          <w:p>
+            <w:pPr>
+              <w:spacing w:after="0"/>
+              <w:jc w:val="left"/>
+            </w:pPr>
+            <w:r>
+              <w:rPr>
+                <w:rFonts w:ascii="Arial" w:hAnsi="Arial" w:eastAsia="Arial"/>
+                <w:b w:val="0"/>
+                <w:color w:val="111827"/>
+                <w:sz w:val="16"/>
+              </w:rPr>
+              <w:t>2,500,000</w:t>
+            </w:r>
+          </w:p>
+        </w:tc>
+        <w:tc>
+          <w:tcPr>
+            <w:tcW w:type="dxa" w:w="1337"/>
+            <w:vAlign w:val="center"/>
+            <w:tcMar>
+              <w:top w:w="80" w:type="dxa"/>
+              <w:start w:w="120" w:type="dxa"/>
+              <w:bottom w:w="80" w:type="dxa"/>
+              <w:end w:w="120" w:type="dxa"/>
+            </w:tcMar>
+            <w:shd w:fill="F8FAFC"/>
+          </w:tcPr>
+          <w:p>
+            <w:pPr>
+              <w:spacing w:after="0"/>
+              <w:jc w:val="left"/>
+            </w:pPr>
+            <w:r>
+              <w:rPr>
+                <w:rFonts w:ascii="Arial" w:hAnsi="Arial" w:eastAsia="Arial"/>
+                <w:b w:val="0"/>
+                <w:color w:val="111827"/>
+                <w:sz w:val="16"/>
+              </w:rPr>
+              <w:t>45%</w:t>
+            </w:r>
+          </w:p>
+        </w:tc>
+        <w:tc>
+          <w:tcPr>
+            <w:tcW w:type="dxa" w:w="1337"/>
+            <w:vAlign w:val="center"/>
+            <w:tcMar>
+              <w:top w:w="80" w:type="dxa"/>
+              <w:start w:w="120" w:type="dxa"/>
+              <w:bottom w:w="80" w:type="dxa"/>
+              <w:end w:w="120" w:type="dxa"/>
+            </w:tcMar>
+            <w:shd w:fill="F8FAFC"/>
+          </w:tcPr>
+          <w:p>
+            <w:pPr>
+              <w:spacing w:after="0"/>
+              <w:jc w:val="left"/>
+            </w:pPr>
+            <w:r>
+              <w:rPr>
+                <w:rFonts w:ascii="Arial" w:hAnsi="Arial" w:eastAsia="Arial"/>
+                <w:b w:val="0"/>
+                <w:color w:val="111827"/>
+                <w:sz w:val="16"/>
+              </w:rPr>
+              <w:t>7%</w:t>
+            </w:r>
+          </w:p>
+        </w:tc>
+        <w:tc>
+          <w:tcPr>
+            <w:tcW w:type="dxa" w:w="1337"/>
+            <w:vAlign w:val="center"/>
+            <w:tcMar>
+              <w:top w:w="80" w:type="dxa"/>
+              <w:start w:w="120" w:type="dxa"/>
+              <w:bottom w:w="80" w:type="dxa"/>
+              <w:end w:w="120" w:type="dxa"/>
+            </w:tcMar>
+            <w:shd w:fill="F8FAFC"/>
+          </w:tcPr>
+          <w:p>
+            <w:pPr>
+              <w:spacing w:after="0"/>
+              <w:jc w:val="left"/>
+            </w:pPr>
+            <w:r>
+              <w:rPr>
+                <w:rFonts w:ascii="Arial" w:hAnsi="Arial" w:eastAsia="Arial"/>
+                <w:b w:val="0"/>
+                <w:color w:val="111827"/>
+                <w:sz w:val="16"/>
+              </w:rPr>
+              <w:t>$95</w:t>
+            </w:r>
+          </w:p>
+        </w:tc>
+        <w:tc>
+          <w:tcPr>
+            <w:tcW w:type="dxa" w:w="1337"/>
+            <w:vAlign w:val="center"/>
+            <w:tcMar>
+              <w:top w:w="80" w:type="dxa"/>
+              <w:start w:w="120" w:type="dxa"/>
+              <w:bottom w:w="80" w:type="dxa"/>
+              <w:end w:w="120" w:type="dxa"/>
+            </w:tcMar>
+            <w:shd w:fill="F8FAFC"/>
+          </w:tcPr>
+          <w:p>
+            <w:pPr>
+              <w:spacing w:after="0"/>
+              <w:jc w:val="left"/>
+            </w:pPr>
+            <w:r>
+              <w:rPr>
+                <w:rFonts w:ascii="Arial" w:hAnsi="Arial" w:eastAsia="Arial"/>
+                <w:b w:val="0"/>
+                <w:color w:val="111827"/>
+                <w:sz w:val="16"/>
+              </w:rPr>
+              <w:t>$7.5M</w:t>
+            </w:r>
+          </w:p>
+        </w:tc>
+        <w:tc>
+          <w:tcPr>
+            <w:tcW w:type="dxa" w:w="1337"/>
+            <w:vAlign w:val="center"/>
+            <w:tcMar>
+              <w:top w:w="80" w:type="dxa"/>
+              <w:start w:w="120" w:type="dxa"/>
+              <w:bottom w:w="80" w:type="dxa"/>
+              <w:end w:w="120" w:type="dxa"/>
+            </w:tcMar>
+            <w:shd w:fill="F8FAFC"/>
+          </w:tcPr>
+          <w:p>
+            <w:pPr>
+              <w:spacing w:after="0"/>
+              <w:jc w:val="left"/>
+            </w:pPr>
+            <w:r>
+              <w:rPr>
+                <w:rFonts w:ascii="Arial" w:hAnsi="Arial" w:eastAsia="Arial"/>
+                <w:b w:val="0"/>
+                <w:color w:val="111827"/>
+                <w:sz w:val="16"/>
+              </w:rPr>
+              <w:t>venture-relevant только если retention и paid depth реально работают</w:t>
+            </w:r>
+          </w:p>
+        </w:tc>
+      </w:tr>
+      <w:tr>
+        <w:tc>
+          <w:tcPr>
+            <w:tcW w:type="dxa" w:w="1337"/>
+            <w:vAlign w:val="center"/>
+            <w:tcMar>
+              <w:top w:w="80" w:type="dxa"/>
+              <w:start w:w="120" w:type="dxa"/>
+              <w:bottom w:w="80" w:type="dxa"/>
+              <w:end w:w="120" w:type="dxa"/>
+            </w:tcMar>
+          </w:tcPr>
+          <w:p>
+            <w:pPr>
+              <w:spacing w:after="0"/>
+              <w:jc w:val="left"/>
+            </w:pPr>
+            <w:r>
+              <w:rPr>
+                <w:rFonts w:ascii="Arial" w:hAnsi="Arial" w:eastAsia="Arial"/>
+                <w:b w:val="0"/>
+                <w:color w:val="111827"/>
+                <w:sz w:val="16"/>
+              </w:rPr>
+              <w:t>upside</w:t>
+            </w:r>
+          </w:p>
+        </w:tc>
+        <w:tc>
+          <w:tcPr>
+            <w:tcW w:type="dxa" w:w="1337"/>
+            <w:vAlign w:val="center"/>
+            <w:tcMar>
+              <w:top w:w="80" w:type="dxa"/>
+              <w:start w:w="120" w:type="dxa"/>
+              <w:bottom w:w="80" w:type="dxa"/>
+              <w:end w:w="120" w:type="dxa"/>
+            </w:tcMar>
+          </w:tcPr>
+          <w:p>
+            <w:pPr>
+              <w:spacing w:after="0"/>
+              <w:jc w:val="left"/>
+            </w:pPr>
+            <w:r>
+              <w:rPr>
+                <w:rFonts w:ascii="Arial" w:hAnsi="Arial" w:eastAsia="Arial"/>
+                <w:b w:val="0"/>
+                <w:color w:val="111827"/>
+                <w:sz w:val="16"/>
+              </w:rPr>
+              <w:t>5,000,000</w:t>
+            </w:r>
+          </w:p>
+        </w:tc>
+        <w:tc>
+          <w:tcPr>
+            <w:tcW w:type="dxa" w:w="1337"/>
+            <w:vAlign w:val="center"/>
+            <w:tcMar>
+              <w:top w:w="80" w:type="dxa"/>
+              <w:start w:w="120" w:type="dxa"/>
+              <w:bottom w:w="80" w:type="dxa"/>
+              <w:end w:w="120" w:type="dxa"/>
+            </w:tcMar>
+          </w:tcPr>
+          <w:p>
+            <w:pPr>
+              <w:spacing w:after="0"/>
+              <w:jc w:val="left"/>
+            </w:pPr>
+            <w:r>
+              <w:rPr>
+                <w:rFonts w:ascii="Arial" w:hAnsi="Arial" w:eastAsia="Arial"/>
+                <w:b w:val="0"/>
+                <w:color w:val="111827"/>
+                <w:sz w:val="16"/>
+              </w:rPr>
+              <w:t>50%</w:t>
+            </w:r>
+          </w:p>
+        </w:tc>
+        <w:tc>
+          <w:tcPr>
+            <w:tcW w:type="dxa" w:w="1337"/>
+            <w:vAlign w:val="center"/>
+            <w:tcMar>
+              <w:top w:w="80" w:type="dxa"/>
+              <w:start w:w="120" w:type="dxa"/>
+              <w:bottom w:w="80" w:type="dxa"/>
+              <w:end w:w="120" w:type="dxa"/>
+            </w:tcMar>
+          </w:tcPr>
+          <w:p>
+            <w:pPr>
+              <w:spacing w:after="0"/>
+              <w:jc w:val="left"/>
+            </w:pPr>
+            <w:r>
+              <w:rPr>
+                <w:rFonts w:ascii="Arial" w:hAnsi="Arial" w:eastAsia="Arial"/>
+                <w:b w:val="0"/>
+                <w:color w:val="111827"/>
+                <w:sz w:val="16"/>
+              </w:rPr>
+              <w:t>9%</w:t>
+            </w:r>
+          </w:p>
+        </w:tc>
+        <w:tc>
+          <w:tcPr>
+            <w:tcW w:type="dxa" w:w="1337"/>
+            <w:vAlign w:val="center"/>
+            <w:tcMar>
+              <w:top w:w="80" w:type="dxa"/>
+              <w:start w:w="120" w:type="dxa"/>
+              <w:bottom w:w="80" w:type="dxa"/>
+              <w:end w:w="120" w:type="dxa"/>
+            </w:tcMar>
+          </w:tcPr>
+          <w:p>
+            <w:pPr>
+              <w:spacing w:after="0"/>
+              <w:jc w:val="left"/>
+            </w:pPr>
+            <w:r>
+              <w:rPr>
+                <w:rFonts w:ascii="Arial" w:hAnsi="Arial" w:eastAsia="Arial"/>
+                <w:b w:val="0"/>
+                <w:color w:val="111827"/>
+                <w:sz w:val="16"/>
+              </w:rPr>
+              <w:t>$110</w:t>
+            </w:r>
+          </w:p>
+        </w:tc>
+        <w:tc>
+          <w:tcPr>
+            <w:tcW w:type="dxa" w:w="1337"/>
+            <w:vAlign w:val="center"/>
+            <w:tcMar>
+              <w:top w:w="80" w:type="dxa"/>
+              <w:start w:w="120" w:type="dxa"/>
+              <w:bottom w:w="80" w:type="dxa"/>
+              <w:end w:w="120" w:type="dxa"/>
+            </w:tcMar>
+          </w:tcPr>
+          <w:p>
+            <w:pPr>
+              <w:spacing w:after="0"/>
+              <w:jc w:val="left"/>
+            </w:pPr>
+            <w:r>
+              <w:rPr>
+                <w:rFonts w:ascii="Arial" w:hAnsi="Arial" w:eastAsia="Arial"/>
+                <w:b w:val="0"/>
+                <w:color w:val="111827"/>
+                <w:sz w:val="16"/>
+              </w:rPr>
+              <w:t>$24.8M</w:t>
+            </w:r>
+          </w:p>
+        </w:tc>
+        <w:tc>
+          <w:tcPr>
+            <w:tcW w:type="dxa" w:w="1337"/>
+            <w:vAlign w:val="center"/>
+            <w:tcMar>
+              <w:top w:w="80" w:type="dxa"/>
+              <w:start w:w="120" w:type="dxa"/>
+              <w:bottom w:w="80" w:type="dxa"/>
+              <w:end w:w="120" w:type="dxa"/>
+            </w:tcMar>
+          </w:tcPr>
+          <w:p>
+            <w:pPr>
+              <w:spacing w:after="0"/>
+              <w:jc w:val="left"/>
+            </w:pPr>
+            <w:r>
+              <w:rPr>
+                <w:rFonts w:ascii="Arial" w:hAnsi="Arial" w:eastAsia="Arial"/>
+                <w:b w:val="0"/>
+                <w:color w:val="111827"/>
+                <w:sz w:val="16"/>
+              </w:rPr>
+              <w:t>крупный outcome требует доказанного distribution, retention и WTP</w:t>
+            </w:r>
+          </w:p>
+        </w:tc>
+      </w:tr>
+      <w:tr>
+        <w:tc>
+          <w:tcPr>
+            <w:tcW w:type="dxa" w:w="1337"/>
+            <w:vAlign w:val="center"/>
+            <w:tcMar>
+              <w:top w:w="80" w:type="dxa"/>
+              <w:start w:w="120" w:type="dxa"/>
+              <w:bottom w:w="80" w:type="dxa"/>
+              <w:end w:w="120" w:type="dxa"/>
+            </w:tcMar>
+            <w:shd w:fill="F8FAFC"/>
+          </w:tcPr>
+          <w:p>
+            <w:pPr>
+              <w:spacing w:after="0"/>
+              <w:jc w:val="left"/>
+            </w:pPr>
+            <w:r>
+              <w:rPr>
+                <w:rFonts w:ascii="Arial" w:hAnsi="Arial" w:eastAsia="Arial"/>
+                <w:b w:val="0"/>
+                <w:color w:val="111827"/>
+                <w:sz w:val="16"/>
+              </w:rPr>
+              <w:t>breakout</w:t>
+            </w:r>
+          </w:p>
+        </w:tc>
+        <w:tc>
+          <w:tcPr>
+            <w:tcW w:type="dxa" w:w="1337"/>
+            <w:vAlign w:val="center"/>
+            <w:tcMar>
+              <w:top w:w="80" w:type="dxa"/>
+              <w:start w:w="120" w:type="dxa"/>
+              <w:bottom w:w="80" w:type="dxa"/>
+              <w:end w:w="120" w:type="dxa"/>
+            </w:tcMar>
+            <w:shd w:fill="F8FAFC"/>
+          </w:tcPr>
+          <w:p>
+            <w:pPr>
+              <w:spacing w:after="0"/>
+              <w:jc w:val="left"/>
+            </w:pPr>
+            <w:r>
+              <w:rPr>
+                <w:rFonts w:ascii="Arial" w:hAnsi="Arial" w:eastAsia="Arial"/>
+                <w:b w:val="0"/>
+                <w:color w:val="111827"/>
+                <w:sz w:val="16"/>
+              </w:rPr>
+              <w:t>10,000,000</w:t>
+            </w:r>
+          </w:p>
+        </w:tc>
+        <w:tc>
+          <w:tcPr>
+            <w:tcW w:type="dxa" w:w="1337"/>
+            <w:vAlign w:val="center"/>
+            <w:tcMar>
+              <w:top w:w="80" w:type="dxa"/>
+              <w:start w:w="120" w:type="dxa"/>
+              <w:bottom w:w="80" w:type="dxa"/>
+              <w:end w:w="120" w:type="dxa"/>
+            </w:tcMar>
+            <w:shd w:fill="F8FAFC"/>
+          </w:tcPr>
+          <w:p>
+            <w:pPr>
+              <w:spacing w:after="0"/>
+              <w:jc w:val="left"/>
+            </w:pPr>
+            <w:r>
+              <w:rPr>
+                <w:rFonts w:ascii="Arial" w:hAnsi="Arial" w:eastAsia="Arial"/>
+                <w:b w:val="0"/>
+                <w:color w:val="111827"/>
+                <w:sz w:val="16"/>
+              </w:rPr>
+              <w:t>55%</w:t>
+            </w:r>
+          </w:p>
+        </w:tc>
+        <w:tc>
+          <w:tcPr>
+            <w:tcW w:type="dxa" w:w="1337"/>
+            <w:vAlign w:val="center"/>
+            <w:tcMar>
+              <w:top w:w="80" w:type="dxa"/>
+              <w:start w:w="120" w:type="dxa"/>
+              <w:bottom w:w="80" w:type="dxa"/>
+              <w:end w:w="120" w:type="dxa"/>
+            </w:tcMar>
+            <w:shd w:fill="F8FAFC"/>
+          </w:tcPr>
+          <w:p>
+            <w:pPr>
+              <w:spacing w:after="0"/>
+              <w:jc w:val="left"/>
+            </w:pPr>
+            <w:r>
+              <w:rPr>
+                <w:rFonts w:ascii="Arial" w:hAnsi="Arial" w:eastAsia="Arial"/>
+                <w:b w:val="0"/>
+                <w:color w:val="111827"/>
+                <w:sz w:val="16"/>
+              </w:rPr>
+              <w:t>11%</w:t>
+            </w:r>
+          </w:p>
+        </w:tc>
+        <w:tc>
+          <w:tcPr>
+            <w:tcW w:type="dxa" w:w="1337"/>
+            <w:vAlign w:val="center"/>
+            <w:tcMar>
+              <w:top w:w="80" w:type="dxa"/>
+              <w:start w:w="120" w:type="dxa"/>
+              <w:bottom w:w="80" w:type="dxa"/>
+              <w:end w:w="120" w:type="dxa"/>
+            </w:tcMar>
+            <w:shd w:fill="F8FAFC"/>
+          </w:tcPr>
+          <w:p>
+            <w:pPr>
+              <w:spacing w:after="0"/>
+              <w:jc w:val="left"/>
+            </w:pPr>
+            <w:r>
+              <w:rPr>
+                <w:rFonts w:ascii="Arial" w:hAnsi="Arial" w:eastAsia="Arial"/>
+                <w:b w:val="0"/>
+                <w:color w:val="111827"/>
+                <w:sz w:val="16"/>
+              </w:rPr>
+              <w:t>$125</w:t>
+            </w:r>
+          </w:p>
+        </w:tc>
+        <w:tc>
+          <w:tcPr>
+            <w:tcW w:type="dxa" w:w="1337"/>
+            <w:vAlign w:val="center"/>
+            <w:tcMar>
+              <w:top w:w="80" w:type="dxa"/>
+              <w:start w:w="120" w:type="dxa"/>
+              <w:bottom w:w="80" w:type="dxa"/>
+              <w:end w:w="120" w:type="dxa"/>
+            </w:tcMar>
+            <w:shd w:fill="F8FAFC"/>
+          </w:tcPr>
+          <w:p>
+            <w:pPr>
+              <w:spacing w:after="0"/>
+              <w:jc w:val="left"/>
+            </w:pPr>
+            <w:r>
+              <w:rPr>
+                <w:rFonts w:ascii="Arial" w:hAnsi="Arial" w:eastAsia="Arial"/>
+                <w:b w:val="0"/>
+                <w:color w:val="111827"/>
+                <w:sz w:val="16"/>
+              </w:rPr>
+              <w:t>$75.6M</w:t>
+            </w:r>
+          </w:p>
+        </w:tc>
+        <w:tc>
+          <w:tcPr>
+            <w:tcW w:type="dxa" w:w="1337"/>
+            <w:vAlign w:val="center"/>
+            <w:tcMar>
+              <w:top w:w="80" w:type="dxa"/>
+              <w:start w:w="120" w:type="dxa"/>
+              <w:bottom w:w="80" w:type="dxa"/>
+              <w:end w:w="120" w:type="dxa"/>
+            </w:tcMar>
+            <w:shd w:fill="F8FAFC"/>
+          </w:tcPr>
+          <w:p>
+            <w:pPr>
+              <w:spacing w:after="0"/>
+              <w:jc w:val="left"/>
+            </w:pPr>
+            <w:r>
+              <w:rPr>
+                <w:rFonts w:ascii="Arial" w:hAnsi="Arial" w:eastAsia="Arial"/>
+                <w:b w:val="0"/>
+                <w:color w:val="111827"/>
+                <w:sz w:val="16"/>
+              </w:rPr>
+              <w:t>крупный outcome требует доказанного distribution, retention и WTP</w:t>
+            </w:r>
+          </w:p>
+        </w:tc>
+      </w:tr>
+    </w:tbl>
+    <w:p/>
     <w:p>
       <w:pPr>
         <w:pStyle w:val="Heading1"/>
@@ -13892,7 +16505,7 @@
                 <w:color w:val="111827"/>
                 <w:sz w:val="16"/>
               </w:rPr>
-              <w:t>459 manifest artifacts; missing=0</w:t>
+              <w:t>462 manifest artifacts; missing=0</w:t>
             </w:r>
           </w:p>
         </w:tc>
@@ -14039,6 +16652,15 @@
       </w:pPr>
       <w:r>
         <w:t>data_processed/global_next_validation_backlog.csv</w:t>
+      </w:r>
+    </w:p>
+    <w:p>
+      <w:pPr>
+        <w:pStyle w:val="ListBullet"/>
+        <w:spacing w:after="80"/>
+      </w:pPr>
+      <w:r>
+        <w:t>data_processed/global_market_sizing_methodology.csv</w:t>
       </w:r>
     </w:p>
     <w:p>

</xml_diff>

<commit_message>
Add global whitespace audience synthesis
</commit_message>
<xml_diff>
--- a/output/docx/alina-global-hypothesis-report-v1.docx
+++ b/output/docx/alina-global-hypothesis-report-v1.docx
@@ -31,7 +31,7 @@
     </w:p>
     <w:p>
       <w:r>
-        <w:t>Собрано: 2026-05-31T15:19:47.884Z</w:t>
+        <w:t>Собрано: 2026-05-31T15:23:55.851Z</w:t>
       </w:r>
     </w:p>
     <w:p>
@@ -59,7 +59,7 @@
     </w:p>
     <w:p>
       <w:r>
-        <w:t>На текущем этапе собрано 67,525 сырьевых source-строк, 36,694 уникализированных строк и 462 локальных артефактов. Эти данные нужны не для того, чтобы объявить продукт доказанным, а для последовательной проверки: существует ли рынок, есть ли деньги, насколько плотна конкуренция, где может быть белое пятно, кто аудитория и какую MVP-петлю надо тестировать.</w:t>
+        <w:t>На текущем этапе собрано 67,525 сырьевых source-строк, 36,694 уникализированных строк и 465 локальных артефактов. Эти данные нужны не для того, чтобы объявить продукт доказанным, а для последовательной проверки: существует ли рынок, есть ли деньги, насколько плотна конкуренция, где может быть белое пятно, кто аудитория и какую MVP-петлю надо тестировать.</w:t>
       </w:r>
     </w:p>
     <w:p>
@@ -8416,6 +8416,886 @@
     <w:p>
       <w:r>
         <w:t>Наиболее перспективная формулировка белого пятна: не “новый wellness app”, а короткая трансформационная петля с причинным visual feedback. Если прогресс меняется произвольно, продукт станет декоративным avatar toy. Если действие никак не связано со смыслом, продукт станет обычным habit tracker. Если reset живет отдельно, продукт станет библиотекой практик. Поэтому отличие должно проверяться именно на связке, а не на отдельных функциях.</w:t>
+      </w:r>
+    </w:p>
+    <w:p>
+      <w:pPr>
+        <w:pStyle w:val="Heading1"/>
+      </w:pPr>
+      <w:r>
+        <w:t>СВЯЗКА WHITESPACE И АУДИТОРИИ</w:t>
+      </w:r>
+    </w:p>
+    <w:p>
+      <w:r>
+        <w:t>Белое пятно нельзя оценивать отдельно от аудитории. Даже если full-loop candidates редки, это становится продуктовой возможностью только там, где есть люди с recent behavior, current workaround и языком боли. Поэтому следующий слой соединяет H3 и H5: по каждому мировому направлению видно, какой разрыв найден в конкурентной среде, какой ICP туда ложится и какой первый validation move нужен.</w:t>
+      </w:r>
+    </w:p>
+    <w:tbl>
+      <w:tblPr>
+        <w:tblW w:type="dxa" w:w="9360"/>
+        <w:jc w:val="left"/>
+        <w:tblLayout w:type="fixed"/>
+        <w:tblLook w:firstColumn="1" w:firstRow="1" w:lastColumn="0" w:lastRow="0" w:noHBand="0" w:noVBand="1" w:val="04A0"/>
+        <w:tblInd w:w="120" w:type="dxa"/>
+        <w:tblBorders>
+          <w:top w:val="single" w:sz="4" w:space="0" w:color="CBD5E1"/>
+          <w:left w:val="single" w:sz="4" w:space="0" w:color="CBD5E1"/>
+          <w:bottom w:val="single" w:sz="4" w:space="0" w:color="CBD5E1"/>
+          <w:right w:val="single" w:sz="4" w:space="0" w:color="CBD5E1"/>
+          <w:insideH w:val="single" w:sz="4" w:space="0" w:color="CBD5E1"/>
+          <w:insideV w:val="single" w:sz="4" w:space="0" w:color="CBD5E1"/>
+        </w:tblBorders>
+      </w:tblPr>
+      <w:tblGrid>
+        <w:gridCol w:w="1872"/>
+        <w:gridCol w:w="1872"/>
+        <w:gridCol w:w="1872"/>
+        <w:gridCol w:w="1872"/>
+        <w:gridCol w:w="1872"/>
+      </w:tblGrid>
+      <w:tr>
+        <w:tc>
+          <w:tcPr>
+            <w:tcW w:type="dxa" w:w="2376"/>
+            <w:vAlign w:val="center"/>
+            <w:tcMar>
+              <w:top w:w="80" w:type="dxa"/>
+              <w:start w:w="120" w:type="dxa"/>
+              <w:bottom w:w="80" w:type="dxa"/>
+              <w:end w:w="120" w:type="dxa"/>
+            </w:tcMar>
+            <w:shd w:fill="E8EEF5"/>
+          </w:tcPr>
+          <w:p>
+            <w:pPr>
+              <w:spacing w:after="0"/>
+              <w:jc w:val="left"/>
+            </w:pPr>
+            <w:r>
+              <w:rPr>
+                <w:rFonts w:ascii="Arial" w:hAnsi="Arial" w:eastAsia="Arial"/>
+                <w:b/>
+                <w:color w:val="111827"/>
+                <w:sz w:val="16"/>
+              </w:rPr>
+              <w:t>Рынок</w:t>
+            </w:r>
+          </w:p>
+        </w:tc>
+        <w:tc>
+          <w:tcPr>
+            <w:tcW w:type="dxa" w:w="1224"/>
+            <w:vAlign w:val="center"/>
+            <w:tcMar>
+              <w:top w:w="80" w:type="dxa"/>
+              <w:start w:w="120" w:type="dxa"/>
+              <w:bottom w:w="80" w:type="dxa"/>
+              <w:end w:w="120" w:type="dxa"/>
+            </w:tcMar>
+            <w:shd w:fill="E8EEF5"/>
+          </w:tcPr>
+          <w:p>
+            <w:pPr>
+              <w:spacing w:after="0"/>
+              <w:jc w:val="left"/>
+            </w:pPr>
+            <w:r>
+              <w:rPr>
+                <w:rFonts w:ascii="Arial" w:hAnsi="Arial" w:eastAsia="Arial"/>
+                <w:b/>
+                <w:color w:val="111827"/>
+                <w:sz w:val="16"/>
+              </w:rPr>
+              <w:t>Full-loop rate</w:t>
+            </w:r>
+          </w:p>
+        </w:tc>
+        <w:tc>
+          <w:tcPr>
+            <w:tcW w:type="dxa" w:w="1224"/>
+            <w:vAlign w:val="center"/>
+            <w:tcMar>
+              <w:top w:w="80" w:type="dxa"/>
+              <w:start w:w="120" w:type="dxa"/>
+              <w:bottom w:w="80" w:type="dxa"/>
+              <w:end w:w="120" w:type="dxa"/>
+            </w:tcMar>
+            <w:shd w:fill="E8EEF5"/>
+          </w:tcPr>
+          <w:p>
+            <w:pPr>
+              <w:spacing w:after="0"/>
+              <w:jc w:val="left"/>
+            </w:pPr>
+            <w:r>
+              <w:rPr>
+                <w:rFonts w:ascii="Arial" w:hAnsi="Arial" w:eastAsia="Arial"/>
+                <w:b/>
+                <w:color w:val="111827"/>
+                <w:sz w:val="16"/>
+              </w:rPr>
+              <w:t>Whitespace read</w:t>
+            </w:r>
+          </w:p>
+        </w:tc>
+        <w:tc>
+          <w:tcPr>
+            <w:tcW w:type="dxa" w:w="1944"/>
+            <w:vAlign w:val="center"/>
+            <w:tcMar>
+              <w:top w:w="80" w:type="dxa"/>
+              <w:start w:w="120" w:type="dxa"/>
+              <w:bottom w:w="80" w:type="dxa"/>
+              <w:end w:w="120" w:type="dxa"/>
+            </w:tcMar>
+            <w:shd w:fill="E8EEF5"/>
+          </w:tcPr>
+          <w:p>
+            <w:pPr>
+              <w:spacing w:after="0"/>
+              <w:jc w:val="left"/>
+            </w:pPr>
+            <w:r>
+              <w:rPr>
+                <w:rFonts w:ascii="Arial" w:hAnsi="Arial" w:eastAsia="Arial"/>
+                <w:b/>
+                <w:color w:val="111827"/>
+                <w:sz w:val="16"/>
+              </w:rPr>
+              <w:t>ICP fit</w:t>
+            </w:r>
+          </w:p>
+        </w:tc>
+        <w:tc>
+          <w:tcPr>
+            <w:tcW w:type="dxa" w:w="2592"/>
+            <w:vAlign w:val="center"/>
+            <w:tcMar>
+              <w:top w:w="80" w:type="dxa"/>
+              <w:start w:w="120" w:type="dxa"/>
+              <w:bottom w:w="80" w:type="dxa"/>
+              <w:end w:w="120" w:type="dxa"/>
+            </w:tcMar>
+            <w:shd w:fill="E8EEF5"/>
+          </w:tcPr>
+          <w:p>
+            <w:pPr>
+              <w:spacing w:after="0"/>
+              <w:jc w:val="left"/>
+            </w:pPr>
+            <w:r>
+              <w:rPr>
+                <w:rFonts w:ascii="Arial" w:hAnsi="Arial" w:eastAsia="Arial"/>
+                <w:b/>
+                <w:color w:val="111827"/>
+                <w:sz w:val="16"/>
+              </w:rPr>
+              <w:t>Первый validation move</w:t>
+            </w:r>
+          </w:p>
+        </w:tc>
+      </w:tr>
+      <w:tr>
+        <w:tc>
+          <w:tcPr>
+            <w:tcW w:type="dxa" w:w="2376"/>
+            <w:vAlign w:val="center"/>
+            <w:tcMar>
+              <w:top w:w="80" w:type="dxa"/>
+              <w:start w:w="120" w:type="dxa"/>
+              <w:bottom w:w="80" w:type="dxa"/>
+              <w:end w:w="120" w:type="dxa"/>
+            </w:tcMar>
+          </w:tcPr>
+          <w:p>
+            <w:pPr>
+              <w:spacing w:after="0"/>
+              <w:jc w:val="left"/>
+            </w:pPr>
+            <w:r>
+              <w:rPr>
+                <w:rFonts w:ascii="Arial" w:hAnsi="Arial" w:eastAsia="Arial"/>
+                <w:b w:val="0"/>
+                <w:color w:val="111827"/>
+                <w:sz w:val="16"/>
+              </w:rPr>
+              <w:t>Mindfulness / reset</w:t>
+            </w:r>
+          </w:p>
+        </w:tc>
+        <w:tc>
+          <w:tcPr>
+            <w:tcW w:type="dxa" w:w="1224"/>
+            <w:vAlign w:val="center"/>
+            <w:tcMar>
+              <w:top w:w="80" w:type="dxa"/>
+              <w:start w:w="120" w:type="dxa"/>
+              <w:bottom w:w="80" w:type="dxa"/>
+              <w:end w:w="120" w:type="dxa"/>
+            </w:tcMar>
+          </w:tcPr>
+          <w:p>
+            <w:pPr>
+              <w:spacing w:after="0"/>
+              <w:jc w:val="left"/>
+            </w:pPr>
+            <w:r>
+              <w:rPr>
+                <w:rFonts w:ascii="Arial" w:hAnsi="Arial" w:eastAsia="Arial"/>
+                <w:b w:val="0"/>
+                <w:color w:val="111827"/>
+                <w:sz w:val="16"/>
+              </w:rPr>
+              <w:t>3.82%</w:t>
+            </w:r>
+          </w:p>
+        </w:tc>
+        <w:tc>
+          <w:tcPr>
+            <w:tcW w:type="dxa" w:w="1224"/>
+            <w:vAlign w:val="center"/>
+            <w:tcMar>
+              <w:top w:w="80" w:type="dxa"/>
+              <w:start w:w="120" w:type="dxa"/>
+              <w:bottom w:w="80" w:type="dxa"/>
+              <w:end w:w="120" w:type="dxa"/>
+            </w:tcMar>
+          </w:tcPr>
+          <w:p>
+            <w:pPr>
+              <w:spacing w:after="0"/>
+              <w:jc w:val="left"/>
+            </w:pPr>
+            <w:r>
+              <w:rPr>
+                <w:rFonts w:ascii="Arial" w:hAnsi="Arial" w:eastAsia="Arial"/>
+                <w:b w:val="0"/>
+                <w:color w:val="111827"/>
+                <w:sz w:val="16"/>
+              </w:rPr>
+              <w:t>узкое белое пятно выглядит правдоподобно: full-loop candidates редки, но нужен P0 walkthrough</w:t>
+            </w:r>
+          </w:p>
+        </w:tc>
+        <w:tc>
+          <w:tcPr>
+            <w:tcW w:type="dxa" w:w="1944"/>
+            <w:vAlign w:val="center"/>
+            <w:tcMar>
+              <w:top w:w="80" w:type="dxa"/>
+              <w:start w:w="120" w:type="dxa"/>
+              <w:bottom w:w="80" w:type="dxa"/>
+              <w:end w:w="120" w:type="dxa"/>
+            </w:tcMar>
+          </w:tcPr>
+          <w:p>
+            <w:pPr>
+              <w:spacing w:after="0"/>
+              <w:jc w:val="left"/>
+            </w:pPr>
+            <w:r>
+              <w:rPr>
+                <w:rFonts w:ascii="Arial" w:hAnsi="Arial" w:eastAsia="Arial"/>
+                <w:b w:val="0"/>
+                <w:color w:val="111827"/>
+                <w:sz w:val="16"/>
+              </w:rPr>
+              <w:t>ICP_D: Habit and progress users / ICP_C: Anxious daily reset users</w:t>
+            </w:r>
+          </w:p>
+        </w:tc>
+        <w:tc>
+          <w:tcPr>
+            <w:tcW w:type="dxa" w:w="2592"/>
+            <w:vAlign w:val="center"/>
+            <w:tcMar>
+              <w:top w:w="80" w:type="dxa"/>
+              <w:start w:w="120" w:type="dxa"/>
+              <w:bottom w:w="80" w:type="dxa"/>
+              <w:end w:w="120" w:type="dxa"/>
+            </w:tcMar>
+          </w:tcPr>
+          <w:p>
+            <w:pPr>
+              <w:spacing w:after="0"/>
+              <w:jc w:val="left"/>
+            </w:pPr>
+            <w:r>
+              <w:rPr>
+                <w:rFonts w:ascii="Arial" w:hAnsi="Arial" w:eastAsia="Arial"/>
+                <w:b w:val="0"/>
+                <w:color w:val="111827"/>
+                <w:sz w:val="16"/>
+              </w:rPr>
+              <w:t>сначала проверить P0-аудиторию через recent behavior интервью, затем walkthrough high-risk конкурентов</w:t>
+            </w:r>
+          </w:p>
+        </w:tc>
+      </w:tr>
+      <w:tr>
+        <w:tc>
+          <w:tcPr>
+            <w:tcW w:type="dxa" w:w="2376"/>
+            <w:vAlign w:val="center"/>
+            <w:tcMar>
+              <w:top w:w="80" w:type="dxa"/>
+              <w:start w:w="120" w:type="dxa"/>
+              <w:bottom w:w="80" w:type="dxa"/>
+              <w:end w:w="120" w:type="dxa"/>
+            </w:tcMar>
+            <w:shd w:fill="F8FAFC"/>
+          </w:tcPr>
+          <w:p>
+            <w:pPr>
+              <w:spacing w:after="0"/>
+              <w:jc w:val="left"/>
+            </w:pPr>
+            <w:r>
+              <w:rPr>
+                <w:rFonts w:ascii="Arial" w:hAnsi="Arial" w:eastAsia="Arial"/>
+                <w:b w:val="0"/>
+                <w:color w:val="111827"/>
+                <w:sz w:val="16"/>
+              </w:rPr>
+              <w:t>Avatar / identity</w:t>
+            </w:r>
+          </w:p>
+        </w:tc>
+        <w:tc>
+          <w:tcPr>
+            <w:tcW w:type="dxa" w:w="1224"/>
+            <w:vAlign w:val="center"/>
+            <w:tcMar>
+              <w:top w:w="80" w:type="dxa"/>
+              <w:start w:w="120" w:type="dxa"/>
+              <w:bottom w:w="80" w:type="dxa"/>
+              <w:end w:w="120" w:type="dxa"/>
+            </w:tcMar>
+            <w:shd w:fill="F8FAFC"/>
+          </w:tcPr>
+          <w:p>
+            <w:pPr>
+              <w:spacing w:after="0"/>
+              <w:jc w:val="left"/>
+            </w:pPr>
+            <w:r>
+              <w:rPr>
+                <w:rFonts w:ascii="Arial" w:hAnsi="Arial" w:eastAsia="Arial"/>
+                <w:b w:val="0"/>
+                <w:color w:val="111827"/>
+                <w:sz w:val="16"/>
+              </w:rPr>
+              <w:t>2.83%</w:t>
+            </w:r>
+          </w:p>
+        </w:tc>
+        <w:tc>
+          <w:tcPr>
+            <w:tcW w:type="dxa" w:w="1224"/>
+            <w:vAlign w:val="center"/>
+            <w:tcMar>
+              <w:top w:w="80" w:type="dxa"/>
+              <w:start w:w="120" w:type="dxa"/>
+              <w:bottom w:w="80" w:type="dxa"/>
+              <w:end w:w="120" w:type="dxa"/>
+            </w:tcMar>
+            <w:shd w:fill="F8FAFC"/>
+          </w:tcPr>
+          <w:p>
+            <w:pPr>
+              <w:spacing w:after="0"/>
+              <w:jc w:val="left"/>
+            </w:pPr>
+            <w:r>
+              <w:rPr>
+                <w:rFonts w:ascii="Arial" w:hAnsi="Arial" w:eastAsia="Arial"/>
+                <w:b w:val="0"/>
+                <w:color w:val="111827"/>
+                <w:sz w:val="16"/>
+              </w:rPr>
+              <w:t>узкое белое пятно выглядит правдоподобно: full-loop candidates редки, но нужен P0 walkthrough</w:t>
+            </w:r>
+          </w:p>
+        </w:tc>
+        <w:tc>
+          <w:tcPr>
+            <w:tcW w:type="dxa" w:w="1944"/>
+            <w:vAlign w:val="center"/>
+            <w:tcMar>
+              <w:top w:w="80" w:type="dxa"/>
+              <w:start w:w="120" w:type="dxa"/>
+              <w:bottom w:w="80" w:type="dxa"/>
+              <w:end w:w="120" w:type="dxa"/>
+            </w:tcMar>
+            <w:shd w:fill="F8FAFC"/>
+          </w:tcPr>
+          <w:p>
+            <w:pPr>
+              <w:spacing w:after="0"/>
+              <w:jc w:val="left"/>
+            </w:pPr>
+            <w:r>
+              <w:rPr>
+                <w:rFonts w:ascii="Arial" w:hAnsi="Arial" w:eastAsia="Arial"/>
+                <w:b w:val="0"/>
+                <w:color w:val="111827"/>
+                <w:sz w:val="16"/>
+              </w:rPr>
+              <w:t>ICP_E: Cozy/casual progression users / ICP_B: Avatar identity builders</w:t>
+            </w:r>
+          </w:p>
+        </w:tc>
+        <w:tc>
+          <w:tcPr>
+            <w:tcW w:type="dxa" w:w="2592"/>
+            <w:vAlign w:val="center"/>
+            <w:tcMar>
+              <w:top w:w="80" w:type="dxa"/>
+              <w:start w:w="120" w:type="dxa"/>
+              <w:bottom w:w="80" w:type="dxa"/>
+              <w:end w:w="120" w:type="dxa"/>
+            </w:tcMar>
+            <w:shd w:fill="F8FAFC"/>
+          </w:tcPr>
+          <w:p>
+            <w:pPr>
+              <w:spacing w:after="0"/>
+              <w:jc w:val="left"/>
+            </w:pPr>
+            <w:r>
+              <w:rPr>
+                <w:rFonts w:ascii="Arial" w:hAnsi="Arial" w:eastAsia="Arial"/>
+                <w:b w:val="0"/>
+                <w:color w:val="111827"/>
+                <w:sz w:val="16"/>
+              </w:rPr>
+              <w:t>использовать как compare-сегмент после P0 ICP и high-risk competitor walkthrough</w:t>
+            </w:r>
+          </w:p>
+        </w:tc>
+      </w:tr>
+      <w:tr>
+        <w:tc>
+          <w:tcPr>
+            <w:tcW w:type="dxa" w:w="2376"/>
+            <w:vAlign w:val="center"/>
+            <w:tcMar>
+              <w:top w:w="80" w:type="dxa"/>
+              <w:start w:w="120" w:type="dxa"/>
+              <w:bottom w:w="80" w:type="dxa"/>
+              <w:end w:w="120" w:type="dxa"/>
+            </w:tcMar>
+          </w:tcPr>
+          <w:p>
+            <w:pPr>
+              <w:spacing w:after="0"/>
+              <w:jc w:val="left"/>
+            </w:pPr>
+            <w:r>
+              <w:rPr>
+                <w:rFonts w:ascii="Arial" w:hAnsi="Arial" w:eastAsia="Arial"/>
+                <w:b w:val="0"/>
+                <w:color w:val="111827"/>
+                <w:sz w:val="16"/>
+              </w:rPr>
+              <w:t>Gaming / progression benchmark</w:t>
+            </w:r>
+          </w:p>
+        </w:tc>
+        <w:tc>
+          <w:tcPr>
+            <w:tcW w:type="dxa" w:w="1224"/>
+            <w:vAlign w:val="center"/>
+            <w:tcMar>
+              <w:top w:w="80" w:type="dxa"/>
+              <w:start w:w="120" w:type="dxa"/>
+              <w:bottom w:w="80" w:type="dxa"/>
+              <w:end w:w="120" w:type="dxa"/>
+            </w:tcMar>
+          </w:tcPr>
+          <w:p>
+            <w:pPr>
+              <w:spacing w:after="0"/>
+              <w:jc w:val="left"/>
+            </w:pPr>
+            <w:r>
+              <w:rPr>
+                <w:rFonts w:ascii="Arial" w:hAnsi="Arial" w:eastAsia="Arial"/>
+                <w:b w:val="0"/>
+                <w:color w:val="111827"/>
+                <w:sz w:val="16"/>
+              </w:rPr>
+              <w:t>1.03%</w:t>
+            </w:r>
+          </w:p>
+        </w:tc>
+        <w:tc>
+          <w:tcPr>
+            <w:tcW w:type="dxa" w:w="1224"/>
+            <w:vAlign w:val="center"/>
+            <w:tcMar>
+              <w:top w:w="80" w:type="dxa"/>
+              <w:start w:w="120" w:type="dxa"/>
+              <w:bottom w:w="80" w:type="dxa"/>
+              <w:end w:w="120" w:type="dxa"/>
+            </w:tcMar>
+          </w:tcPr>
+          <w:p>
+            <w:pPr>
+              <w:spacing w:after="0"/>
+              <w:jc w:val="left"/>
+            </w:pPr>
+            <w:r>
+              <w:rPr>
+                <w:rFonts w:ascii="Arial" w:hAnsi="Arial" w:eastAsia="Arial"/>
+                <w:b w:val="0"/>
+                <w:color w:val="111827"/>
+                <w:sz w:val="16"/>
+              </w:rPr>
+              <w:t>использовать как источник механик прогресса и возврата, но не как прямое доказательство whitespace Alina</w:t>
+            </w:r>
+          </w:p>
+        </w:tc>
+        <w:tc>
+          <w:tcPr>
+            <w:tcW w:type="dxa" w:w="1944"/>
+            <w:vAlign w:val="center"/>
+            <w:tcMar>
+              <w:top w:w="80" w:type="dxa"/>
+              <w:start w:w="120" w:type="dxa"/>
+              <w:bottom w:w="80" w:type="dxa"/>
+              <w:end w:w="120" w:type="dxa"/>
+            </w:tcMar>
+          </w:tcPr>
+          <w:p>
+            <w:pPr>
+              <w:spacing w:after="0"/>
+              <w:jc w:val="left"/>
+            </w:pPr>
+            <w:r>
+              <w:rPr>
+                <w:rFonts w:ascii="Arial" w:hAnsi="Arial" w:eastAsia="Arial"/>
+                <w:b w:val="0"/>
+                <w:color w:val="111827"/>
+                <w:sz w:val="16"/>
+              </w:rPr>
+              <w:t>ICP_E: Cozy/casual progression users</w:t>
+            </w:r>
+          </w:p>
+        </w:tc>
+        <w:tc>
+          <w:tcPr>
+            <w:tcW w:type="dxa" w:w="2592"/>
+            <w:vAlign w:val="center"/>
+            <w:tcMar>
+              <w:top w:w="80" w:type="dxa"/>
+              <w:start w:w="120" w:type="dxa"/>
+              <w:bottom w:w="80" w:type="dxa"/>
+              <w:end w:w="120" w:type="dxa"/>
+            </w:tcMar>
+          </w:tcPr>
+          <w:p>
+            <w:pPr>
+              <w:spacing w:after="0"/>
+              <w:jc w:val="left"/>
+            </w:pPr>
+            <w:r>
+              <w:rPr>
+                <w:rFonts w:ascii="Arial" w:hAnsi="Arial" w:eastAsia="Arial"/>
+                <w:b w:val="0"/>
+                <w:color w:val="111827"/>
+                <w:sz w:val="16"/>
+              </w:rPr>
+              <w:t>взять progression/avatar/retention паттерны в прототип, но не использовать gaming как H3 proof</w:t>
+            </w:r>
+          </w:p>
+        </w:tc>
+      </w:tr>
+      <w:tr>
+        <w:tc>
+          <w:tcPr>
+            <w:tcW w:type="dxa" w:w="2376"/>
+            <w:vAlign w:val="center"/>
+            <w:tcMar>
+              <w:top w:w="80" w:type="dxa"/>
+              <w:start w:w="120" w:type="dxa"/>
+              <w:bottom w:w="80" w:type="dxa"/>
+              <w:end w:w="120" w:type="dxa"/>
+            </w:tcMar>
+            <w:shd w:fill="F8FAFC"/>
+          </w:tcPr>
+          <w:p>
+            <w:pPr>
+              <w:spacing w:after="0"/>
+              <w:jc w:val="left"/>
+            </w:pPr>
+            <w:r>
+              <w:rPr>
+                <w:rFonts w:ascii="Arial" w:hAnsi="Arial" w:eastAsia="Arial"/>
+                <w:b w:val="0"/>
+                <w:color w:val="111827"/>
+                <w:sz w:val="16"/>
+              </w:rPr>
+              <w:t>Coaching / self-improvement</w:t>
+            </w:r>
+          </w:p>
+        </w:tc>
+        <w:tc>
+          <w:tcPr>
+            <w:tcW w:type="dxa" w:w="1224"/>
+            <w:vAlign w:val="center"/>
+            <w:tcMar>
+              <w:top w:w="80" w:type="dxa"/>
+              <w:start w:w="120" w:type="dxa"/>
+              <w:bottom w:w="80" w:type="dxa"/>
+              <w:end w:w="120" w:type="dxa"/>
+            </w:tcMar>
+            <w:shd w:fill="F8FAFC"/>
+          </w:tcPr>
+          <w:p>
+            <w:pPr>
+              <w:spacing w:after="0"/>
+              <w:jc w:val="left"/>
+            </w:pPr>
+            <w:r>
+              <w:rPr>
+                <w:rFonts w:ascii="Arial" w:hAnsi="Arial" w:eastAsia="Arial"/>
+                <w:b w:val="0"/>
+                <w:color w:val="111827"/>
+                <w:sz w:val="16"/>
+              </w:rPr>
+              <w:t>13.02%</w:t>
+            </w:r>
+          </w:p>
+        </w:tc>
+        <w:tc>
+          <w:tcPr>
+            <w:tcW w:type="dxa" w:w="1224"/>
+            <w:vAlign w:val="center"/>
+            <w:tcMar>
+              <w:top w:w="80" w:type="dxa"/>
+              <w:start w:w="120" w:type="dxa"/>
+              <w:bottom w:w="80" w:type="dxa"/>
+              <w:end w:w="120" w:type="dxa"/>
+            </w:tcMar>
+            <w:shd w:fill="F8FAFC"/>
+          </w:tcPr>
+          <w:p>
+            <w:pPr>
+              <w:spacing w:after="0"/>
+              <w:jc w:val="left"/>
+            </w:pPr>
+            <w:r>
+              <w:rPr>
+                <w:rFonts w:ascii="Arial" w:hAnsi="Arial" w:eastAsia="Arial"/>
+                <w:b w:val="0"/>
+                <w:color w:val="111827"/>
+                <w:sz w:val="16"/>
+              </w:rPr>
+              <w:t>рынок видим и плотен; whitespace claim слабый без нового ручного evidence</w:t>
+            </w:r>
+          </w:p>
+        </w:tc>
+        <w:tc>
+          <w:tcPr>
+            <w:tcW w:type="dxa" w:w="1944"/>
+            <w:vAlign w:val="center"/>
+            <w:tcMar>
+              <w:top w:w="80" w:type="dxa"/>
+              <w:start w:w="120" w:type="dxa"/>
+              <w:bottom w:w="80" w:type="dxa"/>
+              <w:end w:w="120" w:type="dxa"/>
+            </w:tcMar>
+            <w:shd w:fill="F8FAFC"/>
+          </w:tcPr>
+          <w:p>
+            <w:pPr>
+              <w:spacing w:after="0"/>
+              <w:jc w:val="left"/>
+            </w:pPr>
+            <w:r>
+              <w:rPr>
+                <w:rFonts w:ascii="Arial" w:hAnsi="Arial" w:eastAsia="Arial"/>
+                <w:b w:val="0"/>
+                <w:color w:val="111827"/>
+                <w:sz w:val="16"/>
+              </w:rPr>
+              <w:t>ICP_A: Spiritual self-improvers / ICP_D: Habit and progress users</w:t>
+            </w:r>
+          </w:p>
+        </w:tc>
+        <w:tc>
+          <w:tcPr>
+            <w:tcW w:type="dxa" w:w="2592"/>
+            <w:vAlign w:val="center"/>
+            <w:tcMar>
+              <w:top w:w="80" w:type="dxa"/>
+              <w:start w:w="120" w:type="dxa"/>
+              <w:bottom w:w="80" w:type="dxa"/>
+              <w:end w:w="120" w:type="dxa"/>
+            </w:tcMar>
+            <w:shd w:fill="F8FAFC"/>
+          </w:tcPr>
+          <w:p>
+            <w:pPr>
+              <w:spacing w:after="0"/>
+              <w:jc w:val="left"/>
+            </w:pPr>
+            <w:r>
+              <w:rPr>
+                <w:rFonts w:ascii="Arial" w:hAnsi="Arial" w:eastAsia="Arial"/>
+                <w:b w:val="0"/>
+                <w:color w:val="111827"/>
+                <w:sz w:val="16"/>
+              </w:rPr>
+              <w:t>сначала проверить P0-аудиторию через recent behavior интервью, затем walkthrough high-risk конкурентов</w:t>
+            </w:r>
+          </w:p>
+        </w:tc>
+      </w:tr>
+      <w:tr>
+        <w:tc>
+          <w:tcPr>
+            <w:tcW w:type="dxa" w:w="2376"/>
+            <w:vAlign w:val="center"/>
+            <w:tcMar>
+              <w:top w:w="80" w:type="dxa"/>
+              <w:start w:w="120" w:type="dxa"/>
+              <w:bottom w:w="80" w:type="dxa"/>
+              <w:end w:w="120" w:type="dxa"/>
+            </w:tcMar>
+          </w:tcPr>
+          <w:p>
+            <w:pPr>
+              <w:spacing w:after="0"/>
+              <w:jc w:val="left"/>
+            </w:pPr>
+            <w:r>
+              <w:rPr>
+                <w:rFonts w:ascii="Arial" w:hAnsi="Arial" w:eastAsia="Arial"/>
+                <w:b w:val="0"/>
+                <w:color w:val="111827"/>
+                <w:sz w:val="16"/>
+              </w:rPr>
+              <w:t>Astrology / esoterics</w:t>
+            </w:r>
+          </w:p>
+        </w:tc>
+        <w:tc>
+          <w:tcPr>
+            <w:tcW w:type="dxa" w:w="1224"/>
+            <w:vAlign w:val="center"/>
+            <w:tcMar>
+              <w:top w:w="80" w:type="dxa"/>
+              <w:start w:w="120" w:type="dxa"/>
+              <w:bottom w:w="80" w:type="dxa"/>
+              <w:end w:w="120" w:type="dxa"/>
+            </w:tcMar>
+          </w:tcPr>
+          <w:p>
+            <w:pPr>
+              <w:spacing w:after="0"/>
+              <w:jc w:val="left"/>
+            </w:pPr>
+            <w:r>
+              <w:rPr>
+                <w:rFonts w:ascii="Arial" w:hAnsi="Arial" w:eastAsia="Arial"/>
+                <w:b w:val="0"/>
+                <w:color w:val="111827"/>
+                <w:sz w:val="16"/>
+              </w:rPr>
+              <w:t>13.70%</w:t>
+            </w:r>
+          </w:p>
+        </w:tc>
+        <w:tc>
+          <w:tcPr>
+            <w:tcW w:type="dxa" w:w="1224"/>
+            <w:vAlign w:val="center"/>
+            <w:tcMar>
+              <w:top w:w="80" w:type="dxa"/>
+              <w:start w:w="120" w:type="dxa"/>
+              <w:bottom w:w="80" w:type="dxa"/>
+              <w:end w:w="120" w:type="dxa"/>
+            </w:tcMar>
+          </w:tcPr>
+          <w:p>
+            <w:pPr>
+              <w:spacing w:after="0"/>
+              <w:jc w:val="left"/>
+            </w:pPr>
+            <w:r>
+              <w:rPr>
+                <w:rFonts w:ascii="Arial" w:hAnsi="Arial" w:eastAsia="Arial"/>
+                <w:b w:val="0"/>
+                <w:color w:val="111827"/>
+                <w:sz w:val="16"/>
+              </w:rPr>
+              <w:t>рынок видим и плотен; whitespace claim слабый без нового ручного evidence</w:t>
+            </w:r>
+          </w:p>
+        </w:tc>
+        <w:tc>
+          <w:tcPr>
+            <w:tcW w:type="dxa" w:w="1944"/>
+            <w:vAlign w:val="center"/>
+            <w:tcMar>
+              <w:top w:w="80" w:type="dxa"/>
+              <w:start w:w="120" w:type="dxa"/>
+              <w:bottom w:w="80" w:type="dxa"/>
+              <w:end w:w="120" w:type="dxa"/>
+            </w:tcMar>
+          </w:tcPr>
+          <w:p>
+            <w:pPr>
+              <w:spacing w:after="0"/>
+              <w:jc w:val="left"/>
+            </w:pPr>
+            <w:r>
+              <w:rPr>
+                <w:rFonts w:ascii="Arial" w:hAnsi="Arial" w:eastAsia="Arial"/>
+                <w:b w:val="0"/>
+                <w:color w:val="111827"/>
+                <w:sz w:val="16"/>
+              </w:rPr>
+              <w:t>ICP_A: Spiritual self-improvers</w:t>
+            </w:r>
+          </w:p>
+        </w:tc>
+        <w:tc>
+          <w:tcPr>
+            <w:tcW w:type="dxa" w:w="2592"/>
+            <w:vAlign w:val="center"/>
+            <w:tcMar>
+              <w:top w:w="80" w:type="dxa"/>
+              <w:start w:w="120" w:type="dxa"/>
+              <w:bottom w:w="80" w:type="dxa"/>
+              <w:end w:w="120" w:type="dxa"/>
+            </w:tcMar>
+          </w:tcPr>
+          <w:p>
+            <w:pPr>
+              <w:spacing w:after="0"/>
+              <w:jc w:val="left"/>
+            </w:pPr>
+            <w:r>
+              <w:rPr>
+                <w:rFonts w:ascii="Arial" w:hAnsi="Arial" w:eastAsia="Arial"/>
+                <w:b w:val="0"/>
+                <w:color w:val="111827"/>
+                <w:sz w:val="16"/>
+              </w:rPr>
+              <w:t>сначала проверить P0-аудиторию через recent behavior интервью, затем walkthrough high-risk конкурентов</w:t>
+            </w:r>
+          </w:p>
+        </w:tc>
+      </w:tr>
+    </w:tbl>
+    <w:p/>
+    <w:p>
+      <w:r>
+        <w:t>Практический вывод: mindfulness и avatar/identity выглядят как самые чистые whitespace-поля по редкости full-loop candidates, но они все равно требуют walkthrough. Astrology/esoterics и coaching дают сильную аудиторию и деньги, но full-loop rate выше, поэтому claim о белом пятне там слабее. Gaming остается benchmark механик, а не прямой рынок.</w:t>
       </w:r>
     </w:p>
     <w:p>
@@ -16505,7 +17385,7 @@
                 <w:color w:val="111827"/>
                 <w:sz w:val="16"/>
               </w:rPr>
-              <w:t>462 manifest artifacts; missing=0</w:t>
+              <w:t>465 manifest artifacts; missing=0</w:t>
             </w:r>
           </w:p>
         </w:tc>
@@ -16661,6 +17541,15 @@
       </w:pPr>
       <w:r>
         <w:t>data_processed/global_market_sizing_methodology.csv</w:t>
+      </w:r>
+    </w:p>
+    <w:p>
+      <w:pPr>
+        <w:pStyle w:val="ListBullet"/>
+        <w:spacing w:after="80"/>
+      </w:pPr>
+      <w:r>
+        <w:t>data_processed/global_whitespace_audience_synthesis.csv</w:t>
       </w:r>
     </w:p>
     <w:p>

</xml_diff>

<commit_message>
Add global goal evidence coverage
</commit_message>
<xml_diff>
--- a/output/docx/alina-global-hypothesis-report-v1.docx
+++ b/output/docx/alina-global-hypothesis-report-v1.docx
@@ -31,7 +31,7 @@
     </w:p>
     <w:p>
       <w:r>
-        <w:t>Собрано: 2026-05-31T15:23:55.851Z</w:t>
+        <w:t>Собрано: 2026-05-31T15:39:46.472Z</w:t>
       </w:r>
     </w:p>
     <w:p>
@@ -59,7 +59,7 @@
     </w:p>
     <w:p>
       <w:r>
-        <w:t>На текущем этапе собрано 67,525 сырьевых source-строк, 36,694 уникализированных строк и 465 локальных артефактов. Эти данные нужны не для того, чтобы объявить продукт доказанным, а для последовательной проверки: существует ли рынок, есть ли деньги, насколько плотна конкуренция, где может быть белое пятно, кто аудитория и какую MVP-петлю надо тестировать.</w:t>
+        <w:t>На текущем этапе собрано 67,525 сырьевых source-строк, 36,694 уникализированных строк и 468 локальных артефактов. Эти данные нужны не для того, чтобы объявить продукт доказанным, а для последовательной проверки: существует ли рынок, есть ли деньги, насколько плотна конкуренция, где может быть белое пятно, кто аудитория и какую MVP-петлю надо тестировать.</w:t>
       </w:r>
     </w:p>
     <w:p>
@@ -16270,6 +16270,1556 @@
         <w:pStyle w:val="Heading1"/>
       </w:pPr>
       <w:r>
+        <w:t>ПОКРЫТИЕ ИСХОДНОЙ ЦЕЛИ ДОКАЗАТЕЛЬСТВАМИ</w:t>
+      </w:r>
+    </w:p>
+    <w:p>
+      <w:r>
+        <w:t>Чтобы не смешивать “сделан исследовательский слой” и “доказана гипотеза”, ниже показано покрытие исходной задачи по частям. Это контрольная карта текущего состояния: где уже есть локальные файлы, методология и отчет, а где требуются observed rows.</w:t>
+      </w:r>
+    </w:p>
+    <w:tbl>
+      <w:tblPr>
+        <w:tblW w:type="dxa" w:w="9360"/>
+        <w:jc w:val="left"/>
+        <w:tblLayout w:type="fixed"/>
+        <w:tblLook w:firstColumn="1" w:firstRow="1" w:lastColumn="0" w:lastRow="0" w:noHBand="0" w:noVBand="1" w:val="04A0"/>
+        <w:tblInd w:w="120" w:type="dxa"/>
+        <w:tblBorders>
+          <w:top w:val="single" w:sz="4" w:space="0" w:color="CBD5E1"/>
+          <w:left w:val="single" w:sz="4" w:space="0" w:color="CBD5E1"/>
+          <w:bottom w:val="single" w:sz="4" w:space="0" w:color="CBD5E1"/>
+          <w:right w:val="single" w:sz="4" w:space="0" w:color="CBD5E1"/>
+          <w:insideH w:val="single" w:sz="4" w:space="0" w:color="CBD5E1"/>
+          <w:insideV w:val="single" w:sz="4" w:space="0" w:color="CBD5E1"/>
+        </w:tblBorders>
+      </w:tblPr>
+      <w:tblGrid>
+        <w:gridCol w:w="1560"/>
+        <w:gridCol w:w="1560"/>
+        <w:gridCol w:w="1560"/>
+        <w:gridCol w:w="1560"/>
+        <w:gridCol w:w="1560"/>
+        <w:gridCol w:w="1560"/>
+      </w:tblGrid>
+      <w:tr>
+        <w:tc>
+          <w:tcPr>
+            <w:tcW w:type="dxa" w:w="1560"/>
+            <w:vAlign w:val="center"/>
+            <w:tcMar>
+              <w:top w:w="80" w:type="dxa"/>
+              <w:start w:w="120" w:type="dxa"/>
+              <w:bottom w:w="80" w:type="dxa"/>
+              <w:end w:w="120" w:type="dxa"/>
+            </w:tcMar>
+            <w:shd w:fill="E8EEF5"/>
+          </w:tcPr>
+          <w:p>
+            <w:pPr>
+              <w:spacing w:after="0"/>
+              <w:jc w:val="left"/>
+            </w:pPr>
+            <w:r>
+              <w:rPr>
+                <w:rFonts w:ascii="Arial" w:hAnsi="Arial" w:eastAsia="Arial"/>
+                <w:b/>
+                <w:color w:val="111827"/>
+                <w:sz w:val="16"/>
+              </w:rPr>
+              <w:t>ID</w:t>
+            </w:r>
+          </w:p>
+        </w:tc>
+        <w:tc>
+          <w:tcPr>
+            <w:tcW w:type="dxa" w:w="1560"/>
+            <w:vAlign w:val="center"/>
+            <w:tcMar>
+              <w:top w:w="80" w:type="dxa"/>
+              <w:start w:w="120" w:type="dxa"/>
+              <w:bottom w:w="80" w:type="dxa"/>
+              <w:end w:w="120" w:type="dxa"/>
+            </w:tcMar>
+            <w:shd w:fill="E8EEF5"/>
+          </w:tcPr>
+          <w:p>
+            <w:pPr>
+              <w:spacing w:after="0"/>
+              <w:jc w:val="left"/>
+            </w:pPr>
+            <w:r>
+              <w:rPr>
+                <w:rFonts w:ascii="Arial" w:hAnsi="Arial" w:eastAsia="Arial"/>
+                <w:b/>
+                <w:color w:val="111827"/>
+                <w:sz w:val="16"/>
+              </w:rPr>
+              <w:t>Часть цели</w:t>
+            </w:r>
+          </w:p>
+        </w:tc>
+        <w:tc>
+          <w:tcPr>
+            <w:tcW w:type="dxa" w:w="1560"/>
+            <w:vAlign w:val="center"/>
+            <w:tcMar>
+              <w:top w:w="80" w:type="dxa"/>
+              <w:start w:w="120" w:type="dxa"/>
+              <w:bottom w:w="80" w:type="dxa"/>
+              <w:end w:w="120" w:type="dxa"/>
+            </w:tcMar>
+            <w:shd w:fill="E8EEF5"/>
+          </w:tcPr>
+          <w:p>
+            <w:pPr>
+              <w:spacing w:after="0"/>
+              <w:jc w:val="left"/>
+            </w:pPr>
+            <w:r>
+              <w:rPr>
+                <w:rFonts w:ascii="Arial" w:hAnsi="Arial" w:eastAsia="Arial"/>
+                <w:b/>
+                <w:color w:val="111827"/>
+                <w:sz w:val="16"/>
+              </w:rPr>
+              <w:t>Статус</w:t>
+            </w:r>
+          </w:p>
+        </w:tc>
+        <w:tc>
+          <w:tcPr>
+            <w:tcW w:type="dxa" w:w="1560"/>
+            <w:vAlign w:val="center"/>
+            <w:tcMar>
+              <w:top w:w="80" w:type="dxa"/>
+              <w:start w:w="120" w:type="dxa"/>
+              <w:bottom w:w="80" w:type="dxa"/>
+              <w:end w:w="120" w:type="dxa"/>
+            </w:tcMar>
+            <w:shd w:fill="E8EEF5"/>
+          </w:tcPr>
+          <w:p>
+            <w:pPr>
+              <w:spacing w:after="0"/>
+              <w:jc w:val="left"/>
+            </w:pPr>
+            <w:r>
+              <w:rPr>
+                <w:rFonts w:ascii="Arial" w:hAnsi="Arial" w:eastAsia="Arial"/>
+                <w:b/>
+                <w:color w:val="111827"/>
+                <w:sz w:val="16"/>
+              </w:rPr>
+              <w:t>Текущее evidence</w:t>
+            </w:r>
+          </w:p>
+        </w:tc>
+        <w:tc>
+          <w:tcPr>
+            <w:tcW w:type="dxa" w:w="1560"/>
+            <w:vAlign w:val="center"/>
+            <w:tcMar>
+              <w:top w:w="80" w:type="dxa"/>
+              <w:start w:w="120" w:type="dxa"/>
+              <w:bottom w:w="80" w:type="dxa"/>
+              <w:end w:w="120" w:type="dxa"/>
+            </w:tcMar>
+            <w:shd w:fill="E8EEF5"/>
+          </w:tcPr>
+          <w:p>
+            <w:pPr>
+              <w:spacing w:after="0"/>
+              <w:jc w:val="left"/>
+            </w:pPr>
+            <w:r>
+              <w:rPr>
+                <w:rFonts w:ascii="Arial" w:hAnsi="Arial" w:eastAsia="Arial"/>
+                <w:b/>
+                <w:color w:val="111827"/>
+                <w:sz w:val="16"/>
+              </w:rPr>
+              <w:t>Осталось</w:t>
+            </w:r>
+          </w:p>
+        </w:tc>
+        <w:tc>
+          <w:tcPr>
+            <w:tcW w:type="dxa" w:w="1560"/>
+            <w:vAlign w:val="center"/>
+            <w:tcMar>
+              <w:top w:w="80" w:type="dxa"/>
+              <w:start w:w="120" w:type="dxa"/>
+              <w:bottom w:w="80" w:type="dxa"/>
+              <w:end w:w="120" w:type="dxa"/>
+            </w:tcMar>
+            <w:shd w:fill="E8EEF5"/>
+          </w:tcPr>
+          <w:p>
+            <w:pPr>
+              <w:spacing w:after="0"/>
+              <w:jc w:val="left"/>
+            </w:pPr>
+            <w:r>
+              <w:rPr>
+                <w:rFonts w:ascii="Arial" w:hAnsi="Arial" w:eastAsia="Arial"/>
+                <w:b/>
+                <w:color w:val="111827"/>
+                <w:sz w:val="16"/>
+              </w:rPr>
+              <w:t>Следующий ход</w:t>
+            </w:r>
+          </w:p>
+        </w:tc>
+      </w:tr>
+      <w:tr>
+        <w:tc>
+          <w:tcPr>
+            <w:tcW w:type="dxa" w:w="1560"/>
+            <w:vAlign w:val="center"/>
+            <w:tcMar>
+              <w:top w:w="80" w:type="dxa"/>
+              <w:start w:w="120" w:type="dxa"/>
+              <w:bottom w:w="80" w:type="dxa"/>
+              <w:end w:w="120" w:type="dxa"/>
+            </w:tcMar>
+          </w:tcPr>
+          <w:p>
+            <w:pPr>
+              <w:spacing w:after="0"/>
+              <w:jc w:val="left"/>
+            </w:pPr>
+            <w:r>
+              <w:rPr>
+                <w:rFonts w:ascii="Arial" w:hAnsi="Arial" w:eastAsia="Arial"/>
+                <w:b w:val="0"/>
+                <w:color w:val="111827"/>
+                <w:sz w:val="16"/>
+              </w:rPr>
+              <w:t>GOAL_01_PLAN</w:t>
+            </w:r>
+          </w:p>
+        </w:tc>
+        <w:tc>
+          <w:tcPr>
+            <w:tcW w:type="dxa" w:w="1560"/>
+            <w:vAlign w:val="center"/>
+            <w:tcMar>
+              <w:top w:w="80" w:type="dxa"/>
+              <w:start w:w="120" w:type="dxa"/>
+              <w:bottom w:w="80" w:type="dxa"/>
+              <w:end w:w="120" w:type="dxa"/>
+            </w:tcMar>
+          </w:tcPr>
+          <w:p>
+            <w:pPr>
+              <w:spacing w:after="0"/>
+              <w:jc w:val="left"/>
+            </w:pPr>
+            <w:r>
+              <w:rPr>
+                <w:rFonts w:ascii="Arial" w:hAnsi="Arial" w:eastAsia="Arial"/>
+                <w:b w:val="0"/>
+                <w:color w:val="111827"/>
+                <w:sz w:val="16"/>
+              </w:rPr>
+              <w:t>Зафиксировать большой план задач и execution path</w:t>
+            </w:r>
+          </w:p>
+        </w:tc>
+        <w:tc>
+          <w:tcPr>
+            <w:tcW w:type="dxa" w:w="1560"/>
+            <w:vAlign w:val="center"/>
+            <w:tcMar>
+              <w:top w:w="80" w:type="dxa"/>
+              <w:start w:w="120" w:type="dxa"/>
+              <w:bottom w:w="80" w:type="dxa"/>
+              <w:end w:w="120" w:type="dxa"/>
+            </w:tcMar>
+          </w:tcPr>
+          <w:p>
+            <w:pPr>
+              <w:spacing w:after="0"/>
+              <w:jc w:val="left"/>
+            </w:pPr>
+            <w:r>
+              <w:rPr>
+                <w:rFonts w:ascii="Arial" w:hAnsi="Arial" w:eastAsia="Arial"/>
+                <w:b w:val="0"/>
+                <w:color w:val="111827"/>
+                <w:sz w:val="16"/>
+              </w:rPr>
+              <w:t>покрыто как рабочая система</w:t>
+            </w:r>
+          </w:p>
+        </w:tc>
+        <w:tc>
+          <w:tcPr>
+            <w:tcW w:type="dxa" w:w="1560"/>
+            <w:vAlign w:val="center"/>
+            <w:tcMar>
+              <w:top w:w="80" w:type="dxa"/>
+              <w:start w:w="120" w:type="dxa"/>
+              <w:bottom w:w="80" w:type="dxa"/>
+              <w:end w:w="120" w:type="dxa"/>
+            </w:tcMar>
+          </w:tcPr>
+          <w:p>
+            <w:pPr>
+              <w:spacing w:after="0"/>
+              <w:jc w:val="left"/>
+            </w:pPr>
+            <w:r>
+              <w:rPr>
+                <w:rFonts w:ascii="Arial" w:hAnsi="Arial" w:eastAsia="Arial"/>
+                <w:b w:val="0"/>
+                <w:color w:val="111827"/>
+                <w:sz w:val="16"/>
+              </w:rPr>
+              <w:t>22 next-validation задач; 75 command-center задач; 5 runway шагов</w:t>
+            </w:r>
+          </w:p>
+        </w:tc>
+        <w:tc>
+          <w:tcPr>
+            <w:tcW w:type="dxa" w:w="1560"/>
+            <w:vAlign w:val="center"/>
+            <w:tcMar>
+              <w:top w:w="80" w:type="dxa"/>
+              <w:start w:w="120" w:type="dxa"/>
+              <w:bottom w:w="80" w:type="dxa"/>
+              <w:end w:w="120" w:type="dxa"/>
+            </w:tcMar>
+          </w:tcPr>
+          <w:p>
+            <w:pPr>
+              <w:spacing w:after="0"/>
+              <w:jc w:val="left"/>
+            </w:pPr>
+            <w:r>
+              <w:rPr>
+                <w:rFonts w:ascii="Arial" w:hAnsi="Arial" w:eastAsia="Arial"/>
+                <w:b w:val="0"/>
+                <w:color w:val="111827"/>
+                <w:sz w:val="16"/>
+              </w:rPr>
+              <w:t>план есть, но требует обновления после observed evidence</w:t>
+            </w:r>
+          </w:p>
+        </w:tc>
+        <w:tc>
+          <w:tcPr>
+            <w:tcW w:type="dxa" w:w="1560"/>
+            <w:vAlign w:val="center"/>
+            <w:tcMar>
+              <w:top w:w="80" w:type="dxa"/>
+              <w:start w:w="120" w:type="dxa"/>
+              <w:bottom w:w="80" w:type="dxa"/>
+              <w:end w:w="120" w:type="dxa"/>
+            </w:tcMar>
+          </w:tcPr>
+          <w:p>
+            <w:pPr>
+              <w:spacing w:after="0"/>
+              <w:jc w:val="left"/>
+            </w:pPr>
+            <w:r>
+              <w:rPr>
+                <w:rFonts w:ascii="Arial" w:hAnsi="Arial" w:eastAsia="Arial"/>
+                <w:b w:val="0"/>
+                <w:color w:val="111827"/>
+                <w:sz w:val="16"/>
+              </w:rPr>
+              <w:t>после каждой ручной проверки пересобирать backlog и gates</w:t>
+            </w:r>
+          </w:p>
+        </w:tc>
+      </w:tr>
+      <w:tr>
+        <w:tc>
+          <w:tcPr>
+            <w:tcW w:type="dxa" w:w="1560"/>
+            <w:vAlign w:val="center"/>
+            <w:tcMar>
+              <w:top w:w="80" w:type="dxa"/>
+              <w:start w:w="120" w:type="dxa"/>
+              <w:bottom w:w="80" w:type="dxa"/>
+              <w:end w:w="120" w:type="dxa"/>
+            </w:tcMar>
+            <w:shd w:fill="F8FAFC"/>
+          </w:tcPr>
+          <w:p>
+            <w:pPr>
+              <w:spacing w:after="0"/>
+              <w:jc w:val="left"/>
+            </w:pPr>
+            <w:r>
+              <w:rPr>
+                <w:rFonts w:ascii="Arial" w:hAnsi="Arial" w:eastAsia="Arial"/>
+                <w:b w:val="0"/>
+                <w:color w:val="111827"/>
+                <w:sz w:val="16"/>
+              </w:rPr>
+              <w:t>GOAL_02_SOURCE_SCALE</w:t>
+            </w:r>
+          </w:p>
+        </w:tc>
+        <w:tc>
+          <w:tcPr>
+            <w:tcW w:type="dxa" w:w="1560"/>
+            <w:vAlign w:val="center"/>
+            <w:tcMar>
+              <w:top w:w="80" w:type="dxa"/>
+              <w:start w:w="120" w:type="dxa"/>
+              <w:bottom w:w="80" w:type="dxa"/>
+              <w:end w:w="120" w:type="dxa"/>
+            </w:tcMar>
+            <w:shd w:fill="F8FAFC"/>
+          </w:tcPr>
+          <w:p>
+            <w:pPr>
+              <w:spacing w:after="0"/>
+              <w:jc w:val="left"/>
+            </w:pPr>
+            <w:r>
+              <w:rPr>
+                <w:rFonts w:ascii="Arial" w:hAnsi="Arial" w:eastAsia="Arial"/>
+                <w:b w:val="0"/>
+                <w:color w:val="111827"/>
+                <w:sz w:val="16"/>
+              </w:rPr>
+              <w:t>Расширить конкурентов и источники по 5 рынкам до большого масштаба</w:t>
+            </w:r>
+          </w:p>
+        </w:tc>
+        <w:tc>
+          <w:tcPr>
+            <w:tcW w:type="dxa" w:w="1560"/>
+            <w:vAlign w:val="center"/>
+            <w:tcMar>
+              <w:top w:w="80" w:type="dxa"/>
+              <w:start w:w="120" w:type="dxa"/>
+              <w:bottom w:w="80" w:type="dxa"/>
+              <w:end w:w="120" w:type="dxa"/>
+            </w:tcMar>
+            <w:shd w:fill="F8FAFC"/>
+          </w:tcPr>
+          <w:p>
+            <w:pPr>
+              <w:spacing w:after="0"/>
+              <w:jc w:val="left"/>
+            </w:pPr>
+            <w:r>
+              <w:rPr>
+                <w:rFonts w:ascii="Arial" w:hAnsi="Arial" w:eastAsia="Arial"/>
+                <w:b w:val="0"/>
+                <w:color w:val="111827"/>
+                <w:sz w:val="16"/>
+              </w:rPr>
+              <w:t>покрыто по raw 50k и dedup 30k+, dedup 50k остается aspiration</w:t>
+            </w:r>
+          </w:p>
+        </w:tc>
+        <w:tc>
+          <w:tcPr>
+            <w:tcW w:type="dxa" w:w="1560"/>
+            <w:vAlign w:val="center"/>
+            <w:tcMar>
+              <w:top w:w="80" w:type="dxa"/>
+              <w:start w:w="120" w:type="dxa"/>
+              <w:bottom w:w="80" w:type="dxa"/>
+              <w:end w:w="120" w:type="dxa"/>
+            </w:tcMar>
+            <w:shd w:fill="F8FAFC"/>
+          </w:tcPr>
+          <w:p>
+            <w:pPr>
+              <w:spacing w:after="0"/>
+              <w:jc w:val="left"/>
+            </w:pPr>
+            <w:r>
+              <w:rPr>
+                <w:rFonts w:ascii="Arial" w:hAnsi="Arial" w:eastAsia="Arial"/>
+                <w:b w:val="0"/>
+                <w:color w:val="111827"/>
+                <w:sz w:val="16"/>
+              </w:rPr>
+              <w:t>raw=67525; dedup=36694; dedup50_status=open; source_refs=239842</w:t>
+            </w:r>
+          </w:p>
+        </w:tc>
+        <w:tc>
+          <w:tcPr>
+            <w:tcW w:type="dxa" w:w="1560"/>
+            <w:vAlign w:val="center"/>
+            <w:tcMar>
+              <w:top w:w="80" w:type="dxa"/>
+              <w:start w:w="120" w:type="dxa"/>
+              <w:bottom w:w="80" w:type="dxa"/>
+              <w:end w:w="120" w:type="dxa"/>
+            </w:tcMar>
+            <w:shd w:fill="F8FAFC"/>
+          </w:tcPr>
+          <w:p>
+            <w:pPr>
+              <w:spacing w:after="0"/>
+              <w:jc w:val="left"/>
+            </w:pPr>
+            <w:r>
+              <w:rPr>
+                <w:rFonts w:ascii="Arial" w:hAnsi="Arial" w:eastAsia="Arial"/>
+                <w:b w:val="0"/>
+                <w:color w:val="111827"/>
+                <w:sz w:val="16"/>
+              </w:rPr>
+              <w:t>нельзя писать, что 50k dedup уникальных конкурентов доказаны; доказаны raw 50k и dedup 30k-40k band</w:t>
+            </w:r>
+          </w:p>
+        </w:tc>
+        <w:tc>
+          <w:tcPr>
+            <w:tcW w:type="dxa" w:w="1560"/>
+            <w:vAlign w:val="center"/>
+            <w:tcMar>
+              <w:top w:w="80" w:type="dxa"/>
+              <w:start w:w="120" w:type="dxa"/>
+              <w:bottom w:w="80" w:type="dxa"/>
+              <w:end w:w="120" w:type="dxa"/>
+            </w:tcMar>
+            <w:shd w:fill="F8FAFC"/>
+          </w:tcPr>
+          <w:p>
+            <w:pPr>
+              <w:spacing w:after="0"/>
+              <w:jc w:val="left"/>
+            </w:pPr>
+            <w:r>
+              <w:rPr>
+                <w:rFonts w:ascii="Arial" w:hAnsi="Arial" w:eastAsia="Arial"/>
+                <w:b w:val="0"/>
+                <w:color w:val="111827"/>
+                <w:sz w:val="16"/>
+              </w:rPr>
+              <w:t>расширять source-native lanes без тяжелого поискового crawl</w:t>
+            </w:r>
+          </w:p>
+        </w:tc>
+      </w:tr>
+      <w:tr>
+        <w:tc>
+          <w:tcPr>
+            <w:tcW w:type="dxa" w:w="1560"/>
+            <w:vAlign w:val="center"/>
+            <w:tcMar>
+              <w:top w:w="80" w:type="dxa"/>
+              <w:start w:w="120" w:type="dxa"/>
+              <w:bottom w:w="80" w:type="dxa"/>
+              <w:end w:w="120" w:type="dxa"/>
+            </w:tcMar>
+          </w:tcPr>
+          <w:p>
+            <w:pPr>
+              <w:spacing w:after="0"/>
+              <w:jc w:val="left"/>
+            </w:pPr>
+            <w:r>
+              <w:rPr>
+                <w:rFonts w:ascii="Arial" w:hAnsi="Arial" w:eastAsia="Arial"/>
+                <w:b w:val="0"/>
+                <w:color w:val="111827"/>
+                <w:sz w:val="16"/>
+              </w:rPr>
+              <w:t>GOAL_03_FIVE_MARKETS</w:t>
+            </w:r>
+          </w:p>
+        </w:tc>
+        <w:tc>
+          <w:tcPr>
+            <w:tcW w:type="dxa" w:w="1560"/>
+            <w:vAlign w:val="center"/>
+            <w:tcMar>
+              <w:top w:w="80" w:type="dxa"/>
+              <w:start w:w="120" w:type="dxa"/>
+              <w:bottom w:w="80" w:type="dxa"/>
+              <w:end w:w="120" w:type="dxa"/>
+            </w:tcMar>
+          </w:tcPr>
+          <w:p>
+            <w:pPr>
+              <w:spacing w:after="0"/>
+              <w:jc w:val="left"/>
+            </w:pPr>
+            <w:r>
+              <w:rPr>
+                <w:rFonts w:ascii="Arial" w:hAnsi="Arial" w:eastAsia="Arial"/>
+                <w:b w:val="0"/>
+                <w:color w:val="111827"/>
+                <w:sz w:val="16"/>
+              </w:rPr>
+              <w:t>Покрыть 5 направлений: mindfulness, coaching, astrology/esoterics, avatar/identity, gaming/progression</w:t>
+            </w:r>
+          </w:p>
+        </w:tc>
+        <w:tc>
+          <w:tcPr>
+            <w:tcW w:type="dxa" w:w="1560"/>
+            <w:vAlign w:val="center"/>
+            <w:tcMar>
+              <w:top w:w="80" w:type="dxa"/>
+              <w:start w:w="120" w:type="dxa"/>
+              <w:bottom w:w="80" w:type="dxa"/>
+              <w:end w:w="120" w:type="dxa"/>
+            </w:tcMar>
+          </w:tcPr>
+          <w:p>
+            <w:pPr>
+              <w:spacing w:after="0"/>
+              <w:jc w:val="left"/>
+            </w:pPr>
+            <w:r>
+              <w:rPr>
+                <w:rFonts w:ascii="Arial" w:hAnsi="Arial" w:eastAsia="Arial"/>
+                <w:b w:val="0"/>
+                <w:color w:val="111827"/>
+                <w:sz w:val="16"/>
+              </w:rPr>
+              <w:t>покрыто</w:t>
+            </w:r>
+          </w:p>
+        </w:tc>
+        <w:tc>
+          <w:tcPr>
+            <w:tcW w:type="dxa" w:w="1560"/>
+            <w:vAlign w:val="center"/>
+            <w:tcMar>
+              <w:top w:w="80" w:type="dxa"/>
+              <w:start w:w="120" w:type="dxa"/>
+              <w:bottom w:w="80" w:type="dxa"/>
+              <w:end w:w="120" w:type="dxa"/>
+            </w:tcMar>
+          </w:tcPr>
+          <w:p>
+            <w:pPr>
+              <w:spacing w:after="0"/>
+              <w:jc w:val="left"/>
+            </w:pPr>
+            <w:r>
+              <w:rPr>
+                <w:rFonts w:ascii="Arial" w:hAnsi="Arial" w:eastAsia="Arial"/>
+                <w:b w:val="0"/>
+                <w:color w:val="111827"/>
+                <w:sz w:val="16"/>
+              </w:rPr>
+              <w:t>5 market rows; 5 whitespace/audience rows; 6 market methodology rows</w:t>
+            </w:r>
+          </w:p>
+        </w:tc>
+        <w:tc>
+          <w:tcPr>
+            <w:tcW w:type="dxa" w:w="1560"/>
+            <w:vAlign w:val="center"/>
+            <w:tcMar>
+              <w:top w:w="80" w:type="dxa"/>
+              <w:start w:w="120" w:type="dxa"/>
+              <w:bottom w:w="80" w:type="dxa"/>
+              <w:end w:w="120" w:type="dxa"/>
+            </w:tcMar>
+          </w:tcPr>
+          <w:p>
+            <w:pPr>
+              <w:spacing w:after="0"/>
+              <w:jc w:val="left"/>
+            </w:pPr>
+            <w:r>
+              <w:rPr>
+                <w:rFonts w:ascii="Arial" w:hAnsi="Arial" w:eastAsia="Arial"/>
+                <w:b w:val="0"/>
+                <w:color w:val="111827"/>
+                <w:sz w:val="16"/>
+              </w:rPr>
+              <w:t>gaming остается benchmark-only до direct audience overlap proof</w:t>
+            </w:r>
+          </w:p>
+        </w:tc>
+        <w:tc>
+          <w:tcPr>
+            <w:tcW w:type="dxa" w:w="1560"/>
+            <w:vAlign w:val="center"/>
+            <w:tcMar>
+              <w:top w:w="80" w:type="dxa"/>
+              <w:start w:w="120" w:type="dxa"/>
+              <w:bottom w:w="80" w:type="dxa"/>
+              <w:end w:w="120" w:type="dxa"/>
+            </w:tcMar>
+          </w:tcPr>
+          <w:p>
+            <w:pPr>
+              <w:spacing w:after="0"/>
+              <w:jc w:val="left"/>
+            </w:pPr>
+            <w:r>
+              <w:rPr>
+                <w:rFonts w:ascii="Arial" w:hAnsi="Arial" w:eastAsia="Arial"/>
+                <w:b w:val="0"/>
+                <w:color w:val="111827"/>
+                <w:sz w:val="16"/>
+              </w:rPr>
+              <w:t>сохранять gaming вне прямого TAM и H3 proof</w:t>
+            </w:r>
+          </w:p>
+        </w:tc>
+      </w:tr>
+      <w:tr>
+        <w:tc>
+          <w:tcPr>
+            <w:tcW w:type="dxa" w:w="1560"/>
+            <w:vAlign w:val="center"/>
+            <w:tcMar>
+              <w:top w:w="80" w:type="dxa"/>
+              <w:start w:w="120" w:type="dxa"/>
+              <w:bottom w:w="80" w:type="dxa"/>
+              <w:end w:w="120" w:type="dxa"/>
+            </w:tcMar>
+            <w:shd w:fill="F8FAFC"/>
+          </w:tcPr>
+          <w:p>
+            <w:pPr>
+              <w:spacing w:after="0"/>
+              <w:jc w:val="left"/>
+            </w:pPr>
+            <w:r>
+              <w:rPr>
+                <w:rFonts w:ascii="Arial" w:hAnsi="Arial" w:eastAsia="Arial"/>
+                <w:b w:val="0"/>
+                <w:color w:val="111827"/>
+                <w:sz w:val="16"/>
+              </w:rPr>
+              <w:t>GOAL_04_TAM_SAM_SOM</w:t>
+            </w:r>
+          </w:p>
+        </w:tc>
+        <w:tc>
+          <w:tcPr>
+            <w:tcW w:type="dxa" w:w="1560"/>
+            <w:vAlign w:val="center"/>
+            <w:tcMar>
+              <w:top w:w="80" w:type="dxa"/>
+              <w:start w:w="120" w:type="dxa"/>
+              <w:bottom w:w="80" w:type="dxa"/>
+              <w:end w:w="120" w:type="dxa"/>
+            </w:tcMar>
+            <w:shd w:fill="F8FAFC"/>
+          </w:tcPr>
+          <w:p>
+            <w:pPr>
+              <w:spacing w:after="0"/>
+              <w:jc w:val="left"/>
+            </w:pPr>
+            <w:r>
+              <w:rPr>
+                <w:rFonts w:ascii="Arial" w:hAnsi="Arial" w:eastAsia="Arial"/>
+                <w:b w:val="0"/>
+                <w:color w:val="111827"/>
+                <w:sz w:val="16"/>
+              </w:rPr>
+              <w:t>Подготовить рыночную методологию TAM/SAM/SOM и stress-сценарии</w:t>
+            </w:r>
+          </w:p>
+        </w:tc>
+        <w:tc>
+          <w:tcPr>
+            <w:tcW w:type="dxa" w:w="1560"/>
+            <w:vAlign w:val="center"/>
+            <w:tcMar>
+              <w:top w:w="80" w:type="dxa"/>
+              <w:start w:w="120" w:type="dxa"/>
+              <w:bottom w:w="80" w:type="dxa"/>
+              <w:end w:w="120" w:type="dxa"/>
+            </w:tcMar>
+            <w:shd w:fill="F8FAFC"/>
+          </w:tcPr>
+          <w:p>
+            <w:pPr>
+              <w:spacing w:after="0"/>
+              <w:jc w:val="left"/>
+            </w:pPr>
+            <w:r>
+              <w:rPr>
+                <w:rFonts w:ascii="Arial" w:hAnsi="Arial" w:eastAsia="Arial"/>
+                <w:b w:val="0"/>
+                <w:color w:val="111827"/>
+                <w:sz w:val="16"/>
+              </w:rPr>
+              <w:t>покрыто как range-based methodology, не финальный revenue proof</w:t>
+            </w:r>
+          </w:p>
+        </w:tc>
+        <w:tc>
+          <w:tcPr>
+            <w:tcW w:type="dxa" w:w="1560"/>
+            <w:vAlign w:val="center"/>
+            <w:tcMar>
+              <w:top w:w="80" w:type="dxa"/>
+              <w:start w:w="120" w:type="dxa"/>
+              <w:bottom w:w="80" w:type="dxa"/>
+              <w:end w:w="120" w:type="dxa"/>
+            </w:tcMar>
+            <w:shd w:fill="F8FAFC"/>
+          </w:tcPr>
+          <w:p>
+            <w:pPr>
+              <w:spacing w:after="0"/>
+              <w:jc w:val="left"/>
+            </w:pPr>
+            <w:r>
+              <w:rPr>
+                <w:rFonts w:ascii="Arial" w:hAnsi="Arial" w:eastAsia="Arial"/>
+                <w:b w:val="0"/>
+                <w:color w:val="111827"/>
+                <w:sz w:val="16"/>
+              </w:rPr>
+              <w:t>6 methodology rows; 6 TAM/SAM/SOM rows; 6 stress scenarios</w:t>
+            </w:r>
+          </w:p>
+        </w:tc>
+        <w:tc>
+          <w:tcPr>
+            <w:tcW w:type="dxa" w:w="1560"/>
+            <w:vAlign w:val="center"/>
+            <w:tcMar>
+              <w:top w:w="80" w:type="dxa"/>
+              <w:start w:w="120" w:type="dxa"/>
+              <w:bottom w:w="80" w:type="dxa"/>
+              <w:end w:w="120" w:type="dxa"/>
+            </w:tcMar>
+            <w:shd w:fill="F8FAFC"/>
+          </w:tcPr>
+          <w:p>
+            <w:pPr>
+              <w:spacing w:after="0"/>
+              <w:jc w:val="left"/>
+            </w:pPr>
+            <w:r>
+              <w:rPr>
+                <w:rFonts w:ascii="Arial" w:hAnsi="Arial" w:eastAsia="Arial"/>
+                <w:b w:val="0"/>
+                <w:color w:val="111827"/>
+                <w:sz w:val="16"/>
+              </w:rPr>
+              <w:t>H2 не закрыт: paid-flow signoff ниже порога, WTP и paid-depth prototype signals еще нужны</w:t>
+            </w:r>
+          </w:p>
+        </w:tc>
+        <w:tc>
+          <w:tcPr>
+            <w:tcW w:type="dxa" w:w="1560"/>
+            <w:vAlign w:val="center"/>
+            <w:tcMar>
+              <w:top w:w="80" w:type="dxa"/>
+              <w:start w:w="120" w:type="dxa"/>
+              <w:bottom w:w="80" w:type="dxa"/>
+              <w:end w:w="120" w:type="dxa"/>
+            </w:tcMar>
+            <w:shd w:fill="F8FAFC"/>
+          </w:tcPr>
+          <w:p>
+            <w:pPr>
+              <w:spacing w:after="0"/>
+              <w:jc w:val="left"/>
+            </w:pPr>
+            <w:r>
+              <w:rPr>
+                <w:rFonts w:ascii="Arial" w:hAnsi="Arial" w:eastAsia="Arial"/>
+                <w:b w:val="0"/>
+                <w:color w:val="111827"/>
+                <w:sz w:val="16"/>
+              </w:rPr>
+              <w:t>добрать paid-flow capture rows и WTP вопросы из P0 backlog</w:t>
+            </w:r>
+          </w:p>
+        </w:tc>
+      </w:tr>
+      <w:tr>
+        <w:tc>
+          <w:tcPr>
+            <w:tcW w:type="dxa" w:w="1560"/>
+            <w:vAlign w:val="center"/>
+            <w:tcMar>
+              <w:top w:w="80" w:type="dxa"/>
+              <w:start w:w="120" w:type="dxa"/>
+              <w:bottom w:w="80" w:type="dxa"/>
+              <w:end w:w="120" w:type="dxa"/>
+            </w:tcMar>
+          </w:tcPr>
+          <w:p>
+            <w:pPr>
+              <w:spacing w:after="0"/>
+              <w:jc w:val="left"/>
+            </w:pPr>
+            <w:r>
+              <w:rPr>
+                <w:rFonts w:ascii="Arial" w:hAnsi="Arial" w:eastAsia="Arial"/>
+                <w:b w:val="0"/>
+                <w:color w:val="111827"/>
+                <w:sz w:val="16"/>
+              </w:rPr>
+              <w:t>GOAL_05_WHITESPACE_AUDIENCE</w:t>
+            </w:r>
+          </w:p>
+        </w:tc>
+        <w:tc>
+          <w:tcPr>
+            <w:tcW w:type="dxa" w:w="1560"/>
+            <w:vAlign w:val="center"/>
+            <w:tcMar>
+              <w:top w:w="80" w:type="dxa"/>
+              <w:start w:w="120" w:type="dxa"/>
+              <w:bottom w:w="80" w:type="dxa"/>
+              <w:end w:w="120" w:type="dxa"/>
+            </w:tcMar>
+          </w:tcPr>
+          <w:p>
+            <w:pPr>
+              <w:spacing w:after="0"/>
+              <w:jc w:val="left"/>
+            </w:pPr>
+            <w:r>
+              <w:rPr>
+                <w:rFonts w:ascii="Arial" w:hAnsi="Arial" w:eastAsia="Arial"/>
+                <w:b w:val="0"/>
+                <w:color w:val="111827"/>
+                <w:sz w:val="16"/>
+              </w:rPr>
+              <w:t>Собрать whitespace и аудиторные матрицы</w:t>
+            </w:r>
+          </w:p>
+        </w:tc>
+        <w:tc>
+          <w:tcPr>
+            <w:tcW w:type="dxa" w:w="1560"/>
+            <w:vAlign w:val="center"/>
+            <w:tcMar>
+              <w:top w:w="80" w:type="dxa"/>
+              <w:start w:w="120" w:type="dxa"/>
+              <w:bottom w:w="80" w:type="dxa"/>
+              <w:end w:w="120" w:type="dxa"/>
+            </w:tcMar>
+          </w:tcPr>
+          <w:p>
+            <w:pPr>
+              <w:spacing w:after="0"/>
+              <w:jc w:val="left"/>
+            </w:pPr>
+            <w:r>
+              <w:rPr>
+                <w:rFonts w:ascii="Arial" w:hAnsi="Arial" w:eastAsia="Arial"/>
+                <w:b w:val="0"/>
+                <w:color w:val="111827"/>
+                <w:sz w:val="16"/>
+              </w:rPr>
+              <w:t>покрыто как directional synthesis, validation остается открытой</w:t>
+            </w:r>
+          </w:p>
+        </w:tc>
+        <w:tc>
+          <w:tcPr>
+            <w:tcW w:type="dxa" w:w="1560"/>
+            <w:vAlign w:val="center"/>
+            <w:tcMar>
+              <w:top w:w="80" w:type="dxa"/>
+              <w:start w:w="120" w:type="dxa"/>
+              <w:bottom w:w="80" w:type="dxa"/>
+              <w:end w:w="120" w:type="dxa"/>
+            </w:tcMar>
+          </w:tcPr>
+          <w:p>
+            <w:pPr>
+              <w:spacing w:after="0"/>
+              <w:jc w:val="left"/>
+            </w:pPr>
+            <w:r>
+              <w:rPr>
+                <w:rFonts w:ascii="Arial" w:hAnsi="Arial" w:eastAsia="Arial"/>
+                <w:b w:val="0"/>
+                <w:color w:val="111827"/>
+                <w:sz w:val="16"/>
+              </w:rPr>
+              <w:t>5 synthesis rows; 6 whitespace rows; 6 ICP rows; 20492 audience signal rows</w:t>
+            </w:r>
+          </w:p>
+        </w:tc>
+        <w:tc>
+          <w:tcPr>
+            <w:tcW w:type="dxa" w:w="1560"/>
+            <w:vAlign w:val="center"/>
+            <w:tcMar>
+              <w:top w:w="80" w:type="dxa"/>
+              <w:start w:w="120" w:type="dxa"/>
+              <w:bottom w:w="80" w:type="dxa"/>
+              <w:end w:w="120" w:type="dxa"/>
+            </w:tcMar>
+          </w:tcPr>
+          <w:p>
+            <w:pPr>
+              <w:spacing w:after="0"/>
+              <w:jc w:val="left"/>
+            </w:pPr>
+            <w:r>
+              <w:rPr>
+                <w:rFonts w:ascii="Arial" w:hAnsi="Arial" w:eastAsia="Arial"/>
+                <w:b w:val="0"/>
+                <w:color w:val="111827"/>
+                <w:sz w:val="16"/>
+              </w:rPr>
+              <w:t>H3/H5 нельзя усиливать без manual walkthrough и recent-behavior interviews</w:t>
+            </w:r>
+          </w:p>
+        </w:tc>
+        <w:tc>
+          <w:tcPr>
+            <w:tcW w:type="dxa" w:w="1560"/>
+            <w:vAlign w:val="center"/>
+            <w:tcMar>
+              <w:top w:w="80" w:type="dxa"/>
+              <w:start w:w="120" w:type="dxa"/>
+              <w:bottom w:w="80" w:type="dxa"/>
+              <w:end w:w="120" w:type="dxa"/>
+            </w:tcMar>
+          </w:tcPr>
+          <w:p>
+            <w:pPr>
+              <w:spacing w:after="0"/>
+              <w:jc w:val="left"/>
+            </w:pPr>
+            <w:r>
+              <w:rPr>
+                <w:rFonts w:ascii="Arial" w:hAnsi="Arial" w:eastAsia="Arial"/>
+                <w:b w:val="0"/>
+                <w:color w:val="111827"/>
+                <w:sz w:val="16"/>
+              </w:rPr>
+              <w:t>исполнить первые 5 walkthrough и P0 ICP interview rows</w:t>
+            </w:r>
+          </w:p>
+        </w:tc>
+      </w:tr>
+      <w:tr>
+        <w:tc>
+          <w:tcPr>
+            <w:tcW w:type="dxa" w:w="1560"/>
+            <w:vAlign w:val="center"/>
+            <w:tcMar>
+              <w:top w:w="80" w:type="dxa"/>
+              <w:start w:w="120" w:type="dxa"/>
+              <w:bottom w:w="80" w:type="dxa"/>
+              <w:end w:w="120" w:type="dxa"/>
+            </w:tcMar>
+            <w:shd w:fill="F8FAFC"/>
+          </w:tcPr>
+          <w:p>
+            <w:pPr>
+              <w:spacing w:after="0"/>
+              <w:jc w:val="left"/>
+            </w:pPr>
+            <w:r>
+              <w:rPr>
+                <w:rFonts w:ascii="Arial" w:hAnsi="Arial" w:eastAsia="Arial"/>
+                <w:b w:val="0"/>
+                <w:color w:val="111827"/>
+                <w:sz w:val="16"/>
+              </w:rPr>
+              <w:t>GOAL_06_REPORT_RU</w:t>
+            </w:r>
+          </w:p>
+        </w:tc>
+        <w:tc>
+          <w:tcPr>
+            <w:tcW w:type="dxa" w:w="1560"/>
+            <w:vAlign w:val="center"/>
+            <w:tcMar>
+              <w:top w:w="80" w:type="dxa"/>
+              <w:start w:w="120" w:type="dxa"/>
+              <w:bottom w:w="80" w:type="dxa"/>
+              <w:end w:w="120" w:type="dxa"/>
+            </w:tcMar>
+            <w:shd w:fill="F8FAFC"/>
+          </w:tcPr>
+          <w:p>
+            <w:pPr>
+              <w:spacing w:after="0"/>
+              <w:jc w:val="left"/>
+            </w:pPr>
+            <w:r>
+              <w:rPr>
+                <w:rFonts w:ascii="Arial" w:hAnsi="Arial" w:eastAsia="Arial"/>
+                <w:b w:val="0"/>
+                <w:color w:val="111827"/>
+                <w:sz w:val="16"/>
+              </w:rPr>
+              <w:t>Собрать последовательный русский мировой отчет и PDF/DOCX</w:t>
+            </w:r>
+          </w:p>
+        </w:tc>
+        <w:tc>
+          <w:tcPr>
+            <w:tcW w:type="dxa" w:w="1560"/>
+            <w:vAlign w:val="center"/>
+            <w:tcMar>
+              <w:top w:w="80" w:type="dxa"/>
+              <w:start w:w="120" w:type="dxa"/>
+              <w:bottom w:w="80" w:type="dxa"/>
+              <w:end w:w="120" w:type="dxa"/>
+            </w:tcMar>
+            <w:shd w:fill="F8FAFC"/>
+          </w:tcPr>
+          <w:p>
+            <w:pPr>
+              <w:spacing w:after="0"/>
+              <w:jc w:val="left"/>
+            </w:pPr>
+            <w:r>
+              <w:rPr>
+                <w:rFonts w:ascii="Arial" w:hAnsi="Arial" w:eastAsia="Arial"/>
+                <w:b w:val="0"/>
+                <w:color w:val="111827"/>
+                <w:sz w:val="16"/>
+              </w:rPr>
+              <w:t>покрыто как draft, не финальная validated версия</w:t>
+            </w:r>
+          </w:p>
+        </w:tc>
+        <w:tc>
+          <w:tcPr>
+            <w:tcW w:type="dxa" w:w="1560"/>
+            <w:vAlign w:val="center"/>
+            <w:tcMar>
+              <w:top w:w="80" w:type="dxa"/>
+              <w:start w:w="120" w:type="dxa"/>
+              <w:bottom w:w="80" w:type="dxa"/>
+              <w:end w:w="120" w:type="dxa"/>
+            </w:tcMar>
+            <w:shd w:fill="F8FAFC"/>
+          </w:tcPr>
+          <w:p>
+            <w:pPr>
+              <w:spacing w:after="0"/>
+              <w:jc w:val="left"/>
+            </w:pPr>
+            <w:r>
+              <w:rPr>
+                <w:rFonts w:ascii="Arial" w:hAnsi="Arial" w:eastAsia="Arial"/>
+                <w:b w:val="0"/>
+                <w:color w:val="111827"/>
+                <w:sz w:val="16"/>
+              </w:rPr>
+              <w:t>global report md=yes; pdf=yes; docx=yes</w:t>
+            </w:r>
+          </w:p>
+        </w:tc>
+        <w:tc>
+          <w:tcPr>
+            <w:tcW w:type="dxa" w:w="1560"/>
+            <w:vAlign w:val="center"/>
+            <w:tcMar>
+              <w:top w:w="80" w:type="dxa"/>
+              <w:start w:w="120" w:type="dxa"/>
+              <w:bottom w:w="80" w:type="dxa"/>
+              <w:end w:w="120" w:type="dxa"/>
+            </w:tcMar>
+            <w:shd w:fill="F8FAFC"/>
+          </w:tcPr>
+          <w:p>
+            <w:pPr>
+              <w:spacing w:after="0"/>
+              <w:jc w:val="left"/>
+            </w:pPr>
+            <w:r>
+              <w:rPr>
+                <w:rFonts w:ascii="Arial" w:hAnsi="Arial" w:eastAsia="Arial"/>
+                <w:b w:val="0"/>
+                <w:color w:val="111827"/>
+                <w:sz w:val="16"/>
+              </w:rPr>
+              <w:t>финальная версия должна обновиться после observed validation rows</w:t>
+            </w:r>
+          </w:p>
+        </w:tc>
+        <w:tc>
+          <w:tcPr>
+            <w:tcW w:type="dxa" w:w="1560"/>
+            <w:vAlign w:val="center"/>
+            <w:tcMar>
+              <w:top w:w="80" w:type="dxa"/>
+              <w:start w:w="120" w:type="dxa"/>
+              <w:bottom w:w="80" w:type="dxa"/>
+              <w:end w:w="120" w:type="dxa"/>
+            </w:tcMar>
+            <w:shd w:fill="F8FAFC"/>
+          </w:tcPr>
+          <w:p>
+            <w:pPr>
+              <w:spacing w:after="0"/>
+              <w:jc w:val="left"/>
+            </w:pPr>
+            <w:r>
+              <w:rPr>
+                <w:rFonts w:ascii="Arial" w:hAnsi="Arial" w:eastAsia="Arial"/>
+                <w:b w:val="0"/>
+                <w:color w:val="111827"/>
+                <w:sz w:val="16"/>
+              </w:rPr>
+              <w:t>после capture rows пересобрать отчет и изменить claim language</w:t>
+            </w:r>
+          </w:p>
+        </w:tc>
+      </w:tr>
+      <w:tr>
+        <w:tc>
+          <w:tcPr>
+            <w:tcW w:type="dxa" w:w="1560"/>
+            <w:vAlign w:val="center"/>
+            <w:tcMar>
+              <w:top w:w="80" w:type="dxa"/>
+              <w:start w:w="120" w:type="dxa"/>
+              <w:bottom w:w="80" w:type="dxa"/>
+              <w:end w:w="120" w:type="dxa"/>
+            </w:tcMar>
+          </w:tcPr>
+          <w:p>
+            <w:pPr>
+              <w:spacing w:after="0"/>
+              <w:jc w:val="left"/>
+            </w:pPr>
+            <w:r>
+              <w:rPr>
+                <w:rFonts w:ascii="Arial" w:hAnsi="Arial" w:eastAsia="Arial"/>
+                <w:b w:val="0"/>
+                <w:color w:val="111827"/>
+                <w:sz w:val="16"/>
+              </w:rPr>
+              <w:t>GOAL_07_VERSIONING</w:t>
+            </w:r>
+          </w:p>
+        </w:tc>
+        <w:tc>
+          <w:tcPr>
+            <w:tcW w:type="dxa" w:w="1560"/>
+            <w:vAlign w:val="center"/>
+            <w:tcMar>
+              <w:top w:w="80" w:type="dxa"/>
+              <w:start w:w="120" w:type="dxa"/>
+              <w:bottom w:w="80" w:type="dxa"/>
+              <w:end w:w="120" w:type="dxa"/>
+            </w:tcMar>
+          </w:tcPr>
+          <w:p>
+            <w:pPr>
+              <w:spacing w:after="0"/>
+              <w:jc w:val="left"/>
+            </w:pPr>
+            <w:r>
+              <w:rPr>
+                <w:rFonts w:ascii="Arial" w:hAnsi="Arial" w:eastAsia="Arial"/>
+                <w:b w:val="0"/>
+                <w:color w:val="111827"/>
+                <w:sz w:val="16"/>
+              </w:rPr>
+              <w:t>Сохранять локально, трассировать источники и версионировать через GitHub</w:t>
+            </w:r>
+          </w:p>
+        </w:tc>
+        <w:tc>
+          <w:tcPr>
+            <w:tcW w:type="dxa" w:w="1560"/>
+            <w:vAlign w:val="center"/>
+            <w:tcMar>
+              <w:top w:w="80" w:type="dxa"/>
+              <w:start w:w="120" w:type="dxa"/>
+              <w:bottom w:w="80" w:type="dxa"/>
+              <w:end w:w="120" w:type="dxa"/>
+            </w:tcMar>
+          </w:tcPr>
+          <w:p>
+            <w:pPr>
+              <w:spacing w:after="0"/>
+              <w:jc w:val="left"/>
+            </w:pPr>
+            <w:r>
+              <w:rPr>
+                <w:rFonts w:ascii="Arial" w:hAnsi="Arial" w:eastAsia="Arial"/>
+                <w:b w:val="0"/>
+                <w:color w:val="111827"/>
+                <w:sz w:val="16"/>
+              </w:rPr>
+              <w:t>покрыто активно</w:t>
+            </w:r>
+          </w:p>
+        </w:tc>
+        <w:tc>
+          <w:tcPr>
+            <w:tcW w:type="dxa" w:w="1560"/>
+            <w:vAlign w:val="center"/>
+            <w:tcMar>
+              <w:top w:w="80" w:type="dxa"/>
+              <w:start w:w="120" w:type="dxa"/>
+              <w:bottom w:w="80" w:type="dxa"/>
+              <w:end w:w="120" w:type="dxa"/>
+            </w:tcMar>
+          </w:tcPr>
+          <w:p>
+            <w:pPr>
+              <w:spacing w:after="0"/>
+              <w:jc w:val="left"/>
+            </w:pPr>
+            <w:r>
+              <w:rPr>
+                <w:rFonts w:ascii="Arial" w:hAnsi="Arial" w:eastAsia="Arial"/>
+                <w:b w:val="0"/>
+                <w:color w:val="111827"/>
+                <w:sz w:val="16"/>
+              </w:rPr>
+              <w:t>manifest=468; missing=0; docs=114; scripts=101</w:t>
+            </w:r>
+          </w:p>
+        </w:tc>
+        <w:tc>
+          <w:tcPr>
+            <w:tcW w:type="dxa" w:w="1560"/>
+            <w:vAlign w:val="center"/>
+            <w:tcMar>
+              <w:top w:w="80" w:type="dxa"/>
+              <w:start w:w="120" w:type="dxa"/>
+              <w:bottom w:w="80" w:type="dxa"/>
+              <w:end w:w="120" w:type="dxa"/>
+            </w:tcMar>
+          </w:tcPr>
+          <w:p>
+            <w:pPr>
+              <w:spacing w:after="0"/>
+              <w:jc w:val="left"/>
+            </w:pPr>
+            <w:r>
+              <w:rPr>
+                <w:rFonts w:ascii="Arial" w:hAnsi="Arial" w:eastAsia="Arial"/>
+                <w:b w:val="0"/>
+                <w:color w:val="111827"/>
+                <w:sz w:val="16"/>
+              </w:rPr>
+              <w:t>manifest надо обновлять после каждого нового слоя</w:t>
+            </w:r>
+          </w:p>
+        </w:tc>
+        <w:tc>
+          <w:tcPr>
+            <w:tcW w:type="dxa" w:w="1560"/>
+            <w:vAlign w:val="center"/>
+            <w:tcMar>
+              <w:top w:w="80" w:type="dxa"/>
+              <w:start w:w="120" w:type="dxa"/>
+              <w:bottom w:w="80" w:type="dxa"/>
+              <w:end w:w="120" w:type="dxa"/>
+            </w:tcMar>
+          </w:tcPr>
+          <w:p>
+            <w:pPr>
+              <w:spacing w:after="0"/>
+              <w:jc w:val="left"/>
+            </w:pPr>
+            <w:r>
+              <w:rPr>
+                <w:rFonts w:ascii="Arial" w:hAnsi="Arial" w:eastAsia="Arial"/>
+                <w:b w:val="0"/>
+                <w:color w:val="111827"/>
+                <w:sz w:val="16"/>
+              </w:rPr>
+              <w:t>пересобирать manifest и делать commit/push после изменений</w:t>
+            </w:r>
+          </w:p>
+        </w:tc>
+      </w:tr>
+      <w:tr>
+        <w:tc>
+          <w:tcPr>
+            <w:tcW w:type="dxa" w:w="1560"/>
+            <w:vAlign w:val="center"/>
+            <w:tcMar>
+              <w:top w:w="80" w:type="dxa"/>
+              <w:start w:w="120" w:type="dxa"/>
+              <w:bottom w:w="80" w:type="dxa"/>
+              <w:end w:w="120" w:type="dxa"/>
+            </w:tcMar>
+            <w:shd w:fill="F8FAFC"/>
+          </w:tcPr>
+          <w:p>
+            <w:pPr>
+              <w:spacing w:after="0"/>
+              <w:jc w:val="left"/>
+            </w:pPr>
+            <w:r>
+              <w:rPr>
+                <w:rFonts w:ascii="Arial" w:hAnsi="Arial" w:eastAsia="Arial"/>
+                <w:b w:val="0"/>
+                <w:color w:val="111827"/>
+                <w:sz w:val="16"/>
+              </w:rPr>
+              <w:t>GOAL_08_VALIDATION</w:t>
+            </w:r>
+          </w:p>
+        </w:tc>
+        <w:tc>
+          <w:tcPr>
+            <w:tcW w:type="dxa" w:w="1560"/>
+            <w:vAlign w:val="center"/>
+            <w:tcMar>
+              <w:top w:w="80" w:type="dxa"/>
+              <w:start w:w="120" w:type="dxa"/>
+              <w:bottom w:w="80" w:type="dxa"/>
+              <w:end w:w="120" w:type="dxa"/>
+            </w:tcMar>
+            <w:shd w:fill="F8FAFC"/>
+          </w:tcPr>
+          <w:p>
+            <w:pPr>
+              <w:spacing w:after="0"/>
+              <w:jc w:val="left"/>
+            </w:pPr>
+            <w:r>
+              <w:rPr>
+                <w:rFonts w:ascii="Arial" w:hAnsi="Arial" w:eastAsia="Arial"/>
+                <w:b w:val="0"/>
+                <w:color w:val="111827"/>
+                <w:sz w:val="16"/>
+              </w:rPr>
+              <w:t>Критически мыслить и не закрывать гипотезы без observed evidence</w:t>
+            </w:r>
+          </w:p>
+        </w:tc>
+        <w:tc>
+          <w:tcPr>
+            <w:tcW w:type="dxa" w:w="1560"/>
+            <w:vAlign w:val="center"/>
+            <w:tcMar>
+              <w:top w:w="80" w:type="dxa"/>
+              <w:start w:w="120" w:type="dxa"/>
+              <w:bottom w:w="80" w:type="dxa"/>
+              <w:end w:w="120" w:type="dxa"/>
+            </w:tcMar>
+            <w:shd w:fill="F8FAFC"/>
+          </w:tcPr>
+          <w:p>
+            <w:pPr>
+              <w:spacing w:after="0"/>
+              <w:jc w:val="left"/>
+            </w:pPr>
+            <w:r>
+              <w:rPr>
+                <w:rFonts w:ascii="Arial" w:hAnsi="Arial" w:eastAsia="Arial"/>
+                <w:b w:val="0"/>
+                <w:color w:val="111827"/>
+                <w:sz w:val="16"/>
+              </w:rPr>
+              <w:t>открыто, capture-ready</w:t>
+            </w:r>
+          </w:p>
+        </w:tc>
+        <w:tc>
+          <w:tcPr>
+            <w:tcW w:type="dxa" w:w="1560"/>
+            <w:vAlign w:val="center"/>
+            <w:tcMar>
+              <w:top w:w="80" w:type="dxa"/>
+              <w:start w:w="120" w:type="dxa"/>
+              <w:bottom w:w="80" w:type="dxa"/>
+              <w:end w:w="120" w:type="dxa"/>
+            </w:tcMar>
+            <w:shd w:fill="F8FAFC"/>
+          </w:tcPr>
+          <w:p>
+            <w:pPr>
+              <w:spacing w:after="0"/>
+              <w:jc w:val="left"/>
+            </w:pPr>
+            <w:r>
+              <w:rPr>
+                <w:rFonts w:ascii="Arial" w:hAnsi="Arial" w:eastAsia="Arial"/>
+                <w:b w:val="0"/>
+                <w:color w:val="111827"/>
+                <w:sz w:val="16"/>
+              </w:rPr>
+              <w:t>gates=6; hold_validate=6; started=1; H2_completed=8/40; H1/H3/H4/H5/H6 observed rows still 0</w:t>
+            </w:r>
+          </w:p>
+        </w:tc>
+        <w:tc>
+          <w:tcPr>
+            <w:tcW w:type="dxa" w:w="1560"/>
+            <w:vAlign w:val="center"/>
+            <w:tcMar>
+              <w:top w:w="80" w:type="dxa"/>
+              <w:start w:w="120" w:type="dxa"/>
+              <w:bottom w:w="80" w:type="dxa"/>
+              <w:end w:w="120" w:type="dxa"/>
+            </w:tcMar>
+            <w:shd w:fill="F8FAFC"/>
+          </w:tcPr>
+          <w:p>
+            <w:pPr>
+              <w:spacing w:after="0"/>
+              <w:jc w:val="left"/>
+            </w:pPr>
+            <w:r>
+              <w:rPr>
+                <w:rFonts w:ascii="Arial" w:hAnsi="Arial" w:eastAsia="Arial"/>
+                <w:b w:val="0"/>
+                <w:color w:val="111827"/>
+                <w:sz w:val="16"/>
+              </w:rPr>
+              <w:t>цель нельзя считать завершенной, пока observed validation gates не закрыты или не понижены по evidence</w:t>
+            </w:r>
+          </w:p>
+        </w:tc>
+        <w:tc>
+          <w:tcPr>
+            <w:tcW w:type="dxa" w:w="1560"/>
+            <w:vAlign w:val="center"/>
+            <w:tcMar>
+              <w:top w:w="80" w:type="dxa"/>
+              <w:start w:w="120" w:type="dxa"/>
+              <w:bottom w:w="80" w:type="dxa"/>
+              <w:end w:w="120" w:type="dxa"/>
+            </w:tcMar>
+            <w:shd w:fill="F8FAFC"/>
+          </w:tcPr>
+          <w:p>
+            <w:pPr>
+              <w:spacing w:after="0"/>
+              <w:jc w:val="left"/>
+            </w:pPr>
+            <w:r>
+              <w:rPr>
+                <w:rFonts w:ascii="Arial" w:hAnsi="Arial" w:eastAsia="Arial"/>
+                <w:b w:val="0"/>
+                <w:color w:val="111827"/>
+                <w:sz w:val="16"/>
+              </w:rPr>
+              <w:t>исполнить P0 validation backlog и обновить gate statuses</w:t>
+            </w:r>
+          </w:p>
+        </w:tc>
+      </w:tr>
+    </w:tbl>
+    <w:p/>
+    <w:p>
+      <w:r>
+        <w:t>Главный вывод по этой карте: пакет уже масштабный и трассируемый, но не финально валидированный. Это правильное состояние для evidence-first ресерча: сильные desk/source слои готовы, а product/market claims остаются в hold_validate до ручных walkthrough, интервью, прототипа и WTP.</w:t>
+      </w:r>
+    </w:p>
+    <w:p>
+      <w:pPr>
+        <w:pStyle w:val="Heading1"/>
+      </w:pPr>
+      <w:r>
         <w:t>ИСТОЧНИКИ И ГРАНИЦЫ ДОКАЗАТЕЛЬСТВ</w:t>
       </w:r>
     </w:p>
@@ -17385,7 +18935,7 @@
                 <w:color w:val="111827"/>
                 <w:sz w:val="16"/>
               </w:rPr>
-              <w:t>465 manifest artifacts; missing=0</w:t>
+              <w:t>468 manifest artifacts; missing=0</w:t>
             </w:r>
           </w:p>
         </w:tc>
@@ -17550,6 +19100,15 @@
       </w:pPr>
       <w:r>
         <w:t>data_processed/global_whitespace_audience_synthesis.csv</w:t>
+      </w:r>
+    </w:p>
+    <w:p>
+      <w:pPr>
+        <w:pStyle w:val="ListBullet"/>
+        <w:spacing w:after="80"/>
+      </w:pPr>
+      <w:r>
+        <w:t>data_processed/global_goal_evidence_coverage.csv</w:t>
       </w:r>
     </w:p>
     <w:p>

</xml_diff>

<commit_message>
Extend paid flow local signoff
</commit_message>
<xml_diff>
--- a/output/docx/alina-global-hypothesis-report-v1.docx
+++ b/output/docx/alina-global-hypothesis-report-v1.docx
@@ -31,7 +31,7 @@
     </w:p>
     <w:p>
       <w:r>
-        <w:t>Собрано: 2026-05-31T15:39:46.472Z</w:t>
+        <w:t>Собрано: 2026-05-31T15:45:48.167Z</w:t>
       </w:r>
     </w:p>
     <w:p>
@@ -819,7 +819,7 @@
                 <w:color w:val="111827"/>
                 <w:sz w:val="16"/>
               </w:rPr>
-              <w:t>8 / 40</w:t>
+              <w:t>28 / 40</w:t>
             </w:r>
           </w:p>
         </w:tc>
@@ -1469,7 +1469,7 @@
     <w:p/>
     <w:p>
       <w:r>
-        <w:t>Практически это означает следующее: H2 уже имеет 8 заполненных paid-flow строк из 40, но еще ниже минимального порога; H1, H3, H4, H5 и H6 остаются в hold_validate, потому что по ним нет наблюдаемых capture rows. Это не слабость отчета, а защита от преждевременного вывода: большой массив конкурентов и источников показывает, куда идти, но не заменяет walkthrough, интервью и прототипные сессии.</w:t>
+        <w:t>Практически это означает следующее: H2 уже имеет 28 / 40 заполненных paid-flow строк и 8 / 12 успешных строк, но еще ниже минимального порога; H1, H3, H4, H5 и H6 остаются в hold_validate, потому что по ним нет наблюдаемых capture rows. Это не слабость отчета, а защита от преждевременного вывода: большой массив конкурентов и источников показывает, куда идти, но не заменяет walkthrough, интервью и прототипные сессии.</w:t>
       </w:r>
     </w:p>
     <w:p>
@@ -3216,7 +3216,7 @@
     <w:p/>
     <w:p>
       <w:r>
-        <w:t>Intersection SAM в текущей модели равен $202M. Это рабочая мировая рамка для дальнейшей проверки, а не обещание revenue. Локальный paid-flow signoff сейчас заполнен на 8 строках; H2 gate имеет статус in_progress_insufficient_evidence, потому что нужны еще in-app paywall walkthrough и willingness-to-pay evidence.</w:t>
+        <w:t>Intersection SAM в текущей модели равен $202M. Это рабочая мировая рамка для дальнейшей проверки, а не обещание revenue. Локальный paid-flow signoff сейчас заполнен на 28 строках; H2 gate имеет статус in_progress_insufficient_evidence, потому что нужны еще in-app paywall walkthrough и willingness-to-pay evidence.</w:t>
       </w:r>
     </w:p>
     <w:p>
@@ -17747,7 +17747,7 @@
                 <w:color w:val="111827"/>
                 <w:sz w:val="16"/>
               </w:rPr>
-              <w:t>gates=6; hold_validate=6; started=1; H2_completed=8/40; H1/H3/H4/H5/H6 observed rows still 0</w:t>
+              <w:t>gates=6; hold_validate=6; started=1; H2_completed=28 / 40; H2_success=8 / 12; H1/H3/H4/H5/H6 observed rows still 0</w:t>
             </w:r>
           </w:p>
         </w:tc>

</xml_diff>

<commit_message>
Add manual public listing signoff
</commit_message>
<xml_diff>
--- a/output/docx/alina-global-hypothesis-report-v1.docx
+++ b/output/docx/alina-global-hypothesis-report-v1.docx
@@ -31,7 +31,7 @@
     </w:p>
     <w:p>
       <w:r>
-        <w:t>Собрано: 2026-05-31T15:45:48.167Z</w:t>
+        <w:t>Собрано: 2026-05-31T15:49:49.784Z</w:t>
       </w:r>
     </w:p>
     <w:p>
@@ -59,7 +59,7 @@
     </w:p>
     <w:p>
       <w:r>
-        <w:t>На текущем этапе собрано 67,525 сырьевых source-строк, 36,694 уникализированных строк и 468 локальных артефактов. Эти данные нужны не для того, чтобы объявить продукт доказанным, а для последовательной проверки: существует ли рынок, есть ли деньги, насколько плотна конкуренция, где может быть белое пятно, кто аудитория и какую MVP-петлю надо тестировать.</w:t>
+        <w:t>На текущем этапе собрано 67,525 сырьевых source-строк, 36,694 уникализированных строк и 470 локальных артефактов. Эти данные нужны не для того, чтобы объявить продукт доказанным, а для последовательной проверки: существует ли рынок, есть ли деньги, насколько плотна конкуренция, где может быть белое пятно, кто аудитория и какую MVP-петлю надо тестировать.</w:t>
       </w:r>
     </w:p>
     <w:p>
@@ -403,7 +403,7 @@
                 <w:color w:val="111827"/>
                 <w:sz w:val="16"/>
               </w:rPr>
-              <w:t>не начато</w:t>
+              <w:t>начато, но доказательств недостаточно</w:t>
             </w:r>
           </w:p>
         </w:tc>
@@ -430,7 +430,7 @@
                 <w:color w:val="111827"/>
                 <w:sz w:val="16"/>
               </w:rPr>
-              <w:t>0 / 60</w:t>
+              <w:t>12 / 60</w:t>
             </w:r>
           </w:p>
         </w:tc>
@@ -598,7 +598,7 @@
                 <w:color w:val="111827"/>
                 <w:sz w:val="16"/>
               </w:rPr>
-              <w:t>не начато</w:t>
+              <w:t>начато, но доказательств недостаточно</w:t>
             </w:r>
           </w:p>
         </w:tc>
@@ -626,7 +626,7 @@
                 <w:color w:val="111827"/>
                 <w:sz w:val="16"/>
               </w:rPr>
-              <w:t>0 / 60</w:t>
+              <w:t>12 / 60</w:t>
             </w:r>
           </w:p>
         </w:tc>
@@ -1469,7 +1469,7 @@
     <w:p/>
     <w:p>
       <w:r>
-        <w:t>Практически это означает следующее: H2 уже имеет 28 / 40 заполненных paid-flow строк и 8 / 12 успешных строк, но еще ниже минимального порога; H1, H3, H4, H5 и H6 остаются в hold_validate, потому что по ним нет наблюдаемых capture rows. Это не слабость отчета, а защита от преждевременного вывода: большой массив конкурентов и источников показывает, куда идти, но не заменяет walkthrough, интервью и прототипные сессии.</w:t>
+        <w:t>Практически это означает следующее: H1 и H3 уже имеют по 12 / 60 listing-only строк, но 0 / 25 успешных app-walkthrough строк, поэтому hidden-clone риск остается открытым. H2 имеет 28 / 40 заполненных paid-flow строк и 8 / 12 успешных строк, но тоже ниже минимального порога. H4, H5 и H6 пока без наблюдаемых capture rows. Это не слабость отчета, а защита от преждевременного вывода: большой массив конкурентов и источников показывает, куда идти, но не заменяет walkthrough, интервью и прототипные сессии.</w:t>
       </w:r>
     </w:p>
     <w:p>
@@ -17579,7 +17579,7 @@
                 <w:color w:val="111827"/>
                 <w:sz w:val="16"/>
               </w:rPr>
-              <w:t>manifest=468; missing=0; docs=114; scripts=101</w:t>
+              <w:t>manifest=470; missing=0; docs=115; scripts=102</w:t>
             </w:r>
           </w:p>
         </w:tc>
@@ -17747,7 +17747,7 @@
                 <w:color w:val="111827"/>
                 <w:sz w:val="16"/>
               </w:rPr>
-              <w:t>gates=6; hold_validate=6; started=1; H2_completed=28 / 40; H2_success=8 / 12; H1/H3/H4/H5/H6 observed rows still 0</w:t>
+              <w:t>gates=6; hold_validate=6; started=3; H1_completed=12 / 60; H1_success=0 / 25; H3_completed=12 / 60; H3_success=0 / 25; H2_completed=28 / 40; H2_success=8 / 12; H4/H5/H6 observed rows still 0</w:t>
             </w:r>
           </w:p>
         </w:tc>
@@ -18935,7 +18935,7 @@
                 <w:color w:val="111827"/>
                 <w:sz w:val="16"/>
               </w:rPr>
-              <w:t>468 manifest artifacts; missing=0</w:t>
+              <w:t>470 manifest artifacts; missing=0</w:t>
             </w:r>
           </w:p>
         </w:tc>

</xml_diff>

<commit_message>
Add ICP secondary VOC signoff
</commit_message>
<xml_diff>
--- a/output/docx/alina-global-hypothesis-report-v1.docx
+++ b/output/docx/alina-global-hypothesis-report-v1.docx
@@ -31,7 +31,7 @@
     </w:p>
     <w:p>
       <w:r>
-        <w:t>Собрано: 2026-05-31T15:49:49.784Z</w:t>
+        <w:t>Собрано: 2026-05-31T15:53:34.403Z</w:t>
       </w:r>
     </w:p>
     <w:p>
@@ -59,7 +59,7 @@
     </w:p>
     <w:p>
       <w:r>
-        <w:t>На текущем этапе собрано 67,525 сырьевых source-строк, 36,694 уникализированных строк и 470 локальных артефактов. Эти данные нужны не для того, чтобы объявить продукт доказанным, а для последовательной проверки: существует ли рынок, есть ли деньги, насколько плотна конкуренция, где может быть белое пятно, кто аудитория и какую MVP-петлю надо тестировать.</w:t>
+        <w:t>На текущем этапе собрано 67,525 сырьевых source-строк, 36,694 уникализированных строк и 472 локальных артефактов. Эти данные нужны не для того, чтобы объявить продукт доказанным, а для последовательной проверки: существует ли рынок, есть ли деньги, насколько плотна конкуренция, где может быть белое пятно, кто аудитория и какую MVP-петлю надо тестировать.</w:t>
       </w:r>
     </w:p>
     <w:p>
@@ -987,7 +987,7 @@
                 <w:color w:val="111827"/>
                 <w:sz w:val="16"/>
               </w:rPr>
-              <w:t>не начато</w:t>
+              <w:t>начато, но доказательств недостаточно</w:t>
             </w:r>
           </w:p>
         </w:tc>
@@ -1015,7 +1015,7 @@
                 <w:color w:val="111827"/>
                 <w:sz w:val="16"/>
               </w:rPr>
-              <w:t>0 / 96</w:t>
+              <w:t>12 / 96</w:t>
             </w:r>
           </w:p>
         </w:tc>
@@ -1469,7 +1469,7 @@
     <w:p/>
     <w:p>
       <w:r>
-        <w:t>Практически это означает следующее: H1 и H3 уже имеют по 12 / 60 listing-only строк, но 0 / 25 успешных app-walkthrough строк, поэтому hidden-clone риск остается открытым. H2 имеет 28 / 40 заполненных paid-flow строк и 8 / 12 успешных строк, но тоже ниже минимального порога. H4, H5 и H6 пока без наблюдаемых capture rows. Это не слабость отчета, а защита от преждевременного вывода: большой массив конкурентов и источников показывает, куда идти, но не заменяет walkthrough, интервью и прототипные сессии.</w:t>
+        <w:t>Практически это означает следующее: H1 и H3 уже имеют по 12 / 60 listing-only строк, но 0 / 25 успешных app-walkthrough строк, поэтому hidden-clone риск остается открытым. H2 имеет 28 / 40 заполненных paid-flow строк и 8 / 12 успешных строк, но тоже ниже минимального порога. H5 имеет 12 / 96 secondary VOC строк и 0 / 30 успешных interview строк: это контекст для рекрутинга, а не доказательство аудитории. H4 и H6 пока без наблюдаемых prototype rows. Это не слабость отчета, а защита от преждевременного вывода: большой массив конкурентов и источников показывает, куда идти, но не заменяет walkthrough, интервью и прототипные сессии.</w:t>
       </w:r>
     </w:p>
     <w:p>
@@ -17579,7 +17579,7 @@
                 <w:color w:val="111827"/>
                 <w:sz w:val="16"/>
               </w:rPr>
-              <w:t>manifest=470; missing=0; docs=115; scripts=102</w:t>
+              <w:t>manifest=472; missing=0; docs=116; scripts=103</w:t>
             </w:r>
           </w:p>
         </w:tc>
@@ -17747,7 +17747,7 @@
                 <w:color w:val="111827"/>
                 <w:sz w:val="16"/>
               </w:rPr>
-              <w:t>gates=6; hold_validate=6; started=3; H1_completed=12 / 60; H1_success=0 / 25; H3_completed=12 / 60; H3_success=0 / 25; H2_completed=28 / 40; H2_success=8 / 12; H4/H5/H6 observed rows still 0</w:t>
+              <w:t>gates=6; hold_validate=6; started=4; H1_completed=12 / 60; H1_success=0 / 25; H3_completed=12 / 60; H3_success=0 / 25; H2_completed=28 / 40; H2_success=8 / 12; H5_completed=12 / 96; H5_success=0 / 30; H4/H6 observed rows still 0</w:t>
             </w:r>
           </w:p>
         </w:tc>
@@ -18935,7 +18935,7 @@
                 <w:color w:val="111827"/>
                 <w:sz w:val="16"/>
               </w:rPr>
-              <w:t>470 manifest artifacts; missing=0</w:t>
+              <w:t>472 manifest artifacts; missing=0</w:t>
             </w:r>
           </w:p>
         </w:tc>

</xml_diff>

<commit_message>
Add prototype readiness signoff
</commit_message>
<xml_diff>
--- a/output/docx/alina-global-hypothesis-report-v1.docx
+++ b/output/docx/alina-global-hypothesis-report-v1.docx
@@ -31,7 +31,7 @@
     </w:p>
     <w:p>
       <w:r>
-        <w:t>Собрано: 2026-05-31T15:53:34.403Z</w:t>
+        <w:t>Собрано: 2026-05-31T15:57:13.799Z</w:t>
       </w:r>
     </w:p>
     <w:p>
@@ -59,7 +59,7 @@
     </w:p>
     <w:p>
       <w:r>
-        <w:t>На текущем этапе собрано 67,525 сырьевых source-строк, 36,694 уникализированных строк и 472 локальных артефактов. Эти данные нужны не для того, чтобы объявить продукт доказанным, а для последовательной проверки: существует ли рынок, есть ли деньги, насколько плотна конкуренция, где может быть белое пятно, кто аудитория и какую MVP-петлю надо тестировать.</w:t>
+        <w:t>На текущем этапе собрано 67,525 сырьевых source-строк, 36,694 уникализированных строк и 474 локальных артефактов. Эти данные нужны не для того, чтобы объявить продукт доказанным, а для последовательной проверки: существует ли рынок, есть ли деньги, насколько плотна конкуренция, где может быть белое пятно, кто аудитория и какую MVP-петлю надо тестировать.</w:t>
       </w:r>
     </w:p>
     <w:p>
@@ -1181,7 +1181,7 @@
                 <w:color w:val="111827"/>
                 <w:sz w:val="16"/>
               </w:rPr>
-              <w:t>не начато</w:t>
+              <w:t>начато, но доказательств недостаточно</w:t>
             </w:r>
           </w:p>
         </w:tc>
@@ -1208,7 +1208,7 @@
                 <w:color w:val="111827"/>
                 <w:sz w:val="16"/>
               </w:rPr>
-              <w:t>0 / 80</w:t>
+              <w:t>16 / 80</w:t>
             </w:r>
           </w:p>
         </w:tc>
@@ -1376,7 +1376,7 @@
                 <w:color w:val="111827"/>
                 <w:sz w:val="16"/>
               </w:rPr>
-              <w:t>не начато</w:t>
+              <w:t>начато, но доказательств недостаточно</w:t>
             </w:r>
           </w:p>
         </w:tc>
@@ -1404,7 +1404,7 @@
                 <w:color w:val="111827"/>
                 <w:sz w:val="16"/>
               </w:rPr>
-              <w:t>0 / 80</w:t>
+              <w:t>16 / 80</w:t>
             </w:r>
           </w:p>
         </w:tc>
@@ -1469,7 +1469,7 @@
     <w:p/>
     <w:p>
       <w:r>
-        <w:t>Практически это означает следующее: H1 и H3 уже имеют по 12 / 60 listing-only строк, но 0 / 25 успешных app-walkthrough строк, поэтому hidden-clone риск остается открытым. H2 имеет 28 / 40 заполненных paid-flow строк и 8 / 12 успешных строк, но тоже ниже минимального порога. H5 имеет 12 / 96 secondary VOC строк и 0 / 30 успешных interview строк: это контекст для рекрутинга, а не доказательство аудитории. H4 и H6 пока без наблюдаемых prototype rows. Это не слабость отчета, а защита от преждевременного вывода: большой массив конкурентов и источников показывает, куда идти, но не заменяет walkthrough, интервью и прототипные сессии.</w:t>
+        <w:t>Практически это означает следующее: H1 и H3 уже имеют по 12 / 60 listing-only строк, но 0 / 25 успешных app-walkthrough строк, поэтому hidden-clone риск остается открытым. H2 имеет 28 / 40 заполненных paid-flow строк и 8 / 12 успешных строк, но тоже ниже минимального порога. H5 имеет 12 / 96 secondary VOC строк и 0 / 30 успешных interview строк: это контекст для рекрутинга, а не доказательство аудитории. H4 и H6 имеют по 16 / 80 prototype-readiness строк, но 0 / 32 успешных user-session строк. Это не слабость отчета, а защита от преждевременного вывода: большой массив конкурентов и источников показывает, куда идти, но не заменяет walkthrough, интервью и прототипные сессии.</w:t>
       </w:r>
     </w:p>
     <w:p>
@@ -16745,7 +16745,7 @@
                 <w:color w:val="111827"/>
                 <w:sz w:val="16"/>
               </w:rPr>
-              <w:t>raw=67525; dedup=36694; dedup50_status=open; source_refs=239842</w:t>
+              <w:t>raw=67525; dedup=36694; dedup50_status=open; source_refs=239841</w:t>
             </w:r>
           </w:p>
         </w:tc>
@@ -17579,7 +17579,7 @@
                 <w:color w:val="111827"/>
                 <w:sz w:val="16"/>
               </w:rPr>
-              <w:t>manifest=472; missing=0; docs=116; scripts=103</w:t>
+              <w:t>manifest=474; missing=0; docs=117; scripts=104</w:t>
             </w:r>
           </w:p>
         </w:tc>
@@ -17747,7 +17747,7 @@
                 <w:color w:val="111827"/>
                 <w:sz w:val="16"/>
               </w:rPr>
-              <w:t>gates=6; hold_validate=6; started=4; H1_completed=12 / 60; H1_success=0 / 25; H3_completed=12 / 60; H3_success=0 / 25; H2_completed=28 / 40; H2_success=8 / 12; H5_completed=12 / 96; H5_success=0 / 30; H4/H6 observed rows still 0</w:t>
+              <w:t>gates=6; hold_validate=6; started=6; H1_completed=12 / 60; H1_success=0 / 25; H3_completed=12 / 60; H3_success=0 / 25; H2_completed=28 / 40; H2_success=8 / 12; H5_completed=12 / 96; H5_success=0 / 30; H4_completed=16 / 80; H4_success=0 / 32; H6_completed=16 / 80; H6_success=0 / 32</w:t>
             </w:r>
           </w:p>
         </w:tc>
@@ -18935,7 +18935,7 @@
                 <w:color w:val="111827"/>
                 <w:sz w:val="16"/>
               </w:rPr>
-              <w:t>472 manifest artifacts; missing=0</w:t>
+              <w:t>474 manifest artifacts; missing=0</w:t>
             </w:r>
           </w:p>
         </w:tc>

</xml_diff>

<commit_message>
Add global validation executive rollup
</commit_message>
<xml_diff>
--- a/output/docx/alina-global-hypothesis-report-v1.docx
+++ b/output/docx/alina-global-hypothesis-report-v1.docx
@@ -31,7 +31,7 @@
     </w:p>
     <w:p>
       <w:r>
-        <w:t>Собрано: 2026-05-31T15:57:13.799Z</w:t>
+        <w:t>Собрано: 2026-05-31T16:00:41.327Z</w:t>
       </w:r>
     </w:p>
     <w:p>
@@ -1472,6 +1472,1217 @@
         <w:t>Практически это означает следующее: H1 и H3 уже имеют по 12 / 60 listing-only строк, но 0 / 25 успешных app-walkthrough строк, поэтому hidden-clone риск остается открытым. H2 имеет 28 / 40 заполненных paid-flow строк и 8 / 12 успешных строк, но тоже ниже минимального порога. H5 имеет 12 / 96 secondary VOC строк и 0 / 30 успешных interview строк: это контекст для рекрутинга, а не доказательство аудитории. H4 и H6 имеют по 16 / 80 prototype-readiness строк, но 0 / 32 успешных user-session строк. Это не слабость отчета, а защита от преждевременного вывода: большой массив конкурентов и источников показывает, куда идти, но не заменяет walkthrough, интервью и прототипные сессии.</w:t>
       </w:r>
     </w:p>
+    <w:p>
+      <w:pPr>
+        <w:pStyle w:val="Heading2"/>
+      </w:pPr>
+      <w:r>
+        <w:t>Управленческий rollup по validation evidence</w:t>
+      </w:r>
+    </w:p>
+    <w:p>
+      <w:r>
+        <w:t>Чтобы не путать подготовленный research layer с реальной валидацией, ниже сведены типы evidence по каждому gate. Важная граница: listing-only, secondary VOC и prototype-readiness помогают запускать проверку, но не апгрейдят гипотезы без наблюдаемых walkthrough/interview/session результатов.</w:t>
+      </w:r>
+    </w:p>
+    <w:tbl>
+      <w:tblPr>
+        <w:tblW w:type="dxa" w:w="9360"/>
+        <w:jc w:val="left"/>
+        <w:tblLayout w:type="fixed"/>
+        <w:tblLook w:firstColumn="1" w:firstRow="1" w:lastColumn="0" w:lastRow="0" w:noHBand="0" w:noVBand="1" w:val="04A0"/>
+        <w:tblInd w:w="120" w:type="dxa"/>
+        <w:tblBorders>
+          <w:top w:val="single" w:sz="4" w:space="0" w:color="CBD5E1"/>
+          <w:left w:val="single" w:sz="4" w:space="0" w:color="CBD5E1"/>
+          <w:bottom w:val="single" w:sz="4" w:space="0" w:color="CBD5E1"/>
+          <w:right w:val="single" w:sz="4" w:space="0" w:color="CBD5E1"/>
+          <w:insideH w:val="single" w:sz="4" w:space="0" w:color="CBD5E1"/>
+          <w:insideV w:val="single" w:sz="4" w:space="0" w:color="CBD5E1"/>
+        </w:tblBorders>
+      </w:tblPr>
+      <w:tblGrid>
+        <w:gridCol w:w="1560"/>
+        <w:gridCol w:w="1560"/>
+        <w:gridCol w:w="1560"/>
+        <w:gridCol w:w="1560"/>
+        <w:gridCol w:w="1560"/>
+        <w:gridCol w:w="1560"/>
+      </w:tblGrid>
+      <w:tr>
+        <w:tc>
+          <w:tcPr>
+            <w:tcW w:type="dxa" w:w="1560"/>
+            <w:vAlign w:val="center"/>
+            <w:tcMar>
+              <w:top w:w="80" w:type="dxa"/>
+              <w:start w:w="120" w:type="dxa"/>
+              <w:bottom w:w="80" w:type="dxa"/>
+              <w:end w:w="120" w:type="dxa"/>
+            </w:tcMar>
+            <w:shd w:fill="E8EEF5"/>
+          </w:tcPr>
+          <w:p>
+            <w:pPr>
+              <w:spacing w:after="0"/>
+              <w:jc w:val="left"/>
+            </w:pPr>
+            <w:r>
+              <w:rPr>
+                <w:rFonts w:ascii="Arial" w:hAnsi="Arial" w:eastAsia="Arial"/>
+                <w:b/>
+                <w:color w:val="111827"/>
+                <w:sz w:val="16"/>
+              </w:rPr>
+              <w:t>H</w:t>
+            </w:r>
+          </w:p>
+        </w:tc>
+        <w:tc>
+          <w:tcPr>
+            <w:tcW w:type="dxa" w:w="1560"/>
+            <w:vAlign w:val="center"/>
+            <w:tcMar>
+              <w:top w:w="80" w:type="dxa"/>
+              <w:start w:w="120" w:type="dxa"/>
+              <w:bottom w:w="80" w:type="dxa"/>
+              <w:end w:w="120" w:type="dxa"/>
+            </w:tcMar>
+            <w:shd w:fill="E8EEF5"/>
+          </w:tcPr>
+          <w:p>
+            <w:pPr>
+              <w:spacing w:after="0"/>
+              <w:jc w:val="left"/>
+            </w:pPr>
+            <w:r>
+              <w:rPr>
+                <w:rFonts w:ascii="Arial" w:hAnsi="Arial" w:eastAsia="Arial"/>
+                <w:b/>
+                <w:color w:val="111827"/>
+                <w:sz w:val="16"/>
+              </w:rPr>
+              <w:t>Тип evidence сейчас</w:t>
+            </w:r>
+          </w:p>
+        </w:tc>
+        <w:tc>
+          <w:tcPr>
+            <w:tcW w:type="dxa" w:w="1560"/>
+            <w:vAlign w:val="center"/>
+            <w:tcMar>
+              <w:top w:w="80" w:type="dxa"/>
+              <w:start w:w="120" w:type="dxa"/>
+              <w:bottom w:w="80" w:type="dxa"/>
+              <w:end w:w="120" w:type="dxa"/>
+            </w:tcMar>
+            <w:shd w:fill="E8EEF5"/>
+          </w:tcPr>
+          <w:p>
+            <w:pPr>
+              <w:spacing w:after="0"/>
+              <w:jc w:val="left"/>
+            </w:pPr>
+            <w:r>
+              <w:rPr>
+                <w:rFonts w:ascii="Arial" w:hAnsi="Arial" w:eastAsia="Arial"/>
+                <w:b/>
+                <w:color w:val="111827"/>
+                <w:sz w:val="16"/>
+              </w:rPr>
+              <w:t>Rows</w:t>
+            </w:r>
+          </w:p>
+        </w:tc>
+        <w:tc>
+          <w:tcPr>
+            <w:tcW w:type="dxa" w:w="1560"/>
+            <w:vAlign w:val="center"/>
+            <w:tcMar>
+              <w:top w:w="80" w:type="dxa"/>
+              <w:start w:w="120" w:type="dxa"/>
+              <w:bottom w:w="80" w:type="dxa"/>
+              <w:end w:w="120" w:type="dxa"/>
+            </w:tcMar>
+            <w:shd w:fill="E8EEF5"/>
+          </w:tcPr>
+          <w:p>
+            <w:pPr>
+              <w:spacing w:after="0"/>
+              <w:jc w:val="left"/>
+            </w:pPr>
+            <w:r>
+              <w:rPr>
+                <w:rFonts w:ascii="Arial" w:hAnsi="Arial" w:eastAsia="Arial"/>
+                <w:b/>
+                <w:color w:val="111827"/>
+                <w:sz w:val="16"/>
+              </w:rPr>
+              <w:t>Success</w:t>
+            </w:r>
+          </w:p>
+        </w:tc>
+        <w:tc>
+          <w:tcPr>
+            <w:tcW w:type="dxa" w:w="1560"/>
+            <w:vAlign w:val="center"/>
+            <w:tcMar>
+              <w:top w:w="80" w:type="dxa"/>
+              <w:start w:w="120" w:type="dxa"/>
+              <w:bottom w:w="80" w:type="dxa"/>
+              <w:end w:w="120" w:type="dxa"/>
+            </w:tcMar>
+            <w:shd w:fill="E8EEF5"/>
+          </w:tcPr>
+          <w:p>
+            <w:pPr>
+              <w:spacing w:after="0"/>
+              <w:jc w:val="left"/>
+            </w:pPr>
+            <w:r>
+              <w:rPr>
+                <w:rFonts w:ascii="Arial" w:hAnsi="Arial" w:eastAsia="Arial"/>
+                <w:b/>
+                <w:color w:val="111827"/>
+                <w:sz w:val="16"/>
+              </w:rPr>
+              <w:t>Success gap</w:t>
+            </w:r>
+          </w:p>
+        </w:tc>
+        <w:tc>
+          <w:tcPr>
+            <w:tcW w:type="dxa" w:w="1560"/>
+            <w:vAlign w:val="center"/>
+            <w:tcMar>
+              <w:top w:w="80" w:type="dxa"/>
+              <w:start w:w="120" w:type="dxa"/>
+              <w:bottom w:w="80" w:type="dxa"/>
+              <w:end w:w="120" w:type="dxa"/>
+            </w:tcMar>
+            <w:shd w:fill="E8EEF5"/>
+          </w:tcPr>
+          <w:p>
+            <w:pPr>
+              <w:spacing w:after="0"/>
+              <w:jc w:val="left"/>
+            </w:pPr>
+            <w:r>
+              <w:rPr>
+                <w:rFonts w:ascii="Arial" w:hAnsi="Arial" w:eastAsia="Arial"/>
+                <w:b/>
+                <w:color w:val="111827"/>
+                <w:sz w:val="16"/>
+              </w:rPr>
+              <w:t>Следующий реальный validation step</w:t>
+            </w:r>
+          </w:p>
+        </w:tc>
+      </w:tr>
+      <w:tr>
+        <w:tc>
+          <w:tcPr>
+            <w:tcW w:type="dxa" w:w="1560"/>
+            <w:vAlign w:val="center"/>
+            <w:tcMar>
+              <w:top w:w="80" w:type="dxa"/>
+              <w:start w:w="120" w:type="dxa"/>
+              <w:bottom w:w="80" w:type="dxa"/>
+              <w:end w:w="120" w:type="dxa"/>
+            </w:tcMar>
+          </w:tcPr>
+          <w:p>
+            <w:pPr>
+              <w:spacing w:after="0"/>
+              <w:jc w:val="left"/>
+            </w:pPr>
+            <w:r>
+              <w:rPr>
+                <w:rFonts w:ascii="Arial" w:hAnsi="Arial" w:eastAsia="Arial"/>
+                <w:b w:val="0"/>
+                <w:color w:val="111827"/>
+                <w:sz w:val="16"/>
+              </w:rPr>
+              <w:t>H1</w:t>
+            </w:r>
+          </w:p>
+        </w:tc>
+        <w:tc>
+          <w:tcPr>
+            <w:tcW w:type="dxa" w:w="1560"/>
+            <w:vAlign w:val="center"/>
+            <w:tcMar>
+              <w:top w:w="80" w:type="dxa"/>
+              <w:start w:w="120" w:type="dxa"/>
+              <w:bottom w:w="80" w:type="dxa"/>
+              <w:end w:w="120" w:type="dxa"/>
+            </w:tcMar>
+          </w:tcPr>
+          <w:p>
+            <w:pPr>
+              <w:spacing w:after="0"/>
+              <w:jc w:val="left"/>
+            </w:pPr>
+            <w:r>
+              <w:rPr>
+                <w:rFonts w:ascii="Arial" w:hAnsi="Arial" w:eastAsia="Arial"/>
+                <w:b w:val="0"/>
+                <w:color w:val="111827"/>
+                <w:sz w:val="16"/>
+              </w:rPr>
+              <w:t>listing-only evidence</w:t>
+            </w:r>
+          </w:p>
+        </w:tc>
+        <w:tc>
+          <w:tcPr>
+            <w:tcW w:type="dxa" w:w="1560"/>
+            <w:vAlign w:val="center"/>
+            <w:tcMar>
+              <w:top w:w="80" w:type="dxa"/>
+              <w:start w:w="120" w:type="dxa"/>
+              <w:bottom w:w="80" w:type="dxa"/>
+              <w:end w:w="120" w:type="dxa"/>
+            </w:tcMar>
+          </w:tcPr>
+          <w:p>
+            <w:pPr>
+              <w:spacing w:after="0"/>
+              <w:jc w:val="left"/>
+            </w:pPr>
+            <w:r>
+              <w:rPr>
+                <w:rFonts w:ascii="Arial" w:hAnsi="Arial" w:eastAsia="Arial"/>
+                <w:b w:val="0"/>
+                <w:color w:val="111827"/>
+                <w:sz w:val="16"/>
+              </w:rPr>
+              <w:t>12 / 60</w:t>
+            </w:r>
+          </w:p>
+        </w:tc>
+        <w:tc>
+          <w:tcPr>
+            <w:tcW w:type="dxa" w:w="1560"/>
+            <w:vAlign w:val="center"/>
+            <w:tcMar>
+              <w:top w:w="80" w:type="dxa"/>
+              <w:start w:w="120" w:type="dxa"/>
+              <w:bottom w:w="80" w:type="dxa"/>
+              <w:end w:w="120" w:type="dxa"/>
+            </w:tcMar>
+          </w:tcPr>
+          <w:p>
+            <w:pPr>
+              <w:spacing w:after="0"/>
+              <w:jc w:val="left"/>
+            </w:pPr>
+            <w:r>
+              <w:rPr>
+                <w:rFonts w:ascii="Arial" w:hAnsi="Arial" w:eastAsia="Arial"/>
+                <w:b w:val="0"/>
+                <w:color w:val="111827"/>
+                <w:sz w:val="16"/>
+              </w:rPr>
+              <w:t>0 / 25</w:t>
+            </w:r>
+          </w:p>
+        </w:tc>
+        <w:tc>
+          <w:tcPr>
+            <w:tcW w:type="dxa" w:w="1560"/>
+            <w:vAlign w:val="center"/>
+            <w:tcMar>
+              <w:top w:w="80" w:type="dxa"/>
+              <w:start w:w="120" w:type="dxa"/>
+              <w:bottom w:w="80" w:type="dxa"/>
+              <w:end w:w="120" w:type="dxa"/>
+            </w:tcMar>
+          </w:tcPr>
+          <w:p>
+            <w:pPr>
+              <w:spacing w:after="0"/>
+              <w:jc w:val="left"/>
+            </w:pPr>
+            <w:r>
+              <w:rPr>
+                <w:rFonts w:ascii="Arial" w:hAnsi="Arial" w:eastAsia="Arial"/>
+                <w:b w:val="0"/>
+                <w:color w:val="111827"/>
+                <w:sz w:val="16"/>
+              </w:rPr>
+              <w:t>25</w:t>
+            </w:r>
+          </w:p>
+        </w:tc>
+        <w:tc>
+          <w:tcPr>
+            <w:tcW w:type="dxa" w:w="1560"/>
+            <w:vAlign w:val="center"/>
+            <w:tcMar>
+              <w:top w:w="80" w:type="dxa"/>
+              <w:start w:w="120" w:type="dxa"/>
+              <w:bottom w:w="80" w:type="dxa"/>
+              <w:end w:w="120" w:type="dxa"/>
+            </w:tcMar>
+          </w:tcPr>
+          <w:p>
+            <w:pPr>
+              <w:spacing w:after="0"/>
+              <w:jc w:val="left"/>
+            </w:pPr>
+            <w:r>
+              <w:rPr>
+                <w:rFonts w:ascii="Arial" w:hAnsi="Arial" w:eastAsia="Arial"/>
+                <w:b w:val="0"/>
+                <w:color w:val="111827"/>
+                <w:sz w:val="16"/>
+              </w:rPr>
+              <w:t>пройти первые 5 P0-приложений от listing до onboarding, first action, avatar/progress feedback и paywall boundary</w:t>
+            </w:r>
+          </w:p>
+        </w:tc>
+      </w:tr>
+      <w:tr>
+        <w:tc>
+          <w:tcPr>
+            <w:tcW w:type="dxa" w:w="1560"/>
+            <w:vAlign w:val="center"/>
+            <w:tcMar>
+              <w:top w:w="80" w:type="dxa"/>
+              <w:start w:w="120" w:type="dxa"/>
+              <w:bottom w:w="80" w:type="dxa"/>
+              <w:end w:w="120" w:type="dxa"/>
+            </w:tcMar>
+            <w:shd w:fill="F8FAFC"/>
+          </w:tcPr>
+          <w:p>
+            <w:pPr>
+              <w:spacing w:after="0"/>
+              <w:jc w:val="left"/>
+            </w:pPr>
+            <w:r>
+              <w:rPr>
+                <w:rFonts w:ascii="Arial" w:hAnsi="Arial" w:eastAsia="Arial"/>
+                <w:b w:val="0"/>
+                <w:color w:val="111827"/>
+                <w:sz w:val="16"/>
+              </w:rPr>
+              <w:t>H3</w:t>
+            </w:r>
+          </w:p>
+        </w:tc>
+        <w:tc>
+          <w:tcPr>
+            <w:tcW w:type="dxa" w:w="1560"/>
+            <w:vAlign w:val="center"/>
+            <w:tcMar>
+              <w:top w:w="80" w:type="dxa"/>
+              <w:start w:w="120" w:type="dxa"/>
+              <w:bottom w:w="80" w:type="dxa"/>
+              <w:end w:w="120" w:type="dxa"/>
+            </w:tcMar>
+            <w:shd w:fill="F8FAFC"/>
+          </w:tcPr>
+          <w:p>
+            <w:pPr>
+              <w:spacing w:after="0"/>
+              <w:jc w:val="left"/>
+            </w:pPr>
+            <w:r>
+              <w:rPr>
+                <w:rFonts w:ascii="Arial" w:hAnsi="Arial" w:eastAsia="Arial"/>
+                <w:b w:val="0"/>
+                <w:color w:val="111827"/>
+                <w:sz w:val="16"/>
+              </w:rPr>
+              <w:t>listing-only whitespace risk evidence</w:t>
+            </w:r>
+          </w:p>
+        </w:tc>
+        <w:tc>
+          <w:tcPr>
+            <w:tcW w:type="dxa" w:w="1560"/>
+            <w:vAlign w:val="center"/>
+            <w:tcMar>
+              <w:top w:w="80" w:type="dxa"/>
+              <w:start w:w="120" w:type="dxa"/>
+              <w:bottom w:w="80" w:type="dxa"/>
+              <w:end w:w="120" w:type="dxa"/>
+            </w:tcMar>
+            <w:shd w:fill="F8FAFC"/>
+          </w:tcPr>
+          <w:p>
+            <w:pPr>
+              <w:spacing w:after="0"/>
+              <w:jc w:val="left"/>
+            </w:pPr>
+            <w:r>
+              <w:rPr>
+                <w:rFonts w:ascii="Arial" w:hAnsi="Arial" w:eastAsia="Arial"/>
+                <w:b w:val="0"/>
+                <w:color w:val="111827"/>
+                <w:sz w:val="16"/>
+              </w:rPr>
+              <w:t>12 / 60</w:t>
+            </w:r>
+          </w:p>
+        </w:tc>
+        <w:tc>
+          <w:tcPr>
+            <w:tcW w:type="dxa" w:w="1560"/>
+            <w:vAlign w:val="center"/>
+            <w:tcMar>
+              <w:top w:w="80" w:type="dxa"/>
+              <w:start w:w="120" w:type="dxa"/>
+              <w:bottom w:w="80" w:type="dxa"/>
+              <w:end w:w="120" w:type="dxa"/>
+            </w:tcMar>
+            <w:shd w:fill="F8FAFC"/>
+          </w:tcPr>
+          <w:p>
+            <w:pPr>
+              <w:spacing w:after="0"/>
+              <w:jc w:val="left"/>
+            </w:pPr>
+            <w:r>
+              <w:rPr>
+                <w:rFonts w:ascii="Arial" w:hAnsi="Arial" w:eastAsia="Arial"/>
+                <w:b w:val="0"/>
+                <w:color w:val="111827"/>
+                <w:sz w:val="16"/>
+              </w:rPr>
+              <w:t>0 / 25</w:t>
+            </w:r>
+          </w:p>
+        </w:tc>
+        <w:tc>
+          <w:tcPr>
+            <w:tcW w:type="dxa" w:w="1560"/>
+            <w:vAlign w:val="center"/>
+            <w:tcMar>
+              <w:top w:w="80" w:type="dxa"/>
+              <w:start w:w="120" w:type="dxa"/>
+              <w:bottom w:w="80" w:type="dxa"/>
+              <w:end w:w="120" w:type="dxa"/>
+            </w:tcMar>
+            <w:shd w:fill="F8FAFC"/>
+          </w:tcPr>
+          <w:p>
+            <w:pPr>
+              <w:spacing w:after="0"/>
+              <w:jc w:val="left"/>
+            </w:pPr>
+            <w:r>
+              <w:rPr>
+                <w:rFonts w:ascii="Arial" w:hAnsi="Arial" w:eastAsia="Arial"/>
+                <w:b w:val="0"/>
+                <w:color w:val="111827"/>
+                <w:sz w:val="16"/>
+              </w:rPr>
+              <w:t>25</w:t>
+            </w:r>
+          </w:p>
+        </w:tc>
+        <w:tc>
+          <w:tcPr>
+            <w:tcW w:type="dxa" w:w="1560"/>
+            <w:vAlign w:val="center"/>
+            <w:tcMar>
+              <w:top w:w="80" w:type="dxa"/>
+              <w:start w:w="120" w:type="dxa"/>
+              <w:bottom w:w="80" w:type="dxa"/>
+              <w:end w:w="120" w:type="dxa"/>
+            </w:tcMar>
+            <w:shd w:fill="F8FAFC"/>
+          </w:tcPr>
+          <w:p>
+            <w:pPr>
+              <w:spacing w:after="0"/>
+              <w:jc w:val="left"/>
+            </w:pPr>
+            <w:r>
+              <w:rPr>
+                <w:rFonts w:ascii="Arial" w:hAnsi="Arial" w:eastAsia="Arial"/>
+                <w:b w:val="0"/>
+                <w:color w:val="111827"/>
+                <w:sz w:val="16"/>
+              </w:rPr>
+              <w:t>для тех же 5 P0-приложений классифицировать full_loop / adjacent_loop / weak_adjacency и action-&gt;avatar causality</w:t>
+            </w:r>
+          </w:p>
+        </w:tc>
+      </w:tr>
+      <w:tr>
+        <w:tc>
+          <w:tcPr>
+            <w:tcW w:type="dxa" w:w="1560"/>
+            <w:vAlign w:val="center"/>
+            <w:tcMar>
+              <w:top w:w="80" w:type="dxa"/>
+              <w:start w:w="120" w:type="dxa"/>
+              <w:bottom w:w="80" w:type="dxa"/>
+              <w:end w:w="120" w:type="dxa"/>
+            </w:tcMar>
+          </w:tcPr>
+          <w:p>
+            <w:pPr>
+              <w:spacing w:after="0"/>
+              <w:jc w:val="left"/>
+            </w:pPr>
+            <w:r>
+              <w:rPr>
+                <w:rFonts w:ascii="Arial" w:hAnsi="Arial" w:eastAsia="Arial"/>
+                <w:b w:val="0"/>
+                <w:color w:val="111827"/>
+                <w:sz w:val="16"/>
+              </w:rPr>
+              <w:t>H2</w:t>
+            </w:r>
+          </w:p>
+        </w:tc>
+        <w:tc>
+          <w:tcPr>
+            <w:tcW w:type="dxa" w:w="1560"/>
+            <w:vAlign w:val="center"/>
+            <w:tcMar>
+              <w:top w:w="80" w:type="dxa"/>
+              <w:start w:w="120" w:type="dxa"/>
+              <w:bottom w:w="80" w:type="dxa"/>
+              <w:end w:w="120" w:type="dxa"/>
+            </w:tcMar>
+          </w:tcPr>
+          <w:p>
+            <w:pPr>
+              <w:spacing w:after="0"/>
+              <w:jc w:val="left"/>
+            </w:pPr>
+            <w:r>
+              <w:rPr>
+                <w:rFonts w:ascii="Arial" w:hAnsi="Arial" w:eastAsia="Arial"/>
+                <w:b w:val="0"/>
+                <w:color w:val="111827"/>
+                <w:sz w:val="16"/>
+              </w:rPr>
+              <w:t>paid-flow signoff evidence</w:t>
+            </w:r>
+          </w:p>
+        </w:tc>
+        <w:tc>
+          <w:tcPr>
+            <w:tcW w:type="dxa" w:w="1560"/>
+            <w:vAlign w:val="center"/>
+            <w:tcMar>
+              <w:top w:w="80" w:type="dxa"/>
+              <w:start w:w="120" w:type="dxa"/>
+              <w:bottom w:w="80" w:type="dxa"/>
+              <w:end w:w="120" w:type="dxa"/>
+            </w:tcMar>
+          </w:tcPr>
+          <w:p>
+            <w:pPr>
+              <w:spacing w:after="0"/>
+              <w:jc w:val="left"/>
+            </w:pPr>
+            <w:r>
+              <w:rPr>
+                <w:rFonts w:ascii="Arial" w:hAnsi="Arial" w:eastAsia="Arial"/>
+                <w:b w:val="0"/>
+                <w:color w:val="111827"/>
+                <w:sz w:val="16"/>
+              </w:rPr>
+              <w:t>28 / 40</w:t>
+            </w:r>
+          </w:p>
+        </w:tc>
+        <w:tc>
+          <w:tcPr>
+            <w:tcW w:type="dxa" w:w="1560"/>
+            <w:vAlign w:val="center"/>
+            <w:tcMar>
+              <w:top w:w="80" w:type="dxa"/>
+              <w:start w:w="120" w:type="dxa"/>
+              <w:bottom w:w="80" w:type="dxa"/>
+              <w:end w:w="120" w:type="dxa"/>
+            </w:tcMar>
+          </w:tcPr>
+          <w:p>
+            <w:pPr>
+              <w:spacing w:after="0"/>
+              <w:jc w:val="left"/>
+            </w:pPr>
+            <w:r>
+              <w:rPr>
+                <w:rFonts w:ascii="Arial" w:hAnsi="Arial" w:eastAsia="Arial"/>
+                <w:b w:val="0"/>
+                <w:color w:val="111827"/>
+                <w:sz w:val="16"/>
+              </w:rPr>
+              <w:t>8 / 12</w:t>
+            </w:r>
+          </w:p>
+        </w:tc>
+        <w:tc>
+          <w:tcPr>
+            <w:tcW w:type="dxa" w:w="1560"/>
+            <w:vAlign w:val="center"/>
+            <w:tcMar>
+              <w:top w:w="80" w:type="dxa"/>
+              <w:start w:w="120" w:type="dxa"/>
+              <w:bottom w:w="80" w:type="dxa"/>
+              <w:end w:w="120" w:type="dxa"/>
+            </w:tcMar>
+          </w:tcPr>
+          <w:p>
+            <w:pPr>
+              <w:spacing w:after="0"/>
+              <w:jc w:val="left"/>
+            </w:pPr>
+            <w:r>
+              <w:rPr>
+                <w:rFonts w:ascii="Arial" w:hAnsi="Arial" w:eastAsia="Arial"/>
+                <w:b w:val="0"/>
+                <w:color w:val="111827"/>
+                <w:sz w:val="16"/>
+              </w:rPr>
+              <w:t>4</w:t>
+            </w:r>
+          </w:p>
+        </w:tc>
+        <w:tc>
+          <w:tcPr>
+            <w:tcW w:type="dxa" w:w="1560"/>
+            <w:vAlign w:val="center"/>
+            <w:tcMar>
+              <w:top w:w="80" w:type="dxa"/>
+              <w:start w:w="120" w:type="dxa"/>
+              <w:bottom w:w="80" w:type="dxa"/>
+              <w:end w:w="120" w:type="dxa"/>
+            </w:tcMar>
+          </w:tcPr>
+          <w:p>
+            <w:pPr>
+              <w:spacing w:after="0"/>
+              <w:jc w:val="left"/>
+            </w:pPr>
+            <w:r>
+              <w:rPr>
+                <w:rFonts w:ascii="Arial" w:hAnsi="Arial" w:eastAsia="Arial"/>
+                <w:b w:val="0"/>
+                <w:color w:val="111827"/>
+                <w:sz w:val="16"/>
+              </w:rPr>
+              <w:t>добрать product-matched paid-flow rows с чистой ценой, trial/plan depth и first-value/paywall boundary</w:t>
+            </w:r>
+          </w:p>
+        </w:tc>
+      </w:tr>
+      <w:tr>
+        <w:tc>
+          <w:tcPr>
+            <w:tcW w:type="dxa" w:w="1560"/>
+            <w:vAlign w:val="center"/>
+            <w:tcMar>
+              <w:top w:w="80" w:type="dxa"/>
+              <w:start w:w="120" w:type="dxa"/>
+              <w:bottom w:w="80" w:type="dxa"/>
+              <w:end w:w="120" w:type="dxa"/>
+            </w:tcMar>
+            <w:shd w:fill="F8FAFC"/>
+          </w:tcPr>
+          <w:p>
+            <w:pPr>
+              <w:spacing w:after="0"/>
+              <w:jc w:val="left"/>
+            </w:pPr>
+            <w:r>
+              <w:rPr>
+                <w:rFonts w:ascii="Arial" w:hAnsi="Arial" w:eastAsia="Arial"/>
+                <w:b w:val="0"/>
+                <w:color w:val="111827"/>
+                <w:sz w:val="16"/>
+              </w:rPr>
+              <w:t>H5</w:t>
+            </w:r>
+          </w:p>
+        </w:tc>
+        <w:tc>
+          <w:tcPr>
+            <w:tcW w:type="dxa" w:w="1560"/>
+            <w:vAlign w:val="center"/>
+            <w:tcMar>
+              <w:top w:w="80" w:type="dxa"/>
+              <w:start w:w="120" w:type="dxa"/>
+              <w:bottom w:w="80" w:type="dxa"/>
+              <w:end w:w="120" w:type="dxa"/>
+            </w:tcMar>
+            <w:shd w:fill="F8FAFC"/>
+          </w:tcPr>
+          <w:p>
+            <w:pPr>
+              <w:spacing w:after="0"/>
+              <w:jc w:val="left"/>
+            </w:pPr>
+            <w:r>
+              <w:rPr>
+                <w:rFonts w:ascii="Arial" w:hAnsi="Arial" w:eastAsia="Arial"/>
+                <w:b w:val="0"/>
+                <w:color w:val="111827"/>
+                <w:sz w:val="16"/>
+              </w:rPr>
+              <w:t>secondary VOC evidence</w:t>
+            </w:r>
+          </w:p>
+        </w:tc>
+        <w:tc>
+          <w:tcPr>
+            <w:tcW w:type="dxa" w:w="1560"/>
+            <w:vAlign w:val="center"/>
+            <w:tcMar>
+              <w:top w:w="80" w:type="dxa"/>
+              <w:start w:w="120" w:type="dxa"/>
+              <w:bottom w:w="80" w:type="dxa"/>
+              <w:end w:w="120" w:type="dxa"/>
+            </w:tcMar>
+            <w:shd w:fill="F8FAFC"/>
+          </w:tcPr>
+          <w:p>
+            <w:pPr>
+              <w:spacing w:after="0"/>
+              <w:jc w:val="left"/>
+            </w:pPr>
+            <w:r>
+              <w:rPr>
+                <w:rFonts w:ascii="Arial" w:hAnsi="Arial" w:eastAsia="Arial"/>
+                <w:b w:val="0"/>
+                <w:color w:val="111827"/>
+                <w:sz w:val="16"/>
+              </w:rPr>
+              <w:t>12 / 96</w:t>
+            </w:r>
+          </w:p>
+        </w:tc>
+        <w:tc>
+          <w:tcPr>
+            <w:tcW w:type="dxa" w:w="1560"/>
+            <w:vAlign w:val="center"/>
+            <w:tcMar>
+              <w:top w:w="80" w:type="dxa"/>
+              <w:start w:w="120" w:type="dxa"/>
+              <w:bottom w:w="80" w:type="dxa"/>
+              <w:end w:w="120" w:type="dxa"/>
+            </w:tcMar>
+            <w:shd w:fill="F8FAFC"/>
+          </w:tcPr>
+          <w:p>
+            <w:pPr>
+              <w:spacing w:after="0"/>
+              <w:jc w:val="left"/>
+            </w:pPr>
+            <w:r>
+              <w:rPr>
+                <w:rFonts w:ascii="Arial" w:hAnsi="Arial" w:eastAsia="Arial"/>
+                <w:b w:val="0"/>
+                <w:color w:val="111827"/>
+                <w:sz w:val="16"/>
+              </w:rPr>
+              <w:t>0 / 30</w:t>
+            </w:r>
+          </w:p>
+        </w:tc>
+        <w:tc>
+          <w:tcPr>
+            <w:tcW w:type="dxa" w:w="1560"/>
+            <w:vAlign w:val="center"/>
+            <w:tcMar>
+              <w:top w:w="80" w:type="dxa"/>
+              <w:start w:w="120" w:type="dxa"/>
+              <w:bottom w:w="80" w:type="dxa"/>
+              <w:end w:w="120" w:type="dxa"/>
+            </w:tcMar>
+            <w:shd w:fill="F8FAFC"/>
+          </w:tcPr>
+          <w:p>
+            <w:pPr>
+              <w:spacing w:after="0"/>
+              <w:jc w:val="left"/>
+            </w:pPr>
+            <w:r>
+              <w:rPr>
+                <w:rFonts w:ascii="Arial" w:hAnsi="Arial" w:eastAsia="Arial"/>
+                <w:b w:val="0"/>
+                <w:color w:val="111827"/>
+                <w:sz w:val="16"/>
+              </w:rPr>
+              <w:t>30</w:t>
+            </w:r>
+          </w:p>
+        </w:tc>
+        <w:tc>
+          <w:tcPr>
+            <w:tcW w:type="dxa" w:w="1560"/>
+            <w:vAlign w:val="center"/>
+            <w:tcMar>
+              <w:top w:w="80" w:type="dxa"/>
+              <w:start w:w="120" w:type="dxa"/>
+              <w:bottom w:w="80" w:type="dxa"/>
+              <w:end w:w="120" w:type="dxa"/>
+            </w:tcMar>
+            <w:shd w:fill="F8FAFC"/>
+          </w:tcPr>
+          <w:p>
+            <w:pPr>
+              <w:spacing w:after="0"/>
+              <w:jc w:val="left"/>
+            </w:pPr>
+            <w:r>
+              <w:rPr>
+                <w:rFonts w:ascii="Arial" w:hAnsi="Arial" w:eastAsia="Arial"/>
+                <w:b w:val="0"/>
+                <w:color w:val="111827"/>
+                <w:sz w:val="16"/>
+              </w:rPr>
+              <w:t>провести первые P0-интервью ICP_A/ICP_D и заменить secondary VOC rows реальными participant answers</w:t>
+            </w:r>
+          </w:p>
+        </w:tc>
+      </w:tr>
+      <w:tr>
+        <w:tc>
+          <w:tcPr>
+            <w:tcW w:type="dxa" w:w="1560"/>
+            <w:vAlign w:val="center"/>
+            <w:tcMar>
+              <w:top w:w="80" w:type="dxa"/>
+              <w:start w:w="120" w:type="dxa"/>
+              <w:bottom w:w="80" w:type="dxa"/>
+              <w:end w:w="120" w:type="dxa"/>
+            </w:tcMar>
+          </w:tcPr>
+          <w:p>
+            <w:pPr>
+              <w:spacing w:after="0"/>
+              <w:jc w:val="left"/>
+            </w:pPr>
+            <w:r>
+              <w:rPr>
+                <w:rFonts w:ascii="Arial" w:hAnsi="Arial" w:eastAsia="Arial"/>
+                <w:b w:val="0"/>
+                <w:color w:val="111827"/>
+                <w:sz w:val="16"/>
+              </w:rPr>
+              <w:t>H4</w:t>
+            </w:r>
+          </w:p>
+        </w:tc>
+        <w:tc>
+          <w:tcPr>
+            <w:tcW w:type="dxa" w:w="1560"/>
+            <w:vAlign w:val="center"/>
+            <w:tcMar>
+              <w:top w:w="80" w:type="dxa"/>
+              <w:start w:w="120" w:type="dxa"/>
+              <w:bottom w:w="80" w:type="dxa"/>
+              <w:end w:w="120" w:type="dxa"/>
+            </w:tcMar>
+          </w:tcPr>
+          <w:p>
+            <w:pPr>
+              <w:spacing w:after="0"/>
+              <w:jc w:val="left"/>
+            </w:pPr>
+            <w:r>
+              <w:rPr>
+                <w:rFonts w:ascii="Arial" w:hAnsi="Arial" w:eastAsia="Arial"/>
+                <w:b w:val="0"/>
+                <w:color w:val="111827"/>
+                <w:sz w:val="16"/>
+              </w:rPr>
+              <w:t>prototype-readiness evidence</w:t>
+            </w:r>
+          </w:p>
+        </w:tc>
+        <w:tc>
+          <w:tcPr>
+            <w:tcW w:type="dxa" w:w="1560"/>
+            <w:vAlign w:val="center"/>
+            <w:tcMar>
+              <w:top w:w="80" w:type="dxa"/>
+              <w:start w:w="120" w:type="dxa"/>
+              <w:bottom w:w="80" w:type="dxa"/>
+              <w:end w:w="120" w:type="dxa"/>
+            </w:tcMar>
+          </w:tcPr>
+          <w:p>
+            <w:pPr>
+              <w:spacing w:after="0"/>
+              <w:jc w:val="left"/>
+            </w:pPr>
+            <w:r>
+              <w:rPr>
+                <w:rFonts w:ascii="Arial" w:hAnsi="Arial" w:eastAsia="Arial"/>
+                <w:b w:val="0"/>
+                <w:color w:val="111827"/>
+                <w:sz w:val="16"/>
+              </w:rPr>
+              <w:t>16 / 80</w:t>
+            </w:r>
+          </w:p>
+        </w:tc>
+        <w:tc>
+          <w:tcPr>
+            <w:tcW w:type="dxa" w:w="1560"/>
+            <w:vAlign w:val="center"/>
+            <w:tcMar>
+              <w:top w:w="80" w:type="dxa"/>
+              <w:start w:w="120" w:type="dxa"/>
+              <w:bottom w:w="80" w:type="dxa"/>
+              <w:end w:w="120" w:type="dxa"/>
+            </w:tcMar>
+          </w:tcPr>
+          <w:p>
+            <w:pPr>
+              <w:spacing w:after="0"/>
+              <w:jc w:val="left"/>
+            </w:pPr>
+            <w:r>
+              <w:rPr>
+                <w:rFonts w:ascii="Arial" w:hAnsi="Arial" w:eastAsia="Arial"/>
+                <w:b w:val="0"/>
+                <w:color w:val="111827"/>
+                <w:sz w:val="16"/>
+              </w:rPr>
+              <w:t>0 / 32</w:t>
+            </w:r>
+          </w:p>
+        </w:tc>
+        <w:tc>
+          <w:tcPr>
+            <w:tcW w:type="dxa" w:w="1560"/>
+            <w:vAlign w:val="center"/>
+            <w:tcMar>
+              <w:top w:w="80" w:type="dxa"/>
+              <w:start w:w="120" w:type="dxa"/>
+              <w:bottom w:w="80" w:type="dxa"/>
+              <w:end w:w="120" w:type="dxa"/>
+            </w:tcMar>
+          </w:tcPr>
+          <w:p>
+            <w:pPr>
+              <w:spacing w:after="0"/>
+              <w:jc w:val="left"/>
+            </w:pPr>
+            <w:r>
+              <w:rPr>
+                <w:rFonts w:ascii="Arial" w:hAnsi="Arial" w:eastAsia="Arial"/>
+                <w:b w:val="0"/>
+                <w:color w:val="111827"/>
+                <w:sz w:val="16"/>
+              </w:rPr>
+              <w:t>32</w:t>
+            </w:r>
+          </w:p>
+        </w:tc>
+        <w:tc>
+          <w:tcPr>
+            <w:tcW w:type="dxa" w:w="1560"/>
+            <w:vAlign w:val="center"/>
+            <w:tcMar>
+              <w:top w:w="80" w:type="dxa"/>
+              <w:start w:w="120" w:type="dxa"/>
+              <w:bottom w:w="80" w:type="dxa"/>
+              <w:end w:w="120" w:type="dxa"/>
+            </w:tcMar>
+          </w:tcPr>
+          <w:p>
+            <w:pPr>
+              <w:spacing w:after="0"/>
+              <w:jc w:val="left"/>
+            </w:pPr>
+            <w:r>
+              <w:rPr>
+                <w:rFonts w:ascii="Arial" w:hAnsi="Arial" w:eastAsia="Arial"/>
+                <w:b w:val="0"/>
+                <w:color w:val="111827"/>
+                <w:sz w:val="16"/>
+              </w:rPr>
+              <w:t>запустить prototype sessions и измерить comprehension, differentiation, meaning lift, trust/safety и return intent</w:t>
+            </w:r>
+          </w:p>
+        </w:tc>
+      </w:tr>
+      <w:tr>
+        <w:tc>
+          <w:tcPr>
+            <w:tcW w:type="dxa" w:w="1560"/>
+            <w:vAlign w:val="center"/>
+            <w:tcMar>
+              <w:top w:w="80" w:type="dxa"/>
+              <w:start w:w="120" w:type="dxa"/>
+              <w:bottom w:w="80" w:type="dxa"/>
+              <w:end w:w="120" w:type="dxa"/>
+            </w:tcMar>
+            <w:shd w:fill="F8FAFC"/>
+          </w:tcPr>
+          <w:p>
+            <w:pPr>
+              <w:spacing w:after="0"/>
+              <w:jc w:val="left"/>
+            </w:pPr>
+            <w:r>
+              <w:rPr>
+                <w:rFonts w:ascii="Arial" w:hAnsi="Arial" w:eastAsia="Arial"/>
+                <w:b w:val="0"/>
+                <w:color w:val="111827"/>
+                <w:sz w:val="16"/>
+              </w:rPr>
+              <w:t>H6</w:t>
+            </w:r>
+          </w:p>
+        </w:tc>
+        <w:tc>
+          <w:tcPr>
+            <w:tcW w:type="dxa" w:w="1560"/>
+            <w:vAlign w:val="center"/>
+            <w:tcMar>
+              <w:top w:w="80" w:type="dxa"/>
+              <w:start w:w="120" w:type="dxa"/>
+              <w:bottom w:w="80" w:type="dxa"/>
+              <w:end w:w="120" w:type="dxa"/>
+            </w:tcMar>
+            <w:shd w:fill="F8FAFC"/>
+          </w:tcPr>
+          <w:p>
+            <w:pPr>
+              <w:spacing w:after="0"/>
+              <w:jc w:val="left"/>
+            </w:pPr>
+            <w:r>
+              <w:rPr>
+                <w:rFonts w:ascii="Arial" w:hAnsi="Arial" w:eastAsia="Arial"/>
+                <w:b w:val="0"/>
+                <w:color w:val="111827"/>
+                <w:sz w:val="16"/>
+              </w:rPr>
+              <w:t>prototype-readiness evidence</w:t>
+            </w:r>
+          </w:p>
+        </w:tc>
+        <w:tc>
+          <w:tcPr>
+            <w:tcW w:type="dxa" w:w="1560"/>
+            <w:vAlign w:val="center"/>
+            <w:tcMar>
+              <w:top w:w="80" w:type="dxa"/>
+              <w:start w:w="120" w:type="dxa"/>
+              <w:bottom w:w="80" w:type="dxa"/>
+              <w:end w:w="120" w:type="dxa"/>
+            </w:tcMar>
+            <w:shd w:fill="F8FAFC"/>
+          </w:tcPr>
+          <w:p>
+            <w:pPr>
+              <w:spacing w:after="0"/>
+              <w:jc w:val="left"/>
+            </w:pPr>
+            <w:r>
+              <w:rPr>
+                <w:rFonts w:ascii="Arial" w:hAnsi="Arial" w:eastAsia="Arial"/>
+                <w:b w:val="0"/>
+                <w:color w:val="111827"/>
+                <w:sz w:val="16"/>
+              </w:rPr>
+              <w:t>16 / 80</w:t>
+            </w:r>
+          </w:p>
+        </w:tc>
+        <w:tc>
+          <w:tcPr>
+            <w:tcW w:type="dxa" w:w="1560"/>
+            <w:vAlign w:val="center"/>
+            <w:tcMar>
+              <w:top w:w="80" w:type="dxa"/>
+              <w:start w:w="120" w:type="dxa"/>
+              <w:bottom w:w="80" w:type="dxa"/>
+              <w:end w:w="120" w:type="dxa"/>
+            </w:tcMar>
+            <w:shd w:fill="F8FAFC"/>
+          </w:tcPr>
+          <w:p>
+            <w:pPr>
+              <w:spacing w:after="0"/>
+              <w:jc w:val="left"/>
+            </w:pPr>
+            <w:r>
+              <w:rPr>
+                <w:rFonts w:ascii="Arial" w:hAnsi="Arial" w:eastAsia="Arial"/>
+                <w:b w:val="0"/>
+                <w:color w:val="111827"/>
+                <w:sz w:val="16"/>
+              </w:rPr>
+              <w:t>0 / 32</w:t>
+            </w:r>
+          </w:p>
+        </w:tc>
+        <w:tc>
+          <w:tcPr>
+            <w:tcW w:type="dxa" w:w="1560"/>
+            <w:vAlign w:val="center"/>
+            <w:tcMar>
+              <w:top w:w="80" w:type="dxa"/>
+              <w:start w:w="120" w:type="dxa"/>
+              <w:bottom w:w="80" w:type="dxa"/>
+              <w:end w:w="120" w:type="dxa"/>
+            </w:tcMar>
+            <w:shd w:fill="F8FAFC"/>
+          </w:tcPr>
+          <w:p>
+            <w:pPr>
+              <w:spacing w:after="0"/>
+              <w:jc w:val="left"/>
+            </w:pPr>
+            <w:r>
+              <w:rPr>
+                <w:rFonts w:ascii="Arial" w:hAnsi="Arial" w:eastAsia="Arial"/>
+                <w:b w:val="0"/>
+                <w:color w:val="111827"/>
+                <w:sz w:val="16"/>
+              </w:rPr>
+              <w:t>32</w:t>
+            </w:r>
+          </w:p>
+        </w:tc>
+        <w:tc>
+          <w:tcPr>
+            <w:tcW w:type="dxa" w:w="1560"/>
+            <w:vAlign w:val="center"/>
+            <w:tcMar>
+              <w:top w:w="80" w:type="dxa"/>
+              <w:start w:w="120" w:type="dxa"/>
+              <w:bottom w:w="80" w:type="dxa"/>
+              <w:end w:w="120" w:type="dxa"/>
+            </w:tcMar>
+            <w:shd w:fill="F8FAFC"/>
+          </w:tcPr>
+          <w:p>
+            <w:pPr>
+              <w:spacing w:after="0"/>
+              <w:jc w:val="left"/>
+            </w:pPr>
+            <w:r>
+              <w:rPr>
+                <w:rFonts w:ascii="Arial" w:hAnsi="Arial" w:eastAsia="Arial"/>
+                <w:b w:val="0"/>
+                <w:color w:val="111827"/>
+                <w:sz w:val="16"/>
+              </w:rPr>
+              <w:t>после prototype sessions обновить MVP loop и проверить, могут ли участники назвать продукт и причинность своими словами</w:t>
+            </w:r>
+          </w:p>
+        </w:tc>
+      </w:tr>
+    </w:tbl>
+    <w:p/>
     <w:p>
       <w:pPr>
         <w:pStyle w:val="Heading1"/>

</xml_diff>

<commit_message>
Strengthen global report narrative flow
</commit_message>
<xml_diff>
--- a/output/docx/alina-global-hypothesis-report-v1.docx
+++ b/output/docx/alina-global-hypothesis-report-v1.docx
@@ -31,7 +31,7 @@
     </w:p>
     <w:p>
       <w:r>
-        <w:t>Собрано: 2026-05-31T16:00:41.327Z</w:t>
+        <w:t>Собрано: 2026-05-31T16:12:24.122Z</w:t>
       </w:r>
     </w:p>
     <w:p>
@@ -49,6 +49,11 @@
     </w:p>
     <w:p>
       <w:r>
+        <w:t>География этого отчета - мировой consumer-app рынок. Русский язык здесь используется как язык повествования и принятия решения, а не как ограничение рынка: конкурентная карта, источники, категории и монетизация собираются глобально.</w:t>
+      </w:r>
+    </w:p>
+    <w:p>
+      <w:r>
         <w:t>Логика продукта строится вокруг связки meaning -&gt; action -&gt; reset -&gt; visible progress. В этой связке смысл не остается абстрактной интерпретацией, действие не превращается в тяжелую productivity-систему, reset не живет как отдельная медитация, а avatar/progress не является случайной косметикой. Ценность появляется только тогда, когда пользователь понимает причинность: я сделал маленький шаг, и поэтому мой образ прогресса изменился.</w:t>
       </w:r>
     </w:p>
@@ -59,7 +64,30 @@
     </w:p>
     <w:p>
       <w:r>
-        <w:t>На текущем этапе собрано 67,525 сырьевых source-строк, 36,694 уникализированных строк и 474 локальных артефактов. Эти данные нужны не для того, чтобы объявить продукт доказанным, а для последовательной проверки: существует ли рынок, есть ли деньги, насколько плотна конкуренция, где может быть белое пятно, кто аудитория и какую MVP-петлю надо тестировать.</w:t>
+        <w:t>На текущем этапе собрано 67,525 сырьевых source-строк, 36,694 уникализированных строк и 477 локальных артефактов. Эти данные нужны не для того, чтобы объявить продукт доказанным, а для последовательной проверки: существует ли рынок, есть ли деньги, насколько плотна конкуренция, где может быть белое пятно, кто аудитория и какую MVP-петлю надо тестировать.</w:t>
+      </w:r>
+    </w:p>
+    <w:p>
+      <w:pPr>
+        <w:pStyle w:val="Heading2"/>
+      </w:pPr>
+      <w:r>
+        <w:t>Логика гипотез</w:t>
+      </w:r>
+    </w:p>
+    <w:p>
+      <w:r>
+        <w:t>Исследование специально построено как цепочка, а не как набор независимых таблиц. Сначала фиксируется продуктовая идея: если Alina должна соединить смысл, действие, reset и видимый прогресс, то первая проверка - существует ли вообще такая форма продукта и не занята ли она уже конкурентами. После этого нужно понять, есть ли вокруг нее мировые рынки и деньги: без этого даже красивая продуктовая петля остается маленьким экспериментом.</w:t>
+      </w:r>
+    </w:p>
+    <w:p>
+      <w:r>
+        <w:t>Дальше проверка переходит к конкурентам и whitespace. Здесь важно не доказывать, что конкурентов нет, а увидеть, где именно существующие решения разрывают петлю: у одних есть reset без действия, у других действие без личного смысла, у третьих avatar без причинности, у четвертых прогресс без мягкого эмоционального входа. Только после этого имеет смысл говорить об аудитории: кто уже живет рядом с этой проблемой, какие приложения и ритуалы использует, за что платит и какие формулировки считает безопасными или манипулятивными.</w:t>
+      </w:r>
+    </w:p>
+    <w:p>
+      <w:r>
+        <w:t>Последний шаг - продуктовое ядро. Если рынки есть, конкуренты понятны, whitespace выглядит узким, а аудитория имеет recent behavior, тогда MVP должен проверять не весь возможный продукт, а одну причинную петлю: personal meaning -&gt; tiny action -&gt; short reset -&gt; visible progress -&gt; tomorrow hook. Пока эта цепочка не пройдет walkthrough, интервью и прототипные сессии, все выводы остаются evidence-first гипотезами, а не финальным go.</w:t>
       </w:r>
     </w:p>
     <w:p>
@@ -20146,7 +20174,7 @@
                 <w:color w:val="111827"/>
                 <w:sz w:val="16"/>
               </w:rPr>
-              <w:t>474 manifest artifacts; missing=0</w:t>
+              <w:t>477 manifest artifacts; missing=0</w:t>
             </w:r>
           </w:p>
         </w:tc>
@@ -20174,6 +20202,148 @@
                 <w:sz w:val="16"/>
               </w:rPr>
               <w:t>Manifest доказывает наличие файлов и хэши, но не заменяет содержательную валидацию claims.</w:t>
+            </w:r>
+          </w:p>
+        </w:tc>
+      </w:tr>
+      <w:tr>
+        <w:tc>
+          <w:tcPr>
+            <w:tcW w:type="dxa" w:w="2376"/>
+            <w:vAlign w:val="center"/>
+            <w:tcMar>
+              <w:top w:w="80" w:type="dxa"/>
+              <w:start w:w="120" w:type="dxa"/>
+              <w:bottom w:w="80" w:type="dxa"/>
+              <w:end w:w="120" w:type="dxa"/>
+            </w:tcMar>
+            <w:shd w:fill="F8FAFC"/>
+          </w:tcPr>
+          <w:p>
+            <w:pPr>
+              <w:spacing w:after="0"/>
+              <w:jc w:val="left"/>
+            </w:pPr>
+            <w:r>
+              <w:rPr>
+                <w:rFonts w:ascii="Arial" w:hAnsi="Arial" w:eastAsia="Arial"/>
+                <w:b w:val="0"/>
+                <w:color w:val="111827"/>
+                <w:sz w:val="16"/>
+              </w:rPr>
+              <w:t>SRC_08_SAMPLE_STYLE_REFERENCE</w:t>
+            </w:r>
+          </w:p>
+        </w:tc>
+        <w:tc>
+          <w:tcPr>
+            <w:tcW w:type="dxa" w:w="1224"/>
+            <w:vAlign w:val="center"/>
+            <w:tcMar>
+              <w:top w:w="80" w:type="dxa"/>
+              <w:start w:w="120" w:type="dxa"/>
+              <w:bottom w:w="80" w:type="dxa"/>
+              <w:end w:w="120" w:type="dxa"/>
+            </w:tcMar>
+            <w:shd w:fill="F8FAFC"/>
+          </w:tcPr>
+          <w:p>
+            <w:pPr>
+              <w:spacing w:after="0"/>
+              <w:jc w:val="left"/>
+            </w:pPr>
+            <w:r>
+              <w:rPr>
+                <w:rFonts w:ascii="Arial" w:hAnsi="Arial" w:eastAsia="Arial"/>
+                <w:b w:val="0"/>
+                <w:color w:val="111827"/>
+                <w:sz w:val="16"/>
+              </w:rPr>
+              <w:t>Логика гипотез и повествовательная форма</w:t>
+            </w:r>
+          </w:p>
+        </w:tc>
+        <w:tc>
+          <w:tcPr>
+            <w:tcW w:type="dxa" w:w="1224"/>
+            <w:vAlign w:val="center"/>
+            <w:tcMar>
+              <w:top w:w="80" w:type="dxa"/>
+              <w:start w:w="120" w:type="dxa"/>
+              <w:bottom w:w="80" w:type="dxa"/>
+              <w:end w:w="120" w:type="dxa"/>
+            </w:tcMar>
+            <w:shd w:fill="F8FAFC"/>
+          </w:tcPr>
+          <w:p>
+            <w:pPr>
+              <w:spacing w:after="0"/>
+              <w:jc w:val="left"/>
+            </w:pPr>
+            <w:r>
+              <w:rPr>
+                <w:rFonts w:ascii="Arial" w:hAnsi="Arial" w:eastAsia="Arial"/>
+                <w:b w:val="0"/>
+                <w:color w:val="111827"/>
+                <w:sz w:val="16"/>
+              </w:rPr>
+              <w:t>используется как style benchmark, не как market evidence</w:t>
+            </w:r>
+          </w:p>
+        </w:tc>
+        <w:tc>
+          <w:tcPr>
+            <w:tcW w:type="dxa" w:w="1944"/>
+            <w:vAlign w:val="center"/>
+            <w:tcMar>
+              <w:top w:w="80" w:type="dxa"/>
+              <w:start w:w="120" w:type="dxa"/>
+              <w:bottom w:w="80" w:type="dxa"/>
+              <w:end w:w="120" w:type="dxa"/>
+            </w:tcMar>
+            <w:shd w:fill="F8FAFC"/>
+          </w:tcPr>
+          <w:p>
+            <w:pPr>
+              <w:spacing w:after="0"/>
+              <w:jc w:val="left"/>
+            </w:pPr>
+            <w:r>
+              <w:rPr>
+                <w:rFonts w:ascii="Arial" w:hAnsi="Arial" w:eastAsia="Arial"/>
+                <w:b w:val="0"/>
+                <w:color w:val="111827"/>
+                <w:sz w:val="16"/>
+              </w:rPr>
+              <w:t>sample_docx_paragraphs=645; benchmark_doc=docs/decision/alina-sample-style-benchmark-v1.md</w:t>
+            </w:r>
+          </w:p>
+        </w:tc>
+        <w:tc>
+          <w:tcPr>
+            <w:tcW w:type="dxa" w:w="2592"/>
+            <w:vAlign w:val="center"/>
+            <w:tcMar>
+              <w:top w:w="80" w:type="dxa"/>
+              <w:start w:w="120" w:type="dxa"/>
+              <w:bottom w:w="80" w:type="dxa"/>
+              <w:end w:w="120" w:type="dxa"/>
+            </w:tcMar>
+            <w:shd w:fill="F8FAFC"/>
+          </w:tcPr>
+          <w:p>
+            <w:pPr>
+              <w:spacing w:after="0"/>
+              <w:jc w:val="left"/>
+            </w:pPr>
+            <w:r>
+              <w:rPr>
+                <w:rFonts w:ascii="Arial" w:hAnsi="Arial" w:eastAsia="Arial"/>
+                <w:b w:val="0"/>
+                <w:color w:val="111827"/>
+                <w:sz w:val="16"/>
+              </w:rPr>
+              <w:t>Образец задает композицию и русский нарратив; он не переносит российский рынок, локальные цифры или старую продуктовую гипотезу в мировой отчет.</w:t>
             </w:r>
           </w:p>
         </w:tc>

</xml_diff>

<commit_message>
Sync global goal coverage counts
</commit_message>
<xml_diff>
--- a/output/docx/alina-global-hypothesis-report-v1.docx
+++ b/output/docx/alina-global-hypothesis-report-v1.docx
@@ -31,7 +31,7 @@
     </w:p>
     <w:p>
       <w:r>
-        <w:t>Собрано: 2026-05-31T16:12:24.122Z</w:t>
+        <w:t>Собрано: 2026-05-31T16:14:16.315Z</w:t>
       </w:r>
     </w:p>
     <w:p>
@@ -17984,7 +17984,7 @@
                 <w:color w:val="111827"/>
                 <w:sz w:val="16"/>
               </w:rPr>
-              <w:t>raw=67525; dedup=36694; dedup50_status=open; source_refs=239841</w:t>
+              <w:t>raw=67525; dedup=36694; dedup50_status=open; source_refs=239842</w:t>
             </w:r>
           </w:p>
         </w:tc>
@@ -18818,7 +18818,7 @@
                 <w:color w:val="111827"/>
                 <w:sz w:val="16"/>
               </w:rPr>
-              <w:t>manifest=474; missing=0; docs=117; scripts=104</w:t>
+              <w:t>manifest=477; missing=0; docs=119; scripts=105</w:t>
             </w:r>
           </w:p>
         </w:tc>

</xml_diff>

<commit_message>
Add global niche count rollup
</commit_message>
<xml_diff>
--- a/output/docx/alina-global-hypothesis-report-v1.docx
+++ b/output/docx/alina-global-hypothesis-report-v1.docx
@@ -31,7 +31,7 @@
     </w:p>
     <w:p>
       <w:r>
-        <w:t>Собрано: 2026-05-31T16:14:16.315Z</w:t>
+        <w:t>Собрано: 2026-05-31T16:20:48.669Z</w:t>
       </w:r>
     </w:p>
     <w:p>
@@ -64,7 +64,7 @@
     </w:p>
     <w:p>
       <w:r>
-        <w:t>На текущем этапе собрано 67,525 сырьевых source-строк, 36,694 уникализированных строк и 477 локальных артефактов. Эти данные нужны не для того, чтобы объявить продукт доказанным, а для последовательной проверки: существует ли рынок, есть ли деньги, насколько плотна конкуренция, где может быть белое пятно, кто аудитория и какую MVP-петлю надо тестировать.</w:t>
+        <w:t>На текущем этапе собрано 67,525 сырьевых source-строк, 36,694 уникализированных строк и 480 локальных артефактов. Эти данные нужны не для того, чтобы объявить продукт доказанным, а для последовательной проверки: существует ли рынок, есть ли деньги, насколько плотна конкуренция, где может быть белое пятно, кто аудитория и какую MVP-петлю надо тестировать.</w:t>
       </w:r>
     </w:p>
     <w:p>
@@ -3588,6 +3588,1537 @@
     <w:p/>
     <w:p>
       <w:r>
+        <w:t>Чтобы счетчики не терялись в приложениях, ниже отдельно показан rollup по каждой нише. Здесь важно различать three layers: all-source rows показывают ширину карты, direct app-store dedup показывает ближнее consumer-app поле, а top-100/manual targets показывают, какие конкуренты уже вынесены в более внимательный review. Эти числа не читаются как “столько прямых клонов Alina”; они показывают, какой объем данных стоит за каждым направлением. Глобальный dedup пакета остается 36,694: построчные niche dedup нельзя просто складывать как уникальных конкурентов, потому что один продукт может попадать в несколько тематических контекстов.</w:t>
+      </w:r>
+    </w:p>
+    <w:tbl>
+      <w:tblPr>
+        <w:tblW w:type="dxa" w:w="9360"/>
+        <w:jc w:val="left"/>
+        <w:tblLayout w:type="fixed"/>
+        <w:tblLook w:firstColumn="1" w:firstRow="1" w:lastColumn="0" w:lastRow="0" w:noHBand="0" w:noVBand="1" w:val="04A0"/>
+        <w:tblInd w:w="120" w:type="dxa"/>
+        <w:tblBorders>
+          <w:top w:val="single" w:sz="4" w:space="0" w:color="CBD5E1"/>
+          <w:left w:val="single" w:sz="4" w:space="0" w:color="CBD5E1"/>
+          <w:bottom w:val="single" w:sz="4" w:space="0" w:color="CBD5E1"/>
+          <w:right w:val="single" w:sz="4" w:space="0" w:color="CBD5E1"/>
+          <w:insideH w:val="single" w:sz="4" w:space="0" w:color="CBD5E1"/>
+          <w:insideV w:val="single" w:sz="4" w:space="0" w:color="CBD5E1"/>
+        </w:tblBorders>
+      </w:tblPr>
+      <w:tblGrid>
+        <w:gridCol w:w="1040"/>
+        <w:gridCol w:w="1040"/>
+        <w:gridCol w:w="1040"/>
+        <w:gridCol w:w="1040"/>
+        <w:gridCol w:w="1040"/>
+        <w:gridCol w:w="1040"/>
+        <w:gridCol w:w="1040"/>
+        <w:gridCol w:w="1040"/>
+        <w:gridCol w:w="1040"/>
+      </w:tblGrid>
+      <w:tr>
+        <w:tc>
+          <w:tcPr>
+            <w:tcW w:type="dxa" w:w="1040"/>
+            <w:vAlign w:val="center"/>
+            <w:tcMar>
+              <w:top w:w="80" w:type="dxa"/>
+              <w:start w:w="120" w:type="dxa"/>
+              <w:bottom w:w="80" w:type="dxa"/>
+              <w:end w:w="120" w:type="dxa"/>
+            </w:tcMar>
+            <w:shd w:fill="E8EEF5"/>
+          </w:tcPr>
+          <w:p>
+            <w:pPr>
+              <w:spacing w:after="0"/>
+              <w:jc w:val="left"/>
+            </w:pPr>
+            <w:r>
+              <w:rPr>
+                <w:rFonts w:ascii="Arial" w:hAnsi="Arial" w:eastAsia="Arial"/>
+                <w:b/>
+                <w:color w:val="111827"/>
+                <w:sz w:val="16"/>
+              </w:rPr>
+              <w:t>Ниша</w:t>
+            </w:r>
+          </w:p>
+        </w:tc>
+        <w:tc>
+          <w:tcPr>
+            <w:tcW w:type="dxa" w:w="1040"/>
+            <w:vAlign w:val="center"/>
+            <w:tcMar>
+              <w:top w:w="80" w:type="dxa"/>
+              <w:start w:w="120" w:type="dxa"/>
+              <w:bottom w:w="80" w:type="dxa"/>
+              <w:end w:w="120" w:type="dxa"/>
+            </w:tcMar>
+            <w:shd w:fill="E8EEF5"/>
+          </w:tcPr>
+          <w:p>
+            <w:pPr>
+              <w:spacing w:after="0"/>
+              <w:jc w:val="left"/>
+            </w:pPr>
+            <w:r>
+              <w:rPr>
+                <w:rFonts w:ascii="Arial" w:hAnsi="Arial" w:eastAsia="Arial"/>
+                <w:b/>
+                <w:color w:val="111827"/>
+                <w:sz w:val="16"/>
+              </w:rPr>
+              <w:t>All raw</w:t>
+            </w:r>
+          </w:p>
+        </w:tc>
+        <w:tc>
+          <w:tcPr>
+            <w:tcW w:type="dxa" w:w="1040"/>
+            <w:vAlign w:val="center"/>
+            <w:tcMar>
+              <w:top w:w="80" w:type="dxa"/>
+              <w:start w:w="120" w:type="dxa"/>
+              <w:bottom w:w="80" w:type="dxa"/>
+              <w:end w:w="120" w:type="dxa"/>
+            </w:tcMar>
+            <w:shd w:fill="E8EEF5"/>
+          </w:tcPr>
+          <w:p>
+            <w:pPr>
+              <w:spacing w:after="0"/>
+              <w:jc w:val="left"/>
+            </w:pPr>
+            <w:r>
+              <w:rPr>
+                <w:rFonts w:ascii="Arial" w:hAnsi="Arial" w:eastAsia="Arial"/>
+                <w:b/>
+                <w:color w:val="111827"/>
+                <w:sz w:val="16"/>
+              </w:rPr>
+              <w:t>All dedup</w:t>
+            </w:r>
+          </w:p>
+        </w:tc>
+        <w:tc>
+          <w:tcPr>
+            <w:tcW w:type="dxa" w:w="1040"/>
+            <w:vAlign w:val="center"/>
+            <w:tcMar>
+              <w:top w:w="80" w:type="dxa"/>
+              <w:start w:w="120" w:type="dxa"/>
+              <w:bottom w:w="80" w:type="dxa"/>
+              <w:end w:w="120" w:type="dxa"/>
+            </w:tcMar>
+            <w:shd w:fill="E8EEF5"/>
+          </w:tcPr>
+          <w:p>
+            <w:pPr>
+              <w:spacing w:after="0"/>
+              <w:jc w:val="left"/>
+            </w:pPr>
+            <w:r>
+              <w:rPr>
+                <w:rFonts w:ascii="Arial" w:hAnsi="Arial" w:eastAsia="Arial"/>
+                <w:b/>
+                <w:color w:val="111827"/>
+                <w:sz w:val="16"/>
+              </w:rPr>
+              <w:t>Direct app dedup</w:t>
+            </w:r>
+          </w:p>
+        </w:tc>
+        <w:tc>
+          <w:tcPr>
+            <w:tcW w:type="dxa" w:w="1040"/>
+            <w:vAlign w:val="center"/>
+            <w:tcMar>
+              <w:top w:w="80" w:type="dxa"/>
+              <w:start w:w="120" w:type="dxa"/>
+              <w:bottom w:w="80" w:type="dxa"/>
+              <w:end w:w="120" w:type="dxa"/>
+            </w:tcMar>
+            <w:shd w:fill="E8EEF5"/>
+          </w:tcPr>
+          <w:p>
+            <w:pPr>
+              <w:spacing w:after="0"/>
+              <w:jc w:val="left"/>
+            </w:pPr>
+            <w:r>
+              <w:rPr>
+                <w:rFonts w:ascii="Arial" w:hAnsi="Arial" w:eastAsia="Arial"/>
+                <w:b/>
+                <w:color w:val="111827"/>
+                <w:sz w:val="16"/>
+              </w:rPr>
+              <w:t>Direct share</w:t>
+            </w:r>
+          </w:p>
+        </w:tc>
+        <w:tc>
+          <w:tcPr>
+            <w:tcW w:type="dxa" w:w="1040"/>
+            <w:vAlign w:val="center"/>
+            <w:tcMar>
+              <w:top w:w="80" w:type="dxa"/>
+              <w:start w:w="120" w:type="dxa"/>
+              <w:bottom w:w="80" w:type="dxa"/>
+              <w:end w:w="120" w:type="dxa"/>
+            </w:tcMar>
+            <w:shd w:fill="E8EEF5"/>
+          </w:tcPr>
+          <w:p>
+            <w:pPr>
+              <w:spacing w:after="0"/>
+              <w:jc w:val="left"/>
+            </w:pPr>
+            <w:r>
+              <w:rPr>
+                <w:rFonts w:ascii="Arial" w:hAnsi="Arial" w:eastAsia="Arial"/>
+                <w:b/>
+                <w:color w:val="111827"/>
+                <w:sz w:val="16"/>
+              </w:rPr>
+              <w:t>Top-100</w:t>
+            </w:r>
+          </w:p>
+        </w:tc>
+        <w:tc>
+          <w:tcPr>
+            <w:tcW w:type="dxa" w:w="1040"/>
+            <w:vAlign w:val="center"/>
+            <w:tcMar>
+              <w:top w:w="80" w:type="dxa"/>
+              <w:start w:w="120" w:type="dxa"/>
+              <w:bottom w:w="80" w:type="dxa"/>
+              <w:end w:w="120" w:type="dxa"/>
+            </w:tcMar>
+            <w:shd w:fill="E8EEF5"/>
+          </w:tcPr>
+          <w:p>
+            <w:pPr>
+              <w:spacing w:after="0"/>
+              <w:jc w:val="left"/>
+            </w:pPr>
+            <w:r>
+              <w:rPr>
+                <w:rFonts w:ascii="Arial" w:hAnsi="Arial" w:eastAsia="Arial"/>
+                <w:b/>
+                <w:color w:val="111827"/>
+                <w:sz w:val="16"/>
+              </w:rPr>
+              <w:t>Manual targets</w:t>
+            </w:r>
+          </w:p>
+        </w:tc>
+        <w:tc>
+          <w:tcPr>
+            <w:tcW w:type="dxa" w:w="1040"/>
+            <w:vAlign w:val="center"/>
+            <w:tcMar>
+              <w:top w:w="80" w:type="dxa"/>
+              <w:start w:w="120" w:type="dxa"/>
+              <w:bottom w:w="80" w:type="dxa"/>
+              <w:end w:w="120" w:type="dxa"/>
+            </w:tcMar>
+            <w:shd w:fill="E8EEF5"/>
+          </w:tcPr>
+          <w:p>
+            <w:pPr>
+              <w:spacing w:after="0"/>
+              <w:jc w:val="left"/>
+            </w:pPr>
+            <w:r>
+              <w:rPr>
+                <w:rFonts w:ascii="Arial" w:hAnsi="Arial" w:eastAsia="Arial"/>
+                <w:b/>
+                <w:color w:val="111827"/>
+                <w:sz w:val="16"/>
+              </w:rPr>
+              <w:t>Coverage</w:t>
+            </w:r>
+          </w:p>
+        </w:tc>
+        <w:tc>
+          <w:tcPr>
+            <w:tcW w:type="dxa" w:w="1040"/>
+            <w:vAlign w:val="center"/>
+            <w:tcMar>
+              <w:top w:w="80" w:type="dxa"/>
+              <w:start w:w="120" w:type="dxa"/>
+              <w:bottom w:w="80" w:type="dxa"/>
+              <w:end w:w="120" w:type="dxa"/>
+            </w:tcMar>
+            <w:shd w:fill="E8EEF5"/>
+          </w:tcPr>
+          <w:p>
+            <w:pPr>
+              <w:spacing w:after="0"/>
+              <w:jc w:val="left"/>
+            </w:pPr>
+            <w:r>
+              <w:rPr>
+                <w:rFonts w:ascii="Arial" w:hAnsi="Arial" w:eastAsia="Arial"/>
+                <w:b/>
+                <w:color w:val="111827"/>
+                <w:sz w:val="16"/>
+              </w:rPr>
+              <w:t>Как читать</w:t>
+            </w:r>
+          </w:p>
+        </w:tc>
+      </w:tr>
+      <w:tr>
+        <w:tc>
+          <w:tcPr>
+            <w:tcW w:type="dxa" w:w="1040"/>
+            <w:vAlign w:val="center"/>
+            <w:tcMar>
+              <w:top w:w="80" w:type="dxa"/>
+              <w:start w:w="120" w:type="dxa"/>
+              <w:bottom w:w="80" w:type="dxa"/>
+              <w:end w:w="120" w:type="dxa"/>
+            </w:tcMar>
+          </w:tcPr>
+          <w:p>
+            <w:pPr>
+              <w:spacing w:after="0"/>
+              <w:jc w:val="left"/>
+            </w:pPr>
+            <w:r>
+              <w:rPr>
+                <w:rFonts w:ascii="Arial" w:hAnsi="Arial" w:eastAsia="Arial"/>
+                <w:b w:val="0"/>
+                <w:color w:val="111827"/>
+                <w:sz w:val="16"/>
+              </w:rPr>
+              <w:t>Mindfulness / reset</w:t>
+            </w:r>
+          </w:p>
+        </w:tc>
+        <w:tc>
+          <w:tcPr>
+            <w:tcW w:type="dxa" w:w="1040"/>
+            <w:vAlign w:val="center"/>
+            <w:tcMar>
+              <w:top w:w="80" w:type="dxa"/>
+              <w:start w:w="120" w:type="dxa"/>
+              <w:bottom w:w="80" w:type="dxa"/>
+              <w:end w:w="120" w:type="dxa"/>
+            </w:tcMar>
+          </w:tcPr>
+          <w:p>
+            <w:pPr>
+              <w:spacing w:after="0"/>
+              <w:jc w:val="left"/>
+            </w:pPr>
+            <w:r>
+              <w:rPr>
+                <w:rFonts w:ascii="Arial" w:hAnsi="Arial" w:eastAsia="Arial"/>
+                <w:b w:val="0"/>
+                <w:color w:val="111827"/>
+                <w:sz w:val="16"/>
+              </w:rPr>
+              <w:t>15,109</w:t>
+            </w:r>
+          </w:p>
+        </w:tc>
+        <w:tc>
+          <w:tcPr>
+            <w:tcW w:type="dxa" w:w="1040"/>
+            <w:vAlign w:val="center"/>
+            <w:tcMar>
+              <w:top w:w="80" w:type="dxa"/>
+              <w:start w:w="120" w:type="dxa"/>
+              <w:bottom w:w="80" w:type="dxa"/>
+              <w:end w:w="120" w:type="dxa"/>
+            </w:tcMar>
+          </w:tcPr>
+          <w:p>
+            <w:pPr>
+              <w:spacing w:after="0"/>
+              <w:jc w:val="left"/>
+            </w:pPr>
+            <w:r>
+              <w:rPr>
+                <w:rFonts w:ascii="Arial" w:hAnsi="Arial" w:eastAsia="Arial"/>
+                <w:b w:val="0"/>
+                <w:color w:val="111827"/>
+                <w:sz w:val="16"/>
+              </w:rPr>
+              <w:t>9,803</w:t>
+            </w:r>
+          </w:p>
+        </w:tc>
+        <w:tc>
+          <w:tcPr>
+            <w:tcW w:type="dxa" w:w="1040"/>
+            <w:vAlign w:val="center"/>
+            <w:tcMar>
+              <w:top w:w="80" w:type="dxa"/>
+              <w:start w:w="120" w:type="dxa"/>
+              <w:bottom w:w="80" w:type="dxa"/>
+              <w:end w:w="120" w:type="dxa"/>
+            </w:tcMar>
+          </w:tcPr>
+          <w:p>
+            <w:pPr>
+              <w:spacing w:after="0"/>
+              <w:jc w:val="left"/>
+            </w:pPr>
+            <w:r>
+              <w:rPr>
+                <w:rFonts w:ascii="Arial" w:hAnsi="Arial" w:eastAsia="Arial"/>
+                <w:b w:val="0"/>
+                <w:color w:val="111827"/>
+                <w:sz w:val="16"/>
+              </w:rPr>
+              <w:t>2,550</w:t>
+            </w:r>
+          </w:p>
+        </w:tc>
+        <w:tc>
+          <w:tcPr>
+            <w:tcW w:type="dxa" w:w="1040"/>
+            <w:vAlign w:val="center"/>
+            <w:tcMar>
+              <w:top w:w="80" w:type="dxa"/>
+              <w:start w:w="120" w:type="dxa"/>
+              <w:bottom w:w="80" w:type="dxa"/>
+              <w:end w:w="120" w:type="dxa"/>
+            </w:tcMar>
+          </w:tcPr>
+          <w:p>
+            <w:pPr>
+              <w:spacing w:after="0"/>
+              <w:jc w:val="left"/>
+            </w:pPr>
+            <w:r>
+              <w:rPr>
+                <w:rFonts w:ascii="Arial" w:hAnsi="Arial" w:eastAsia="Arial"/>
+                <w:b w:val="0"/>
+                <w:color w:val="111827"/>
+                <w:sz w:val="16"/>
+              </w:rPr>
+              <w:t>26.0%</w:t>
+            </w:r>
+          </w:p>
+        </w:tc>
+        <w:tc>
+          <w:tcPr>
+            <w:tcW w:type="dxa" w:w="1040"/>
+            <w:vAlign w:val="center"/>
+            <w:tcMar>
+              <w:top w:w="80" w:type="dxa"/>
+              <w:start w:w="120" w:type="dxa"/>
+              <w:bottom w:w="80" w:type="dxa"/>
+              <w:end w:w="120" w:type="dxa"/>
+            </w:tcMar>
+          </w:tcPr>
+          <w:p>
+            <w:pPr>
+              <w:spacing w:after="0"/>
+              <w:jc w:val="left"/>
+            </w:pPr>
+            <w:r>
+              <w:rPr>
+                <w:rFonts w:ascii="Arial" w:hAnsi="Arial" w:eastAsia="Arial"/>
+                <w:b w:val="0"/>
+                <w:color w:val="111827"/>
+                <w:sz w:val="16"/>
+              </w:rPr>
+              <w:t>21</w:t>
+            </w:r>
+          </w:p>
+        </w:tc>
+        <w:tc>
+          <w:tcPr>
+            <w:tcW w:type="dxa" w:w="1040"/>
+            <w:vAlign w:val="center"/>
+            <w:tcMar>
+              <w:top w:w="80" w:type="dxa"/>
+              <w:start w:w="120" w:type="dxa"/>
+              <w:bottom w:w="80" w:type="dxa"/>
+              <w:end w:w="120" w:type="dxa"/>
+            </w:tcMar>
+          </w:tcPr>
+          <w:p>
+            <w:pPr>
+              <w:spacing w:after="0"/>
+              <w:jc w:val="left"/>
+            </w:pPr>
+            <w:r>
+              <w:rPr>
+                <w:rFonts w:ascii="Arial" w:hAnsi="Arial" w:eastAsia="Arial"/>
+                <w:b w:val="0"/>
+                <w:color w:val="111827"/>
+                <w:sz w:val="16"/>
+              </w:rPr>
+              <w:t>0</w:t>
+            </w:r>
+          </w:p>
+        </w:tc>
+        <w:tc>
+          <w:tcPr>
+            <w:tcW w:type="dxa" w:w="1040"/>
+            <w:vAlign w:val="center"/>
+            <w:tcMar>
+              <w:top w:w="80" w:type="dxa"/>
+              <w:start w:w="120" w:type="dxa"/>
+              <w:bottom w:w="80" w:type="dxa"/>
+              <w:end w:w="120" w:type="dxa"/>
+            </w:tcMar>
+          </w:tcPr>
+          <w:p>
+            <w:pPr>
+              <w:spacing w:after="0"/>
+              <w:jc w:val="left"/>
+            </w:pPr>
+            <w:r>
+              <w:rPr>
+                <w:rFonts w:ascii="Arial" w:hAnsi="Arial" w:eastAsia="Arial"/>
+                <w:b w:val="0"/>
+                <w:color w:val="111827"/>
+                <w:sz w:val="16"/>
+              </w:rPr>
+              <w:t>8 groups; strong 3; medium 2</w:t>
+            </w:r>
+          </w:p>
+        </w:tc>
+        <w:tc>
+          <w:tcPr>
+            <w:tcW w:type="dxa" w:w="1040"/>
+            <w:vAlign w:val="center"/>
+            <w:tcMar>
+              <w:top w:w="80" w:type="dxa"/>
+              <w:start w:w="120" w:type="dxa"/>
+              <w:bottom w:w="80" w:type="dxa"/>
+              <w:end w:w="120" w:type="dxa"/>
+            </w:tcMar>
+          </w:tcPr>
+          <w:p>
+            <w:pPr>
+              <w:spacing w:after="0"/>
+              <w:jc w:val="left"/>
+            </w:pPr>
+            <w:r>
+              <w:rPr>
+                <w:rFonts w:ascii="Arial" w:hAnsi="Arial" w:eastAsia="Arial"/>
+                <w:b w:val="0"/>
+                <w:color w:val="111827"/>
+                <w:sz w:val="16"/>
+              </w:rPr>
+              <w:t>возможность есть, нужен ручной sampling</w:t>
+            </w:r>
+          </w:p>
+        </w:tc>
+      </w:tr>
+      <w:tr>
+        <w:tc>
+          <w:tcPr>
+            <w:tcW w:type="dxa" w:w="1040"/>
+            <w:vAlign w:val="center"/>
+            <w:tcMar>
+              <w:top w:w="80" w:type="dxa"/>
+              <w:start w:w="120" w:type="dxa"/>
+              <w:bottom w:w="80" w:type="dxa"/>
+              <w:end w:w="120" w:type="dxa"/>
+            </w:tcMar>
+            <w:shd w:fill="F8FAFC"/>
+          </w:tcPr>
+          <w:p>
+            <w:pPr>
+              <w:spacing w:after="0"/>
+              <w:jc w:val="left"/>
+            </w:pPr>
+            <w:r>
+              <w:rPr>
+                <w:rFonts w:ascii="Arial" w:hAnsi="Arial" w:eastAsia="Arial"/>
+                <w:b w:val="0"/>
+                <w:color w:val="111827"/>
+                <w:sz w:val="16"/>
+              </w:rPr>
+              <w:t>Avatar / identity</w:t>
+            </w:r>
+          </w:p>
+        </w:tc>
+        <w:tc>
+          <w:tcPr>
+            <w:tcW w:type="dxa" w:w="1040"/>
+            <w:vAlign w:val="center"/>
+            <w:tcMar>
+              <w:top w:w="80" w:type="dxa"/>
+              <w:start w:w="120" w:type="dxa"/>
+              <w:bottom w:w="80" w:type="dxa"/>
+              <w:end w:w="120" w:type="dxa"/>
+            </w:tcMar>
+            <w:shd w:fill="F8FAFC"/>
+          </w:tcPr>
+          <w:p>
+            <w:pPr>
+              <w:spacing w:after="0"/>
+              <w:jc w:val="left"/>
+            </w:pPr>
+            <w:r>
+              <w:rPr>
+                <w:rFonts w:ascii="Arial" w:hAnsi="Arial" w:eastAsia="Arial"/>
+                <w:b w:val="0"/>
+                <w:color w:val="111827"/>
+                <w:sz w:val="16"/>
+              </w:rPr>
+              <w:t>14,872</w:t>
+            </w:r>
+          </w:p>
+        </w:tc>
+        <w:tc>
+          <w:tcPr>
+            <w:tcW w:type="dxa" w:w="1040"/>
+            <w:vAlign w:val="center"/>
+            <w:tcMar>
+              <w:top w:w="80" w:type="dxa"/>
+              <w:start w:w="120" w:type="dxa"/>
+              <w:bottom w:w="80" w:type="dxa"/>
+              <w:end w:w="120" w:type="dxa"/>
+            </w:tcMar>
+            <w:shd w:fill="F8FAFC"/>
+          </w:tcPr>
+          <w:p>
+            <w:pPr>
+              <w:spacing w:after="0"/>
+              <w:jc w:val="left"/>
+            </w:pPr>
+            <w:r>
+              <w:rPr>
+                <w:rFonts w:ascii="Arial" w:hAnsi="Arial" w:eastAsia="Arial"/>
+                <w:b w:val="0"/>
+                <w:color w:val="111827"/>
+                <w:sz w:val="16"/>
+              </w:rPr>
+              <w:t>9,952</w:t>
+            </w:r>
+          </w:p>
+        </w:tc>
+        <w:tc>
+          <w:tcPr>
+            <w:tcW w:type="dxa" w:w="1040"/>
+            <w:vAlign w:val="center"/>
+            <w:tcMar>
+              <w:top w:w="80" w:type="dxa"/>
+              <w:start w:w="120" w:type="dxa"/>
+              <w:bottom w:w="80" w:type="dxa"/>
+              <w:end w:w="120" w:type="dxa"/>
+            </w:tcMar>
+            <w:shd w:fill="F8FAFC"/>
+          </w:tcPr>
+          <w:p>
+            <w:pPr>
+              <w:spacing w:after="0"/>
+              <w:jc w:val="left"/>
+            </w:pPr>
+            <w:r>
+              <w:rPr>
+                <w:rFonts w:ascii="Arial" w:hAnsi="Arial" w:eastAsia="Arial"/>
+                <w:b w:val="0"/>
+                <w:color w:val="111827"/>
+                <w:sz w:val="16"/>
+              </w:rPr>
+              <w:t>2,506</w:t>
+            </w:r>
+          </w:p>
+        </w:tc>
+        <w:tc>
+          <w:tcPr>
+            <w:tcW w:type="dxa" w:w="1040"/>
+            <w:vAlign w:val="center"/>
+            <w:tcMar>
+              <w:top w:w="80" w:type="dxa"/>
+              <w:start w:w="120" w:type="dxa"/>
+              <w:bottom w:w="80" w:type="dxa"/>
+              <w:end w:w="120" w:type="dxa"/>
+            </w:tcMar>
+            <w:shd w:fill="F8FAFC"/>
+          </w:tcPr>
+          <w:p>
+            <w:pPr>
+              <w:spacing w:after="0"/>
+              <w:jc w:val="left"/>
+            </w:pPr>
+            <w:r>
+              <w:rPr>
+                <w:rFonts w:ascii="Arial" w:hAnsi="Arial" w:eastAsia="Arial"/>
+                <w:b w:val="0"/>
+                <w:color w:val="111827"/>
+                <w:sz w:val="16"/>
+              </w:rPr>
+              <w:t>25.2%</w:t>
+            </w:r>
+          </w:p>
+        </w:tc>
+        <w:tc>
+          <w:tcPr>
+            <w:tcW w:type="dxa" w:w="1040"/>
+            <w:vAlign w:val="center"/>
+            <w:tcMar>
+              <w:top w:w="80" w:type="dxa"/>
+              <w:start w:w="120" w:type="dxa"/>
+              <w:bottom w:w="80" w:type="dxa"/>
+              <w:end w:w="120" w:type="dxa"/>
+            </w:tcMar>
+            <w:shd w:fill="F8FAFC"/>
+          </w:tcPr>
+          <w:p>
+            <w:pPr>
+              <w:spacing w:after="0"/>
+              <w:jc w:val="left"/>
+            </w:pPr>
+            <w:r>
+              <w:rPr>
+                <w:rFonts w:ascii="Arial" w:hAnsi="Arial" w:eastAsia="Arial"/>
+                <w:b w:val="0"/>
+                <w:color w:val="111827"/>
+                <w:sz w:val="16"/>
+              </w:rPr>
+              <w:t>49</w:t>
+            </w:r>
+          </w:p>
+        </w:tc>
+        <w:tc>
+          <w:tcPr>
+            <w:tcW w:type="dxa" w:w="1040"/>
+            <w:vAlign w:val="center"/>
+            <w:tcMar>
+              <w:top w:w="80" w:type="dxa"/>
+              <w:start w:w="120" w:type="dxa"/>
+              <w:bottom w:w="80" w:type="dxa"/>
+              <w:end w:w="120" w:type="dxa"/>
+            </w:tcMar>
+            <w:shd w:fill="F8FAFC"/>
+          </w:tcPr>
+          <w:p>
+            <w:pPr>
+              <w:spacing w:after="0"/>
+              <w:jc w:val="left"/>
+            </w:pPr>
+            <w:r>
+              <w:rPr>
+                <w:rFonts w:ascii="Arial" w:hAnsi="Arial" w:eastAsia="Arial"/>
+                <w:b w:val="0"/>
+                <w:color w:val="111827"/>
+                <w:sz w:val="16"/>
+              </w:rPr>
+              <w:t>3</w:t>
+            </w:r>
+          </w:p>
+        </w:tc>
+        <w:tc>
+          <w:tcPr>
+            <w:tcW w:type="dxa" w:w="1040"/>
+            <w:vAlign w:val="center"/>
+            <w:tcMar>
+              <w:top w:w="80" w:type="dxa"/>
+              <w:start w:w="120" w:type="dxa"/>
+              <w:bottom w:w="80" w:type="dxa"/>
+              <w:end w:w="120" w:type="dxa"/>
+            </w:tcMar>
+            <w:shd w:fill="F8FAFC"/>
+          </w:tcPr>
+          <w:p>
+            <w:pPr>
+              <w:spacing w:after="0"/>
+              <w:jc w:val="left"/>
+            </w:pPr>
+            <w:r>
+              <w:rPr>
+                <w:rFonts w:ascii="Arial" w:hAnsi="Arial" w:eastAsia="Arial"/>
+                <w:b w:val="0"/>
+                <w:color w:val="111827"/>
+                <w:sz w:val="16"/>
+              </w:rPr>
+              <w:t>8 groups; strong 3; medium 2</w:t>
+            </w:r>
+          </w:p>
+        </w:tc>
+        <w:tc>
+          <w:tcPr>
+            <w:tcW w:type="dxa" w:w="1040"/>
+            <w:vAlign w:val="center"/>
+            <w:tcMar>
+              <w:top w:w="80" w:type="dxa"/>
+              <w:start w:w="120" w:type="dxa"/>
+              <w:bottom w:w="80" w:type="dxa"/>
+              <w:end w:w="120" w:type="dxa"/>
+            </w:tcMar>
+            <w:shd w:fill="F8FAFC"/>
+          </w:tcPr>
+          <w:p>
+            <w:pPr>
+              <w:spacing w:after="0"/>
+              <w:jc w:val="left"/>
+            </w:pPr>
+            <w:r>
+              <w:rPr>
+                <w:rFonts w:ascii="Arial" w:hAnsi="Arial" w:eastAsia="Arial"/>
+                <w:b w:val="0"/>
+                <w:color w:val="111827"/>
+                <w:sz w:val="16"/>
+              </w:rPr>
+              <w:t>возможность есть, нужен ручной sampling</w:t>
+            </w:r>
+          </w:p>
+        </w:tc>
+      </w:tr>
+      <w:tr>
+        <w:tc>
+          <w:tcPr>
+            <w:tcW w:type="dxa" w:w="1040"/>
+            <w:vAlign w:val="center"/>
+            <w:tcMar>
+              <w:top w:w="80" w:type="dxa"/>
+              <w:start w:w="120" w:type="dxa"/>
+              <w:bottom w:w="80" w:type="dxa"/>
+              <w:end w:w="120" w:type="dxa"/>
+            </w:tcMar>
+          </w:tcPr>
+          <w:p>
+            <w:pPr>
+              <w:spacing w:after="0"/>
+              <w:jc w:val="left"/>
+            </w:pPr>
+            <w:r>
+              <w:rPr>
+                <w:rFonts w:ascii="Arial" w:hAnsi="Arial" w:eastAsia="Arial"/>
+                <w:b w:val="0"/>
+                <w:color w:val="111827"/>
+                <w:sz w:val="16"/>
+              </w:rPr>
+              <w:t>Astrology / esoterics</w:t>
+            </w:r>
+          </w:p>
+        </w:tc>
+        <w:tc>
+          <w:tcPr>
+            <w:tcW w:type="dxa" w:w="1040"/>
+            <w:vAlign w:val="center"/>
+            <w:tcMar>
+              <w:top w:w="80" w:type="dxa"/>
+              <w:start w:w="120" w:type="dxa"/>
+              <w:bottom w:w="80" w:type="dxa"/>
+              <w:end w:w="120" w:type="dxa"/>
+            </w:tcMar>
+          </w:tcPr>
+          <w:p>
+            <w:pPr>
+              <w:spacing w:after="0"/>
+              <w:jc w:val="left"/>
+            </w:pPr>
+            <w:r>
+              <w:rPr>
+                <w:rFonts w:ascii="Arial" w:hAnsi="Arial" w:eastAsia="Arial"/>
+                <w:b w:val="0"/>
+                <w:color w:val="111827"/>
+                <w:sz w:val="16"/>
+              </w:rPr>
+              <w:t>5,427</w:t>
+            </w:r>
+          </w:p>
+        </w:tc>
+        <w:tc>
+          <w:tcPr>
+            <w:tcW w:type="dxa" w:w="1040"/>
+            <w:vAlign w:val="center"/>
+            <w:tcMar>
+              <w:top w:w="80" w:type="dxa"/>
+              <w:start w:w="120" w:type="dxa"/>
+              <w:bottom w:w="80" w:type="dxa"/>
+              <w:end w:w="120" w:type="dxa"/>
+            </w:tcMar>
+          </w:tcPr>
+          <w:p>
+            <w:pPr>
+              <w:spacing w:after="0"/>
+              <w:jc w:val="left"/>
+            </w:pPr>
+            <w:r>
+              <w:rPr>
+                <w:rFonts w:ascii="Arial" w:hAnsi="Arial" w:eastAsia="Arial"/>
+                <w:b w:val="0"/>
+                <w:color w:val="111827"/>
+                <w:sz w:val="16"/>
+              </w:rPr>
+              <w:t>2,657</w:t>
+            </w:r>
+          </w:p>
+        </w:tc>
+        <w:tc>
+          <w:tcPr>
+            <w:tcW w:type="dxa" w:w="1040"/>
+            <w:vAlign w:val="center"/>
+            <w:tcMar>
+              <w:top w:w="80" w:type="dxa"/>
+              <w:start w:w="120" w:type="dxa"/>
+              <w:bottom w:w="80" w:type="dxa"/>
+              <w:end w:w="120" w:type="dxa"/>
+            </w:tcMar>
+          </w:tcPr>
+          <w:p>
+            <w:pPr>
+              <w:spacing w:after="0"/>
+              <w:jc w:val="left"/>
+            </w:pPr>
+            <w:r>
+              <w:rPr>
+                <w:rFonts w:ascii="Arial" w:hAnsi="Arial" w:eastAsia="Arial"/>
+                <w:b w:val="0"/>
+                <w:color w:val="111827"/>
+                <w:sz w:val="16"/>
+              </w:rPr>
+              <w:t>2,206</w:t>
+            </w:r>
+          </w:p>
+        </w:tc>
+        <w:tc>
+          <w:tcPr>
+            <w:tcW w:type="dxa" w:w="1040"/>
+            <w:vAlign w:val="center"/>
+            <w:tcMar>
+              <w:top w:w="80" w:type="dxa"/>
+              <w:start w:w="120" w:type="dxa"/>
+              <w:bottom w:w="80" w:type="dxa"/>
+              <w:end w:w="120" w:type="dxa"/>
+            </w:tcMar>
+          </w:tcPr>
+          <w:p>
+            <w:pPr>
+              <w:spacing w:after="0"/>
+              <w:jc w:val="left"/>
+            </w:pPr>
+            <w:r>
+              <w:rPr>
+                <w:rFonts w:ascii="Arial" w:hAnsi="Arial" w:eastAsia="Arial"/>
+                <w:b w:val="0"/>
+                <w:color w:val="111827"/>
+                <w:sz w:val="16"/>
+              </w:rPr>
+              <w:t>83.0%</w:t>
+            </w:r>
+          </w:p>
+        </w:tc>
+        <w:tc>
+          <w:tcPr>
+            <w:tcW w:type="dxa" w:w="1040"/>
+            <w:vAlign w:val="center"/>
+            <w:tcMar>
+              <w:top w:w="80" w:type="dxa"/>
+              <w:start w:w="120" w:type="dxa"/>
+              <w:bottom w:w="80" w:type="dxa"/>
+              <w:end w:w="120" w:type="dxa"/>
+            </w:tcMar>
+          </w:tcPr>
+          <w:p>
+            <w:pPr>
+              <w:spacing w:after="0"/>
+              <w:jc w:val="left"/>
+            </w:pPr>
+            <w:r>
+              <w:rPr>
+                <w:rFonts w:ascii="Arial" w:hAnsi="Arial" w:eastAsia="Arial"/>
+                <w:b w:val="0"/>
+                <w:color w:val="111827"/>
+                <w:sz w:val="16"/>
+              </w:rPr>
+              <w:t>59</w:t>
+            </w:r>
+          </w:p>
+        </w:tc>
+        <w:tc>
+          <w:tcPr>
+            <w:tcW w:type="dxa" w:w="1040"/>
+            <w:vAlign w:val="center"/>
+            <w:tcMar>
+              <w:top w:w="80" w:type="dxa"/>
+              <w:start w:w="120" w:type="dxa"/>
+              <w:bottom w:w="80" w:type="dxa"/>
+              <w:end w:w="120" w:type="dxa"/>
+            </w:tcMar>
+          </w:tcPr>
+          <w:p>
+            <w:pPr>
+              <w:spacing w:after="0"/>
+              <w:jc w:val="left"/>
+            </w:pPr>
+            <w:r>
+              <w:rPr>
+                <w:rFonts w:ascii="Arial" w:hAnsi="Arial" w:eastAsia="Arial"/>
+                <w:b w:val="0"/>
+                <w:color w:val="111827"/>
+                <w:sz w:val="16"/>
+              </w:rPr>
+              <w:t>7</w:t>
+            </w:r>
+          </w:p>
+        </w:tc>
+        <w:tc>
+          <w:tcPr>
+            <w:tcW w:type="dxa" w:w="1040"/>
+            <w:vAlign w:val="center"/>
+            <w:tcMar>
+              <w:top w:w="80" w:type="dxa"/>
+              <w:start w:w="120" w:type="dxa"/>
+              <w:bottom w:w="80" w:type="dxa"/>
+              <w:end w:w="120" w:type="dxa"/>
+            </w:tcMar>
+          </w:tcPr>
+          <w:p>
+            <w:pPr>
+              <w:spacing w:after="0"/>
+              <w:jc w:val="left"/>
+            </w:pPr>
+            <w:r>
+              <w:rPr>
+                <w:rFonts w:ascii="Arial" w:hAnsi="Arial" w:eastAsia="Arial"/>
+                <w:b w:val="0"/>
+                <w:color w:val="111827"/>
+                <w:sz w:val="16"/>
+              </w:rPr>
+              <w:t>7 groups; strong 1; medium 3</w:t>
+            </w:r>
+          </w:p>
+        </w:tc>
+        <w:tc>
+          <w:tcPr>
+            <w:tcW w:type="dxa" w:w="1040"/>
+            <w:vAlign w:val="center"/>
+            <w:tcMar>
+              <w:top w:w="80" w:type="dxa"/>
+              <w:start w:w="120" w:type="dxa"/>
+              <w:bottom w:w="80" w:type="dxa"/>
+              <w:end w:w="120" w:type="dxa"/>
+            </w:tcMar>
+          </w:tcPr>
+          <w:p>
+            <w:pPr>
+              <w:spacing w:after="0"/>
+              <w:jc w:val="left"/>
+            </w:pPr>
+            <w:r>
+              <w:rPr>
+                <w:rFonts w:ascii="Arial" w:hAnsi="Arial" w:eastAsia="Arial"/>
+                <w:b w:val="0"/>
+                <w:color w:val="111827"/>
+                <w:sz w:val="16"/>
+              </w:rPr>
+              <w:t>рынок плотный или контекст неясен</w:t>
+            </w:r>
+          </w:p>
+        </w:tc>
+      </w:tr>
+      <w:tr>
+        <w:tc>
+          <w:tcPr>
+            <w:tcW w:type="dxa" w:w="1040"/>
+            <w:vAlign w:val="center"/>
+            <w:tcMar>
+              <w:top w:w="80" w:type="dxa"/>
+              <w:start w:w="120" w:type="dxa"/>
+              <w:bottom w:w="80" w:type="dxa"/>
+              <w:end w:w="120" w:type="dxa"/>
+            </w:tcMar>
+            <w:shd w:fill="F8FAFC"/>
+          </w:tcPr>
+          <w:p>
+            <w:pPr>
+              <w:spacing w:after="0"/>
+              <w:jc w:val="left"/>
+            </w:pPr>
+            <w:r>
+              <w:rPr>
+                <w:rFonts w:ascii="Arial" w:hAnsi="Arial" w:eastAsia="Arial"/>
+                <w:b w:val="0"/>
+                <w:color w:val="111827"/>
+                <w:sz w:val="16"/>
+              </w:rPr>
+              <w:t>Coaching / self-improvement</w:t>
+            </w:r>
+          </w:p>
+        </w:tc>
+        <w:tc>
+          <w:tcPr>
+            <w:tcW w:type="dxa" w:w="1040"/>
+            <w:vAlign w:val="center"/>
+            <w:tcMar>
+              <w:top w:w="80" w:type="dxa"/>
+              <w:start w:w="120" w:type="dxa"/>
+              <w:bottom w:w="80" w:type="dxa"/>
+              <w:end w:w="120" w:type="dxa"/>
+            </w:tcMar>
+            <w:shd w:fill="F8FAFC"/>
+          </w:tcPr>
+          <w:p>
+            <w:pPr>
+              <w:spacing w:after="0"/>
+              <w:jc w:val="left"/>
+            </w:pPr>
+            <w:r>
+              <w:rPr>
+                <w:rFonts w:ascii="Arial" w:hAnsi="Arial" w:eastAsia="Arial"/>
+                <w:b w:val="0"/>
+                <w:color w:val="111827"/>
+                <w:sz w:val="16"/>
+              </w:rPr>
+              <w:t>7,671</w:t>
+            </w:r>
+          </w:p>
+        </w:tc>
+        <w:tc>
+          <w:tcPr>
+            <w:tcW w:type="dxa" w:w="1040"/>
+            <w:vAlign w:val="center"/>
+            <w:tcMar>
+              <w:top w:w="80" w:type="dxa"/>
+              <w:start w:w="120" w:type="dxa"/>
+              <w:bottom w:w="80" w:type="dxa"/>
+              <w:end w:w="120" w:type="dxa"/>
+            </w:tcMar>
+            <w:shd w:fill="F8FAFC"/>
+          </w:tcPr>
+          <w:p>
+            <w:pPr>
+              <w:spacing w:after="0"/>
+              <w:jc w:val="left"/>
+            </w:pPr>
+            <w:r>
+              <w:rPr>
+                <w:rFonts w:ascii="Arial" w:hAnsi="Arial" w:eastAsia="Arial"/>
+                <w:b w:val="0"/>
+                <w:color w:val="111827"/>
+                <w:sz w:val="16"/>
+              </w:rPr>
+              <w:t>3,857</w:t>
+            </w:r>
+          </w:p>
+        </w:tc>
+        <w:tc>
+          <w:tcPr>
+            <w:tcW w:type="dxa" w:w="1040"/>
+            <w:vAlign w:val="center"/>
+            <w:tcMar>
+              <w:top w:w="80" w:type="dxa"/>
+              <w:start w:w="120" w:type="dxa"/>
+              <w:bottom w:w="80" w:type="dxa"/>
+              <w:end w:w="120" w:type="dxa"/>
+            </w:tcMar>
+            <w:shd w:fill="F8FAFC"/>
+          </w:tcPr>
+          <w:p>
+            <w:pPr>
+              <w:spacing w:after="0"/>
+              <w:jc w:val="left"/>
+            </w:pPr>
+            <w:r>
+              <w:rPr>
+                <w:rFonts w:ascii="Arial" w:hAnsi="Arial" w:eastAsia="Arial"/>
+                <w:b w:val="0"/>
+                <w:color w:val="111827"/>
+                <w:sz w:val="16"/>
+              </w:rPr>
+              <w:t>2,651</w:t>
+            </w:r>
+          </w:p>
+        </w:tc>
+        <w:tc>
+          <w:tcPr>
+            <w:tcW w:type="dxa" w:w="1040"/>
+            <w:vAlign w:val="center"/>
+            <w:tcMar>
+              <w:top w:w="80" w:type="dxa"/>
+              <w:start w:w="120" w:type="dxa"/>
+              <w:bottom w:w="80" w:type="dxa"/>
+              <w:end w:w="120" w:type="dxa"/>
+            </w:tcMar>
+            <w:shd w:fill="F8FAFC"/>
+          </w:tcPr>
+          <w:p>
+            <w:pPr>
+              <w:spacing w:after="0"/>
+              <w:jc w:val="left"/>
+            </w:pPr>
+            <w:r>
+              <w:rPr>
+                <w:rFonts w:ascii="Arial" w:hAnsi="Arial" w:eastAsia="Arial"/>
+                <w:b w:val="0"/>
+                <w:color w:val="111827"/>
+                <w:sz w:val="16"/>
+              </w:rPr>
+              <w:t>68.7%</w:t>
+            </w:r>
+          </w:p>
+        </w:tc>
+        <w:tc>
+          <w:tcPr>
+            <w:tcW w:type="dxa" w:w="1040"/>
+            <w:vAlign w:val="center"/>
+            <w:tcMar>
+              <w:top w:w="80" w:type="dxa"/>
+              <w:start w:w="120" w:type="dxa"/>
+              <w:bottom w:w="80" w:type="dxa"/>
+              <w:end w:w="120" w:type="dxa"/>
+            </w:tcMar>
+            <w:shd w:fill="F8FAFC"/>
+          </w:tcPr>
+          <w:p>
+            <w:pPr>
+              <w:spacing w:after="0"/>
+              <w:jc w:val="left"/>
+            </w:pPr>
+            <w:r>
+              <w:rPr>
+                <w:rFonts w:ascii="Arial" w:hAnsi="Arial" w:eastAsia="Arial"/>
+                <w:b w:val="0"/>
+                <w:color w:val="111827"/>
+                <w:sz w:val="16"/>
+              </w:rPr>
+              <w:t>50</w:t>
+            </w:r>
+          </w:p>
+        </w:tc>
+        <w:tc>
+          <w:tcPr>
+            <w:tcW w:type="dxa" w:w="1040"/>
+            <w:vAlign w:val="center"/>
+            <w:tcMar>
+              <w:top w:w="80" w:type="dxa"/>
+              <w:start w:w="120" w:type="dxa"/>
+              <w:bottom w:w="80" w:type="dxa"/>
+              <w:end w:w="120" w:type="dxa"/>
+            </w:tcMar>
+            <w:shd w:fill="F8FAFC"/>
+          </w:tcPr>
+          <w:p>
+            <w:pPr>
+              <w:spacing w:after="0"/>
+              <w:jc w:val="left"/>
+            </w:pPr>
+            <w:r>
+              <w:rPr>
+                <w:rFonts w:ascii="Arial" w:hAnsi="Arial" w:eastAsia="Arial"/>
+                <w:b w:val="0"/>
+                <w:color w:val="111827"/>
+                <w:sz w:val="16"/>
+              </w:rPr>
+              <w:t>8</w:t>
+            </w:r>
+          </w:p>
+        </w:tc>
+        <w:tc>
+          <w:tcPr>
+            <w:tcW w:type="dxa" w:w="1040"/>
+            <w:vAlign w:val="center"/>
+            <w:tcMar>
+              <w:top w:w="80" w:type="dxa"/>
+              <w:start w:w="120" w:type="dxa"/>
+              <w:bottom w:w="80" w:type="dxa"/>
+              <w:end w:w="120" w:type="dxa"/>
+            </w:tcMar>
+            <w:shd w:fill="F8FAFC"/>
+          </w:tcPr>
+          <w:p>
+            <w:pPr>
+              <w:spacing w:after="0"/>
+              <w:jc w:val="left"/>
+            </w:pPr>
+            <w:r>
+              <w:rPr>
+                <w:rFonts w:ascii="Arial" w:hAnsi="Arial" w:eastAsia="Arial"/>
+                <w:b w:val="0"/>
+                <w:color w:val="111827"/>
+                <w:sz w:val="16"/>
+              </w:rPr>
+              <w:t>7 groups; strong 1; medium 3</w:t>
+            </w:r>
+          </w:p>
+        </w:tc>
+        <w:tc>
+          <w:tcPr>
+            <w:tcW w:type="dxa" w:w="1040"/>
+            <w:vAlign w:val="center"/>
+            <w:tcMar>
+              <w:top w:w="80" w:type="dxa"/>
+              <w:start w:w="120" w:type="dxa"/>
+              <w:bottom w:w="80" w:type="dxa"/>
+              <w:end w:w="120" w:type="dxa"/>
+            </w:tcMar>
+            <w:shd w:fill="F8FAFC"/>
+          </w:tcPr>
+          <w:p>
+            <w:pPr>
+              <w:spacing w:after="0"/>
+              <w:jc w:val="left"/>
+            </w:pPr>
+            <w:r>
+              <w:rPr>
+                <w:rFonts w:ascii="Arial" w:hAnsi="Arial" w:eastAsia="Arial"/>
+                <w:b w:val="0"/>
+                <w:color w:val="111827"/>
+                <w:sz w:val="16"/>
+              </w:rPr>
+              <w:t>рынок плотный или контекст неясен</w:t>
+            </w:r>
+          </w:p>
+        </w:tc>
+      </w:tr>
+      <w:tr>
+        <w:tc>
+          <w:tcPr>
+            <w:tcW w:type="dxa" w:w="1040"/>
+            <w:vAlign w:val="center"/>
+            <w:tcMar>
+              <w:top w:w="80" w:type="dxa"/>
+              <w:start w:w="120" w:type="dxa"/>
+              <w:bottom w:w="80" w:type="dxa"/>
+              <w:end w:w="120" w:type="dxa"/>
+            </w:tcMar>
+          </w:tcPr>
+          <w:p>
+            <w:pPr>
+              <w:spacing w:after="0"/>
+              <w:jc w:val="left"/>
+            </w:pPr>
+            <w:r>
+              <w:rPr>
+                <w:rFonts w:ascii="Arial" w:hAnsi="Arial" w:eastAsia="Arial"/>
+                <w:b w:val="0"/>
+                <w:color w:val="111827"/>
+                <w:sz w:val="16"/>
+              </w:rPr>
+              <w:t>Gaming / progression benchmark</w:t>
+            </w:r>
+          </w:p>
+        </w:tc>
+        <w:tc>
+          <w:tcPr>
+            <w:tcW w:type="dxa" w:w="1040"/>
+            <w:vAlign w:val="center"/>
+            <w:tcMar>
+              <w:top w:w="80" w:type="dxa"/>
+              <w:start w:w="120" w:type="dxa"/>
+              <w:bottom w:w="80" w:type="dxa"/>
+              <w:end w:w="120" w:type="dxa"/>
+            </w:tcMar>
+          </w:tcPr>
+          <w:p>
+            <w:pPr>
+              <w:spacing w:after="0"/>
+              <w:jc w:val="left"/>
+            </w:pPr>
+            <w:r>
+              <w:rPr>
+                <w:rFonts w:ascii="Arial" w:hAnsi="Arial" w:eastAsia="Arial"/>
+                <w:b w:val="0"/>
+                <w:color w:val="111827"/>
+                <w:sz w:val="16"/>
+              </w:rPr>
+              <w:t>24,446</w:t>
+            </w:r>
+          </w:p>
+        </w:tc>
+        <w:tc>
+          <w:tcPr>
+            <w:tcW w:type="dxa" w:w="1040"/>
+            <w:vAlign w:val="center"/>
+            <w:tcMar>
+              <w:top w:w="80" w:type="dxa"/>
+              <w:start w:w="120" w:type="dxa"/>
+              <w:bottom w:w="80" w:type="dxa"/>
+              <w:end w:w="120" w:type="dxa"/>
+            </w:tcMar>
+          </w:tcPr>
+          <w:p>
+            <w:pPr>
+              <w:spacing w:after="0"/>
+              <w:jc w:val="left"/>
+            </w:pPr>
+            <w:r>
+              <w:rPr>
+                <w:rFonts w:ascii="Arial" w:hAnsi="Arial" w:eastAsia="Arial"/>
+                <w:b w:val="0"/>
+                <w:color w:val="111827"/>
+                <w:sz w:val="16"/>
+              </w:rPr>
+              <w:t>16,875</w:t>
+            </w:r>
+          </w:p>
+        </w:tc>
+        <w:tc>
+          <w:tcPr>
+            <w:tcW w:type="dxa" w:w="1040"/>
+            <w:vAlign w:val="center"/>
+            <w:tcMar>
+              <w:top w:w="80" w:type="dxa"/>
+              <w:start w:w="120" w:type="dxa"/>
+              <w:bottom w:w="80" w:type="dxa"/>
+              <w:end w:w="120" w:type="dxa"/>
+            </w:tcMar>
+          </w:tcPr>
+          <w:p>
+            <w:pPr>
+              <w:spacing w:after="0"/>
+              <w:jc w:val="left"/>
+            </w:pPr>
+            <w:r>
+              <w:rPr>
+                <w:rFonts w:ascii="Arial" w:hAnsi="Arial" w:eastAsia="Arial"/>
+                <w:b w:val="0"/>
+                <w:color w:val="111827"/>
+                <w:sz w:val="16"/>
+              </w:rPr>
+              <w:t>3,204</w:t>
+            </w:r>
+          </w:p>
+        </w:tc>
+        <w:tc>
+          <w:tcPr>
+            <w:tcW w:type="dxa" w:w="1040"/>
+            <w:vAlign w:val="center"/>
+            <w:tcMar>
+              <w:top w:w="80" w:type="dxa"/>
+              <w:start w:w="120" w:type="dxa"/>
+              <w:bottom w:w="80" w:type="dxa"/>
+              <w:end w:w="120" w:type="dxa"/>
+            </w:tcMar>
+          </w:tcPr>
+          <w:p>
+            <w:pPr>
+              <w:spacing w:after="0"/>
+              <w:jc w:val="left"/>
+            </w:pPr>
+            <w:r>
+              <w:rPr>
+                <w:rFonts w:ascii="Arial" w:hAnsi="Arial" w:eastAsia="Arial"/>
+                <w:b w:val="0"/>
+                <w:color w:val="111827"/>
+                <w:sz w:val="16"/>
+              </w:rPr>
+              <w:t>19.0%</w:t>
+            </w:r>
+          </w:p>
+        </w:tc>
+        <w:tc>
+          <w:tcPr>
+            <w:tcW w:type="dxa" w:w="1040"/>
+            <w:vAlign w:val="center"/>
+            <w:tcMar>
+              <w:top w:w="80" w:type="dxa"/>
+              <w:start w:w="120" w:type="dxa"/>
+              <w:bottom w:w="80" w:type="dxa"/>
+              <w:end w:w="120" w:type="dxa"/>
+            </w:tcMar>
+          </w:tcPr>
+          <w:p>
+            <w:pPr>
+              <w:spacing w:after="0"/>
+              <w:jc w:val="left"/>
+            </w:pPr>
+            <w:r>
+              <w:rPr>
+                <w:rFonts w:ascii="Arial" w:hAnsi="Arial" w:eastAsia="Arial"/>
+                <w:b w:val="0"/>
+                <w:color w:val="111827"/>
+                <w:sz w:val="16"/>
+              </w:rPr>
+              <w:t>8</w:t>
+            </w:r>
+          </w:p>
+        </w:tc>
+        <w:tc>
+          <w:tcPr>
+            <w:tcW w:type="dxa" w:w="1040"/>
+            <w:vAlign w:val="center"/>
+            <w:tcMar>
+              <w:top w:w="80" w:type="dxa"/>
+              <w:start w:w="120" w:type="dxa"/>
+              <w:bottom w:w="80" w:type="dxa"/>
+              <w:end w:w="120" w:type="dxa"/>
+            </w:tcMar>
+          </w:tcPr>
+          <w:p>
+            <w:pPr>
+              <w:spacing w:after="0"/>
+              <w:jc w:val="left"/>
+            </w:pPr>
+            <w:r>
+              <w:rPr>
+                <w:rFonts w:ascii="Arial" w:hAnsi="Arial" w:eastAsia="Arial"/>
+                <w:b w:val="0"/>
+                <w:color w:val="111827"/>
+                <w:sz w:val="16"/>
+              </w:rPr>
+              <w:t>0</w:t>
+            </w:r>
+          </w:p>
+        </w:tc>
+        <w:tc>
+          <w:tcPr>
+            <w:tcW w:type="dxa" w:w="1040"/>
+            <w:vAlign w:val="center"/>
+            <w:tcMar>
+              <w:top w:w="80" w:type="dxa"/>
+              <w:start w:w="120" w:type="dxa"/>
+              <w:bottom w:w="80" w:type="dxa"/>
+              <w:end w:w="120" w:type="dxa"/>
+            </w:tcMar>
+          </w:tcPr>
+          <w:p>
+            <w:pPr>
+              <w:spacing w:after="0"/>
+              <w:jc w:val="left"/>
+            </w:pPr>
+            <w:r>
+              <w:rPr>
+                <w:rFonts w:ascii="Arial" w:hAnsi="Arial" w:eastAsia="Arial"/>
+                <w:b w:val="0"/>
+                <w:color w:val="111827"/>
+                <w:sz w:val="16"/>
+              </w:rPr>
+              <w:t>9 groups; strong 3; medium 2</w:t>
+            </w:r>
+          </w:p>
+        </w:tc>
+        <w:tc>
+          <w:tcPr>
+            <w:tcW w:type="dxa" w:w="1040"/>
+            <w:vAlign w:val="center"/>
+            <w:tcMar>
+              <w:top w:w="80" w:type="dxa"/>
+              <w:start w:w="120" w:type="dxa"/>
+              <w:bottom w:w="80" w:type="dxa"/>
+              <w:end w:w="120" w:type="dxa"/>
+            </w:tcMar>
+          </w:tcPr>
+          <w:p>
+            <w:pPr>
+              <w:spacing w:after="0"/>
+              <w:jc w:val="left"/>
+            </w:pPr>
+            <w:r>
+              <w:rPr>
+                <w:rFonts w:ascii="Arial" w:hAnsi="Arial" w:eastAsia="Arial"/>
+                <w:b w:val="0"/>
+                <w:color w:val="111827"/>
+                <w:sz w:val="16"/>
+              </w:rPr>
+              <w:t>benchmark механик, не primary market</w:t>
+            </w:r>
+          </w:p>
+        </w:tc>
+      </w:tr>
+    </w:tbl>
+    <w:p/>
+    <w:p>
+      <w:r>
         <w:t>Гипотеза №2: мировые adjacent-рынки достаточно велики и монетизируемы, чтобы продолжать проверку Alina, но рыночные цифры должны читаться как sizing для направления, а не как прогноз выручки самого продукта.</w:t>
       </w:r>
     </w:p>
@@ -17984,7 +19515,7 @@
                 <w:color w:val="111827"/>
                 <w:sz w:val="16"/>
               </w:rPr>
-              <w:t>raw=67525; dedup=36694; dedup50_status=open; source_refs=239842</w:t>
+              <w:t>raw=67525; dedup=36694; dedup50_status=open; source_refs=239848</w:t>
             </w:r>
           </w:p>
         </w:tc>
@@ -18818,7 +20349,7 @@
                 <w:color w:val="111827"/>
                 <w:sz w:val="16"/>
               </w:rPr>
-              <w:t>manifest=477; missing=0; docs=119; scripts=105</w:t>
+              <w:t>manifest=480; missing=0; docs=120; scripts=106</w:t>
             </w:r>
           </w:p>
         </w:tc>
@@ -20174,7 +21705,7 @@
                 <w:color w:val="111827"/>
                 <w:sz w:val="16"/>
               </w:rPr>
-              <w:t>477 manifest artifacts; missing=0</w:t>
+              <w:t>480 manifest artifacts; missing=0</w:t>
             </w:r>
           </w:p>
         </w:tc>
@@ -20344,6 +21875,143 @@
                 <w:sz w:val="16"/>
               </w:rPr>
               <w:t>Образец задает композицию и русский нарратив; он не переносит российский рынок, локальные цифры или старую продуктовую гипотезу в мировой отчет.</w:t>
+            </w:r>
+          </w:p>
+        </w:tc>
+      </w:tr>
+      <w:tr>
+        <w:tc>
+          <w:tcPr>
+            <w:tcW w:type="dxa" w:w="2376"/>
+            <w:vAlign w:val="center"/>
+            <w:tcMar>
+              <w:top w:w="80" w:type="dxa"/>
+              <w:start w:w="120" w:type="dxa"/>
+              <w:bottom w:w="80" w:type="dxa"/>
+              <w:end w:w="120" w:type="dxa"/>
+            </w:tcMar>
+          </w:tcPr>
+          <w:p>
+            <w:pPr>
+              <w:spacing w:after="0"/>
+              <w:jc w:val="left"/>
+            </w:pPr>
+            <w:r>
+              <w:rPr>
+                <w:rFonts w:ascii="Arial" w:hAnsi="Arial" w:eastAsia="Arial"/>
+                <w:b w:val="0"/>
+                <w:color w:val="111827"/>
+                <w:sz w:val="16"/>
+              </w:rPr>
+              <w:t>SRC_09_NICHE_COUNT_ROLLUP</w:t>
+            </w:r>
+          </w:p>
+        </w:tc>
+        <w:tc>
+          <w:tcPr>
+            <w:tcW w:type="dxa" w:w="1224"/>
+            <w:vAlign w:val="center"/>
+            <w:tcMar>
+              <w:top w:w="80" w:type="dxa"/>
+              <w:start w:w="120" w:type="dxa"/>
+              <w:bottom w:w="80" w:type="dxa"/>
+              <w:end w:w="120" w:type="dxa"/>
+            </w:tcMar>
+          </w:tcPr>
+          <w:p>
+            <w:pPr>
+              <w:spacing w:after="0"/>
+              <w:jc w:val="left"/>
+            </w:pPr>
+            <w:r>
+              <w:rPr>
+                <w:rFonts w:ascii="Arial" w:hAnsi="Arial" w:eastAsia="Arial"/>
+                <w:b w:val="0"/>
+                <w:color w:val="111827"/>
+                <w:sz w:val="16"/>
+              </w:rPr>
+              <w:t>Определение мировых целевых рынков и гипотеза #2</w:t>
+            </w:r>
+          </w:p>
+        </w:tc>
+        <w:tc>
+          <w:tcPr>
+            <w:tcW w:type="dxa" w:w="1224"/>
+            <w:vAlign w:val="center"/>
+            <w:tcMar>
+              <w:top w:w="80" w:type="dxa"/>
+              <w:start w:w="120" w:type="dxa"/>
+              <w:bottom w:w="80" w:type="dxa"/>
+              <w:end w:w="120" w:type="dxa"/>
+            </w:tcMar>
+          </w:tcPr>
+          <w:p>
+            <w:pPr>
+              <w:spacing w:after="0"/>
+              <w:jc w:val="left"/>
+            </w:pPr>
+            <w:r>
+              <w:rPr>
+                <w:rFonts w:ascii="Arial" w:hAnsi="Arial" w:eastAsia="Arial"/>
+                <w:b w:val="0"/>
+                <w:color w:val="111827"/>
+                <w:sz w:val="16"/>
+              </w:rPr>
+              <w:t>доказано как source-count rollup, не как PMF proof</w:t>
+            </w:r>
+          </w:p>
+        </w:tc>
+        <w:tc>
+          <w:tcPr>
+            <w:tcW w:type="dxa" w:w="1944"/>
+            <w:vAlign w:val="center"/>
+            <w:tcMar>
+              <w:top w:w="80" w:type="dxa"/>
+              <w:start w:w="120" w:type="dxa"/>
+              <w:bottom w:w="80" w:type="dxa"/>
+              <w:end w:w="120" w:type="dxa"/>
+            </w:tcMar>
+          </w:tcPr>
+          <w:p>
+            <w:pPr>
+              <w:spacing w:after="0"/>
+              <w:jc w:val="left"/>
+            </w:pPr>
+            <w:r>
+              <w:rPr>
+                <w:rFonts w:ascii="Arial" w:hAnsi="Arial" w:eastAsia="Arial"/>
+                <w:b w:val="0"/>
+                <w:color w:val="111827"/>
+                <w:sz w:val="16"/>
+              </w:rPr>
+              <w:t>5 niche rows; file=data_processed/global_niche_count_rollup.csv</w:t>
+            </w:r>
+          </w:p>
+        </w:tc>
+        <w:tc>
+          <w:tcPr>
+            <w:tcW w:type="dxa" w:w="2592"/>
+            <w:vAlign w:val="center"/>
+            <w:tcMar>
+              <w:top w:w="80" w:type="dxa"/>
+              <w:start w:w="120" w:type="dxa"/>
+              <w:bottom w:w="80" w:type="dxa"/>
+              <w:end w:w="120" w:type="dxa"/>
+            </w:tcMar>
+          </w:tcPr>
+          <w:p>
+            <w:pPr>
+              <w:spacing w:after="0"/>
+              <w:jc w:val="left"/>
+            </w:pPr>
+            <w:r>
+              <w:rPr>
+                <w:rFonts w:ascii="Arial" w:hAnsi="Arial" w:eastAsia="Arial"/>
+                <w:b w:val="0"/>
+                <w:color w:val="111827"/>
+                <w:sz w:val="16"/>
+              </w:rPr>
+              <w:t>Niche count rollup показывает масштаб source discovery по рынкам; он не доказывает спрос, WTP или отсутствие скрытого full-loop конкурента.</w:t>
             </w:r>
           </w:p>
         </w:tc>
@@ -20472,6 +22140,15 @@
       </w:pPr>
       <w:r>
         <w:t>data_processed/global_market_sizing_methodology.csv</w:t>
+      </w:r>
+    </w:p>
+    <w:p>
+      <w:pPr>
+        <w:pStyle w:val="ListBullet"/>
+        <w:spacing w:after="80"/>
+      </w:pPr>
+      <w:r>
+        <w:t>data_processed/global_niche_count_rollup.csv</w:t>
       </w:r>
     </w:p>
     <w:p>

</xml_diff>

<commit_message>
Add competitor archetype rollup
</commit_message>
<xml_diff>
--- a/output/docx/alina-global-hypothesis-report-v1.docx
+++ b/output/docx/alina-global-hypothesis-report-v1.docx
@@ -31,7 +31,7 @@
     </w:p>
     <w:p>
       <w:r>
-        <w:t>Собрано: 2026-05-31T16:20:48.669Z</w:t>
+        <w:t>Собрано: 2026-05-31T16:25:42.313Z</w:t>
       </w:r>
     </w:p>
     <w:p>
@@ -64,7 +64,7 @@
     </w:p>
     <w:p>
       <w:r>
-        <w:t>На текущем этапе собрано 67,525 сырьевых source-строк, 36,694 уникализированных строк и 480 локальных артефактов. Эти данные нужны не для того, чтобы объявить продукт доказанным, а для последовательной проверки: существует ли рынок, есть ли деньги, насколько плотна конкуренция, где может быть белое пятно, кто аудитория и какую MVP-петлю надо тестировать.</w:t>
+        <w:t>На текущем этапе собрано 67,525 сырьевых source-строк, 36,694 уникализированных строк и 483 локальных артефактов. Эти данные нужны не для того, чтобы объявить продукт доказанным, а для последовательной проверки: существует ли рынок, есть ли деньги, насколько плотна конкуренция, где может быть белое пятно, кто аудитория и какую MVP-петлю надо тестировать.</w:t>
       </w:r>
     </w:p>
     <w:p>
@@ -8633,6 +8633,2257 @@
         <w:t>Конкурентная среда подтверждает, что пользователь уже решает части задачи через существующие приложения. В top-100 review сейчас есть meditation apps, habit trackers, AI journals, spiritual guidance apps, avatar/identity apps и progression products. Рынок не пустой, поэтому сильная ставка Alina не может звучать как “конкурентов нет”. Ставка должна быть точнее: конкуренты закрывают отдельные части петли, но полная причинная связка meaning -&gt; action -&gt; reset -&gt; visible identity/progress встречается редко и требует ручной проверки.</w:t>
       </w:r>
     </w:p>
+    <w:p>
+      <w:r>
+        <w:t>Чтобы конкурентная карта не выглядела как случайный список приложений, ниже она сведена в archetype rollup. Это промежуточная классификация по App Store metadata/reviews/IAP и AI-assisted scorecards: она показывает, какие типы конкурентов создают риск для Alina, но не заменяет walkthrough. Особенно важно смотреть не только на количество приложений, а на close/direct count, behavior-tied progression и manual targets. Отдельная осторожность: AI companion / tarot-oracle labels требуют taxonomy cleanup перед сильными выводами, потому что source classifier может смешивать symbolic guidance и roleplay/companion продукты.</w:t>
+      </w:r>
+    </w:p>
+    <w:tbl>
+      <w:tblPr>
+        <w:tblW w:type="dxa" w:w="9360"/>
+        <w:jc w:val="left"/>
+        <w:tblLayout w:type="fixed"/>
+        <w:tblLook w:firstColumn="1" w:firstRow="1" w:lastColumn="0" w:lastRow="0" w:noHBand="0" w:noVBand="1" w:val="04A0"/>
+        <w:tblInd w:w="120" w:type="dxa"/>
+        <w:tblBorders>
+          <w:top w:val="single" w:sz="4" w:space="0" w:color="CBD5E1"/>
+          <w:left w:val="single" w:sz="4" w:space="0" w:color="CBD5E1"/>
+          <w:bottom w:val="single" w:sz="4" w:space="0" w:color="CBD5E1"/>
+          <w:right w:val="single" w:sz="4" w:space="0" w:color="CBD5E1"/>
+          <w:insideH w:val="single" w:sz="4" w:space="0" w:color="CBD5E1"/>
+          <w:insideV w:val="single" w:sz="4" w:space="0" w:color="CBD5E1"/>
+        </w:tblBorders>
+      </w:tblPr>
+      <w:tblGrid>
+        <w:gridCol w:w="936"/>
+        <w:gridCol w:w="936"/>
+        <w:gridCol w:w="936"/>
+        <w:gridCol w:w="936"/>
+        <w:gridCol w:w="936"/>
+        <w:gridCol w:w="936"/>
+        <w:gridCol w:w="936"/>
+        <w:gridCol w:w="936"/>
+        <w:gridCol w:w="936"/>
+        <w:gridCol w:w="936"/>
+      </w:tblGrid>
+      <w:tr>
+        <w:tc>
+          <w:tcPr>
+            <w:tcW w:type="dxa" w:w="936"/>
+            <w:vAlign w:val="center"/>
+            <w:tcMar>
+              <w:top w:w="80" w:type="dxa"/>
+              <w:start w:w="120" w:type="dxa"/>
+              <w:bottom w:w="80" w:type="dxa"/>
+              <w:end w:w="120" w:type="dxa"/>
+            </w:tcMar>
+            <w:shd w:fill="E8EEF5"/>
+          </w:tcPr>
+          <w:p>
+            <w:pPr>
+              <w:spacing w:after="0"/>
+              <w:jc w:val="left"/>
+            </w:pPr>
+            <w:r>
+              <w:rPr>
+                <w:rFonts w:ascii="Arial" w:hAnsi="Arial" w:eastAsia="Arial"/>
+                <w:b/>
+                <w:color w:val="111827"/>
+                <w:sz w:val="16"/>
+              </w:rPr>
+              <w:t>Archetype</w:t>
+            </w:r>
+          </w:p>
+        </w:tc>
+        <w:tc>
+          <w:tcPr>
+            <w:tcW w:type="dxa" w:w="936"/>
+            <w:vAlign w:val="center"/>
+            <w:tcMar>
+              <w:top w:w="80" w:type="dxa"/>
+              <w:start w:w="120" w:type="dxa"/>
+              <w:bottom w:w="80" w:type="dxa"/>
+              <w:end w:w="120" w:type="dxa"/>
+            </w:tcMar>
+            <w:shd w:fill="E8EEF5"/>
+          </w:tcPr>
+          <w:p>
+            <w:pPr>
+              <w:spacing w:after="0"/>
+              <w:jc w:val="left"/>
+            </w:pPr>
+            <w:r>
+              <w:rPr>
+                <w:rFonts w:ascii="Arial" w:hAnsi="Arial" w:eastAsia="Arial"/>
+                <w:b/>
+                <w:color w:val="111827"/>
+                <w:sz w:val="16"/>
+              </w:rPr>
+              <w:t>Market role</w:t>
+            </w:r>
+          </w:p>
+        </w:tc>
+        <w:tc>
+          <w:tcPr>
+            <w:tcW w:type="dxa" w:w="936"/>
+            <w:vAlign w:val="center"/>
+            <w:tcMar>
+              <w:top w:w="80" w:type="dxa"/>
+              <w:start w:w="120" w:type="dxa"/>
+              <w:bottom w:w="80" w:type="dxa"/>
+              <w:end w:w="120" w:type="dxa"/>
+            </w:tcMar>
+            <w:shd w:fill="E8EEF5"/>
+          </w:tcPr>
+          <w:p>
+            <w:pPr>
+              <w:spacing w:after="0"/>
+              <w:jc w:val="left"/>
+            </w:pPr>
+            <w:r>
+              <w:rPr>
+                <w:rFonts w:ascii="Arial" w:hAnsi="Arial" w:eastAsia="Arial"/>
+                <w:b/>
+                <w:color w:val="111827"/>
+                <w:sz w:val="16"/>
+              </w:rPr>
+              <w:t>Top-100 apps</w:t>
+            </w:r>
+          </w:p>
+        </w:tc>
+        <w:tc>
+          <w:tcPr>
+            <w:tcW w:type="dxa" w:w="936"/>
+            <w:vAlign w:val="center"/>
+            <w:tcMar>
+              <w:top w:w="80" w:type="dxa"/>
+              <w:start w:w="120" w:type="dxa"/>
+              <w:bottom w:w="80" w:type="dxa"/>
+              <w:end w:w="120" w:type="dxa"/>
+            </w:tcMar>
+            <w:shd w:fill="E8EEF5"/>
+          </w:tcPr>
+          <w:p>
+            <w:pPr>
+              <w:spacing w:after="0"/>
+              <w:jc w:val="left"/>
+            </w:pPr>
+            <w:r>
+              <w:rPr>
+                <w:rFonts w:ascii="Arial" w:hAnsi="Arial" w:eastAsia="Arial"/>
+                <w:b/>
+                <w:color w:val="111827"/>
+                <w:sz w:val="16"/>
+              </w:rPr>
+              <w:t>Close/direct</w:t>
+            </w:r>
+          </w:p>
+        </w:tc>
+        <w:tc>
+          <w:tcPr>
+            <w:tcW w:type="dxa" w:w="936"/>
+            <w:vAlign w:val="center"/>
+            <w:tcMar>
+              <w:top w:w="80" w:type="dxa"/>
+              <w:start w:w="120" w:type="dxa"/>
+              <w:bottom w:w="80" w:type="dxa"/>
+              <w:end w:w="120" w:type="dxa"/>
+            </w:tcMar>
+            <w:shd w:fill="E8EEF5"/>
+          </w:tcPr>
+          <w:p>
+            <w:pPr>
+              <w:spacing w:after="0"/>
+              <w:jc w:val="left"/>
+            </w:pPr>
+            <w:r>
+              <w:rPr>
+                <w:rFonts w:ascii="Arial" w:hAnsi="Arial" w:eastAsia="Arial"/>
+                <w:b/>
+                <w:color w:val="111827"/>
+                <w:sz w:val="16"/>
+              </w:rPr>
+              <w:t>Behavior-tied</w:t>
+            </w:r>
+          </w:p>
+        </w:tc>
+        <w:tc>
+          <w:tcPr>
+            <w:tcW w:type="dxa" w:w="936"/>
+            <w:vAlign w:val="center"/>
+            <w:tcMar>
+              <w:top w:w="80" w:type="dxa"/>
+              <w:start w:w="120" w:type="dxa"/>
+              <w:bottom w:w="80" w:type="dxa"/>
+              <w:end w:w="120" w:type="dxa"/>
+            </w:tcMar>
+            <w:shd w:fill="E8EEF5"/>
+          </w:tcPr>
+          <w:p>
+            <w:pPr>
+              <w:spacing w:after="0"/>
+              <w:jc w:val="left"/>
+            </w:pPr>
+            <w:r>
+              <w:rPr>
+                <w:rFonts w:ascii="Arial" w:hAnsi="Arial" w:eastAsia="Arial"/>
+                <w:b/>
+                <w:color w:val="111827"/>
+                <w:sz w:val="16"/>
+              </w:rPr>
+              <w:t>Paid signal</w:t>
+            </w:r>
+          </w:p>
+        </w:tc>
+        <w:tc>
+          <w:tcPr>
+            <w:tcW w:type="dxa" w:w="936"/>
+            <w:vAlign w:val="center"/>
+            <w:tcMar>
+              <w:top w:w="80" w:type="dxa"/>
+              <w:start w:w="120" w:type="dxa"/>
+              <w:bottom w:w="80" w:type="dxa"/>
+              <w:end w:w="120" w:type="dxa"/>
+            </w:tcMar>
+            <w:shd w:fill="E8EEF5"/>
+          </w:tcPr>
+          <w:p>
+            <w:pPr>
+              <w:spacing w:after="0"/>
+              <w:jc w:val="left"/>
+            </w:pPr>
+            <w:r>
+              <w:rPr>
+                <w:rFonts w:ascii="Arial" w:hAnsi="Arial" w:eastAsia="Arial"/>
+                <w:b/>
+                <w:color w:val="111827"/>
+                <w:sz w:val="16"/>
+              </w:rPr>
+              <w:t>Battlecards</w:t>
+            </w:r>
+          </w:p>
+        </w:tc>
+        <w:tc>
+          <w:tcPr>
+            <w:tcW w:type="dxa" w:w="936"/>
+            <w:vAlign w:val="center"/>
+            <w:tcMar>
+              <w:top w:w="80" w:type="dxa"/>
+              <w:start w:w="120" w:type="dxa"/>
+              <w:bottom w:w="80" w:type="dxa"/>
+              <w:end w:w="120" w:type="dxa"/>
+            </w:tcMar>
+            <w:shd w:fill="E8EEF5"/>
+          </w:tcPr>
+          <w:p>
+            <w:pPr>
+              <w:spacing w:after="0"/>
+              <w:jc w:val="left"/>
+            </w:pPr>
+            <w:r>
+              <w:rPr>
+                <w:rFonts w:ascii="Arial" w:hAnsi="Arial" w:eastAsia="Arial"/>
+                <w:b/>
+                <w:color w:val="111827"/>
+                <w:sz w:val="16"/>
+              </w:rPr>
+              <w:t>Manual targets</w:t>
+            </w:r>
+          </w:p>
+        </w:tc>
+        <w:tc>
+          <w:tcPr>
+            <w:tcW w:type="dxa" w:w="936"/>
+            <w:vAlign w:val="center"/>
+            <w:tcMar>
+              <w:top w:w="80" w:type="dxa"/>
+              <w:start w:w="120" w:type="dxa"/>
+              <w:bottom w:w="80" w:type="dxa"/>
+              <w:end w:w="120" w:type="dxa"/>
+            </w:tcMar>
+            <w:shd w:fill="E8EEF5"/>
+          </w:tcPr>
+          <w:p>
+            <w:pPr>
+              <w:spacing w:after="0"/>
+              <w:jc w:val="left"/>
+            </w:pPr>
+            <w:r>
+              <w:rPr>
+                <w:rFonts w:ascii="Arial" w:hAnsi="Arial" w:eastAsia="Arial"/>
+                <w:b/>
+                <w:color w:val="111827"/>
+                <w:sz w:val="16"/>
+              </w:rPr>
+              <w:t>Taxonomy</w:t>
+            </w:r>
+          </w:p>
+        </w:tc>
+        <w:tc>
+          <w:tcPr>
+            <w:tcW w:type="dxa" w:w="936"/>
+            <w:vAlign w:val="center"/>
+            <w:tcMar>
+              <w:top w:w="80" w:type="dxa"/>
+              <w:start w:w="120" w:type="dxa"/>
+              <w:bottom w:w="80" w:type="dxa"/>
+              <w:end w:w="120" w:type="dxa"/>
+            </w:tcMar>
+            <w:shd w:fill="E8EEF5"/>
+          </w:tcPr>
+          <w:p>
+            <w:pPr>
+              <w:spacing w:after="0"/>
+              <w:jc w:val="left"/>
+            </w:pPr>
+            <w:r>
+              <w:rPr>
+                <w:rFonts w:ascii="Arial" w:hAnsi="Arial" w:eastAsia="Arial"/>
+                <w:b/>
+                <w:color w:val="111827"/>
+                <w:sz w:val="16"/>
+              </w:rPr>
+              <w:t>Top examples</w:t>
+            </w:r>
+          </w:p>
+        </w:tc>
+      </w:tr>
+      <w:tr>
+        <w:tc>
+          <w:tcPr>
+            <w:tcW w:type="dxa" w:w="936"/>
+            <w:vAlign w:val="center"/>
+            <w:tcMar>
+              <w:top w:w="80" w:type="dxa"/>
+              <w:start w:w="120" w:type="dxa"/>
+              <w:bottom w:w="80" w:type="dxa"/>
+              <w:end w:w="120" w:type="dxa"/>
+            </w:tcMar>
+          </w:tcPr>
+          <w:p>
+            <w:pPr>
+              <w:spacing w:after="0"/>
+              <w:jc w:val="left"/>
+            </w:pPr>
+            <w:r>
+              <w:rPr>
+                <w:rFonts w:ascii="Arial" w:hAnsi="Arial" w:eastAsia="Arial"/>
+                <w:b w:val="0"/>
+                <w:color w:val="111827"/>
+                <w:sz w:val="16"/>
+              </w:rPr>
+              <w:t>ai_companion_roleplay</w:t>
+            </w:r>
+          </w:p>
+        </w:tc>
+        <w:tc>
+          <w:tcPr>
+            <w:tcW w:type="dxa" w:w="936"/>
+            <w:vAlign w:val="center"/>
+            <w:tcMar>
+              <w:top w:w="80" w:type="dxa"/>
+              <w:start w:w="120" w:type="dxa"/>
+              <w:bottom w:w="80" w:type="dxa"/>
+              <w:end w:w="120" w:type="dxa"/>
+            </w:tcMar>
+          </w:tcPr>
+          <w:p>
+            <w:pPr>
+              <w:spacing w:after="0"/>
+              <w:jc w:val="left"/>
+            </w:pPr>
+            <w:r>
+              <w:rPr>
+                <w:rFonts w:ascii="Arial" w:hAnsi="Arial" w:eastAsia="Arial"/>
+                <w:b w:val="0"/>
+                <w:color w:val="111827"/>
+                <w:sz w:val="16"/>
+              </w:rPr>
+              <w:t>AI companion / identity benchmark</w:t>
+            </w:r>
+          </w:p>
+        </w:tc>
+        <w:tc>
+          <w:tcPr>
+            <w:tcW w:type="dxa" w:w="936"/>
+            <w:vAlign w:val="center"/>
+            <w:tcMar>
+              <w:top w:w="80" w:type="dxa"/>
+              <w:start w:w="120" w:type="dxa"/>
+              <w:bottom w:w="80" w:type="dxa"/>
+              <w:end w:w="120" w:type="dxa"/>
+            </w:tcMar>
+          </w:tcPr>
+          <w:p>
+            <w:pPr>
+              <w:spacing w:after="0"/>
+              <w:jc w:val="left"/>
+            </w:pPr>
+            <w:r>
+              <w:rPr>
+                <w:rFonts w:ascii="Arial" w:hAnsi="Arial" w:eastAsia="Arial"/>
+                <w:b w:val="0"/>
+                <w:color w:val="111827"/>
+                <w:sz w:val="16"/>
+              </w:rPr>
+              <w:t>1</w:t>
+            </w:r>
+          </w:p>
+        </w:tc>
+        <w:tc>
+          <w:tcPr>
+            <w:tcW w:type="dxa" w:w="936"/>
+            <w:vAlign w:val="center"/>
+            <w:tcMar>
+              <w:top w:w="80" w:type="dxa"/>
+              <w:start w:w="120" w:type="dxa"/>
+              <w:bottom w:w="80" w:type="dxa"/>
+              <w:end w:w="120" w:type="dxa"/>
+            </w:tcMar>
+          </w:tcPr>
+          <w:p>
+            <w:pPr>
+              <w:spacing w:after="0"/>
+              <w:jc w:val="left"/>
+            </w:pPr>
+            <w:r>
+              <w:rPr>
+                <w:rFonts w:ascii="Arial" w:hAnsi="Arial" w:eastAsia="Arial"/>
+                <w:b w:val="0"/>
+                <w:color w:val="111827"/>
+                <w:sz w:val="16"/>
+              </w:rPr>
+              <w:t>1</w:t>
+            </w:r>
+          </w:p>
+        </w:tc>
+        <w:tc>
+          <w:tcPr>
+            <w:tcW w:type="dxa" w:w="936"/>
+            <w:vAlign w:val="center"/>
+            <w:tcMar>
+              <w:top w:w="80" w:type="dxa"/>
+              <w:start w:w="120" w:type="dxa"/>
+              <w:bottom w:w="80" w:type="dxa"/>
+              <w:end w:w="120" w:type="dxa"/>
+            </w:tcMar>
+          </w:tcPr>
+          <w:p>
+            <w:pPr>
+              <w:spacing w:after="0"/>
+              <w:jc w:val="left"/>
+            </w:pPr>
+            <w:r>
+              <w:rPr>
+                <w:rFonts w:ascii="Arial" w:hAnsi="Arial" w:eastAsia="Arial"/>
+                <w:b w:val="0"/>
+                <w:color w:val="111827"/>
+                <w:sz w:val="16"/>
+              </w:rPr>
+              <w:t>0</w:t>
+            </w:r>
+          </w:p>
+        </w:tc>
+        <w:tc>
+          <w:tcPr>
+            <w:tcW w:type="dxa" w:w="936"/>
+            <w:vAlign w:val="center"/>
+            <w:tcMar>
+              <w:top w:w="80" w:type="dxa"/>
+              <w:start w:w="120" w:type="dxa"/>
+              <w:bottom w:w="80" w:type="dxa"/>
+              <w:end w:w="120" w:type="dxa"/>
+            </w:tcMar>
+          </w:tcPr>
+          <w:p>
+            <w:pPr>
+              <w:spacing w:after="0"/>
+              <w:jc w:val="left"/>
+            </w:pPr>
+            <w:r>
+              <w:rPr>
+                <w:rFonts w:ascii="Arial" w:hAnsi="Arial" w:eastAsia="Arial"/>
+                <w:b w:val="0"/>
+                <w:color w:val="111827"/>
+                <w:sz w:val="16"/>
+              </w:rPr>
+              <w:t>1</w:t>
+            </w:r>
+          </w:p>
+        </w:tc>
+        <w:tc>
+          <w:tcPr>
+            <w:tcW w:type="dxa" w:w="936"/>
+            <w:vAlign w:val="center"/>
+            <w:tcMar>
+              <w:top w:w="80" w:type="dxa"/>
+              <w:start w:w="120" w:type="dxa"/>
+              <w:bottom w:w="80" w:type="dxa"/>
+              <w:end w:w="120" w:type="dxa"/>
+            </w:tcMar>
+          </w:tcPr>
+          <w:p>
+            <w:pPr>
+              <w:spacing w:after="0"/>
+              <w:jc w:val="left"/>
+            </w:pPr>
+            <w:r>
+              <w:rPr>
+                <w:rFonts w:ascii="Arial" w:hAnsi="Arial" w:eastAsia="Arial"/>
+                <w:b w:val="0"/>
+                <w:color w:val="111827"/>
+                <w:sz w:val="16"/>
+              </w:rPr>
+              <w:t>1</w:t>
+            </w:r>
+          </w:p>
+        </w:tc>
+        <w:tc>
+          <w:tcPr>
+            <w:tcW w:type="dxa" w:w="936"/>
+            <w:vAlign w:val="center"/>
+            <w:tcMar>
+              <w:top w:w="80" w:type="dxa"/>
+              <w:start w:w="120" w:type="dxa"/>
+              <w:bottom w:w="80" w:type="dxa"/>
+              <w:end w:w="120" w:type="dxa"/>
+            </w:tcMar>
+          </w:tcPr>
+          <w:p>
+            <w:pPr>
+              <w:spacing w:after="0"/>
+              <w:jc w:val="left"/>
+            </w:pPr>
+            <w:r>
+              <w:rPr>
+                <w:rFonts w:ascii="Arial" w:hAnsi="Arial" w:eastAsia="Arial"/>
+                <w:b w:val="0"/>
+                <w:color w:val="111827"/>
+                <w:sz w:val="16"/>
+              </w:rPr>
+              <w:t>1</w:t>
+            </w:r>
+          </w:p>
+        </w:tc>
+        <w:tc>
+          <w:tcPr>
+            <w:tcW w:type="dxa" w:w="936"/>
+            <w:vAlign w:val="center"/>
+            <w:tcMar>
+              <w:top w:w="80" w:type="dxa"/>
+              <w:start w:w="120" w:type="dxa"/>
+              <w:bottom w:w="80" w:type="dxa"/>
+              <w:end w:w="120" w:type="dxa"/>
+            </w:tcMar>
+          </w:tcPr>
+          <w:p>
+            <w:pPr>
+              <w:spacing w:after="0"/>
+              <w:jc w:val="left"/>
+            </w:pPr>
+            <w:r>
+              <w:rPr>
+                <w:rFonts w:ascii="Arial" w:hAnsi="Arial" w:eastAsia="Arial"/>
+                <w:b w:val="0"/>
+                <w:color w:val="111827"/>
+                <w:sz w:val="16"/>
+              </w:rPr>
+              <w:t>taxonomy_needs_manual_cleanup_before_claim_use</w:t>
+            </w:r>
+          </w:p>
+        </w:tc>
+        <w:tc>
+          <w:tcPr>
+            <w:tcW w:type="dxa" w:w="936"/>
+            <w:vAlign w:val="center"/>
+            <w:tcMar>
+              <w:top w:w="80" w:type="dxa"/>
+              <w:start w:w="120" w:type="dxa"/>
+              <w:bottom w:w="80" w:type="dxa"/>
+              <w:end w:w="120" w:type="dxa"/>
+            </w:tcMar>
+          </w:tcPr>
+          <w:p>
+            <w:pPr>
+              <w:spacing w:after="0"/>
+              <w:jc w:val="left"/>
+            </w:pPr>
+            <w:r>
+              <w:rPr>
+                <w:rFonts w:ascii="Arial" w:hAnsi="Arial" w:eastAsia="Arial"/>
+                <w:b w:val="0"/>
+                <w:color w:val="111827"/>
+                <w:sz w:val="16"/>
+              </w:rPr>
+              <w:t>Habit Tracker (high_priority_close_substitute; score 29)</w:t>
+            </w:r>
+          </w:p>
+        </w:tc>
+      </w:tr>
+      <w:tr>
+        <w:tc>
+          <w:tcPr>
+            <w:tcW w:type="dxa" w:w="936"/>
+            <w:vAlign w:val="center"/>
+            <w:tcMar>
+              <w:top w:w="80" w:type="dxa"/>
+              <w:start w:w="120" w:type="dxa"/>
+              <w:bottom w:w="80" w:type="dxa"/>
+              <w:end w:w="120" w:type="dxa"/>
+            </w:tcMar>
+            <w:shd w:fill="F8FAFC"/>
+          </w:tcPr>
+          <w:p>
+            <w:pPr>
+              <w:spacing w:after="0"/>
+              <w:jc w:val="left"/>
+            </w:pPr>
+            <w:r>
+              <w:rPr>
+                <w:rFonts w:ascii="Arial" w:hAnsi="Arial" w:eastAsia="Arial"/>
+                <w:b w:val="0"/>
+                <w:color w:val="111827"/>
+                <w:sz w:val="16"/>
+              </w:rPr>
+              <w:t>astrology_guidance</w:t>
+            </w:r>
+          </w:p>
+        </w:tc>
+        <w:tc>
+          <w:tcPr>
+            <w:tcW w:type="dxa" w:w="936"/>
+            <w:vAlign w:val="center"/>
+            <w:tcMar>
+              <w:top w:w="80" w:type="dxa"/>
+              <w:start w:w="120" w:type="dxa"/>
+              <w:bottom w:w="80" w:type="dxa"/>
+              <w:end w:w="120" w:type="dxa"/>
+            </w:tcMar>
+            <w:shd w:fill="F8FAFC"/>
+          </w:tcPr>
+          <w:p>
+            <w:pPr>
+              <w:spacing w:after="0"/>
+              <w:jc w:val="left"/>
+            </w:pPr>
+            <w:r>
+              <w:rPr>
+                <w:rFonts w:ascii="Arial" w:hAnsi="Arial" w:eastAsia="Arial"/>
+                <w:b w:val="0"/>
+                <w:color w:val="111827"/>
+                <w:sz w:val="16"/>
+              </w:rPr>
+              <w:t>astrology / esoterics</w:t>
+            </w:r>
+          </w:p>
+        </w:tc>
+        <w:tc>
+          <w:tcPr>
+            <w:tcW w:type="dxa" w:w="936"/>
+            <w:vAlign w:val="center"/>
+            <w:tcMar>
+              <w:top w:w="80" w:type="dxa"/>
+              <w:start w:w="120" w:type="dxa"/>
+              <w:bottom w:w="80" w:type="dxa"/>
+              <w:end w:w="120" w:type="dxa"/>
+            </w:tcMar>
+            <w:shd w:fill="F8FAFC"/>
+          </w:tcPr>
+          <w:p>
+            <w:pPr>
+              <w:spacing w:after="0"/>
+              <w:jc w:val="left"/>
+            </w:pPr>
+            <w:r>
+              <w:rPr>
+                <w:rFonts w:ascii="Arial" w:hAnsi="Arial" w:eastAsia="Arial"/>
+                <w:b w:val="0"/>
+                <w:color w:val="111827"/>
+                <w:sz w:val="16"/>
+              </w:rPr>
+              <w:t>12</w:t>
+            </w:r>
+          </w:p>
+        </w:tc>
+        <w:tc>
+          <w:tcPr>
+            <w:tcW w:type="dxa" w:w="936"/>
+            <w:vAlign w:val="center"/>
+            <w:tcMar>
+              <w:top w:w="80" w:type="dxa"/>
+              <w:start w:w="120" w:type="dxa"/>
+              <w:bottom w:w="80" w:type="dxa"/>
+              <w:end w:w="120" w:type="dxa"/>
+            </w:tcMar>
+            <w:shd w:fill="F8FAFC"/>
+          </w:tcPr>
+          <w:p>
+            <w:pPr>
+              <w:spacing w:after="0"/>
+              <w:jc w:val="left"/>
+            </w:pPr>
+            <w:r>
+              <w:rPr>
+                <w:rFonts w:ascii="Arial" w:hAnsi="Arial" w:eastAsia="Arial"/>
+                <w:b w:val="0"/>
+                <w:color w:val="111827"/>
+                <w:sz w:val="16"/>
+              </w:rPr>
+              <w:t>6</w:t>
+            </w:r>
+          </w:p>
+        </w:tc>
+        <w:tc>
+          <w:tcPr>
+            <w:tcW w:type="dxa" w:w="936"/>
+            <w:vAlign w:val="center"/>
+            <w:tcMar>
+              <w:top w:w="80" w:type="dxa"/>
+              <w:start w:w="120" w:type="dxa"/>
+              <w:bottom w:w="80" w:type="dxa"/>
+              <w:end w:w="120" w:type="dxa"/>
+            </w:tcMar>
+            <w:shd w:fill="F8FAFC"/>
+          </w:tcPr>
+          <w:p>
+            <w:pPr>
+              <w:spacing w:after="0"/>
+              <w:jc w:val="left"/>
+            </w:pPr>
+            <w:r>
+              <w:rPr>
+                <w:rFonts w:ascii="Arial" w:hAnsi="Arial" w:eastAsia="Arial"/>
+                <w:b w:val="0"/>
+                <w:color w:val="111827"/>
+                <w:sz w:val="16"/>
+              </w:rPr>
+              <w:t>0</w:t>
+            </w:r>
+          </w:p>
+        </w:tc>
+        <w:tc>
+          <w:tcPr>
+            <w:tcW w:type="dxa" w:w="936"/>
+            <w:vAlign w:val="center"/>
+            <w:tcMar>
+              <w:top w:w="80" w:type="dxa"/>
+              <w:start w:w="120" w:type="dxa"/>
+              <w:bottom w:w="80" w:type="dxa"/>
+              <w:end w:w="120" w:type="dxa"/>
+            </w:tcMar>
+            <w:shd w:fill="F8FAFC"/>
+          </w:tcPr>
+          <w:p>
+            <w:pPr>
+              <w:spacing w:after="0"/>
+              <w:jc w:val="left"/>
+            </w:pPr>
+            <w:r>
+              <w:rPr>
+                <w:rFonts w:ascii="Arial" w:hAnsi="Arial" w:eastAsia="Arial"/>
+                <w:b w:val="0"/>
+                <w:color w:val="111827"/>
+                <w:sz w:val="16"/>
+              </w:rPr>
+              <w:t>4</w:t>
+            </w:r>
+          </w:p>
+        </w:tc>
+        <w:tc>
+          <w:tcPr>
+            <w:tcW w:type="dxa" w:w="936"/>
+            <w:vAlign w:val="center"/>
+            <w:tcMar>
+              <w:top w:w="80" w:type="dxa"/>
+              <w:start w:w="120" w:type="dxa"/>
+              <w:bottom w:w="80" w:type="dxa"/>
+              <w:end w:w="120" w:type="dxa"/>
+            </w:tcMar>
+            <w:shd w:fill="F8FAFC"/>
+          </w:tcPr>
+          <w:p>
+            <w:pPr>
+              <w:spacing w:after="0"/>
+              <w:jc w:val="left"/>
+            </w:pPr>
+            <w:r>
+              <w:rPr>
+                <w:rFonts w:ascii="Arial" w:hAnsi="Arial" w:eastAsia="Arial"/>
+                <w:b w:val="0"/>
+                <w:color w:val="111827"/>
+                <w:sz w:val="16"/>
+              </w:rPr>
+              <w:t>0</w:t>
+            </w:r>
+          </w:p>
+        </w:tc>
+        <w:tc>
+          <w:tcPr>
+            <w:tcW w:type="dxa" w:w="936"/>
+            <w:vAlign w:val="center"/>
+            <w:tcMar>
+              <w:top w:w="80" w:type="dxa"/>
+              <w:start w:w="120" w:type="dxa"/>
+              <w:bottom w:w="80" w:type="dxa"/>
+              <w:end w:w="120" w:type="dxa"/>
+            </w:tcMar>
+            <w:shd w:fill="F8FAFC"/>
+          </w:tcPr>
+          <w:p>
+            <w:pPr>
+              <w:spacing w:after="0"/>
+              <w:jc w:val="left"/>
+            </w:pPr>
+            <w:r>
+              <w:rPr>
+                <w:rFonts w:ascii="Arial" w:hAnsi="Arial" w:eastAsia="Arial"/>
+                <w:b w:val="0"/>
+                <w:color w:val="111827"/>
+                <w:sz w:val="16"/>
+              </w:rPr>
+              <w:t>0</w:t>
+            </w:r>
+          </w:p>
+        </w:tc>
+        <w:tc>
+          <w:tcPr>
+            <w:tcW w:type="dxa" w:w="936"/>
+            <w:vAlign w:val="center"/>
+            <w:tcMar>
+              <w:top w:w="80" w:type="dxa"/>
+              <w:start w:w="120" w:type="dxa"/>
+              <w:bottom w:w="80" w:type="dxa"/>
+              <w:end w:w="120" w:type="dxa"/>
+            </w:tcMar>
+            <w:shd w:fill="F8FAFC"/>
+          </w:tcPr>
+          <w:p>
+            <w:pPr>
+              <w:spacing w:after="0"/>
+              <w:jc w:val="left"/>
+            </w:pPr>
+            <w:r>
+              <w:rPr>
+                <w:rFonts w:ascii="Arial" w:hAnsi="Arial" w:eastAsia="Arial"/>
+                <w:b w:val="0"/>
+                <w:color w:val="111827"/>
+                <w:sz w:val="16"/>
+              </w:rPr>
+              <w:t>usable_for_directional_grouping</w:t>
+            </w:r>
+          </w:p>
+        </w:tc>
+        <w:tc>
+          <w:tcPr>
+            <w:tcW w:type="dxa" w:w="936"/>
+            <w:vAlign w:val="center"/>
+            <w:tcMar>
+              <w:top w:w="80" w:type="dxa"/>
+              <w:start w:w="120" w:type="dxa"/>
+              <w:bottom w:w="80" w:type="dxa"/>
+              <w:end w:w="120" w:type="dxa"/>
+            </w:tcMar>
+            <w:shd w:fill="F8FAFC"/>
+          </w:tcPr>
+          <w:p>
+            <w:pPr>
+              <w:spacing w:after="0"/>
+              <w:jc w:val="left"/>
+            </w:pPr>
+            <w:r>
+              <w:rPr>
+                <w:rFonts w:ascii="Arial" w:hAnsi="Arial" w:eastAsia="Arial"/>
+                <w:b w:val="0"/>
+                <w:color w:val="111827"/>
+                <w:sz w:val="16"/>
+              </w:rPr>
+              <w:t>Sol - Inner Life &amp; Wellbeing (high_priority_close_substitute; score 30.1) / Pocket Insight Psychic Reading (high_priority_close_substitute; score 27.7) / Bodhi: Astrology &amp; Horoscope (high_priority_close_substitute; score 25.2) / Lunaria AI - Soulmate Drawing (close_substitute; score 21.4)</w:t>
+            </w:r>
+          </w:p>
+        </w:tc>
+      </w:tr>
+      <w:tr>
+        <w:tc>
+          <w:tcPr>
+            <w:tcW w:type="dxa" w:w="936"/>
+            <w:vAlign w:val="center"/>
+            <w:tcMar>
+              <w:top w:w="80" w:type="dxa"/>
+              <w:start w:w="120" w:type="dxa"/>
+              <w:bottom w:w="80" w:type="dxa"/>
+              <w:end w:w="120" w:type="dxa"/>
+            </w:tcMar>
+          </w:tcPr>
+          <w:p>
+            <w:pPr>
+              <w:spacing w:after="0"/>
+              <w:jc w:val="left"/>
+            </w:pPr>
+            <w:r>
+              <w:rPr>
+                <w:rFonts w:ascii="Arial" w:hAnsi="Arial" w:eastAsia="Arial"/>
+                <w:b w:val="0"/>
+                <w:color w:val="111827"/>
+                <w:sz w:val="16"/>
+              </w:rPr>
+              <w:t>avatar_identity_coaching</w:t>
+            </w:r>
+          </w:p>
+        </w:tc>
+        <w:tc>
+          <w:tcPr>
+            <w:tcW w:type="dxa" w:w="936"/>
+            <w:vAlign w:val="center"/>
+            <w:tcMar>
+              <w:top w:w="80" w:type="dxa"/>
+              <w:start w:w="120" w:type="dxa"/>
+              <w:bottom w:w="80" w:type="dxa"/>
+              <w:end w:w="120" w:type="dxa"/>
+            </w:tcMar>
+          </w:tcPr>
+          <w:p>
+            <w:pPr>
+              <w:spacing w:after="0"/>
+              <w:jc w:val="left"/>
+            </w:pPr>
+            <w:r>
+              <w:rPr>
+                <w:rFonts w:ascii="Arial" w:hAnsi="Arial" w:eastAsia="Arial"/>
+                <w:b w:val="0"/>
+                <w:color w:val="111827"/>
+                <w:sz w:val="16"/>
+              </w:rPr>
+              <w:t>avatar / identity + coaching</w:t>
+            </w:r>
+          </w:p>
+        </w:tc>
+        <w:tc>
+          <w:tcPr>
+            <w:tcW w:type="dxa" w:w="936"/>
+            <w:vAlign w:val="center"/>
+            <w:tcMar>
+              <w:top w:w="80" w:type="dxa"/>
+              <w:start w:w="120" w:type="dxa"/>
+              <w:bottom w:w="80" w:type="dxa"/>
+              <w:end w:w="120" w:type="dxa"/>
+            </w:tcMar>
+          </w:tcPr>
+          <w:p>
+            <w:pPr>
+              <w:spacing w:after="0"/>
+              <w:jc w:val="left"/>
+            </w:pPr>
+            <w:r>
+              <w:rPr>
+                <w:rFonts w:ascii="Arial" w:hAnsi="Arial" w:eastAsia="Arial"/>
+                <w:b w:val="0"/>
+                <w:color w:val="111827"/>
+                <w:sz w:val="16"/>
+              </w:rPr>
+              <w:t>19</w:t>
+            </w:r>
+          </w:p>
+        </w:tc>
+        <w:tc>
+          <w:tcPr>
+            <w:tcW w:type="dxa" w:w="936"/>
+            <w:vAlign w:val="center"/>
+            <w:tcMar>
+              <w:top w:w="80" w:type="dxa"/>
+              <w:start w:w="120" w:type="dxa"/>
+              <w:bottom w:w="80" w:type="dxa"/>
+              <w:end w:w="120" w:type="dxa"/>
+            </w:tcMar>
+          </w:tcPr>
+          <w:p>
+            <w:pPr>
+              <w:spacing w:after="0"/>
+              <w:jc w:val="left"/>
+            </w:pPr>
+            <w:r>
+              <w:rPr>
+                <w:rFonts w:ascii="Arial" w:hAnsi="Arial" w:eastAsia="Arial"/>
+                <w:b w:val="0"/>
+                <w:color w:val="111827"/>
+                <w:sz w:val="16"/>
+              </w:rPr>
+              <w:t>17</w:t>
+            </w:r>
+          </w:p>
+        </w:tc>
+        <w:tc>
+          <w:tcPr>
+            <w:tcW w:type="dxa" w:w="936"/>
+            <w:vAlign w:val="center"/>
+            <w:tcMar>
+              <w:top w:w="80" w:type="dxa"/>
+              <w:start w:w="120" w:type="dxa"/>
+              <w:bottom w:w="80" w:type="dxa"/>
+              <w:end w:w="120" w:type="dxa"/>
+            </w:tcMar>
+          </w:tcPr>
+          <w:p>
+            <w:pPr>
+              <w:spacing w:after="0"/>
+              <w:jc w:val="left"/>
+            </w:pPr>
+            <w:r>
+              <w:rPr>
+                <w:rFonts w:ascii="Arial" w:hAnsi="Arial" w:eastAsia="Arial"/>
+                <w:b w:val="0"/>
+                <w:color w:val="111827"/>
+                <w:sz w:val="16"/>
+              </w:rPr>
+              <w:t>0</w:t>
+            </w:r>
+          </w:p>
+        </w:tc>
+        <w:tc>
+          <w:tcPr>
+            <w:tcW w:type="dxa" w:w="936"/>
+            <w:vAlign w:val="center"/>
+            <w:tcMar>
+              <w:top w:w="80" w:type="dxa"/>
+              <w:start w:w="120" w:type="dxa"/>
+              <w:bottom w:w="80" w:type="dxa"/>
+              <w:end w:w="120" w:type="dxa"/>
+            </w:tcMar>
+          </w:tcPr>
+          <w:p>
+            <w:pPr>
+              <w:spacing w:after="0"/>
+              <w:jc w:val="left"/>
+            </w:pPr>
+            <w:r>
+              <w:rPr>
+                <w:rFonts w:ascii="Arial" w:hAnsi="Arial" w:eastAsia="Arial"/>
+                <w:b w:val="0"/>
+                <w:color w:val="111827"/>
+                <w:sz w:val="16"/>
+              </w:rPr>
+              <w:t>6</w:t>
+            </w:r>
+          </w:p>
+        </w:tc>
+        <w:tc>
+          <w:tcPr>
+            <w:tcW w:type="dxa" w:w="936"/>
+            <w:vAlign w:val="center"/>
+            <w:tcMar>
+              <w:top w:w="80" w:type="dxa"/>
+              <w:start w:w="120" w:type="dxa"/>
+              <w:bottom w:w="80" w:type="dxa"/>
+              <w:end w:w="120" w:type="dxa"/>
+            </w:tcMar>
+          </w:tcPr>
+          <w:p>
+            <w:pPr>
+              <w:spacing w:after="0"/>
+              <w:jc w:val="left"/>
+            </w:pPr>
+            <w:r>
+              <w:rPr>
+                <w:rFonts w:ascii="Arial" w:hAnsi="Arial" w:eastAsia="Arial"/>
+                <w:b w:val="0"/>
+                <w:color w:val="111827"/>
+                <w:sz w:val="16"/>
+              </w:rPr>
+              <w:t>3</w:t>
+            </w:r>
+          </w:p>
+        </w:tc>
+        <w:tc>
+          <w:tcPr>
+            <w:tcW w:type="dxa" w:w="936"/>
+            <w:vAlign w:val="center"/>
+            <w:tcMar>
+              <w:top w:w="80" w:type="dxa"/>
+              <w:start w:w="120" w:type="dxa"/>
+              <w:bottom w:w="80" w:type="dxa"/>
+              <w:end w:w="120" w:type="dxa"/>
+            </w:tcMar>
+          </w:tcPr>
+          <w:p>
+            <w:pPr>
+              <w:spacing w:after="0"/>
+              <w:jc w:val="left"/>
+            </w:pPr>
+            <w:r>
+              <w:rPr>
+                <w:rFonts w:ascii="Arial" w:hAnsi="Arial" w:eastAsia="Arial"/>
+                <w:b w:val="0"/>
+                <w:color w:val="111827"/>
+                <w:sz w:val="16"/>
+              </w:rPr>
+              <w:t>3</w:t>
+            </w:r>
+          </w:p>
+        </w:tc>
+        <w:tc>
+          <w:tcPr>
+            <w:tcW w:type="dxa" w:w="936"/>
+            <w:vAlign w:val="center"/>
+            <w:tcMar>
+              <w:top w:w="80" w:type="dxa"/>
+              <w:start w:w="120" w:type="dxa"/>
+              <w:bottom w:w="80" w:type="dxa"/>
+              <w:end w:w="120" w:type="dxa"/>
+            </w:tcMar>
+          </w:tcPr>
+          <w:p>
+            <w:pPr>
+              <w:spacing w:after="0"/>
+              <w:jc w:val="left"/>
+            </w:pPr>
+            <w:r>
+              <w:rPr>
+                <w:rFonts w:ascii="Arial" w:hAnsi="Arial" w:eastAsia="Arial"/>
+                <w:b w:val="0"/>
+                <w:color w:val="111827"/>
+                <w:sz w:val="16"/>
+              </w:rPr>
+              <w:t>usable_for_directional_grouping</w:t>
+            </w:r>
+          </w:p>
+        </w:tc>
+        <w:tc>
+          <w:tcPr>
+            <w:tcW w:type="dxa" w:w="936"/>
+            <w:vAlign w:val="center"/>
+            <w:tcMar>
+              <w:top w:w="80" w:type="dxa"/>
+              <w:start w:w="120" w:type="dxa"/>
+              <w:bottom w:w="80" w:type="dxa"/>
+              <w:end w:w="120" w:type="dxa"/>
+            </w:tcMar>
+          </w:tcPr>
+          <w:p>
+            <w:pPr>
+              <w:spacing w:after="0"/>
+              <w:jc w:val="left"/>
+            </w:pPr>
+            <w:r>
+              <w:rPr>
+                <w:rFonts w:ascii="Arial" w:hAnsi="Arial" w:eastAsia="Arial"/>
+                <w:b w:val="0"/>
+                <w:color w:val="111827"/>
+                <w:sz w:val="16"/>
+              </w:rPr>
+              <w:t>Zing AI: Home &amp; Gym Workouts (high_priority_close_substitute; score 34) / Daily Yoga: Yoga for Fitness® (high_priority_close_substitute; score 31.6) / Vida Health (high_priority_close_substitute; score 31) / Daily Burn: Workout Coach (high_priority_close_substitute; score 31)</w:t>
+            </w:r>
+          </w:p>
+        </w:tc>
+      </w:tr>
+      <w:tr>
+        <w:tc>
+          <w:tcPr>
+            <w:tcW w:type="dxa" w:w="936"/>
+            <w:vAlign w:val="center"/>
+            <w:tcMar>
+              <w:top w:w="80" w:type="dxa"/>
+              <w:start w:w="120" w:type="dxa"/>
+              <w:bottom w:w="80" w:type="dxa"/>
+              <w:end w:w="120" w:type="dxa"/>
+            </w:tcMar>
+            <w:shd w:fill="F8FAFC"/>
+          </w:tcPr>
+          <w:p>
+            <w:pPr>
+              <w:spacing w:after="0"/>
+              <w:jc w:val="left"/>
+            </w:pPr>
+            <w:r>
+              <w:rPr>
+                <w:rFonts w:ascii="Arial" w:hAnsi="Arial" w:eastAsia="Arial"/>
+                <w:b w:val="0"/>
+                <w:color w:val="111827"/>
+                <w:sz w:val="16"/>
+              </w:rPr>
+              <w:t>faith_devotional_habit</w:t>
+            </w:r>
+          </w:p>
+        </w:tc>
+        <w:tc>
+          <w:tcPr>
+            <w:tcW w:type="dxa" w:w="936"/>
+            <w:vAlign w:val="center"/>
+            <w:tcMar>
+              <w:top w:w="80" w:type="dxa"/>
+              <w:start w:w="120" w:type="dxa"/>
+              <w:bottom w:w="80" w:type="dxa"/>
+              <w:end w:w="120" w:type="dxa"/>
+            </w:tcMar>
+            <w:shd w:fill="F8FAFC"/>
+          </w:tcPr>
+          <w:p>
+            <w:pPr>
+              <w:spacing w:after="0"/>
+              <w:jc w:val="left"/>
+            </w:pPr>
+            <w:r>
+              <w:rPr>
+                <w:rFonts w:ascii="Arial" w:hAnsi="Arial" w:eastAsia="Arial"/>
+                <w:b w:val="0"/>
+                <w:color w:val="111827"/>
+                <w:sz w:val="16"/>
+              </w:rPr>
+              <w:t>spiritual meaning / habit loop</w:t>
+            </w:r>
+          </w:p>
+        </w:tc>
+        <w:tc>
+          <w:tcPr>
+            <w:tcW w:type="dxa" w:w="936"/>
+            <w:vAlign w:val="center"/>
+            <w:tcMar>
+              <w:top w:w="80" w:type="dxa"/>
+              <w:start w:w="120" w:type="dxa"/>
+              <w:bottom w:w="80" w:type="dxa"/>
+              <w:end w:w="120" w:type="dxa"/>
+            </w:tcMar>
+            <w:shd w:fill="F8FAFC"/>
+          </w:tcPr>
+          <w:p>
+            <w:pPr>
+              <w:spacing w:after="0"/>
+              <w:jc w:val="left"/>
+            </w:pPr>
+            <w:r>
+              <w:rPr>
+                <w:rFonts w:ascii="Arial" w:hAnsi="Arial" w:eastAsia="Arial"/>
+                <w:b w:val="0"/>
+                <w:color w:val="111827"/>
+                <w:sz w:val="16"/>
+              </w:rPr>
+              <w:t>8</w:t>
+            </w:r>
+          </w:p>
+        </w:tc>
+        <w:tc>
+          <w:tcPr>
+            <w:tcW w:type="dxa" w:w="936"/>
+            <w:vAlign w:val="center"/>
+            <w:tcMar>
+              <w:top w:w="80" w:type="dxa"/>
+              <w:start w:w="120" w:type="dxa"/>
+              <w:bottom w:w="80" w:type="dxa"/>
+              <w:end w:w="120" w:type="dxa"/>
+            </w:tcMar>
+            <w:shd w:fill="F8FAFC"/>
+          </w:tcPr>
+          <w:p>
+            <w:pPr>
+              <w:spacing w:after="0"/>
+              <w:jc w:val="left"/>
+            </w:pPr>
+            <w:r>
+              <w:rPr>
+                <w:rFonts w:ascii="Arial" w:hAnsi="Arial" w:eastAsia="Arial"/>
+                <w:b w:val="0"/>
+                <w:color w:val="111827"/>
+                <w:sz w:val="16"/>
+              </w:rPr>
+              <w:t>6</w:t>
+            </w:r>
+          </w:p>
+        </w:tc>
+        <w:tc>
+          <w:tcPr>
+            <w:tcW w:type="dxa" w:w="936"/>
+            <w:vAlign w:val="center"/>
+            <w:tcMar>
+              <w:top w:w="80" w:type="dxa"/>
+              <w:start w:w="120" w:type="dxa"/>
+              <w:bottom w:w="80" w:type="dxa"/>
+              <w:end w:w="120" w:type="dxa"/>
+            </w:tcMar>
+            <w:shd w:fill="F8FAFC"/>
+          </w:tcPr>
+          <w:p>
+            <w:pPr>
+              <w:spacing w:after="0"/>
+              <w:jc w:val="left"/>
+            </w:pPr>
+            <w:r>
+              <w:rPr>
+                <w:rFonts w:ascii="Arial" w:hAnsi="Arial" w:eastAsia="Arial"/>
+                <w:b w:val="0"/>
+                <w:color w:val="111827"/>
+                <w:sz w:val="16"/>
+              </w:rPr>
+              <w:t>1</w:t>
+            </w:r>
+          </w:p>
+        </w:tc>
+        <w:tc>
+          <w:tcPr>
+            <w:tcW w:type="dxa" w:w="936"/>
+            <w:vAlign w:val="center"/>
+            <w:tcMar>
+              <w:top w:w="80" w:type="dxa"/>
+              <w:start w:w="120" w:type="dxa"/>
+              <w:bottom w:w="80" w:type="dxa"/>
+              <w:end w:w="120" w:type="dxa"/>
+            </w:tcMar>
+            <w:shd w:fill="F8FAFC"/>
+          </w:tcPr>
+          <w:p>
+            <w:pPr>
+              <w:spacing w:after="0"/>
+              <w:jc w:val="left"/>
+            </w:pPr>
+            <w:r>
+              <w:rPr>
+                <w:rFonts w:ascii="Arial" w:hAnsi="Arial" w:eastAsia="Arial"/>
+                <w:b w:val="0"/>
+                <w:color w:val="111827"/>
+                <w:sz w:val="16"/>
+              </w:rPr>
+              <w:t>3</w:t>
+            </w:r>
+          </w:p>
+        </w:tc>
+        <w:tc>
+          <w:tcPr>
+            <w:tcW w:type="dxa" w:w="936"/>
+            <w:vAlign w:val="center"/>
+            <w:tcMar>
+              <w:top w:w="80" w:type="dxa"/>
+              <w:start w:w="120" w:type="dxa"/>
+              <w:bottom w:w="80" w:type="dxa"/>
+              <w:end w:w="120" w:type="dxa"/>
+            </w:tcMar>
+            <w:shd w:fill="F8FAFC"/>
+          </w:tcPr>
+          <w:p>
+            <w:pPr>
+              <w:spacing w:after="0"/>
+              <w:jc w:val="left"/>
+            </w:pPr>
+            <w:r>
+              <w:rPr>
+                <w:rFonts w:ascii="Arial" w:hAnsi="Arial" w:eastAsia="Arial"/>
+                <w:b w:val="0"/>
+                <w:color w:val="111827"/>
+                <w:sz w:val="16"/>
+              </w:rPr>
+              <w:t>1</w:t>
+            </w:r>
+          </w:p>
+        </w:tc>
+        <w:tc>
+          <w:tcPr>
+            <w:tcW w:type="dxa" w:w="936"/>
+            <w:vAlign w:val="center"/>
+            <w:tcMar>
+              <w:top w:w="80" w:type="dxa"/>
+              <w:start w:w="120" w:type="dxa"/>
+              <w:bottom w:w="80" w:type="dxa"/>
+              <w:end w:w="120" w:type="dxa"/>
+            </w:tcMar>
+            <w:shd w:fill="F8FAFC"/>
+          </w:tcPr>
+          <w:p>
+            <w:pPr>
+              <w:spacing w:after="0"/>
+              <w:jc w:val="left"/>
+            </w:pPr>
+            <w:r>
+              <w:rPr>
+                <w:rFonts w:ascii="Arial" w:hAnsi="Arial" w:eastAsia="Arial"/>
+                <w:b w:val="0"/>
+                <w:color w:val="111827"/>
+                <w:sz w:val="16"/>
+              </w:rPr>
+              <w:t>1</w:t>
+            </w:r>
+          </w:p>
+        </w:tc>
+        <w:tc>
+          <w:tcPr>
+            <w:tcW w:type="dxa" w:w="936"/>
+            <w:vAlign w:val="center"/>
+            <w:tcMar>
+              <w:top w:w="80" w:type="dxa"/>
+              <w:start w:w="120" w:type="dxa"/>
+              <w:bottom w:w="80" w:type="dxa"/>
+              <w:end w:w="120" w:type="dxa"/>
+            </w:tcMar>
+            <w:shd w:fill="F8FAFC"/>
+          </w:tcPr>
+          <w:p>
+            <w:pPr>
+              <w:spacing w:after="0"/>
+              <w:jc w:val="left"/>
+            </w:pPr>
+            <w:r>
+              <w:rPr>
+                <w:rFonts w:ascii="Arial" w:hAnsi="Arial" w:eastAsia="Arial"/>
+                <w:b w:val="0"/>
+                <w:color w:val="111827"/>
+                <w:sz w:val="16"/>
+              </w:rPr>
+              <w:t>usable_for_directional_grouping</w:t>
+            </w:r>
+          </w:p>
+        </w:tc>
+        <w:tc>
+          <w:tcPr>
+            <w:tcW w:type="dxa" w:w="936"/>
+            <w:vAlign w:val="center"/>
+            <w:tcMar>
+              <w:top w:w="80" w:type="dxa"/>
+              <w:start w:w="120" w:type="dxa"/>
+              <w:bottom w:w="80" w:type="dxa"/>
+              <w:end w:w="120" w:type="dxa"/>
+            </w:tcMar>
+            <w:shd w:fill="F8FAFC"/>
+          </w:tcPr>
+          <w:p>
+            <w:pPr>
+              <w:spacing w:after="0"/>
+              <w:jc w:val="left"/>
+            </w:pPr>
+            <w:r>
+              <w:rPr>
+                <w:rFonts w:ascii="Arial" w:hAnsi="Arial" w:eastAsia="Arial"/>
+                <w:b w:val="0"/>
+                <w:color w:val="111827"/>
+                <w:sz w:val="16"/>
+              </w:rPr>
+              <w:t>Shepherd: Spiritual Bible BFF (direct_reference_competitor; score 40.9) / Good Morning Messages &amp; Images (high_priority_close_substitute; score 27.6) / Testimonio (close_substitute; score 22.7) / Pactly: Social Habit Tracker (close_substitute; score 22)</w:t>
+            </w:r>
+          </w:p>
+        </w:tc>
+      </w:tr>
+      <w:tr>
+        <w:tc>
+          <w:tcPr>
+            <w:tcW w:type="dxa" w:w="936"/>
+            <w:vAlign w:val="center"/>
+            <w:tcMar>
+              <w:top w:w="80" w:type="dxa"/>
+              <w:start w:w="120" w:type="dxa"/>
+              <w:bottom w:w="80" w:type="dxa"/>
+              <w:end w:w="120" w:type="dxa"/>
+            </w:tcMar>
+          </w:tcPr>
+          <w:p>
+            <w:pPr>
+              <w:spacing w:after="0"/>
+              <w:jc w:val="left"/>
+            </w:pPr>
+            <w:r>
+              <w:rPr>
+                <w:rFonts w:ascii="Arial" w:hAnsi="Arial" w:eastAsia="Arial"/>
+                <w:b w:val="0"/>
+                <w:color w:val="111827"/>
+                <w:sz w:val="16"/>
+              </w:rPr>
+              <w:t>gamified_self_improvement</w:t>
+            </w:r>
+          </w:p>
+        </w:tc>
+        <w:tc>
+          <w:tcPr>
+            <w:tcW w:type="dxa" w:w="936"/>
+            <w:vAlign w:val="center"/>
+            <w:tcMar>
+              <w:top w:w="80" w:type="dxa"/>
+              <w:start w:w="120" w:type="dxa"/>
+              <w:bottom w:w="80" w:type="dxa"/>
+              <w:end w:w="120" w:type="dxa"/>
+            </w:tcMar>
+          </w:tcPr>
+          <w:p>
+            <w:pPr>
+              <w:spacing w:after="0"/>
+              <w:jc w:val="left"/>
+            </w:pPr>
+            <w:r>
+              <w:rPr>
+                <w:rFonts w:ascii="Arial" w:hAnsi="Arial" w:eastAsia="Arial"/>
+                <w:b w:val="0"/>
+                <w:color w:val="111827"/>
+                <w:sz w:val="16"/>
+              </w:rPr>
+              <w:t>coaching / habits / progression</w:t>
+            </w:r>
+          </w:p>
+        </w:tc>
+        <w:tc>
+          <w:tcPr>
+            <w:tcW w:type="dxa" w:w="936"/>
+            <w:vAlign w:val="center"/>
+            <w:tcMar>
+              <w:top w:w="80" w:type="dxa"/>
+              <w:start w:w="120" w:type="dxa"/>
+              <w:bottom w:w="80" w:type="dxa"/>
+              <w:end w:w="120" w:type="dxa"/>
+            </w:tcMar>
+          </w:tcPr>
+          <w:p>
+            <w:pPr>
+              <w:spacing w:after="0"/>
+              <w:jc w:val="left"/>
+            </w:pPr>
+            <w:r>
+              <w:rPr>
+                <w:rFonts w:ascii="Arial" w:hAnsi="Arial" w:eastAsia="Arial"/>
+                <w:b w:val="0"/>
+                <w:color w:val="111827"/>
+                <w:sz w:val="16"/>
+              </w:rPr>
+              <w:t>13</w:t>
+            </w:r>
+          </w:p>
+        </w:tc>
+        <w:tc>
+          <w:tcPr>
+            <w:tcW w:type="dxa" w:w="936"/>
+            <w:vAlign w:val="center"/>
+            <w:tcMar>
+              <w:top w:w="80" w:type="dxa"/>
+              <w:start w:w="120" w:type="dxa"/>
+              <w:bottom w:w="80" w:type="dxa"/>
+              <w:end w:w="120" w:type="dxa"/>
+            </w:tcMar>
+          </w:tcPr>
+          <w:p>
+            <w:pPr>
+              <w:spacing w:after="0"/>
+              <w:jc w:val="left"/>
+            </w:pPr>
+            <w:r>
+              <w:rPr>
+                <w:rFonts w:ascii="Arial" w:hAnsi="Arial" w:eastAsia="Arial"/>
+                <w:b w:val="0"/>
+                <w:color w:val="111827"/>
+                <w:sz w:val="16"/>
+              </w:rPr>
+              <w:t>12</w:t>
+            </w:r>
+          </w:p>
+        </w:tc>
+        <w:tc>
+          <w:tcPr>
+            <w:tcW w:type="dxa" w:w="936"/>
+            <w:vAlign w:val="center"/>
+            <w:tcMar>
+              <w:top w:w="80" w:type="dxa"/>
+              <w:start w:w="120" w:type="dxa"/>
+              <w:bottom w:w="80" w:type="dxa"/>
+              <w:end w:w="120" w:type="dxa"/>
+            </w:tcMar>
+          </w:tcPr>
+          <w:p>
+            <w:pPr>
+              <w:spacing w:after="0"/>
+              <w:jc w:val="left"/>
+            </w:pPr>
+            <w:r>
+              <w:rPr>
+                <w:rFonts w:ascii="Arial" w:hAnsi="Arial" w:eastAsia="Arial"/>
+                <w:b w:val="0"/>
+                <w:color w:val="111827"/>
+                <w:sz w:val="16"/>
+              </w:rPr>
+              <w:t>0</w:t>
+            </w:r>
+          </w:p>
+        </w:tc>
+        <w:tc>
+          <w:tcPr>
+            <w:tcW w:type="dxa" w:w="936"/>
+            <w:vAlign w:val="center"/>
+            <w:tcMar>
+              <w:top w:w="80" w:type="dxa"/>
+              <w:start w:w="120" w:type="dxa"/>
+              <w:bottom w:w="80" w:type="dxa"/>
+              <w:end w:w="120" w:type="dxa"/>
+            </w:tcMar>
+          </w:tcPr>
+          <w:p>
+            <w:pPr>
+              <w:spacing w:after="0"/>
+              <w:jc w:val="left"/>
+            </w:pPr>
+            <w:r>
+              <w:rPr>
+                <w:rFonts w:ascii="Arial" w:hAnsi="Arial" w:eastAsia="Arial"/>
+                <w:b w:val="0"/>
+                <w:color w:val="111827"/>
+                <w:sz w:val="16"/>
+              </w:rPr>
+              <w:t>8</w:t>
+            </w:r>
+          </w:p>
+        </w:tc>
+        <w:tc>
+          <w:tcPr>
+            <w:tcW w:type="dxa" w:w="936"/>
+            <w:vAlign w:val="center"/>
+            <w:tcMar>
+              <w:top w:w="80" w:type="dxa"/>
+              <w:start w:w="120" w:type="dxa"/>
+              <w:bottom w:w="80" w:type="dxa"/>
+              <w:end w:w="120" w:type="dxa"/>
+            </w:tcMar>
+          </w:tcPr>
+          <w:p>
+            <w:pPr>
+              <w:spacing w:after="0"/>
+              <w:jc w:val="left"/>
+            </w:pPr>
+            <w:r>
+              <w:rPr>
+                <w:rFonts w:ascii="Arial" w:hAnsi="Arial" w:eastAsia="Arial"/>
+                <w:b w:val="0"/>
+                <w:color w:val="111827"/>
+                <w:sz w:val="16"/>
+              </w:rPr>
+              <w:t>1</w:t>
+            </w:r>
+          </w:p>
+        </w:tc>
+        <w:tc>
+          <w:tcPr>
+            <w:tcW w:type="dxa" w:w="936"/>
+            <w:vAlign w:val="center"/>
+            <w:tcMar>
+              <w:top w:w="80" w:type="dxa"/>
+              <w:start w:w="120" w:type="dxa"/>
+              <w:bottom w:w="80" w:type="dxa"/>
+              <w:end w:w="120" w:type="dxa"/>
+            </w:tcMar>
+          </w:tcPr>
+          <w:p>
+            <w:pPr>
+              <w:spacing w:after="0"/>
+              <w:jc w:val="left"/>
+            </w:pPr>
+            <w:r>
+              <w:rPr>
+                <w:rFonts w:ascii="Arial" w:hAnsi="Arial" w:eastAsia="Arial"/>
+                <w:b w:val="0"/>
+                <w:color w:val="111827"/>
+                <w:sz w:val="16"/>
+              </w:rPr>
+              <w:t>1</w:t>
+            </w:r>
+          </w:p>
+        </w:tc>
+        <w:tc>
+          <w:tcPr>
+            <w:tcW w:type="dxa" w:w="936"/>
+            <w:vAlign w:val="center"/>
+            <w:tcMar>
+              <w:top w:w="80" w:type="dxa"/>
+              <w:start w:w="120" w:type="dxa"/>
+              <w:bottom w:w="80" w:type="dxa"/>
+              <w:end w:w="120" w:type="dxa"/>
+            </w:tcMar>
+          </w:tcPr>
+          <w:p>
+            <w:pPr>
+              <w:spacing w:after="0"/>
+              <w:jc w:val="left"/>
+            </w:pPr>
+            <w:r>
+              <w:rPr>
+                <w:rFonts w:ascii="Arial" w:hAnsi="Arial" w:eastAsia="Arial"/>
+                <w:b w:val="0"/>
+                <w:color w:val="111827"/>
+                <w:sz w:val="16"/>
+              </w:rPr>
+              <w:t>usable_for_directional_grouping</w:t>
+            </w:r>
+          </w:p>
+        </w:tc>
+        <w:tc>
+          <w:tcPr>
+            <w:tcW w:type="dxa" w:w="936"/>
+            <w:vAlign w:val="center"/>
+            <w:tcMar>
+              <w:top w:w="80" w:type="dxa"/>
+              <w:start w:w="120" w:type="dxa"/>
+              <w:bottom w:w="80" w:type="dxa"/>
+              <w:end w:w="120" w:type="dxa"/>
+            </w:tcMar>
+          </w:tcPr>
+          <w:p>
+            <w:pPr>
+              <w:spacing w:after="0"/>
+              <w:jc w:val="left"/>
+            </w:pPr>
+            <w:r>
+              <w:rPr>
+                <w:rFonts w:ascii="Arial" w:hAnsi="Arial" w:eastAsia="Arial"/>
+                <w:b w:val="0"/>
+                <w:color w:val="111827"/>
+                <w:sz w:val="16"/>
+              </w:rPr>
+              <w:t>LifeWheel Goal Habit Tracker (high_priority_close_substitute; score 29.7) / Habit Tracker - Statz (high_priority_close_substitute; score 28.6) / OtterLife: AI Health Tracker (high_priority_close_substitute; score 28) / Ricky Kalmon (high_priority_close_substitute; score 26.6)</w:t>
+            </w:r>
+          </w:p>
+        </w:tc>
+      </w:tr>
+      <w:tr>
+        <w:tc>
+          <w:tcPr>
+            <w:tcW w:type="dxa" w:w="936"/>
+            <w:vAlign w:val="center"/>
+            <w:tcMar>
+              <w:top w:w="80" w:type="dxa"/>
+              <w:start w:w="120" w:type="dxa"/>
+              <w:bottom w:w="80" w:type="dxa"/>
+              <w:end w:w="120" w:type="dxa"/>
+            </w:tcMar>
+            <w:shd w:fill="F8FAFC"/>
+          </w:tcPr>
+          <w:p>
+            <w:pPr>
+              <w:spacing w:after="0"/>
+              <w:jc w:val="left"/>
+            </w:pPr>
+            <w:r>
+              <w:rPr>
+                <w:rFonts w:ascii="Arial" w:hAnsi="Arial" w:eastAsia="Arial"/>
+                <w:b w:val="0"/>
+                <w:color w:val="111827"/>
+                <w:sz w:val="16"/>
+              </w:rPr>
+              <w:t>manifestation_tool</w:t>
+            </w:r>
+          </w:p>
+        </w:tc>
+        <w:tc>
+          <w:tcPr>
+            <w:tcW w:type="dxa" w:w="936"/>
+            <w:vAlign w:val="center"/>
+            <w:tcMar>
+              <w:top w:w="80" w:type="dxa"/>
+              <w:start w:w="120" w:type="dxa"/>
+              <w:bottom w:w="80" w:type="dxa"/>
+              <w:end w:w="120" w:type="dxa"/>
+            </w:tcMar>
+            <w:shd w:fill="F8FAFC"/>
+          </w:tcPr>
+          <w:p>
+            <w:pPr>
+              <w:spacing w:after="0"/>
+              <w:jc w:val="left"/>
+            </w:pPr>
+            <w:r>
+              <w:rPr>
+                <w:rFonts w:ascii="Arial" w:hAnsi="Arial" w:eastAsia="Arial"/>
+                <w:b w:val="0"/>
+                <w:color w:val="111827"/>
+                <w:sz w:val="16"/>
+              </w:rPr>
+              <w:t>astrology / manifestation / self-improvement</w:t>
+            </w:r>
+          </w:p>
+        </w:tc>
+        <w:tc>
+          <w:tcPr>
+            <w:tcW w:type="dxa" w:w="936"/>
+            <w:vAlign w:val="center"/>
+            <w:tcMar>
+              <w:top w:w="80" w:type="dxa"/>
+              <w:start w:w="120" w:type="dxa"/>
+              <w:bottom w:w="80" w:type="dxa"/>
+              <w:end w:w="120" w:type="dxa"/>
+            </w:tcMar>
+            <w:shd w:fill="F8FAFC"/>
+          </w:tcPr>
+          <w:p>
+            <w:pPr>
+              <w:spacing w:after="0"/>
+              <w:jc w:val="left"/>
+            </w:pPr>
+            <w:r>
+              <w:rPr>
+                <w:rFonts w:ascii="Arial" w:hAnsi="Arial" w:eastAsia="Arial"/>
+                <w:b w:val="0"/>
+                <w:color w:val="111827"/>
+                <w:sz w:val="16"/>
+              </w:rPr>
+              <w:t>30</w:t>
+            </w:r>
+          </w:p>
+        </w:tc>
+        <w:tc>
+          <w:tcPr>
+            <w:tcW w:type="dxa" w:w="936"/>
+            <w:vAlign w:val="center"/>
+            <w:tcMar>
+              <w:top w:w="80" w:type="dxa"/>
+              <w:start w:w="120" w:type="dxa"/>
+              <w:bottom w:w="80" w:type="dxa"/>
+              <w:end w:w="120" w:type="dxa"/>
+            </w:tcMar>
+            <w:shd w:fill="F8FAFC"/>
+          </w:tcPr>
+          <w:p>
+            <w:pPr>
+              <w:spacing w:after="0"/>
+              <w:jc w:val="left"/>
+            </w:pPr>
+            <w:r>
+              <w:rPr>
+                <w:rFonts w:ascii="Arial" w:hAnsi="Arial" w:eastAsia="Arial"/>
+                <w:b w:val="0"/>
+                <w:color w:val="111827"/>
+                <w:sz w:val="16"/>
+              </w:rPr>
+              <w:t>27</w:t>
+            </w:r>
+          </w:p>
+        </w:tc>
+        <w:tc>
+          <w:tcPr>
+            <w:tcW w:type="dxa" w:w="936"/>
+            <w:vAlign w:val="center"/>
+            <w:tcMar>
+              <w:top w:w="80" w:type="dxa"/>
+              <w:start w:w="120" w:type="dxa"/>
+              <w:bottom w:w="80" w:type="dxa"/>
+              <w:end w:w="120" w:type="dxa"/>
+            </w:tcMar>
+            <w:shd w:fill="F8FAFC"/>
+          </w:tcPr>
+          <w:p>
+            <w:pPr>
+              <w:spacing w:after="0"/>
+              <w:jc w:val="left"/>
+            </w:pPr>
+            <w:r>
+              <w:rPr>
+                <w:rFonts w:ascii="Arial" w:hAnsi="Arial" w:eastAsia="Arial"/>
+                <w:b w:val="0"/>
+                <w:color w:val="111827"/>
+                <w:sz w:val="16"/>
+              </w:rPr>
+              <w:t>0</w:t>
+            </w:r>
+          </w:p>
+        </w:tc>
+        <w:tc>
+          <w:tcPr>
+            <w:tcW w:type="dxa" w:w="936"/>
+            <w:vAlign w:val="center"/>
+            <w:tcMar>
+              <w:top w:w="80" w:type="dxa"/>
+              <w:start w:w="120" w:type="dxa"/>
+              <w:bottom w:w="80" w:type="dxa"/>
+              <w:end w:w="120" w:type="dxa"/>
+            </w:tcMar>
+            <w:shd w:fill="F8FAFC"/>
+          </w:tcPr>
+          <w:p>
+            <w:pPr>
+              <w:spacing w:after="0"/>
+              <w:jc w:val="left"/>
+            </w:pPr>
+            <w:r>
+              <w:rPr>
+                <w:rFonts w:ascii="Arial" w:hAnsi="Arial" w:eastAsia="Arial"/>
+                <w:b w:val="0"/>
+                <w:color w:val="111827"/>
+                <w:sz w:val="16"/>
+              </w:rPr>
+              <w:t>14</w:t>
+            </w:r>
+          </w:p>
+        </w:tc>
+        <w:tc>
+          <w:tcPr>
+            <w:tcW w:type="dxa" w:w="936"/>
+            <w:vAlign w:val="center"/>
+            <w:tcMar>
+              <w:top w:w="80" w:type="dxa"/>
+              <w:start w:w="120" w:type="dxa"/>
+              <w:bottom w:w="80" w:type="dxa"/>
+              <w:end w:w="120" w:type="dxa"/>
+            </w:tcMar>
+            <w:shd w:fill="F8FAFC"/>
+          </w:tcPr>
+          <w:p>
+            <w:pPr>
+              <w:spacing w:after="0"/>
+              <w:jc w:val="left"/>
+            </w:pPr>
+            <w:r>
+              <w:rPr>
+                <w:rFonts w:ascii="Arial" w:hAnsi="Arial" w:eastAsia="Arial"/>
+                <w:b w:val="0"/>
+                <w:color w:val="111827"/>
+                <w:sz w:val="16"/>
+              </w:rPr>
+              <w:t>6</w:t>
+            </w:r>
+          </w:p>
+        </w:tc>
+        <w:tc>
+          <w:tcPr>
+            <w:tcW w:type="dxa" w:w="936"/>
+            <w:vAlign w:val="center"/>
+            <w:tcMar>
+              <w:top w:w="80" w:type="dxa"/>
+              <w:start w:w="120" w:type="dxa"/>
+              <w:bottom w:w="80" w:type="dxa"/>
+              <w:end w:w="120" w:type="dxa"/>
+            </w:tcMar>
+            <w:shd w:fill="F8FAFC"/>
+          </w:tcPr>
+          <w:p>
+            <w:pPr>
+              <w:spacing w:after="0"/>
+              <w:jc w:val="left"/>
+            </w:pPr>
+            <w:r>
+              <w:rPr>
+                <w:rFonts w:ascii="Arial" w:hAnsi="Arial" w:eastAsia="Arial"/>
+                <w:b w:val="0"/>
+                <w:color w:val="111827"/>
+                <w:sz w:val="16"/>
+              </w:rPr>
+              <w:t>6</w:t>
+            </w:r>
+          </w:p>
+        </w:tc>
+        <w:tc>
+          <w:tcPr>
+            <w:tcW w:type="dxa" w:w="936"/>
+            <w:vAlign w:val="center"/>
+            <w:tcMar>
+              <w:top w:w="80" w:type="dxa"/>
+              <w:start w:w="120" w:type="dxa"/>
+              <w:bottom w:w="80" w:type="dxa"/>
+              <w:end w:w="120" w:type="dxa"/>
+            </w:tcMar>
+            <w:shd w:fill="F8FAFC"/>
+          </w:tcPr>
+          <w:p>
+            <w:pPr>
+              <w:spacing w:after="0"/>
+              <w:jc w:val="left"/>
+            </w:pPr>
+            <w:r>
+              <w:rPr>
+                <w:rFonts w:ascii="Arial" w:hAnsi="Arial" w:eastAsia="Arial"/>
+                <w:b w:val="0"/>
+                <w:color w:val="111827"/>
+                <w:sz w:val="16"/>
+              </w:rPr>
+              <w:t>usable_for_directional_grouping</w:t>
+            </w:r>
+          </w:p>
+        </w:tc>
+        <w:tc>
+          <w:tcPr>
+            <w:tcW w:type="dxa" w:w="936"/>
+            <w:vAlign w:val="center"/>
+            <w:tcMar>
+              <w:top w:w="80" w:type="dxa"/>
+              <w:start w:w="120" w:type="dxa"/>
+              <w:bottom w:w="80" w:type="dxa"/>
+              <w:end w:w="120" w:type="dxa"/>
+            </w:tcMar>
+            <w:shd w:fill="F8FAFC"/>
+          </w:tcPr>
+          <w:p>
+            <w:pPr>
+              <w:spacing w:after="0"/>
+              <w:jc w:val="left"/>
+            </w:pPr>
+            <w:r>
+              <w:rPr>
+                <w:rFonts w:ascii="Arial" w:hAnsi="Arial" w:eastAsia="Arial"/>
+                <w:b w:val="0"/>
+                <w:color w:val="111827"/>
+                <w:sz w:val="16"/>
+              </w:rPr>
+              <w:t>Miracle Morning Routine (high_priority_close_substitute; score 33.7) / EVOLVE: Transform Your Life (high_priority_close_substitute; score 31) / Rosebud: AI Journal &amp; Diary (high_priority_close_substitute; score 30.5) / Habit Tracker : Haby (high_priority_close_substitute; score 29.9)</w:t>
+            </w:r>
+          </w:p>
+        </w:tc>
+      </w:tr>
+      <w:tr>
+        <w:tc>
+          <w:tcPr>
+            <w:tcW w:type="dxa" w:w="936"/>
+            <w:vAlign w:val="center"/>
+            <w:tcMar>
+              <w:top w:w="80" w:type="dxa"/>
+              <w:start w:w="120" w:type="dxa"/>
+              <w:bottom w:w="80" w:type="dxa"/>
+              <w:end w:w="120" w:type="dxa"/>
+            </w:tcMar>
+          </w:tcPr>
+          <w:p>
+            <w:pPr>
+              <w:spacing w:after="0"/>
+              <w:jc w:val="left"/>
+            </w:pPr>
+            <w:r>
+              <w:rPr>
+                <w:rFonts w:ascii="Arial" w:hAnsi="Arial" w:eastAsia="Arial"/>
+                <w:b w:val="0"/>
+                <w:color w:val="111827"/>
+                <w:sz w:val="16"/>
+              </w:rPr>
+              <w:t>tarot_or_oracle_guidance</w:t>
+            </w:r>
+          </w:p>
+        </w:tc>
+        <w:tc>
+          <w:tcPr>
+            <w:tcW w:type="dxa" w:w="936"/>
+            <w:vAlign w:val="center"/>
+            <w:tcMar>
+              <w:top w:w="80" w:type="dxa"/>
+              <w:start w:w="120" w:type="dxa"/>
+              <w:bottom w:w="80" w:type="dxa"/>
+              <w:end w:w="120" w:type="dxa"/>
+            </w:tcMar>
+          </w:tcPr>
+          <w:p>
+            <w:pPr>
+              <w:spacing w:after="0"/>
+              <w:jc w:val="left"/>
+            </w:pPr>
+            <w:r>
+              <w:rPr>
+                <w:rFonts w:ascii="Arial" w:hAnsi="Arial" w:eastAsia="Arial"/>
+                <w:b w:val="0"/>
+                <w:color w:val="111827"/>
+                <w:sz w:val="16"/>
+              </w:rPr>
+              <w:t>tarot / oracle / symbolic guidance</w:t>
+            </w:r>
+          </w:p>
+        </w:tc>
+        <w:tc>
+          <w:tcPr>
+            <w:tcW w:type="dxa" w:w="936"/>
+            <w:vAlign w:val="center"/>
+            <w:tcMar>
+              <w:top w:w="80" w:type="dxa"/>
+              <w:start w:w="120" w:type="dxa"/>
+              <w:bottom w:w="80" w:type="dxa"/>
+              <w:end w:w="120" w:type="dxa"/>
+            </w:tcMar>
+          </w:tcPr>
+          <w:p>
+            <w:pPr>
+              <w:spacing w:after="0"/>
+              <w:jc w:val="left"/>
+            </w:pPr>
+            <w:r>
+              <w:rPr>
+                <w:rFonts w:ascii="Arial" w:hAnsi="Arial" w:eastAsia="Arial"/>
+                <w:b w:val="0"/>
+                <w:color w:val="111827"/>
+                <w:sz w:val="16"/>
+              </w:rPr>
+              <w:t>7</w:t>
+            </w:r>
+          </w:p>
+        </w:tc>
+        <w:tc>
+          <w:tcPr>
+            <w:tcW w:type="dxa" w:w="936"/>
+            <w:vAlign w:val="center"/>
+            <w:tcMar>
+              <w:top w:w="80" w:type="dxa"/>
+              <w:start w:w="120" w:type="dxa"/>
+              <w:bottom w:w="80" w:type="dxa"/>
+              <w:end w:w="120" w:type="dxa"/>
+            </w:tcMar>
+          </w:tcPr>
+          <w:p>
+            <w:pPr>
+              <w:spacing w:after="0"/>
+              <w:jc w:val="left"/>
+            </w:pPr>
+            <w:r>
+              <w:rPr>
+                <w:rFonts w:ascii="Arial" w:hAnsi="Arial" w:eastAsia="Arial"/>
+                <w:b w:val="0"/>
+                <w:color w:val="111827"/>
+                <w:sz w:val="16"/>
+              </w:rPr>
+              <w:t>4</w:t>
+            </w:r>
+          </w:p>
+        </w:tc>
+        <w:tc>
+          <w:tcPr>
+            <w:tcW w:type="dxa" w:w="936"/>
+            <w:vAlign w:val="center"/>
+            <w:tcMar>
+              <w:top w:w="80" w:type="dxa"/>
+              <w:start w:w="120" w:type="dxa"/>
+              <w:bottom w:w="80" w:type="dxa"/>
+              <w:end w:w="120" w:type="dxa"/>
+            </w:tcMar>
+          </w:tcPr>
+          <w:p>
+            <w:pPr>
+              <w:spacing w:after="0"/>
+              <w:jc w:val="left"/>
+            </w:pPr>
+            <w:r>
+              <w:rPr>
+                <w:rFonts w:ascii="Arial" w:hAnsi="Arial" w:eastAsia="Arial"/>
+                <w:b w:val="0"/>
+                <w:color w:val="111827"/>
+                <w:sz w:val="16"/>
+              </w:rPr>
+              <w:t>0</w:t>
+            </w:r>
+          </w:p>
+        </w:tc>
+        <w:tc>
+          <w:tcPr>
+            <w:tcW w:type="dxa" w:w="936"/>
+            <w:vAlign w:val="center"/>
+            <w:tcMar>
+              <w:top w:w="80" w:type="dxa"/>
+              <w:start w:w="120" w:type="dxa"/>
+              <w:bottom w:w="80" w:type="dxa"/>
+              <w:end w:w="120" w:type="dxa"/>
+            </w:tcMar>
+          </w:tcPr>
+          <w:p>
+            <w:pPr>
+              <w:spacing w:after="0"/>
+              <w:jc w:val="left"/>
+            </w:pPr>
+            <w:r>
+              <w:rPr>
+                <w:rFonts w:ascii="Arial" w:hAnsi="Arial" w:eastAsia="Arial"/>
+                <w:b w:val="0"/>
+                <w:color w:val="111827"/>
+                <w:sz w:val="16"/>
+              </w:rPr>
+              <w:t>3</w:t>
+            </w:r>
+          </w:p>
+        </w:tc>
+        <w:tc>
+          <w:tcPr>
+            <w:tcW w:type="dxa" w:w="936"/>
+            <w:vAlign w:val="center"/>
+            <w:tcMar>
+              <w:top w:w="80" w:type="dxa"/>
+              <w:start w:w="120" w:type="dxa"/>
+              <w:bottom w:w="80" w:type="dxa"/>
+              <w:end w:w="120" w:type="dxa"/>
+            </w:tcMar>
+          </w:tcPr>
+          <w:p>
+            <w:pPr>
+              <w:spacing w:after="0"/>
+              <w:jc w:val="left"/>
+            </w:pPr>
+            <w:r>
+              <w:rPr>
+                <w:rFonts w:ascii="Arial" w:hAnsi="Arial" w:eastAsia="Arial"/>
+                <w:b w:val="0"/>
+                <w:color w:val="111827"/>
+                <w:sz w:val="16"/>
+              </w:rPr>
+              <w:t>0</w:t>
+            </w:r>
+          </w:p>
+        </w:tc>
+        <w:tc>
+          <w:tcPr>
+            <w:tcW w:type="dxa" w:w="936"/>
+            <w:vAlign w:val="center"/>
+            <w:tcMar>
+              <w:top w:w="80" w:type="dxa"/>
+              <w:start w:w="120" w:type="dxa"/>
+              <w:bottom w:w="80" w:type="dxa"/>
+              <w:end w:w="120" w:type="dxa"/>
+            </w:tcMar>
+          </w:tcPr>
+          <w:p>
+            <w:pPr>
+              <w:spacing w:after="0"/>
+              <w:jc w:val="left"/>
+            </w:pPr>
+            <w:r>
+              <w:rPr>
+                <w:rFonts w:ascii="Arial" w:hAnsi="Arial" w:eastAsia="Arial"/>
+                <w:b w:val="0"/>
+                <w:color w:val="111827"/>
+                <w:sz w:val="16"/>
+              </w:rPr>
+              <w:t>0</w:t>
+            </w:r>
+          </w:p>
+        </w:tc>
+        <w:tc>
+          <w:tcPr>
+            <w:tcW w:type="dxa" w:w="936"/>
+            <w:vAlign w:val="center"/>
+            <w:tcMar>
+              <w:top w:w="80" w:type="dxa"/>
+              <w:start w:w="120" w:type="dxa"/>
+              <w:bottom w:w="80" w:type="dxa"/>
+              <w:end w:w="120" w:type="dxa"/>
+            </w:tcMar>
+          </w:tcPr>
+          <w:p>
+            <w:pPr>
+              <w:spacing w:after="0"/>
+              <w:jc w:val="left"/>
+            </w:pPr>
+            <w:r>
+              <w:rPr>
+                <w:rFonts w:ascii="Arial" w:hAnsi="Arial" w:eastAsia="Arial"/>
+                <w:b w:val="0"/>
+                <w:color w:val="111827"/>
+                <w:sz w:val="16"/>
+              </w:rPr>
+              <w:t>taxonomy_needs_manual_cleanup_before_claim_use</w:t>
+            </w:r>
+          </w:p>
+        </w:tc>
+        <w:tc>
+          <w:tcPr>
+            <w:tcW w:type="dxa" w:w="936"/>
+            <w:vAlign w:val="center"/>
+            <w:tcMar>
+              <w:top w:w="80" w:type="dxa"/>
+              <w:start w:w="120" w:type="dxa"/>
+              <w:bottom w:w="80" w:type="dxa"/>
+              <w:end w:w="120" w:type="dxa"/>
+            </w:tcMar>
+          </w:tcPr>
+          <w:p>
+            <w:pPr>
+              <w:spacing w:after="0"/>
+              <w:jc w:val="left"/>
+            </w:pPr>
+            <w:r>
+              <w:rPr>
+                <w:rFonts w:ascii="Arial" w:hAnsi="Arial" w:eastAsia="Arial"/>
+                <w:b w:val="0"/>
+                <w:color w:val="111827"/>
+                <w:sz w:val="16"/>
+              </w:rPr>
+              <w:t>Harem AI - Chat &amp; Talk &amp; Crush (high_priority_close_substitute; score 29.1) / Kokoa AI: Roleplay AI Chat (high_priority_close_substitute; score 27.8) / Spark AI: Chat with Characters (high_priority_close_substitute; score 27) / LunaMate: AI Fanstasy Roleplay (high_priority_close_substitute; score 25.6)</w:t>
+            </w:r>
+          </w:p>
+        </w:tc>
+      </w:tr>
+    </w:tbl>
+    <w:p/>
     <w:tbl>
       <w:tblPr>
         <w:tblW w:type="dxa" w:w="9360"/>
@@ -20349,7 +22600,7 @@
                 <w:color w:val="111827"/>
                 <w:sz w:val="16"/>
               </w:rPr>
-              <w:t>manifest=480; missing=0; docs=120; scripts=106</w:t>
+              <w:t>manifest=483; missing=0; docs=121; scripts=107</w:t>
             </w:r>
           </w:p>
         </w:tc>
@@ -21705,7 +23956,7 @@
                 <w:color w:val="111827"/>
                 <w:sz w:val="16"/>
               </w:rPr>
-              <w:t>480 manifest artifacts; missing=0</w:t>
+              <w:t>483 manifest artifacts; missing=0</w:t>
             </w:r>
           </w:p>
         </w:tc>
@@ -22158,6 +24409,15 @@
       </w:pPr>
       <w:r>
         <w:t>data_processed/global_whitespace_audience_synthesis.csv</w:t>
+      </w:r>
+    </w:p>
+    <w:p>
+      <w:pPr>
+        <w:pStyle w:val="ListBullet"/>
+        <w:spacing w:after="80"/>
+      </w:pPr>
+      <w:r>
+        <w:t>data_processed/global_competitor_archetype_rollup.csv</w:t>
       </w:r>
     </w:p>
     <w:p>

</xml_diff>

<commit_message>
Add competitor taxonomy cleanup queue
</commit_message>
<xml_diff>
--- a/output/docx/alina-global-hypothesis-report-v1.docx
+++ b/output/docx/alina-global-hypothesis-report-v1.docx
@@ -31,7 +31,7 @@
     </w:p>
     <w:p>
       <w:r>
-        <w:t>Собрано: 2026-05-31T16:25:42.313Z</w:t>
+        <w:t>Собрано: 2026-05-31T16:32:40.274Z</w:t>
       </w:r>
     </w:p>
     <w:p>
@@ -64,7 +64,7 @@
     </w:p>
     <w:p>
       <w:r>
-        <w:t>На текущем этапе собрано 67,525 сырьевых source-строк, 36,694 уникализированных строк и 483 локальных артефактов. Эти данные нужны не для того, чтобы объявить продукт доказанным, а для последовательной проверки: существует ли рынок, есть ли деньги, насколько плотна конкуренция, где может быть белое пятно, кто аудитория и какую MVP-петлю надо тестировать.</w:t>
+        <w:t>На текущем этапе собрано 67,525 сырьевых source-строк, 36,694 уникализированных строк и 486 локальных артефактов. Эти данные нужны не для того, чтобы объявить продукт доказанным, а для последовательной проверки: существует ли рынок, есть ли деньги, насколько плотна конкуренция, где может быть белое пятно, кто аудитория и какую MVP-петлю надо тестировать.</w:t>
       </w:r>
     </w:p>
     <w:p>
@@ -10884,6 +10884,1792 @@
       </w:tr>
     </w:tbl>
     <w:p/>
+    <w:p>
+      <w:r>
+        <w:t>Отдельно вынесена очередь taxonomy cleanup. Это не “исправленный датасет”, а список строк, где текущий classifier может смешивать AI companion, roleplay, tarot/oracle и habit-tracking продукты. Пока статус у всех строк queued_not_applied: эти замечания помогают читать competitor map критично, но не апгрейдят гипотезы без ручного подтверждения.</w:t>
+      </w:r>
+    </w:p>
+    <w:tbl>
+      <w:tblPr>
+        <w:tblW w:type="dxa" w:w="9360"/>
+        <w:jc w:val="left"/>
+        <w:tblLayout w:type="fixed"/>
+        <w:tblLook w:firstColumn="1" w:firstRow="1" w:lastColumn="0" w:lastRow="0" w:noHBand="0" w:noVBand="1" w:val="04A0"/>
+        <w:tblInd w:w="120" w:type="dxa"/>
+        <w:tblBorders>
+          <w:top w:val="single" w:sz="4" w:space="0" w:color="CBD5E1"/>
+          <w:left w:val="single" w:sz="4" w:space="0" w:color="CBD5E1"/>
+          <w:bottom w:val="single" w:sz="4" w:space="0" w:color="CBD5E1"/>
+          <w:right w:val="single" w:sz="4" w:space="0" w:color="CBD5E1"/>
+          <w:insideH w:val="single" w:sz="4" w:space="0" w:color="CBD5E1"/>
+          <w:insideV w:val="single" w:sz="4" w:space="0" w:color="CBD5E1"/>
+        </w:tblBorders>
+      </w:tblPr>
+      <w:tblGrid>
+        <w:gridCol w:w="1337"/>
+        <w:gridCol w:w="1337"/>
+        <w:gridCol w:w="1337"/>
+        <w:gridCol w:w="1337"/>
+        <w:gridCol w:w="1337"/>
+        <w:gridCol w:w="1337"/>
+        <w:gridCol w:w="1337"/>
+      </w:tblGrid>
+      <w:tr>
+        <w:tc>
+          <w:tcPr>
+            <w:tcW w:type="dxa" w:w="1337"/>
+            <w:vAlign w:val="center"/>
+            <w:tcMar>
+              <w:top w:w="80" w:type="dxa"/>
+              <w:start w:w="120" w:type="dxa"/>
+              <w:bottom w:w="80" w:type="dxa"/>
+              <w:end w:w="120" w:type="dxa"/>
+            </w:tcMar>
+            <w:shd w:fill="E8EEF5"/>
+          </w:tcPr>
+          <w:p>
+            <w:pPr>
+              <w:spacing w:after="0"/>
+              <w:jc w:val="left"/>
+            </w:pPr>
+            <w:r>
+              <w:rPr>
+                <w:rFonts w:ascii="Arial" w:hAnsi="Arial" w:eastAsia="Arial"/>
+                <w:b/>
+                <w:color w:val="111827"/>
+                <w:sz w:val="16"/>
+              </w:rPr>
+              <w:t>ID</w:t>
+            </w:r>
+          </w:p>
+        </w:tc>
+        <w:tc>
+          <w:tcPr>
+            <w:tcW w:type="dxa" w:w="1337"/>
+            <w:vAlign w:val="center"/>
+            <w:tcMar>
+              <w:top w:w="80" w:type="dxa"/>
+              <w:start w:w="120" w:type="dxa"/>
+              <w:bottom w:w="80" w:type="dxa"/>
+              <w:end w:w="120" w:type="dxa"/>
+            </w:tcMar>
+            <w:shd w:fill="E8EEF5"/>
+          </w:tcPr>
+          <w:p>
+            <w:pPr>
+              <w:spacing w:after="0"/>
+              <w:jc w:val="left"/>
+            </w:pPr>
+            <w:r>
+              <w:rPr>
+                <w:rFonts w:ascii="Arial" w:hAnsi="Arial" w:eastAsia="Arial"/>
+                <w:b/>
+                <w:color w:val="111827"/>
+                <w:sz w:val="16"/>
+              </w:rPr>
+              <w:t>Rank</w:t>
+            </w:r>
+          </w:p>
+        </w:tc>
+        <w:tc>
+          <w:tcPr>
+            <w:tcW w:type="dxa" w:w="1337"/>
+            <w:vAlign w:val="center"/>
+            <w:tcMar>
+              <w:top w:w="80" w:type="dxa"/>
+              <w:start w:w="120" w:type="dxa"/>
+              <w:bottom w:w="80" w:type="dxa"/>
+              <w:end w:w="120" w:type="dxa"/>
+            </w:tcMar>
+            <w:shd w:fill="E8EEF5"/>
+          </w:tcPr>
+          <w:p>
+            <w:pPr>
+              <w:spacing w:after="0"/>
+              <w:jc w:val="left"/>
+            </w:pPr>
+            <w:r>
+              <w:rPr>
+                <w:rFonts w:ascii="Arial" w:hAnsi="Arial" w:eastAsia="Arial"/>
+                <w:b/>
+                <w:color w:val="111827"/>
+                <w:sz w:val="16"/>
+              </w:rPr>
+              <w:t>App</w:t>
+            </w:r>
+          </w:p>
+        </w:tc>
+        <w:tc>
+          <w:tcPr>
+            <w:tcW w:type="dxa" w:w="1337"/>
+            <w:vAlign w:val="center"/>
+            <w:tcMar>
+              <w:top w:w="80" w:type="dxa"/>
+              <w:start w:w="120" w:type="dxa"/>
+              <w:bottom w:w="80" w:type="dxa"/>
+              <w:end w:w="120" w:type="dxa"/>
+            </w:tcMar>
+            <w:shd w:fill="E8EEF5"/>
+          </w:tcPr>
+          <w:p>
+            <w:pPr>
+              <w:spacing w:after="0"/>
+              <w:jc w:val="left"/>
+            </w:pPr>
+            <w:r>
+              <w:rPr>
+                <w:rFonts w:ascii="Arial" w:hAnsi="Arial" w:eastAsia="Arial"/>
+                <w:b/>
+                <w:color w:val="111827"/>
+                <w:sz w:val="16"/>
+              </w:rPr>
+              <w:t>Current</w:t>
+            </w:r>
+          </w:p>
+        </w:tc>
+        <w:tc>
+          <w:tcPr>
+            <w:tcW w:type="dxa" w:w="1337"/>
+            <w:vAlign w:val="center"/>
+            <w:tcMar>
+              <w:top w:w="80" w:type="dxa"/>
+              <w:start w:w="120" w:type="dxa"/>
+              <w:bottom w:w="80" w:type="dxa"/>
+              <w:end w:w="120" w:type="dxa"/>
+            </w:tcMar>
+            <w:shd w:fill="E8EEF5"/>
+          </w:tcPr>
+          <w:p>
+            <w:pPr>
+              <w:spacing w:after="0"/>
+              <w:jc w:val="left"/>
+            </w:pPr>
+            <w:r>
+              <w:rPr>
+                <w:rFonts w:ascii="Arial" w:hAnsi="Arial" w:eastAsia="Arial"/>
+                <w:b/>
+                <w:color w:val="111827"/>
+                <w:sz w:val="16"/>
+              </w:rPr>
+              <w:t>Suggested</w:t>
+            </w:r>
+          </w:p>
+        </w:tc>
+        <w:tc>
+          <w:tcPr>
+            <w:tcW w:type="dxa" w:w="1337"/>
+            <w:vAlign w:val="center"/>
+            <w:tcMar>
+              <w:top w:w="80" w:type="dxa"/>
+              <w:start w:w="120" w:type="dxa"/>
+              <w:bottom w:w="80" w:type="dxa"/>
+              <w:end w:w="120" w:type="dxa"/>
+            </w:tcMar>
+            <w:shd w:fill="E8EEF5"/>
+          </w:tcPr>
+          <w:p>
+            <w:pPr>
+              <w:spacing w:after="0"/>
+              <w:jc w:val="left"/>
+            </w:pPr>
+            <w:r>
+              <w:rPr>
+                <w:rFonts w:ascii="Arial" w:hAnsi="Arial" w:eastAsia="Arial"/>
+                <w:b/>
+                <w:color w:val="111827"/>
+                <w:sz w:val="16"/>
+              </w:rPr>
+              <w:t>Status</w:t>
+            </w:r>
+          </w:p>
+        </w:tc>
+        <w:tc>
+          <w:tcPr>
+            <w:tcW w:type="dxa" w:w="1337"/>
+            <w:vAlign w:val="center"/>
+            <w:tcMar>
+              <w:top w:w="80" w:type="dxa"/>
+              <w:start w:w="120" w:type="dxa"/>
+              <w:bottom w:w="80" w:type="dxa"/>
+              <w:end w:w="120" w:type="dxa"/>
+            </w:tcMar>
+            <w:shd w:fill="E8EEF5"/>
+          </w:tcPr>
+          <w:p>
+            <w:pPr>
+              <w:spacing w:after="0"/>
+              <w:jc w:val="left"/>
+            </w:pPr>
+            <w:r>
+              <w:rPr>
+                <w:rFonts w:ascii="Arial" w:hAnsi="Arial" w:eastAsia="Arial"/>
+                <w:b/>
+                <w:color w:val="111827"/>
+                <w:sz w:val="16"/>
+              </w:rPr>
+              <w:t>Почему</w:t>
+            </w:r>
+          </w:p>
+        </w:tc>
+      </w:tr>
+      <w:tr>
+        <w:tc>
+          <w:tcPr>
+            <w:tcW w:type="dxa" w:w="1337"/>
+            <w:vAlign w:val="center"/>
+            <w:tcMar>
+              <w:top w:w="80" w:type="dxa"/>
+              <w:start w:w="120" w:type="dxa"/>
+              <w:bottom w:w="80" w:type="dxa"/>
+              <w:end w:w="120" w:type="dxa"/>
+            </w:tcMar>
+          </w:tcPr>
+          <w:p>
+            <w:pPr>
+              <w:spacing w:after="0"/>
+              <w:jc w:val="left"/>
+            </w:pPr>
+            <w:r>
+              <w:rPr>
+                <w:rFonts w:ascii="Arial" w:hAnsi="Arial" w:eastAsia="Arial"/>
+                <w:b w:val="0"/>
+                <w:color w:val="111827"/>
+                <w:sz w:val="16"/>
+              </w:rPr>
+              <w:t>TAX_01</w:t>
+            </w:r>
+          </w:p>
+        </w:tc>
+        <w:tc>
+          <w:tcPr>
+            <w:tcW w:type="dxa" w:w="1337"/>
+            <w:vAlign w:val="center"/>
+            <w:tcMar>
+              <w:top w:w="80" w:type="dxa"/>
+              <w:start w:w="120" w:type="dxa"/>
+              <w:bottom w:w="80" w:type="dxa"/>
+              <w:end w:w="120" w:type="dxa"/>
+            </w:tcMar>
+          </w:tcPr>
+          <w:p>
+            <w:pPr>
+              <w:spacing w:after="0"/>
+              <w:jc w:val="left"/>
+            </w:pPr>
+            <w:r>
+              <w:rPr>
+                <w:rFonts w:ascii="Arial" w:hAnsi="Arial" w:eastAsia="Arial"/>
+                <w:b w:val="0"/>
+                <w:color w:val="111827"/>
+                <w:sz w:val="16"/>
+              </w:rPr>
+              <w:t>12</w:t>
+            </w:r>
+          </w:p>
+        </w:tc>
+        <w:tc>
+          <w:tcPr>
+            <w:tcW w:type="dxa" w:w="1337"/>
+            <w:vAlign w:val="center"/>
+            <w:tcMar>
+              <w:top w:w="80" w:type="dxa"/>
+              <w:start w:w="120" w:type="dxa"/>
+              <w:bottom w:w="80" w:type="dxa"/>
+              <w:end w:w="120" w:type="dxa"/>
+            </w:tcMar>
+          </w:tcPr>
+          <w:p>
+            <w:pPr>
+              <w:spacing w:after="0"/>
+              <w:jc w:val="left"/>
+            </w:pPr>
+            <w:r>
+              <w:rPr>
+                <w:rFonts w:ascii="Arial" w:hAnsi="Arial" w:eastAsia="Arial"/>
+                <w:b w:val="0"/>
+                <w:color w:val="111827"/>
+                <w:sz w:val="16"/>
+              </w:rPr>
+              <w:t>LunaMate: AI Fanstasy Roleplay</w:t>
+            </w:r>
+          </w:p>
+        </w:tc>
+        <w:tc>
+          <w:tcPr>
+            <w:tcW w:type="dxa" w:w="1337"/>
+            <w:vAlign w:val="center"/>
+            <w:tcMar>
+              <w:top w:w="80" w:type="dxa"/>
+              <w:start w:w="120" w:type="dxa"/>
+              <w:bottom w:w="80" w:type="dxa"/>
+              <w:end w:w="120" w:type="dxa"/>
+            </w:tcMar>
+          </w:tcPr>
+          <w:p>
+            <w:pPr>
+              <w:spacing w:after="0"/>
+              <w:jc w:val="left"/>
+            </w:pPr>
+            <w:r>
+              <w:rPr>
+                <w:rFonts w:ascii="Arial" w:hAnsi="Arial" w:eastAsia="Arial"/>
+                <w:b w:val="0"/>
+                <w:color w:val="111827"/>
+                <w:sz w:val="16"/>
+              </w:rPr>
+              <w:t>tarot_or_oracle_guidance</w:t>
+            </w:r>
+          </w:p>
+        </w:tc>
+        <w:tc>
+          <w:tcPr>
+            <w:tcW w:type="dxa" w:w="1337"/>
+            <w:vAlign w:val="center"/>
+            <w:tcMar>
+              <w:top w:w="80" w:type="dxa"/>
+              <w:start w:w="120" w:type="dxa"/>
+              <w:bottom w:w="80" w:type="dxa"/>
+              <w:end w:w="120" w:type="dxa"/>
+            </w:tcMar>
+          </w:tcPr>
+          <w:p>
+            <w:pPr>
+              <w:spacing w:after="0"/>
+              <w:jc w:val="left"/>
+            </w:pPr>
+            <w:r>
+              <w:rPr>
+                <w:rFonts w:ascii="Arial" w:hAnsi="Arial" w:eastAsia="Arial"/>
+                <w:b w:val="0"/>
+                <w:color w:val="111827"/>
+                <w:sz w:val="16"/>
+              </w:rPr>
+              <w:t>ai_companion_roleplay</w:t>
+            </w:r>
+          </w:p>
+        </w:tc>
+        <w:tc>
+          <w:tcPr>
+            <w:tcW w:type="dxa" w:w="1337"/>
+            <w:vAlign w:val="center"/>
+            <w:tcMar>
+              <w:top w:w="80" w:type="dxa"/>
+              <w:start w:w="120" w:type="dxa"/>
+              <w:bottom w:w="80" w:type="dxa"/>
+              <w:end w:w="120" w:type="dxa"/>
+            </w:tcMar>
+          </w:tcPr>
+          <w:p>
+            <w:pPr>
+              <w:spacing w:after="0"/>
+              <w:jc w:val="left"/>
+            </w:pPr>
+            <w:r>
+              <w:rPr>
+                <w:rFonts w:ascii="Arial" w:hAnsi="Arial" w:eastAsia="Arial"/>
+                <w:b w:val="0"/>
+                <w:color w:val="111827"/>
+                <w:sz w:val="16"/>
+              </w:rPr>
+              <w:t>suggested_change</w:t>
+            </w:r>
+          </w:p>
+        </w:tc>
+        <w:tc>
+          <w:tcPr>
+            <w:tcW w:type="dxa" w:w="1337"/>
+            <w:vAlign w:val="center"/>
+            <w:tcMar>
+              <w:top w:w="80" w:type="dxa"/>
+              <w:start w:w="120" w:type="dxa"/>
+              <w:bottom w:w="80" w:type="dxa"/>
+              <w:end w:w="120" w:type="dxa"/>
+            </w:tcMar>
+          </w:tcPr>
+          <w:p>
+            <w:pPr>
+              <w:spacing w:after="0"/>
+              <w:jc w:val="left"/>
+            </w:pPr>
+            <w:r>
+              <w:rPr>
+                <w:rFonts w:ascii="Arial" w:hAnsi="Arial" w:eastAsia="Arial"/>
+                <w:b w:val="0"/>
+                <w:color w:val="111827"/>
+                <w:sz w:val="16"/>
+              </w:rPr>
+              <w:t>публичное описание сильнее указывает на AI characters/companions/roleplay, чем на tarot/oracle symbolic guidance</w:t>
+            </w:r>
+          </w:p>
+        </w:tc>
+      </w:tr>
+      <w:tr>
+        <w:tc>
+          <w:tcPr>
+            <w:tcW w:type="dxa" w:w="1337"/>
+            <w:vAlign w:val="center"/>
+            <w:tcMar>
+              <w:top w:w="80" w:type="dxa"/>
+              <w:start w:w="120" w:type="dxa"/>
+              <w:bottom w:w="80" w:type="dxa"/>
+              <w:end w:w="120" w:type="dxa"/>
+            </w:tcMar>
+            <w:shd w:fill="F8FAFC"/>
+          </w:tcPr>
+          <w:p>
+            <w:pPr>
+              <w:spacing w:after="0"/>
+              <w:jc w:val="left"/>
+            </w:pPr>
+            <w:r>
+              <w:rPr>
+                <w:rFonts w:ascii="Arial" w:hAnsi="Arial" w:eastAsia="Arial"/>
+                <w:b w:val="0"/>
+                <w:color w:val="111827"/>
+                <w:sz w:val="16"/>
+              </w:rPr>
+              <w:t>TAX_02</w:t>
+            </w:r>
+          </w:p>
+        </w:tc>
+        <w:tc>
+          <w:tcPr>
+            <w:tcW w:type="dxa" w:w="1337"/>
+            <w:vAlign w:val="center"/>
+            <w:tcMar>
+              <w:top w:w="80" w:type="dxa"/>
+              <w:start w:w="120" w:type="dxa"/>
+              <w:bottom w:w="80" w:type="dxa"/>
+              <w:end w:w="120" w:type="dxa"/>
+            </w:tcMar>
+            <w:shd w:fill="F8FAFC"/>
+          </w:tcPr>
+          <w:p>
+            <w:pPr>
+              <w:spacing w:after="0"/>
+              <w:jc w:val="left"/>
+            </w:pPr>
+            <w:r>
+              <w:rPr>
+                <w:rFonts w:ascii="Arial" w:hAnsi="Arial" w:eastAsia="Arial"/>
+                <w:b w:val="0"/>
+                <w:color w:val="111827"/>
+                <w:sz w:val="16"/>
+              </w:rPr>
+              <w:t>13</w:t>
+            </w:r>
+          </w:p>
+        </w:tc>
+        <w:tc>
+          <w:tcPr>
+            <w:tcW w:type="dxa" w:w="1337"/>
+            <w:vAlign w:val="center"/>
+            <w:tcMar>
+              <w:top w:w="80" w:type="dxa"/>
+              <w:start w:w="120" w:type="dxa"/>
+              <w:bottom w:w="80" w:type="dxa"/>
+              <w:end w:w="120" w:type="dxa"/>
+            </w:tcMar>
+            <w:shd w:fill="F8FAFC"/>
+          </w:tcPr>
+          <w:p>
+            <w:pPr>
+              <w:spacing w:after="0"/>
+              <w:jc w:val="left"/>
+            </w:pPr>
+            <w:r>
+              <w:rPr>
+                <w:rFonts w:ascii="Arial" w:hAnsi="Arial" w:eastAsia="Arial"/>
+                <w:b w:val="0"/>
+                <w:color w:val="111827"/>
+                <w:sz w:val="16"/>
+              </w:rPr>
+              <w:t>Kokoa AI: Roleplay AI Chat</w:t>
+            </w:r>
+          </w:p>
+        </w:tc>
+        <w:tc>
+          <w:tcPr>
+            <w:tcW w:type="dxa" w:w="1337"/>
+            <w:vAlign w:val="center"/>
+            <w:tcMar>
+              <w:top w:w="80" w:type="dxa"/>
+              <w:start w:w="120" w:type="dxa"/>
+              <w:bottom w:w="80" w:type="dxa"/>
+              <w:end w:w="120" w:type="dxa"/>
+            </w:tcMar>
+            <w:shd w:fill="F8FAFC"/>
+          </w:tcPr>
+          <w:p>
+            <w:pPr>
+              <w:spacing w:after="0"/>
+              <w:jc w:val="left"/>
+            </w:pPr>
+            <w:r>
+              <w:rPr>
+                <w:rFonts w:ascii="Arial" w:hAnsi="Arial" w:eastAsia="Arial"/>
+                <w:b w:val="0"/>
+                <w:color w:val="111827"/>
+                <w:sz w:val="16"/>
+              </w:rPr>
+              <w:t>tarot_or_oracle_guidance</w:t>
+            </w:r>
+          </w:p>
+        </w:tc>
+        <w:tc>
+          <w:tcPr>
+            <w:tcW w:type="dxa" w:w="1337"/>
+            <w:vAlign w:val="center"/>
+            <w:tcMar>
+              <w:top w:w="80" w:type="dxa"/>
+              <w:start w:w="120" w:type="dxa"/>
+              <w:bottom w:w="80" w:type="dxa"/>
+              <w:end w:w="120" w:type="dxa"/>
+            </w:tcMar>
+            <w:shd w:fill="F8FAFC"/>
+          </w:tcPr>
+          <w:p>
+            <w:pPr>
+              <w:spacing w:after="0"/>
+              <w:jc w:val="left"/>
+            </w:pPr>
+            <w:r>
+              <w:rPr>
+                <w:rFonts w:ascii="Arial" w:hAnsi="Arial" w:eastAsia="Arial"/>
+                <w:b w:val="0"/>
+                <w:color w:val="111827"/>
+                <w:sz w:val="16"/>
+              </w:rPr>
+              <w:t>ai_companion_roleplay</w:t>
+            </w:r>
+          </w:p>
+        </w:tc>
+        <w:tc>
+          <w:tcPr>
+            <w:tcW w:type="dxa" w:w="1337"/>
+            <w:vAlign w:val="center"/>
+            <w:tcMar>
+              <w:top w:w="80" w:type="dxa"/>
+              <w:start w:w="120" w:type="dxa"/>
+              <w:bottom w:w="80" w:type="dxa"/>
+              <w:end w:w="120" w:type="dxa"/>
+            </w:tcMar>
+            <w:shd w:fill="F8FAFC"/>
+          </w:tcPr>
+          <w:p>
+            <w:pPr>
+              <w:spacing w:after="0"/>
+              <w:jc w:val="left"/>
+            </w:pPr>
+            <w:r>
+              <w:rPr>
+                <w:rFonts w:ascii="Arial" w:hAnsi="Arial" w:eastAsia="Arial"/>
+                <w:b w:val="0"/>
+                <w:color w:val="111827"/>
+                <w:sz w:val="16"/>
+              </w:rPr>
+              <w:t>suggested_change</w:t>
+            </w:r>
+          </w:p>
+        </w:tc>
+        <w:tc>
+          <w:tcPr>
+            <w:tcW w:type="dxa" w:w="1337"/>
+            <w:vAlign w:val="center"/>
+            <w:tcMar>
+              <w:top w:w="80" w:type="dxa"/>
+              <w:start w:w="120" w:type="dxa"/>
+              <w:bottom w:w="80" w:type="dxa"/>
+              <w:end w:w="120" w:type="dxa"/>
+            </w:tcMar>
+            <w:shd w:fill="F8FAFC"/>
+          </w:tcPr>
+          <w:p>
+            <w:pPr>
+              <w:spacing w:after="0"/>
+              <w:jc w:val="left"/>
+            </w:pPr>
+            <w:r>
+              <w:rPr>
+                <w:rFonts w:ascii="Arial" w:hAnsi="Arial" w:eastAsia="Arial"/>
+                <w:b w:val="0"/>
+                <w:color w:val="111827"/>
+                <w:sz w:val="16"/>
+              </w:rPr>
+              <w:t>публичное описание сильнее указывает на AI characters/companions/roleplay, чем на tarot/oracle symbolic guidance</w:t>
+            </w:r>
+          </w:p>
+        </w:tc>
+      </w:tr>
+      <w:tr>
+        <w:tc>
+          <w:tcPr>
+            <w:tcW w:type="dxa" w:w="1337"/>
+            <w:vAlign w:val="center"/>
+            <w:tcMar>
+              <w:top w:w="80" w:type="dxa"/>
+              <w:start w:w="120" w:type="dxa"/>
+              <w:bottom w:w="80" w:type="dxa"/>
+              <w:end w:w="120" w:type="dxa"/>
+            </w:tcMar>
+          </w:tcPr>
+          <w:p>
+            <w:pPr>
+              <w:spacing w:after="0"/>
+              <w:jc w:val="left"/>
+            </w:pPr>
+            <w:r>
+              <w:rPr>
+                <w:rFonts w:ascii="Arial" w:hAnsi="Arial" w:eastAsia="Arial"/>
+                <w:b w:val="0"/>
+                <w:color w:val="111827"/>
+                <w:sz w:val="16"/>
+              </w:rPr>
+              <w:t>TAX_03</w:t>
+            </w:r>
+          </w:p>
+        </w:tc>
+        <w:tc>
+          <w:tcPr>
+            <w:tcW w:type="dxa" w:w="1337"/>
+            <w:vAlign w:val="center"/>
+            <w:tcMar>
+              <w:top w:w="80" w:type="dxa"/>
+              <w:start w:w="120" w:type="dxa"/>
+              <w:bottom w:w="80" w:type="dxa"/>
+              <w:end w:w="120" w:type="dxa"/>
+            </w:tcMar>
+          </w:tcPr>
+          <w:p>
+            <w:pPr>
+              <w:spacing w:after="0"/>
+              <w:jc w:val="left"/>
+            </w:pPr>
+            <w:r>
+              <w:rPr>
+                <w:rFonts w:ascii="Arial" w:hAnsi="Arial" w:eastAsia="Arial"/>
+                <w:b w:val="0"/>
+                <w:color w:val="111827"/>
+                <w:sz w:val="16"/>
+              </w:rPr>
+              <w:t>14</w:t>
+            </w:r>
+          </w:p>
+        </w:tc>
+        <w:tc>
+          <w:tcPr>
+            <w:tcW w:type="dxa" w:w="1337"/>
+            <w:vAlign w:val="center"/>
+            <w:tcMar>
+              <w:top w:w="80" w:type="dxa"/>
+              <w:start w:w="120" w:type="dxa"/>
+              <w:bottom w:w="80" w:type="dxa"/>
+              <w:end w:w="120" w:type="dxa"/>
+            </w:tcMar>
+          </w:tcPr>
+          <w:p>
+            <w:pPr>
+              <w:spacing w:after="0"/>
+              <w:jc w:val="left"/>
+            </w:pPr>
+            <w:r>
+              <w:rPr>
+                <w:rFonts w:ascii="Arial" w:hAnsi="Arial" w:eastAsia="Arial"/>
+                <w:b w:val="0"/>
+                <w:color w:val="111827"/>
+                <w:sz w:val="16"/>
+              </w:rPr>
+              <w:t>Harem AI - Chat &amp; Talk &amp; Crush</w:t>
+            </w:r>
+          </w:p>
+        </w:tc>
+        <w:tc>
+          <w:tcPr>
+            <w:tcW w:type="dxa" w:w="1337"/>
+            <w:vAlign w:val="center"/>
+            <w:tcMar>
+              <w:top w:w="80" w:type="dxa"/>
+              <w:start w:w="120" w:type="dxa"/>
+              <w:bottom w:w="80" w:type="dxa"/>
+              <w:end w:w="120" w:type="dxa"/>
+            </w:tcMar>
+          </w:tcPr>
+          <w:p>
+            <w:pPr>
+              <w:spacing w:after="0"/>
+              <w:jc w:val="left"/>
+            </w:pPr>
+            <w:r>
+              <w:rPr>
+                <w:rFonts w:ascii="Arial" w:hAnsi="Arial" w:eastAsia="Arial"/>
+                <w:b w:val="0"/>
+                <w:color w:val="111827"/>
+                <w:sz w:val="16"/>
+              </w:rPr>
+              <w:t>tarot_or_oracle_guidance</w:t>
+            </w:r>
+          </w:p>
+        </w:tc>
+        <w:tc>
+          <w:tcPr>
+            <w:tcW w:type="dxa" w:w="1337"/>
+            <w:vAlign w:val="center"/>
+            <w:tcMar>
+              <w:top w:w="80" w:type="dxa"/>
+              <w:start w:w="120" w:type="dxa"/>
+              <w:bottom w:w="80" w:type="dxa"/>
+              <w:end w:w="120" w:type="dxa"/>
+            </w:tcMar>
+          </w:tcPr>
+          <w:p>
+            <w:pPr>
+              <w:spacing w:after="0"/>
+              <w:jc w:val="left"/>
+            </w:pPr>
+            <w:r>
+              <w:rPr>
+                <w:rFonts w:ascii="Arial" w:hAnsi="Arial" w:eastAsia="Arial"/>
+                <w:b w:val="0"/>
+                <w:color w:val="111827"/>
+                <w:sz w:val="16"/>
+              </w:rPr>
+              <w:t>ai_companion_roleplay</w:t>
+            </w:r>
+          </w:p>
+        </w:tc>
+        <w:tc>
+          <w:tcPr>
+            <w:tcW w:type="dxa" w:w="1337"/>
+            <w:vAlign w:val="center"/>
+            <w:tcMar>
+              <w:top w:w="80" w:type="dxa"/>
+              <w:start w:w="120" w:type="dxa"/>
+              <w:bottom w:w="80" w:type="dxa"/>
+              <w:end w:w="120" w:type="dxa"/>
+            </w:tcMar>
+          </w:tcPr>
+          <w:p>
+            <w:pPr>
+              <w:spacing w:after="0"/>
+              <w:jc w:val="left"/>
+            </w:pPr>
+            <w:r>
+              <w:rPr>
+                <w:rFonts w:ascii="Arial" w:hAnsi="Arial" w:eastAsia="Arial"/>
+                <w:b w:val="0"/>
+                <w:color w:val="111827"/>
+                <w:sz w:val="16"/>
+              </w:rPr>
+              <w:t>suggested_change</w:t>
+            </w:r>
+          </w:p>
+        </w:tc>
+        <w:tc>
+          <w:tcPr>
+            <w:tcW w:type="dxa" w:w="1337"/>
+            <w:vAlign w:val="center"/>
+            <w:tcMar>
+              <w:top w:w="80" w:type="dxa"/>
+              <w:start w:w="120" w:type="dxa"/>
+              <w:bottom w:w="80" w:type="dxa"/>
+              <w:end w:w="120" w:type="dxa"/>
+            </w:tcMar>
+          </w:tcPr>
+          <w:p>
+            <w:pPr>
+              <w:spacing w:after="0"/>
+              <w:jc w:val="left"/>
+            </w:pPr>
+            <w:r>
+              <w:rPr>
+                <w:rFonts w:ascii="Arial" w:hAnsi="Arial" w:eastAsia="Arial"/>
+                <w:b w:val="0"/>
+                <w:color w:val="111827"/>
+                <w:sz w:val="16"/>
+              </w:rPr>
+              <w:t>публичное описание сильнее указывает на AI characters/companions/roleplay, чем на tarot/oracle symbolic guidance</w:t>
+            </w:r>
+          </w:p>
+        </w:tc>
+      </w:tr>
+      <w:tr>
+        <w:tc>
+          <w:tcPr>
+            <w:tcW w:type="dxa" w:w="1337"/>
+            <w:vAlign w:val="center"/>
+            <w:tcMar>
+              <w:top w:w="80" w:type="dxa"/>
+              <w:start w:w="120" w:type="dxa"/>
+              <w:bottom w:w="80" w:type="dxa"/>
+              <w:end w:w="120" w:type="dxa"/>
+            </w:tcMar>
+            <w:shd w:fill="F8FAFC"/>
+          </w:tcPr>
+          <w:p>
+            <w:pPr>
+              <w:spacing w:after="0"/>
+              <w:jc w:val="left"/>
+            </w:pPr>
+            <w:r>
+              <w:rPr>
+                <w:rFonts w:ascii="Arial" w:hAnsi="Arial" w:eastAsia="Arial"/>
+                <w:b w:val="0"/>
+                <w:color w:val="111827"/>
+                <w:sz w:val="16"/>
+              </w:rPr>
+              <w:t>TAX_04</w:t>
+            </w:r>
+          </w:p>
+        </w:tc>
+        <w:tc>
+          <w:tcPr>
+            <w:tcW w:type="dxa" w:w="1337"/>
+            <w:vAlign w:val="center"/>
+            <w:tcMar>
+              <w:top w:w="80" w:type="dxa"/>
+              <w:start w:w="120" w:type="dxa"/>
+              <w:bottom w:w="80" w:type="dxa"/>
+              <w:end w:w="120" w:type="dxa"/>
+            </w:tcMar>
+            <w:shd w:fill="F8FAFC"/>
+          </w:tcPr>
+          <w:p>
+            <w:pPr>
+              <w:spacing w:after="0"/>
+              <w:jc w:val="left"/>
+            </w:pPr>
+            <w:r>
+              <w:rPr>
+                <w:rFonts w:ascii="Arial" w:hAnsi="Arial" w:eastAsia="Arial"/>
+                <w:b w:val="0"/>
+                <w:color w:val="111827"/>
+                <w:sz w:val="16"/>
+              </w:rPr>
+              <w:t>15</w:t>
+            </w:r>
+          </w:p>
+        </w:tc>
+        <w:tc>
+          <w:tcPr>
+            <w:tcW w:type="dxa" w:w="1337"/>
+            <w:vAlign w:val="center"/>
+            <w:tcMar>
+              <w:top w:w="80" w:type="dxa"/>
+              <w:start w:w="120" w:type="dxa"/>
+              <w:bottom w:w="80" w:type="dxa"/>
+              <w:end w:w="120" w:type="dxa"/>
+            </w:tcMar>
+            <w:shd w:fill="F8FAFC"/>
+          </w:tcPr>
+          <w:p>
+            <w:pPr>
+              <w:spacing w:after="0"/>
+              <w:jc w:val="left"/>
+            </w:pPr>
+            <w:r>
+              <w:rPr>
+                <w:rFonts w:ascii="Arial" w:hAnsi="Arial" w:eastAsia="Arial"/>
+                <w:b w:val="0"/>
+                <w:color w:val="111827"/>
+                <w:sz w:val="16"/>
+              </w:rPr>
+              <w:t>Spark AI: Chat with Characters</w:t>
+            </w:r>
+          </w:p>
+        </w:tc>
+        <w:tc>
+          <w:tcPr>
+            <w:tcW w:type="dxa" w:w="1337"/>
+            <w:vAlign w:val="center"/>
+            <w:tcMar>
+              <w:top w:w="80" w:type="dxa"/>
+              <w:start w:w="120" w:type="dxa"/>
+              <w:bottom w:w="80" w:type="dxa"/>
+              <w:end w:w="120" w:type="dxa"/>
+            </w:tcMar>
+            <w:shd w:fill="F8FAFC"/>
+          </w:tcPr>
+          <w:p>
+            <w:pPr>
+              <w:spacing w:after="0"/>
+              <w:jc w:val="left"/>
+            </w:pPr>
+            <w:r>
+              <w:rPr>
+                <w:rFonts w:ascii="Arial" w:hAnsi="Arial" w:eastAsia="Arial"/>
+                <w:b w:val="0"/>
+                <w:color w:val="111827"/>
+                <w:sz w:val="16"/>
+              </w:rPr>
+              <w:t>tarot_or_oracle_guidance</w:t>
+            </w:r>
+          </w:p>
+        </w:tc>
+        <w:tc>
+          <w:tcPr>
+            <w:tcW w:type="dxa" w:w="1337"/>
+            <w:vAlign w:val="center"/>
+            <w:tcMar>
+              <w:top w:w="80" w:type="dxa"/>
+              <w:start w:w="120" w:type="dxa"/>
+              <w:bottom w:w="80" w:type="dxa"/>
+              <w:end w:w="120" w:type="dxa"/>
+            </w:tcMar>
+            <w:shd w:fill="F8FAFC"/>
+          </w:tcPr>
+          <w:p>
+            <w:pPr>
+              <w:spacing w:after="0"/>
+              <w:jc w:val="left"/>
+            </w:pPr>
+            <w:r>
+              <w:rPr>
+                <w:rFonts w:ascii="Arial" w:hAnsi="Arial" w:eastAsia="Arial"/>
+                <w:b w:val="0"/>
+                <w:color w:val="111827"/>
+                <w:sz w:val="16"/>
+              </w:rPr>
+              <w:t>ai_companion_roleplay</w:t>
+            </w:r>
+          </w:p>
+        </w:tc>
+        <w:tc>
+          <w:tcPr>
+            <w:tcW w:type="dxa" w:w="1337"/>
+            <w:vAlign w:val="center"/>
+            <w:tcMar>
+              <w:top w:w="80" w:type="dxa"/>
+              <w:start w:w="120" w:type="dxa"/>
+              <w:bottom w:w="80" w:type="dxa"/>
+              <w:end w:w="120" w:type="dxa"/>
+            </w:tcMar>
+            <w:shd w:fill="F8FAFC"/>
+          </w:tcPr>
+          <w:p>
+            <w:pPr>
+              <w:spacing w:after="0"/>
+              <w:jc w:val="left"/>
+            </w:pPr>
+            <w:r>
+              <w:rPr>
+                <w:rFonts w:ascii="Arial" w:hAnsi="Arial" w:eastAsia="Arial"/>
+                <w:b w:val="0"/>
+                <w:color w:val="111827"/>
+                <w:sz w:val="16"/>
+              </w:rPr>
+              <w:t>suggested_change</w:t>
+            </w:r>
+          </w:p>
+        </w:tc>
+        <w:tc>
+          <w:tcPr>
+            <w:tcW w:type="dxa" w:w="1337"/>
+            <w:vAlign w:val="center"/>
+            <w:tcMar>
+              <w:top w:w="80" w:type="dxa"/>
+              <w:start w:w="120" w:type="dxa"/>
+              <w:bottom w:w="80" w:type="dxa"/>
+              <w:end w:w="120" w:type="dxa"/>
+            </w:tcMar>
+            <w:shd w:fill="F8FAFC"/>
+          </w:tcPr>
+          <w:p>
+            <w:pPr>
+              <w:spacing w:after="0"/>
+              <w:jc w:val="left"/>
+            </w:pPr>
+            <w:r>
+              <w:rPr>
+                <w:rFonts w:ascii="Arial" w:hAnsi="Arial" w:eastAsia="Arial"/>
+                <w:b w:val="0"/>
+                <w:color w:val="111827"/>
+                <w:sz w:val="16"/>
+              </w:rPr>
+              <w:t>публичное описание сильнее указывает на AI characters/companions/roleplay, чем на tarot/oracle symbolic guidance</w:t>
+            </w:r>
+          </w:p>
+        </w:tc>
+      </w:tr>
+      <w:tr>
+        <w:tc>
+          <w:tcPr>
+            <w:tcW w:type="dxa" w:w="1337"/>
+            <w:vAlign w:val="center"/>
+            <w:tcMar>
+              <w:top w:w="80" w:type="dxa"/>
+              <w:start w:w="120" w:type="dxa"/>
+              <w:bottom w:w="80" w:type="dxa"/>
+              <w:end w:w="120" w:type="dxa"/>
+            </w:tcMar>
+          </w:tcPr>
+          <w:p>
+            <w:pPr>
+              <w:spacing w:after="0"/>
+              <w:jc w:val="left"/>
+            </w:pPr>
+            <w:r>
+              <w:rPr>
+                <w:rFonts w:ascii="Arial" w:hAnsi="Arial" w:eastAsia="Arial"/>
+                <w:b w:val="0"/>
+                <w:color w:val="111827"/>
+                <w:sz w:val="16"/>
+              </w:rPr>
+              <w:t>TAX_05</w:t>
+            </w:r>
+          </w:p>
+        </w:tc>
+        <w:tc>
+          <w:tcPr>
+            <w:tcW w:type="dxa" w:w="1337"/>
+            <w:vAlign w:val="center"/>
+            <w:tcMar>
+              <w:top w:w="80" w:type="dxa"/>
+              <w:start w:w="120" w:type="dxa"/>
+              <w:bottom w:w="80" w:type="dxa"/>
+              <w:end w:w="120" w:type="dxa"/>
+            </w:tcMar>
+          </w:tcPr>
+          <w:p>
+            <w:pPr>
+              <w:spacing w:after="0"/>
+              <w:jc w:val="left"/>
+            </w:pPr>
+            <w:r>
+              <w:rPr>
+                <w:rFonts w:ascii="Arial" w:hAnsi="Arial" w:eastAsia="Arial"/>
+                <w:b w:val="0"/>
+                <w:color w:val="111827"/>
+                <w:sz w:val="16"/>
+              </w:rPr>
+              <w:t>24</w:t>
+            </w:r>
+          </w:p>
+        </w:tc>
+        <w:tc>
+          <w:tcPr>
+            <w:tcW w:type="dxa" w:w="1337"/>
+            <w:vAlign w:val="center"/>
+            <w:tcMar>
+              <w:top w:w="80" w:type="dxa"/>
+              <w:start w:w="120" w:type="dxa"/>
+              <w:bottom w:w="80" w:type="dxa"/>
+              <w:end w:w="120" w:type="dxa"/>
+            </w:tcMar>
+          </w:tcPr>
+          <w:p>
+            <w:pPr>
+              <w:spacing w:after="0"/>
+              <w:jc w:val="left"/>
+            </w:pPr>
+            <w:r>
+              <w:rPr>
+                <w:rFonts w:ascii="Arial" w:hAnsi="Arial" w:eastAsia="Arial"/>
+                <w:b w:val="0"/>
+                <w:color w:val="111827"/>
+                <w:sz w:val="16"/>
+              </w:rPr>
+              <w:t>Intuitive Life Coaching Oracle</w:t>
+            </w:r>
+          </w:p>
+        </w:tc>
+        <w:tc>
+          <w:tcPr>
+            <w:tcW w:type="dxa" w:w="1337"/>
+            <w:vAlign w:val="center"/>
+            <w:tcMar>
+              <w:top w:w="80" w:type="dxa"/>
+              <w:start w:w="120" w:type="dxa"/>
+              <w:bottom w:w="80" w:type="dxa"/>
+              <w:end w:w="120" w:type="dxa"/>
+            </w:tcMar>
+          </w:tcPr>
+          <w:p>
+            <w:pPr>
+              <w:spacing w:after="0"/>
+              <w:jc w:val="left"/>
+            </w:pPr>
+            <w:r>
+              <w:rPr>
+                <w:rFonts w:ascii="Arial" w:hAnsi="Arial" w:eastAsia="Arial"/>
+                <w:b w:val="0"/>
+                <w:color w:val="111827"/>
+                <w:sz w:val="16"/>
+              </w:rPr>
+              <w:t>tarot_or_oracle_guidance</w:t>
+            </w:r>
+          </w:p>
+        </w:tc>
+        <w:tc>
+          <w:tcPr>
+            <w:tcW w:type="dxa" w:w="1337"/>
+            <w:vAlign w:val="center"/>
+            <w:tcMar>
+              <w:top w:w="80" w:type="dxa"/>
+              <w:start w:w="120" w:type="dxa"/>
+              <w:bottom w:w="80" w:type="dxa"/>
+              <w:end w:w="120" w:type="dxa"/>
+            </w:tcMar>
+          </w:tcPr>
+          <w:p>
+            <w:pPr>
+              <w:spacing w:after="0"/>
+              <w:jc w:val="left"/>
+            </w:pPr>
+            <w:r>
+              <w:rPr>
+                <w:rFonts w:ascii="Arial" w:hAnsi="Arial" w:eastAsia="Arial"/>
+                <w:b w:val="0"/>
+                <w:color w:val="111827"/>
+                <w:sz w:val="16"/>
+              </w:rPr>
+              <w:t>tarot_or_oracle_guidance</w:t>
+            </w:r>
+          </w:p>
+        </w:tc>
+        <w:tc>
+          <w:tcPr>
+            <w:tcW w:type="dxa" w:w="1337"/>
+            <w:vAlign w:val="center"/>
+            <w:tcMar>
+              <w:top w:w="80" w:type="dxa"/>
+              <w:start w:w="120" w:type="dxa"/>
+              <w:bottom w:w="80" w:type="dxa"/>
+              <w:end w:w="120" w:type="dxa"/>
+            </w:tcMar>
+          </w:tcPr>
+          <w:p>
+            <w:pPr>
+              <w:spacing w:after="0"/>
+              <w:jc w:val="left"/>
+            </w:pPr>
+            <w:r>
+              <w:rPr>
+                <w:rFonts w:ascii="Arial" w:hAnsi="Arial" w:eastAsia="Arial"/>
+                <w:b w:val="0"/>
+                <w:color w:val="111827"/>
+                <w:sz w:val="16"/>
+              </w:rPr>
+              <w:t>confirm_or_manual_read</w:t>
+            </w:r>
+          </w:p>
+        </w:tc>
+        <w:tc>
+          <w:tcPr>
+            <w:tcW w:type="dxa" w:w="1337"/>
+            <w:vAlign w:val="center"/>
+            <w:tcMar>
+              <w:top w:w="80" w:type="dxa"/>
+              <w:start w:w="120" w:type="dxa"/>
+              <w:bottom w:w="80" w:type="dxa"/>
+              <w:end w:w="120" w:type="dxa"/>
+            </w:tcMar>
+          </w:tcPr>
+          <w:p>
+            <w:pPr>
+              <w:spacing w:after="0"/>
+              <w:jc w:val="left"/>
+            </w:pPr>
+            <w:r>
+              <w:rPr>
+                <w:rFonts w:ascii="Arial" w:hAnsi="Arial" w:eastAsia="Arial"/>
+                <w:b w:val="0"/>
+                <w:color w:val="111827"/>
+                <w:sz w:val="16"/>
+              </w:rPr>
+              <w:t>публичное описание действительно указывает на oracle/tarot/symbolic guidance</w:t>
+            </w:r>
+          </w:p>
+        </w:tc>
+      </w:tr>
+      <w:tr>
+        <w:tc>
+          <w:tcPr>
+            <w:tcW w:type="dxa" w:w="1337"/>
+            <w:vAlign w:val="center"/>
+            <w:tcMar>
+              <w:top w:w="80" w:type="dxa"/>
+              <w:start w:w="120" w:type="dxa"/>
+              <w:bottom w:w="80" w:type="dxa"/>
+              <w:end w:w="120" w:type="dxa"/>
+            </w:tcMar>
+            <w:shd w:fill="F8FAFC"/>
+          </w:tcPr>
+          <w:p>
+            <w:pPr>
+              <w:spacing w:after="0"/>
+              <w:jc w:val="left"/>
+            </w:pPr>
+            <w:r>
+              <w:rPr>
+                <w:rFonts w:ascii="Arial" w:hAnsi="Arial" w:eastAsia="Arial"/>
+                <w:b w:val="0"/>
+                <w:color w:val="111827"/>
+                <w:sz w:val="16"/>
+              </w:rPr>
+              <w:t>TAX_06</w:t>
+            </w:r>
+          </w:p>
+        </w:tc>
+        <w:tc>
+          <w:tcPr>
+            <w:tcW w:type="dxa" w:w="1337"/>
+            <w:vAlign w:val="center"/>
+            <w:tcMar>
+              <w:top w:w="80" w:type="dxa"/>
+              <w:start w:w="120" w:type="dxa"/>
+              <w:bottom w:w="80" w:type="dxa"/>
+              <w:end w:w="120" w:type="dxa"/>
+            </w:tcMar>
+            <w:shd w:fill="F8FAFC"/>
+          </w:tcPr>
+          <w:p>
+            <w:pPr>
+              <w:spacing w:after="0"/>
+              <w:jc w:val="left"/>
+            </w:pPr>
+            <w:r>
+              <w:rPr>
+                <w:rFonts w:ascii="Arial" w:hAnsi="Arial" w:eastAsia="Arial"/>
+                <w:b w:val="0"/>
+                <w:color w:val="111827"/>
+                <w:sz w:val="16"/>
+              </w:rPr>
+              <w:t>45</w:t>
+            </w:r>
+          </w:p>
+        </w:tc>
+        <w:tc>
+          <w:tcPr>
+            <w:tcW w:type="dxa" w:w="1337"/>
+            <w:vAlign w:val="center"/>
+            <w:tcMar>
+              <w:top w:w="80" w:type="dxa"/>
+              <w:start w:w="120" w:type="dxa"/>
+              <w:bottom w:w="80" w:type="dxa"/>
+              <w:end w:w="120" w:type="dxa"/>
+            </w:tcMar>
+            <w:shd w:fill="F8FAFC"/>
+          </w:tcPr>
+          <w:p>
+            <w:pPr>
+              <w:spacing w:after="0"/>
+              <w:jc w:val="left"/>
+            </w:pPr>
+            <w:r>
+              <w:rPr>
+                <w:rFonts w:ascii="Arial" w:hAnsi="Arial" w:eastAsia="Arial"/>
+                <w:b w:val="0"/>
+                <w:color w:val="111827"/>
+                <w:sz w:val="16"/>
+              </w:rPr>
+              <w:t>Guiding Light Oracle Cards</w:t>
+            </w:r>
+          </w:p>
+        </w:tc>
+        <w:tc>
+          <w:tcPr>
+            <w:tcW w:type="dxa" w:w="1337"/>
+            <w:vAlign w:val="center"/>
+            <w:tcMar>
+              <w:top w:w="80" w:type="dxa"/>
+              <w:start w:w="120" w:type="dxa"/>
+              <w:bottom w:w="80" w:type="dxa"/>
+              <w:end w:w="120" w:type="dxa"/>
+            </w:tcMar>
+            <w:shd w:fill="F8FAFC"/>
+          </w:tcPr>
+          <w:p>
+            <w:pPr>
+              <w:spacing w:after="0"/>
+              <w:jc w:val="left"/>
+            </w:pPr>
+            <w:r>
+              <w:rPr>
+                <w:rFonts w:ascii="Arial" w:hAnsi="Arial" w:eastAsia="Arial"/>
+                <w:b w:val="0"/>
+                <w:color w:val="111827"/>
+                <w:sz w:val="16"/>
+              </w:rPr>
+              <w:t>tarot_or_oracle_guidance</w:t>
+            </w:r>
+          </w:p>
+        </w:tc>
+        <w:tc>
+          <w:tcPr>
+            <w:tcW w:type="dxa" w:w="1337"/>
+            <w:vAlign w:val="center"/>
+            <w:tcMar>
+              <w:top w:w="80" w:type="dxa"/>
+              <w:start w:w="120" w:type="dxa"/>
+              <w:bottom w:w="80" w:type="dxa"/>
+              <w:end w:w="120" w:type="dxa"/>
+            </w:tcMar>
+            <w:shd w:fill="F8FAFC"/>
+          </w:tcPr>
+          <w:p>
+            <w:pPr>
+              <w:spacing w:after="0"/>
+              <w:jc w:val="left"/>
+            </w:pPr>
+            <w:r>
+              <w:rPr>
+                <w:rFonts w:ascii="Arial" w:hAnsi="Arial" w:eastAsia="Arial"/>
+                <w:b w:val="0"/>
+                <w:color w:val="111827"/>
+                <w:sz w:val="16"/>
+              </w:rPr>
+              <w:t>tarot_or_oracle_guidance</w:t>
+            </w:r>
+          </w:p>
+        </w:tc>
+        <w:tc>
+          <w:tcPr>
+            <w:tcW w:type="dxa" w:w="1337"/>
+            <w:vAlign w:val="center"/>
+            <w:tcMar>
+              <w:top w:w="80" w:type="dxa"/>
+              <w:start w:w="120" w:type="dxa"/>
+              <w:bottom w:w="80" w:type="dxa"/>
+              <w:end w:w="120" w:type="dxa"/>
+            </w:tcMar>
+            <w:shd w:fill="F8FAFC"/>
+          </w:tcPr>
+          <w:p>
+            <w:pPr>
+              <w:spacing w:after="0"/>
+              <w:jc w:val="left"/>
+            </w:pPr>
+            <w:r>
+              <w:rPr>
+                <w:rFonts w:ascii="Arial" w:hAnsi="Arial" w:eastAsia="Arial"/>
+                <w:b w:val="0"/>
+                <w:color w:val="111827"/>
+                <w:sz w:val="16"/>
+              </w:rPr>
+              <w:t>confirm_or_manual_read</w:t>
+            </w:r>
+          </w:p>
+        </w:tc>
+        <w:tc>
+          <w:tcPr>
+            <w:tcW w:type="dxa" w:w="1337"/>
+            <w:vAlign w:val="center"/>
+            <w:tcMar>
+              <w:top w:w="80" w:type="dxa"/>
+              <w:start w:w="120" w:type="dxa"/>
+              <w:bottom w:w="80" w:type="dxa"/>
+              <w:end w:w="120" w:type="dxa"/>
+            </w:tcMar>
+            <w:shd w:fill="F8FAFC"/>
+          </w:tcPr>
+          <w:p>
+            <w:pPr>
+              <w:spacing w:after="0"/>
+              <w:jc w:val="left"/>
+            </w:pPr>
+            <w:r>
+              <w:rPr>
+                <w:rFonts w:ascii="Arial" w:hAnsi="Arial" w:eastAsia="Arial"/>
+                <w:b w:val="0"/>
+                <w:color w:val="111827"/>
+                <w:sz w:val="16"/>
+              </w:rPr>
+              <w:t>публичное описание действительно указывает на oracle/tarot/symbolic guidance</w:t>
+            </w:r>
+          </w:p>
+        </w:tc>
+      </w:tr>
+      <w:tr>
+        <w:tc>
+          <w:tcPr>
+            <w:tcW w:type="dxa" w:w="1337"/>
+            <w:vAlign w:val="center"/>
+            <w:tcMar>
+              <w:top w:w="80" w:type="dxa"/>
+              <w:start w:w="120" w:type="dxa"/>
+              <w:bottom w:w="80" w:type="dxa"/>
+              <w:end w:w="120" w:type="dxa"/>
+            </w:tcMar>
+          </w:tcPr>
+          <w:p>
+            <w:pPr>
+              <w:spacing w:after="0"/>
+              <w:jc w:val="left"/>
+            </w:pPr>
+            <w:r>
+              <w:rPr>
+                <w:rFonts w:ascii="Arial" w:hAnsi="Arial" w:eastAsia="Arial"/>
+                <w:b w:val="0"/>
+                <w:color w:val="111827"/>
+                <w:sz w:val="16"/>
+              </w:rPr>
+              <w:t>TAX_07</w:t>
+            </w:r>
+          </w:p>
+        </w:tc>
+        <w:tc>
+          <w:tcPr>
+            <w:tcW w:type="dxa" w:w="1337"/>
+            <w:vAlign w:val="center"/>
+            <w:tcMar>
+              <w:top w:w="80" w:type="dxa"/>
+              <w:start w:w="120" w:type="dxa"/>
+              <w:bottom w:w="80" w:type="dxa"/>
+              <w:end w:w="120" w:type="dxa"/>
+            </w:tcMar>
+          </w:tcPr>
+          <w:p>
+            <w:pPr>
+              <w:spacing w:after="0"/>
+              <w:jc w:val="left"/>
+            </w:pPr>
+            <w:r>
+              <w:rPr>
+                <w:rFonts w:ascii="Arial" w:hAnsi="Arial" w:eastAsia="Arial"/>
+                <w:b w:val="0"/>
+                <w:color w:val="111827"/>
+                <w:sz w:val="16"/>
+              </w:rPr>
+              <w:t>54</w:t>
+            </w:r>
+          </w:p>
+        </w:tc>
+        <w:tc>
+          <w:tcPr>
+            <w:tcW w:type="dxa" w:w="1337"/>
+            <w:vAlign w:val="center"/>
+            <w:tcMar>
+              <w:top w:w="80" w:type="dxa"/>
+              <w:start w:w="120" w:type="dxa"/>
+              <w:bottom w:w="80" w:type="dxa"/>
+              <w:end w:w="120" w:type="dxa"/>
+            </w:tcMar>
+          </w:tcPr>
+          <w:p>
+            <w:pPr>
+              <w:spacing w:after="0"/>
+              <w:jc w:val="left"/>
+            </w:pPr>
+            <w:r>
+              <w:rPr>
+                <w:rFonts w:ascii="Arial" w:hAnsi="Arial" w:eastAsia="Arial"/>
+                <w:b w:val="0"/>
+                <w:color w:val="111827"/>
+                <w:sz w:val="16"/>
+              </w:rPr>
+              <w:t>PALs by Tavus: AI Companions</w:t>
+            </w:r>
+          </w:p>
+        </w:tc>
+        <w:tc>
+          <w:tcPr>
+            <w:tcW w:type="dxa" w:w="1337"/>
+            <w:vAlign w:val="center"/>
+            <w:tcMar>
+              <w:top w:w="80" w:type="dxa"/>
+              <w:start w:w="120" w:type="dxa"/>
+              <w:bottom w:w="80" w:type="dxa"/>
+              <w:end w:w="120" w:type="dxa"/>
+            </w:tcMar>
+          </w:tcPr>
+          <w:p>
+            <w:pPr>
+              <w:spacing w:after="0"/>
+              <w:jc w:val="left"/>
+            </w:pPr>
+            <w:r>
+              <w:rPr>
+                <w:rFonts w:ascii="Arial" w:hAnsi="Arial" w:eastAsia="Arial"/>
+                <w:b w:val="0"/>
+                <w:color w:val="111827"/>
+                <w:sz w:val="16"/>
+              </w:rPr>
+              <w:t>tarot_or_oracle_guidance</w:t>
+            </w:r>
+          </w:p>
+        </w:tc>
+        <w:tc>
+          <w:tcPr>
+            <w:tcW w:type="dxa" w:w="1337"/>
+            <w:vAlign w:val="center"/>
+            <w:tcMar>
+              <w:top w:w="80" w:type="dxa"/>
+              <w:start w:w="120" w:type="dxa"/>
+              <w:bottom w:w="80" w:type="dxa"/>
+              <w:end w:w="120" w:type="dxa"/>
+            </w:tcMar>
+          </w:tcPr>
+          <w:p>
+            <w:pPr>
+              <w:spacing w:after="0"/>
+              <w:jc w:val="left"/>
+            </w:pPr>
+            <w:r>
+              <w:rPr>
+                <w:rFonts w:ascii="Arial" w:hAnsi="Arial" w:eastAsia="Arial"/>
+                <w:b w:val="0"/>
+                <w:color w:val="111827"/>
+                <w:sz w:val="16"/>
+              </w:rPr>
+              <w:t>ai_companion_roleplay</w:t>
+            </w:r>
+          </w:p>
+        </w:tc>
+        <w:tc>
+          <w:tcPr>
+            <w:tcW w:type="dxa" w:w="1337"/>
+            <w:vAlign w:val="center"/>
+            <w:tcMar>
+              <w:top w:w="80" w:type="dxa"/>
+              <w:start w:w="120" w:type="dxa"/>
+              <w:bottom w:w="80" w:type="dxa"/>
+              <w:end w:w="120" w:type="dxa"/>
+            </w:tcMar>
+          </w:tcPr>
+          <w:p>
+            <w:pPr>
+              <w:spacing w:after="0"/>
+              <w:jc w:val="left"/>
+            </w:pPr>
+            <w:r>
+              <w:rPr>
+                <w:rFonts w:ascii="Arial" w:hAnsi="Arial" w:eastAsia="Arial"/>
+                <w:b w:val="0"/>
+                <w:color w:val="111827"/>
+                <w:sz w:val="16"/>
+              </w:rPr>
+              <w:t>suggested_change</w:t>
+            </w:r>
+          </w:p>
+        </w:tc>
+        <w:tc>
+          <w:tcPr>
+            <w:tcW w:type="dxa" w:w="1337"/>
+            <w:vAlign w:val="center"/>
+            <w:tcMar>
+              <w:top w:w="80" w:type="dxa"/>
+              <w:start w:w="120" w:type="dxa"/>
+              <w:bottom w:w="80" w:type="dxa"/>
+              <w:end w:w="120" w:type="dxa"/>
+            </w:tcMar>
+          </w:tcPr>
+          <w:p>
+            <w:pPr>
+              <w:spacing w:after="0"/>
+              <w:jc w:val="left"/>
+            </w:pPr>
+            <w:r>
+              <w:rPr>
+                <w:rFonts w:ascii="Arial" w:hAnsi="Arial" w:eastAsia="Arial"/>
+                <w:b w:val="0"/>
+                <w:color w:val="111827"/>
+                <w:sz w:val="16"/>
+              </w:rPr>
+              <w:t>публичное описание сильнее указывает на AI characters/companions/roleplay, чем на tarot/oracle symbolic guidance</w:t>
+            </w:r>
+          </w:p>
+        </w:tc>
+      </w:tr>
+      <w:tr>
+        <w:tc>
+          <w:tcPr>
+            <w:tcW w:type="dxa" w:w="1337"/>
+            <w:vAlign w:val="center"/>
+            <w:tcMar>
+              <w:top w:w="80" w:type="dxa"/>
+              <w:start w:w="120" w:type="dxa"/>
+              <w:bottom w:w="80" w:type="dxa"/>
+              <w:end w:w="120" w:type="dxa"/>
+            </w:tcMar>
+            <w:shd w:fill="F8FAFC"/>
+          </w:tcPr>
+          <w:p>
+            <w:pPr>
+              <w:spacing w:after="0"/>
+              <w:jc w:val="left"/>
+            </w:pPr>
+            <w:r>
+              <w:rPr>
+                <w:rFonts w:ascii="Arial" w:hAnsi="Arial" w:eastAsia="Arial"/>
+                <w:b w:val="0"/>
+                <w:color w:val="111827"/>
+                <w:sz w:val="16"/>
+              </w:rPr>
+              <w:t>TAX_08</w:t>
+            </w:r>
+          </w:p>
+        </w:tc>
+        <w:tc>
+          <w:tcPr>
+            <w:tcW w:type="dxa" w:w="1337"/>
+            <w:vAlign w:val="center"/>
+            <w:tcMar>
+              <w:top w:w="80" w:type="dxa"/>
+              <w:start w:w="120" w:type="dxa"/>
+              <w:bottom w:w="80" w:type="dxa"/>
+              <w:end w:w="120" w:type="dxa"/>
+            </w:tcMar>
+            <w:shd w:fill="F8FAFC"/>
+          </w:tcPr>
+          <w:p>
+            <w:pPr>
+              <w:spacing w:after="0"/>
+              <w:jc w:val="left"/>
+            </w:pPr>
+            <w:r>
+              <w:rPr>
+                <w:rFonts w:ascii="Arial" w:hAnsi="Arial" w:eastAsia="Arial"/>
+                <w:b w:val="0"/>
+                <w:color w:val="111827"/>
+                <w:sz w:val="16"/>
+              </w:rPr>
+              <w:t>62</w:t>
+            </w:r>
+          </w:p>
+        </w:tc>
+        <w:tc>
+          <w:tcPr>
+            <w:tcW w:type="dxa" w:w="1337"/>
+            <w:vAlign w:val="center"/>
+            <w:tcMar>
+              <w:top w:w="80" w:type="dxa"/>
+              <w:start w:w="120" w:type="dxa"/>
+              <w:bottom w:w="80" w:type="dxa"/>
+              <w:end w:w="120" w:type="dxa"/>
+            </w:tcMar>
+            <w:shd w:fill="F8FAFC"/>
+          </w:tcPr>
+          <w:p>
+            <w:pPr>
+              <w:spacing w:after="0"/>
+              <w:jc w:val="left"/>
+            </w:pPr>
+            <w:r>
+              <w:rPr>
+                <w:rFonts w:ascii="Arial" w:hAnsi="Arial" w:eastAsia="Arial"/>
+                <w:b w:val="0"/>
+                <w:color w:val="111827"/>
+                <w:sz w:val="16"/>
+              </w:rPr>
+              <w:t>Habit Tracker</w:t>
+            </w:r>
+          </w:p>
+        </w:tc>
+        <w:tc>
+          <w:tcPr>
+            <w:tcW w:type="dxa" w:w="1337"/>
+            <w:vAlign w:val="center"/>
+            <w:tcMar>
+              <w:top w:w="80" w:type="dxa"/>
+              <w:start w:w="120" w:type="dxa"/>
+              <w:bottom w:w="80" w:type="dxa"/>
+              <w:end w:w="120" w:type="dxa"/>
+            </w:tcMar>
+            <w:shd w:fill="F8FAFC"/>
+          </w:tcPr>
+          <w:p>
+            <w:pPr>
+              <w:spacing w:after="0"/>
+              <w:jc w:val="left"/>
+            </w:pPr>
+            <w:r>
+              <w:rPr>
+                <w:rFonts w:ascii="Arial" w:hAnsi="Arial" w:eastAsia="Arial"/>
+                <w:b w:val="0"/>
+                <w:color w:val="111827"/>
+                <w:sz w:val="16"/>
+              </w:rPr>
+              <w:t>ai_companion_roleplay</w:t>
+            </w:r>
+          </w:p>
+        </w:tc>
+        <w:tc>
+          <w:tcPr>
+            <w:tcW w:type="dxa" w:w="1337"/>
+            <w:vAlign w:val="center"/>
+            <w:tcMar>
+              <w:top w:w="80" w:type="dxa"/>
+              <w:start w:w="120" w:type="dxa"/>
+              <w:bottom w:w="80" w:type="dxa"/>
+              <w:end w:w="120" w:type="dxa"/>
+            </w:tcMar>
+            <w:shd w:fill="F8FAFC"/>
+          </w:tcPr>
+          <w:p>
+            <w:pPr>
+              <w:spacing w:after="0"/>
+              <w:jc w:val="left"/>
+            </w:pPr>
+            <w:r>
+              <w:rPr>
+                <w:rFonts w:ascii="Arial" w:hAnsi="Arial" w:eastAsia="Arial"/>
+                <w:b w:val="0"/>
+                <w:color w:val="111827"/>
+                <w:sz w:val="16"/>
+              </w:rPr>
+              <w:t>gamified_self_improvement</w:t>
+            </w:r>
+          </w:p>
+        </w:tc>
+        <w:tc>
+          <w:tcPr>
+            <w:tcW w:type="dxa" w:w="1337"/>
+            <w:vAlign w:val="center"/>
+            <w:tcMar>
+              <w:top w:w="80" w:type="dxa"/>
+              <w:start w:w="120" w:type="dxa"/>
+              <w:bottom w:w="80" w:type="dxa"/>
+              <w:end w:w="120" w:type="dxa"/>
+            </w:tcMar>
+            <w:shd w:fill="F8FAFC"/>
+          </w:tcPr>
+          <w:p>
+            <w:pPr>
+              <w:spacing w:after="0"/>
+              <w:jc w:val="left"/>
+            </w:pPr>
+            <w:r>
+              <w:rPr>
+                <w:rFonts w:ascii="Arial" w:hAnsi="Arial" w:eastAsia="Arial"/>
+                <w:b w:val="0"/>
+                <w:color w:val="111827"/>
+                <w:sz w:val="16"/>
+              </w:rPr>
+              <w:t>suggested_change</w:t>
+            </w:r>
+          </w:p>
+        </w:tc>
+        <w:tc>
+          <w:tcPr>
+            <w:tcW w:type="dxa" w:w="1337"/>
+            <w:vAlign w:val="center"/>
+            <w:tcMar>
+              <w:top w:w="80" w:type="dxa"/>
+              <w:start w:w="120" w:type="dxa"/>
+              <w:bottom w:w="80" w:type="dxa"/>
+              <w:end w:w="120" w:type="dxa"/>
+            </w:tcMar>
+            <w:shd w:fill="F8FAFC"/>
+          </w:tcPr>
+          <w:p>
+            <w:pPr>
+              <w:spacing w:after="0"/>
+              <w:jc w:val="left"/>
+            </w:pPr>
+            <w:r>
+              <w:rPr>
+                <w:rFonts w:ascii="Arial" w:hAnsi="Arial" w:eastAsia="Arial"/>
+                <w:b w:val="0"/>
+                <w:color w:val="111827"/>
+                <w:sz w:val="16"/>
+              </w:rPr>
+              <w:t>публичное описание сильнее указывает на habit tracking/routine/planning, чем на AI companion roleplay</w:t>
+            </w:r>
+          </w:p>
+        </w:tc>
+      </w:tr>
+    </w:tbl>
+    <w:p/>
     <w:tbl>
       <w:tblPr>
         <w:tblW w:type="dxa" w:w="9360"/>
@@ -21766,7 +23552,7 @@
                 <w:color w:val="111827"/>
                 <w:sz w:val="16"/>
               </w:rPr>
-              <w:t>raw=67525; dedup=36694; dedup50_status=open; source_refs=239848</w:t>
+              <w:t>raw=67525; dedup=36694; dedup50_status=open; source_refs=239856</w:t>
             </w:r>
           </w:p>
         </w:tc>
@@ -22600,7 +24386,7 @@
                 <w:color w:val="111827"/>
                 <w:sz w:val="16"/>
               </w:rPr>
-              <w:t>manifest=483; missing=0; docs=121; scripts=107</w:t>
+              <w:t>manifest=486; missing=0; docs=122; scripts=108</w:t>
             </w:r>
           </w:p>
         </w:tc>
@@ -23398,7 +25184,7 @@
                 <w:color w:val="111827"/>
                 <w:sz w:val="16"/>
               </w:rPr>
-              <w:t>100 top-candidate rows; 90 primary apps; 12 P0 inspection targets; 12 public listings inspected</w:t>
+              <w:t>100 top-candidate rows; 90 primary apps; 12 P0 inspection targets; 12 public listings inspected; taxonomy_cleanup_rows=8</w:t>
             </w:r>
           </w:p>
         </w:tc>
@@ -23956,7 +25742,7 @@
                 <w:color w:val="111827"/>
                 <w:sz w:val="16"/>
               </w:rPr>
-              <w:t>483 manifest artifacts; missing=0</w:t>
+              <w:t>486 manifest artifacts; missing=0</w:t>
             </w:r>
           </w:p>
         </w:tc>
@@ -24418,6 +26204,15 @@
       </w:pPr>
       <w:r>
         <w:t>data_processed/global_competitor_archetype_rollup.csv</w:t>
+      </w:r>
+    </w:p>
+    <w:p>
+      <w:pPr>
+        <w:pStyle w:val="ListBullet"/>
+        <w:spacing w:after="80"/>
+      </w:pPr>
+      <w:r>
+        <w:t>data_processed/competitor_taxonomy_cleanup_queue.csv</w:t>
       </w:r>
     </w:p>
     <w:p>

</xml_diff>

<commit_message>
Add global report readability audit
</commit_message>
<xml_diff>
--- a/output/docx/alina-global-hypothesis-report-v1.docx
+++ b/output/docx/alina-global-hypothesis-report-v1.docx
@@ -31,7 +31,7 @@
     </w:p>
     <w:p>
       <w:r>
-        <w:t>Собрано: 2026-05-31T16:32:40.274Z</w:t>
+        <w:t>Собрано: 2026-05-31T16:39:27.595Z</w:t>
       </w:r>
     </w:p>
     <w:p>
@@ -64,7 +64,7 @@
     </w:p>
     <w:p>
       <w:r>
-        <w:t>На текущем этапе собрано 67,525 сырьевых source-строк, 36,694 уникализированных строк и 486 локальных артефактов. Эти данные нужны не для того, чтобы объявить продукт доказанным, а для последовательной проверки: существует ли рынок, есть ли деньги, насколько плотна конкуренция, где может быть белое пятно, кто аудитория и какую MVP-петлю надо тестировать.</w:t>
+        <w:t>На текущем этапе собрано 67,525 сырьевых source-строк, 36,694 уникализированных строк и 489 локальных артефактов. Эти данные нужны не для того, чтобы объявить продукт доказанным, а для последовательной проверки: существует ли рынок, есть ли деньги, насколько плотна конкуренция, где может быть белое пятно, кто аудитория и какую MVP-петлю надо тестировать.</w:t>
       </w:r>
     </w:p>
     <w:p>
@@ -23552,7 +23552,7 @@
                 <w:color w:val="111827"/>
                 <w:sz w:val="16"/>
               </w:rPr>
-              <w:t>raw=67525; dedup=36694; dedup50_status=open; source_refs=239856</w:t>
+              <w:t>raw=67525; dedup=36694; dedup50_status=open; source_refs=239857</w:t>
             </w:r>
           </w:p>
         </w:tc>
@@ -24220,7 +24220,7 @@
                 <w:color w:val="111827"/>
                 <w:sz w:val="16"/>
               </w:rPr>
-              <w:t>global report md=yes; pdf=yes; docx=yes</w:t>
+              <w:t>global report md=yes; pdf=yes; docx=yes; readability_audit_rows=7</w:t>
             </w:r>
           </w:p>
         </w:tc>
@@ -24386,7 +24386,7 @@
                 <w:color w:val="111827"/>
                 <w:sz w:val="16"/>
               </w:rPr>
-              <w:t>manifest=486; missing=0; docs=122; scripts=108</w:t>
+              <w:t>manifest=489; missing=0; docs=123; scripts=109</w:t>
             </w:r>
           </w:p>
         </w:tc>
@@ -24622,6 +24622,1160 @@
         <w:t>Главный вывод по этой карте: пакет уже масштабный и трассируемый, но не финально валидированный. Это правильное состояние для evidence-first ресерча: сильные desk/source слои готовы, а product/market claims остаются в hold_validate до ручных walkthrough, интервью, прототипа и WTP.</w:t>
       </w:r>
     </w:p>
+    <w:p>
+      <w:pPr>
+        <w:pStyle w:val="Heading1"/>
+      </w:pPr>
+      <w:r>
+        <w:t>ПРОВЕРКА СКЛАДНОСТИ И ЧИТАЕМОСТИ ОТЧЕТА</w:t>
+      </w:r>
+    </w:p>
+    <w:p>
+      <w:r>
+        <w:t>Отдельно проверено, складно ли текущая версия читается как русский мировой отчет, а не как случайная выгрузка таблиц. Вывод такой: логика гипотез уже держится, счетчики по нишам видны, границы доказательств прописаны, но документ остается плотным рабочим evidence pack. Для внешней версии позже нужен облегченный executive narrative, а тяжелые таблицы лучше вынести в appendix.</w:t>
+      </w:r>
+    </w:p>
+    <w:tbl>
+      <w:tblPr>
+        <w:tblW w:type="dxa" w:w="9360"/>
+        <w:jc w:val="left"/>
+        <w:tblLayout w:type="fixed"/>
+        <w:tblLook w:firstColumn="1" w:firstRow="1" w:lastColumn="0" w:lastRow="0" w:noHBand="0" w:noVBand="1" w:val="04A0"/>
+        <w:tblInd w:w="120" w:type="dxa"/>
+        <w:tblBorders>
+          <w:top w:val="single" w:sz="4" w:space="0" w:color="CBD5E1"/>
+          <w:left w:val="single" w:sz="4" w:space="0" w:color="CBD5E1"/>
+          <w:bottom w:val="single" w:sz="4" w:space="0" w:color="CBD5E1"/>
+          <w:right w:val="single" w:sz="4" w:space="0" w:color="CBD5E1"/>
+          <w:insideH w:val="single" w:sz="4" w:space="0" w:color="CBD5E1"/>
+          <w:insideV w:val="single" w:sz="4" w:space="0" w:color="CBD5E1"/>
+        </w:tblBorders>
+      </w:tblPr>
+      <w:tblGrid>
+        <w:gridCol w:w="1872"/>
+        <w:gridCol w:w="1872"/>
+        <w:gridCol w:w="1872"/>
+        <w:gridCol w:w="1872"/>
+        <w:gridCol w:w="1872"/>
+      </w:tblGrid>
+      <w:tr>
+        <w:tc>
+          <w:tcPr>
+            <w:tcW w:type="dxa" w:w="2376"/>
+            <w:vAlign w:val="center"/>
+            <w:tcMar>
+              <w:top w:w="80" w:type="dxa"/>
+              <w:start w:w="120" w:type="dxa"/>
+              <w:bottom w:w="80" w:type="dxa"/>
+              <w:end w:w="120" w:type="dxa"/>
+            </w:tcMar>
+            <w:shd w:fill="E8EEF5"/>
+          </w:tcPr>
+          <w:p>
+            <w:pPr>
+              <w:spacing w:after="0"/>
+              <w:jc w:val="left"/>
+            </w:pPr>
+            <w:r>
+              <w:rPr>
+                <w:rFonts w:ascii="Arial" w:hAnsi="Arial" w:eastAsia="Arial"/>
+                <w:b/>
+                <w:color w:val="111827"/>
+                <w:sz w:val="16"/>
+              </w:rPr>
+              <w:t>Блок</w:t>
+            </w:r>
+          </w:p>
+        </w:tc>
+        <w:tc>
+          <w:tcPr>
+            <w:tcW w:type="dxa" w:w="1224"/>
+            <w:vAlign w:val="center"/>
+            <w:tcMar>
+              <w:top w:w="80" w:type="dxa"/>
+              <w:start w:w="120" w:type="dxa"/>
+              <w:bottom w:w="80" w:type="dxa"/>
+              <w:end w:w="120" w:type="dxa"/>
+            </w:tcMar>
+            <w:shd w:fill="E8EEF5"/>
+          </w:tcPr>
+          <w:p>
+            <w:pPr>
+              <w:spacing w:after="0"/>
+              <w:jc w:val="left"/>
+            </w:pPr>
+            <w:r>
+              <w:rPr>
+                <w:rFonts w:ascii="Arial" w:hAnsi="Arial" w:eastAsia="Arial"/>
+                <w:b/>
+                <w:color w:val="111827"/>
+                <w:sz w:val="16"/>
+              </w:rPr>
+              <w:t>Чтение</w:t>
+            </w:r>
+          </w:p>
+        </w:tc>
+        <w:tc>
+          <w:tcPr>
+            <w:tcW w:type="dxa" w:w="1224"/>
+            <w:vAlign w:val="center"/>
+            <w:tcMar>
+              <w:top w:w="80" w:type="dxa"/>
+              <w:start w:w="120" w:type="dxa"/>
+              <w:bottom w:w="80" w:type="dxa"/>
+              <w:end w:w="120" w:type="dxa"/>
+            </w:tcMar>
+            <w:shd w:fill="E8EEF5"/>
+          </w:tcPr>
+          <w:p>
+            <w:pPr>
+              <w:spacing w:after="0"/>
+              <w:jc w:val="left"/>
+            </w:pPr>
+            <w:r>
+              <w:rPr>
+                <w:rFonts w:ascii="Arial" w:hAnsi="Arial" w:eastAsia="Arial"/>
+                <w:b/>
+                <w:color w:val="111827"/>
+                <w:sz w:val="16"/>
+              </w:rPr>
+              <w:t>Риск</w:t>
+            </w:r>
+          </w:p>
+        </w:tc>
+        <w:tc>
+          <w:tcPr>
+            <w:tcW w:type="dxa" w:w="1944"/>
+            <w:vAlign w:val="center"/>
+            <w:tcMar>
+              <w:top w:w="80" w:type="dxa"/>
+              <w:start w:w="120" w:type="dxa"/>
+              <w:bottom w:w="80" w:type="dxa"/>
+              <w:end w:w="120" w:type="dxa"/>
+            </w:tcMar>
+            <w:shd w:fill="E8EEF5"/>
+          </w:tcPr>
+          <w:p>
+            <w:pPr>
+              <w:spacing w:after="0"/>
+              <w:jc w:val="left"/>
+            </w:pPr>
+            <w:r>
+              <w:rPr>
+                <w:rFonts w:ascii="Arial" w:hAnsi="Arial" w:eastAsia="Arial"/>
+                <w:b/>
+                <w:color w:val="111827"/>
+                <w:sz w:val="16"/>
+              </w:rPr>
+              <w:t>Что видно</w:t>
+            </w:r>
+          </w:p>
+        </w:tc>
+        <w:tc>
+          <w:tcPr>
+            <w:tcW w:type="dxa" w:w="2592"/>
+            <w:vAlign w:val="center"/>
+            <w:tcMar>
+              <w:top w:w="80" w:type="dxa"/>
+              <w:start w:w="120" w:type="dxa"/>
+              <w:bottom w:w="80" w:type="dxa"/>
+              <w:end w:w="120" w:type="dxa"/>
+            </w:tcMar>
+            <w:shd w:fill="E8EEF5"/>
+          </w:tcPr>
+          <w:p>
+            <w:pPr>
+              <w:spacing w:after="0"/>
+              <w:jc w:val="left"/>
+            </w:pPr>
+            <w:r>
+              <w:rPr>
+                <w:rFonts w:ascii="Arial" w:hAnsi="Arial" w:eastAsia="Arial"/>
+                <w:b/>
+                <w:color w:val="111827"/>
+                <w:sz w:val="16"/>
+              </w:rPr>
+              <w:t>Что делать</w:t>
+            </w:r>
+          </w:p>
+        </w:tc>
+      </w:tr>
+      <w:tr>
+        <w:tc>
+          <w:tcPr>
+            <w:tcW w:type="dxa" w:w="2376"/>
+            <w:vAlign w:val="center"/>
+            <w:tcMar>
+              <w:top w:w="80" w:type="dxa"/>
+              <w:start w:w="120" w:type="dxa"/>
+              <w:bottom w:w="80" w:type="dxa"/>
+              <w:end w:w="120" w:type="dxa"/>
+            </w:tcMar>
+          </w:tcPr>
+          <w:p>
+            <w:pPr>
+              <w:spacing w:after="0"/>
+              <w:jc w:val="left"/>
+            </w:pPr>
+            <w:r>
+              <w:rPr>
+                <w:rFonts w:ascii="Arial" w:hAnsi="Arial" w:eastAsia="Arial"/>
+                <w:b w:val="0"/>
+                <w:color w:val="111827"/>
+                <w:sz w:val="16"/>
+              </w:rPr>
+              <w:t>Порядок повествования</w:t>
+            </w:r>
+          </w:p>
+        </w:tc>
+        <w:tc>
+          <w:tcPr>
+            <w:tcW w:type="dxa" w:w="1224"/>
+            <w:vAlign w:val="center"/>
+            <w:tcMar>
+              <w:top w:w="80" w:type="dxa"/>
+              <w:start w:w="120" w:type="dxa"/>
+              <w:bottom w:w="80" w:type="dxa"/>
+              <w:end w:w="120" w:type="dxa"/>
+            </w:tcMar>
+          </w:tcPr>
+          <w:p>
+            <w:pPr>
+              <w:spacing w:after="0"/>
+              <w:jc w:val="left"/>
+            </w:pPr>
+            <w:r>
+              <w:rPr>
+                <w:rFonts w:ascii="Arial" w:hAnsi="Arial" w:eastAsia="Arial"/>
+                <w:b w:val="0"/>
+                <w:color w:val="111827"/>
+                <w:sz w:val="16"/>
+              </w:rPr>
+              <w:t>складно</w:t>
+            </w:r>
+          </w:p>
+        </w:tc>
+        <w:tc>
+          <w:tcPr>
+            <w:tcW w:type="dxa" w:w="1224"/>
+            <w:vAlign w:val="center"/>
+            <w:tcMar>
+              <w:top w:w="80" w:type="dxa"/>
+              <w:start w:w="120" w:type="dxa"/>
+              <w:bottom w:w="80" w:type="dxa"/>
+              <w:end w:w="120" w:type="dxa"/>
+            </w:tcMar>
+          </w:tcPr>
+          <w:p>
+            <w:pPr>
+              <w:spacing w:after="0"/>
+              <w:jc w:val="left"/>
+            </w:pPr>
+            <w:r>
+              <w:rPr>
+                <w:rFonts w:ascii="Arial" w:hAnsi="Arial" w:eastAsia="Arial"/>
+                <w:b w:val="0"/>
+                <w:color w:val="111827"/>
+                <w:sz w:val="16"/>
+              </w:rPr>
+              <w:t>низкая</w:t>
+            </w:r>
+          </w:p>
+        </w:tc>
+        <w:tc>
+          <w:tcPr>
+            <w:tcW w:type="dxa" w:w="1944"/>
+            <w:vAlign w:val="center"/>
+            <w:tcMar>
+              <w:top w:w="80" w:type="dxa"/>
+              <w:start w:w="120" w:type="dxa"/>
+              <w:bottom w:w="80" w:type="dxa"/>
+              <w:end w:w="120" w:type="dxa"/>
+            </w:tcMar>
+          </w:tcPr>
+          <w:p>
+            <w:pPr>
+              <w:spacing w:after="0"/>
+              <w:jc w:val="left"/>
+            </w:pPr>
+            <w:r>
+              <w:rPr>
+                <w:rFonts w:ascii="Arial" w:hAnsi="Arial" w:eastAsia="Arial"/>
+                <w:b w:val="0"/>
+                <w:color w:val="111827"/>
+                <w:sz w:val="16"/>
+              </w:rPr>
+              <w:t>19 крупных разделов; expected_sequence_breaks=0</w:t>
+            </w:r>
+          </w:p>
+        </w:tc>
+        <w:tc>
+          <w:tcPr>
+            <w:tcW w:type="dxa" w:w="2592"/>
+            <w:vAlign w:val="center"/>
+            <w:tcMar>
+              <w:top w:w="80" w:type="dxa"/>
+              <w:start w:w="120" w:type="dxa"/>
+              <w:bottom w:w="80" w:type="dxa"/>
+              <w:end w:w="120" w:type="dxa"/>
+            </w:tcMar>
+          </w:tcPr>
+          <w:p>
+            <w:pPr>
+              <w:spacing w:after="0"/>
+              <w:jc w:val="left"/>
+            </w:pPr>
+            <w:r>
+              <w:rPr>
+                <w:rFonts w:ascii="Arial" w:hAnsi="Arial" w:eastAsia="Arial"/>
+                <w:b w:val="0"/>
+                <w:color w:val="111827"/>
+                <w:sz w:val="16"/>
+              </w:rPr>
+              <w:t>Сохранять этот порядок при следующих расширениях и не вставлять новые тяжелые таблицы до объясняющего абзаца.</w:t>
+            </w:r>
+          </w:p>
+        </w:tc>
+      </w:tr>
+      <w:tr>
+        <w:tc>
+          <w:tcPr>
+            <w:tcW w:type="dxa" w:w="2376"/>
+            <w:vAlign w:val="center"/>
+            <w:tcMar>
+              <w:top w:w="80" w:type="dxa"/>
+              <w:start w:w="120" w:type="dxa"/>
+              <w:bottom w:w="80" w:type="dxa"/>
+              <w:end w:w="120" w:type="dxa"/>
+            </w:tcMar>
+            <w:shd w:fill="F8FAFC"/>
+          </w:tcPr>
+          <w:p>
+            <w:pPr>
+              <w:spacing w:after="0"/>
+              <w:jc w:val="left"/>
+            </w:pPr>
+            <w:r>
+              <w:rPr>
+                <w:rFonts w:ascii="Arial" w:hAnsi="Arial" w:eastAsia="Arial"/>
+                <w:b w:val="0"/>
+                <w:color w:val="111827"/>
+                <w:sz w:val="16"/>
+              </w:rPr>
+              <w:t>Видимость счетчиков по нишам</w:t>
+            </w:r>
+          </w:p>
+        </w:tc>
+        <w:tc>
+          <w:tcPr>
+            <w:tcW w:type="dxa" w:w="1224"/>
+            <w:vAlign w:val="center"/>
+            <w:tcMar>
+              <w:top w:w="80" w:type="dxa"/>
+              <w:start w:w="120" w:type="dxa"/>
+              <w:bottom w:w="80" w:type="dxa"/>
+              <w:end w:w="120" w:type="dxa"/>
+            </w:tcMar>
+            <w:shd w:fill="F8FAFC"/>
+          </w:tcPr>
+          <w:p>
+            <w:pPr>
+              <w:spacing w:after="0"/>
+              <w:jc w:val="left"/>
+            </w:pPr>
+            <w:r>
+              <w:rPr>
+                <w:rFonts w:ascii="Arial" w:hAnsi="Arial" w:eastAsia="Arial"/>
+                <w:b w:val="0"/>
+                <w:color w:val="111827"/>
+                <w:sz w:val="16"/>
+              </w:rPr>
+              <w:t>складно</w:t>
+            </w:r>
+          </w:p>
+        </w:tc>
+        <w:tc>
+          <w:tcPr>
+            <w:tcW w:type="dxa" w:w="1224"/>
+            <w:vAlign w:val="center"/>
+            <w:tcMar>
+              <w:top w:w="80" w:type="dxa"/>
+              <w:start w:w="120" w:type="dxa"/>
+              <w:bottom w:w="80" w:type="dxa"/>
+              <w:end w:w="120" w:type="dxa"/>
+            </w:tcMar>
+            <w:shd w:fill="F8FAFC"/>
+          </w:tcPr>
+          <w:p>
+            <w:pPr>
+              <w:spacing w:after="0"/>
+              <w:jc w:val="left"/>
+            </w:pPr>
+            <w:r>
+              <w:rPr>
+                <w:rFonts w:ascii="Arial" w:hAnsi="Arial" w:eastAsia="Arial"/>
+                <w:b w:val="0"/>
+                <w:color w:val="111827"/>
+                <w:sz w:val="16"/>
+              </w:rPr>
+              <w:t>средняя</w:t>
+            </w:r>
+          </w:p>
+        </w:tc>
+        <w:tc>
+          <w:tcPr>
+            <w:tcW w:type="dxa" w:w="1944"/>
+            <w:vAlign w:val="center"/>
+            <w:tcMar>
+              <w:top w:w="80" w:type="dxa"/>
+              <w:start w:w="120" w:type="dxa"/>
+              <w:bottom w:w="80" w:type="dxa"/>
+              <w:end w:w="120" w:type="dxa"/>
+            </w:tcMar>
+            <w:shd w:fill="F8FAFC"/>
+          </w:tcPr>
+          <w:p>
+            <w:pPr>
+              <w:spacing w:after="0"/>
+              <w:jc w:val="left"/>
+            </w:pPr>
+            <w:r>
+              <w:rPr>
+                <w:rFonts w:ascii="Arial" w:hAnsi="Arial" w:eastAsia="Arial"/>
+                <w:b w:val="0"/>
+                <w:color w:val="111827"/>
+                <w:sz w:val="16"/>
+              </w:rPr>
+              <w:t>в отчете есть таблицы Direct app/store dedup, Total dedup, Top-100 apps и niche rollup</w:t>
+            </w:r>
+          </w:p>
+        </w:tc>
+        <w:tc>
+          <w:tcPr>
+            <w:tcW w:type="dxa" w:w="2592"/>
+            <w:vAlign w:val="center"/>
+            <w:tcMar>
+              <w:top w:w="80" w:type="dxa"/>
+              <w:start w:w="120" w:type="dxa"/>
+              <w:bottom w:w="80" w:type="dxa"/>
+              <w:end w:w="120" w:type="dxa"/>
+            </w:tcMar>
+            <w:shd w:fill="F8FAFC"/>
+          </w:tcPr>
+          <w:p>
+            <w:pPr>
+              <w:spacing w:after="0"/>
+              <w:jc w:val="left"/>
+            </w:pPr>
+            <w:r>
+              <w:rPr>
+                <w:rFonts w:ascii="Arial" w:hAnsi="Arial" w:eastAsia="Arial"/>
+                <w:b w:val="0"/>
+                <w:color w:val="111827"/>
+                <w:sz w:val="16"/>
+              </w:rPr>
+              <w:t>Оставить счетчики в основном тексте; если добавлять новые источники, обновлять niche rollup до PDF/DOCX.</w:t>
+            </w:r>
+          </w:p>
+        </w:tc>
+      </w:tr>
+      <w:tr>
+        <w:tc>
+          <w:tcPr>
+            <w:tcW w:type="dxa" w:w="2376"/>
+            <w:vAlign w:val="center"/>
+            <w:tcMar>
+              <w:top w:w="80" w:type="dxa"/>
+              <w:start w:w="120" w:type="dxa"/>
+              <w:bottom w:w="80" w:type="dxa"/>
+              <w:end w:w="120" w:type="dxa"/>
+            </w:tcMar>
+          </w:tcPr>
+          <w:p>
+            <w:pPr>
+              <w:spacing w:after="0"/>
+              <w:jc w:val="left"/>
+            </w:pPr>
+            <w:r>
+              <w:rPr>
+                <w:rFonts w:ascii="Arial" w:hAnsi="Arial" w:eastAsia="Arial"/>
+                <w:b w:val="0"/>
+                <w:color w:val="111827"/>
+                <w:sz w:val="16"/>
+              </w:rPr>
+              <w:t>Плотность таблиц</w:t>
+            </w:r>
+          </w:p>
+        </w:tc>
+        <w:tc>
+          <w:tcPr>
+            <w:tcW w:type="dxa" w:w="1224"/>
+            <w:vAlign w:val="center"/>
+            <w:tcMar>
+              <w:top w:w="80" w:type="dxa"/>
+              <w:start w:w="120" w:type="dxa"/>
+              <w:bottom w:w="80" w:type="dxa"/>
+              <w:end w:w="120" w:type="dxa"/>
+            </w:tcMar>
+          </w:tcPr>
+          <w:p>
+            <w:pPr>
+              <w:spacing w:after="0"/>
+              <w:jc w:val="left"/>
+            </w:pPr>
+            <w:r>
+              <w:rPr>
+                <w:rFonts w:ascii="Arial" w:hAnsi="Arial" w:eastAsia="Arial"/>
+                <w:b w:val="0"/>
+                <w:color w:val="111827"/>
+                <w:sz w:val="16"/>
+              </w:rPr>
+              <w:t>перегружено</w:t>
+            </w:r>
+          </w:p>
+        </w:tc>
+        <w:tc>
+          <w:tcPr>
+            <w:tcW w:type="dxa" w:w="1224"/>
+            <w:vAlign w:val="center"/>
+            <w:tcMar>
+              <w:top w:w="80" w:type="dxa"/>
+              <w:start w:w="120" w:type="dxa"/>
+              <w:bottom w:w="80" w:type="dxa"/>
+              <w:end w:w="120" w:type="dxa"/>
+            </w:tcMar>
+          </w:tcPr>
+          <w:p>
+            <w:pPr>
+              <w:spacing w:after="0"/>
+              <w:jc w:val="left"/>
+            </w:pPr>
+            <w:r>
+              <w:rPr>
+                <w:rFonts w:ascii="Arial" w:hAnsi="Arial" w:eastAsia="Arial"/>
+                <w:b w:val="0"/>
+                <w:color w:val="111827"/>
+                <w:sz w:val="16"/>
+              </w:rPr>
+              <w:t>высокая</w:t>
+            </w:r>
+          </w:p>
+        </w:tc>
+        <w:tc>
+          <w:tcPr>
+            <w:tcW w:type="dxa" w:w="1944"/>
+            <w:vAlign w:val="center"/>
+            <w:tcMar>
+              <w:top w:w="80" w:type="dxa"/>
+              <w:start w:w="120" w:type="dxa"/>
+              <w:bottom w:w="80" w:type="dxa"/>
+              <w:end w:w="120" w:type="dxa"/>
+            </w:tcMar>
+          </w:tcPr>
+          <w:p>
+            <w:pPr>
+              <w:spacing w:after="0"/>
+              <w:jc w:val="left"/>
+            </w:pPr>
+            <w:r>
+              <w:rPr>
+                <w:rFonts w:ascii="Arial" w:hAnsi="Arial" w:eastAsia="Arial"/>
+                <w:b w:val="0"/>
+                <w:color w:val="111827"/>
+                <w:sz w:val="16"/>
+              </w:rPr>
+              <w:t>markdown_table_rows=186</w:t>
+            </w:r>
+          </w:p>
+        </w:tc>
+        <w:tc>
+          <w:tcPr>
+            <w:tcW w:type="dxa" w:w="2592"/>
+            <w:vAlign w:val="center"/>
+            <w:tcMar>
+              <w:top w:w="80" w:type="dxa"/>
+              <w:start w:w="120" w:type="dxa"/>
+              <w:bottom w:w="80" w:type="dxa"/>
+              <w:end w:w="120" w:type="dxa"/>
+            </w:tcMar>
+          </w:tcPr>
+          <w:p>
+            <w:pPr>
+              <w:spacing w:after="0"/>
+              <w:jc w:val="left"/>
+            </w:pPr>
+            <w:r>
+              <w:rPr>
+                <w:rFonts w:ascii="Arial" w:hAnsi="Arial" w:eastAsia="Arial"/>
+                <w:b w:val="0"/>
+                <w:color w:val="111827"/>
+                <w:sz w:val="16"/>
+              </w:rPr>
+              <w:t>В следующей итерации сделать два режима: executive narrative в основном PDF и heavy appendix для широких таблиц, сохранив текущий полный отчет как evidence pack.</w:t>
+            </w:r>
+          </w:p>
+        </w:tc>
+      </w:tr>
+      <w:tr>
+        <w:tc>
+          <w:tcPr>
+            <w:tcW w:type="dxa" w:w="2376"/>
+            <w:vAlign w:val="center"/>
+            <w:tcMar>
+              <w:top w:w="80" w:type="dxa"/>
+              <w:start w:w="120" w:type="dxa"/>
+              <w:bottom w:w="80" w:type="dxa"/>
+              <w:end w:w="120" w:type="dxa"/>
+            </w:tcMar>
+            <w:shd w:fill="F8FAFC"/>
+          </w:tcPr>
+          <w:p>
+            <w:pPr>
+              <w:spacing w:after="0"/>
+              <w:jc w:val="left"/>
+            </w:pPr>
+            <w:r>
+              <w:rPr>
+                <w:rFonts w:ascii="Arial" w:hAnsi="Arial" w:eastAsia="Arial"/>
+                <w:b w:val="0"/>
+                <w:color w:val="111827"/>
+                <w:sz w:val="16"/>
+              </w:rPr>
+              <w:t>Логичность competitor map</w:t>
+            </w:r>
+          </w:p>
+        </w:tc>
+        <w:tc>
+          <w:tcPr>
+            <w:tcW w:type="dxa" w:w="1224"/>
+            <w:vAlign w:val="center"/>
+            <w:tcMar>
+              <w:top w:w="80" w:type="dxa"/>
+              <w:start w:w="120" w:type="dxa"/>
+              <w:bottom w:w="80" w:type="dxa"/>
+              <w:end w:w="120" w:type="dxa"/>
+            </w:tcMar>
+            <w:shd w:fill="F8FAFC"/>
+          </w:tcPr>
+          <w:p>
+            <w:pPr>
+              <w:spacing w:after="0"/>
+              <w:jc w:val="left"/>
+            </w:pPr>
+            <w:r>
+              <w:rPr>
+                <w:rFonts w:ascii="Arial" w:hAnsi="Arial" w:eastAsia="Arial"/>
+                <w:b w:val="0"/>
+                <w:color w:val="111827"/>
+                <w:sz w:val="16"/>
+              </w:rPr>
+              <w:t>складно с оговоркой</w:t>
+            </w:r>
+          </w:p>
+        </w:tc>
+        <w:tc>
+          <w:tcPr>
+            <w:tcW w:type="dxa" w:w="1224"/>
+            <w:vAlign w:val="center"/>
+            <w:tcMar>
+              <w:top w:w="80" w:type="dxa"/>
+              <w:start w:w="120" w:type="dxa"/>
+              <w:bottom w:w="80" w:type="dxa"/>
+              <w:end w:w="120" w:type="dxa"/>
+            </w:tcMar>
+            <w:shd w:fill="F8FAFC"/>
+          </w:tcPr>
+          <w:p>
+            <w:pPr>
+              <w:spacing w:after="0"/>
+              <w:jc w:val="left"/>
+            </w:pPr>
+            <w:r>
+              <w:rPr>
+                <w:rFonts w:ascii="Arial" w:hAnsi="Arial" w:eastAsia="Arial"/>
+                <w:b w:val="0"/>
+                <w:color w:val="111827"/>
+                <w:sz w:val="16"/>
+              </w:rPr>
+              <w:t>средняя</w:t>
+            </w:r>
+          </w:p>
+        </w:tc>
+        <w:tc>
+          <w:tcPr>
+            <w:tcW w:type="dxa" w:w="1944"/>
+            <w:vAlign w:val="center"/>
+            <w:tcMar>
+              <w:top w:w="80" w:type="dxa"/>
+              <w:start w:w="120" w:type="dxa"/>
+              <w:bottom w:w="80" w:type="dxa"/>
+              <w:end w:w="120" w:type="dxa"/>
+            </w:tcMar>
+            <w:shd w:fill="F8FAFC"/>
+          </w:tcPr>
+          <w:p>
+            <w:pPr>
+              <w:spacing w:after="0"/>
+              <w:jc w:val="left"/>
+            </w:pPr>
+            <w:r>
+              <w:rPr>
+                <w:rFonts w:ascii="Arial" w:hAnsi="Arial" w:eastAsia="Arial"/>
+                <w:b w:val="0"/>
+                <w:color w:val="111827"/>
+                <w:sz w:val="16"/>
+              </w:rPr>
+              <w:t>competitor archetype rollup дополнен cleanup queue и прямой оговоркой queued_not_applied</w:t>
+            </w:r>
+          </w:p>
+        </w:tc>
+        <w:tc>
+          <w:tcPr>
+            <w:tcW w:type="dxa" w:w="2592"/>
+            <w:vAlign w:val="center"/>
+            <w:tcMar>
+              <w:top w:w="80" w:type="dxa"/>
+              <w:start w:w="120" w:type="dxa"/>
+              <w:bottom w:w="80" w:type="dxa"/>
+              <w:end w:w="120" w:type="dxa"/>
+            </w:tcMar>
+            <w:shd w:fill="F8FAFC"/>
+          </w:tcPr>
+          <w:p>
+            <w:pPr>
+              <w:spacing w:after="0"/>
+              <w:jc w:val="left"/>
+            </w:pPr>
+            <w:r>
+              <w:rPr>
+                <w:rFonts w:ascii="Arial" w:hAnsi="Arial" w:eastAsia="Arial"/>
+                <w:b w:val="0"/>
+                <w:color w:val="111827"/>
+                <w:sz w:val="16"/>
+              </w:rPr>
+              <w:t>После ручного taxonomy pass обновить top100 scorecard или оставить queue как documented limitation, если правки не подтверждены.</w:t>
+            </w:r>
+          </w:p>
+        </w:tc>
+      </w:tr>
+      <w:tr>
+        <w:tc>
+          <w:tcPr>
+            <w:tcW w:type="dxa" w:w="2376"/>
+            <w:vAlign w:val="center"/>
+            <w:tcMar>
+              <w:top w:w="80" w:type="dxa"/>
+              <w:start w:w="120" w:type="dxa"/>
+              <w:bottom w:w="80" w:type="dxa"/>
+              <w:end w:w="120" w:type="dxa"/>
+            </w:tcMar>
+          </w:tcPr>
+          <w:p>
+            <w:pPr>
+              <w:spacing w:after="0"/>
+              <w:jc w:val="left"/>
+            </w:pPr>
+            <w:r>
+              <w:rPr>
+                <w:rFonts w:ascii="Arial" w:hAnsi="Arial" w:eastAsia="Arial"/>
+                <w:b w:val="0"/>
+                <w:color w:val="111827"/>
+                <w:sz w:val="16"/>
+              </w:rPr>
+              <w:t>Русский текст и технические EN-термины</w:t>
+            </w:r>
+          </w:p>
+        </w:tc>
+        <w:tc>
+          <w:tcPr>
+            <w:tcW w:type="dxa" w:w="1224"/>
+            <w:vAlign w:val="center"/>
+            <w:tcMar>
+              <w:top w:w="80" w:type="dxa"/>
+              <w:start w:w="120" w:type="dxa"/>
+              <w:bottom w:w="80" w:type="dxa"/>
+              <w:end w:w="120" w:type="dxa"/>
+            </w:tcMar>
+          </w:tcPr>
+          <w:p>
+            <w:pPr>
+              <w:spacing w:after="0"/>
+              <w:jc w:val="left"/>
+            </w:pPr>
+            <w:r>
+              <w:rPr>
+                <w:rFonts w:ascii="Arial" w:hAnsi="Arial" w:eastAsia="Arial"/>
+                <w:b w:val="0"/>
+                <w:color w:val="111827"/>
+                <w:sz w:val="16"/>
+              </w:rPr>
+              <w:t>понятно, но много терминов</w:t>
+            </w:r>
+          </w:p>
+        </w:tc>
+        <w:tc>
+          <w:tcPr>
+            <w:tcW w:type="dxa" w:w="1224"/>
+            <w:vAlign w:val="center"/>
+            <w:tcMar>
+              <w:top w:w="80" w:type="dxa"/>
+              <w:start w:w="120" w:type="dxa"/>
+              <w:bottom w:w="80" w:type="dxa"/>
+              <w:end w:w="120" w:type="dxa"/>
+            </w:tcMar>
+          </w:tcPr>
+          <w:p>
+            <w:pPr>
+              <w:spacing w:after="0"/>
+              <w:jc w:val="left"/>
+            </w:pPr>
+            <w:r>
+              <w:rPr>
+                <w:rFonts w:ascii="Arial" w:hAnsi="Arial" w:eastAsia="Arial"/>
+                <w:b w:val="0"/>
+                <w:color w:val="111827"/>
+                <w:sz w:val="16"/>
+              </w:rPr>
+              <w:t>средняя</w:t>
+            </w:r>
+          </w:p>
+        </w:tc>
+        <w:tc>
+          <w:tcPr>
+            <w:tcW w:type="dxa" w:w="1944"/>
+            <w:vAlign w:val="center"/>
+            <w:tcMar>
+              <w:top w:w="80" w:type="dxa"/>
+              <w:start w:w="120" w:type="dxa"/>
+              <w:bottom w:w="80" w:type="dxa"/>
+              <w:end w:w="120" w:type="dxa"/>
+            </w:tcMar>
+          </w:tcPr>
+          <w:p>
+            <w:pPr>
+              <w:spacing w:after="0"/>
+              <w:jc w:val="left"/>
+            </w:pPr>
+            <w:r>
+              <w:rPr>
+                <w:rFonts w:ascii="Arial" w:hAnsi="Arial" w:eastAsia="Arial"/>
+                <w:b w:val="0"/>
+                <w:color w:val="111827"/>
+                <w:sz w:val="16"/>
+              </w:rPr>
+              <w:t>technical_english_hits=309</w:t>
+            </w:r>
+          </w:p>
+        </w:tc>
+        <w:tc>
+          <w:tcPr>
+            <w:tcW w:type="dxa" w:w="2592"/>
+            <w:vAlign w:val="center"/>
+            <w:tcMar>
+              <w:top w:w="80" w:type="dxa"/>
+              <w:start w:w="120" w:type="dxa"/>
+              <w:bottom w:w="80" w:type="dxa"/>
+              <w:end w:w="120" w:type="dxa"/>
+            </w:tcMar>
+          </w:tcPr>
+          <w:p>
+            <w:pPr>
+              <w:spacing w:after="0"/>
+              <w:jc w:val="left"/>
+            </w:pPr>
+            <w:r>
+              <w:rPr>
+                <w:rFonts w:ascii="Arial" w:hAnsi="Arial" w:eastAsia="Arial"/>
+                <w:b w:val="0"/>
+                <w:color w:val="111827"/>
+                <w:sz w:val="16"/>
+              </w:rPr>
+              <w:t>Для внешней версии сделать отдельный glossary или заменить часть table headers на русские подписи; для рабочей версии оставить EN labels там, где они являются ID/полями данных.</w:t>
+            </w:r>
+          </w:p>
+        </w:tc>
+      </w:tr>
+      <w:tr>
+        <w:tc>
+          <w:tcPr>
+            <w:tcW w:type="dxa" w:w="2376"/>
+            <w:vAlign w:val="center"/>
+            <w:tcMar>
+              <w:top w:w="80" w:type="dxa"/>
+              <w:start w:w="120" w:type="dxa"/>
+              <w:bottom w:w="80" w:type="dxa"/>
+              <w:end w:w="120" w:type="dxa"/>
+            </w:tcMar>
+            <w:shd w:fill="F8FAFC"/>
+          </w:tcPr>
+          <w:p>
+            <w:pPr>
+              <w:spacing w:after="0"/>
+              <w:jc w:val="left"/>
+            </w:pPr>
+            <w:r>
+              <w:rPr>
+                <w:rFonts w:ascii="Arial" w:hAnsi="Arial" w:eastAsia="Arial"/>
+                <w:b w:val="0"/>
+                <w:color w:val="111827"/>
+                <w:sz w:val="16"/>
+              </w:rPr>
+              <w:t>Границы доказательств</w:t>
+            </w:r>
+          </w:p>
+        </w:tc>
+        <w:tc>
+          <w:tcPr>
+            <w:tcW w:type="dxa" w:w="1224"/>
+            <w:vAlign w:val="center"/>
+            <w:tcMar>
+              <w:top w:w="80" w:type="dxa"/>
+              <w:start w:w="120" w:type="dxa"/>
+              <w:bottom w:w="80" w:type="dxa"/>
+              <w:end w:w="120" w:type="dxa"/>
+            </w:tcMar>
+            <w:shd w:fill="F8FAFC"/>
+          </w:tcPr>
+          <w:p>
+            <w:pPr>
+              <w:spacing w:after="0"/>
+              <w:jc w:val="left"/>
+            </w:pPr>
+            <w:r>
+              <w:rPr>
+                <w:rFonts w:ascii="Arial" w:hAnsi="Arial" w:eastAsia="Arial"/>
+                <w:b w:val="0"/>
+                <w:color w:val="111827"/>
+                <w:sz w:val="16"/>
+              </w:rPr>
+              <w:t>складно</w:t>
+            </w:r>
+          </w:p>
+        </w:tc>
+        <w:tc>
+          <w:tcPr>
+            <w:tcW w:type="dxa" w:w="1224"/>
+            <w:vAlign w:val="center"/>
+            <w:tcMar>
+              <w:top w:w="80" w:type="dxa"/>
+              <w:start w:w="120" w:type="dxa"/>
+              <w:bottom w:w="80" w:type="dxa"/>
+              <w:end w:w="120" w:type="dxa"/>
+            </w:tcMar>
+            <w:shd w:fill="F8FAFC"/>
+          </w:tcPr>
+          <w:p>
+            <w:pPr>
+              <w:spacing w:after="0"/>
+              <w:jc w:val="left"/>
+            </w:pPr>
+            <w:r>
+              <w:rPr>
+                <w:rFonts w:ascii="Arial" w:hAnsi="Arial" w:eastAsia="Arial"/>
+                <w:b w:val="0"/>
+                <w:color w:val="111827"/>
+                <w:sz w:val="16"/>
+              </w:rPr>
+              <w:t>низкая</w:t>
+            </w:r>
+          </w:p>
+        </w:tc>
+        <w:tc>
+          <w:tcPr>
+            <w:tcW w:type="dxa" w:w="1944"/>
+            <w:vAlign w:val="center"/>
+            <w:tcMar>
+              <w:top w:w="80" w:type="dxa"/>
+              <w:start w:w="120" w:type="dxa"/>
+              <w:bottom w:w="80" w:type="dxa"/>
+              <w:end w:w="120" w:type="dxa"/>
+            </w:tcMar>
+            <w:shd w:fill="F8FAFC"/>
+          </w:tcPr>
+          <w:p>
+            <w:pPr>
+              <w:spacing w:after="0"/>
+              <w:jc w:val="left"/>
+            </w:pPr>
+            <w:r>
+              <w:rPr>
+                <w:rFonts w:ascii="Arial" w:hAnsi="Arial" w:eastAsia="Arial"/>
+                <w:b w:val="0"/>
+                <w:color w:val="111827"/>
+                <w:sz w:val="16"/>
+              </w:rPr>
+              <w:t>в тексте повторяются hold_validate, not final proof, source boundaries и запрет на claim upgrade без observed evidence</w:t>
+            </w:r>
+          </w:p>
+        </w:tc>
+        <w:tc>
+          <w:tcPr>
+            <w:tcW w:type="dxa" w:w="2592"/>
+            <w:vAlign w:val="center"/>
+            <w:tcMar>
+              <w:top w:w="80" w:type="dxa"/>
+              <w:start w:w="120" w:type="dxa"/>
+              <w:bottom w:w="80" w:type="dxa"/>
+              <w:end w:w="120" w:type="dxa"/>
+            </w:tcMar>
+            <w:shd w:fill="F8FAFC"/>
+          </w:tcPr>
+          <w:p>
+            <w:pPr>
+              <w:spacing w:after="0"/>
+              <w:jc w:val="left"/>
+            </w:pPr>
+            <w:r>
+              <w:rPr>
+                <w:rFonts w:ascii="Arial" w:hAnsi="Arial" w:eastAsia="Arial"/>
+                <w:b w:val="0"/>
+                <w:color w:val="111827"/>
+                <w:sz w:val="16"/>
+              </w:rPr>
+              <w:t>Не убирать эти границы ради красоты; лучше вынести краткий executive summary поверх них, если нужен более легкий PDF.</w:t>
+            </w:r>
+          </w:p>
+        </w:tc>
+      </w:tr>
+      <w:tr>
+        <w:tc>
+          <w:tcPr>
+            <w:tcW w:type="dxa" w:w="2376"/>
+            <w:vAlign w:val="center"/>
+            <w:tcMar>
+              <w:top w:w="80" w:type="dxa"/>
+              <w:start w:w="120" w:type="dxa"/>
+              <w:bottom w:w="80" w:type="dxa"/>
+              <w:end w:w="120" w:type="dxa"/>
+            </w:tcMar>
+          </w:tcPr>
+          <w:p>
+            <w:pPr>
+              <w:spacing w:after="0"/>
+              <w:jc w:val="left"/>
+            </w:pPr>
+            <w:r>
+              <w:rPr>
+                <w:rFonts w:ascii="Arial" w:hAnsi="Arial" w:eastAsia="Arial"/>
+                <w:b w:val="0"/>
+                <w:color w:val="111827"/>
+                <w:sz w:val="16"/>
+              </w:rPr>
+              <w:t>Ясность следующего шага</w:t>
+            </w:r>
+          </w:p>
+        </w:tc>
+        <w:tc>
+          <w:tcPr>
+            <w:tcW w:type="dxa" w:w="1224"/>
+            <w:vAlign w:val="center"/>
+            <w:tcMar>
+              <w:top w:w="80" w:type="dxa"/>
+              <w:start w:w="120" w:type="dxa"/>
+              <w:bottom w:w="80" w:type="dxa"/>
+              <w:end w:w="120" w:type="dxa"/>
+            </w:tcMar>
+          </w:tcPr>
+          <w:p>
+            <w:pPr>
+              <w:spacing w:after="0"/>
+              <w:jc w:val="left"/>
+            </w:pPr>
+            <w:r>
+              <w:rPr>
+                <w:rFonts w:ascii="Arial" w:hAnsi="Arial" w:eastAsia="Arial"/>
+                <w:b w:val="0"/>
+                <w:color w:val="111827"/>
+                <w:sz w:val="16"/>
+              </w:rPr>
+              <w:t>складно</w:t>
+            </w:r>
+          </w:p>
+        </w:tc>
+        <w:tc>
+          <w:tcPr>
+            <w:tcW w:type="dxa" w:w="1224"/>
+            <w:vAlign w:val="center"/>
+            <w:tcMar>
+              <w:top w:w="80" w:type="dxa"/>
+              <w:start w:w="120" w:type="dxa"/>
+              <w:bottom w:w="80" w:type="dxa"/>
+              <w:end w:w="120" w:type="dxa"/>
+            </w:tcMar>
+          </w:tcPr>
+          <w:p>
+            <w:pPr>
+              <w:spacing w:after="0"/>
+              <w:jc w:val="left"/>
+            </w:pPr>
+            <w:r>
+              <w:rPr>
+                <w:rFonts w:ascii="Arial" w:hAnsi="Arial" w:eastAsia="Arial"/>
+                <w:b w:val="0"/>
+                <w:color w:val="111827"/>
+                <w:sz w:val="16"/>
+              </w:rPr>
+              <w:t>низкая</w:t>
+            </w:r>
+          </w:p>
+        </w:tc>
+        <w:tc>
+          <w:tcPr>
+            <w:tcW w:type="dxa" w:w="1944"/>
+            <w:vAlign w:val="center"/>
+            <w:tcMar>
+              <w:top w:w="80" w:type="dxa"/>
+              <w:start w:w="120" w:type="dxa"/>
+              <w:bottom w:w="80" w:type="dxa"/>
+              <w:end w:w="120" w:type="dxa"/>
+            </w:tcMar>
+          </w:tcPr>
+          <w:p>
+            <w:pPr>
+              <w:spacing w:after="0"/>
+              <w:jc w:val="left"/>
+            </w:pPr>
+            <w:r>
+              <w:rPr>
+                <w:rFonts w:ascii="Arial" w:hAnsi="Arial" w:eastAsia="Arial"/>
+                <w:b w:val="0"/>
+                <w:color w:val="111827"/>
+                <w:sz w:val="16"/>
+              </w:rPr>
+              <w:t>есть P0 очередь: competitor walkthrough -&gt; paid-flow -&gt; ICP interview -&gt; prototype session</w:t>
+            </w:r>
+          </w:p>
+        </w:tc>
+        <w:tc>
+          <w:tcPr>
+            <w:tcW w:type="dxa" w:w="2592"/>
+            <w:vAlign w:val="center"/>
+            <w:tcMar>
+              <w:top w:w="80" w:type="dxa"/>
+              <w:start w:w="120" w:type="dxa"/>
+              <w:bottom w:w="80" w:type="dxa"/>
+              <w:end w:w="120" w:type="dxa"/>
+            </w:tcMar>
+          </w:tcPr>
+          <w:p>
+            <w:pPr>
+              <w:spacing w:after="0"/>
+              <w:jc w:val="left"/>
+            </w:pPr>
+            <w:r>
+              <w:rPr>
+                <w:rFonts w:ascii="Arial" w:hAnsi="Arial" w:eastAsia="Arial"/>
+                <w:b w:val="0"/>
+                <w:color w:val="111827"/>
+                <w:sz w:val="16"/>
+              </w:rPr>
+              <w:t>Следующим рабочим ходом закрывать первые P0 walkthrough и paid-flow tasks, а не расширять desk research бесконечно.</w:t>
+            </w:r>
+          </w:p>
+        </w:tc>
+      </w:tr>
+    </w:tbl>
+    <w:p/>
     <w:p>
       <w:pPr>
         <w:pStyle w:val="Heading1"/>
@@ -25742,7 +26896,7 @@
                 <w:color w:val="111827"/>
                 <w:sz w:val="16"/>
               </w:rPr>
-              <w:t>486 manifest artifacts; missing=0</w:t>
+              <w:t>489 manifest artifacts; missing=0</w:t>
             </w:r>
           </w:p>
         </w:tc>
@@ -26049,6 +27203,148 @@
                 <w:sz w:val="16"/>
               </w:rPr>
               <w:t>Niche count rollup показывает масштаб source discovery по рынкам; он не доказывает спрос, WTP или отсутствие скрытого full-loop конкурента.</w:t>
+            </w:r>
+          </w:p>
+        </w:tc>
+      </w:tr>
+      <w:tr>
+        <w:tc>
+          <w:tcPr>
+            <w:tcW w:type="dxa" w:w="2376"/>
+            <w:vAlign w:val="center"/>
+            <w:tcMar>
+              <w:top w:w="80" w:type="dxa"/>
+              <w:start w:w="120" w:type="dxa"/>
+              <w:bottom w:w="80" w:type="dxa"/>
+              <w:end w:w="120" w:type="dxa"/>
+            </w:tcMar>
+            <w:shd w:fill="F8FAFC"/>
+          </w:tcPr>
+          <w:p>
+            <w:pPr>
+              <w:spacing w:after="0"/>
+              <w:jc w:val="left"/>
+            </w:pPr>
+            <w:r>
+              <w:rPr>
+                <w:rFonts w:ascii="Arial" w:hAnsi="Arial" w:eastAsia="Arial"/>
+                <w:b w:val="0"/>
+                <w:color w:val="111827"/>
+                <w:sz w:val="16"/>
+              </w:rPr>
+              <w:t>SRC_10_REPORT_READABILITY</w:t>
+            </w:r>
+          </w:p>
+        </w:tc>
+        <w:tc>
+          <w:tcPr>
+            <w:tcW w:type="dxa" w:w="1224"/>
+            <w:vAlign w:val="center"/>
+            <w:tcMar>
+              <w:top w:w="80" w:type="dxa"/>
+              <w:start w:w="120" w:type="dxa"/>
+              <w:bottom w:w="80" w:type="dxa"/>
+              <w:end w:w="120" w:type="dxa"/>
+            </w:tcMar>
+            <w:shd w:fill="F8FAFC"/>
+          </w:tcPr>
+          <w:p>
+            <w:pPr>
+              <w:spacing w:after="0"/>
+              <w:jc w:val="left"/>
+            </w:pPr>
+            <w:r>
+              <w:rPr>
+                <w:rFonts w:ascii="Arial" w:hAnsi="Arial" w:eastAsia="Arial"/>
+                <w:b w:val="0"/>
+                <w:color w:val="111827"/>
+                <w:sz w:val="16"/>
+              </w:rPr>
+              <w:t>Проверка складности и читаемости отчета</w:t>
+            </w:r>
+          </w:p>
+        </w:tc>
+        <w:tc>
+          <w:tcPr>
+            <w:tcW w:type="dxa" w:w="1224"/>
+            <w:vAlign w:val="center"/>
+            <w:tcMar>
+              <w:top w:w="80" w:type="dxa"/>
+              <w:start w:w="120" w:type="dxa"/>
+              <w:bottom w:w="80" w:type="dxa"/>
+              <w:end w:w="120" w:type="dxa"/>
+            </w:tcMar>
+            <w:shd w:fill="F8FAFC"/>
+          </w:tcPr>
+          <w:p>
+            <w:pPr>
+              <w:spacing w:after="0"/>
+              <w:jc w:val="left"/>
+            </w:pPr>
+            <w:r>
+              <w:rPr>
+                <w:rFonts w:ascii="Arial" w:hAnsi="Arial" w:eastAsia="Arial"/>
+                <w:b w:val="0"/>
+                <w:color w:val="111827"/>
+                <w:sz w:val="16"/>
+              </w:rPr>
+              <w:t>проверено редакционным аудитом, не market proof</w:t>
+            </w:r>
+          </w:p>
+        </w:tc>
+        <w:tc>
+          <w:tcPr>
+            <w:tcW w:type="dxa" w:w="1944"/>
+            <w:vAlign w:val="center"/>
+            <w:tcMar>
+              <w:top w:w="80" w:type="dxa"/>
+              <w:start w:w="120" w:type="dxa"/>
+              <w:bottom w:w="80" w:type="dxa"/>
+              <w:end w:w="120" w:type="dxa"/>
+            </w:tcMar>
+            <w:shd w:fill="F8FAFC"/>
+          </w:tcPr>
+          <w:p>
+            <w:pPr>
+              <w:spacing w:after="0"/>
+              <w:jc w:val="left"/>
+            </w:pPr>
+            <w:r>
+              <w:rPr>
+                <w:rFonts w:ascii="Arial" w:hAnsi="Arial" w:eastAsia="Arial"/>
+                <w:b w:val="0"/>
+                <w:color w:val="111827"/>
+                <w:sz w:val="16"/>
+              </w:rPr>
+              <w:t>7 readability audit rows</w:t>
+            </w:r>
+          </w:p>
+        </w:tc>
+        <w:tc>
+          <w:tcPr>
+            <w:tcW w:type="dxa" w:w="2592"/>
+            <w:vAlign w:val="center"/>
+            <w:tcMar>
+              <w:top w:w="80" w:type="dxa"/>
+              <w:start w:w="120" w:type="dxa"/>
+              <w:bottom w:w="80" w:type="dxa"/>
+              <w:end w:w="120" w:type="dxa"/>
+            </w:tcMar>
+            <w:shd w:fill="F8FAFC"/>
+          </w:tcPr>
+          <w:p>
+            <w:pPr>
+              <w:spacing w:after="0"/>
+              <w:jc w:val="left"/>
+            </w:pPr>
+            <w:r>
+              <w:rPr>
+                <w:rFonts w:ascii="Arial" w:hAnsi="Arial" w:eastAsia="Arial"/>
+                <w:b w:val="0"/>
+                <w:color w:val="111827"/>
+                <w:sz w:val="16"/>
+              </w:rPr>
+              <w:t>Readability audit оценивает форму и ясность текста; он не доказывает рыночные или продуктовые claims.</w:t>
             </w:r>
           </w:p>
         </w:tc>
@@ -26168,6 +27464,15 @@
       </w:pPr>
       <w:r>
         <w:t>data_processed/global_next_validation_backlog.csv</w:t>
+      </w:r>
+    </w:p>
+    <w:p>
+      <w:pPr>
+        <w:pStyle w:val="ListBullet"/>
+        <w:spacing w:after="80"/>
+      </w:pPr>
+      <w:r>
+        <w:t>data_processed/global_report_readability_audit.csv</w:t>
       </w:r>
     </w:p>
     <w:p>

</xml_diff>

<commit_message>
Add global executive narrative report
</commit_message>
<xml_diff>
--- a/output/docx/alina-global-hypothesis-report-v1.docx
+++ b/output/docx/alina-global-hypothesis-report-v1.docx
@@ -31,7 +31,7 @@
     </w:p>
     <w:p>
       <w:r>
-        <w:t>Собрано: 2026-05-31T16:39:27.595Z</w:t>
+        <w:t>Собрано: 2026-05-31T16:46:55.496Z</w:t>
       </w:r>
     </w:p>
     <w:p>
@@ -64,7 +64,7 @@
     </w:p>
     <w:p>
       <w:r>
-        <w:t>На текущем этапе собрано 67,525 сырьевых source-строк, 36,694 уникализированных строк и 489 локальных артефактов. Эти данные нужны не для того, чтобы объявить продукт доказанным, а для последовательной проверки: существует ли рынок, есть ли деньги, насколько плотна конкуренция, где может быть белое пятно, кто аудитория и какую MVP-петлю надо тестировать.</w:t>
+        <w:t>На текущем этапе собрано 67,525 сырьевых source-строк, 36,694 уникализированных строк и 492 локальных артефактов. Эти данные нужны не для того, чтобы объявить продукт доказанным, а для последовательной проверки: существует ли рынок, есть ли деньги, насколько плотна конкуренция, где может быть белое пятно, кто аудитория и какую MVP-петлю надо тестировать.</w:t>
       </w:r>
     </w:p>
     <w:p>
@@ -24220,7 +24220,7 @@
                 <w:color w:val="111827"/>
                 <w:sz w:val="16"/>
               </w:rPr>
-              <w:t>global report md=yes; pdf=yes; docx=yes; readability_audit_rows=7</w:t>
+              <w:t>global report md=yes; pdf=yes; docx=yes; executive_md=yes; executive_pdf=yes; readability_audit_rows=7</w:t>
             </w:r>
           </w:p>
         </w:tc>
@@ -24386,7 +24386,7 @@
                 <w:color w:val="111827"/>
                 <w:sz w:val="16"/>
               </w:rPr>
-              <w:t>manifest=489; missing=0; docs=123; scripts=109</w:t>
+              <w:t>manifest=492; missing=0; docs=123; scripts=110</w:t>
             </w:r>
           </w:p>
         </w:tc>
@@ -24633,6 +24633,11 @@
     <w:p>
       <w:r>
         <w:t>Отдельно проверено, складно ли текущая версия читается как русский мировой отчет, а не как случайная выгрузка таблиц. Вывод такой: логика гипотез уже держится, счетчики по нишам видны, границы доказательств прописаны, но документ остается плотным рабочим evidence pack. Для внешней версии позже нужен облегченный executive narrative, а тяжелые таблицы лучше вынести в appendix.</w:t>
+      </w:r>
+    </w:p>
+    <w:p>
+      <w:r>
+        <w:t>Поэтому рядом с полным отчетом теперь собирается короткая executive-версия: reports/alina-global-executive-narrative-v1.md и output/pdf/alina-global-executive-narrative-v1.pdf. Ее задача - дать последовательное чтение без потери claim boundaries; полный отчет остается evidence pack и источником таблиц.</w:t>
       </w:r>
     </w:p>
     <w:tbl>
@@ -25463,7 +25468,7 @@
                 <w:color w:val="111827"/>
                 <w:sz w:val="16"/>
               </w:rPr>
-              <w:t>technical_english_hits=309</w:t>
+              <w:t>technical_english_hits=310</w:t>
             </w:r>
           </w:p>
         </w:tc>
@@ -26896,7 +26901,7 @@
                 <w:color w:val="111827"/>
                 <w:sz w:val="16"/>
               </w:rPr>
-              <w:t>489 manifest artifacts; missing=0</w:t>
+              <w:t>492 manifest artifacts; missing=0</w:t>
             </w:r>
           </w:p>
         </w:tc>
@@ -27427,7 +27432,25 @@
         <w:spacing w:after="80"/>
       </w:pPr>
       <w:r>
+        <w:t>reports/alina-global-executive-narrative-v1.md</w:t>
+      </w:r>
+    </w:p>
+    <w:p>
+      <w:pPr>
+        <w:pStyle w:val="ListBullet"/>
+        <w:spacing w:after="80"/>
+      </w:pPr>
+      <w:r>
         <w:t>output/pdf/alina-global-hypothesis-report-v1.pdf</w:t>
+      </w:r>
+    </w:p>
+    <w:p>
+      <w:pPr>
+        <w:pStyle w:val="ListBullet"/>
+        <w:spacing w:after="80"/>
+      </w:pPr>
+      <w:r>
+        <w:t>output/pdf/alina-global-executive-narrative-v1.pdf</w:t>
       </w:r>
     </w:p>
     <w:p>

</xml_diff>

<commit_message>
Add global source quality gap audit
</commit_message>
<xml_diff>
--- a/output/docx/alina-global-hypothesis-report-v1.docx
+++ b/output/docx/alina-global-hypothesis-report-v1.docx
@@ -31,7 +31,7 @@
     </w:p>
     <w:p>
       <w:r>
-        <w:t>Собрано: 2026-05-31T16:46:55.496Z</w:t>
+        <w:t>Собрано: 2026-05-31T16:52:28.036Z</w:t>
       </w:r>
     </w:p>
     <w:p>
@@ -64,9 +64,1042 @@
     </w:p>
     <w:p>
       <w:r>
-        <w:t>На текущем этапе собрано 67,525 сырьевых source-строк, 36,694 уникализированных строк и 492 локальных артефактов. Эти данные нужны не для того, чтобы объявить продукт доказанным, а для последовательной проверки: существует ли рынок, есть ли деньги, насколько плотна конкуренция, где может быть белое пятно, кто аудитория и какую MVP-петлю надо тестировать.</w:t>
+        <w:t>На текущем этапе собрано 67,525 сырьевых source-строк, 36,694 уникализированных строк и 495 локальных артефактов. Эти данные нужны не для того, чтобы объявить продукт доказанным, а для последовательной проверки: существует ли рынок, есть ли деньги, насколько плотна конкуренция, где может быть белое пятно, кто аудитория и какую MVP-петлю надо тестировать.</w:t>
       </w:r>
     </w:p>
+    <w:p>
+      <w:r>
+        <w:t>Чтобы масштаб базы не читался как одинаковое качество источников, отдельно добавлен source-quality audit по пяти рынкам. Он показывает, где coverage ближе к прямым consumer-app конкурентам, где это скорее Steam/itch mechanics benchmark, а где нужны source-native lanes из backlog. Это защищает отчет от ложного вывода “много строк = все доказано”.</w:t>
+      </w:r>
+    </w:p>
+    <w:tbl>
+      <w:tblPr>
+        <w:tblW w:type="dxa" w:w="9360"/>
+        <w:jc w:val="left"/>
+        <w:tblLayout w:type="fixed"/>
+        <w:tblLook w:firstColumn="1" w:firstRow="1" w:lastColumn="0" w:lastRow="0" w:noHBand="0" w:noVBand="1" w:val="04A0"/>
+        <w:tblInd w:w="120" w:type="dxa"/>
+        <w:tblBorders>
+          <w:top w:val="single" w:sz="4" w:space="0" w:color="CBD5E1"/>
+          <w:left w:val="single" w:sz="4" w:space="0" w:color="CBD5E1"/>
+          <w:bottom w:val="single" w:sz="4" w:space="0" w:color="CBD5E1"/>
+          <w:right w:val="single" w:sz="4" w:space="0" w:color="CBD5E1"/>
+          <w:insideH w:val="single" w:sz="4" w:space="0" w:color="CBD5E1"/>
+          <w:insideV w:val="single" w:sz="4" w:space="0" w:color="CBD5E1"/>
+        </w:tblBorders>
+      </w:tblPr>
+      <w:tblGrid>
+        <w:gridCol w:w="1560"/>
+        <w:gridCol w:w="1560"/>
+        <w:gridCol w:w="1560"/>
+        <w:gridCol w:w="1560"/>
+        <w:gridCol w:w="1560"/>
+        <w:gridCol w:w="1560"/>
+      </w:tblGrid>
+      <w:tr>
+        <w:tc>
+          <w:tcPr>
+            <w:tcW w:type="dxa" w:w="1560"/>
+            <w:vAlign w:val="center"/>
+            <w:tcMar>
+              <w:top w:w="80" w:type="dxa"/>
+              <w:start w:w="120" w:type="dxa"/>
+              <w:bottom w:w="80" w:type="dxa"/>
+              <w:end w:w="120" w:type="dxa"/>
+            </w:tcMar>
+            <w:shd w:fill="E8EEF5"/>
+          </w:tcPr>
+          <w:p>
+            <w:pPr>
+              <w:spacing w:after="0"/>
+              <w:jc w:val="left"/>
+            </w:pPr>
+            <w:r>
+              <w:rPr>
+                <w:rFonts w:ascii="Arial" w:hAnsi="Arial" w:eastAsia="Arial"/>
+                <w:b/>
+                <w:color w:val="111827"/>
+                <w:sz w:val="16"/>
+              </w:rPr>
+              <w:t>Рынок</w:t>
+            </w:r>
+          </w:p>
+        </w:tc>
+        <w:tc>
+          <w:tcPr>
+            <w:tcW w:type="dxa" w:w="1560"/>
+            <w:vAlign w:val="center"/>
+            <w:tcMar>
+              <w:top w:w="80" w:type="dxa"/>
+              <w:start w:w="120" w:type="dxa"/>
+              <w:bottom w:w="80" w:type="dxa"/>
+              <w:end w:w="120" w:type="dxa"/>
+            </w:tcMar>
+            <w:shd w:fill="E8EEF5"/>
+          </w:tcPr>
+          <w:p>
+            <w:pPr>
+              <w:spacing w:after="0"/>
+              <w:jc w:val="left"/>
+            </w:pPr>
+            <w:r>
+              <w:rPr>
+                <w:rFonts w:ascii="Arial" w:hAnsi="Arial" w:eastAsia="Arial"/>
+                <w:b/>
+                <w:color w:val="111827"/>
+                <w:sz w:val="16"/>
+              </w:rPr>
+              <w:t>Direct dedup</w:t>
+            </w:r>
+          </w:p>
+        </w:tc>
+        <w:tc>
+          <w:tcPr>
+            <w:tcW w:type="dxa" w:w="1560"/>
+            <w:vAlign w:val="center"/>
+            <w:tcMar>
+              <w:top w:w="80" w:type="dxa"/>
+              <w:start w:w="120" w:type="dxa"/>
+              <w:bottom w:w="80" w:type="dxa"/>
+              <w:end w:w="120" w:type="dxa"/>
+            </w:tcMar>
+            <w:shd w:fill="E8EEF5"/>
+          </w:tcPr>
+          <w:p>
+            <w:pPr>
+              <w:spacing w:after="0"/>
+              <w:jc w:val="left"/>
+            </w:pPr>
+            <w:r>
+              <w:rPr>
+                <w:rFonts w:ascii="Arial" w:hAnsi="Arial" w:eastAsia="Arial"/>
+                <w:b/>
+                <w:color w:val="111827"/>
+                <w:sz w:val="16"/>
+              </w:rPr>
+              <w:t>Direct share</w:t>
+            </w:r>
+          </w:p>
+        </w:tc>
+        <w:tc>
+          <w:tcPr>
+            <w:tcW w:type="dxa" w:w="1560"/>
+            <w:vAlign w:val="center"/>
+            <w:tcMar>
+              <w:top w:w="80" w:type="dxa"/>
+              <w:start w:w="120" w:type="dxa"/>
+              <w:bottom w:w="80" w:type="dxa"/>
+              <w:end w:w="120" w:type="dxa"/>
+            </w:tcMar>
+            <w:shd w:fill="E8EEF5"/>
+          </w:tcPr>
+          <w:p>
+            <w:pPr>
+              <w:spacing w:after="0"/>
+              <w:jc w:val="left"/>
+            </w:pPr>
+            <w:r>
+              <w:rPr>
+                <w:rFonts w:ascii="Arial" w:hAnsi="Arial" w:eastAsia="Arial"/>
+                <w:b/>
+                <w:color w:val="111827"/>
+                <w:sz w:val="16"/>
+              </w:rPr>
+              <w:t>Benchmark dedup</w:t>
+            </w:r>
+          </w:p>
+        </w:tc>
+        <w:tc>
+          <w:tcPr>
+            <w:tcW w:type="dxa" w:w="1560"/>
+            <w:vAlign w:val="center"/>
+            <w:tcMar>
+              <w:top w:w="80" w:type="dxa"/>
+              <w:start w:w="120" w:type="dxa"/>
+              <w:bottom w:w="80" w:type="dxa"/>
+              <w:end w:w="120" w:type="dxa"/>
+            </w:tcMar>
+            <w:shd w:fill="E8EEF5"/>
+          </w:tcPr>
+          <w:p>
+            <w:pPr>
+              <w:spacing w:after="0"/>
+              <w:jc w:val="left"/>
+            </w:pPr>
+            <w:r>
+              <w:rPr>
+                <w:rFonts w:ascii="Arial" w:hAnsi="Arial" w:eastAsia="Arial"/>
+                <w:b/>
+                <w:color w:val="111827"/>
+                <w:sz w:val="16"/>
+              </w:rPr>
+              <w:t>Как читать source quality</w:t>
+            </w:r>
+          </w:p>
+        </w:tc>
+        <w:tc>
+          <w:tcPr>
+            <w:tcW w:type="dxa" w:w="1560"/>
+            <w:vAlign w:val="center"/>
+            <w:tcMar>
+              <w:top w:w="80" w:type="dxa"/>
+              <w:start w:w="120" w:type="dxa"/>
+              <w:bottom w:w="80" w:type="dxa"/>
+              <w:end w:w="120" w:type="dxa"/>
+            </w:tcMar>
+            <w:shd w:fill="E8EEF5"/>
+          </w:tcPr>
+          <w:p>
+            <w:pPr>
+              <w:spacing w:after="0"/>
+              <w:jc w:val="left"/>
+            </w:pPr>
+            <w:r>
+              <w:rPr>
+                <w:rFonts w:ascii="Arial" w:hAnsi="Arial" w:eastAsia="Arial"/>
+                <w:b/>
+                <w:color w:val="111827"/>
+                <w:sz w:val="16"/>
+              </w:rPr>
+              <w:t>Следующие lanes</w:t>
+            </w:r>
+          </w:p>
+        </w:tc>
+      </w:tr>
+      <w:tr>
+        <w:tc>
+          <w:tcPr>
+            <w:tcW w:type="dxa" w:w="1560"/>
+            <w:vAlign w:val="center"/>
+            <w:tcMar>
+              <w:top w:w="80" w:type="dxa"/>
+              <w:start w:w="120" w:type="dxa"/>
+              <w:bottom w:w="80" w:type="dxa"/>
+              <w:end w:w="120" w:type="dxa"/>
+            </w:tcMar>
+          </w:tcPr>
+          <w:p>
+            <w:pPr>
+              <w:spacing w:after="0"/>
+              <w:jc w:val="left"/>
+            </w:pPr>
+            <w:r>
+              <w:rPr>
+                <w:rFonts w:ascii="Arial" w:hAnsi="Arial" w:eastAsia="Arial"/>
+                <w:b w:val="0"/>
+                <w:color w:val="111827"/>
+                <w:sz w:val="16"/>
+              </w:rPr>
+              <w:t>Mindfulness / reset</w:t>
+            </w:r>
+          </w:p>
+        </w:tc>
+        <w:tc>
+          <w:tcPr>
+            <w:tcW w:type="dxa" w:w="1560"/>
+            <w:vAlign w:val="center"/>
+            <w:tcMar>
+              <w:top w:w="80" w:type="dxa"/>
+              <w:start w:w="120" w:type="dxa"/>
+              <w:bottom w:w="80" w:type="dxa"/>
+              <w:end w:w="120" w:type="dxa"/>
+            </w:tcMar>
+          </w:tcPr>
+          <w:p>
+            <w:pPr>
+              <w:spacing w:after="0"/>
+              <w:jc w:val="left"/>
+            </w:pPr>
+            <w:r>
+              <w:rPr>
+                <w:rFonts w:ascii="Arial" w:hAnsi="Arial" w:eastAsia="Arial"/>
+                <w:b w:val="0"/>
+                <w:color w:val="111827"/>
+                <w:sz w:val="16"/>
+              </w:rPr>
+              <w:t>2,550</w:t>
+            </w:r>
+          </w:p>
+        </w:tc>
+        <w:tc>
+          <w:tcPr>
+            <w:tcW w:type="dxa" w:w="1560"/>
+            <w:vAlign w:val="center"/>
+            <w:tcMar>
+              <w:top w:w="80" w:type="dxa"/>
+              <w:start w:w="120" w:type="dxa"/>
+              <w:bottom w:w="80" w:type="dxa"/>
+              <w:end w:w="120" w:type="dxa"/>
+            </w:tcMar>
+          </w:tcPr>
+          <w:p>
+            <w:pPr>
+              <w:spacing w:after="0"/>
+              <w:jc w:val="left"/>
+            </w:pPr>
+            <w:r>
+              <w:rPr>
+                <w:rFonts w:ascii="Arial" w:hAnsi="Arial" w:eastAsia="Arial"/>
+                <w:b w:val="0"/>
+                <w:color w:val="111827"/>
+                <w:sz w:val="16"/>
+              </w:rPr>
+              <w:t>26.0%</w:t>
+            </w:r>
+          </w:p>
+        </w:tc>
+        <w:tc>
+          <w:tcPr>
+            <w:tcW w:type="dxa" w:w="1560"/>
+            <w:vAlign w:val="center"/>
+            <w:tcMar>
+              <w:top w:w="80" w:type="dxa"/>
+              <w:start w:w="120" w:type="dxa"/>
+              <w:bottom w:w="80" w:type="dxa"/>
+              <w:end w:w="120" w:type="dxa"/>
+            </w:tcMar>
+          </w:tcPr>
+          <w:p>
+            <w:pPr>
+              <w:spacing w:after="0"/>
+              <w:jc w:val="left"/>
+            </w:pPr>
+            <w:r>
+              <w:rPr>
+                <w:rFonts w:ascii="Arial" w:hAnsi="Arial" w:eastAsia="Arial"/>
+                <w:b w:val="0"/>
+                <w:color w:val="111827"/>
+                <w:sz w:val="16"/>
+              </w:rPr>
+              <w:t>6,608</w:t>
+            </w:r>
+          </w:p>
+        </w:tc>
+        <w:tc>
+          <w:tcPr>
+            <w:tcW w:type="dxa" w:w="1560"/>
+            <w:vAlign w:val="center"/>
+            <w:tcMar>
+              <w:top w:w="80" w:type="dxa"/>
+              <w:start w:w="120" w:type="dxa"/>
+              <w:bottom w:w="80" w:type="dxa"/>
+              <w:end w:w="120" w:type="dxa"/>
+            </w:tcMar>
+          </w:tcPr>
+          <w:p>
+            <w:pPr>
+              <w:spacing w:after="0"/>
+              <w:jc w:val="left"/>
+            </w:pPr>
+            <w:r>
+              <w:rPr>
+                <w:rFonts w:ascii="Arial" w:hAnsi="Arial" w:eastAsia="Arial"/>
+                <w:b w:val="0"/>
+                <w:color w:val="111827"/>
+                <w:sz w:val="16"/>
+              </w:rPr>
+              <w:t>coverage пригоден для directionality, но требует ручного sampling перед claim upgrade</w:t>
+            </w:r>
+          </w:p>
+        </w:tc>
+        <w:tc>
+          <w:tcPr>
+            <w:tcW w:type="dxa" w:w="1560"/>
+            <w:vAlign w:val="center"/>
+            <w:tcMar>
+              <w:top w:w="80" w:type="dxa"/>
+              <w:start w:w="120" w:type="dxa"/>
+              <w:bottom w:w="80" w:type="dxa"/>
+              <w:end w:w="120" w:type="dxa"/>
+            </w:tcMar>
+          </w:tcPr>
+          <w:p>
+            <w:pPr>
+              <w:spacing w:after="0"/>
+              <w:jc w:val="left"/>
+            </w:pPr>
+            <w:r>
+              <w:rPr>
+                <w:rFonts w:ascii="Arial" w:hAnsi="Arial" w:eastAsia="Arial"/>
+                <w:b w:val="0"/>
+                <w:color w:val="111827"/>
+                <w:sz w:val="16"/>
+              </w:rPr>
+              <w:t>P0 Product Hunt / P0 AlternativeTo / P0 Chrome Web Store / browser extensions</w:t>
+            </w:r>
+          </w:p>
+        </w:tc>
+      </w:tr>
+      <w:tr>
+        <w:tc>
+          <w:tcPr>
+            <w:tcW w:type="dxa" w:w="1560"/>
+            <w:vAlign w:val="center"/>
+            <w:tcMar>
+              <w:top w:w="80" w:type="dxa"/>
+              <w:start w:w="120" w:type="dxa"/>
+              <w:bottom w:w="80" w:type="dxa"/>
+              <w:end w:w="120" w:type="dxa"/>
+            </w:tcMar>
+            <w:shd w:fill="F8FAFC"/>
+          </w:tcPr>
+          <w:p>
+            <w:pPr>
+              <w:spacing w:after="0"/>
+              <w:jc w:val="left"/>
+            </w:pPr>
+            <w:r>
+              <w:rPr>
+                <w:rFonts w:ascii="Arial" w:hAnsi="Arial" w:eastAsia="Arial"/>
+                <w:b w:val="0"/>
+                <w:color w:val="111827"/>
+                <w:sz w:val="16"/>
+              </w:rPr>
+              <w:t>Avatar / identity</w:t>
+            </w:r>
+          </w:p>
+        </w:tc>
+        <w:tc>
+          <w:tcPr>
+            <w:tcW w:type="dxa" w:w="1560"/>
+            <w:vAlign w:val="center"/>
+            <w:tcMar>
+              <w:top w:w="80" w:type="dxa"/>
+              <w:start w:w="120" w:type="dxa"/>
+              <w:bottom w:w="80" w:type="dxa"/>
+              <w:end w:w="120" w:type="dxa"/>
+            </w:tcMar>
+            <w:shd w:fill="F8FAFC"/>
+          </w:tcPr>
+          <w:p>
+            <w:pPr>
+              <w:spacing w:after="0"/>
+              <w:jc w:val="left"/>
+            </w:pPr>
+            <w:r>
+              <w:rPr>
+                <w:rFonts w:ascii="Arial" w:hAnsi="Arial" w:eastAsia="Arial"/>
+                <w:b w:val="0"/>
+                <w:color w:val="111827"/>
+                <w:sz w:val="16"/>
+              </w:rPr>
+              <w:t>2,506</w:t>
+            </w:r>
+          </w:p>
+        </w:tc>
+        <w:tc>
+          <w:tcPr>
+            <w:tcW w:type="dxa" w:w="1560"/>
+            <w:vAlign w:val="center"/>
+            <w:tcMar>
+              <w:top w:w="80" w:type="dxa"/>
+              <w:start w:w="120" w:type="dxa"/>
+              <w:bottom w:w="80" w:type="dxa"/>
+              <w:end w:w="120" w:type="dxa"/>
+            </w:tcMar>
+            <w:shd w:fill="F8FAFC"/>
+          </w:tcPr>
+          <w:p>
+            <w:pPr>
+              <w:spacing w:after="0"/>
+              <w:jc w:val="left"/>
+            </w:pPr>
+            <w:r>
+              <w:rPr>
+                <w:rFonts w:ascii="Arial" w:hAnsi="Arial" w:eastAsia="Arial"/>
+                <w:b w:val="0"/>
+                <w:color w:val="111827"/>
+                <w:sz w:val="16"/>
+              </w:rPr>
+              <w:t>25.2%</w:t>
+            </w:r>
+          </w:p>
+        </w:tc>
+        <w:tc>
+          <w:tcPr>
+            <w:tcW w:type="dxa" w:w="1560"/>
+            <w:vAlign w:val="center"/>
+            <w:tcMar>
+              <w:top w:w="80" w:type="dxa"/>
+              <w:start w:w="120" w:type="dxa"/>
+              <w:bottom w:w="80" w:type="dxa"/>
+              <w:end w:w="120" w:type="dxa"/>
+            </w:tcMar>
+            <w:shd w:fill="F8FAFC"/>
+          </w:tcPr>
+          <w:p>
+            <w:pPr>
+              <w:spacing w:after="0"/>
+              <w:jc w:val="left"/>
+            </w:pPr>
+            <w:r>
+              <w:rPr>
+                <w:rFonts w:ascii="Arial" w:hAnsi="Arial" w:eastAsia="Arial"/>
+                <w:b w:val="0"/>
+                <w:color w:val="111827"/>
+                <w:sz w:val="16"/>
+              </w:rPr>
+              <w:t>6,867</w:t>
+            </w:r>
+          </w:p>
+        </w:tc>
+        <w:tc>
+          <w:tcPr>
+            <w:tcW w:type="dxa" w:w="1560"/>
+            <w:vAlign w:val="center"/>
+            <w:tcMar>
+              <w:top w:w="80" w:type="dxa"/>
+              <w:start w:w="120" w:type="dxa"/>
+              <w:bottom w:w="80" w:type="dxa"/>
+              <w:end w:w="120" w:type="dxa"/>
+            </w:tcMar>
+            <w:shd w:fill="F8FAFC"/>
+          </w:tcPr>
+          <w:p>
+            <w:pPr>
+              <w:spacing w:after="0"/>
+              <w:jc w:val="left"/>
+            </w:pPr>
+            <w:r>
+              <w:rPr>
+                <w:rFonts w:ascii="Arial" w:hAnsi="Arial" w:eastAsia="Arial"/>
+                <w:b w:val="0"/>
+                <w:color w:val="111827"/>
+                <w:sz w:val="16"/>
+              </w:rPr>
+              <w:t>coverage пригоден для directionality, но требует ручного sampling перед claim upgrade</w:t>
+            </w:r>
+          </w:p>
+        </w:tc>
+        <w:tc>
+          <w:tcPr>
+            <w:tcW w:type="dxa" w:w="1560"/>
+            <w:vAlign w:val="center"/>
+            <w:tcMar>
+              <w:top w:w="80" w:type="dxa"/>
+              <w:start w:w="120" w:type="dxa"/>
+              <w:bottom w:w="80" w:type="dxa"/>
+              <w:end w:w="120" w:type="dxa"/>
+            </w:tcMar>
+            <w:shd w:fill="F8FAFC"/>
+          </w:tcPr>
+          <w:p>
+            <w:pPr>
+              <w:spacing w:after="0"/>
+              <w:jc w:val="left"/>
+            </w:pPr>
+            <w:r>
+              <w:rPr>
+                <w:rFonts w:ascii="Arial" w:hAnsi="Arial" w:eastAsia="Arial"/>
+                <w:b w:val="0"/>
+                <w:color w:val="111827"/>
+                <w:sz w:val="16"/>
+              </w:rPr>
+              <w:t>P0 Product Hunt / P0 AlternativeTo / P0 Chrome Web Store / browser extensions</w:t>
+            </w:r>
+          </w:p>
+        </w:tc>
+      </w:tr>
+      <w:tr>
+        <w:tc>
+          <w:tcPr>
+            <w:tcW w:type="dxa" w:w="1560"/>
+            <w:vAlign w:val="center"/>
+            <w:tcMar>
+              <w:top w:w="80" w:type="dxa"/>
+              <w:start w:w="120" w:type="dxa"/>
+              <w:bottom w:w="80" w:type="dxa"/>
+              <w:end w:w="120" w:type="dxa"/>
+            </w:tcMar>
+          </w:tcPr>
+          <w:p>
+            <w:pPr>
+              <w:spacing w:after="0"/>
+              <w:jc w:val="left"/>
+            </w:pPr>
+            <w:r>
+              <w:rPr>
+                <w:rFonts w:ascii="Arial" w:hAnsi="Arial" w:eastAsia="Arial"/>
+                <w:b w:val="0"/>
+                <w:color w:val="111827"/>
+                <w:sz w:val="16"/>
+              </w:rPr>
+              <w:t>Astrology / esoterics</w:t>
+            </w:r>
+          </w:p>
+        </w:tc>
+        <w:tc>
+          <w:tcPr>
+            <w:tcW w:type="dxa" w:w="1560"/>
+            <w:vAlign w:val="center"/>
+            <w:tcMar>
+              <w:top w:w="80" w:type="dxa"/>
+              <w:start w:w="120" w:type="dxa"/>
+              <w:bottom w:w="80" w:type="dxa"/>
+              <w:end w:w="120" w:type="dxa"/>
+            </w:tcMar>
+          </w:tcPr>
+          <w:p>
+            <w:pPr>
+              <w:spacing w:after="0"/>
+              <w:jc w:val="left"/>
+            </w:pPr>
+            <w:r>
+              <w:rPr>
+                <w:rFonts w:ascii="Arial" w:hAnsi="Arial" w:eastAsia="Arial"/>
+                <w:b w:val="0"/>
+                <w:color w:val="111827"/>
+                <w:sz w:val="16"/>
+              </w:rPr>
+              <w:t>2,206</w:t>
+            </w:r>
+          </w:p>
+        </w:tc>
+        <w:tc>
+          <w:tcPr>
+            <w:tcW w:type="dxa" w:w="1560"/>
+            <w:vAlign w:val="center"/>
+            <w:tcMar>
+              <w:top w:w="80" w:type="dxa"/>
+              <w:start w:w="120" w:type="dxa"/>
+              <w:bottom w:w="80" w:type="dxa"/>
+              <w:end w:w="120" w:type="dxa"/>
+            </w:tcMar>
+          </w:tcPr>
+          <w:p>
+            <w:pPr>
+              <w:spacing w:after="0"/>
+              <w:jc w:val="left"/>
+            </w:pPr>
+            <w:r>
+              <w:rPr>
+                <w:rFonts w:ascii="Arial" w:hAnsi="Arial" w:eastAsia="Arial"/>
+                <w:b w:val="0"/>
+                <w:color w:val="111827"/>
+                <w:sz w:val="16"/>
+              </w:rPr>
+              <w:t>83.0%</w:t>
+            </w:r>
+          </w:p>
+        </w:tc>
+        <w:tc>
+          <w:tcPr>
+            <w:tcW w:type="dxa" w:w="1560"/>
+            <w:vAlign w:val="center"/>
+            <w:tcMar>
+              <w:top w:w="80" w:type="dxa"/>
+              <w:start w:w="120" w:type="dxa"/>
+              <w:bottom w:w="80" w:type="dxa"/>
+              <w:end w:w="120" w:type="dxa"/>
+            </w:tcMar>
+          </w:tcPr>
+          <w:p>
+            <w:pPr>
+              <w:spacing w:after="0"/>
+              <w:jc w:val="left"/>
+            </w:pPr>
+            <w:r>
+              <w:rPr>
+                <w:rFonts w:ascii="Arial" w:hAnsi="Arial" w:eastAsia="Arial"/>
+                <w:b w:val="0"/>
+                <w:color w:val="111827"/>
+                <w:sz w:val="16"/>
+              </w:rPr>
+              <w:t>366</w:t>
+            </w:r>
+          </w:p>
+        </w:tc>
+        <w:tc>
+          <w:tcPr>
+            <w:tcW w:type="dxa" w:w="1560"/>
+            <w:vAlign w:val="center"/>
+            <w:tcMar>
+              <w:top w:w="80" w:type="dxa"/>
+              <w:start w:w="120" w:type="dxa"/>
+              <w:bottom w:w="80" w:type="dxa"/>
+              <w:end w:w="120" w:type="dxa"/>
+            </w:tcMar>
+          </w:tcPr>
+          <w:p>
+            <w:pPr>
+              <w:spacing w:after="0"/>
+              <w:jc w:val="left"/>
+            </w:pPr>
+            <w:r>
+              <w:rPr>
+                <w:rFonts w:ascii="Arial" w:hAnsi="Arial" w:eastAsia="Arial"/>
+                <w:b w:val="0"/>
+                <w:color w:val="111827"/>
+                <w:sz w:val="16"/>
+              </w:rPr>
+              <w:t>direct consumer-app coverage достаточно заметный для desk map</w:t>
+            </w:r>
+          </w:p>
+        </w:tc>
+        <w:tc>
+          <w:tcPr>
+            <w:tcW w:type="dxa" w:w="1560"/>
+            <w:vAlign w:val="center"/>
+            <w:tcMar>
+              <w:top w:w="80" w:type="dxa"/>
+              <w:start w:w="120" w:type="dxa"/>
+              <w:bottom w:w="80" w:type="dxa"/>
+              <w:end w:w="120" w:type="dxa"/>
+            </w:tcMar>
+          </w:tcPr>
+          <w:p>
+            <w:pPr>
+              <w:spacing w:after="0"/>
+              <w:jc w:val="left"/>
+            </w:pPr>
+            <w:r>
+              <w:rPr>
+                <w:rFonts w:ascii="Arial" w:hAnsi="Arial" w:eastAsia="Arial"/>
+                <w:b w:val="0"/>
+                <w:color w:val="111827"/>
+                <w:sz w:val="16"/>
+              </w:rPr>
+              <w:t>P0 Product Hunt / P1 Reddit/subreddit discovery as competitor source / P2 Public website/pricing pages for top candidates</w:t>
+            </w:r>
+          </w:p>
+        </w:tc>
+      </w:tr>
+      <w:tr>
+        <w:tc>
+          <w:tcPr>
+            <w:tcW w:type="dxa" w:w="1560"/>
+            <w:vAlign w:val="center"/>
+            <w:tcMar>
+              <w:top w:w="80" w:type="dxa"/>
+              <w:start w:w="120" w:type="dxa"/>
+              <w:bottom w:w="80" w:type="dxa"/>
+              <w:end w:w="120" w:type="dxa"/>
+            </w:tcMar>
+            <w:shd w:fill="F8FAFC"/>
+          </w:tcPr>
+          <w:p>
+            <w:pPr>
+              <w:spacing w:after="0"/>
+              <w:jc w:val="left"/>
+            </w:pPr>
+            <w:r>
+              <w:rPr>
+                <w:rFonts w:ascii="Arial" w:hAnsi="Arial" w:eastAsia="Arial"/>
+                <w:b w:val="0"/>
+                <w:color w:val="111827"/>
+                <w:sz w:val="16"/>
+              </w:rPr>
+              <w:t>Coaching / self-improvement</w:t>
+            </w:r>
+          </w:p>
+        </w:tc>
+        <w:tc>
+          <w:tcPr>
+            <w:tcW w:type="dxa" w:w="1560"/>
+            <w:vAlign w:val="center"/>
+            <w:tcMar>
+              <w:top w:w="80" w:type="dxa"/>
+              <w:start w:w="120" w:type="dxa"/>
+              <w:bottom w:w="80" w:type="dxa"/>
+              <w:end w:w="120" w:type="dxa"/>
+            </w:tcMar>
+            <w:shd w:fill="F8FAFC"/>
+          </w:tcPr>
+          <w:p>
+            <w:pPr>
+              <w:spacing w:after="0"/>
+              <w:jc w:val="left"/>
+            </w:pPr>
+            <w:r>
+              <w:rPr>
+                <w:rFonts w:ascii="Arial" w:hAnsi="Arial" w:eastAsia="Arial"/>
+                <w:b w:val="0"/>
+                <w:color w:val="111827"/>
+                <w:sz w:val="16"/>
+              </w:rPr>
+              <w:t>2,651</w:t>
+            </w:r>
+          </w:p>
+        </w:tc>
+        <w:tc>
+          <w:tcPr>
+            <w:tcW w:type="dxa" w:w="1560"/>
+            <w:vAlign w:val="center"/>
+            <w:tcMar>
+              <w:top w:w="80" w:type="dxa"/>
+              <w:start w:w="120" w:type="dxa"/>
+              <w:bottom w:w="80" w:type="dxa"/>
+              <w:end w:w="120" w:type="dxa"/>
+            </w:tcMar>
+            <w:shd w:fill="F8FAFC"/>
+          </w:tcPr>
+          <w:p>
+            <w:pPr>
+              <w:spacing w:after="0"/>
+              <w:jc w:val="left"/>
+            </w:pPr>
+            <w:r>
+              <w:rPr>
+                <w:rFonts w:ascii="Arial" w:hAnsi="Arial" w:eastAsia="Arial"/>
+                <w:b w:val="0"/>
+                <w:color w:val="111827"/>
+                <w:sz w:val="16"/>
+              </w:rPr>
+              <w:t>68.7%</w:t>
+            </w:r>
+          </w:p>
+        </w:tc>
+        <w:tc>
+          <w:tcPr>
+            <w:tcW w:type="dxa" w:w="1560"/>
+            <w:vAlign w:val="center"/>
+            <w:tcMar>
+              <w:top w:w="80" w:type="dxa"/>
+              <w:start w:w="120" w:type="dxa"/>
+              <w:bottom w:w="80" w:type="dxa"/>
+              <w:end w:w="120" w:type="dxa"/>
+            </w:tcMar>
+            <w:shd w:fill="F8FAFC"/>
+          </w:tcPr>
+          <w:p>
+            <w:pPr>
+              <w:spacing w:after="0"/>
+              <w:jc w:val="left"/>
+            </w:pPr>
+            <w:r>
+              <w:rPr>
+                <w:rFonts w:ascii="Arial" w:hAnsi="Arial" w:eastAsia="Arial"/>
+                <w:b w:val="0"/>
+                <w:color w:val="111827"/>
+                <w:sz w:val="16"/>
+              </w:rPr>
+              <w:t>485</w:t>
+            </w:r>
+          </w:p>
+        </w:tc>
+        <w:tc>
+          <w:tcPr>
+            <w:tcW w:type="dxa" w:w="1560"/>
+            <w:vAlign w:val="center"/>
+            <w:tcMar>
+              <w:top w:w="80" w:type="dxa"/>
+              <w:start w:w="120" w:type="dxa"/>
+              <w:bottom w:w="80" w:type="dxa"/>
+              <w:end w:w="120" w:type="dxa"/>
+            </w:tcMar>
+            <w:shd w:fill="F8FAFC"/>
+          </w:tcPr>
+          <w:p>
+            <w:pPr>
+              <w:spacing w:after="0"/>
+              <w:jc w:val="left"/>
+            </w:pPr>
+            <w:r>
+              <w:rPr>
+                <w:rFonts w:ascii="Arial" w:hAnsi="Arial" w:eastAsia="Arial"/>
+                <w:b w:val="0"/>
+                <w:color w:val="111827"/>
+                <w:sz w:val="16"/>
+              </w:rPr>
+              <w:t>direct consumer-app coverage достаточно заметный для desk map</w:t>
+            </w:r>
+          </w:p>
+        </w:tc>
+        <w:tc>
+          <w:tcPr>
+            <w:tcW w:type="dxa" w:w="1560"/>
+            <w:vAlign w:val="center"/>
+            <w:tcMar>
+              <w:top w:w="80" w:type="dxa"/>
+              <w:start w:w="120" w:type="dxa"/>
+              <w:bottom w:w="80" w:type="dxa"/>
+              <w:end w:w="120" w:type="dxa"/>
+            </w:tcMar>
+            <w:shd w:fill="F8FAFC"/>
+          </w:tcPr>
+          <w:p>
+            <w:pPr>
+              <w:spacing w:after="0"/>
+              <w:jc w:val="left"/>
+            </w:pPr>
+            <w:r>
+              <w:rPr>
+                <w:rFonts w:ascii="Arial" w:hAnsi="Arial" w:eastAsia="Arial"/>
+                <w:b w:val="0"/>
+                <w:color w:val="111827"/>
+                <w:sz w:val="16"/>
+              </w:rPr>
+              <w:t>P0 Product Hunt / P0 AlternativeTo / P0 Chrome Web Store / browser extensions</w:t>
+            </w:r>
+          </w:p>
+        </w:tc>
+      </w:tr>
+      <w:tr>
+        <w:tc>
+          <w:tcPr>
+            <w:tcW w:type="dxa" w:w="1560"/>
+            <w:vAlign w:val="center"/>
+            <w:tcMar>
+              <w:top w:w="80" w:type="dxa"/>
+              <w:start w:w="120" w:type="dxa"/>
+              <w:bottom w:w="80" w:type="dxa"/>
+              <w:end w:w="120" w:type="dxa"/>
+            </w:tcMar>
+          </w:tcPr>
+          <w:p>
+            <w:pPr>
+              <w:spacing w:after="0"/>
+              <w:jc w:val="left"/>
+            </w:pPr>
+            <w:r>
+              <w:rPr>
+                <w:rFonts w:ascii="Arial" w:hAnsi="Arial" w:eastAsia="Arial"/>
+                <w:b w:val="0"/>
+                <w:color w:val="111827"/>
+                <w:sz w:val="16"/>
+              </w:rPr>
+              <w:t>Gaming / progression benchmark</w:t>
+            </w:r>
+          </w:p>
+        </w:tc>
+        <w:tc>
+          <w:tcPr>
+            <w:tcW w:type="dxa" w:w="1560"/>
+            <w:vAlign w:val="center"/>
+            <w:tcMar>
+              <w:top w:w="80" w:type="dxa"/>
+              <w:start w:w="120" w:type="dxa"/>
+              <w:bottom w:w="80" w:type="dxa"/>
+              <w:end w:w="120" w:type="dxa"/>
+            </w:tcMar>
+          </w:tcPr>
+          <w:p>
+            <w:pPr>
+              <w:spacing w:after="0"/>
+              <w:jc w:val="left"/>
+            </w:pPr>
+            <w:r>
+              <w:rPr>
+                <w:rFonts w:ascii="Arial" w:hAnsi="Arial" w:eastAsia="Arial"/>
+                <w:b w:val="0"/>
+                <w:color w:val="111827"/>
+                <w:sz w:val="16"/>
+              </w:rPr>
+              <w:t>3,204</w:t>
+            </w:r>
+          </w:p>
+        </w:tc>
+        <w:tc>
+          <w:tcPr>
+            <w:tcW w:type="dxa" w:w="1560"/>
+            <w:vAlign w:val="center"/>
+            <w:tcMar>
+              <w:top w:w="80" w:type="dxa"/>
+              <w:start w:w="120" w:type="dxa"/>
+              <w:bottom w:w="80" w:type="dxa"/>
+              <w:end w:w="120" w:type="dxa"/>
+            </w:tcMar>
+          </w:tcPr>
+          <w:p>
+            <w:pPr>
+              <w:spacing w:after="0"/>
+              <w:jc w:val="left"/>
+            </w:pPr>
+            <w:r>
+              <w:rPr>
+                <w:rFonts w:ascii="Arial" w:hAnsi="Arial" w:eastAsia="Arial"/>
+                <w:b w:val="0"/>
+                <w:color w:val="111827"/>
+                <w:sz w:val="16"/>
+              </w:rPr>
+              <w:t>19.0%</w:t>
+            </w:r>
+          </w:p>
+        </w:tc>
+        <w:tc>
+          <w:tcPr>
+            <w:tcW w:type="dxa" w:w="1560"/>
+            <w:vAlign w:val="center"/>
+            <w:tcMar>
+              <w:top w:w="80" w:type="dxa"/>
+              <w:start w:w="120" w:type="dxa"/>
+              <w:bottom w:w="80" w:type="dxa"/>
+              <w:end w:w="120" w:type="dxa"/>
+            </w:tcMar>
+          </w:tcPr>
+          <w:p>
+            <w:pPr>
+              <w:spacing w:after="0"/>
+              <w:jc w:val="left"/>
+            </w:pPr>
+            <w:r>
+              <w:rPr>
+                <w:rFonts w:ascii="Arial" w:hAnsi="Arial" w:eastAsia="Arial"/>
+                <w:b w:val="0"/>
+                <w:color w:val="111827"/>
+                <w:sz w:val="16"/>
+              </w:rPr>
+              <w:t>13,542</w:t>
+            </w:r>
+          </w:p>
+        </w:tc>
+        <w:tc>
+          <w:tcPr>
+            <w:tcW w:type="dxa" w:w="1560"/>
+            <w:vAlign w:val="center"/>
+            <w:tcMar>
+              <w:top w:w="80" w:type="dxa"/>
+              <w:start w:w="120" w:type="dxa"/>
+              <w:bottom w:w="80" w:type="dxa"/>
+              <w:end w:w="120" w:type="dxa"/>
+            </w:tcMar>
+          </w:tcPr>
+          <w:p>
+            <w:pPr>
+              <w:spacing w:after="0"/>
+              <w:jc w:val="left"/>
+            </w:pPr>
+            <w:r>
+              <w:rPr>
+                <w:rFonts w:ascii="Arial" w:hAnsi="Arial" w:eastAsia="Arial"/>
+                <w:b w:val="0"/>
+                <w:color w:val="111827"/>
+                <w:sz w:val="16"/>
+              </w:rPr>
+              <w:t>coverage сильный по масштабу, но сильно benchmark/mechanics-heavy</w:t>
+            </w:r>
+          </w:p>
+        </w:tc>
+        <w:tc>
+          <w:tcPr>
+            <w:tcW w:type="dxa" w:w="1560"/>
+            <w:vAlign w:val="center"/>
+            <w:tcMar>
+              <w:top w:w="80" w:type="dxa"/>
+              <w:start w:w="120" w:type="dxa"/>
+              <w:bottom w:w="80" w:type="dxa"/>
+              <w:end w:w="120" w:type="dxa"/>
+            </w:tcMar>
+          </w:tcPr>
+          <w:p>
+            <w:pPr>
+              <w:spacing w:after="0"/>
+              <w:jc w:val="left"/>
+            </w:pPr>
+            <w:r>
+              <w:rPr>
+                <w:rFonts w:ascii="Arial" w:hAnsi="Arial" w:eastAsia="Arial"/>
+                <w:b w:val="0"/>
+                <w:color w:val="111827"/>
+                <w:sz w:val="16"/>
+              </w:rPr>
+              <w:t>P1 Microsoft Store / Mac App Store web / P1 itch.io / indie game directories / P1 Reddit/subreddit discovery as competitor source</w:t>
+            </w:r>
+          </w:p>
+        </w:tc>
+      </w:tr>
+    </w:tbl>
+    <w:p/>
     <w:p>
       <w:pPr>
         <w:pStyle w:val="Heading2"/>
@@ -23552,7 +24585,7 @@
                 <w:color w:val="111827"/>
                 <w:sz w:val="16"/>
               </w:rPr>
-              <w:t>raw=67525; dedup=36694; dedup50_status=open; source_refs=239857</w:t>
+              <w:t>raw=67525; dedup=36694; dedup50_status=open; source_refs=239863; source_quality_rows=5</w:t>
             </w:r>
           </w:p>
         </w:tc>
@@ -24386,7 +25419,7 @@
                 <w:color w:val="111827"/>
                 <w:sz w:val="16"/>
               </w:rPr>
-              <w:t>manifest=492; missing=0; docs=123; scripts=110</w:t>
+              <w:t>manifest=495; missing=0; docs=124; scripts=111</w:t>
             </w:r>
           </w:p>
         </w:tc>
@@ -26901,7 +27934,7 @@
                 <w:color w:val="111827"/>
                 <w:sz w:val="16"/>
               </w:rPr>
-              <w:t>492 manifest artifacts; missing=0</w:t>
+              <w:t>495 manifest artifacts; missing=0</w:t>
             </w:r>
           </w:p>
         </w:tc>
@@ -27350,6 +28383,143 @@
                 <w:sz w:val="16"/>
               </w:rPr>
               <w:t>Readability audit оценивает форму и ясность текста; он не доказывает рыночные или продуктовые claims.</w:t>
+            </w:r>
+          </w:p>
+        </w:tc>
+      </w:tr>
+      <w:tr>
+        <w:tc>
+          <w:tcPr>
+            <w:tcW w:type="dxa" w:w="2376"/>
+            <w:vAlign w:val="center"/>
+            <w:tcMar>
+              <w:top w:w="80" w:type="dxa"/>
+              <w:start w:w="120" w:type="dxa"/>
+              <w:bottom w:w="80" w:type="dxa"/>
+              <w:end w:w="120" w:type="dxa"/>
+            </w:tcMar>
+          </w:tcPr>
+          <w:p>
+            <w:pPr>
+              <w:spacing w:after="0"/>
+              <w:jc w:val="left"/>
+            </w:pPr>
+            <w:r>
+              <w:rPr>
+                <w:rFonts w:ascii="Arial" w:hAnsi="Arial" w:eastAsia="Arial"/>
+                <w:b w:val="0"/>
+                <w:color w:val="111827"/>
+                <w:sz w:val="16"/>
+              </w:rPr>
+              <w:t>SRC_11_SOURCE_QUALITY_GAP</w:t>
+            </w:r>
+          </w:p>
+        </w:tc>
+        <w:tc>
+          <w:tcPr>
+            <w:tcW w:type="dxa" w:w="1224"/>
+            <w:vAlign w:val="center"/>
+            <w:tcMar>
+              <w:top w:w="80" w:type="dxa"/>
+              <w:start w:w="120" w:type="dxa"/>
+              <w:bottom w:w="80" w:type="dxa"/>
+              <w:end w:w="120" w:type="dxa"/>
+            </w:tcMar>
+          </w:tcPr>
+          <w:p>
+            <w:pPr>
+              <w:spacing w:after="0"/>
+              <w:jc w:val="left"/>
+            </w:pPr>
+            <w:r>
+              <w:rPr>
+                <w:rFonts w:ascii="Arial" w:hAnsi="Arial" w:eastAsia="Arial"/>
+                <w:b w:val="0"/>
+                <w:color w:val="111827"/>
+                <w:sz w:val="16"/>
+              </w:rPr>
+              <w:t>Описание проекта и гипотеза #1</w:t>
+            </w:r>
+          </w:p>
+        </w:tc>
+        <w:tc>
+          <w:tcPr>
+            <w:tcW w:type="dxa" w:w="1224"/>
+            <w:vAlign w:val="center"/>
+            <w:tcMar>
+              <w:top w:w="80" w:type="dxa"/>
+              <w:start w:w="120" w:type="dxa"/>
+              <w:bottom w:w="80" w:type="dxa"/>
+              <w:end w:w="120" w:type="dxa"/>
+            </w:tcMar>
+          </w:tcPr>
+          <w:p>
+            <w:pPr>
+              <w:spacing w:after="0"/>
+              <w:jc w:val="left"/>
+            </w:pPr>
+            <w:r>
+              <w:rPr>
+                <w:rFonts w:ascii="Arial" w:hAnsi="Arial" w:eastAsia="Arial"/>
+                <w:b w:val="0"/>
+                <w:color w:val="111827"/>
+                <w:sz w:val="16"/>
+              </w:rPr>
+              <w:t>доказано как source-quality audit, не validation proof</w:t>
+            </w:r>
+          </w:p>
+        </w:tc>
+        <w:tc>
+          <w:tcPr>
+            <w:tcW w:type="dxa" w:w="1944"/>
+            <w:vAlign w:val="center"/>
+            <w:tcMar>
+              <w:top w:w="80" w:type="dxa"/>
+              <w:start w:w="120" w:type="dxa"/>
+              <w:bottom w:w="80" w:type="dxa"/>
+              <w:end w:w="120" w:type="dxa"/>
+            </w:tcMar>
+          </w:tcPr>
+          <w:p>
+            <w:pPr>
+              <w:spacing w:after="0"/>
+              <w:jc w:val="left"/>
+            </w:pPr>
+            <w:r>
+              <w:rPr>
+                <w:rFonts w:ascii="Arial" w:hAnsi="Arial" w:eastAsia="Arial"/>
+                <w:b w:val="0"/>
+                <w:color w:val="111827"/>
+                <w:sz w:val="16"/>
+              </w:rPr>
+              <w:t>5 market source-quality rows</w:t>
+            </w:r>
+          </w:p>
+        </w:tc>
+        <w:tc>
+          <w:tcPr>
+            <w:tcW w:type="dxa" w:w="2592"/>
+            <w:vAlign w:val="center"/>
+            <w:tcMar>
+              <w:top w:w="80" w:type="dxa"/>
+              <w:start w:w="120" w:type="dxa"/>
+              <w:bottom w:w="80" w:type="dxa"/>
+              <w:end w:w="120" w:type="dxa"/>
+            </w:tcMar>
+          </w:tcPr>
+          <w:p>
+            <w:pPr>
+              <w:spacing w:after="0"/>
+              <w:jc w:val="left"/>
+            </w:pPr>
+            <w:r>
+              <w:rPr>
+                <w:rFonts w:ascii="Arial" w:hAnsi="Arial" w:eastAsia="Arial"/>
+                <w:b w:val="0"/>
+                <w:color w:val="111827"/>
+                <w:sz w:val="16"/>
+              </w:rPr>
+              <w:t>Source quality audit показывает качество coverage и next lanes; он не доказывает PMF, WTP или отсутствие hidden clone.</w:t>
             </w:r>
           </w:p>
         </w:tc>
@@ -27496,6 +28666,15 @@
       </w:pPr>
       <w:r>
         <w:t>data_processed/global_report_readability_audit.csv</w:t>
+      </w:r>
+    </w:p>
+    <w:p>
+      <w:pPr>
+        <w:pStyle w:val="ListBullet"/>
+        <w:spacing w:after="80"/>
+      </w:pPr>
+      <w:r>
+        <w:t>data_processed/global_source_quality_gap_audit.csv</w:t>
       </w:r>
     </w:p>
     <w:p>

</xml_diff>

<commit_message>
Add market model sensitivity audit
</commit_message>
<xml_diff>
--- a/output/docx/alina-global-hypothesis-report-v1.docx
+++ b/output/docx/alina-global-hypothesis-report-v1.docx
@@ -31,7 +31,7 @@
     </w:p>
     <w:p>
       <w:r>
-        <w:t>Собрано: 2026-05-31T16:52:28.036Z</w:t>
+        <w:t>Собрано: 2026-05-31T16:58:13.989Z</w:t>
       </w:r>
     </w:p>
     <w:p>
@@ -64,7 +64,7 @@
     </w:p>
     <w:p>
       <w:r>
-        <w:t>На текущем этапе собрано 67,525 сырьевых source-строк, 36,694 уникализированных строк и 495 локальных артефактов. Эти данные нужны не для того, чтобы объявить продукт доказанным, а для последовательной проверки: существует ли рынок, есть ли деньги, насколько плотна конкуренция, где может быть белое пятно, кто аудитория и какую MVP-петлю надо тестировать.</w:t>
+        <w:t>На текущем этапе собрано 67,525 сырьевых source-строк, 36,694 уникализированных строк и 498 локальных артефактов. Эти данные нужны не для того, чтобы объявить продукт доказанным, а для последовательной проверки: существует ли рынок, есть ли деньги, насколько плотна конкуренция, где может быть белое пятно, кто аудитория и какую MVP-петлю надо тестировать.</w:t>
       </w:r>
     </w:p>
     <w:p>
@@ -8243,6 +8243,1403 @@
         <w:t>Для H2 это означает жесткую границу: TAM/SAM/SOM доказывает, что рынок достаточно интересен для проверки, но не доказывает, что Alina заработает эти деньги. H2 можно усиливать только после product-matched paid-flow signoff, willingness-to-pay в ICP-интервью и paid-depth signal в прототипных сессиях.</w:t>
       </w:r>
     </w:p>
+    <w:p>
+      <w:r>
+        <w:t>Чтобы H2 не опиралась на одну “красивую” рыночную цифру, отдельно добавлен sensitivity audit. Он показывает, какие assumptions двигают модель сильнее всего: ширина SAM диапазона, directness рынка, confidence weight, число источников и paid-flow/WTP evidence. Самый хрупкий слой - intersection SAM: его нельзя читать как прогноз выручки до ICP/WTP и product-matched paid-flow.</w:t>
+      </w:r>
+    </w:p>
+    <w:tbl>
+      <w:tblPr>
+        <w:tblW w:type="dxa" w:w="9360"/>
+        <w:jc w:val="left"/>
+        <w:tblLayout w:type="fixed"/>
+        <w:tblLook w:firstColumn="1" w:firstRow="1" w:lastColumn="0" w:lastRow="0" w:noHBand="0" w:noVBand="1" w:val="04A0"/>
+        <w:tblInd w:w="120" w:type="dxa"/>
+        <w:tblBorders>
+          <w:top w:val="single" w:sz="4" w:space="0" w:color="CBD5E1"/>
+          <w:left w:val="single" w:sz="4" w:space="0" w:color="CBD5E1"/>
+          <w:bottom w:val="single" w:sz="4" w:space="0" w:color="CBD5E1"/>
+          <w:right w:val="single" w:sz="4" w:space="0" w:color="CBD5E1"/>
+          <w:insideH w:val="single" w:sz="4" w:space="0" w:color="CBD5E1"/>
+          <w:insideV w:val="single" w:sz="4" w:space="0" w:color="CBD5E1"/>
+        </w:tblBorders>
+      </w:tblPr>
+      <w:tblGrid>
+        <w:gridCol w:w="1337"/>
+        <w:gridCol w:w="1337"/>
+        <w:gridCol w:w="1337"/>
+        <w:gridCol w:w="1337"/>
+        <w:gridCol w:w="1337"/>
+        <w:gridCol w:w="1337"/>
+        <w:gridCol w:w="1337"/>
+      </w:tblGrid>
+      <w:tr>
+        <w:tc>
+          <w:tcPr>
+            <w:tcW w:type="dxa" w:w="1337"/>
+            <w:vAlign w:val="center"/>
+            <w:tcMar>
+              <w:top w:w="80" w:type="dxa"/>
+              <w:start w:w="120" w:type="dxa"/>
+              <w:bottom w:w="80" w:type="dxa"/>
+              <w:end w:w="120" w:type="dxa"/>
+            </w:tcMar>
+            <w:shd w:fill="E8EEF5"/>
+          </w:tcPr>
+          <w:p>
+            <w:pPr>
+              <w:spacing w:after="0"/>
+              <w:jc w:val="left"/>
+            </w:pPr>
+            <w:r>
+              <w:rPr>
+                <w:rFonts w:ascii="Arial" w:hAnsi="Arial" w:eastAsia="Arial"/>
+                <w:b/>
+                <w:color w:val="111827"/>
+                <w:sz w:val="16"/>
+              </w:rPr>
+              <w:t>Pillar</w:t>
+            </w:r>
+          </w:p>
+        </w:tc>
+        <w:tc>
+          <w:tcPr>
+            <w:tcW w:type="dxa" w:w="1337"/>
+            <w:vAlign w:val="center"/>
+            <w:tcMar>
+              <w:top w:w="80" w:type="dxa"/>
+              <w:start w:w="120" w:type="dxa"/>
+              <w:bottom w:w="80" w:type="dxa"/>
+              <w:end w:w="120" w:type="dxa"/>
+            </w:tcMar>
+            <w:shd w:fill="E8EEF5"/>
+          </w:tcPr>
+          <w:p>
+            <w:pPr>
+              <w:spacing w:after="0"/>
+              <w:jc w:val="left"/>
+            </w:pPr>
+            <w:r>
+              <w:rPr>
+                <w:rFonts w:ascii="Arial" w:hAnsi="Arial" w:eastAsia="Arial"/>
+                <w:b/>
+                <w:color w:val="111827"/>
+                <w:sz w:val="16"/>
+              </w:rPr>
+              <w:t>SAM base</w:t>
+            </w:r>
+          </w:p>
+        </w:tc>
+        <w:tc>
+          <w:tcPr>
+            <w:tcW w:type="dxa" w:w="1337"/>
+            <w:vAlign w:val="center"/>
+            <w:tcMar>
+              <w:top w:w="80" w:type="dxa"/>
+              <w:start w:w="120" w:type="dxa"/>
+              <w:bottom w:w="80" w:type="dxa"/>
+              <w:end w:w="120" w:type="dxa"/>
+            </w:tcMar>
+            <w:shd w:fill="E8EEF5"/>
+          </w:tcPr>
+          <w:p>
+            <w:pPr>
+              <w:spacing w:after="0"/>
+              <w:jc w:val="left"/>
+            </w:pPr>
+            <w:r>
+              <w:rPr>
+                <w:rFonts w:ascii="Arial" w:hAnsi="Arial" w:eastAsia="Arial"/>
+                <w:b/>
+                <w:color w:val="111827"/>
+                <w:sz w:val="16"/>
+              </w:rPr>
+              <w:t>Weighted SAM</w:t>
+            </w:r>
+          </w:p>
+        </w:tc>
+        <w:tc>
+          <w:tcPr>
+            <w:tcW w:type="dxa" w:w="1337"/>
+            <w:vAlign w:val="center"/>
+            <w:tcMar>
+              <w:top w:w="80" w:type="dxa"/>
+              <w:start w:w="120" w:type="dxa"/>
+              <w:bottom w:w="80" w:type="dxa"/>
+              <w:end w:w="120" w:type="dxa"/>
+            </w:tcMar>
+            <w:shd w:fill="E8EEF5"/>
+          </w:tcPr>
+          <w:p>
+            <w:pPr>
+              <w:spacing w:after="0"/>
+              <w:jc w:val="left"/>
+            </w:pPr>
+            <w:r>
+              <w:rPr>
+                <w:rFonts w:ascii="Arial" w:hAnsi="Arial" w:eastAsia="Arial"/>
+                <w:b/>
+                <w:color w:val="111827"/>
+                <w:sz w:val="16"/>
+              </w:rPr>
+              <w:t>SAM spread</w:t>
+            </w:r>
+          </w:p>
+        </w:tc>
+        <w:tc>
+          <w:tcPr>
+            <w:tcW w:type="dxa" w:w="1337"/>
+            <w:vAlign w:val="center"/>
+            <w:tcMar>
+              <w:top w:w="80" w:type="dxa"/>
+              <w:start w:w="120" w:type="dxa"/>
+              <w:bottom w:w="80" w:type="dxa"/>
+              <w:end w:w="120" w:type="dxa"/>
+            </w:tcMar>
+            <w:shd w:fill="E8EEF5"/>
+          </w:tcPr>
+          <w:p>
+            <w:pPr>
+              <w:spacing w:after="0"/>
+              <w:jc w:val="left"/>
+            </w:pPr>
+            <w:r>
+              <w:rPr>
+                <w:rFonts w:ascii="Arial" w:hAnsi="Arial" w:eastAsia="Arial"/>
+                <w:b/>
+                <w:color w:val="111827"/>
+                <w:sz w:val="16"/>
+              </w:rPr>
+              <w:t>Risk</w:t>
+            </w:r>
+          </w:p>
+        </w:tc>
+        <w:tc>
+          <w:tcPr>
+            <w:tcW w:type="dxa" w:w="1337"/>
+            <w:vAlign w:val="center"/>
+            <w:tcMar>
+              <w:top w:w="80" w:type="dxa"/>
+              <w:start w:w="120" w:type="dxa"/>
+              <w:bottom w:w="80" w:type="dxa"/>
+              <w:end w:w="120" w:type="dxa"/>
+            </w:tcMar>
+            <w:shd w:fill="E8EEF5"/>
+          </w:tcPr>
+          <w:p>
+            <w:pPr>
+              <w:spacing w:after="0"/>
+              <w:jc w:val="left"/>
+            </w:pPr>
+            <w:r>
+              <w:rPr>
+                <w:rFonts w:ascii="Arial" w:hAnsi="Arial" w:eastAsia="Arial"/>
+                <w:b/>
+                <w:color w:val="111827"/>
+                <w:sz w:val="16"/>
+              </w:rPr>
+              <w:t>Main driver</w:t>
+            </w:r>
+          </w:p>
+        </w:tc>
+        <w:tc>
+          <w:tcPr>
+            <w:tcW w:type="dxa" w:w="1337"/>
+            <w:vAlign w:val="center"/>
+            <w:tcMar>
+              <w:top w:w="80" w:type="dxa"/>
+              <w:start w:w="120" w:type="dxa"/>
+              <w:bottom w:w="80" w:type="dxa"/>
+              <w:end w:w="120" w:type="dxa"/>
+            </w:tcMar>
+            <w:shd w:fill="E8EEF5"/>
+          </w:tcPr>
+          <w:p>
+            <w:pPr>
+              <w:spacing w:after="0"/>
+              <w:jc w:val="left"/>
+            </w:pPr>
+            <w:r>
+              <w:rPr>
+                <w:rFonts w:ascii="Arial" w:hAnsi="Arial" w:eastAsia="Arial"/>
+                <w:b/>
+                <w:color w:val="111827"/>
+                <w:sz w:val="16"/>
+              </w:rPr>
+              <w:t>Next proof</w:t>
+            </w:r>
+          </w:p>
+        </w:tc>
+      </w:tr>
+      <w:tr>
+        <w:tc>
+          <w:tcPr>
+            <w:tcW w:type="dxa" w:w="1337"/>
+            <w:vAlign w:val="center"/>
+            <w:tcMar>
+              <w:top w:w="80" w:type="dxa"/>
+              <w:start w:w="120" w:type="dxa"/>
+              <w:bottom w:w="80" w:type="dxa"/>
+              <w:end w:w="120" w:type="dxa"/>
+            </w:tcMar>
+          </w:tcPr>
+          <w:p>
+            <w:pPr>
+              <w:spacing w:after="0"/>
+              <w:jc w:val="left"/>
+            </w:pPr>
+            <w:r>
+              <w:rPr>
+                <w:rFonts w:ascii="Arial" w:hAnsi="Arial" w:eastAsia="Arial"/>
+                <w:b w:val="0"/>
+                <w:color w:val="111827"/>
+                <w:sz w:val="16"/>
+              </w:rPr>
+              <w:t>gaming</w:t>
+            </w:r>
+          </w:p>
+        </w:tc>
+        <w:tc>
+          <w:tcPr>
+            <w:tcW w:type="dxa" w:w="1337"/>
+            <w:vAlign w:val="center"/>
+            <w:tcMar>
+              <w:top w:w="80" w:type="dxa"/>
+              <w:start w:w="120" w:type="dxa"/>
+              <w:bottom w:w="80" w:type="dxa"/>
+              <w:end w:w="120" w:type="dxa"/>
+            </w:tcMar>
+          </w:tcPr>
+          <w:p>
+            <w:pPr>
+              <w:spacing w:after="0"/>
+              <w:jc w:val="left"/>
+            </w:pPr>
+            <w:r>
+              <w:rPr>
+                <w:rFonts w:ascii="Arial" w:hAnsi="Arial" w:eastAsia="Arial"/>
+                <w:b w:val="0"/>
+                <w:color w:val="111827"/>
+                <w:sz w:val="16"/>
+              </w:rPr>
+              <w:t>$671M</w:t>
+            </w:r>
+          </w:p>
+        </w:tc>
+        <w:tc>
+          <w:tcPr>
+            <w:tcW w:type="dxa" w:w="1337"/>
+            <w:vAlign w:val="center"/>
+            <w:tcMar>
+              <w:top w:w="80" w:type="dxa"/>
+              <w:start w:w="120" w:type="dxa"/>
+              <w:bottom w:w="80" w:type="dxa"/>
+              <w:end w:w="120" w:type="dxa"/>
+            </w:tcMar>
+          </w:tcPr>
+          <w:p>
+            <w:pPr>
+              <w:spacing w:after="0"/>
+              <w:jc w:val="left"/>
+            </w:pPr>
+            <w:r>
+              <w:rPr>
+                <w:rFonts w:ascii="Arial" w:hAnsi="Arial" w:eastAsia="Arial"/>
+                <w:b w:val="0"/>
+                <w:color w:val="111827"/>
+                <w:sz w:val="16"/>
+              </w:rPr>
+              <w:t>$470M</w:t>
+            </w:r>
+          </w:p>
+        </w:tc>
+        <w:tc>
+          <w:tcPr>
+            <w:tcW w:type="dxa" w:w="1337"/>
+            <w:vAlign w:val="center"/>
+            <w:tcMar>
+              <w:top w:w="80" w:type="dxa"/>
+              <w:start w:w="120" w:type="dxa"/>
+              <w:bottom w:w="80" w:type="dxa"/>
+              <w:end w:w="120" w:type="dxa"/>
+            </w:tcMar>
+          </w:tcPr>
+          <w:p>
+            <w:pPr>
+              <w:spacing w:after="0"/>
+              <w:jc w:val="left"/>
+            </w:pPr>
+            <w:r>
+              <w:rPr>
+                <w:rFonts w:ascii="Arial" w:hAnsi="Arial" w:eastAsia="Arial"/>
+                <w:b w:val="0"/>
+                <w:color w:val="111827"/>
+                <w:sz w:val="16"/>
+              </w:rPr>
+              <w:t>7.3</w:t>
+            </w:r>
+          </w:p>
+        </w:tc>
+        <w:tc>
+          <w:tcPr>
+            <w:tcW w:type="dxa" w:w="1337"/>
+            <w:vAlign w:val="center"/>
+            <w:tcMar>
+              <w:top w:w="80" w:type="dxa"/>
+              <w:start w:w="120" w:type="dxa"/>
+              <w:bottom w:w="80" w:type="dxa"/>
+              <w:end w:w="120" w:type="dxa"/>
+            </w:tcMar>
+          </w:tcPr>
+          <w:p>
+            <w:pPr>
+              <w:spacing w:after="0"/>
+              <w:jc w:val="left"/>
+            </w:pPr>
+            <w:r>
+              <w:rPr>
+                <w:rFonts w:ascii="Arial" w:hAnsi="Arial" w:eastAsia="Arial"/>
+                <w:b w:val="0"/>
+                <w:color w:val="111827"/>
+                <w:sz w:val="16"/>
+              </w:rPr>
+              <w:t>средний</w:t>
+            </w:r>
+          </w:p>
+        </w:tc>
+        <w:tc>
+          <w:tcPr>
+            <w:tcW w:type="dxa" w:w="1337"/>
+            <w:vAlign w:val="center"/>
+            <w:tcMar>
+              <w:top w:w="80" w:type="dxa"/>
+              <w:start w:w="120" w:type="dxa"/>
+              <w:bottom w:w="80" w:type="dxa"/>
+              <w:end w:w="120" w:type="dxa"/>
+            </w:tcMar>
+          </w:tcPr>
+          <w:p>
+            <w:pPr>
+              <w:spacing w:after="0"/>
+              <w:jc w:val="left"/>
+            </w:pPr>
+            <w:r>
+              <w:rPr>
+                <w:rFonts w:ascii="Arial" w:hAnsi="Arial" w:eastAsia="Arial"/>
+                <w:b w:val="0"/>
+                <w:color w:val="111827"/>
+                <w:sz w:val="16"/>
+              </w:rPr>
+              <w:t>directness: benchmark нельзя считать прямым TAM</w:t>
+            </w:r>
+          </w:p>
+        </w:tc>
+        <w:tc>
+          <w:tcPr>
+            <w:tcW w:type="dxa" w:w="1337"/>
+            <w:vAlign w:val="center"/>
+            <w:tcMar>
+              <w:top w:w="80" w:type="dxa"/>
+              <w:start w:w="120" w:type="dxa"/>
+              <w:bottom w:w="80" w:type="dxa"/>
+              <w:end w:w="120" w:type="dxa"/>
+            </w:tcMar>
+          </w:tcPr>
+          <w:p>
+            <w:pPr>
+              <w:spacing w:after="0"/>
+              <w:jc w:val="left"/>
+            </w:pPr>
+            <w:r>
+              <w:rPr>
+                <w:rFonts w:ascii="Arial" w:hAnsi="Arial" w:eastAsia="Arial"/>
+                <w:b w:val="0"/>
+                <w:color w:val="111827"/>
+                <w:sz w:val="16"/>
+              </w:rPr>
+              <w:t>оставить как mechanics benchmark; не включать в прямой H2 proof</w:t>
+            </w:r>
+          </w:p>
+        </w:tc>
+      </w:tr>
+      <w:tr>
+        <w:tc>
+          <w:tcPr>
+            <w:tcW w:type="dxa" w:w="1337"/>
+            <w:vAlign w:val="center"/>
+            <w:tcMar>
+              <w:top w:w="80" w:type="dxa"/>
+              <w:start w:w="120" w:type="dxa"/>
+              <w:bottom w:w="80" w:type="dxa"/>
+              <w:end w:w="120" w:type="dxa"/>
+            </w:tcMar>
+            <w:shd w:fill="F8FAFC"/>
+          </w:tcPr>
+          <w:p>
+            <w:pPr>
+              <w:spacing w:after="0"/>
+              <w:jc w:val="left"/>
+            </w:pPr>
+            <w:r>
+              <w:rPr>
+                <w:rFonts w:ascii="Arial" w:hAnsi="Arial" w:eastAsia="Arial"/>
+                <w:b w:val="0"/>
+                <w:color w:val="111827"/>
+                <w:sz w:val="16"/>
+              </w:rPr>
+              <w:t>astrology_esoterics</w:t>
+            </w:r>
+          </w:p>
+        </w:tc>
+        <w:tc>
+          <w:tcPr>
+            <w:tcW w:type="dxa" w:w="1337"/>
+            <w:vAlign w:val="center"/>
+            <w:tcMar>
+              <w:top w:w="80" w:type="dxa"/>
+              <w:start w:w="120" w:type="dxa"/>
+              <w:bottom w:w="80" w:type="dxa"/>
+              <w:end w:w="120" w:type="dxa"/>
+            </w:tcMar>
+            <w:shd w:fill="F8FAFC"/>
+          </w:tcPr>
+          <w:p>
+            <w:pPr>
+              <w:spacing w:after="0"/>
+              <w:jc w:val="left"/>
+            </w:pPr>
+            <w:r>
+              <w:rPr>
+                <w:rFonts w:ascii="Arial" w:hAnsi="Arial" w:eastAsia="Arial"/>
+                <w:b w:val="0"/>
+                <w:color w:val="111827"/>
+                <w:sz w:val="16"/>
+              </w:rPr>
+              <w:t>$374M</w:t>
+            </w:r>
+          </w:p>
+        </w:tc>
+        <w:tc>
+          <w:tcPr>
+            <w:tcW w:type="dxa" w:w="1337"/>
+            <w:vAlign w:val="center"/>
+            <w:tcMar>
+              <w:top w:w="80" w:type="dxa"/>
+              <w:start w:w="120" w:type="dxa"/>
+              <w:bottom w:w="80" w:type="dxa"/>
+              <w:end w:w="120" w:type="dxa"/>
+            </w:tcMar>
+            <w:shd w:fill="F8FAFC"/>
+          </w:tcPr>
+          <w:p>
+            <w:pPr>
+              <w:spacing w:after="0"/>
+              <w:jc w:val="left"/>
+            </w:pPr>
+            <w:r>
+              <w:rPr>
+                <w:rFonts w:ascii="Arial" w:hAnsi="Arial" w:eastAsia="Arial"/>
+                <w:b w:val="0"/>
+                <w:color w:val="111827"/>
+                <w:sz w:val="16"/>
+              </w:rPr>
+              <w:t>$262M</w:t>
+            </w:r>
+          </w:p>
+        </w:tc>
+        <w:tc>
+          <w:tcPr>
+            <w:tcW w:type="dxa" w:w="1337"/>
+            <w:vAlign w:val="center"/>
+            <w:tcMar>
+              <w:top w:w="80" w:type="dxa"/>
+              <w:start w:w="120" w:type="dxa"/>
+              <w:bottom w:w="80" w:type="dxa"/>
+              <w:end w:w="120" w:type="dxa"/>
+            </w:tcMar>
+            <w:shd w:fill="F8FAFC"/>
+          </w:tcPr>
+          <w:p>
+            <w:pPr>
+              <w:spacing w:after="0"/>
+              <w:jc w:val="left"/>
+            </w:pPr>
+            <w:r>
+              <w:rPr>
+                <w:rFonts w:ascii="Arial" w:hAnsi="Arial" w:eastAsia="Arial"/>
+                <w:b w:val="0"/>
+                <w:color w:val="111827"/>
+                <w:sz w:val="16"/>
+              </w:rPr>
+              <w:t>9.4</w:t>
+            </w:r>
+          </w:p>
+        </w:tc>
+        <w:tc>
+          <w:tcPr>
+            <w:tcW w:type="dxa" w:w="1337"/>
+            <w:vAlign w:val="center"/>
+            <w:tcMar>
+              <w:top w:w="80" w:type="dxa"/>
+              <w:start w:w="120" w:type="dxa"/>
+              <w:bottom w:w="80" w:type="dxa"/>
+              <w:end w:w="120" w:type="dxa"/>
+            </w:tcMar>
+            <w:shd w:fill="F8FAFC"/>
+          </w:tcPr>
+          <w:p>
+            <w:pPr>
+              <w:spacing w:after="0"/>
+              <w:jc w:val="left"/>
+            </w:pPr>
+            <w:r>
+              <w:rPr>
+                <w:rFonts w:ascii="Arial" w:hAnsi="Arial" w:eastAsia="Arial"/>
+                <w:b w:val="0"/>
+                <w:color w:val="111827"/>
+                <w:sz w:val="16"/>
+              </w:rPr>
+              <w:t>средне-высокий</w:t>
+            </w:r>
+          </w:p>
+        </w:tc>
+        <w:tc>
+          <w:tcPr>
+            <w:tcW w:type="dxa" w:w="1337"/>
+            <w:vAlign w:val="center"/>
+            <w:tcMar>
+              <w:top w:w="80" w:type="dxa"/>
+              <w:start w:w="120" w:type="dxa"/>
+              <w:bottom w:w="80" w:type="dxa"/>
+              <w:end w:w="120" w:type="dxa"/>
+            </w:tcMar>
+            <w:shd w:fill="F8FAFC"/>
+          </w:tcPr>
+          <w:p>
+            <w:pPr>
+              <w:spacing w:after="0"/>
+              <w:jc w:val="left"/>
+            </w:pPr>
+            <w:r>
+              <w:rPr>
+                <w:rFonts w:ascii="Arial" w:hAnsi="Arial" w:eastAsia="Arial"/>
+                <w:b w:val="0"/>
+                <w:color w:val="111827"/>
+                <w:sz w:val="16"/>
+              </w:rPr>
+              <w:t>paid-flow/WTP still unobserved</w:t>
+            </w:r>
+          </w:p>
+        </w:tc>
+        <w:tc>
+          <w:tcPr>
+            <w:tcW w:type="dxa" w:w="1337"/>
+            <w:vAlign w:val="center"/>
+            <w:tcMar>
+              <w:top w:w="80" w:type="dxa"/>
+              <w:start w:w="120" w:type="dxa"/>
+              <w:bottom w:w="80" w:type="dxa"/>
+              <w:end w:w="120" w:type="dxa"/>
+            </w:tcMar>
+            <w:shd w:fill="F8FAFC"/>
+          </w:tcPr>
+          <w:p>
+            <w:pPr>
+              <w:spacing w:after="0"/>
+              <w:jc w:val="left"/>
+            </w:pPr>
+            <w:r>
+              <w:rPr>
+                <w:rFonts w:ascii="Arial" w:hAnsi="Arial" w:eastAsia="Arial"/>
+                <w:b w:val="0"/>
+                <w:color w:val="111827"/>
+                <w:sz w:val="16"/>
+              </w:rPr>
+              <w:t>добрать paid-flow screenshots и WTP/prototype paid-depth signals</w:t>
+            </w:r>
+          </w:p>
+        </w:tc>
+      </w:tr>
+      <w:tr>
+        <w:tc>
+          <w:tcPr>
+            <w:tcW w:type="dxa" w:w="1337"/>
+            <w:vAlign w:val="center"/>
+            <w:tcMar>
+              <w:top w:w="80" w:type="dxa"/>
+              <w:start w:w="120" w:type="dxa"/>
+              <w:bottom w:w="80" w:type="dxa"/>
+              <w:end w:w="120" w:type="dxa"/>
+            </w:tcMar>
+          </w:tcPr>
+          <w:p>
+            <w:pPr>
+              <w:spacing w:after="0"/>
+              <w:jc w:val="left"/>
+            </w:pPr>
+            <w:r>
+              <w:rPr>
+                <w:rFonts w:ascii="Arial" w:hAnsi="Arial" w:eastAsia="Arial"/>
+                <w:b w:val="0"/>
+                <w:color w:val="111827"/>
+                <w:sz w:val="16"/>
+              </w:rPr>
+              <w:t>avatar_identity</w:t>
+            </w:r>
+          </w:p>
+        </w:tc>
+        <w:tc>
+          <w:tcPr>
+            <w:tcW w:type="dxa" w:w="1337"/>
+            <w:vAlign w:val="center"/>
+            <w:tcMar>
+              <w:top w:w="80" w:type="dxa"/>
+              <w:start w:w="120" w:type="dxa"/>
+              <w:bottom w:w="80" w:type="dxa"/>
+              <w:end w:w="120" w:type="dxa"/>
+            </w:tcMar>
+          </w:tcPr>
+          <w:p>
+            <w:pPr>
+              <w:spacing w:after="0"/>
+              <w:jc w:val="left"/>
+            </w:pPr>
+            <w:r>
+              <w:rPr>
+                <w:rFonts w:ascii="Arial" w:hAnsi="Arial" w:eastAsia="Arial"/>
+                <w:b w:val="0"/>
+                <w:color w:val="111827"/>
+                <w:sz w:val="16"/>
+              </w:rPr>
+              <w:t>$420M</w:t>
+            </w:r>
+          </w:p>
+        </w:tc>
+        <w:tc>
+          <w:tcPr>
+            <w:tcW w:type="dxa" w:w="1337"/>
+            <w:vAlign w:val="center"/>
+            <w:tcMar>
+              <w:top w:w="80" w:type="dxa"/>
+              <w:start w:w="120" w:type="dxa"/>
+              <w:bottom w:w="80" w:type="dxa"/>
+              <w:end w:w="120" w:type="dxa"/>
+            </w:tcMar>
+          </w:tcPr>
+          <w:p>
+            <w:pPr>
+              <w:spacing w:after="0"/>
+              <w:jc w:val="left"/>
+            </w:pPr>
+            <w:r>
+              <w:rPr>
+                <w:rFonts w:ascii="Arial" w:hAnsi="Arial" w:eastAsia="Arial"/>
+                <w:b w:val="0"/>
+                <w:color w:val="111827"/>
+                <w:sz w:val="16"/>
+              </w:rPr>
+              <w:t>$294M</w:t>
+            </w:r>
+          </w:p>
+        </w:tc>
+        <w:tc>
+          <w:tcPr>
+            <w:tcW w:type="dxa" w:w="1337"/>
+            <w:vAlign w:val="center"/>
+            <w:tcMar>
+              <w:top w:w="80" w:type="dxa"/>
+              <w:start w:w="120" w:type="dxa"/>
+              <w:bottom w:w="80" w:type="dxa"/>
+              <w:end w:w="120" w:type="dxa"/>
+            </w:tcMar>
+          </w:tcPr>
+          <w:p>
+            <w:pPr>
+              <w:spacing w:after="0"/>
+              <w:jc w:val="left"/>
+            </w:pPr>
+            <w:r>
+              <w:rPr>
+                <w:rFonts w:ascii="Arial" w:hAnsi="Arial" w:eastAsia="Arial"/>
+                <w:b w:val="0"/>
+                <w:color w:val="111827"/>
+                <w:sz w:val="16"/>
+              </w:rPr>
+              <w:t>29.4</w:t>
+            </w:r>
+          </w:p>
+        </w:tc>
+        <w:tc>
+          <w:tcPr>
+            <w:tcW w:type="dxa" w:w="1337"/>
+            <w:vAlign w:val="center"/>
+            <w:tcMar>
+              <w:top w:w="80" w:type="dxa"/>
+              <w:start w:w="120" w:type="dxa"/>
+              <w:bottom w:w="80" w:type="dxa"/>
+              <w:end w:w="120" w:type="dxa"/>
+            </w:tcMar>
+          </w:tcPr>
+          <w:p>
+            <w:pPr>
+              <w:spacing w:after="0"/>
+              <w:jc w:val="left"/>
+            </w:pPr>
+            <w:r>
+              <w:rPr>
+                <w:rFonts w:ascii="Arial" w:hAnsi="Arial" w:eastAsia="Arial"/>
+                <w:b w:val="0"/>
+                <w:color w:val="111827"/>
+                <w:sz w:val="16"/>
+              </w:rPr>
+              <w:t>высокий</w:t>
+            </w:r>
+          </w:p>
+        </w:tc>
+        <w:tc>
+          <w:tcPr>
+            <w:tcW w:type="dxa" w:w="1337"/>
+            <w:vAlign w:val="center"/>
+            <w:tcMar>
+              <w:top w:w="80" w:type="dxa"/>
+              <w:start w:w="120" w:type="dxa"/>
+              <w:bottom w:w="80" w:type="dxa"/>
+              <w:end w:w="120" w:type="dxa"/>
+            </w:tcMar>
+          </w:tcPr>
+          <w:p>
+            <w:pPr>
+              <w:spacing w:after="0"/>
+              <w:jc w:val="left"/>
+            </w:pPr>
+            <w:r>
+              <w:rPr>
+                <w:rFonts w:ascii="Arial" w:hAnsi="Arial" w:eastAsia="Arial"/>
+                <w:b w:val="0"/>
+                <w:color w:val="111827"/>
+                <w:sz w:val="16"/>
+              </w:rPr>
+              <w:t>ширина диапазона SAM</w:t>
+            </w:r>
+          </w:p>
+        </w:tc>
+        <w:tc>
+          <w:tcPr>
+            <w:tcW w:type="dxa" w:w="1337"/>
+            <w:vAlign w:val="center"/>
+            <w:tcMar>
+              <w:top w:w="80" w:type="dxa"/>
+              <w:start w:w="120" w:type="dxa"/>
+              <w:bottom w:w="80" w:type="dxa"/>
+              <w:end w:w="120" w:type="dxa"/>
+            </w:tcMar>
+          </w:tcPr>
+          <w:p>
+            <w:pPr>
+              <w:spacing w:after="0"/>
+              <w:jc w:val="left"/>
+            </w:pPr>
+            <w:r>
+              <w:rPr>
+                <w:rFonts w:ascii="Arial" w:hAnsi="Arial" w:eastAsia="Arial"/>
+                <w:b w:val="0"/>
+                <w:color w:val="111827"/>
+                <w:sz w:val="16"/>
+              </w:rPr>
+              <w:t>добавить credible market anchors и source-confidence refresh</w:t>
+            </w:r>
+          </w:p>
+        </w:tc>
+      </w:tr>
+      <w:tr>
+        <w:tc>
+          <w:tcPr>
+            <w:tcW w:type="dxa" w:w="1337"/>
+            <w:vAlign w:val="center"/>
+            <w:tcMar>
+              <w:top w:w="80" w:type="dxa"/>
+              <w:start w:w="120" w:type="dxa"/>
+              <w:bottom w:w="80" w:type="dxa"/>
+              <w:end w:w="120" w:type="dxa"/>
+            </w:tcMar>
+            <w:shd w:fill="F8FAFC"/>
+          </w:tcPr>
+          <w:p>
+            <w:pPr>
+              <w:spacing w:after="0"/>
+              <w:jc w:val="left"/>
+            </w:pPr>
+            <w:r>
+              <w:rPr>
+                <w:rFonts w:ascii="Arial" w:hAnsi="Arial" w:eastAsia="Arial"/>
+                <w:b w:val="0"/>
+                <w:color w:val="111827"/>
+                <w:sz w:val="16"/>
+              </w:rPr>
+              <w:t>coaching</w:t>
+            </w:r>
+          </w:p>
+        </w:tc>
+        <w:tc>
+          <w:tcPr>
+            <w:tcW w:type="dxa" w:w="1337"/>
+            <w:vAlign w:val="center"/>
+            <w:tcMar>
+              <w:top w:w="80" w:type="dxa"/>
+              <w:start w:w="120" w:type="dxa"/>
+              <w:bottom w:w="80" w:type="dxa"/>
+              <w:end w:w="120" w:type="dxa"/>
+            </w:tcMar>
+            <w:shd w:fill="F8FAFC"/>
+          </w:tcPr>
+          <w:p>
+            <w:pPr>
+              <w:spacing w:after="0"/>
+              <w:jc w:val="left"/>
+            </w:pPr>
+            <w:r>
+              <w:rPr>
+                <w:rFonts w:ascii="Arial" w:hAnsi="Arial" w:eastAsia="Arial"/>
+                <w:b w:val="0"/>
+                <w:color w:val="111827"/>
+                <w:sz w:val="16"/>
+              </w:rPr>
+              <w:t>$300M</w:t>
+            </w:r>
+          </w:p>
+        </w:tc>
+        <w:tc>
+          <w:tcPr>
+            <w:tcW w:type="dxa" w:w="1337"/>
+            <w:vAlign w:val="center"/>
+            <w:tcMar>
+              <w:top w:w="80" w:type="dxa"/>
+              <w:start w:w="120" w:type="dxa"/>
+              <w:bottom w:w="80" w:type="dxa"/>
+              <w:end w:w="120" w:type="dxa"/>
+            </w:tcMar>
+            <w:shd w:fill="F8FAFC"/>
+          </w:tcPr>
+          <w:p>
+            <w:pPr>
+              <w:spacing w:after="0"/>
+              <w:jc w:val="left"/>
+            </w:pPr>
+            <w:r>
+              <w:rPr>
+                <w:rFonts w:ascii="Arial" w:hAnsi="Arial" w:eastAsia="Arial"/>
+                <w:b w:val="0"/>
+                <w:color w:val="111827"/>
+                <w:sz w:val="16"/>
+              </w:rPr>
+              <w:t>$210M</w:t>
+            </w:r>
+          </w:p>
+        </w:tc>
+        <w:tc>
+          <w:tcPr>
+            <w:tcW w:type="dxa" w:w="1337"/>
+            <w:vAlign w:val="center"/>
+            <w:tcMar>
+              <w:top w:w="80" w:type="dxa"/>
+              <w:start w:w="120" w:type="dxa"/>
+              <w:bottom w:w="80" w:type="dxa"/>
+              <w:end w:w="120" w:type="dxa"/>
+            </w:tcMar>
+            <w:shd w:fill="F8FAFC"/>
+          </w:tcPr>
+          <w:p>
+            <w:pPr>
+              <w:spacing w:after="0"/>
+              <w:jc w:val="left"/>
+            </w:pPr>
+            <w:r>
+              <w:rPr>
+                <w:rFonts w:ascii="Arial" w:hAnsi="Arial" w:eastAsia="Arial"/>
+                <w:b w:val="0"/>
+                <w:color w:val="111827"/>
+                <w:sz w:val="16"/>
+              </w:rPr>
+              <w:t>5.3</w:t>
+            </w:r>
+          </w:p>
+        </w:tc>
+        <w:tc>
+          <w:tcPr>
+            <w:tcW w:type="dxa" w:w="1337"/>
+            <w:vAlign w:val="center"/>
+            <w:tcMar>
+              <w:top w:w="80" w:type="dxa"/>
+              <w:start w:w="120" w:type="dxa"/>
+              <w:bottom w:w="80" w:type="dxa"/>
+              <w:end w:w="120" w:type="dxa"/>
+            </w:tcMar>
+            <w:shd w:fill="F8FAFC"/>
+          </w:tcPr>
+          <w:p>
+            <w:pPr>
+              <w:spacing w:after="0"/>
+              <w:jc w:val="left"/>
+            </w:pPr>
+            <w:r>
+              <w:rPr>
+                <w:rFonts w:ascii="Arial" w:hAnsi="Arial" w:eastAsia="Arial"/>
+                <w:b w:val="0"/>
+                <w:color w:val="111827"/>
+                <w:sz w:val="16"/>
+              </w:rPr>
+              <w:t>средний</w:t>
+            </w:r>
+          </w:p>
+        </w:tc>
+        <w:tc>
+          <w:tcPr>
+            <w:tcW w:type="dxa" w:w="1337"/>
+            <w:vAlign w:val="center"/>
+            <w:tcMar>
+              <w:top w:w="80" w:type="dxa"/>
+              <w:start w:w="120" w:type="dxa"/>
+              <w:bottom w:w="80" w:type="dxa"/>
+              <w:end w:w="120" w:type="dxa"/>
+            </w:tcMar>
+            <w:shd w:fill="F8FAFC"/>
+          </w:tcPr>
+          <w:p>
+            <w:pPr>
+              <w:spacing w:after="0"/>
+              <w:jc w:val="left"/>
+            </w:pPr>
+            <w:r>
+              <w:rPr>
+                <w:rFonts w:ascii="Arial" w:hAnsi="Arial" w:eastAsia="Arial"/>
+                <w:b w:val="0"/>
+                <w:color w:val="111827"/>
+                <w:sz w:val="16"/>
+              </w:rPr>
+              <w:t>range variance источников</w:t>
+            </w:r>
+          </w:p>
+        </w:tc>
+        <w:tc>
+          <w:tcPr>
+            <w:tcW w:type="dxa" w:w="1337"/>
+            <w:vAlign w:val="center"/>
+            <w:tcMar>
+              <w:top w:w="80" w:type="dxa"/>
+              <w:start w:w="120" w:type="dxa"/>
+              <w:bottom w:w="80" w:type="dxa"/>
+              <w:end w:w="120" w:type="dxa"/>
+            </w:tcMar>
+            <w:shd w:fill="F8FAFC"/>
+          </w:tcPr>
+          <w:p>
+            <w:pPr>
+              <w:spacing w:after="0"/>
+              <w:jc w:val="left"/>
+            </w:pPr>
+            <w:r>
+              <w:rPr>
+                <w:rFonts w:ascii="Arial" w:hAnsi="Arial" w:eastAsia="Arial"/>
+                <w:b w:val="0"/>
+                <w:color w:val="111827"/>
+                <w:sz w:val="16"/>
+              </w:rPr>
+              <w:t>добрать bottom-up competitor pricing/revenue proxy и WTP signals</w:t>
+            </w:r>
+          </w:p>
+        </w:tc>
+      </w:tr>
+      <w:tr>
+        <w:tc>
+          <w:tcPr>
+            <w:tcW w:type="dxa" w:w="1337"/>
+            <w:vAlign w:val="center"/>
+            <w:tcMar>
+              <w:top w:w="80" w:type="dxa"/>
+              <w:start w:w="120" w:type="dxa"/>
+              <w:bottom w:w="80" w:type="dxa"/>
+              <w:end w:w="120" w:type="dxa"/>
+            </w:tcMar>
+          </w:tcPr>
+          <w:p>
+            <w:pPr>
+              <w:spacing w:after="0"/>
+              <w:jc w:val="left"/>
+            </w:pPr>
+            <w:r>
+              <w:rPr>
+                <w:rFonts w:ascii="Arial" w:hAnsi="Arial" w:eastAsia="Arial"/>
+                <w:b w:val="0"/>
+                <w:color w:val="111827"/>
+                <w:sz w:val="16"/>
+              </w:rPr>
+              <w:t>mindfulness</w:t>
+            </w:r>
+          </w:p>
+        </w:tc>
+        <w:tc>
+          <w:tcPr>
+            <w:tcW w:type="dxa" w:w="1337"/>
+            <w:vAlign w:val="center"/>
+            <w:tcMar>
+              <w:top w:w="80" w:type="dxa"/>
+              <w:start w:w="120" w:type="dxa"/>
+              <w:bottom w:w="80" w:type="dxa"/>
+              <w:end w:w="120" w:type="dxa"/>
+            </w:tcMar>
+          </w:tcPr>
+          <w:p>
+            <w:pPr>
+              <w:spacing w:after="0"/>
+              <w:jc w:val="left"/>
+            </w:pPr>
+            <w:r>
+              <w:rPr>
+                <w:rFonts w:ascii="Arial" w:hAnsi="Arial" w:eastAsia="Arial"/>
+                <w:b w:val="0"/>
+                <w:color w:val="111827"/>
+                <w:sz w:val="16"/>
+              </w:rPr>
+              <w:t>$252M</w:t>
+            </w:r>
+          </w:p>
+        </w:tc>
+        <w:tc>
+          <w:tcPr>
+            <w:tcW w:type="dxa" w:w="1337"/>
+            <w:vAlign w:val="center"/>
+            <w:tcMar>
+              <w:top w:w="80" w:type="dxa"/>
+              <w:start w:w="120" w:type="dxa"/>
+              <w:bottom w:w="80" w:type="dxa"/>
+              <w:end w:w="120" w:type="dxa"/>
+            </w:tcMar>
+          </w:tcPr>
+          <w:p>
+            <w:pPr>
+              <w:spacing w:after="0"/>
+              <w:jc w:val="left"/>
+            </w:pPr>
+            <w:r>
+              <w:rPr>
+                <w:rFonts w:ascii="Arial" w:hAnsi="Arial" w:eastAsia="Arial"/>
+                <w:b w:val="0"/>
+                <w:color w:val="111827"/>
+                <w:sz w:val="16"/>
+              </w:rPr>
+              <w:t>$176M</w:t>
+            </w:r>
+          </w:p>
+        </w:tc>
+        <w:tc>
+          <w:tcPr>
+            <w:tcW w:type="dxa" w:w="1337"/>
+            <w:vAlign w:val="center"/>
+            <w:tcMar>
+              <w:top w:w="80" w:type="dxa"/>
+              <w:start w:w="120" w:type="dxa"/>
+              <w:bottom w:w="80" w:type="dxa"/>
+              <w:end w:w="120" w:type="dxa"/>
+            </w:tcMar>
+          </w:tcPr>
+          <w:p>
+            <w:pPr>
+              <w:spacing w:after="0"/>
+              <w:jc w:val="left"/>
+            </w:pPr>
+            <w:r>
+              <w:rPr>
+                <w:rFonts w:ascii="Arial" w:hAnsi="Arial" w:eastAsia="Arial"/>
+                <w:b w:val="0"/>
+                <w:color w:val="111827"/>
+                <w:sz w:val="16"/>
+              </w:rPr>
+              <w:t>8.6</w:t>
+            </w:r>
+          </w:p>
+        </w:tc>
+        <w:tc>
+          <w:tcPr>
+            <w:tcW w:type="dxa" w:w="1337"/>
+            <w:vAlign w:val="center"/>
+            <w:tcMar>
+              <w:top w:w="80" w:type="dxa"/>
+              <w:start w:w="120" w:type="dxa"/>
+              <w:bottom w:w="80" w:type="dxa"/>
+              <w:end w:w="120" w:type="dxa"/>
+            </w:tcMar>
+          </w:tcPr>
+          <w:p>
+            <w:pPr>
+              <w:spacing w:after="0"/>
+              <w:jc w:val="left"/>
+            </w:pPr>
+            <w:r>
+              <w:rPr>
+                <w:rFonts w:ascii="Arial" w:hAnsi="Arial" w:eastAsia="Arial"/>
+                <w:b w:val="0"/>
+                <w:color w:val="111827"/>
+                <w:sz w:val="16"/>
+              </w:rPr>
+              <w:t>высокий</w:t>
+            </w:r>
+          </w:p>
+        </w:tc>
+        <w:tc>
+          <w:tcPr>
+            <w:tcW w:type="dxa" w:w="1337"/>
+            <w:vAlign w:val="center"/>
+            <w:tcMar>
+              <w:top w:w="80" w:type="dxa"/>
+              <w:start w:w="120" w:type="dxa"/>
+              <w:bottom w:w="80" w:type="dxa"/>
+              <w:end w:w="120" w:type="dxa"/>
+            </w:tcMar>
+          </w:tcPr>
+          <w:p>
+            <w:pPr>
+              <w:spacing w:after="0"/>
+              <w:jc w:val="left"/>
+            </w:pPr>
+            <w:r>
+              <w:rPr>
+                <w:rFonts w:ascii="Arial" w:hAnsi="Arial" w:eastAsia="Arial"/>
+                <w:b w:val="0"/>
+                <w:color w:val="111827"/>
+                <w:sz w:val="16"/>
+              </w:rPr>
+              <w:t>малое число market anchors</w:t>
+            </w:r>
+          </w:p>
+        </w:tc>
+        <w:tc>
+          <w:tcPr>
+            <w:tcW w:type="dxa" w:w="1337"/>
+            <w:vAlign w:val="center"/>
+            <w:tcMar>
+              <w:top w:w="80" w:type="dxa"/>
+              <w:start w:w="120" w:type="dxa"/>
+              <w:bottom w:w="80" w:type="dxa"/>
+              <w:end w:w="120" w:type="dxa"/>
+            </w:tcMar>
+          </w:tcPr>
+          <w:p>
+            <w:pPr>
+              <w:spacing w:after="0"/>
+              <w:jc w:val="left"/>
+            </w:pPr>
+            <w:r>
+              <w:rPr>
+                <w:rFonts w:ascii="Arial" w:hAnsi="Arial" w:eastAsia="Arial"/>
+                <w:b w:val="0"/>
+                <w:color w:val="111827"/>
+                <w:sz w:val="16"/>
+              </w:rPr>
+              <w:t>добавить credible market anchors и source-confidence refresh</w:t>
+            </w:r>
+          </w:p>
+        </w:tc>
+      </w:tr>
+      <w:tr>
+        <w:tc>
+          <w:tcPr>
+            <w:tcW w:type="dxa" w:w="1337"/>
+            <w:vAlign w:val="center"/>
+            <w:tcMar>
+              <w:top w:w="80" w:type="dxa"/>
+              <w:start w:w="120" w:type="dxa"/>
+              <w:bottom w:w="80" w:type="dxa"/>
+              <w:end w:w="120" w:type="dxa"/>
+            </w:tcMar>
+            <w:shd w:fill="F8FAFC"/>
+          </w:tcPr>
+          <w:p>
+            <w:pPr>
+              <w:spacing w:after="0"/>
+              <w:jc w:val="left"/>
+            </w:pPr>
+            <w:r>
+              <w:rPr>
+                <w:rFonts w:ascii="Arial" w:hAnsi="Arial" w:eastAsia="Arial"/>
+                <w:b w:val="0"/>
+                <w:color w:val="111827"/>
+                <w:sz w:val="16"/>
+              </w:rPr>
+              <w:t>intersection</w:t>
+            </w:r>
+          </w:p>
+        </w:tc>
+        <w:tc>
+          <w:tcPr>
+            <w:tcW w:type="dxa" w:w="1337"/>
+            <w:vAlign w:val="center"/>
+            <w:tcMar>
+              <w:top w:w="80" w:type="dxa"/>
+              <w:start w:w="120" w:type="dxa"/>
+              <w:bottom w:w="80" w:type="dxa"/>
+              <w:end w:w="120" w:type="dxa"/>
+            </w:tcMar>
+            <w:shd w:fill="F8FAFC"/>
+          </w:tcPr>
+          <w:p>
+            <w:pPr>
+              <w:spacing w:after="0"/>
+              <w:jc w:val="left"/>
+            </w:pPr>
+            <w:r>
+              <w:rPr>
+                <w:rFonts w:ascii="Arial" w:hAnsi="Arial" w:eastAsia="Arial"/>
+                <w:b w:val="0"/>
+                <w:color w:val="111827"/>
+                <w:sz w:val="16"/>
+              </w:rPr>
+              <w:t>$202M</w:t>
+            </w:r>
+          </w:p>
+        </w:tc>
+        <w:tc>
+          <w:tcPr>
+            <w:tcW w:type="dxa" w:w="1337"/>
+            <w:vAlign w:val="center"/>
+            <w:tcMar>
+              <w:top w:w="80" w:type="dxa"/>
+              <w:start w:w="120" w:type="dxa"/>
+              <w:bottom w:w="80" w:type="dxa"/>
+              <w:end w:w="120" w:type="dxa"/>
+            </w:tcMar>
+            <w:shd w:fill="F8FAFC"/>
+          </w:tcPr>
+          <w:p>
+            <w:pPr>
+              <w:spacing w:after="0"/>
+              <w:jc w:val="left"/>
+            </w:pPr>
+            <w:r>
+              <w:rPr>
+                <w:rFonts w:ascii="Arial" w:hAnsi="Arial" w:eastAsia="Arial"/>
+                <w:b w:val="0"/>
+                <w:color w:val="111827"/>
+                <w:sz w:val="16"/>
+              </w:rPr>
+              <w:t>$80.8M</w:t>
+            </w:r>
+          </w:p>
+        </w:tc>
+        <w:tc>
+          <w:tcPr>
+            <w:tcW w:type="dxa" w:w="1337"/>
+            <w:vAlign w:val="center"/>
+            <w:tcMar>
+              <w:top w:w="80" w:type="dxa"/>
+              <w:start w:w="120" w:type="dxa"/>
+              <w:bottom w:w="80" w:type="dxa"/>
+              <w:end w:w="120" w:type="dxa"/>
+            </w:tcMar>
+            <w:shd w:fill="F8FAFC"/>
+          </w:tcPr>
+          <w:p>
+            <w:pPr>
+              <w:spacing w:after="0"/>
+              <w:jc w:val="left"/>
+            </w:pPr>
+            <w:r>
+              <w:rPr>
+                <w:rFonts w:ascii="Arial" w:hAnsi="Arial" w:eastAsia="Arial"/>
+                <w:b w:val="0"/>
+                <w:color w:val="111827"/>
+                <w:sz w:val="16"/>
+              </w:rPr>
+              <w:t>30.3</w:t>
+            </w:r>
+          </w:p>
+        </w:tc>
+        <w:tc>
+          <w:tcPr>
+            <w:tcW w:type="dxa" w:w="1337"/>
+            <w:vAlign w:val="center"/>
+            <w:tcMar>
+              <w:top w:w="80" w:type="dxa"/>
+              <w:start w:w="120" w:type="dxa"/>
+              <w:bottom w:w="80" w:type="dxa"/>
+              <w:end w:w="120" w:type="dxa"/>
+            </w:tcMar>
+            <w:shd w:fill="F8FAFC"/>
+          </w:tcPr>
+          <w:p>
+            <w:pPr>
+              <w:spacing w:after="0"/>
+              <w:jc w:val="left"/>
+            </w:pPr>
+            <w:r>
+              <w:rPr>
+                <w:rFonts w:ascii="Arial" w:hAnsi="Arial" w:eastAsia="Arial"/>
+                <w:b w:val="0"/>
+                <w:color w:val="111827"/>
+                <w:sz w:val="16"/>
+              </w:rPr>
+              <w:t>очень высокий</w:t>
+            </w:r>
+          </w:p>
+        </w:tc>
+        <w:tc>
+          <w:tcPr>
+            <w:tcW w:type="dxa" w:w="1337"/>
+            <w:vAlign w:val="center"/>
+            <w:tcMar>
+              <w:top w:w="80" w:type="dxa"/>
+              <w:start w:w="120" w:type="dxa"/>
+              <w:bottom w:w="80" w:type="dxa"/>
+              <w:end w:w="120" w:type="dxa"/>
+            </w:tcMar>
+            <w:shd w:fill="F8FAFC"/>
+          </w:tcPr>
+          <w:p>
+            <w:pPr>
+              <w:spacing w:after="0"/>
+              <w:jc w:val="left"/>
+            </w:pPr>
+            <w:r>
+              <w:rPr>
+                <w:rFonts w:ascii="Arial" w:hAnsi="Arial" w:eastAsia="Arial"/>
+                <w:b w:val="0"/>
+                <w:color w:val="111827"/>
+                <w:sz w:val="16"/>
+              </w:rPr>
+              <w:t>intersection discount + отсутствующие прямые источники</w:t>
+            </w:r>
+          </w:p>
+        </w:tc>
+        <w:tc>
+          <w:tcPr>
+            <w:tcW w:type="dxa" w:w="1337"/>
+            <w:vAlign w:val="center"/>
+            <w:tcMar>
+              <w:top w:w="80" w:type="dxa"/>
+              <w:start w:w="120" w:type="dxa"/>
+              <w:bottom w:w="80" w:type="dxa"/>
+              <w:end w:w="120" w:type="dxa"/>
+            </w:tcMar>
+            <w:shd w:fill="F8FAFC"/>
+          </w:tcPr>
+          <w:p>
+            <w:pPr>
+              <w:spacing w:after="0"/>
+              <w:jc w:val="left"/>
+            </w:pPr>
+            <w:r>
+              <w:rPr>
+                <w:rFonts w:ascii="Arial" w:hAnsi="Arial" w:eastAsia="Arial"/>
+                <w:b w:val="0"/>
+                <w:color w:val="111827"/>
+                <w:sz w:val="16"/>
+              </w:rPr>
+              <w:t>ICP/WTP + product-matched paid-flow + bottom-up competitor revenue proxy</w:t>
+            </w:r>
+          </w:p>
+        </w:tc>
+      </w:tr>
+    </w:tbl>
+    <w:p/>
     <w:tbl>
       <w:tblPr>
         <w:tblW w:type="dxa" w:w="9360"/>
@@ -24585,7 +25982,7 @@
                 <w:color w:val="111827"/>
                 <w:sz w:val="16"/>
               </w:rPr>
-              <w:t>raw=67525; dedup=36694; dedup50_status=open; source_refs=239863; source_quality_rows=5</w:t>
+              <w:t>raw=67525; dedup=36694; dedup50_status=open; source_refs=239870; source_quality_rows=5</w:t>
             </w:r>
           </w:p>
         </w:tc>
@@ -24919,7 +26316,7 @@
                 <w:color w:val="111827"/>
                 <w:sz w:val="16"/>
               </w:rPr>
-              <w:t>6 methodology rows; 6 TAM/SAM/SOM rows; 6 stress scenarios</w:t>
+              <w:t>6 methodology rows; 6 TAM/SAM/SOM rows; 6 stress scenarios; sensitivity_rows=6</w:t>
             </w:r>
           </w:p>
         </w:tc>
@@ -25419,7 +26816,7 @@
                 <w:color w:val="111827"/>
                 <w:sz w:val="16"/>
               </w:rPr>
-              <w:t>manifest=495; missing=0; docs=124; scripts=111</w:t>
+              <w:t>manifest=498; missing=0; docs=125; scripts=112</w:t>
             </w:r>
           </w:p>
         </w:tc>
@@ -27934,7 +29331,7 @@
                 <w:color w:val="111827"/>
                 <w:sz w:val="16"/>
               </w:rPr>
-              <w:t>495 manifest artifacts; missing=0</w:t>
+              <w:t>498 manifest artifacts; missing=0</w:t>
             </w:r>
           </w:p>
         </w:tc>
@@ -28520,6 +29917,148 @@
                 <w:sz w:val="16"/>
               </w:rPr>
               <w:t>Source quality audit показывает качество coverage и next lanes; он не доказывает PMF, WTP или отсутствие hidden clone.</w:t>
+            </w:r>
+          </w:p>
+        </w:tc>
+      </w:tr>
+      <w:tr>
+        <w:tc>
+          <w:tcPr>
+            <w:tcW w:type="dxa" w:w="2376"/>
+            <w:vAlign w:val="center"/>
+            <w:tcMar>
+              <w:top w:w="80" w:type="dxa"/>
+              <w:start w:w="120" w:type="dxa"/>
+              <w:bottom w:w="80" w:type="dxa"/>
+              <w:end w:w="120" w:type="dxa"/>
+            </w:tcMar>
+            <w:shd w:fill="F8FAFC"/>
+          </w:tcPr>
+          <w:p>
+            <w:pPr>
+              <w:spacing w:after="0"/>
+              <w:jc w:val="left"/>
+            </w:pPr>
+            <w:r>
+              <w:rPr>
+                <w:rFonts w:ascii="Arial" w:hAnsi="Arial" w:eastAsia="Arial"/>
+                <w:b w:val="0"/>
+                <w:color w:val="111827"/>
+                <w:sz w:val="16"/>
+              </w:rPr>
+              <w:t>SRC_12_MARKET_SENSITIVITY</w:t>
+            </w:r>
+          </w:p>
+        </w:tc>
+        <w:tc>
+          <w:tcPr>
+            <w:tcW w:type="dxa" w:w="1224"/>
+            <w:vAlign w:val="center"/>
+            <w:tcMar>
+              <w:top w:w="80" w:type="dxa"/>
+              <w:start w:w="120" w:type="dxa"/>
+              <w:bottom w:w="80" w:type="dxa"/>
+              <w:end w:w="120" w:type="dxa"/>
+            </w:tcMar>
+            <w:shd w:fill="F8FAFC"/>
+          </w:tcPr>
+          <w:p>
+            <w:pPr>
+              <w:spacing w:after="0"/>
+              <w:jc w:val="left"/>
+            </w:pPr>
+            <w:r>
+              <w:rPr>
+                <w:rFonts w:ascii="Arial" w:hAnsi="Arial" w:eastAsia="Arial"/>
+                <w:b w:val="0"/>
+                <w:color w:val="111827"/>
+                <w:sz w:val="16"/>
+              </w:rPr>
+              <w:t>Методология TAM/SAM/SOM</w:t>
+            </w:r>
+          </w:p>
+        </w:tc>
+        <w:tc>
+          <w:tcPr>
+            <w:tcW w:type="dxa" w:w="1224"/>
+            <w:vAlign w:val="center"/>
+            <w:tcMar>
+              <w:top w:w="80" w:type="dxa"/>
+              <w:start w:w="120" w:type="dxa"/>
+              <w:bottom w:w="80" w:type="dxa"/>
+              <w:end w:w="120" w:type="dxa"/>
+            </w:tcMar>
+            <w:shd w:fill="F8FAFC"/>
+          </w:tcPr>
+          <w:p>
+            <w:pPr>
+              <w:spacing w:after="0"/>
+              <w:jc w:val="left"/>
+            </w:pPr>
+            <w:r>
+              <w:rPr>
+                <w:rFonts w:ascii="Arial" w:hAnsi="Arial" w:eastAsia="Arial"/>
+                <w:b w:val="0"/>
+                <w:color w:val="111827"/>
+                <w:sz w:val="16"/>
+              </w:rPr>
+              <w:t>проверено sensitivity audit, не revenue forecast</w:t>
+            </w:r>
+          </w:p>
+        </w:tc>
+        <w:tc>
+          <w:tcPr>
+            <w:tcW w:type="dxa" w:w="1944"/>
+            <w:vAlign w:val="center"/>
+            <w:tcMar>
+              <w:top w:w="80" w:type="dxa"/>
+              <w:start w:w="120" w:type="dxa"/>
+              <w:bottom w:w="80" w:type="dxa"/>
+              <w:end w:w="120" w:type="dxa"/>
+            </w:tcMar>
+            <w:shd w:fill="F8FAFC"/>
+          </w:tcPr>
+          <w:p>
+            <w:pPr>
+              <w:spacing w:after="0"/>
+              <w:jc w:val="left"/>
+            </w:pPr>
+            <w:r>
+              <w:rPr>
+                <w:rFonts w:ascii="Arial" w:hAnsi="Arial" w:eastAsia="Arial"/>
+                <w:b w:val="0"/>
+                <w:color w:val="111827"/>
+                <w:sz w:val="16"/>
+              </w:rPr>
+              <w:t>6 sensitivity rows</w:t>
+            </w:r>
+          </w:p>
+        </w:tc>
+        <w:tc>
+          <w:tcPr>
+            <w:tcW w:type="dxa" w:w="2592"/>
+            <w:vAlign w:val="center"/>
+            <w:tcMar>
+              <w:top w:w="80" w:type="dxa"/>
+              <w:start w:w="120" w:type="dxa"/>
+              <w:bottom w:w="80" w:type="dxa"/>
+              <w:end w:w="120" w:type="dxa"/>
+            </w:tcMar>
+            <w:shd w:fill="F8FAFC"/>
+          </w:tcPr>
+          <w:p>
+            <w:pPr>
+              <w:spacing w:after="0"/>
+              <w:jc w:val="left"/>
+            </w:pPr>
+            <w:r>
+              <w:rPr>
+                <w:rFonts w:ascii="Arial" w:hAnsi="Arial" w:eastAsia="Arial"/>
+                <w:b w:val="0"/>
+                <w:color w:val="111827"/>
+                <w:sz w:val="16"/>
+              </w:rPr>
+              <w:t>Sensitivity audit показывает хрупкость assumptions; он не доказывает выручку Alina.</w:t>
             </w:r>
           </w:p>
         </w:tc>
@@ -28684,6 +30223,15 @@
       </w:pPr>
       <w:r>
         <w:t>data_processed/global_market_sizing_methodology.csv</w:t>
+      </w:r>
+    </w:p>
+    <w:p>
+      <w:pPr>
+        <w:pStyle w:val="ListBullet"/>
+        <w:spacing w:after="80"/>
+      </w:pPr>
+      <w:r>
+        <w:t>data_processed/market_model_sensitivity_audit.csv</w:t>
       </w:r>
     </w:p>
     <w:p>

</xml_diff>

<commit_message>
Add Russian narrative storyline spine
</commit_message>
<xml_diff>
--- a/output/docx/alina-global-hypothesis-report-v1.docx
+++ b/output/docx/alina-global-hypothesis-report-v1.docx
@@ -31,7 +31,7 @@
     </w:p>
     <w:p>
       <w:r>
-        <w:t>Собрано: 2026-05-31T16:58:13.989Z</w:t>
+        <w:t>Собрано: 2026-05-31T17:06:40.916Z</w:t>
       </w:r>
     </w:p>
     <w:p>
@@ -64,7 +64,7 @@
     </w:p>
     <w:p>
       <w:r>
-        <w:t>На текущем этапе собрано 67,525 сырьевых source-строк, 36,694 уникализированных строк и 498 локальных артефактов. Эти данные нужны не для того, чтобы объявить продукт доказанным, а для последовательной проверки: существует ли рынок, есть ли деньги, насколько плотна конкуренция, где может быть белое пятно, кто аудитория и какую MVP-петлю надо тестировать.</w:t>
+        <w:t>На текущем этапе собрано 67,525 сырьевых source-строк, 36,694 уникализированных строк и 501 локальных артефактов. Эти данные нужны не для того, чтобы объявить продукт доказанным, а для последовательной проверки: существует ли рынок, есть ли деньги, насколько плотна конкуренция, где может быть белое пятно, кто аудитория и какую MVP-петлю надо тестировать.</w:t>
       </w:r>
     </w:p>
     <w:p>
@@ -25982,7 +25982,7 @@
                 <w:color w:val="111827"/>
                 <w:sz w:val="16"/>
               </w:rPr>
-              <w:t>raw=67525; dedup=36694; dedup50_status=open; source_refs=239870; source_quality_rows=5</w:t>
+              <w:t>raw=67525; dedup=36694; dedup50_status=open; source_refs=239871; source_quality_rows=5</w:t>
             </w:r>
           </w:p>
         </w:tc>
@@ -26650,7 +26650,7 @@
                 <w:color w:val="111827"/>
                 <w:sz w:val="16"/>
               </w:rPr>
-              <w:t>global report md=yes; pdf=yes; docx=yes; executive_md=yes; executive_pdf=yes; readability_audit_rows=7</w:t>
+              <w:t>global report md=yes; pdf=yes; docx=yes; executive_md=yes; executive_pdf=yes; readability_audit_rows=8; storyline_rows=10</w:t>
             </w:r>
           </w:p>
         </w:tc>
@@ -26816,7 +26816,7 @@
                 <w:color w:val="111827"/>
                 <w:sz w:val="16"/>
               </w:rPr>
-              <w:t>manifest=498; missing=0; docs=125; scripts=112</w:t>
+              <w:t>manifest=501; missing=0; docs=126; scripts=113</w:t>
             </w:r>
           </w:p>
         </w:tc>
@@ -27052,6 +27052,1890 @@
         <w:t>Главный вывод по этой карте: пакет уже масштабный и трассируемый, но не финально валидированный. Это правильное состояние для evidence-first ресерча: сильные desk/source слои готовы, а product/market claims остаются в hold_validate до ручных walkthrough, интервью, прототипа и WTP.</w:t>
       </w:r>
     </w:p>
+    <w:p>
+      <w:pPr>
+        <w:pStyle w:val="Heading1"/>
+      </w:pPr>
+      <w:r>
+        <w:t>ПОВЕСТВОВАТЕЛЬНАЯ ЛОГИКА ОТЧЕТА</w:t>
+      </w:r>
+    </w:p>
+    <w:p>
+      <w:r>
+        <w:t>Чтобы отчет не выглядел как набор разрозненных таблиц, отдельно зафиксирована русская storyline-карта. Она переводит образец Alina в текущий мировой research: каждый большой раздел отвечает на один вопрос читателя, сначала дает смысловой вывод, затем показывает evidence, называет границу доказательства и объясняет переход к следующей гипотезе.</w:t>
+      </w:r>
+    </w:p>
+    <w:p>
+      <w:r>
+        <w:t>Практически это означает: не начинать с методологии ради методологии, не прятать счетчики по нишам, не выдавать market size за proof, не писать “конкурентов нет”, а вести читателя по цепочке “идея -&gt; рынки -&gt; деньги -&gt; конкуренты -&gt; whitespace -&gt; аудитория -&gt; MVP -&gt; validation”.</w:t>
+      </w:r>
+    </w:p>
+    <w:tbl>
+      <w:tblPr>
+        <w:tblW w:type="dxa" w:w="9360"/>
+        <w:jc w:val="left"/>
+        <w:tblLayout w:type="fixed"/>
+        <w:tblLook w:firstColumn="1" w:firstRow="1" w:lastColumn="0" w:lastRow="0" w:noHBand="0" w:noVBand="1" w:val="04A0"/>
+        <w:tblInd w:w="120" w:type="dxa"/>
+        <w:tblBorders>
+          <w:top w:val="single" w:sz="4" w:space="0" w:color="CBD5E1"/>
+          <w:left w:val="single" w:sz="4" w:space="0" w:color="CBD5E1"/>
+          <w:bottom w:val="single" w:sz="4" w:space="0" w:color="CBD5E1"/>
+          <w:right w:val="single" w:sz="4" w:space="0" w:color="CBD5E1"/>
+          <w:insideH w:val="single" w:sz="4" w:space="0" w:color="CBD5E1"/>
+          <w:insideV w:val="single" w:sz="4" w:space="0" w:color="CBD5E1"/>
+        </w:tblBorders>
+      </w:tblPr>
+      <w:tblGrid>
+        <w:gridCol w:w="1560"/>
+        <w:gridCol w:w="1560"/>
+        <w:gridCol w:w="1560"/>
+        <w:gridCol w:w="1560"/>
+        <w:gridCol w:w="1560"/>
+        <w:gridCol w:w="1560"/>
+      </w:tblGrid>
+      <w:tr>
+        <w:tc>
+          <w:tcPr>
+            <w:tcW w:type="dxa" w:w="1560"/>
+            <w:vAlign w:val="center"/>
+            <w:tcMar>
+              <w:top w:w="80" w:type="dxa"/>
+              <w:start w:w="120" w:type="dxa"/>
+              <w:bottom w:w="80" w:type="dxa"/>
+              <w:end w:w="120" w:type="dxa"/>
+            </w:tcMar>
+            <w:shd w:fill="E8EEF5"/>
+          </w:tcPr>
+          <w:p>
+            <w:pPr>
+              <w:spacing w:after="0"/>
+              <w:jc w:val="left"/>
+            </w:pPr>
+            <w:r>
+              <w:rPr>
+                <w:rFonts w:ascii="Arial" w:hAnsi="Arial" w:eastAsia="Arial"/>
+                <w:b/>
+                <w:color w:val="111827"/>
+                <w:sz w:val="16"/>
+              </w:rPr>
+              <w:t>ID</w:t>
+            </w:r>
+          </w:p>
+        </w:tc>
+        <w:tc>
+          <w:tcPr>
+            <w:tcW w:type="dxa" w:w="1560"/>
+            <w:vAlign w:val="center"/>
+            <w:tcMar>
+              <w:top w:w="80" w:type="dxa"/>
+              <w:start w:w="120" w:type="dxa"/>
+              <w:bottom w:w="80" w:type="dxa"/>
+              <w:end w:w="120" w:type="dxa"/>
+            </w:tcMar>
+            <w:shd w:fill="E8EEF5"/>
+          </w:tcPr>
+          <w:p>
+            <w:pPr>
+              <w:spacing w:after="0"/>
+              <w:jc w:val="left"/>
+            </w:pPr>
+            <w:r>
+              <w:rPr>
+                <w:rFonts w:ascii="Arial" w:hAnsi="Arial" w:eastAsia="Arial"/>
+                <w:b/>
+                <w:color w:val="111827"/>
+                <w:sz w:val="16"/>
+              </w:rPr>
+              <w:t>Раздел</w:t>
+            </w:r>
+          </w:p>
+        </w:tc>
+        <w:tc>
+          <w:tcPr>
+            <w:tcW w:type="dxa" w:w="1560"/>
+            <w:vAlign w:val="center"/>
+            <w:tcMar>
+              <w:top w:w="80" w:type="dxa"/>
+              <w:start w:w="120" w:type="dxa"/>
+              <w:bottom w:w="80" w:type="dxa"/>
+              <w:end w:w="120" w:type="dxa"/>
+            </w:tcMar>
+            <w:shd w:fill="E8EEF5"/>
+          </w:tcPr>
+          <w:p>
+            <w:pPr>
+              <w:spacing w:after="0"/>
+              <w:jc w:val="left"/>
+            </w:pPr>
+            <w:r>
+              <w:rPr>
+                <w:rFonts w:ascii="Arial" w:hAnsi="Arial" w:eastAsia="Arial"/>
+                <w:b/>
+                <w:color w:val="111827"/>
+                <w:sz w:val="16"/>
+              </w:rPr>
+              <w:t>Вопрос читателя</w:t>
+            </w:r>
+          </w:p>
+        </w:tc>
+        <w:tc>
+          <w:tcPr>
+            <w:tcW w:type="dxa" w:w="1560"/>
+            <w:vAlign w:val="center"/>
+            <w:tcMar>
+              <w:top w:w="80" w:type="dxa"/>
+              <w:start w:w="120" w:type="dxa"/>
+              <w:bottom w:w="80" w:type="dxa"/>
+              <w:end w:w="120" w:type="dxa"/>
+            </w:tcMar>
+            <w:shd w:fill="E8EEF5"/>
+          </w:tcPr>
+          <w:p>
+            <w:pPr>
+              <w:spacing w:after="0"/>
+              <w:jc w:val="left"/>
+            </w:pPr>
+            <w:r>
+              <w:rPr>
+                <w:rFonts w:ascii="Arial" w:hAnsi="Arial" w:eastAsia="Arial"/>
+                <w:b/>
+                <w:color w:val="111827"/>
+                <w:sz w:val="16"/>
+              </w:rPr>
+              <w:t>Ход повествования</w:t>
+            </w:r>
+          </w:p>
+        </w:tc>
+        <w:tc>
+          <w:tcPr>
+            <w:tcW w:type="dxa" w:w="1560"/>
+            <w:vAlign w:val="center"/>
+            <w:tcMar>
+              <w:top w:w="80" w:type="dxa"/>
+              <w:start w:w="120" w:type="dxa"/>
+              <w:bottom w:w="80" w:type="dxa"/>
+              <w:end w:w="120" w:type="dxa"/>
+            </w:tcMar>
+            <w:shd w:fill="E8EEF5"/>
+          </w:tcPr>
+          <w:p>
+            <w:pPr>
+              <w:spacing w:after="0"/>
+              <w:jc w:val="left"/>
+            </w:pPr>
+            <w:r>
+              <w:rPr>
+                <w:rFonts w:ascii="Arial" w:hAnsi="Arial" w:eastAsia="Arial"/>
+                <w:b/>
+                <w:color w:val="111827"/>
+                <w:sz w:val="16"/>
+              </w:rPr>
+              <w:t>Evidence</w:t>
+            </w:r>
+          </w:p>
+        </w:tc>
+        <w:tc>
+          <w:tcPr>
+            <w:tcW w:type="dxa" w:w="1560"/>
+            <w:vAlign w:val="center"/>
+            <w:tcMar>
+              <w:top w:w="80" w:type="dxa"/>
+              <w:start w:w="120" w:type="dxa"/>
+              <w:bottom w:w="80" w:type="dxa"/>
+              <w:end w:w="120" w:type="dxa"/>
+            </w:tcMar>
+            <w:shd w:fill="E8EEF5"/>
+          </w:tcPr>
+          <w:p>
+            <w:pPr>
+              <w:spacing w:after="0"/>
+              <w:jc w:val="left"/>
+            </w:pPr>
+            <w:r>
+              <w:rPr>
+                <w:rFonts w:ascii="Arial" w:hAnsi="Arial" w:eastAsia="Arial"/>
+                <w:b/>
+                <w:color w:val="111827"/>
+                <w:sz w:val="16"/>
+              </w:rPr>
+              <w:t>Граница</w:t>
+            </w:r>
+          </w:p>
+        </w:tc>
+      </w:tr>
+      <w:tr>
+        <w:tc>
+          <w:tcPr>
+            <w:tcW w:type="dxa" w:w="1560"/>
+            <w:vAlign w:val="center"/>
+            <w:tcMar>
+              <w:top w:w="80" w:type="dxa"/>
+              <w:start w:w="120" w:type="dxa"/>
+              <w:bottom w:w="80" w:type="dxa"/>
+              <w:end w:w="120" w:type="dxa"/>
+            </w:tcMar>
+          </w:tcPr>
+          <w:p>
+            <w:pPr>
+              <w:spacing w:after="0"/>
+              <w:jc w:val="left"/>
+            </w:pPr>
+            <w:r>
+              <w:rPr>
+                <w:rFonts w:ascii="Arial" w:hAnsi="Arial" w:eastAsia="Arial"/>
+                <w:b w:val="0"/>
+                <w:color w:val="111827"/>
+                <w:sz w:val="16"/>
+              </w:rPr>
+              <w:t>STORY_01_PRODUCT_THESIS</w:t>
+            </w:r>
+          </w:p>
+        </w:tc>
+        <w:tc>
+          <w:tcPr>
+            <w:tcW w:type="dxa" w:w="1560"/>
+            <w:vAlign w:val="center"/>
+            <w:tcMar>
+              <w:top w:w="80" w:type="dxa"/>
+              <w:start w:w="120" w:type="dxa"/>
+              <w:bottom w:w="80" w:type="dxa"/>
+              <w:end w:w="120" w:type="dxa"/>
+            </w:tcMar>
+          </w:tcPr>
+          <w:p>
+            <w:pPr>
+              <w:spacing w:after="0"/>
+              <w:jc w:val="left"/>
+            </w:pPr>
+            <w:r>
+              <w:rPr>
+                <w:rFonts w:ascii="Arial" w:hAnsi="Arial" w:eastAsia="Arial"/>
+                <w:b w:val="0"/>
+                <w:color w:val="111827"/>
+                <w:sz w:val="16"/>
+              </w:rPr>
+              <w:t>Описание проекта и гипотеза #1</w:t>
+            </w:r>
+          </w:p>
+        </w:tc>
+        <w:tc>
+          <w:tcPr>
+            <w:tcW w:type="dxa" w:w="1560"/>
+            <w:vAlign w:val="center"/>
+            <w:tcMar>
+              <w:top w:w="80" w:type="dxa"/>
+              <w:start w:w="120" w:type="dxa"/>
+              <w:bottom w:w="80" w:type="dxa"/>
+              <w:end w:w="120" w:type="dxa"/>
+            </w:tcMar>
+          </w:tcPr>
+          <w:p>
+            <w:pPr>
+              <w:spacing w:after="0"/>
+              <w:jc w:val="left"/>
+            </w:pPr>
+            <w:r>
+              <w:rPr>
+                <w:rFonts w:ascii="Arial" w:hAnsi="Arial" w:eastAsia="Arial"/>
+                <w:b w:val="0"/>
+                <w:color w:val="111827"/>
+                <w:sz w:val="16"/>
+              </w:rPr>
+              <w:t>Что такое Alina и почему это не просто еще один tracker, meditation app или avatar toy?</w:t>
+            </w:r>
+          </w:p>
+        </w:tc>
+        <w:tc>
+          <w:tcPr>
+            <w:tcW w:type="dxa" w:w="1560"/>
+            <w:vAlign w:val="center"/>
+            <w:tcMar>
+              <w:top w:w="80" w:type="dxa"/>
+              <w:start w:w="120" w:type="dxa"/>
+              <w:bottom w:w="80" w:type="dxa"/>
+              <w:end w:w="120" w:type="dxa"/>
+            </w:tcMar>
+          </w:tcPr>
+          <w:p>
+            <w:pPr>
+              <w:spacing w:after="0"/>
+              <w:jc w:val="left"/>
+            </w:pPr>
+            <w:r>
+              <w:rPr>
+                <w:rFonts w:ascii="Arial" w:hAnsi="Arial" w:eastAsia="Arial"/>
+                <w:b w:val="0"/>
+                <w:color w:val="111827"/>
+                <w:sz w:val="16"/>
+              </w:rPr>
+              <w:t>Сначала дать продуктовую ставку человеческим языком: daily meaning превращается в маленькое действие, reset снижает трение, progress/avatar показывает причинное изменение.</w:t>
+            </w:r>
+          </w:p>
+        </w:tc>
+        <w:tc>
+          <w:tcPr>
+            <w:tcW w:type="dxa" w:w="1560"/>
+            <w:vAlign w:val="center"/>
+            <w:tcMar>
+              <w:top w:w="80" w:type="dxa"/>
+              <w:start w:w="120" w:type="dxa"/>
+              <w:bottom w:w="80" w:type="dxa"/>
+              <w:end w:w="120" w:type="dxa"/>
+            </w:tcMar>
+          </w:tcPr>
+          <w:p>
+            <w:pPr>
+              <w:spacing w:after="0"/>
+              <w:jc w:val="left"/>
+            </w:pPr>
+            <w:r>
+              <w:rPr>
+                <w:rFonts w:ascii="Arial" w:hAnsi="Arial" w:eastAsia="Arial"/>
+                <w:b w:val="0"/>
+                <w:color w:val="111827"/>
+                <w:sz w:val="16"/>
+              </w:rPr>
+              <w:t>source_base=67,525 raw; dedup=36,694; manifest=501; sample_style=yes</w:t>
+            </w:r>
+          </w:p>
+        </w:tc>
+        <w:tc>
+          <w:tcPr>
+            <w:tcW w:type="dxa" w:w="1560"/>
+            <w:vAlign w:val="center"/>
+            <w:tcMar>
+              <w:top w:w="80" w:type="dxa"/>
+              <w:start w:w="120" w:type="dxa"/>
+              <w:bottom w:w="80" w:type="dxa"/>
+              <w:end w:w="120" w:type="dxa"/>
+            </w:tcMar>
+          </w:tcPr>
+          <w:p>
+            <w:pPr>
+              <w:spacing w:after="0"/>
+              <w:jc w:val="left"/>
+            </w:pPr>
+            <w:r>
+              <w:rPr>
+                <w:rFonts w:ascii="Arial" w:hAnsi="Arial" w:eastAsia="Arial"/>
+                <w:b w:val="0"/>
+                <w:color w:val="111827"/>
+                <w:sz w:val="16"/>
+              </w:rPr>
+              <w:t>Это не PMF proof и не доказательство спроса; это стартовая рамка H1.</w:t>
+            </w:r>
+          </w:p>
+        </w:tc>
+      </w:tr>
+      <w:tr>
+        <w:tc>
+          <w:tcPr>
+            <w:tcW w:type="dxa" w:w="1560"/>
+            <w:vAlign w:val="center"/>
+            <w:tcMar>
+              <w:top w:w="80" w:type="dxa"/>
+              <w:start w:w="120" w:type="dxa"/>
+              <w:bottom w:w="80" w:type="dxa"/>
+              <w:end w:w="120" w:type="dxa"/>
+            </w:tcMar>
+            <w:shd w:fill="F8FAFC"/>
+          </w:tcPr>
+          <w:p>
+            <w:pPr>
+              <w:spacing w:after="0"/>
+              <w:jc w:val="left"/>
+            </w:pPr>
+            <w:r>
+              <w:rPr>
+                <w:rFonts w:ascii="Arial" w:hAnsi="Arial" w:eastAsia="Arial"/>
+                <w:b w:val="0"/>
+                <w:color w:val="111827"/>
+                <w:sz w:val="16"/>
+              </w:rPr>
+              <w:t>STORY_02_EVIDENCE_STATUS</w:t>
+            </w:r>
+          </w:p>
+        </w:tc>
+        <w:tc>
+          <w:tcPr>
+            <w:tcW w:type="dxa" w:w="1560"/>
+            <w:vAlign w:val="center"/>
+            <w:tcMar>
+              <w:top w:w="80" w:type="dxa"/>
+              <w:start w:w="120" w:type="dxa"/>
+              <w:bottom w:w="80" w:type="dxa"/>
+              <w:end w:w="120" w:type="dxa"/>
+            </w:tcMar>
+            <w:shd w:fill="F8FAFC"/>
+          </w:tcPr>
+          <w:p>
+            <w:pPr>
+              <w:spacing w:after="0"/>
+              <w:jc w:val="left"/>
+            </w:pPr>
+            <w:r>
+              <w:rPr>
+                <w:rFonts w:ascii="Arial" w:hAnsi="Arial" w:eastAsia="Arial"/>
+                <w:b w:val="0"/>
+                <w:color w:val="111827"/>
+                <w:sz w:val="16"/>
+              </w:rPr>
+              <w:t>Текущий статус доказательств</w:t>
+            </w:r>
+          </w:p>
+        </w:tc>
+        <w:tc>
+          <w:tcPr>
+            <w:tcW w:type="dxa" w:w="1560"/>
+            <w:vAlign w:val="center"/>
+            <w:tcMar>
+              <w:top w:w="80" w:type="dxa"/>
+              <w:start w:w="120" w:type="dxa"/>
+              <w:bottom w:w="80" w:type="dxa"/>
+              <w:end w:w="120" w:type="dxa"/>
+            </w:tcMar>
+            <w:shd w:fill="F8FAFC"/>
+          </w:tcPr>
+          <w:p>
+            <w:pPr>
+              <w:spacing w:after="0"/>
+              <w:jc w:val="left"/>
+            </w:pPr>
+            <w:r>
+              <w:rPr>
+                <w:rFonts w:ascii="Arial" w:hAnsi="Arial" w:eastAsia="Arial"/>
+                <w:b w:val="0"/>
+                <w:color w:val="111827"/>
+                <w:sz w:val="16"/>
+              </w:rPr>
+              <w:t>Можно ли уже говорить, что гипотезы доказаны?</w:t>
+            </w:r>
+          </w:p>
+        </w:tc>
+        <w:tc>
+          <w:tcPr>
+            <w:tcW w:type="dxa" w:w="1560"/>
+            <w:vAlign w:val="center"/>
+            <w:tcMar>
+              <w:top w:w="80" w:type="dxa"/>
+              <w:start w:w="120" w:type="dxa"/>
+              <w:bottom w:w="80" w:type="dxa"/>
+              <w:end w:w="120" w:type="dxa"/>
+            </w:tcMar>
+            <w:shd w:fill="F8FAFC"/>
+          </w:tcPr>
+          <w:p>
+            <w:pPr>
+              <w:spacing w:after="0"/>
+              <w:jc w:val="left"/>
+            </w:pPr>
+            <w:r>
+              <w:rPr>
+                <w:rFonts w:ascii="Arial" w:hAnsi="Arial" w:eastAsia="Arial"/>
+                <w:b w:val="0"/>
+                <w:color w:val="111827"/>
+                <w:sz w:val="16"/>
+              </w:rPr>
+              <w:t>Сразу поставить защитную рамку: все гипотезы идут через gates, а desk research не заменяет observed evidence.</w:t>
+            </w:r>
+          </w:p>
+        </w:tc>
+        <w:tc>
+          <w:tcPr>
+            <w:tcW w:type="dxa" w:w="1560"/>
+            <w:vAlign w:val="center"/>
+            <w:tcMar>
+              <w:top w:w="80" w:type="dxa"/>
+              <w:start w:w="120" w:type="dxa"/>
+              <w:bottom w:w="80" w:type="dxa"/>
+              <w:end w:w="120" w:type="dxa"/>
+            </w:tcMar>
+            <w:shd w:fill="F8FAFC"/>
+          </w:tcPr>
+          <w:p>
+            <w:pPr>
+              <w:spacing w:after="0"/>
+              <w:jc w:val="left"/>
+            </w:pPr>
+            <w:r>
+              <w:rPr>
+                <w:rFonts w:ascii="Arial" w:hAnsi="Arial" w:eastAsia="Arial"/>
+                <w:b w:val="0"/>
+                <w:color w:val="111827"/>
+                <w:sz w:val="16"/>
+              </w:rPr>
+              <w:t>gates=6; hold_validate=6; H2=28 / 40 completed</w:t>
+            </w:r>
+          </w:p>
+        </w:tc>
+        <w:tc>
+          <w:tcPr>
+            <w:tcW w:type="dxa" w:w="1560"/>
+            <w:vAlign w:val="center"/>
+            <w:tcMar>
+              <w:top w:w="80" w:type="dxa"/>
+              <w:start w:w="120" w:type="dxa"/>
+              <w:bottom w:w="80" w:type="dxa"/>
+              <w:end w:w="120" w:type="dxa"/>
+            </w:tcMar>
+            <w:shd w:fill="F8FAFC"/>
+          </w:tcPr>
+          <w:p>
+            <w:pPr>
+              <w:spacing w:after="0"/>
+              <w:jc w:val="left"/>
+            </w:pPr>
+            <w:r>
+              <w:rPr>
+                <w:rFonts w:ascii="Arial" w:hAnsi="Arial" w:eastAsia="Arial"/>
+                <w:b w:val="0"/>
+                <w:color w:val="111827"/>
+                <w:sz w:val="16"/>
+              </w:rPr>
+              <w:t>Не усиливать формулировки до go, пока нет walkthrough, интервью, prototype sessions и WTP.</w:t>
+            </w:r>
+          </w:p>
+        </w:tc>
+      </w:tr>
+      <w:tr>
+        <w:tc>
+          <w:tcPr>
+            <w:tcW w:type="dxa" w:w="1560"/>
+            <w:vAlign w:val="center"/>
+            <w:tcMar>
+              <w:top w:w="80" w:type="dxa"/>
+              <w:start w:w="120" w:type="dxa"/>
+              <w:bottom w:w="80" w:type="dxa"/>
+              <w:end w:w="120" w:type="dxa"/>
+            </w:tcMar>
+          </w:tcPr>
+          <w:p>
+            <w:pPr>
+              <w:spacing w:after="0"/>
+              <w:jc w:val="left"/>
+            </w:pPr>
+            <w:r>
+              <w:rPr>
+                <w:rFonts w:ascii="Arial" w:hAnsi="Arial" w:eastAsia="Arial"/>
+                <w:b w:val="0"/>
+                <w:color w:val="111827"/>
+                <w:sz w:val="16"/>
+              </w:rPr>
+              <w:t>STORY_03_MARKET_MAP</w:t>
+            </w:r>
+          </w:p>
+        </w:tc>
+        <w:tc>
+          <w:tcPr>
+            <w:tcW w:type="dxa" w:w="1560"/>
+            <w:vAlign w:val="center"/>
+            <w:tcMar>
+              <w:top w:w="80" w:type="dxa"/>
+              <w:start w:w="120" w:type="dxa"/>
+              <w:bottom w:w="80" w:type="dxa"/>
+              <w:end w:w="120" w:type="dxa"/>
+            </w:tcMar>
+          </w:tcPr>
+          <w:p>
+            <w:pPr>
+              <w:spacing w:after="0"/>
+              <w:jc w:val="left"/>
+            </w:pPr>
+            <w:r>
+              <w:rPr>
+                <w:rFonts w:ascii="Arial" w:hAnsi="Arial" w:eastAsia="Arial"/>
+                <w:b w:val="0"/>
+                <w:color w:val="111827"/>
+                <w:sz w:val="16"/>
+              </w:rPr>
+              <w:t>Определение мировых целевых рынков и гипотеза #2</w:t>
+            </w:r>
+          </w:p>
+        </w:tc>
+        <w:tc>
+          <w:tcPr>
+            <w:tcW w:type="dxa" w:w="1560"/>
+            <w:vAlign w:val="center"/>
+            <w:tcMar>
+              <w:top w:w="80" w:type="dxa"/>
+              <w:start w:w="120" w:type="dxa"/>
+              <w:bottom w:w="80" w:type="dxa"/>
+              <w:end w:w="120" w:type="dxa"/>
+            </w:tcMar>
+          </w:tcPr>
+          <w:p>
+            <w:pPr>
+              <w:spacing w:after="0"/>
+              <w:jc w:val="left"/>
+            </w:pPr>
+            <w:r>
+              <w:rPr>
+                <w:rFonts w:ascii="Arial" w:hAnsi="Arial" w:eastAsia="Arial"/>
+                <w:b w:val="0"/>
+                <w:color w:val="111827"/>
+                <w:sz w:val="16"/>
+              </w:rPr>
+              <w:t>Какие именно пять мировых направлений проверяются и сколько данных взято в каждой нише?</w:t>
+            </w:r>
+          </w:p>
+        </w:tc>
+        <w:tc>
+          <w:tcPr>
+            <w:tcW w:type="dxa" w:w="1560"/>
+            <w:vAlign w:val="center"/>
+            <w:tcMar>
+              <w:top w:w="80" w:type="dxa"/>
+              <w:start w:w="120" w:type="dxa"/>
+              <w:bottom w:w="80" w:type="dxa"/>
+              <w:end w:w="120" w:type="dxa"/>
+            </w:tcMar>
+          </w:tcPr>
+          <w:p>
+            <w:pPr>
+              <w:spacing w:after="0"/>
+              <w:jc w:val="left"/>
+            </w:pPr>
+            <w:r>
+              <w:rPr>
+                <w:rFonts w:ascii="Arial" w:hAnsi="Arial" w:eastAsia="Arial"/>
+                <w:b w:val="0"/>
+                <w:color w:val="111827"/>
+                <w:sz w:val="16"/>
+              </w:rPr>
+              <w:t>Показать пять направлений как роли в будущей ценности Alina: reset, action, meaning, visible identity, progression mechanics.</w:t>
+            </w:r>
+          </w:p>
+        </w:tc>
+        <w:tc>
+          <w:tcPr>
+            <w:tcW w:type="dxa" w:w="1560"/>
+            <w:vAlign w:val="center"/>
+            <w:tcMar>
+              <w:top w:w="80" w:type="dxa"/>
+              <w:start w:w="120" w:type="dxa"/>
+              <w:bottom w:w="80" w:type="dxa"/>
+              <w:end w:w="120" w:type="dxa"/>
+            </w:tcMar>
+          </w:tcPr>
+          <w:p>
+            <w:pPr>
+              <w:spacing w:after="0"/>
+              <w:jc w:val="left"/>
+            </w:pPr>
+            <w:r>
+              <w:rPr>
+                <w:rFonts w:ascii="Arial" w:hAnsi="Arial" w:eastAsia="Arial"/>
+                <w:b w:val="0"/>
+                <w:color w:val="111827"/>
+                <w:sz w:val="16"/>
+              </w:rPr>
+              <w:t>5 market rows; direct_app_dedup=13,117; all_source_dedup_rows_by_niche=43,144</w:t>
+            </w:r>
+          </w:p>
+        </w:tc>
+        <w:tc>
+          <w:tcPr>
+            <w:tcW w:type="dxa" w:w="1560"/>
+            <w:vAlign w:val="center"/>
+            <w:tcMar>
+              <w:top w:w="80" w:type="dxa"/>
+              <w:start w:w="120" w:type="dxa"/>
+              <w:bottom w:w="80" w:type="dxa"/>
+              <w:end w:w="120" w:type="dxa"/>
+            </w:tcMar>
+          </w:tcPr>
+          <w:p>
+            <w:pPr>
+              <w:spacing w:after="0"/>
+              <w:jc w:val="left"/>
+            </w:pPr>
+            <w:r>
+              <w:rPr>
+                <w:rFonts w:ascii="Arial" w:hAnsi="Arial" w:eastAsia="Arial"/>
+                <w:b w:val="0"/>
+                <w:color w:val="111827"/>
+                <w:sz w:val="16"/>
+              </w:rPr>
+              <w:t>Построчные niche dedup нельзя складывать как уникальных конкурентов; gaming остается benchmark, не прямой TAM.</w:t>
+            </w:r>
+          </w:p>
+        </w:tc>
+      </w:tr>
+      <w:tr>
+        <w:tc>
+          <w:tcPr>
+            <w:tcW w:type="dxa" w:w="1560"/>
+            <w:vAlign w:val="center"/>
+            <w:tcMar>
+              <w:top w:w="80" w:type="dxa"/>
+              <w:start w:w="120" w:type="dxa"/>
+              <w:bottom w:w="80" w:type="dxa"/>
+              <w:end w:w="120" w:type="dxa"/>
+            </w:tcMar>
+            <w:shd w:fill="F8FAFC"/>
+          </w:tcPr>
+          <w:p>
+            <w:pPr>
+              <w:spacing w:after="0"/>
+              <w:jc w:val="left"/>
+            </w:pPr>
+            <w:r>
+              <w:rPr>
+                <w:rFonts w:ascii="Arial" w:hAnsi="Arial" w:eastAsia="Arial"/>
+                <w:b w:val="0"/>
+                <w:color w:val="111827"/>
+                <w:sz w:val="16"/>
+              </w:rPr>
+              <w:t>STORY_04_MARKET_MONEY</w:t>
+            </w:r>
+          </w:p>
+        </w:tc>
+        <w:tc>
+          <w:tcPr>
+            <w:tcW w:type="dxa" w:w="1560"/>
+            <w:vAlign w:val="center"/>
+            <w:tcMar>
+              <w:top w:w="80" w:type="dxa"/>
+              <w:start w:w="120" w:type="dxa"/>
+              <w:bottom w:w="80" w:type="dxa"/>
+              <w:end w:w="120" w:type="dxa"/>
+            </w:tcMar>
+            <w:shd w:fill="F8FAFC"/>
+          </w:tcPr>
+          <w:p>
+            <w:pPr>
+              <w:spacing w:after="0"/>
+              <w:jc w:val="left"/>
+            </w:pPr>
+            <w:r>
+              <w:rPr>
+                <w:rFonts w:ascii="Arial" w:hAnsi="Arial" w:eastAsia="Arial"/>
+                <w:b w:val="0"/>
+                <w:color w:val="111827"/>
+                <w:sz w:val="16"/>
+              </w:rPr>
+              <w:t>Методология TAM/SAM/SOM</w:t>
+            </w:r>
+          </w:p>
+        </w:tc>
+        <w:tc>
+          <w:tcPr>
+            <w:tcW w:type="dxa" w:w="1560"/>
+            <w:vAlign w:val="center"/>
+            <w:tcMar>
+              <w:top w:w="80" w:type="dxa"/>
+              <w:start w:w="120" w:type="dxa"/>
+              <w:bottom w:w="80" w:type="dxa"/>
+              <w:end w:w="120" w:type="dxa"/>
+            </w:tcMar>
+            <w:shd w:fill="F8FAFC"/>
+          </w:tcPr>
+          <w:p>
+            <w:pPr>
+              <w:spacing w:after="0"/>
+              <w:jc w:val="left"/>
+            </w:pPr>
+            <w:r>
+              <w:rPr>
+                <w:rFonts w:ascii="Arial" w:hAnsi="Arial" w:eastAsia="Arial"/>
+                <w:b w:val="0"/>
+                <w:color w:val="111827"/>
+                <w:sz w:val="16"/>
+              </w:rPr>
+              <w:t>Есть ли там деньги и насколько хрупка рыночная модель?</w:t>
+            </w:r>
+          </w:p>
+        </w:tc>
+        <w:tc>
+          <w:tcPr>
+            <w:tcW w:type="dxa" w:w="1560"/>
+            <w:vAlign w:val="center"/>
+            <w:tcMar>
+              <w:top w:w="80" w:type="dxa"/>
+              <w:start w:w="120" w:type="dxa"/>
+              <w:bottom w:w="80" w:type="dxa"/>
+              <w:end w:w="120" w:type="dxa"/>
+            </w:tcMar>
+            <w:shd w:fill="F8FAFC"/>
+          </w:tcPr>
+          <w:p>
+            <w:pPr>
+              <w:spacing w:after="0"/>
+              <w:jc w:val="left"/>
+            </w:pPr>
+            <w:r>
+              <w:rPr>
+                <w:rFonts w:ascii="Arial" w:hAnsi="Arial" w:eastAsia="Arial"/>
+                <w:b w:val="0"/>
+                <w:color w:val="111827"/>
+                <w:sz w:val="16"/>
+              </w:rPr>
+              <w:t>Разделить TAM, SAM, confidence-weighted SAM и stress scenarios; отдельно назвать чувствительные assumptions.</w:t>
+            </w:r>
+          </w:p>
+        </w:tc>
+        <w:tc>
+          <w:tcPr>
+            <w:tcW w:type="dxa" w:w="1560"/>
+            <w:vAlign w:val="center"/>
+            <w:tcMar>
+              <w:top w:w="80" w:type="dxa"/>
+              <w:start w:w="120" w:type="dxa"/>
+              <w:bottom w:w="80" w:type="dxa"/>
+              <w:end w:w="120" w:type="dxa"/>
+            </w:tcMar>
+            <w:shd w:fill="F8FAFC"/>
+          </w:tcPr>
+          <w:p>
+            <w:pPr>
+              <w:spacing w:after="0"/>
+              <w:jc w:val="left"/>
+            </w:pPr>
+            <w:r>
+              <w:rPr>
+                <w:rFonts w:ascii="Arial" w:hAnsi="Arial" w:eastAsia="Arial"/>
+                <w:b w:val="0"/>
+                <w:color w:val="111827"/>
+                <w:sz w:val="16"/>
+              </w:rPr>
+              <w:t>tam_rows=6; intersection_sam=201960000; sensitivity_rows=6</w:t>
+            </w:r>
+          </w:p>
+        </w:tc>
+        <w:tc>
+          <w:tcPr>
+            <w:tcW w:type="dxa" w:w="1560"/>
+            <w:vAlign w:val="center"/>
+            <w:tcMar>
+              <w:top w:w="80" w:type="dxa"/>
+              <w:start w:w="120" w:type="dxa"/>
+              <w:bottom w:w="80" w:type="dxa"/>
+              <w:end w:w="120" w:type="dxa"/>
+            </w:tcMar>
+            <w:shd w:fill="F8FAFC"/>
+          </w:tcPr>
+          <w:p>
+            <w:pPr>
+              <w:spacing w:after="0"/>
+              <w:jc w:val="left"/>
+            </w:pPr>
+            <w:r>
+              <w:rPr>
+                <w:rFonts w:ascii="Arial" w:hAnsi="Arial" w:eastAsia="Arial"/>
+                <w:b w:val="0"/>
+                <w:color w:val="111827"/>
+                <w:sz w:val="16"/>
+              </w:rPr>
+              <w:t>Рыночная модель не является revenue forecast и не закрывает paid-flow/WTP gate.</w:t>
+            </w:r>
+          </w:p>
+        </w:tc>
+      </w:tr>
+      <w:tr>
+        <w:tc>
+          <w:tcPr>
+            <w:tcW w:type="dxa" w:w="1560"/>
+            <w:vAlign w:val="center"/>
+            <w:tcMar>
+              <w:top w:w="80" w:type="dxa"/>
+              <w:start w:w="120" w:type="dxa"/>
+              <w:bottom w:w="80" w:type="dxa"/>
+              <w:end w:w="120" w:type="dxa"/>
+            </w:tcMar>
+          </w:tcPr>
+          <w:p>
+            <w:pPr>
+              <w:spacing w:after="0"/>
+              <w:jc w:val="left"/>
+            </w:pPr>
+            <w:r>
+              <w:rPr>
+                <w:rFonts w:ascii="Arial" w:hAnsi="Arial" w:eastAsia="Arial"/>
+                <w:b w:val="0"/>
+                <w:color w:val="111827"/>
+                <w:sz w:val="16"/>
+              </w:rPr>
+              <w:t>STORY_05_COMPETITOR_FIELD</w:t>
+            </w:r>
+          </w:p>
+        </w:tc>
+        <w:tc>
+          <w:tcPr>
+            <w:tcW w:type="dxa" w:w="1560"/>
+            <w:vAlign w:val="center"/>
+            <w:tcMar>
+              <w:top w:w="80" w:type="dxa"/>
+              <w:start w:w="120" w:type="dxa"/>
+              <w:bottom w:w="80" w:type="dxa"/>
+              <w:end w:w="120" w:type="dxa"/>
+            </w:tcMar>
+          </w:tcPr>
+          <w:p>
+            <w:pPr>
+              <w:spacing w:after="0"/>
+              <w:jc w:val="left"/>
+            </w:pPr>
+            <w:r>
+              <w:rPr>
+                <w:rFonts w:ascii="Arial" w:hAnsi="Arial" w:eastAsia="Arial"/>
+                <w:b w:val="0"/>
+                <w:color w:val="111827"/>
+                <w:sz w:val="16"/>
+              </w:rPr>
+              <w:t>Определение конкурентов и гипотеза #3</w:t>
+            </w:r>
+          </w:p>
+        </w:tc>
+        <w:tc>
+          <w:tcPr>
+            <w:tcW w:type="dxa" w:w="1560"/>
+            <w:vAlign w:val="center"/>
+            <w:tcMar>
+              <w:top w:w="80" w:type="dxa"/>
+              <w:start w:w="120" w:type="dxa"/>
+              <w:bottom w:w="80" w:type="dxa"/>
+              <w:end w:w="120" w:type="dxa"/>
+            </w:tcMar>
+          </w:tcPr>
+          <w:p>
+            <w:pPr>
+              <w:spacing w:after="0"/>
+              <w:jc w:val="left"/>
+            </w:pPr>
+            <w:r>
+              <w:rPr>
+                <w:rFonts w:ascii="Arial" w:hAnsi="Arial" w:eastAsia="Arial"/>
+                <w:b w:val="0"/>
+                <w:color w:val="111827"/>
+                <w:sz w:val="16"/>
+              </w:rPr>
+              <w:t>Кто уже борется за похожее поведение пользователя?</w:t>
+            </w:r>
+          </w:p>
+        </w:tc>
+        <w:tc>
+          <w:tcPr>
+            <w:tcW w:type="dxa" w:w="1560"/>
+            <w:vAlign w:val="center"/>
+            <w:tcMar>
+              <w:top w:w="80" w:type="dxa"/>
+              <w:start w:w="120" w:type="dxa"/>
+              <w:bottom w:w="80" w:type="dxa"/>
+              <w:end w:w="120" w:type="dxa"/>
+            </w:tcMar>
+          </w:tcPr>
+          <w:p>
+            <w:pPr>
+              <w:spacing w:after="0"/>
+              <w:jc w:val="left"/>
+            </w:pPr>
+            <w:r>
+              <w:rPr>
+                <w:rFonts w:ascii="Arial" w:hAnsi="Arial" w:eastAsia="Arial"/>
+                <w:b w:val="0"/>
+                <w:color w:val="111827"/>
+                <w:sz w:val="16"/>
+              </w:rPr>
+              <w:t>Показывать конкурентов как карту соседних способов решения задачи, а не как список приложений ради списка.</w:t>
+            </w:r>
+          </w:p>
+        </w:tc>
+        <w:tc>
+          <w:tcPr>
+            <w:tcW w:type="dxa" w:w="1560"/>
+            <w:vAlign w:val="center"/>
+            <w:tcMar>
+              <w:top w:w="80" w:type="dxa"/>
+              <w:start w:w="120" w:type="dxa"/>
+              <w:bottom w:w="80" w:type="dxa"/>
+              <w:end w:w="120" w:type="dxa"/>
+            </w:tcMar>
+          </w:tcPr>
+          <w:p>
+            <w:pPr>
+              <w:spacing w:after="0"/>
+              <w:jc w:val="left"/>
+            </w:pPr>
+            <w:r>
+              <w:rPr>
+                <w:rFonts w:ascii="Arial" w:hAnsi="Arial" w:eastAsia="Arial"/>
+                <w:b w:val="0"/>
+                <w:color w:val="111827"/>
+                <w:sz w:val="16"/>
+              </w:rPr>
+              <w:t>archetype_rows=7; close_or_direct_total=73</w:t>
+            </w:r>
+          </w:p>
+        </w:tc>
+        <w:tc>
+          <w:tcPr>
+            <w:tcW w:type="dxa" w:w="1560"/>
+            <w:vAlign w:val="center"/>
+            <w:tcMar>
+              <w:top w:w="80" w:type="dxa"/>
+              <w:start w:w="120" w:type="dxa"/>
+              <w:bottom w:w="80" w:type="dxa"/>
+              <w:end w:w="120" w:type="dxa"/>
+            </w:tcMar>
+          </w:tcPr>
+          <w:p>
+            <w:pPr>
+              <w:spacing w:after="0"/>
+              <w:jc w:val="left"/>
+            </w:pPr>
+            <w:r>
+              <w:rPr>
+                <w:rFonts w:ascii="Arial" w:hAnsi="Arial" w:eastAsia="Arial"/>
+                <w:b w:val="0"/>
+                <w:color w:val="111827"/>
+                <w:sz w:val="16"/>
+              </w:rPr>
+              <w:t>Плотность конкурентов не доказывает Alina; taxonomy noise и hidden-clone риск остаются.</w:t>
+            </w:r>
+          </w:p>
+        </w:tc>
+      </w:tr>
+      <w:tr>
+        <w:tc>
+          <w:tcPr>
+            <w:tcW w:type="dxa" w:w="1560"/>
+            <w:vAlign w:val="center"/>
+            <w:tcMar>
+              <w:top w:w="80" w:type="dxa"/>
+              <w:start w:w="120" w:type="dxa"/>
+              <w:bottom w:w="80" w:type="dxa"/>
+              <w:end w:w="120" w:type="dxa"/>
+            </w:tcMar>
+            <w:shd w:fill="F8FAFC"/>
+          </w:tcPr>
+          <w:p>
+            <w:pPr>
+              <w:spacing w:after="0"/>
+              <w:jc w:val="left"/>
+            </w:pPr>
+            <w:r>
+              <w:rPr>
+                <w:rFonts w:ascii="Arial" w:hAnsi="Arial" w:eastAsia="Arial"/>
+                <w:b w:val="0"/>
+                <w:color w:val="111827"/>
+                <w:sz w:val="16"/>
+              </w:rPr>
+              <w:t>STORY_06_WHITESPACE</w:t>
+            </w:r>
+          </w:p>
+        </w:tc>
+        <w:tc>
+          <w:tcPr>
+            <w:tcW w:type="dxa" w:w="1560"/>
+            <w:vAlign w:val="center"/>
+            <w:tcMar>
+              <w:top w:w="80" w:type="dxa"/>
+              <w:start w:w="120" w:type="dxa"/>
+              <w:bottom w:w="80" w:type="dxa"/>
+              <w:end w:w="120" w:type="dxa"/>
+            </w:tcMar>
+            <w:shd w:fill="F8FAFC"/>
+          </w:tcPr>
+          <w:p>
+            <w:pPr>
+              <w:spacing w:after="0"/>
+              <w:jc w:val="left"/>
+            </w:pPr>
+            <w:r>
+              <w:rPr>
+                <w:rFonts w:ascii="Arial" w:hAnsi="Arial" w:eastAsia="Arial"/>
+                <w:b w:val="0"/>
+                <w:color w:val="111827"/>
+                <w:sz w:val="16"/>
+              </w:rPr>
+              <w:t>Где дыры и возможность отличиться</w:t>
+            </w:r>
+          </w:p>
+        </w:tc>
+        <w:tc>
+          <w:tcPr>
+            <w:tcW w:type="dxa" w:w="1560"/>
+            <w:vAlign w:val="center"/>
+            <w:tcMar>
+              <w:top w:w="80" w:type="dxa"/>
+              <w:start w:w="120" w:type="dxa"/>
+              <w:bottom w:w="80" w:type="dxa"/>
+              <w:end w:w="120" w:type="dxa"/>
+            </w:tcMar>
+            <w:shd w:fill="F8FAFC"/>
+          </w:tcPr>
+          <w:p>
+            <w:pPr>
+              <w:spacing w:after="0"/>
+              <w:jc w:val="left"/>
+            </w:pPr>
+            <w:r>
+              <w:rPr>
+                <w:rFonts w:ascii="Arial" w:hAnsi="Arial" w:eastAsia="Arial"/>
+                <w:b w:val="0"/>
+                <w:color w:val="111827"/>
+                <w:sz w:val="16"/>
+              </w:rPr>
+              <w:t>Где может быть белое пятно и почему оно не слишком широкое?</w:t>
+            </w:r>
+          </w:p>
+        </w:tc>
+        <w:tc>
+          <w:tcPr>
+            <w:tcW w:type="dxa" w:w="1560"/>
+            <w:vAlign w:val="center"/>
+            <w:tcMar>
+              <w:top w:w="80" w:type="dxa"/>
+              <w:start w:w="120" w:type="dxa"/>
+              <w:bottom w:w="80" w:type="dxa"/>
+              <w:end w:w="120" w:type="dxa"/>
+            </w:tcMar>
+            <w:shd w:fill="F8FAFC"/>
+          </w:tcPr>
+          <w:p>
+            <w:pPr>
+              <w:spacing w:after="0"/>
+              <w:jc w:val="left"/>
+            </w:pPr>
+            <w:r>
+              <w:rPr>
+                <w:rFonts w:ascii="Arial" w:hAnsi="Arial" w:eastAsia="Arial"/>
+                <w:b w:val="0"/>
+                <w:color w:val="111827"/>
+                <w:sz w:val="16"/>
+              </w:rPr>
+              <w:t>Формулировать whitespace как причинную дыру: meaning -&gt; action -&gt; reset -&gt; visible progress, а не как отсутствие wellness apps.</w:t>
+            </w:r>
+          </w:p>
+        </w:tc>
+        <w:tc>
+          <w:tcPr>
+            <w:tcW w:type="dxa" w:w="1560"/>
+            <w:vAlign w:val="center"/>
+            <w:tcMar>
+              <w:top w:w="80" w:type="dxa"/>
+              <w:start w:w="120" w:type="dxa"/>
+              <w:bottom w:w="80" w:type="dxa"/>
+              <w:end w:w="120" w:type="dxa"/>
+            </w:tcMar>
+            <w:shd w:fill="F8FAFC"/>
+          </w:tcPr>
+          <w:p>
+            <w:pPr>
+              <w:spacing w:after="0"/>
+              <w:jc w:val="left"/>
+            </w:pPr>
+            <w:r>
+              <w:rPr>
+                <w:rFonts w:ascii="Arial" w:hAnsi="Arial" w:eastAsia="Arial"/>
+                <w:b w:val="0"/>
+                <w:color w:val="111827"/>
+                <w:sz w:val="16"/>
+              </w:rPr>
+              <w:t>5 whitespace/audience rows; best_directional_fields=mindfulness, avatar_identity</w:t>
+            </w:r>
+          </w:p>
+        </w:tc>
+        <w:tc>
+          <w:tcPr>
+            <w:tcW w:type="dxa" w:w="1560"/>
+            <w:vAlign w:val="center"/>
+            <w:tcMar>
+              <w:top w:w="80" w:type="dxa"/>
+              <w:start w:w="120" w:type="dxa"/>
+              <w:bottom w:w="80" w:type="dxa"/>
+              <w:end w:w="120" w:type="dxa"/>
+            </w:tcMar>
+            <w:shd w:fill="F8FAFC"/>
+          </w:tcPr>
+          <w:p>
+            <w:pPr>
+              <w:spacing w:after="0"/>
+              <w:jc w:val="left"/>
+            </w:pPr>
+            <w:r>
+              <w:rPr>
+                <w:rFonts w:ascii="Arial" w:hAnsi="Arial" w:eastAsia="Arial"/>
+                <w:b w:val="0"/>
+                <w:color w:val="111827"/>
+                <w:sz w:val="16"/>
+              </w:rPr>
+              <w:t>H3 нельзя усиливать без ручного walkthrough P0-конкурентов.</w:t>
+            </w:r>
+          </w:p>
+        </w:tc>
+      </w:tr>
+      <w:tr>
+        <w:tc>
+          <w:tcPr>
+            <w:tcW w:type="dxa" w:w="1560"/>
+            <w:vAlign w:val="center"/>
+            <w:tcMar>
+              <w:top w:w="80" w:type="dxa"/>
+              <w:start w:w="120" w:type="dxa"/>
+              <w:bottom w:w="80" w:type="dxa"/>
+              <w:end w:w="120" w:type="dxa"/>
+            </w:tcMar>
+          </w:tcPr>
+          <w:p>
+            <w:pPr>
+              <w:spacing w:after="0"/>
+              <w:jc w:val="left"/>
+            </w:pPr>
+            <w:r>
+              <w:rPr>
+                <w:rFonts w:ascii="Arial" w:hAnsi="Arial" w:eastAsia="Arial"/>
+                <w:b w:val="0"/>
+                <w:color w:val="111827"/>
+                <w:sz w:val="16"/>
+              </w:rPr>
+              <w:t>STORY_07_AUDIENCE</w:t>
+            </w:r>
+          </w:p>
+        </w:tc>
+        <w:tc>
+          <w:tcPr>
+            <w:tcW w:type="dxa" w:w="1560"/>
+            <w:vAlign w:val="center"/>
+            <w:tcMar>
+              <w:top w:w="80" w:type="dxa"/>
+              <w:start w:w="120" w:type="dxa"/>
+              <w:bottom w:w="80" w:type="dxa"/>
+              <w:end w:w="120" w:type="dxa"/>
+            </w:tcMar>
+          </w:tcPr>
+          <w:p>
+            <w:pPr>
+              <w:spacing w:after="0"/>
+              <w:jc w:val="left"/>
+            </w:pPr>
+            <w:r>
+              <w:rPr>
+                <w:rFonts w:ascii="Arial" w:hAnsi="Arial" w:eastAsia="Arial"/>
+                <w:b w:val="0"/>
+                <w:color w:val="111827"/>
+                <w:sz w:val="16"/>
+              </w:rPr>
+              <w:t>Аудитория, интервью и гипотеза #4</w:t>
+            </w:r>
+          </w:p>
+        </w:tc>
+        <w:tc>
+          <w:tcPr>
+            <w:tcW w:type="dxa" w:w="1560"/>
+            <w:vAlign w:val="center"/>
+            <w:tcMar>
+              <w:top w:w="80" w:type="dxa"/>
+              <w:start w:w="120" w:type="dxa"/>
+              <w:bottom w:w="80" w:type="dxa"/>
+              <w:end w:w="120" w:type="dxa"/>
+            </w:tcMar>
+          </w:tcPr>
+          <w:p>
+            <w:pPr>
+              <w:spacing w:after="0"/>
+              <w:jc w:val="left"/>
+            </w:pPr>
+            <w:r>
+              <w:rPr>
+                <w:rFonts w:ascii="Arial" w:hAnsi="Arial" w:eastAsia="Arial"/>
+                <w:b w:val="0"/>
+                <w:color w:val="111827"/>
+                <w:sz w:val="16"/>
+              </w:rPr>
+              <w:t>Кто потенциальный пользователь и почему это не демография?</w:t>
+            </w:r>
+          </w:p>
+        </w:tc>
+        <w:tc>
+          <w:tcPr>
+            <w:tcW w:type="dxa" w:w="1560"/>
+            <w:vAlign w:val="center"/>
+            <w:tcMar>
+              <w:top w:w="80" w:type="dxa"/>
+              <w:start w:w="120" w:type="dxa"/>
+              <w:bottom w:w="80" w:type="dxa"/>
+              <w:end w:w="120" w:type="dxa"/>
+            </w:tcMar>
+          </w:tcPr>
+          <w:p>
+            <w:pPr>
+              <w:spacing w:after="0"/>
+              <w:jc w:val="left"/>
+            </w:pPr>
+            <w:r>
+              <w:rPr>
+                <w:rFonts w:ascii="Arial" w:hAnsi="Arial" w:eastAsia="Arial"/>
+                <w:b w:val="0"/>
+                <w:color w:val="111827"/>
+                <w:sz w:val="16"/>
+              </w:rPr>
+              <w:t>Описывать audience через поведение: digital ritual users, recent behavior, paid depth, trust boundary и язык боли.</w:t>
+            </w:r>
+          </w:p>
+        </w:tc>
+        <w:tc>
+          <w:tcPr>
+            <w:tcW w:type="dxa" w:w="1560"/>
+            <w:vAlign w:val="center"/>
+            <w:tcMar>
+              <w:top w:w="80" w:type="dxa"/>
+              <w:start w:w="120" w:type="dxa"/>
+              <w:bottom w:w="80" w:type="dxa"/>
+              <w:end w:w="120" w:type="dxa"/>
+            </w:tcMar>
+          </w:tcPr>
+          <w:p>
+            <w:pPr>
+              <w:spacing w:after="0"/>
+              <w:jc w:val="left"/>
+            </w:pPr>
+            <w:r>
+              <w:rPr>
+                <w:rFonts w:ascii="Arial" w:hAnsi="Arial" w:eastAsia="Arial"/>
+                <w:b w:val="0"/>
+                <w:color w:val="111827"/>
+                <w:sz w:val="16"/>
+              </w:rPr>
+              <w:t>icp_rows=6; p0_segments=Spiritual self-improvers + Habit and progress users</w:t>
+            </w:r>
+          </w:p>
+        </w:tc>
+        <w:tc>
+          <w:tcPr>
+            <w:tcW w:type="dxa" w:w="1560"/>
+            <w:vAlign w:val="center"/>
+            <w:tcMar>
+              <w:top w:w="80" w:type="dxa"/>
+              <w:start w:w="120" w:type="dxa"/>
+              <w:bottom w:w="80" w:type="dxa"/>
+              <w:end w:w="120" w:type="dxa"/>
+            </w:tcMar>
+          </w:tcPr>
+          <w:p>
+            <w:pPr>
+              <w:spacing w:after="0"/>
+              <w:jc w:val="left"/>
+            </w:pPr>
+            <w:r>
+              <w:rPr>
+                <w:rFonts w:ascii="Arial" w:hAnsi="Arial" w:eastAsia="Arial"/>
+                <w:b w:val="0"/>
+                <w:color w:val="111827"/>
+                <w:sz w:val="16"/>
+              </w:rPr>
+              <w:t>Secondary VOC и review language не заменяют живые интервью.</w:t>
+            </w:r>
+          </w:p>
+        </w:tc>
+      </w:tr>
+      <w:tr>
+        <w:tc>
+          <w:tcPr>
+            <w:tcW w:type="dxa" w:w="1560"/>
+            <w:vAlign w:val="center"/>
+            <w:tcMar>
+              <w:top w:w="80" w:type="dxa"/>
+              <w:start w:w="120" w:type="dxa"/>
+              <w:bottom w:w="80" w:type="dxa"/>
+              <w:end w:w="120" w:type="dxa"/>
+            </w:tcMar>
+            <w:shd w:fill="F8FAFC"/>
+          </w:tcPr>
+          <w:p>
+            <w:pPr>
+              <w:spacing w:after="0"/>
+              <w:jc w:val="left"/>
+            </w:pPr>
+            <w:r>
+              <w:rPr>
+                <w:rFonts w:ascii="Arial" w:hAnsi="Arial" w:eastAsia="Arial"/>
+                <w:b w:val="0"/>
+                <w:color w:val="111827"/>
+                <w:sz w:val="16"/>
+              </w:rPr>
+              <w:t>STORY_08_PRODUCT_LOOP</w:t>
+            </w:r>
+          </w:p>
+        </w:tc>
+        <w:tc>
+          <w:tcPr>
+            <w:tcW w:type="dxa" w:w="1560"/>
+            <w:vAlign w:val="center"/>
+            <w:tcMar>
+              <w:top w:w="80" w:type="dxa"/>
+              <w:start w:w="120" w:type="dxa"/>
+              <w:bottom w:w="80" w:type="dxa"/>
+              <w:end w:w="120" w:type="dxa"/>
+            </w:tcMar>
+            <w:shd w:fill="F8FAFC"/>
+          </w:tcPr>
+          <w:p>
+            <w:pPr>
+              <w:spacing w:after="0"/>
+              <w:jc w:val="left"/>
+            </w:pPr>
+            <w:r>
+              <w:rPr>
+                <w:rFonts w:ascii="Arial" w:hAnsi="Arial" w:eastAsia="Arial"/>
+                <w:b w:val="0"/>
+                <w:color w:val="111827"/>
+                <w:sz w:val="16"/>
+              </w:rPr>
+              <w:t>Итоговая модель продукта и гипотеза #5</w:t>
+            </w:r>
+          </w:p>
+        </w:tc>
+        <w:tc>
+          <w:tcPr>
+            <w:tcW w:type="dxa" w:w="1560"/>
+            <w:vAlign w:val="center"/>
+            <w:tcMar>
+              <w:top w:w="80" w:type="dxa"/>
+              <w:start w:w="120" w:type="dxa"/>
+              <w:bottom w:w="80" w:type="dxa"/>
+              <w:end w:w="120" w:type="dxa"/>
+            </w:tcMar>
+            <w:shd w:fill="F8FAFC"/>
+          </w:tcPr>
+          <w:p>
+            <w:pPr>
+              <w:spacing w:after="0"/>
+              <w:jc w:val="left"/>
+            </w:pPr>
+            <w:r>
+              <w:rPr>
+                <w:rFonts w:ascii="Arial" w:hAnsi="Arial" w:eastAsia="Arial"/>
+                <w:b w:val="0"/>
+                <w:color w:val="111827"/>
+                <w:sz w:val="16"/>
+              </w:rPr>
+              <w:t>Что именно должен проверить MVP?</w:t>
+            </w:r>
+          </w:p>
+        </w:tc>
+        <w:tc>
+          <w:tcPr>
+            <w:tcW w:type="dxa" w:w="1560"/>
+            <w:vAlign w:val="center"/>
+            <w:tcMar>
+              <w:top w:w="80" w:type="dxa"/>
+              <w:start w:w="120" w:type="dxa"/>
+              <w:bottom w:w="80" w:type="dxa"/>
+              <w:end w:w="120" w:type="dxa"/>
+            </w:tcMar>
+            <w:shd w:fill="F8FAFC"/>
+          </w:tcPr>
+          <w:p>
+            <w:pPr>
+              <w:spacing w:after="0"/>
+              <w:jc w:val="left"/>
+            </w:pPr>
+            <w:r>
+              <w:rPr>
+                <w:rFonts w:ascii="Arial" w:hAnsi="Arial" w:eastAsia="Arial"/>
+                <w:b w:val="0"/>
+                <w:color w:val="111827"/>
+                <w:sz w:val="16"/>
+              </w:rPr>
+              <w:t>Сжать продукт до одной причинной сессии: вход в смысл, контекст, действие, reset, evidence, avatar/progress feedback, next-day hook.</w:t>
+            </w:r>
+          </w:p>
+        </w:tc>
+        <w:tc>
+          <w:tcPr>
+            <w:tcW w:type="dxa" w:w="1560"/>
+            <w:vAlign w:val="center"/>
+            <w:tcMar>
+              <w:top w:w="80" w:type="dxa"/>
+              <w:start w:w="120" w:type="dxa"/>
+              <w:bottom w:w="80" w:type="dxa"/>
+              <w:end w:w="120" w:type="dxa"/>
+            </w:tcMar>
+            <w:shd w:fill="F8FAFC"/>
+          </w:tcPr>
+          <w:p>
+            <w:pPr>
+              <w:spacing w:after="0"/>
+              <w:jc w:val="left"/>
+            </w:pPr>
+            <w:r>
+              <w:rPr>
+                <w:rFonts w:ascii="Arial" w:hAnsi="Arial" w:eastAsia="Arial"/>
+                <w:b w:val="0"/>
+                <w:color w:val="111827"/>
+                <w:sz w:val="16"/>
+              </w:rPr>
+              <w:t>product_loop_screens=8; prototype_scorecard_file=data_processed/prototype_validation_scorecard.csv</w:t>
+            </w:r>
+          </w:p>
+        </w:tc>
+        <w:tc>
+          <w:tcPr>
+            <w:tcW w:type="dxa" w:w="1560"/>
+            <w:vAlign w:val="center"/>
+            <w:tcMar>
+              <w:top w:w="80" w:type="dxa"/>
+              <w:start w:w="120" w:type="dxa"/>
+              <w:bottom w:w="80" w:type="dxa"/>
+              <w:end w:w="120" w:type="dxa"/>
+            </w:tcMar>
+            <w:shd w:fill="F8FAFC"/>
+          </w:tcPr>
+          <w:p>
+            <w:pPr>
+              <w:spacing w:after="0"/>
+              <w:jc w:val="left"/>
+            </w:pPr>
+            <w:r>
+              <w:rPr>
+                <w:rFonts w:ascii="Arial" w:hAnsi="Arial" w:eastAsia="Arial"/>
+                <w:b w:val="0"/>
+                <w:color w:val="111827"/>
+                <w:sz w:val="16"/>
+              </w:rPr>
+              <w:t>H4/H6 не закрыты, пока участники не объясняют петлю своими словами.</w:t>
+            </w:r>
+          </w:p>
+        </w:tc>
+      </w:tr>
+      <w:tr>
+        <w:tc>
+          <w:tcPr>
+            <w:tcW w:type="dxa" w:w="1560"/>
+            <w:vAlign w:val="center"/>
+            <w:tcMar>
+              <w:top w:w="80" w:type="dxa"/>
+              <w:start w:w="120" w:type="dxa"/>
+              <w:bottom w:w="80" w:type="dxa"/>
+              <w:end w:w="120" w:type="dxa"/>
+            </w:tcMar>
+          </w:tcPr>
+          <w:p>
+            <w:pPr>
+              <w:spacing w:after="0"/>
+              <w:jc w:val="left"/>
+            </w:pPr>
+            <w:r>
+              <w:rPr>
+                <w:rFonts w:ascii="Arial" w:hAnsi="Arial" w:eastAsia="Arial"/>
+                <w:b w:val="0"/>
+                <w:color w:val="111827"/>
+                <w:sz w:val="16"/>
+              </w:rPr>
+              <w:t>STORY_09_VALIDATION_QUEUE</w:t>
+            </w:r>
+          </w:p>
+        </w:tc>
+        <w:tc>
+          <w:tcPr>
+            <w:tcW w:type="dxa" w:w="1560"/>
+            <w:vAlign w:val="center"/>
+            <w:tcMar>
+              <w:top w:w="80" w:type="dxa"/>
+              <w:start w:w="120" w:type="dxa"/>
+              <w:bottom w:w="80" w:type="dxa"/>
+              <w:end w:w="120" w:type="dxa"/>
+            </w:tcMar>
+          </w:tcPr>
+          <w:p>
+            <w:pPr>
+              <w:spacing w:after="0"/>
+              <w:jc w:val="left"/>
+            </w:pPr>
+            <w:r>
+              <w:rPr>
+                <w:rFonts w:ascii="Arial" w:hAnsi="Arial" w:eastAsia="Arial"/>
+                <w:b w:val="0"/>
+                <w:color w:val="111827"/>
+                <w:sz w:val="16"/>
+              </w:rPr>
+              <w:t>Ближайшая очередь валидации</w:t>
+            </w:r>
+          </w:p>
+        </w:tc>
+        <w:tc>
+          <w:tcPr>
+            <w:tcW w:type="dxa" w:w="1560"/>
+            <w:vAlign w:val="center"/>
+            <w:tcMar>
+              <w:top w:w="80" w:type="dxa"/>
+              <w:start w:w="120" w:type="dxa"/>
+              <w:bottom w:w="80" w:type="dxa"/>
+              <w:end w:w="120" w:type="dxa"/>
+            </w:tcMar>
+          </w:tcPr>
+          <w:p>
+            <w:pPr>
+              <w:spacing w:after="0"/>
+              <w:jc w:val="left"/>
+            </w:pPr>
+            <w:r>
+              <w:rPr>
+                <w:rFonts w:ascii="Arial" w:hAnsi="Arial" w:eastAsia="Arial"/>
+                <w:b w:val="0"/>
+                <w:color w:val="111827"/>
+                <w:sz w:val="16"/>
+              </w:rPr>
+              <w:t>Что делать следующим шагом, чтобы отчет стал сильнее?</w:t>
+            </w:r>
+          </w:p>
+        </w:tc>
+        <w:tc>
+          <w:tcPr>
+            <w:tcW w:type="dxa" w:w="1560"/>
+            <w:vAlign w:val="center"/>
+            <w:tcMar>
+              <w:top w:w="80" w:type="dxa"/>
+              <w:start w:w="120" w:type="dxa"/>
+              <w:bottom w:w="80" w:type="dxa"/>
+              <w:end w:w="120" w:type="dxa"/>
+            </w:tcMar>
+          </w:tcPr>
+          <w:p>
+            <w:pPr>
+              <w:spacing w:after="0"/>
+              <w:jc w:val="left"/>
+            </w:pPr>
+            <w:r>
+              <w:rPr>
+                <w:rFonts w:ascii="Arial" w:hAnsi="Arial" w:eastAsia="Arial"/>
+                <w:b w:val="0"/>
+                <w:color w:val="111827"/>
+                <w:sz w:val="16"/>
+              </w:rPr>
+              <w:t>Дать порядок работ: hidden-clone walkthrough, paid-flow/WTP, ICP interviews, prototype sessions.</w:t>
+            </w:r>
+          </w:p>
+        </w:tc>
+        <w:tc>
+          <w:tcPr>
+            <w:tcW w:type="dxa" w:w="1560"/>
+            <w:vAlign w:val="center"/>
+            <w:tcMar>
+              <w:top w:w="80" w:type="dxa"/>
+              <w:start w:w="120" w:type="dxa"/>
+              <w:bottom w:w="80" w:type="dxa"/>
+              <w:end w:w="120" w:type="dxa"/>
+            </w:tcMar>
+          </w:tcPr>
+          <w:p>
+            <w:pPr>
+              <w:spacing w:after="0"/>
+              <w:jc w:val="left"/>
+            </w:pPr>
+            <w:r>
+              <w:rPr>
+                <w:rFonts w:ascii="Arial" w:hAnsi="Arial" w:eastAsia="Arial"/>
+                <w:b w:val="0"/>
+                <w:color w:val="111827"/>
+                <w:sz w:val="16"/>
+              </w:rPr>
+              <w:t>next_validation_tasks=22; first_workstreams=manual walkthrough + paid-flow</w:t>
+            </w:r>
+          </w:p>
+        </w:tc>
+        <w:tc>
+          <w:tcPr>
+            <w:tcW w:type="dxa" w:w="1560"/>
+            <w:vAlign w:val="center"/>
+            <w:tcMar>
+              <w:top w:w="80" w:type="dxa"/>
+              <w:start w:w="120" w:type="dxa"/>
+              <w:bottom w:w="80" w:type="dxa"/>
+              <w:end w:w="120" w:type="dxa"/>
+            </w:tcMar>
+          </w:tcPr>
+          <w:p>
+            <w:pPr>
+              <w:spacing w:after="0"/>
+              <w:jc w:val="left"/>
+            </w:pPr>
+            <w:r>
+              <w:rPr>
+                <w:rFonts w:ascii="Arial" w:hAnsi="Arial" w:eastAsia="Arial"/>
+                <w:b w:val="0"/>
+                <w:color w:val="111827"/>
+                <w:sz w:val="16"/>
+              </w:rPr>
+              <w:t>Очередь задач не равна выполненной валидации.</w:t>
+            </w:r>
+          </w:p>
+        </w:tc>
+      </w:tr>
+      <w:tr>
+        <w:tc>
+          <w:tcPr>
+            <w:tcW w:type="dxa" w:w="1560"/>
+            <w:vAlign w:val="center"/>
+            <w:tcMar>
+              <w:top w:w="80" w:type="dxa"/>
+              <w:start w:w="120" w:type="dxa"/>
+              <w:bottom w:w="80" w:type="dxa"/>
+              <w:end w:w="120" w:type="dxa"/>
+            </w:tcMar>
+            <w:shd w:fill="F8FAFC"/>
+          </w:tcPr>
+          <w:p>
+            <w:pPr>
+              <w:spacing w:after="0"/>
+              <w:jc w:val="left"/>
+            </w:pPr>
+            <w:r>
+              <w:rPr>
+                <w:rFonts w:ascii="Arial" w:hAnsi="Arial" w:eastAsia="Arial"/>
+                <w:b w:val="0"/>
+                <w:color w:val="111827"/>
+                <w:sz w:val="16"/>
+              </w:rPr>
+              <w:t>STORY_10_TRACEABILITY</w:t>
+            </w:r>
+          </w:p>
+        </w:tc>
+        <w:tc>
+          <w:tcPr>
+            <w:tcW w:type="dxa" w:w="1560"/>
+            <w:vAlign w:val="center"/>
+            <w:tcMar>
+              <w:top w:w="80" w:type="dxa"/>
+              <w:start w:w="120" w:type="dxa"/>
+              <w:bottom w:w="80" w:type="dxa"/>
+              <w:end w:w="120" w:type="dxa"/>
+            </w:tcMar>
+            <w:shd w:fill="F8FAFC"/>
+          </w:tcPr>
+          <w:p>
+            <w:pPr>
+              <w:spacing w:after="0"/>
+              <w:jc w:val="left"/>
+            </w:pPr>
+            <w:r>
+              <w:rPr>
+                <w:rFonts w:ascii="Arial" w:hAnsi="Arial" w:eastAsia="Arial"/>
+                <w:b w:val="0"/>
+                <w:color w:val="111827"/>
+                <w:sz w:val="16"/>
+              </w:rPr>
+              <w:t>Источники и границы доказательств</w:t>
+            </w:r>
+          </w:p>
+        </w:tc>
+        <w:tc>
+          <w:tcPr>
+            <w:tcW w:type="dxa" w:w="1560"/>
+            <w:vAlign w:val="center"/>
+            <w:tcMar>
+              <w:top w:w="80" w:type="dxa"/>
+              <w:start w:w="120" w:type="dxa"/>
+              <w:bottom w:w="80" w:type="dxa"/>
+              <w:end w:w="120" w:type="dxa"/>
+            </w:tcMar>
+            <w:shd w:fill="F8FAFC"/>
+          </w:tcPr>
+          <w:p>
+            <w:pPr>
+              <w:spacing w:after="0"/>
+              <w:jc w:val="left"/>
+            </w:pPr>
+            <w:r>
+              <w:rPr>
+                <w:rFonts w:ascii="Arial" w:hAnsi="Arial" w:eastAsia="Arial"/>
+                <w:b w:val="0"/>
+                <w:color w:val="111827"/>
+                <w:sz w:val="16"/>
+              </w:rPr>
+              <w:t>Можно ли проверить, откуда взялись утверждения?</w:t>
+            </w:r>
+          </w:p>
+        </w:tc>
+        <w:tc>
+          <w:tcPr>
+            <w:tcW w:type="dxa" w:w="1560"/>
+            <w:vAlign w:val="center"/>
+            <w:tcMar>
+              <w:top w:w="80" w:type="dxa"/>
+              <w:start w:w="120" w:type="dxa"/>
+              <w:bottom w:w="80" w:type="dxa"/>
+              <w:end w:w="120" w:type="dxa"/>
+            </w:tcMar>
+            <w:shd w:fill="F8FAFC"/>
+          </w:tcPr>
+          <w:p>
+            <w:pPr>
+              <w:spacing w:after="0"/>
+              <w:jc w:val="left"/>
+            </w:pPr>
+            <w:r>
+              <w:rPr>
+                <w:rFonts w:ascii="Arial" w:hAnsi="Arial" w:eastAsia="Arial"/>
+                <w:b w:val="0"/>
+                <w:color w:val="111827"/>
+                <w:sz w:val="16"/>
+              </w:rPr>
+              <w:t>Закрыть рассказ source appendix, manifest и границами claims, чтобы отчет был красивым, но не бездоказательным.</w:t>
+            </w:r>
+          </w:p>
+        </w:tc>
+        <w:tc>
+          <w:tcPr>
+            <w:tcW w:type="dxa" w:w="1560"/>
+            <w:vAlign w:val="center"/>
+            <w:tcMar>
+              <w:top w:w="80" w:type="dxa"/>
+              <w:start w:w="120" w:type="dxa"/>
+              <w:bottom w:w="80" w:type="dxa"/>
+              <w:end w:w="120" w:type="dxa"/>
+            </w:tcMar>
+            <w:shd w:fill="F8FAFC"/>
+          </w:tcPr>
+          <w:p>
+            <w:pPr>
+              <w:spacing w:after="0"/>
+              <w:jc w:val="left"/>
+            </w:pPr>
+            <w:r>
+              <w:rPr>
+                <w:rFonts w:ascii="Arial" w:hAnsi="Arial" w:eastAsia="Arial"/>
+                <w:b w:val="0"/>
+                <w:color w:val="111827"/>
+                <w:sz w:val="16"/>
+              </w:rPr>
+              <w:t>manifest=501; readability_rows=8; source_appendix=data_processed/global_hypothesis_source_appendix.csv</w:t>
+            </w:r>
+          </w:p>
+        </w:tc>
+        <w:tc>
+          <w:tcPr>
+            <w:tcW w:type="dxa" w:w="1560"/>
+            <w:vAlign w:val="center"/>
+            <w:tcMar>
+              <w:top w:w="80" w:type="dxa"/>
+              <w:start w:w="120" w:type="dxa"/>
+              <w:bottom w:w="80" w:type="dxa"/>
+              <w:end w:w="120" w:type="dxa"/>
+            </w:tcMar>
+            <w:shd w:fill="F8FAFC"/>
+          </w:tcPr>
+          <w:p>
+            <w:pPr>
+              <w:spacing w:after="0"/>
+              <w:jc w:val="left"/>
+            </w:pPr>
+            <w:r>
+              <w:rPr>
+                <w:rFonts w:ascii="Arial" w:hAnsi="Arial" w:eastAsia="Arial"/>
+                <w:b w:val="0"/>
+                <w:color w:val="111827"/>
+                <w:sz w:val="16"/>
+              </w:rPr>
+              <w:t>Traceability доказывает наличие и связность артефактов, но не доказывает продуктовый outcome.</w:t>
+            </w:r>
+          </w:p>
+        </w:tc>
+      </w:tr>
+    </w:tbl>
+    <w:p/>
     <w:p>
       <w:pPr>
         <w:pStyle w:val="Heading1"/>
@@ -27340,7 +29224,7 @@
                 <w:color w:val="111827"/>
                 <w:sz w:val="16"/>
               </w:rPr>
-              <w:t>19 крупных разделов; expected_sequence_breaks=0</w:t>
+              <w:t>20 крупных разделов; expected_sequence_breaks=0</w:t>
             </w:r>
           </w:p>
         </w:tc>
@@ -27619,7 +29503,7 @@
                 <w:color w:val="111827"/>
                 <w:sz w:val="16"/>
               </w:rPr>
-              <w:t>markdown_table_rows=186</w:t>
+              <w:t>markdown_table_rows=217</w:t>
             </w:r>
           </w:p>
         </w:tc>
@@ -27898,7 +29782,7 @@
                 <w:color w:val="111827"/>
                 <w:sz w:val="16"/>
               </w:rPr>
-              <w:t>technical_english_hits=310</w:t>
+              <w:t>technical_english_hits=361</w:t>
             </w:r>
           </w:p>
         </w:tc>
@@ -28205,6 +30089,148 @@
                 <w:sz w:val="16"/>
               </w:rPr>
               <w:t>Следующим рабочим ходом закрывать первые P0 walkthrough и paid-flow tasks, а не расширять desk research бесконечно.</w:t>
+            </w:r>
+          </w:p>
+        </w:tc>
+      </w:tr>
+      <w:tr>
+        <w:tc>
+          <w:tcPr>
+            <w:tcW w:type="dxa" w:w="2376"/>
+            <w:vAlign w:val="center"/>
+            <w:tcMar>
+              <w:top w:w="80" w:type="dxa"/>
+              <w:start w:w="120" w:type="dxa"/>
+              <w:bottom w:w="80" w:type="dxa"/>
+              <w:end w:w="120" w:type="dxa"/>
+            </w:tcMar>
+            <w:shd w:fill="F8FAFC"/>
+          </w:tcPr>
+          <w:p>
+            <w:pPr>
+              <w:spacing w:after="0"/>
+              <w:jc w:val="left"/>
+            </w:pPr>
+            <w:r>
+              <w:rPr>
+                <w:rFonts w:ascii="Arial" w:hAnsi="Arial" w:eastAsia="Arial"/>
+                <w:b w:val="0"/>
+                <w:color w:val="111827"/>
+                <w:sz w:val="16"/>
+              </w:rPr>
+              <w:t>Повествовательная склейка по образцу</w:t>
+            </w:r>
+          </w:p>
+        </w:tc>
+        <w:tc>
+          <w:tcPr>
+            <w:tcW w:type="dxa" w:w="1224"/>
+            <w:vAlign w:val="center"/>
+            <w:tcMar>
+              <w:top w:w="80" w:type="dxa"/>
+              <w:start w:w="120" w:type="dxa"/>
+              <w:bottom w:w="80" w:type="dxa"/>
+              <w:end w:w="120" w:type="dxa"/>
+            </w:tcMar>
+            <w:shd w:fill="F8FAFC"/>
+          </w:tcPr>
+          <w:p>
+            <w:pPr>
+              <w:spacing w:after="0"/>
+              <w:jc w:val="left"/>
+            </w:pPr>
+            <w:r>
+              <w:rPr>
+                <w:rFonts w:ascii="Arial" w:hAnsi="Arial" w:eastAsia="Arial"/>
+                <w:b w:val="0"/>
+                <w:color w:val="111827"/>
+                <w:sz w:val="16"/>
+              </w:rPr>
+              <w:t>складно</w:t>
+            </w:r>
+          </w:p>
+        </w:tc>
+        <w:tc>
+          <w:tcPr>
+            <w:tcW w:type="dxa" w:w="1224"/>
+            <w:vAlign w:val="center"/>
+            <w:tcMar>
+              <w:top w:w="80" w:type="dxa"/>
+              <w:start w:w="120" w:type="dxa"/>
+              <w:bottom w:w="80" w:type="dxa"/>
+              <w:end w:w="120" w:type="dxa"/>
+            </w:tcMar>
+            <w:shd w:fill="F8FAFC"/>
+          </w:tcPr>
+          <w:p>
+            <w:pPr>
+              <w:spacing w:after="0"/>
+              <w:jc w:val="left"/>
+            </w:pPr>
+            <w:r>
+              <w:rPr>
+                <w:rFonts w:ascii="Arial" w:hAnsi="Arial" w:eastAsia="Arial"/>
+                <w:b w:val="0"/>
+                <w:color w:val="111827"/>
+                <w:sz w:val="16"/>
+              </w:rPr>
+              <w:t>низкая</w:t>
+            </w:r>
+          </w:p>
+        </w:tc>
+        <w:tc>
+          <w:tcPr>
+            <w:tcW w:type="dxa" w:w="1944"/>
+            <w:vAlign w:val="center"/>
+            <w:tcMar>
+              <w:top w:w="80" w:type="dxa"/>
+              <w:start w:w="120" w:type="dxa"/>
+              <w:bottom w:w="80" w:type="dxa"/>
+              <w:end w:w="120" w:type="dxa"/>
+            </w:tcMar>
+            <w:shd w:fill="F8FAFC"/>
+          </w:tcPr>
+          <w:p>
+            <w:pPr>
+              <w:spacing w:after="0"/>
+              <w:jc w:val="left"/>
+            </w:pPr>
+            <w:r>
+              <w:rPr>
+                <w:rFonts w:ascii="Arial" w:hAnsi="Arial" w:eastAsia="Arial"/>
+                <w:b w:val="0"/>
+                <w:color w:val="111827"/>
+                <w:sz w:val="16"/>
+              </w:rPr>
+              <w:t>storyline_rows=10; section_present=yes</w:t>
+            </w:r>
+          </w:p>
+        </w:tc>
+        <w:tc>
+          <w:tcPr>
+            <w:tcW w:type="dxa" w:w="2592"/>
+            <w:vAlign w:val="center"/>
+            <w:tcMar>
+              <w:top w:w="80" w:type="dxa"/>
+              <w:start w:w="120" w:type="dxa"/>
+              <w:bottom w:w="80" w:type="dxa"/>
+              <w:end w:w="120" w:type="dxa"/>
+            </w:tcMar>
+            <w:shd w:fill="F8FAFC"/>
+          </w:tcPr>
+          <w:p>
+            <w:pPr>
+              <w:spacing w:after="0"/>
+              <w:jc w:val="left"/>
+            </w:pPr>
+            <w:r>
+              <w:rPr>
+                <w:rFonts w:ascii="Arial" w:hAnsi="Arial" w:eastAsia="Arial"/>
+                <w:b w:val="0"/>
+                <w:color w:val="111827"/>
+                <w:sz w:val="16"/>
+              </w:rPr>
+              <w:t>Держать STORY_01-STORY_10 как редакционный каркас перед каждой внешней сборкой PDF/DOCX.</w:t>
             </w:r>
           </w:p>
         </w:tc>
@@ -29331,7 +31357,7 @@
                 <w:color w:val="111827"/>
                 <w:sz w:val="16"/>
               </w:rPr>
-              <w:t>498 manifest artifacts; missing=0</w:t>
+              <w:t>501 manifest artifacts; missing=0</w:t>
             </w:r>
           </w:p>
         </w:tc>
@@ -29751,7 +31777,7 @@
                 <w:color w:val="111827"/>
                 <w:sz w:val="16"/>
               </w:rPr>
-              <w:t>7 readability audit rows</w:t>
+              <w:t>8 readability audit rows</w:t>
             </w:r>
           </w:p>
         </w:tc>
@@ -30059,6 +32085,143 @@
                 <w:sz w:val="16"/>
               </w:rPr>
               <w:t>Sensitivity audit показывает хрупкость assumptions; он не доказывает выручку Alina.</w:t>
+            </w:r>
+          </w:p>
+        </w:tc>
+      </w:tr>
+      <w:tr>
+        <w:tc>
+          <w:tcPr>
+            <w:tcW w:type="dxa" w:w="2376"/>
+            <w:vAlign w:val="center"/>
+            <w:tcMar>
+              <w:top w:w="80" w:type="dxa"/>
+              <w:start w:w="120" w:type="dxa"/>
+              <w:bottom w:w="80" w:type="dxa"/>
+              <w:end w:w="120" w:type="dxa"/>
+            </w:tcMar>
+          </w:tcPr>
+          <w:p>
+            <w:pPr>
+              <w:spacing w:after="0"/>
+              <w:jc w:val="left"/>
+            </w:pPr>
+            <w:r>
+              <w:rPr>
+                <w:rFonts w:ascii="Arial" w:hAnsi="Arial" w:eastAsia="Arial"/>
+                <w:b w:val="0"/>
+                <w:color w:val="111827"/>
+                <w:sz w:val="16"/>
+              </w:rPr>
+              <w:t>SRC_13_RUSSIAN_STORYLINE</w:t>
+            </w:r>
+          </w:p>
+        </w:tc>
+        <w:tc>
+          <w:tcPr>
+            <w:tcW w:type="dxa" w:w="1224"/>
+            <w:vAlign w:val="center"/>
+            <w:tcMar>
+              <w:top w:w="80" w:type="dxa"/>
+              <w:start w:w="120" w:type="dxa"/>
+              <w:bottom w:w="80" w:type="dxa"/>
+              <w:end w:w="120" w:type="dxa"/>
+            </w:tcMar>
+          </w:tcPr>
+          <w:p>
+            <w:pPr>
+              <w:spacing w:after="0"/>
+              <w:jc w:val="left"/>
+            </w:pPr>
+            <w:r>
+              <w:rPr>
+                <w:rFonts w:ascii="Arial" w:hAnsi="Arial" w:eastAsia="Arial"/>
+                <w:b w:val="0"/>
+                <w:color w:val="111827"/>
+                <w:sz w:val="16"/>
+              </w:rPr>
+              <w:t>Повествовательная логика отчета</w:t>
+            </w:r>
+          </w:p>
+        </w:tc>
+        <w:tc>
+          <w:tcPr>
+            <w:tcW w:type="dxa" w:w="1224"/>
+            <w:vAlign w:val="center"/>
+            <w:tcMar>
+              <w:top w:w="80" w:type="dxa"/>
+              <w:start w:w="120" w:type="dxa"/>
+              <w:bottom w:w="80" w:type="dxa"/>
+              <w:end w:w="120" w:type="dxa"/>
+            </w:tcMar>
+          </w:tcPr>
+          <w:p>
+            <w:pPr>
+              <w:spacing w:after="0"/>
+              <w:jc w:val="left"/>
+            </w:pPr>
+            <w:r>
+              <w:rPr>
+                <w:rFonts w:ascii="Arial" w:hAnsi="Arial" w:eastAsia="Arial"/>
+                <w:b w:val="0"/>
+                <w:color w:val="111827"/>
+                <w:sz w:val="16"/>
+              </w:rPr>
+              <w:t>проверено narrative-spine картой, не market proof</w:t>
+            </w:r>
+          </w:p>
+        </w:tc>
+        <w:tc>
+          <w:tcPr>
+            <w:tcW w:type="dxa" w:w="1944"/>
+            <w:vAlign w:val="center"/>
+            <w:tcMar>
+              <w:top w:w="80" w:type="dxa"/>
+              <w:start w:w="120" w:type="dxa"/>
+              <w:bottom w:w="80" w:type="dxa"/>
+              <w:end w:w="120" w:type="dxa"/>
+            </w:tcMar>
+          </w:tcPr>
+          <w:p>
+            <w:pPr>
+              <w:spacing w:after="0"/>
+              <w:jc w:val="left"/>
+            </w:pPr>
+            <w:r>
+              <w:rPr>
+                <w:rFonts w:ascii="Arial" w:hAnsi="Arial" w:eastAsia="Arial"/>
+                <w:b w:val="0"/>
+                <w:color w:val="111827"/>
+                <w:sz w:val="16"/>
+              </w:rPr>
+              <w:t>10 storyline rows</w:t>
+            </w:r>
+          </w:p>
+        </w:tc>
+        <w:tc>
+          <w:tcPr>
+            <w:tcW w:type="dxa" w:w="2592"/>
+            <w:vAlign w:val="center"/>
+            <w:tcMar>
+              <w:top w:w="80" w:type="dxa"/>
+              <w:start w:w="120" w:type="dxa"/>
+              <w:bottom w:w="80" w:type="dxa"/>
+              <w:end w:w="120" w:type="dxa"/>
+            </w:tcMar>
+          </w:tcPr>
+          <w:p>
+            <w:pPr>
+              <w:spacing w:after="0"/>
+              <w:jc w:val="left"/>
+            </w:pPr>
+            <w:r>
+              <w:rPr>
+                <w:rFonts w:ascii="Arial" w:hAnsi="Arial" w:eastAsia="Arial"/>
+                <w:b w:val="0"/>
+                <w:color w:val="111827"/>
+                <w:sz w:val="16"/>
+              </w:rPr>
+              <w:t>Storyline карта управляет формой и переходами отчета; она не усиливает рыночные, конкурентные или продуктовые claims без observed evidence.</w:t>
             </w:r>
           </w:p>
         </w:tc>
@@ -30214,6 +32377,15 @@
       </w:pPr>
       <w:r>
         <w:t>data_processed/global_source_quality_gap_audit.csv</w:t>
+      </w:r>
+    </w:p>
+    <w:p>
+      <w:pPr>
+        <w:pStyle w:val="ListBullet"/>
+        <w:spacing w:after="80"/>
+      </w:pPr>
+      <w:r>
+        <w:t>data_processed/russian_sequential_storyline.csv</w:t>
       </w:r>
     </w:p>
     <w:p>

</xml_diff>

<commit_message>
Add Russian frontmatter dashboard
</commit_message>
<xml_diff>
--- a/output/docx/alina-global-hypothesis-report-v1.docx
+++ b/output/docx/alina-global-hypothesis-report-v1.docx
@@ -31,7 +31,7 @@
     </w:p>
     <w:p>
       <w:r>
-        <w:t>Собрано: 2026-05-31T17:06:40.916Z</w:t>
+        <w:t>Собрано: 2026-05-31T17:16:20.827Z</w:t>
       </w:r>
     </w:p>
     <w:p>
@@ -64,9 +64,2229 @@
     </w:p>
     <w:p>
       <w:r>
-        <w:t>На текущем этапе собрано 67,525 сырьевых source-строк, 36,694 уникализированных строк и 501 локальных артефактов. Эти данные нужны не для того, чтобы объявить продукт доказанным, а для последовательной проверки: существует ли рынок, есть ли деньги, насколько плотна конкуренция, где может быть белое пятно, кто аудитория и какую MVP-петлю надо тестировать.</w:t>
+        <w:t>На текущем этапе собрано 67,525 сырьевых source-строк, 36,694 уникализированных строк и 504 локальных артефактов. Эти данные нужны не для того, чтобы объявить продукт доказанным, а для последовательной проверки: существует ли рынок, есть ли деньги, насколько плотна конкуренция, где может быть белое пятно, кто аудитория и какую MVP-петлю надо тестировать.</w:t>
       </w:r>
     </w:p>
+    <w:p>
+      <w:pPr>
+        <w:pStyle w:val="Heading2"/>
+      </w:pPr>
+      <w:r>
+        <w:t>Первые управленческие числа</w:t>
+      </w:r>
+    </w:p>
+    <w:p>
+      <w:r>
+        <w:t>Перед длинным evidence pack ниже вынесена короткая панель. Она отвечает на базовые вопросы: сколько данных собрано, сколько приложений/строк видно по каждой нише, где находится денежная модель, какие gates еще открыты и что делать дальше. Это не отдельное доказательство продукта, а навигация по текущему состоянию ресерча.</w:t>
+      </w:r>
+    </w:p>
+    <w:tbl>
+      <w:tblPr>
+        <w:tblW w:type="dxa" w:w="9360"/>
+        <w:jc w:val="left"/>
+        <w:tblLayout w:type="fixed"/>
+        <w:tblLook w:firstColumn="1" w:firstRow="1" w:lastColumn="0" w:lastRow="0" w:noHBand="0" w:noVBand="1" w:val="04A0"/>
+        <w:tblInd w:w="120" w:type="dxa"/>
+        <w:tblBorders>
+          <w:top w:val="single" w:sz="4" w:space="0" w:color="CBD5E1"/>
+          <w:left w:val="single" w:sz="4" w:space="0" w:color="CBD5E1"/>
+          <w:bottom w:val="single" w:sz="4" w:space="0" w:color="CBD5E1"/>
+          <w:right w:val="single" w:sz="4" w:space="0" w:color="CBD5E1"/>
+          <w:insideH w:val="single" w:sz="4" w:space="0" w:color="CBD5E1"/>
+          <w:insideV w:val="single" w:sz="4" w:space="0" w:color="CBD5E1"/>
+        </w:tblBorders>
+      </w:tblPr>
+      <w:tblGrid>
+        <w:gridCol w:w="2340"/>
+        <w:gridCol w:w="2340"/>
+        <w:gridCol w:w="2340"/>
+        <w:gridCol w:w="2340"/>
+      </w:tblGrid>
+      <w:tr>
+        <w:tc>
+          <w:tcPr>
+            <w:tcW w:type="dxa" w:w="2448"/>
+            <w:vAlign w:val="center"/>
+            <w:tcMar>
+              <w:top w:w="80" w:type="dxa"/>
+              <w:start w:w="120" w:type="dxa"/>
+              <w:bottom w:w="80" w:type="dxa"/>
+              <w:end w:w="120" w:type="dxa"/>
+            </w:tcMar>
+            <w:shd w:fill="E8EEF5"/>
+          </w:tcPr>
+          <w:p>
+            <w:pPr>
+              <w:spacing w:after="0"/>
+              <w:jc w:val="left"/>
+            </w:pPr>
+            <w:r>
+              <w:rPr>
+                <w:rFonts w:ascii="Arial" w:hAnsi="Arial" w:eastAsia="Arial"/>
+                <w:b/>
+                <w:color w:val="111827"/>
+                <w:sz w:val="17"/>
+              </w:rPr>
+              <w:t>Метрика</w:t>
+            </w:r>
+          </w:p>
+        </w:tc>
+        <w:tc>
+          <w:tcPr>
+            <w:tcW w:type="dxa" w:w="1440"/>
+            <w:vAlign w:val="center"/>
+            <w:tcMar>
+              <w:top w:w="80" w:type="dxa"/>
+              <w:start w:w="120" w:type="dxa"/>
+              <w:bottom w:w="80" w:type="dxa"/>
+              <w:end w:w="120" w:type="dxa"/>
+            </w:tcMar>
+            <w:shd w:fill="E8EEF5"/>
+          </w:tcPr>
+          <w:p>
+            <w:pPr>
+              <w:spacing w:after="0"/>
+              <w:jc w:val="left"/>
+            </w:pPr>
+            <w:r>
+              <w:rPr>
+                <w:rFonts w:ascii="Arial" w:hAnsi="Arial" w:eastAsia="Arial"/>
+                <w:b/>
+                <w:color w:val="111827"/>
+                <w:sz w:val="17"/>
+              </w:rPr>
+              <w:t>Значение</w:t>
+            </w:r>
+          </w:p>
+        </w:tc>
+        <w:tc>
+          <w:tcPr>
+            <w:tcW w:type="dxa" w:w="2016"/>
+            <w:vAlign w:val="center"/>
+            <w:tcMar>
+              <w:top w:w="80" w:type="dxa"/>
+              <w:start w:w="120" w:type="dxa"/>
+              <w:bottom w:w="80" w:type="dxa"/>
+              <w:end w:w="120" w:type="dxa"/>
+            </w:tcMar>
+            <w:shd w:fill="E8EEF5"/>
+          </w:tcPr>
+          <w:p>
+            <w:pPr>
+              <w:spacing w:after="0"/>
+              <w:jc w:val="left"/>
+            </w:pPr>
+            <w:r>
+              <w:rPr>
+                <w:rFonts w:ascii="Arial" w:hAnsi="Arial" w:eastAsia="Arial"/>
+                <w:b/>
+                <w:color w:val="111827"/>
+                <w:sz w:val="17"/>
+              </w:rPr>
+              <w:t>Как читать</w:t>
+            </w:r>
+          </w:p>
+        </w:tc>
+        <w:tc>
+          <w:tcPr>
+            <w:tcW w:type="dxa" w:w="3456"/>
+            <w:vAlign w:val="center"/>
+            <w:tcMar>
+              <w:top w:w="80" w:type="dxa"/>
+              <w:start w:w="120" w:type="dxa"/>
+              <w:bottom w:w="80" w:type="dxa"/>
+              <w:end w:w="120" w:type="dxa"/>
+            </w:tcMar>
+            <w:shd w:fill="E8EEF5"/>
+          </w:tcPr>
+          <w:p>
+            <w:pPr>
+              <w:spacing w:after="0"/>
+              <w:jc w:val="left"/>
+            </w:pPr>
+            <w:r>
+              <w:rPr>
+                <w:rFonts w:ascii="Arial" w:hAnsi="Arial" w:eastAsia="Arial"/>
+                <w:b/>
+                <w:color w:val="111827"/>
+                <w:sz w:val="17"/>
+              </w:rPr>
+              <w:t>Граница</w:t>
+            </w:r>
+          </w:p>
+        </w:tc>
+      </w:tr>
+      <w:tr>
+        <w:tc>
+          <w:tcPr>
+            <w:tcW w:type="dxa" w:w="2448"/>
+            <w:vAlign w:val="center"/>
+            <w:tcMar>
+              <w:top w:w="80" w:type="dxa"/>
+              <w:start w:w="120" w:type="dxa"/>
+              <w:bottom w:w="80" w:type="dxa"/>
+              <w:end w:w="120" w:type="dxa"/>
+            </w:tcMar>
+          </w:tcPr>
+          <w:p>
+            <w:pPr>
+              <w:spacing w:after="0"/>
+              <w:jc w:val="left"/>
+            </w:pPr>
+            <w:r>
+              <w:rPr>
+                <w:rFonts w:ascii="Arial" w:hAnsi="Arial" w:eastAsia="Arial"/>
+                <w:b w:val="0"/>
+                <w:color w:val="111827"/>
+                <w:sz w:val="17"/>
+              </w:rPr>
+              <w:t>Масштаб evidence base</w:t>
+            </w:r>
+          </w:p>
+        </w:tc>
+        <w:tc>
+          <w:tcPr>
+            <w:tcW w:type="dxa" w:w="1440"/>
+            <w:vAlign w:val="center"/>
+            <w:tcMar>
+              <w:top w:w="80" w:type="dxa"/>
+              <w:start w:w="120" w:type="dxa"/>
+              <w:bottom w:w="80" w:type="dxa"/>
+              <w:end w:w="120" w:type="dxa"/>
+            </w:tcMar>
+          </w:tcPr>
+          <w:p>
+            <w:pPr>
+              <w:spacing w:after="0"/>
+              <w:jc w:val="left"/>
+            </w:pPr>
+            <w:r>
+              <w:rPr>
+                <w:rFonts w:ascii="Arial" w:hAnsi="Arial" w:eastAsia="Arial"/>
+                <w:b w:val="0"/>
+                <w:color w:val="111827"/>
+                <w:sz w:val="17"/>
+              </w:rPr>
+              <w:t>67,525 raw source-строк; 36,694 global dedup; 504 manifest artifacts</w:t>
+            </w:r>
+          </w:p>
+        </w:tc>
+        <w:tc>
+          <w:tcPr>
+            <w:tcW w:type="dxa" w:w="2016"/>
+            <w:vAlign w:val="center"/>
+            <w:tcMar>
+              <w:top w:w="80" w:type="dxa"/>
+              <w:start w:w="120" w:type="dxa"/>
+              <w:bottom w:w="80" w:type="dxa"/>
+              <w:end w:w="120" w:type="dxa"/>
+            </w:tcMar>
+          </w:tcPr>
+          <w:p>
+            <w:pPr>
+              <w:spacing w:after="0"/>
+              <w:jc w:val="left"/>
+            </w:pPr>
+            <w:r>
+              <w:rPr>
+                <w:rFonts w:ascii="Arial" w:hAnsi="Arial" w:eastAsia="Arial"/>
+                <w:b w:val="0"/>
+                <w:color w:val="111827"/>
+                <w:sz w:val="17"/>
+              </w:rPr>
+              <w:t>Пакет уже большой как карта рынка и конкурентов.</w:t>
+            </w:r>
+          </w:p>
+        </w:tc>
+        <w:tc>
+          <w:tcPr>
+            <w:tcW w:type="dxa" w:w="3456"/>
+            <w:vAlign w:val="center"/>
+            <w:tcMar>
+              <w:top w:w="80" w:type="dxa"/>
+              <w:start w:w="120" w:type="dxa"/>
+              <w:bottom w:w="80" w:type="dxa"/>
+              <w:end w:w="120" w:type="dxa"/>
+            </w:tcMar>
+          </w:tcPr>
+          <w:p>
+            <w:pPr>
+              <w:spacing w:after="0"/>
+              <w:jc w:val="left"/>
+            </w:pPr>
+            <w:r>
+              <w:rPr>
+                <w:rFonts w:ascii="Arial" w:hAnsi="Arial" w:eastAsia="Arial"/>
+                <w:b w:val="0"/>
+                <w:color w:val="111827"/>
+                <w:sz w:val="17"/>
+              </w:rPr>
+              <w:t>Масштаб строк не равен доказанному спросу или числу прямых клонов.</w:t>
+            </w:r>
+          </w:p>
+        </w:tc>
+      </w:tr>
+      <w:tr>
+        <w:tc>
+          <w:tcPr>
+            <w:tcW w:type="dxa" w:w="2448"/>
+            <w:vAlign w:val="center"/>
+            <w:tcMar>
+              <w:top w:w="80" w:type="dxa"/>
+              <w:start w:w="120" w:type="dxa"/>
+              <w:bottom w:w="80" w:type="dxa"/>
+              <w:end w:w="120" w:type="dxa"/>
+            </w:tcMar>
+            <w:shd w:fill="F8FAFC"/>
+          </w:tcPr>
+          <w:p>
+            <w:pPr>
+              <w:spacing w:after="0"/>
+              <w:jc w:val="left"/>
+            </w:pPr>
+            <w:r>
+              <w:rPr>
+                <w:rFonts w:ascii="Arial" w:hAnsi="Arial" w:eastAsia="Arial"/>
+                <w:b w:val="0"/>
+                <w:color w:val="111827"/>
+                <w:sz w:val="17"/>
+              </w:rPr>
+              <w:t>Покрытие пяти направлений</w:t>
+            </w:r>
+          </w:p>
+        </w:tc>
+        <w:tc>
+          <w:tcPr>
+            <w:tcW w:type="dxa" w:w="1440"/>
+            <w:vAlign w:val="center"/>
+            <w:tcMar>
+              <w:top w:w="80" w:type="dxa"/>
+              <w:start w:w="120" w:type="dxa"/>
+              <w:bottom w:w="80" w:type="dxa"/>
+              <w:end w:w="120" w:type="dxa"/>
+            </w:tcMar>
+            <w:shd w:fill="F8FAFC"/>
+          </w:tcPr>
+          <w:p>
+            <w:pPr>
+              <w:spacing w:after="0"/>
+              <w:jc w:val="left"/>
+            </w:pPr>
+            <w:r>
+              <w:rPr>
+                <w:rFonts w:ascii="Arial" w:hAnsi="Arial" w:eastAsia="Arial"/>
+                <w:b w:val="0"/>
+                <w:color w:val="111827"/>
+                <w:sz w:val="17"/>
+              </w:rPr>
+              <w:t>5 market rows; 13,117 direct app dedup rows by niche; 43,144 all-source dedup rows by niche</w:t>
+            </w:r>
+          </w:p>
+        </w:tc>
+        <w:tc>
+          <w:tcPr>
+            <w:tcW w:type="dxa" w:w="2016"/>
+            <w:vAlign w:val="center"/>
+            <w:tcMar>
+              <w:top w:w="80" w:type="dxa"/>
+              <w:start w:w="120" w:type="dxa"/>
+              <w:bottom w:w="80" w:type="dxa"/>
+              <w:end w:w="120" w:type="dxa"/>
+            </w:tcMar>
+            <w:shd w:fill="F8FAFC"/>
+          </w:tcPr>
+          <w:p>
+            <w:pPr>
+              <w:spacing w:after="0"/>
+              <w:jc w:val="left"/>
+            </w:pPr>
+            <w:r>
+              <w:rPr>
+                <w:rFonts w:ascii="Arial" w:hAnsi="Arial" w:eastAsia="Arial"/>
+                <w:b w:val="0"/>
+                <w:color w:val="111827"/>
+                <w:sz w:val="17"/>
+              </w:rPr>
+              <w:t>По каждой нише видно, сколько данных лежит под выводами.</w:t>
+            </w:r>
+          </w:p>
+        </w:tc>
+        <w:tc>
+          <w:tcPr>
+            <w:tcW w:type="dxa" w:w="3456"/>
+            <w:vAlign w:val="center"/>
+            <w:tcMar>
+              <w:top w:w="80" w:type="dxa"/>
+              <w:start w:w="120" w:type="dxa"/>
+              <w:bottom w:w="80" w:type="dxa"/>
+              <w:end w:w="120" w:type="dxa"/>
+            </w:tcMar>
+            <w:shd w:fill="F8FAFC"/>
+          </w:tcPr>
+          <w:p>
+            <w:pPr>
+              <w:spacing w:after="0"/>
+              <w:jc w:val="left"/>
+            </w:pPr>
+            <w:r>
+              <w:rPr>
+                <w:rFonts w:ascii="Arial" w:hAnsi="Arial" w:eastAsia="Arial"/>
+                <w:b w:val="0"/>
+                <w:color w:val="111827"/>
+                <w:sz w:val="17"/>
+              </w:rPr>
+              <w:t>Niche dedup rows нельзя складывать как уникальные продукты: один продукт может жить в нескольких контекстах.</w:t>
+            </w:r>
+          </w:p>
+        </w:tc>
+      </w:tr>
+      <w:tr>
+        <w:tc>
+          <w:tcPr>
+            <w:tcW w:type="dxa" w:w="2448"/>
+            <w:vAlign w:val="center"/>
+            <w:tcMar>
+              <w:top w:w="80" w:type="dxa"/>
+              <w:start w:w="120" w:type="dxa"/>
+              <w:bottom w:w="80" w:type="dxa"/>
+              <w:end w:w="120" w:type="dxa"/>
+            </w:tcMar>
+          </w:tcPr>
+          <w:p>
+            <w:pPr>
+              <w:spacing w:after="0"/>
+              <w:jc w:val="left"/>
+            </w:pPr>
+            <w:r>
+              <w:rPr>
+                <w:rFonts w:ascii="Arial" w:hAnsi="Arial" w:eastAsia="Arial"/>
+                <w:b w:val="0"/>
+                <w:color w:val="111827"/>
+                <w:sz w:val="17"/>
+              </w:rPr>
+              <w:t>Денежная рамка H2</w:t>
+            </w:r>
+          </w:p>
+        </w:tc>
+        <w:tc>
+          <w:tcPr>
+            <w:tcW w:type="dxa" w:w="1440"/>
+            <w:vAlign w:val="center"/>
+            <w:tcMar>
+              <w:top w:w="80" w:type="dxa"/>
+              <w:start w:w="120" w:type="dxa"/>
+              <w:bottom w:w="80" w:type="dxa"/>
+              <w:end w:w="120" w:type="dxa"/>
+            </w:tcMar>
+          </w:tcPr>
+          <w:p>
+            <w:pPr>
+              <w:spacing w:after="0"/>
+              <w:jc w:val="left"/>
+            </w:pPr>
+            <w:r>
+              <w:rPr>
+                <w:rFonts w:ascii="Arial" w:hAnsi="Arial" w:eastAsia="Arial"/>
+                <w:b w:val="0"/>
+                <w:color w:val="111827"/>
+                <w:sz w:val="17"/>
+              </w:rPr>
+              <w:t>intersection SAM $202M; weighted SAM $80.8M; sensitivity high-or-above 4/6</w:t>
+            </w:r>
+          </w:p>
+        </w:tc>
+        <w:tc>
+          <w:tcPr>
+            <w:tcW w:type="dxa" w:w="2016"/>
+            <w:vAlign w:val="center"/>
+            <w:tcMar>
+              <w:top w:w="80" w:type="dxa"/>
+              <w:start w:w="120" w:type="dxa"/>
+              <w:bottom w:w="80" w:type="dxa"/>
+              <w:end w:w="120" w:type="dxa"/>
+            </w:tcMar>
+          </w:tcPr>
+          <w:p>
+            <w:pPr>
+              <w:spacing w:after="0"/>
+              <w:jc w:val="left"/>
+            </w:pPr>
+            <w:r>
+              <w:rPr>
+                <w:rFonts w:ascii="Arial" w:hAnsi="Arial" w:eastAsia="Arial"/>
+                <w:b w:val="0"/>
+                <w:color w:val="111827"/>
+                <w:sz w:val="17"/>
+              </w:rPr>
+              <w:t>Денежная зона выглядит достаточно большой, чтобы продолжать проверку.</w:t>
+            </w:r>
+          </w:p>
+        </w:tc>
+        <w:tc>
+          <w:tcPr>
+            <w:tcW w:type="dxa" w:w="3456"/>
+            <w:vAlign w:val="center"/>
+            <w:tcMar>
+              <w:top w:w="80" w:type="dxa"/>
+              <w:start w:w="120" w:type="dxa"/>
+              <w:bottom w:w="80" w:type="dxa"/>
+              <w:end w:w="120" w:type="dxa"/>
+            </w:tcMar>
+          </w:tcPr>
+          <w:p>
+            <w:pPr>
+              <w:spacing w:after="0"/>
+              <w:jc w:val="left"/>
+            </w:pPr>
+            <w:r>
+              <w:rPr>
+                <w:rFonts w:ascii="Arial" w:hAnsi="Arial" w:eastAsia="Arial"/>
+                <w:b w:val="0"/>
+                <w:color w:val="111827"/>
+                <w:sz w:val="17"/>
+              </w:rPr>
+              <w:t>Это range-based sizing, не revenue forecast и не закрытый H2 gate.</w:t>
+            </w:r>
+          </w:p>
+        </w:tc>
+      </w:tr>
+      <w:tr>
+        <w:tc>
+          <w:tcPr>
+            <w:tcW w:type="dxa" w:w="2448"/>
+            <w:vAlign w:val="center"/>
+            <w:tcMar>
+              <w:top w:w="80" w:type="dxa"/>
+              <w:start w:w="120" w:type="dxa"/>
+              <w:bottom w:w="80" w:type="dxa"/>
+              <w:end w:w="120" w:type="dxa"/>
+            </w:tcMar>
+            <w:shd w:fill="F8FAFC"/>
+          </w:tcPr>
+          <w:p>
+            <w:pPr>
+              <w:spacing w:after="0"/>
+              <w:jc w:val="left"/>
+            </w:pPr>
+            <w:r>
+              <w:rPr>
+                <w:rFonts w:ascii="Arial" w:hAnsi="Arial" w:eastAsia="Arial"/>
+                <w:b w:val="0"/>
+                <w:color w:val="111827"/>
+                <w:sz w:val="17"/>
+              </w:rPr>
+              <w:t>Статус гипотез</w:t>
+            </w:r>
+          </w:p>
+        </w:tc>
+        <w:tc>
+          <w:tcPr>
+            <w:tcW w:type="dxa" w:w="1440"/>
+            <w:vAlign w:val="center"/>
+            <w:tcMar>
+              <w:top w:w="80" w:type="dxa"/>
+              <w:start w:w="120" w:type="dxa"/>
+              <w:bottom w:w="80" w:type="dxa"/>
+              <w:end w:w="120" w:type="dxa"/>
+            </w:tcMar>
+            <w:shd w:fill="F8FAFC"/>
+          </w:tcPr>
+          <w:p>
+            <w:pPr>
+              <w:spacing w:after="0"/>
+              <w:jc w:val="left"/>
+            </w:pPr>
+            <w:r>
+              <w:rPr>
+                <w:rFonts w:ascii="Arial" w:hAnsi="Arial" w:eastAsia="Arial"/>
+                <w:b w:val="0"/>
+                <w:color w:val="111827"/>
+                <w:sz w:val="17"/>
+              </w:rPr>
+              <w:t>6/6 gates hold_validate; H1 12 / 60; success 0 / 25; H2 28 / 40; success 8 / 12; H5 12 / 96; success 0 / 30</w:t>
+            </w:r>
+          </w:p>
+        </w:tc>
+        <w:tc>
+          <w:tcPr>
+            <w:tcW w:type="dxa" w:w="2016"/>
+            <w:vAlign w:val="center"/>
+            <w:tcMar>
+              <w:top w:w="80" w:type="dxa"/>
+              <w:start w:w="120" w:type="dxa"/>
+              <w:bottom w:w="80" w:type="dxa"/>
+              <w:end w:w="120" w:type="dxa"/>
+            </w:tcMar>
+            <w:shd w:fill="F8FAFC"/>
+          </w:tcPr>
+          <w:p>
+            <w:pPr>
+              <w:spacing w:after="0"/>
+              <w:jc w:val="left"/>
+            </w:pPr>
+            <w:r>
+              <w:rPr>
+                <w:rFonts w:ascii="Arial" w:hAnsi="Arial" w:eastAsia="Arial"/>
+                <w:b w:val="0"/>
+                <w:color w:val="111827"/>
+                <w:sz w:val="17"/>
+              </w:rPr>
+              <w:t>Исследование готово к ручной проверке, но еще не готово к claim upgrade.</w:t>
+            </w:r>
+          </w:p>
+        </w:tc>
+        <w:tc>
+          <w:tcPr>
+            <w:tcW w:type="dxa" w:w="3456"/>
+            <w:vAlign w:val="center"/>
+            <w:tcMar>
+              <w:top w:w="80" w:type="dxa"/>
+              <w:start w:w="120" w:type="dxa"/>
+              <w:bottom w:w="80" w:type="dxa"/>
+              <w:end w:w="120" w:type="dxa"/>
+            </w:tcMar>
+            <w:shd w:fill="F8FAFC"/>
+          </w:tcPr>
+          <w:p>
+            <w:pPr>
+              <w:spacing w:after="0"/>
+              <w:jc w:val="left"/>
+            </w:pPr>
+            <w:r>
+              <w:rPr>
+                <w:rFonts w:ascii="Arial" w:hAnsi="Arial" w:eastAsia="Arial"/>
+                <w:b w:val="0"/>
+                <w:color w:val="111827"/>
+                <w:sz w:val="17"/>
+              </w:rPr>
+              <w:t>Listing-only, secondary VOC и prototype-readiness не заменяют observed walkthrough/interview/session evidence.</w:t>
+            </w:r>
+          </w:p>
+        </w:tc>
+      </w:tr>
+      <w:tr>
+        <w:tc>
+          <w:tcPr>
+            <w:tcW w:type="dxa" w:w="2448"/>
+            <w:vAlign w:val="center"/>
+            <w:tcMar>
+              <w:top w:w="80" w:type="dxa"/>
+              <w:start w:w="120" w:type="dxa"/>
+              <w:bottom w:w="80" w:type="dxa"/>
+              <w:end w:w="120" w:type="dxa"/>
+            </w:tcMar>
+          </w:tcPr>
+          <w:p>
+            <w:pPr>
+              <w:spacing w:after="0"/>
+              <w:jc w:val="left"/>
+            </w:pPr>
+            <w:r>
+              <w:rPr>
+                <w:rFonts w:ascii="Arial" w:hAnsi="Arial" w:eastAsia="Arial"/>
+                <w:b w:val="0"/>
+                <w:color w:val="111827"/>
+                <w:sz w:val="17"/>
+              </w:rPr>
+              <w:t>Следующий рабочий фокус</w:t>
+            </w:r>
+          </w:p>
+        </w:tc>
+        <w:tc>
+          <w:tcPr>
+            <w:tcW w:type="dxa" w:w="1440"/>
+            <w:vAlign w:val="center"/>
+            <w:tcMar>
+              <w:top w:w="80" w:type="dxa"/>
+              <w:start w:w="120" w:type="dxa"/>
+              <w:bottom w:w="80" w:type="dxa"/>
+              <w:end w:w="120" w:type="dxa"/>
+            </w:tcMar>
+          </w:tcPr>
+          <w:p>
+            <w:pPr>
+              <w:spacing w:after="0"/>
+              <w:jc w:val="left"/>
+            </w:pPr>
+            <w:r>
+              <w:rPr>
+                <w:rFonts w:ascii="Arial" w:hAnsi="Arial" w:eastAsia="Arial"/>
+                <w:b w:val="0"/>
+                <w:color w:val="111827"/>
+                <w:sz w:val="17"/>
+              </w:rPr>
+              <w:t>22 next-validation tasks; readability rows=9; source-quality rows=5</w:t>
+            </w:r>
+          </w:p>
+        </w:tc>
+        <w:tc>
+          <w:tcPr>
+            <w:tcW w:type="dxa" w:w="2016"/>
+            <w:vAlign w:val="center"/>
+            <w:tcMar>
+              <w:top w:w="80" w:type="dxa"/>
+              <w:start w:w="120" w:type="dxa"/>
+              <w:bottom w:w="80" w:type="dxa"/>
+              <w:end w:w="120" w:type="dxa"/>
+            </w:tcMar>
+          </w:tcPr>
+          <w:p>
+            <w:pPr>
+              <w:spacing w:after="0"/>
+              <w:jc w:val="left"/>
+            </w:pPr>
+            <w:r>
+              <w:rPr>
+                <w:rFonts w:ascii="Arial" w:hAnsi="Arial" w:eastAsia="Arial"/>
+                <w:b w:val="0"/>
+                <w:color w:val="111827"/>
+                <w:sz w:val="17"/>
+              </w:rPr>
+              <w:t>Следующий прирост качества должен прийти от observed rows, а не от бесконечного расширения desk research.</w:t>
+            </w:r>
+          </w:p>
+        </w:tc>
+        <w:tc>
+          <w:tcPr>
+            <w:tcW w:type="dxa" w:w="3456"/>
+            <w:vAlign w:val="center"/>
+            <w:tcMar>
+              <w:top w:w="80" w:type="dxa"/>
+              <w:start w:w="120" w:type="dxa"/>
+              <w:bottom w:w="80" w:type="dxa"/>
+              <w:end w:w="120" w:type="dxa"/>
+            </w:tcMar>
+          </w:tcPr>
+          <w:p>
+            <w:pPr>
+              <w:spacing w:after="0"/>
+              <w:jc w:val="left"/>
+            </w:pPr>
+            <w:r>
+              <w:rPr>
+                <w:rFonts w:ascii="Arial" w:hAnsi="Arial" w:eastAsia="Arial"/>
+                <w:b w:val="0"/>
+                <w:color w:val="111827"/>
+                <w:sz w:val="17"/>
+              </w:rPr>
+              <w:t>Backlog описывает работу, но не считается выполненным evidence.</w:t>
+            </w:r>
+          </w:p>
+        </w:tc>
+      </w:tr>
+    </w:tbl>
+    <w:p/>
+    <w:p>
+      <w:r>
+        <w:t>Самая важная читательская оговорка: счетчики по нишам показывают coverage и источник для анализа, а не количество прямых клонов Alina и не доказанный спрос.</w:t>
+      </w:r>
+    </w:p>
+    <w:tbl>
+      <w:tblPr>
+        <w:tblW w:type="dxa" w:w="9360"/>
+        <w:jc w:val="left"/>
+        <w:tblLayout w:type="fixed"/>
+        <w:tblLook w:firstColumn="1" w:firstRow="1" w:lastColumn="0" w:lastRow="0" w:noHBand="0" w:noVBand="1" w:val="04A0"/>
+        <w:tblInd w:w="120" w:type="dxa"/>
+        <w:tblBorders>
+          <w:top w:val="single" w:sz="4" w:space="0" w:color="CBD5E1"/>
+          <w:left w:val="single" w:sz="4" w:space="0" w:color="CBD5E1"/>
+          <w:bottom w:val="single" w:sz="4" w:space="0" w:color="CBD5E1"/>
+          <w:right w:val="single" w:sz="4" w:space="0" w:color="CBD5E1"/>
+          <w:insideH w:val="single" w:sz="4" w:space="0" w:color="CBD5E1"/>
+          <w:insideV w:val="single" w:sz="4" w:space="0" w:color="CBD5E1"/>
+        </w:tblBorders>
+      </w:tblPr>
+      <w:tblGrid>
+        <w:gridCol w:w="2340"/>
+        <w:gridCol w:w="2340"/>
+        <w:gridCol w:w="2340"/>
+        <w:gridCol w:w="2340"/>
+      </w:tblGrid>
+      <w:tr>
+        <w:tc>
+          <w:tcPr>
+            <w:tcW w:type="dxa" w:w="2448"/>
+            <w:vAlign w:val="center"/>
+            <w:tcMar>
+              <w:top w:w="80" w:type="dxa"/>
+              <w:start w:w="120" w:type="dxa"/>
+              <w:bottom w:w="80" w:type="dxa"/>
+              <w:end w:w="120" w:type="dxa"/>
+            </w:tcMar>
+            <w:shd w:fill="E8EEF5"/>
+          </w:tcPr>
+          <w:p>
+            <w:pPr>
+              <w:spacing w:after="0"/>
+              <w:jc w:val="left"/>
+            </w:pPr>
+            <w:r>
+              <w:rPr>
+                <w:rFonts w:ascii="Arial" w:hAnsi="Arial" w:eastAsia="Arial"/>
+                <w:b/>
+                <w:color w:val="111827"/>
+                <w:sz w:val="17"/>
+              </w:rPr>
+              <w:t>Ниша</w:t>
+            </w:r>
+          </w:p>
+        </w:tc>
+        <w:tc>
+          <w:tcPr>
+            <w:tcW w:type="dxa" w:w="1440"/>
+            <w:vAlign w:val="center"/>
+            <w:tcMar>
+              <w:top w:w="80" w:type="dxa"/>
+              <w:start w:w="120" w:type="dxa"/>
+              <w:bottom w:w="80" w:type="dxa"/>
+              <w:end w:w="120" w:type="dxa"/>
+            </w:tcMar>
+            <w:shd w:fill="E8EEF5"/>
+          </w:tcPr>
+          <w:p>
+            <w:pPr>
+              <w:spacing w:after="0"/>
+              <w:jc w:val="left"/>
+            </w:pPr>
+            <w:r>
+              <w:rPr>
+                <w:rFonts w:ascii="Arial" w:hAnsi="Arial" w:eastAsia="Arial"/>
+                <w:b/>
+                <w:color w:val="111827"/>
+                <w:sz w:val="17"/>
+              </w:rPr>
+              <w:t>Сколько данных</w:t>
+            </w:r>
+          </w:p>
+        </w:tc>
+        <w:tc>
+          <w:tcPr>
+            <w:tcW w:type="dxa" w:w="2016"/>
+            <w:vAlign w:val="center"/>
+            <w:tcMar>
+              <w:top w:w="80" w:type="dxa"/>
+              <w:start w:w="120" w:type="dxa"/>
+              <w:bottom w:w="80" w:type="dxa"/>
+              <w:end w:w="120" w:type="dxa"/>
+            </w:tcMar>
+            <w:shd w:fill="E8EEF5"/>
+          </w:tcPr>
+          <w:p>
+            <w:pPr>
+              <w:spacing w:after="0"/>
+              <w:jc w:val="left"/>
+            </w:pPr>
+            <w:r>
+              <w:rPr>
+                <w:rFonts w:ascii="Arial" w:hAnsi="Arial" w:eastAsia="Arial"/>
+                <w:b/>
+                <w:color w:val="111827"/>
+                <w:sz w:val="17"/>
+              </w:rPr>
+              <w:t>Как читать</w:t>
+            </w:r>
+          </w:p>
+        </w:tc>
+        <w:tc>
+          <w:tcPr>
+            <w:tcW w:type="dxa" w:w="3456"/>
+            <w:vAlign w:val="center"/>
+            <w:tcMar>
+              <w:top w:w="80" w:type="dxa"/>
+              <w:start w:w="120" w:type="dxa"/>
+              <w:bottom w:w="80" w:type="dxa"/>
+              <w:end w:w="120" w:type="dxa"/>
+            </w:tcMar>
+            <w:shd w:fill="E8EEF5"/>
+          </w:tcPr>
+          <w:p>
+            <w:pPr>
+              <w:spacing w:after="0"/>
+              <w:jc w:val="left"/>
+            </w:pPr>
+            <w:r>
+              <w:rPr>
+                <w:rFonts w:ascii="Arial" w:hAnsi="Arial" w:eastAsia="Arial"/>
+                <w:b/>
+                <w:color w:val="111827"/>
+                <w:sz w:val="17"/>
+              </w:rPr>
+              <w:t>Граница</w:t>
+            </w:r>
+          </w:p>
+        </w:tc>
+      </w:tr>
+      <w:tr>
+        <w:tc>
+          <w:tcPr>
+            <w:tcW w:type="dxa" w:w="2448"/>
+            <w:vAlign w:val="center"/>
+            <w:tcMar>
+              <w:top w:w="80" w:type="dxa"/>
+              <w:start w:w="120" w:type="dxa"/>
+              <w:bottom w:w="80" w:type="dxa"/>
+              <w:end w:w="120" w:type="dxa"/>
+            </w:tcMar>
+          </w:tcPr>
+          <w:p>
+            <w:pPr>
+              <w:spacing w:after="0"/>
+              <w:jc w:val="left"/>
+            </w:pPr>
+            <w:r>
+              <w:rPr>
+                <w:rFonts w:ascii="Arial" w:hAnsi="Arial" w:eastAsia="Arial"/>
+                <w:b w:val="0"/>
+                <w:color w:val="111827"/>
+                <w:sz w:val="17"/>
+              </w:rPr>
+              <w:t>Mindfulness / reset</w:t>
+            </w:r>
+          </w:p>
+        </w:tc>
+        <w:tc>
+          <w:tcPr>
+            <w:tcW w:type="dxa" w:w="1440"/>
+            <w:vAlign w:val="center"/>
+            <w:tcMar>
+              <w:top w:w="80" w:type="dxa"/>
+              <w:start w:w="120" w:type="dxa"/>
+              <w:bottom w:w="80" w:type="dxa"/>
+              <w:end w:w="120" w:type="dxa"/>
+            </w:tcMar>
+          </w:tcPr>
+          <w:p>
+            <w:pPr>
+              <w:spacing w:after="0"/>
+              <w:jc w:val="left"/>
+            </w:pPr>
+            <w:r>
+              <w:rPr>
+                <w:rFonts w:ascii="Arial" w:hAnsi="Arial" w:eastAsia="Arial"/>
+                <w:b w:val="0"/>
+                <w:color w:val="111827"/>
+                <w:sz w:val="17"/>
+              </w:rPr>
+              <w:t>raw=15,109; all dedup=9,803; direct app dedup=2,550; top100=21; manual targets=0</w:t>
+            </w:r>
+          </w:p>
+        </w:tc>
+        <w:tc>
+          <w:tcPr>
+            <w:tcW w:type="dxa" w:w="2016"/>
+            <w:vAlign w:val="center"/>
+            <w:tcMar>
+              <w:top w:w="80" w:type="dxa"/>
+              <w:start w:w="120" w:type="dxa"/>
+              <w:bottom w:w="80" w:type="dxa"/>
+              <w:end w:w="120" w:type="dxa"/>
+            </w:tcMar>
+          </w:tcPr>
+          <w:p>
+            <w:pPr>
+              <w:spacing w:after="0"/>
+              <w:jc w:val="left"/>
+            </w:pPr>
+            <w:r>
+              <w:rPr>
+                <w:rFonts w:ascii="Arial" w:hAnsi="Arial" w:eastAsia="Arial"/>
+                <w:b w:val="0"/>
+                <w:color w:val="111827"/>
+                <w:sz w:val="17"/>
+              </w:rPr>
+              <w:t>сильный money proxy</w:t>
+            </w:r>
+          </w:p>
+        </w:tc>
+        <w:tc>
+          <w:tcPr>
+            <w:tcW w:type="dxa" w:w="3456"/>
+            <w:vAlign w:val="center"/>
+            <w:tcMar>
+              <w:top w:w="80" w:type="dxa"/>
+              <w:start w:w="120" w:type="dxa"/>
+              <w:bottom w:w="80" w:type="dxa"/>
+              <w:end w:w="120" w:type="dxa"/>
+            </w:tcMar>
+          </w:tcPr>
+          <w:p>
+            <w:pPr>
+              <w:spacing w:after="0"/>
+              <w:jc w:val="left"/>
+            </w:pPr>
+            <w:r>
+              <w:rPr>
+                <w:rFonts w:ascii="Arial" w:hAnsi="Arial" w:eastAsia="Arial"/>
+                <w:b w:val="0"/>
+                <w:color w:val="111827"/>
+                <w:sz w:val="17"/>
+              </w:rPr>
+              <w:t>Счетчики показывают coverage, но не доказывают demand, WTP или отсутствие hidden clone.</w:t>
+            </w:r>
+          </w:p>
+        </w:tc>
+      </w:tr>
+      <w:tr>
+        <w:tc>
+          <w:tcPr>
+            <w:tcW w:type="dxa" w:w="2448"/>
+            <w:vAlign w:val="center"/>
+            <w:tcMar>
+              <w:top w:w="80" w:type="dxa"/>
+              <w:start w:w="120" w:type="dxa"/>
+              <w:bottom w:w="80" w:type="dxa"/>
+              <w:end w:w="120" w:type="dxa"/>
+            </w:tcMar>
+            <w:shd w:fill="F8FAFC"/>
+          </w:tcPr>
+          <w:p>
+            <w:pPr>
+              <w:spacing w:after="0"/>
+              <w:jc w:val="left"/>
+            </w:pPr>
+            <w:r>
+              <w:rPr>
+                <w:rFonts w:ascii="Arial" w:hAnsi="Arial" w:eastAsia="Arial"/>
+                <w:b w:val="0"/>
+                <w:color w:val="111827"/>
+                <w:sz w:val="17"/>
+              </w:rPr>
+              <w:t>Avatar / identity</w:t>
+            </w:r>
+          </w:p>
+        </w:tc>
+        <w:tc>
+          <w:tcPr>
+            <w:tcW w:type="dxa" w:w="1440"/>
+            <w:vAlign w:val="center"/>
+            <w:tcMar>
+              <w:top w:w="80" w:type="dxa"/>
+              <w:start w:w="120" w:type="dxa"/>
+              <w:bottom w:w="80" w:type="dxa"/>
+              <w:end w:w="120" w:type="dxa"/>
+            </w:tcMar>
+            <w:shd w:fill="F8FAFC"/>
+          </w:tcPr>
+          <w:p>
+            <w:pPr>
+              <w:spacing w:after="0"/>
+              <w:jc w:val="left"/>
+            </w:pPr>
+            <w:r>
+              <w:rPr>
+                <w:rFonts w:ascii="Arial" w:hAnsi="Arial" w:eastAsia="Arial"/>
+                <w:b w:val="0"/>
+                <w:color w:val="111827"/>
+                <w:sz w:val="17"/>
+              </w:rPr>
+              <w:t>raw=14,872; all dedup=9,952; direct app dedup=2,506; top100=49; manual targets=3</w:t>
+            </w:r>
+          </w:p>
+        </w:tc>
+        <w:tc>
+          <w:tcPr>
+            <w:tcW w:type="dxa" w:w="2016"/>
+            <w:vAlign w:val="center"/>
+            <w:tcMar>
+              <w:top w:w="80" w:type="dxa"/>
+              <w:start w:w="120" w:type="dxa"/>
+              <w:bottom w:w="80" w:type="dxa"/>
+              <w:end w:w="120" w:type="dxa"/>
+            </w:tcMar>
+            <w:shd w:fill="F8FAFC"/>
+          </w:tcPr>
+          <w:p>
+            <w:pPr>
+              <w:spacing w:after="0"/>
+              <w:jc w:val="left"/>
+            </w:pPr>
+            <w:r>
+              <w:rPr>
+                <w:rFonts w:ascii="Arial" w:hAnsi="Arial" w:eastAsia="Arial"/>
+                <w:b w:val="0"/>
+                <w:color w:val="111827"/>
+                <w:sz w:val="17"/>
+              </w:rPr>
+              <w:t>сильный money proxy</w:t>
+            </w:r>
+          </w:p>
+        </w:tc>
+        <w:tc>
+          <w:tcPr>
+            <w:tcW w:type="dxa" w:w="3456"/>
+            <w:vAlign w:val="center"/>
+            <w:tcMar>
+              <w:top w:w="80" w:type="dxa"/>
+              <w:start w:w="120" w:type="dxa"/>
+              <w:bottom w:w="80" w:type="dxa"/>
+              <w:end w:w="120" w:type="dxa"/>
+            </w:tcMar>
+            <w:shd w:fill="F8FAFC"/>
+          </w:tcPr>
+          <w:p>
+            <w:pPr>
+              <w:spacing w:after="0"/>
+              <w:jc w:val="left"/>
+            </w:pPr>
+            <w:r>
+              <w:rPr>
+                <w:rFonts w:ascii="Arial" w:hAnsi="Arial" w:eastAsia="Arial"/>
+                <w:b w:val="0"/>
+                <w:color w:val="111827"/>
+                <w:sz w:val="17"/>
+              </w:rPr>
+              <w:t>Счетчики показывают coverage, но не доказывают demand, WTP или отсутствие hidden clone.</w:t>
+            </w:r>
+          </w:p>
+        </w:tc>
+      </w:tr>
+      <w:tr>
+        <w:tc>
+          <w:tcPr>
+            <w:tcW w:type="dxa" w:w="2448"/>
+            <w:vAlign w:val="center"/>
+            <w:tcMar>
+              <w:top w:w="80" w:type="dxa"/>
+              <w:start w:w="120" w:type="dxa"/>
+              <w:bottom w:w="80" w:type="dxa"/>
+              <w:end w:w="120" w:type="dxa"/>
+            </w:tcMar>
+          </w:tcPr>
+          <w:p>
+            <w:pPr>
+              <w:spacing w:after="0"/>
+              <w:jc w:val="left"/>
+            </w:pPr>
+            <w:r>
+              <w:rPr>
+                <w:rFonts w:ascii="Arial" w:hAnsi="Arial" w:eastAsia="Arial"/>
+                <w:b w:val="0"/>
+                <w:color w:val="111827"/>
+                <w:sz w:val="17"/>
+              </w:rPr>
+              <w:t>Astrology / esoterics</w:t>
+            </w:r>
+          </w:p>
+        </w:tc>
+        <w:tc>
+          <w:tcPr>
+            <w:tcW w:type="dxa" w:w="1440"/>
+            <w:vAlign w:val="center"/>
+            <w:tcMar>
+              <w:top w:w="80" w:type="dxa"/>
+              <w:start w:w="120" w:type="dxa"/>
+              <w:bottom w:w="80" w:type="dxa"/>
+              <w:end w:w="120" w:type="dxa"/>
+            </w:tcMar>
+          </w:tcPr>
+          <w:p>
+            <w:pPr>
+              <w:spacing w:after="0"/>
+              <w:jc w:val="left"/>
+            </w:pPr>
+            <w:r>
+              <w:rPr>
+                <w:rFonts w:ascii="Arial" w:hAnsi="Arial" w:eastAsia="Arial"/>
+                <w:b w:val="0"/>
+                <w:color w:val="111827"/>
+                <w:sz w:val="17"/>
+              </w:rPr>
+              <w:t>raw=5,427; all dedup=2,657; direct app dedup=2,206; top100=59; manual targets=7</w:t>
+            </w:r>
+          </w:p>
+        </w:tc>
+        <w:tc>
+          <w:tcPr>
+            <w:tcW w:type="dxa" w:w="2016"/>
+            <w:vAlign w:val="center"/>
+            <w:tcMar>
+              <w:top w:w="80" w:type="dxa"/>
+              <w:start w:w="120" w:type="dxa"/>
+              <w:bottom w:w="80" w:type="dxa"/>
+              <w:end w:w="120" w:type="dxa"/>
+            </w:tcMar>
+          </w:tcPr>
+          <w:p>
+            <w:pPr>
+              <w:spacing w:after="0"/>
+              <w:jc w:val="left"/>
+            </w:pPr>
+            <w:r>
+              <w:rPr>
+                <w:rFonts w:ascii="Arial" w:hAnsi="Arial" w:eastAsia="Arial"/>
+                <w:b w:val="0"/>
+                <w:color w:val="111827"/>
+                <w:sz w:val="17"/>
+              </w:rPr>
+              <w:t>сильный money proxy</w:t>
+            </w:r>
+          </w:p>
+        </w:tc>
+        <w:tc>
+          <w:tcPr>
+            <w:tcW w:type="dxa" w:w="3456"/>
+            <w:vAlign w:val="center"/>
+            <w:tcMar>
+              <w:top w:w="80" w:type="dxa"/>
+              <w:start w:w="120" w:type="dxa"/>
+              <w:bottom w:w="80" w:type="dxa"/>
+              <w:end w:w="120" w:type="dxa"/>
+            </w:tcMar>
+          </w:tcPr>
+          <w:p>
+            <w:pPr>
+              <w:spacing w:after="0"/>
+              <w:jc w:val="left"/>
+            </w:pPr>
+            <w:r>
+              <w:rPr>
+                <w:rFonts w:ascii="Arial" w:hAnsi="Arial" w:eastAsia="Arial"/>
+                <w:b w:val="0"/>
+                <w:color w:val="111827"/>
+                <w:sz w:val="17"/>
+              </w:rPr>
+              <w:t>Счетчики показывают coverage, но не доказывают demand, WTP или отсутствие hidden clone.</w:t>
+            </w:r>
+          </w:p>
+        </w:tc>
+      </w:tr>
+      <w:tr>
+        <w:tc>
+          <w:tcPr>
+            <w:tcW w:type="dxa" w:w="2448"/>
+            <w:vAlign w:val="center"/>
+            <w:tcMar>
+              <w:top w:w="80" w:type="dxa"/>
+              <w:start w:w="120" w:type="dxa"/>
+              <w:bottom w:w="80" w:type="dxa"/>
+              <w:end w:w="120" w:type="dxa"/>
+            </w:tcMar>
+            <w:shd w:fill="F8FAFC"/>
+          </w:tcPr>
+          <w:p>
+            <w:pPr>
+              <w:spacing w:after="0"/>
+              <w:jc w:val="left"/>
+            </w:pPr>
+            <w:r>
+              <w:rPr>
+                <w:rFonts w:ascii="Arial" w:hAnsi="Arial" w:eastAsia="Arial"/>
+                <w:b w:val="0"/>
+                <w:color w:val="111827"/>
+                <w:sz w:val="17"/>
+              </w:rPr>
+              <w:t>Coaching / self-improvement</w:t>
+            </w:r>
+          </w:p>
+        </w:tc>
+        <w:tc>
+          <w:tcPr>
+            <w:tcW w:type="dxa" w:w="1440"/>
+            <w:vAlign w:val="center"/>
+            <w:tcMar>
+              <w:top w:w="80" w:type="dxa"/>
+              <w:start w:w="120" w:type="dxa"/>
+              <w:bottom w:w="80" w:type="dxa"/>
+              <w:end w:w="120" w:type="dxa"/>
+            </w:tcMar>
+            <w:shd w:fill="F8FAFC"/>
+          </w:tcPr>
+          <w:p>
+            <w:pPr>
+              <w:spacing w:after="0"/>
+              <w:jc w:val="left"/>
+            </w:pPr>
+            <w:r>
+              <w:rPr>
+                <w:rFonts w:ascii="Arial" w:hAnsi="Arial" w:eastAsia="Arial"/>
+                <w:b w:val="0"/>
+                <w:color w:val="111827"/>
+                <w:sz w:val="17"/>
+              </w:rPr>
+              <w:t>raw=7,671; all dedup=3,857; direct app dedup=2,651; top100=50; manual targets=8</w:t>
+            </w:r>
+          </w:p>
+        </w:tc>
+        <w:tc>
+          <w:tcPr>
+            <w:tcW w:type="dxa" w:w="2016"/>
+            <w:vAlign w:val="center"/>
+            <w:tcMar>
+              <w:top w:w="80" w:type="dxa"/>
+              <w:start w:w="120" w:type="dxa"/>
+              <w:bottom w:w="80" w:type="dxa"/>
+              <w:end w:w="120" w:type="dxa"/>
+            </w:tcMar>
+            <w:shd w:fill="F8FAFC"/>
+          </w:tcPr>
+          <w:p>
+            <w:pPr>
+              <w:spacing w:after="0"/>
+              <w:jc w:val="left"/>
+            </w:pPr>
+            <w:r>
+              <w:rPr>
+                <w:rFonts w:ascii="Arial" w:hAnsi="Arial" w:eastAsia="Arial"/>
+                <w:b w:val="0"/>
+                <w:color w:val="111827"/>
+                <w:sz w:val="17"/>
+              </w:rPr>
+              <w:t>средний money proxy</w:t>
+            </w:r>
+          </w:p>
+        </w:tc>
+        <w:tc>
+          <w:tcPr>
+            <w:tcW w:type="dxa" w:w="3456"/>
+            <w:vAlign w:val="center"/>
+            <w:tcMar>
+              <w:top w:w="80" w:type="dxa"/>
+              <w:start w:w="120" w:type="dxa"/>
+              <w:bottom w:w="80" w:type="dxa"/>
+              <w:end w:w="120" w:type="dxa"/>
+            </w:tcMar>
+            <w:shd w:fill="F8FAFC"/>
+          </w:tcPr>
+          <w:p>
+            <w:pPr>
+              <w:spacing w:after="0"/>
+              <w:jc w:val="left"/>
+            </w:pPr>
+            <w:r>
+              <w:rPr>
+                <w:rFonts w:ascii="Arial" w:hAnsi="Arial" w:eastAsia="Arial"/>
+                <w:b w:val="0"/>
+                <w:color w:val="111827"/>
+                <w:sz w:val="17"/>
+              </w:rPr>
+              <w:t>Счетчики показывают coverage, но не доказывают demand, WTP или отсутствие hidden clone.</w:t>
+            </w:r>
+          </w:p>
+        </w:tc>
+      </w:tr>
+      <w:tr>
+        <w:tc>
+          <w:tcPr>
+            <w:tcW w:type="dxa" w:w="2448"/>
+            <w:vAlign w:val="center"/>
+            <w:tcMar>
+              <w:top w:w="80" w:type="dxa"/>
+              <w:start w:w="120" w:type="dxa"/>
+              <w:bottom w:w="80" w:type="dxa"/>
+              <w:end w:w="120" w:type="dxa"/>
+            </w:tcMar>
+          </w:tcPr>
+          <w:p>
+            <w:pPr>
+              <w:spacing w:after="0"/>
+              <w:jc w:val="left"/>
+            </w:pPr>
+            <w:r>
+              <w:rPr>
+                <w:rFonts w:ascii="Arial" w:hAnsi="Arial" w:eastAsia="Arial"/>
+                <w:b w:val="0"/>
+                <w:color w:val="111827"/>
+                <w:sz w:val="17"/>
+              </w:rPr>
+              <w:t>Gaming / progression benchmark</w:t>
+            </w:r>
+          </w:p>
+        </w:tc>
+        <w:tc>
+          <w:tcPr>
+            <w:tcW w:type="dxa" w:w="1440"/>
+            <w:vAlign w:val="center"/>
+            <w:tcMar>
+              <w:top w:w="80" w:type="dxa"/>
+              <w:start w:w="120" w:type="dxa"/>
+              <w:bottom w:w="80" w:type="dxa"/>
+              <w:end w:w="120" w:type="dxa"/>
+            </w:tcMar>
+          </w:tcPr>
+          <w:p>
+            <w:pPr>
+              <w:spacing w:after="0"/>
+              <w:jc w:val="left"/>
+            </w:pPr>
+            <w:r>
+              <w:rPr>
+                <w:rFonts w:ascii="Arial" w:hAnsi="Arial" w:eastAsia="Arial"/>
+                <w:b w:val="0"/>
+                <w:color w:val="111827"/>
+                <w:sz w:val="17"/>
+              </w:rPr>
+              <w:t>raw=24,446; all dedup=16,875; direct app dedup=3,204; top100=8; manual targets=0</w:t>
+            </w:r>
+          </w:p>
+        </w:tc>
+        <w:tc>
+          <w:tcPr>
+            <w:tcW w:type="dxa" w:w="2016"/>
+            <w:vAlign w:val="center"/>
+            <w:tcMar>
+              <w:top w:w="80" w:type="dxa"/>
+              <w:start w:w="120" w:type="dxa"/>
+              <w:bottom w:w="80" w:type="dxa"/>
+              <w:end w:w="120" w:type="dxa"/>
+            </w:tcMar>
+          </w:tcPr>
+          <w:p>
+            <w:pPr>
+              <w:spacing w:after="0"/>
+              <w:jc w:val="left"/>
+            </w:pPr>
+            <w:r>
+              <w:rPr>
+                <w:rFonts w:ascii="Arial" w:hAnsi="Arial" w:eastAsia="Arial"/>
+                <w:b w:val="0"/>
+                <w:color w:val="111827"/>
+                <w:sz w:val="17"/>
+              </w:rPr>
+              <w:t>Использовать как benchmark механик прогресса, возврата и монетизации.</w:t>
+            </w:r>
+          </w:p>
+        </w:tc>
+        <w:tc>
+          <w:tcPr>
+            <w:tcW w:type="dxa" w:w="3456"/>
+            <w:vAlign w:val="center"/>
+            <w:tcMar>
+              <w:top w:w="80" w:type="dxa"/>
+              <w:start w:w="120" w:type="dxa"/>
+              <w:bottom w:w="80" w:type="dxa"/>
+              <w:end w:w="120" w:type="dxa"/>
+            </w:tcMar>
+          </w:tcPr>
+          <w:p>
+            <w:pPr>
+              <w:spacing w:after="0"/>
+              <w:jc w:val="left"/>
+            </w:pPr>
+            <w:r>
+              <w:rPr>
+                <w:rFonts w:ascii="Arial" w:hAnsi="Arial" w:eastAsia="Arial"/>
+                <w:b w:val="0"/>
+                <w:color w:val="111827"/>
+                <w:sz w:val="17"/>
+              </w:rPr>
+              <w:t>Gaming не считать прямым TAM Alina до доказанного ritual/self-improvement overlap.</w:t>
+            </w:r>
+          </w:p>
+        </w:tc>
+      </w:tr>
+    </w:tbl>
+    <w:p/>
+    <w:tbl>
+      <w:tblPr>
+        <w:tblW w:type="dxa" w:w="9360"/>
+        <w:jc w:val="left"/>
+        <w:tblLayout w:type="fixed"/>
+        <w:tblLook w:firstColumn="1" w:firstRow="1" w:lastColumn="0" w:lastRow="0" w:noHBand="0" w:noVBand="1" w:val="04A0"/>
+        <w:tblInd w:w="120" w:type="dxa"/>
+        <w:tblBorders>
+          <w:top w:val="single" w:sz="4" w:space="0" w:color="CBD5E1"/>
+          <w:left w:val="single" w:sz="4" w:space="0" w:color="CBD5E1"/>
+          <w:bottom w:val="single" w:sz="4" w:space="0" w:color="CBD5E1"/>
+          <w:right w:val="single" w:sz="4" w:space="0" w:color="CBD5E1"/>
+          <w:insideH w:val="single" w:sz="4" w:space="0" w:color="CBD5E1"/>
+          <w:insideV w:val="single" w:sz="4" w:space="0" w:color="CBD5E1"/>
+        </w:tblBorders>
+      </w:tblPr>
+      <w:tblGrid>
+        <w:gridCol w:w="2340"/>
+        <w:gridCol w:w="2340"/>
+        <w:gridCol w:w="2340"/>
+        <w:gridCol w:w="2340"/>
+      </w:tblGrid>
+      <w:tr>
+        <w:tc>
+          <w:tcPr>
+            <w:tcW w:type="dxa" w:w="2448"/>
+            <w:vAlign w:val="center"/>
+            <w:tcMar>
+              <w:top w:w="80" w:type="dxa"/>
+              <w:start w:w="120" w:type="dxa"/>
+              <w:bottom w:w="80" w:type="dxa"/>
+              <w:end w:w="120" w:type="dxa"/>
+            </w:tcMar>
+            <w:shd w:fill="E8EEF5"/>
+          </w:tcPr>
+          <w:p>
+            <w:pPr>
+              <w:spacing w:after="0"/>
+              <w:jc w:val="left"/>
+            </w:pPr>
+            <w:r>
+              <w:rPr>
+                <w:rFonts w:ascii="Arial" w:hAnsi="Arial" w:eastAsia="Arial"/>
+                <w:b/>
+                <w:color w:val="111827"/>
+                <w:sz w:val="17"/>
+              </w:rPr>
+              <w:t>Гипотеза</w:t>
+            </w:r>
+          </w:p>
+        </w:tc>
+        <w:tc>
+          <w:tcPr>
+            <w:tcW w:type="dxa" w:w="1440"/>
+            <w:vAlign w:val="center"/>
+            <w:tcMar>
+              <w:top w:w="80" w:type="dxa"/>
+              <w:start w:w="120" w:type="dxa"/>
+              <w:bottom w:w="80" w:type="dxa"/>
+              <w:end w:w="120" w:type="dxa"/>
+            </w:tcMar>
+            <w:shd w:fill="E8EEF5"/>
+          </w:tcPr>
+          <w:p>
+            <w:pPr>
+              <w:spacing w:after="0"/>
+              <w:jc w:val="left"/>
+            </w:pPr>
+            <w:r>
+              <w:rPr>
+                <w:rFonts w:ascii="Arial" w:hAnsi="Arial" w:eastAsia="Arial"/>
+                <w:b/>
+                <w:color w:val="111827"/>
+                <w:sz w:val="17"/>
+              </w:rPr>
+              <w:t>Статус</w:t>
+            </w:r>
+          </w:p>
+        </w:tc>
+        <w:tc>
+          <w:tcPr>
+            <w:tcW w:type="dxa" w:w="2016"/>
+            <w:vAlign w:val="center"/>
+            <w:tcMar>
+              <w:top w:w="80" w:type="dxa"/>
+              <w:start w:w="120" w:type="dxa"/>
+              <w:bottom w:w="80" w:type="dxa"/>
+              <w:end w:w="120" w:type="dxa"/>
+            </w:tcMar>
+            <w:shd w:fill="E8EEF5"/>
+          </w:tcPr>
+          <w:p>
+            <w:pPr>
+              <w:spacing w:after="0"/>
+              <w:jc w:val="left"/>
+            </w:pPr>
+            <w:r>
+              <w:rPr>
+                <w:rFonts w:ascii="Arial" w:hAnsi="Arial" w:eastAsia="Arial"/>
+                <w:b/>
+                <w:color w:val="111827"/>
+                <w:sz w:val="17"/>
+              </w:rPr>
+              <w:t>Следующий шаг</w:t>
+            </w:r>
+          </w:p>
+        </w:tc>
+        <w:tc>
+          <w:tcPr>
+            <w:tcW w:type="dxa" w:w="3456"/>
+            <w:vAlign w:val="center"/>
+            <w:tcMar>
+              <w:top w:w="80" w:type="dxa"/>
+              <w:start w:w="120" w:type="dxa"/>
+              <w:bottom w:w="80" w:type="dxa"/>
+              <w:end w:w="120" w:type="dxa"/>
+            </w:tcMar>
+            <w:shd w:fill="E8EEF5"/>
+          </w:tcPr>
+          <w:p>
+            <w:pPr>
+              <w:spacing w:after="0"/>
+              <w:jc w:val="left"/>
+            </w:pPr>
+            <w:r>
+              <w:rPr>
+                <w:rFonts w:ascii="Arial" w:hAnsi="Arial" w:eastAsia="Arial"/>
+                <w:b/>
+                <w:color w:val="111827"/>
+                <w:sz w:val="17"/>
+              </w:rPr>
+              <w:t>Решение сейчас</w:t>
+            </w:r>
+          </w:p>
+        </w:tc>
+      </w:tr>
+      <w:tr>
+        <w:tc>
+          <w:tcPr>
+            <w:tcW w:type="dxa" w:w="2448"/>
+            <w:vAlign w:val="center"/>
+            <w:tcMar>
+              <w:top w:w="80" w:type="dxa"/>
+              <w:start w:w="120" w:type="dxa"/>
+              <w:bottom w:w="80" w:type="dxa"/>
+              <w:end w:w="120" w:type="dxa"/>
+            </w:tcMar>
+          </w:tcPr>
+          <w:p>
+            <w:pPr>
+              <w:spacing w:after="0"/>
+              <w:jc w:val="left"/>
+            </w:pPr>
+            <w:r>
+              <w:rPr>
+                <w:rFonts w:ascii="Arial" w:hAnsi="Arial" w:eastAsia="Arial"/>
+                <w:b w:val="0"/>
+                <w:color w:val="111827"/>
+                <w:sz w:val="17"/>
+              </w:rPr>
+              <w:t>H1: форма продукта существует</w:t>
+            </w:r>
+          </w:p>
+        </w:tc>
+        <w:tc>
+          <w:tcPr>
+            <w:tcW w:type="dxa" w:w="1440"/>
+            <w:vAlign w:val="center"/>
+            <w:tcMar>
+              <w:top w:w="80" w:type="dxa"/>
+              <w:start w:w="120" w:type="dxa"/>
+              <w:bottom w:w="80" w:type="dxa"/>
+              <w:end w:w="120" w:type="dxa"/>
+            </w:tcMar>
+          </w:tcPr>
+          <w:p>
+            <w:pPr>
+              <w:spacing w:after="0"/>
+              <w:jc w:val="left"/>
+            </w:pPr>
+            <w:r>
+              <w:rPr>
+                <w:rFonts w:ascii="Arial" w:hAnsi="Arial" w:eastAsia="Arial"/>
+                <w:b w:val="0"/>
+                <w:color w:val="111827"/>
+                <w:sz w:val="17"/>
+              </w:rPr>
+              <w:t>начато, но доказательств недостаточно; completed 12 / 60; success 0 / 25</w:t>
+            </w:r>
+          </w:p>
+        </w:tc>
+        <w:tc>
+          <w:tcPr>
+            <w:tcW w:type="dxa" w:w="2016"/>
+            <w:vAlign w:val="center"/>
+            <w:tcMar>
+              <w:top w:w="80" w:type="dxa"/>
+              <w:start w:w="120" w:type="dxa"/>
+              <w:bottom w:w="80" w:type="dxa"/>
+              <w:end w:w="120" w:type="dxa"/>
+            </w:tcMar>
+          </w:tcPr>
+          <w:p>
+            <w:pPr>
+              <w:spacing w:after="0"/>
+              <w:jc w:val="left"/>
+            </w:pPr>
+            <w:r>
+              <w:rPr>
+                <w:rFonts w:ascii="Arial" w:hAnsi="Arial" w:eastAsia="Arial"/>
+                <w:b w:val="0"/>
+                <w:color w:val="111827"/>
+                <w:sz w:val="17"/>
+              </w:rPr>
+              <w:t>Нужна observed validation строка.</w:t>
+            </w:r>
+          </w:p>
+        </w:tc>
+        <w:tc>
+          <w:tcPr>
+            <w:tcW w:type="dxa" w:w="3456"/>
+            <w:vAlign w:val="center"/>
+            <w:tcMar>
+              <w:top w:w="80" w:type="dxa"/>
+              <w:start w:w="120" w:type="dxa"/>
+              <w:bottom w:w="80" w:type="dxa"/>
+              <w:end w:w="120" w:type="dxa"/>
+            </w:tcMar>
+          </w:tcPr>
+          <w:p>
+            <w:pPr>
+              <w:spacing w:after="0"/>
+              <w:jc w:val="left"/>
+            </w:pPr>
+            <w:r>
+              <w:rPr>
+                <w:rFonts w:ascii="Arial" w:hAnsi="Arial" w:eastAsia="Arial"/>
+                <w:b w:val="0"/>
+                <w:color w:val="111827"/>
+                <w:sz w:val="17"/>
+              </w:rPr>
+              <w:t>оставить hold_validate</w:t>
+            </w:r>
+          </w:p>
+        </w:tc>
+      </w:tr>
+      <w:tr>
+        <w:tc>
+          <w:tcPr>
+            <w:tcW w:type="dxa" w:w="2448"/>
+            <w:vAlign w:val="center"/>
+            <w:tcMar>
+              <w:top w:w="80" w:type="dxa"/>
+              <w:start w:w="120" w:type="dxa"/>
+              <w:bottom w:w="80" w:type="dxa"/>
+              <w:end w:w="120" w:type="dxa"/>
+            </w:tcMar>
+            <w:shd w:fill="F8FAFC"/>
+          </w:tcPr>
+          <w:p>
+            <w:pPr>
+              <w:spacing w:after="0"/>
+              <w:jc w:val="left"/>
+            </w:pPr>
+            <w:r>
+              <w:rPr>
+                <w:rFonts w:ascii="Arial" w:hAnsi="Arial" w:eastAsia="Arial"/>
+                <w:b w:val="0"/>
+                <w:color w:val="111827"/>
+                <w:sz w:val="17"/>
+              </w:rPr>
+              <w:t>H3: есть узкое белое пятно</w:t>
+            </w:r>
+          </w:p>
+        </w:tc>
+        <w:tc>
+          <w:tcPr>
+            <w:tcW w:type="dxa" w:w="1440"/>
+            <w:vAlign w:val="center"/>
+            <w:tcMar>
+              <w:top w:w="80" w:type="dxa"/>
+              <w:start w:w="120" w:type="dxa"/>
+              <w:bottom w:w="80" w:type="dxa"/>
+              <w:end w:w="120" w:type="dxa"/>
+            </w:tcMar>
+            <w:shd w:fill="F8FAFC"/>
+          </w:tcPr>
+          <w:p>
+            <w:pPr>
+              <w:spacing w:after="0"/>
+              <w:jc w:val="left"/>
+            </w:pPr>
+            <w:r>
+              <w:rPr>
+                <w:rFonts w:ascii="Arial" w:hAnsi="Arial" w:eastAsia="Arial"/>
+                <w:b w:val="0"/>
+                <w:color w:val="111827"/>
+                <w:sz w:val="17"/>
+              </w:rPr>
+              <w:t>начато, но доказательств недостаточно; completed 12 / 60; success 0 / 25</w:t>
+            </w:r>
+          </w:p>
+        </w:tc>
+        <w:tc>
+          <w:tcPr>
+            <w:tcW w:type="dxa" w:w="2016"/>
+            <w:vAlign w:val="center"/>
+            <w:tcMar>
+              <w:top w:w="80" w:type="dxa"/>
+              <w:start w:w="120" w:type="dxa"/>
+              <w:bottom w:w="80" w:type="dxa"/>
+              <w:end w:w="120" w:type="dxa"/>
+            </w:tcMar>
+            <w:shd w:fill="F8FAFC"/>
+          </w:tcPr>
+          <w:p>
+            <w:pPr>
+              <w:spacing w:after="0"/>
+              <w:jc w:val="left"/>
+            </w:pPr>
+            <w:r>
+              <w:rPr>
+                <w:rFonts w:ascii="Arial" w:hAnsi="Arial" w:eastAsia="Arial"/>
+                <w:b w:val="0"/>
+                <w:color w:val="111827"/>
+                <w:sz w:val="17"/>
+              </w:rPr>
+              <w:t>Нужна observed validation строка.</w:t>
+            </w:r>
+          </w:p>
+        </w:tc>
+        <w:tc>
+          <w:tcPr>
+            <w:tcW w:type="dxa" w:w="3456"/>
+            <w:vAlign w:val="center"/>
+            <w:tcMar>
+              <w:top w:w="80" w:type="dxa"/>
+              <w:start w:w="120" w:type="dxa"/>
+              <w:bottom w:w="80" w:type="dxa"/>
+              <w:end w:w="120" w:type="dxa"/>
+            </w:tcMar>
+            <w:shd w:fill="F8FAFC"/>
+          </w:tcPr>
+          <w:p>
+            <w:pPr>
+              <w:spacing w:after="0"/>
+              <w:jc w:val="left"/>
+            </w:pPr>
+            <w:r>
+              <w:rPr>
+                <w:rFonts w:ascii="Arial" w:hAnsi="Arial" w:eastAsia="Arial"/>
+                <w:b w:val="0"/>
+                <w:color w:val="111827"/>
+                <w:sz w:val="17"/>
+              </w:rPr>
+              <w:t>оставить hold_validate</w:t>
+            </w:r>
+          </w:p>
+        </w:tc>
+      </w:tr>
+      <w:tr>
+        <w:tc>
+          <w:tcPr>
+            <w:tcW w:type="dxa" w:w="2448"/>
+            <w:vAlign w:val="center"/>
+            <w:tcMar>
+              <w:top w:w="80" w:type="dxa"/>
+              <w:start w:w="120" w:type="dxa"/>
+              <w:bottom w:w="80" w:type="dxa"/>
+              <w:end w:w="120" w:type="dxa"/>
+            </w:tcMar>
+          </w:tcPr>
+          <w:p>
+            <w:pPr>
+              <w:spacing w:after="0"/>
+              <w:jc w:val="left"/>
+            </w:pPr>
+            <w:r>
+              <w:rPr>
+                <w:rFonts w:ascii="Arial" w:hAnsi="Arial" w:eastAsia="Arial"/>
+                <w:b w:val="0"/>
+                <w:color w:val="111827"/>
+                <w:sz w:val="17"/>
+              </w:rPr>
+              <w:t>H2: в рынках есть деньги</w:t>
+            </w:r>
+          </w:p>
+        </w:tc>
+        <w:tc>
+          <w:tcPr>
+            <w:tcW w:type="dxa" w:w="1440"/>
+            <w:vAlign w:val="center"/>
+            <w:tcMar>
+              <w:top w:w="80" w:type="dxa"/>
+              <w:start w:w="120" w:type="dxa"/>
+              <w:bottom w:w="80" w:type="dxa"/>
+              <w:end w:w="120" w:type="dxa"/>
+            </w:tcMar>
+          </w:tcPr>
+          <w:p>
+            <w:pPr>
+              <w:spacing w:after="0"/>
+              <w:jc w:val="left"/>
+            </w:pPr>
+            <w:r>
+              <w:rPr>
+                <w:rFonts w:ascii="Arial" w:hAnsi="Arial" w:eastAsia="Arial"/>
+                <w:b w:val="0"/>
+                <w:color w:val="111827"/>
+                <w:sz w:val="17"/>
+              </w:rPr>
+              <w:t>начато, но доказательств недостаточно; completed 28 / 40; success 8 / 12</w:t>
+            </w:r>
+          </w:p>
+        </w:tc>
+        <w:tc>
+          <w:tcPr>
+            <w:tcW w:type="dxa" w:w="2016"/>
+            <w:vAlign w:val="center"/>
+            <w:tcMar>
+              <w:top w:w="80" w:type="dxa"/>
+              <w:start w:w="120" w:type="dxa"/>
+              <w:bottom w:w="80" w:type="dxa"/>
+              <w:end w:w="120" w:type="dxa"/>
+            </w:tcMar>
+          </w:tcPr>
+          <w:p>
+            <w:pPr>
+              <w:spacing w:after="0"/>
+              <w:jc w:val="left"/>
+            </w:pPr>
+            <w:r>
+              <w:rPr>
+                <w:rFonts w:ascii="Arial" w:hAnsi="Arial" w:eastAsia="Arial"/>
+                <w:b w:val="0"/>
+                <w:color w:val="111827"/>
+                <w:sz w:val="17"/>
+              </w:rPr>
+              <w:t>Нужна observed validation строка.</w:t>
+            </w:r>
+          </w:p>
+        </w:tc>
+        <w:tc>
+          <w:tcPr>
+            <w:tcW w:type="dxa" w:w="3456"/>
+            <w:vAlign w:val="center"/>
+            <w:tcMar>
+              <w:top w:w="80" w:type="dxa"/>
+              <w:start w:w="120" w:type="dxa"/>
+              <w:bottom w:w="80" w:type="dxa"/>
+              <w:end w:w="120" w:type="dxa"/>
+            </w:tcMar>
+          </w:tcPr>
+          <w:p>
+            <w:pPr>
+              <w:spacing w:after="0"/>
+              <w:jc w:val="left"/>
+            </w:pPr>
+            <w:r>
+              <w:rPr>
+                <w:rFonts w:ascii="Arial" w:hAnsi="Arial" w:eastAsia="Arial"/>
+                <w:b w:val="0"/>
+                <w:color w:val="111827"/>
+                <w:sz w:val="17"/>
+              </w:rPr>
+              <w:t>оставить hold_validate</w:t>
+            </w:r>
+          </w:p>
+        </w:tc>
+      </w:tr>
+      <w:tr>
+        <w:tc>
+          <w:tcPr>
+            <w:tcW w:type="dxa" w:w="2448"/>
+            <w:vAlign w:val="center"/>
+            <w:tcMar>
+              <w:top w:w="80" w:type="dxa"/>
+              <w:start w:w="120" w:type="dxa"/>
+              <w:bottom w:w="80" w:type="dxa"/>
+              <w:end w:w="120" w:type="dxa"/>
+            </w:tcMar>
+            <w:shd w:fill="F8FAFC"/>
+          </w:tcPr>
+          <w:p>
+            <w:pPr>
+              <w:spacing w:after="0"/>
+              <w:jc w:val="left"/>
+            </w:pPr>
+            <w:r>
+              <w:rPr>
+                <w:rFonts w:ascii="Arial" w:hAnsi="Arial" w:eastAsia="Arial"/>
+                <w:b w:val="0"/>
+                <w:color w:val="111827"/>
+                <w:sz w:val="17"/>
+              </w:rPr>
+              <w:t>H5: общая аудитория существует</w:t>
+            </w:r>
+          </w:p>
+        </w:tc>
+        <w:tc>
+          <w:tcPr>
+            <w:tcW w:type="dxa" w:w="1440"/>
+            <w:vAlign w:val="center"/>
+            <w:tcMar>
+              <w:top w:w="80" w:type="dxa"/>
+              <w:start w:w="120" w:type="dxa"/>
+              <w:bottom w:w="80" w:type="dxa"/>
+              <w:end w:w="120" w:type="dxa"/>
+            </w:tcMar>
+            <w:shd w:fill="F8FAFC"/>
+          </w:tcPr>
+          <w:p>
+            <w:pPr>
+              <w:spacing w:after="0"/>
+              <w:jc w:val="left"/>
+            </w:pPr>
+            <w:r>
+              <w:rPr>
+                <w:rFonts w:ascii="Arial" w:hAnsi="Arial" w:eastAsia="Arial"/>
+                <w:b w:val="0"/>
+                <w:color w:val="111827"/>
+                <w:sz w:val="17"/>
+              </w:rPr>
+              <w:t>начато, но доказательств недостаточно; completed 12 / 96; success 0 / 30</w:t>
+            </w:r>
+          </w:p>
+        </w:tc>
+        <w:tc>
+          <w:tcPr>
+            <w:tcW w:type="dxa" w:w="2016"/>
+            <w:vAlign w:val="center"/>
+            <w:tcMar>
+              <w:top w:w="80" w:type="dxa"/>
+              <w:start w:w="120" w:type="dxa"/>
+              <w:bottom w:w="80" w:type="dxa"/>
+              <w:end w:w="120" w:type="dxa"/>
+            </w:tcMar>
+            <w:shd w:fill="F8FAFC"/>
+          </w:tcPr>
+          <w:p>
+            <w:pPr>
+              <w:spacing w:after="0"/>
+              <w:jc w:val="left"/>
+            </w:pPr>
+            <w:r>
+              <w:rPr>
+                <w:rFonts w:ascii="Arial" w:hAnsi="Arial" w:eastAsia="Arial"/>
+                <w:b w:val="0"/>
+                <w:color w:val="111827"/>
+                <w:sz w:val="17"/>
+              </w:rPr>
+              <w:t>Нужна observed validation строка.</w:t>
+            </w:r>
+          </w:p>
+        </w:tc>
+        <w:tc>
+          <w:tcPr>
+            <w:tcW w:type="dxa" w:w="3456"/>
+            <w:vAlign w:val="center"/>
+            <w:tcMar>
+              <w:top w:w="80" w:type="dxa"/>
+              <w:start w:w="120" w:type="dxa"/>
+              <w:bottom w:w="80" w:type="dxa"/>
+              <w:end w:w="120" w:type="dxa"/>
+            </w:tcMar>
+            <w:shd w:fill="F8FAFC"/>
+          </w:tcPr>
+          <w:p>
+            <w:pPr>
+              <w:spacing w:after="0"/>
+              <w:jc w:val="left"/>
+            </w:pPr>
+            <w:r>
+              <w:rPr>
+                <w:rFonts w:ascii="Arial" w:hAnsi="Arial" w:eastAsia="Arial"/>
+                <w:b w:val="0"/>
+                <w:color w:val="111827"/>
+                <w:sz w:val="17"/>
+              </w:rPr>
+              <w:t>оставить hold_validate</w:t>
+            </w:r>
+          </w:p>
+        </w:tc>
+      </w:tr>
+      <w:tr>
+        <w:tc>
+          <w:tcPr>
+            <w:tcW w:type="dxa" w:w="2448"/>
+            <w:vAlign w:val="center"/>
+            <w:tcMar>
+              <w:top w:w="80" w:type="dxa"/>
+              <w:start w:w="120" w:type="dxa"/>
+              <w:bottom w:w="80" w:type="dxa"/>
+              <w:end w:w="120" w:type="dxa"/>
+            </w:tcMar>
+          </w:tcPr>
+          <w:p>
+            <w:pPr>
+              <w:spacing w:after="0"/>
+              <w:jc w:val="left"/>
+            </w:pPr>
+            <w:r>
+              <w:rPr>
+                <w:rFonts w:ascii="Arial" w:hAnsi="Arial" w:eastAsia="Arial"/>
+                <w:b w:val="0"/>
+                <w:color w:val="111827"/>
+                <w:sz w:val="17"/>
+              </w:rPr>
+              <w:t>H4: конкурентное преимущество правдоподобно</w:t>
+            </w:r>
+          </w:p>
+        </w:tc>
+        <w:tc>
+          <w:tcPr>
+            <w:tcW w:type="dxa" w:w="1440"/>
+            <w:vAlign w:val="center"/>
+            <w:tcMar>
+              <w:top w:w="80" w:type="dxa"/>
+              <w:start w:w="120" w:type="dxa"/>
+              <w:bottom w:w="80" w:type="dxa"/>
+              <w:end w:w="120" w:type="dxa"/>
+            </w:tcMar>
+          </w:tcPr>
+          <w:p>
+            <w:pPr>
+              <w:spacing w:after="0"/>
+              <w:jc w:val="left"/>
+            </w:pPr>
+            <w:r>
+              <w:rPr>
+                <w:rFonts w:ascii="Arial" w:hAnsi="Arial" w:eastAsia="Arial"/>
+                <w:b w:val="0"/>
+                <w:color w:val="111827"/>
+                <w:sz w:val="17"/>
+              </w:rPr>
+              <w:t>начато, но доказательств недостаточно; completed 16 / 80; success 0 / 32</w:t>
+            </w:r>
+          </w:p>
+        </w:tc>
+        <w:tc>
+          <w:tcPr>
+            <w:tcW w:type="dxa" w:w="2016"/>
+            <w:vAlign w:val="center"/>
+            <w:tcMar>
+              <w:top w:w="80" w:type="dxa"/>
+              <w:start w:w="120" w:type="dxa"/>
+              <w:bottom w:w="80" w:type="dxa"/>
+              <w:end w:w="120" w:type="dxa"/>
+            </w:tcMar>
+          </w:tcPr>
+          <w:p>
+            <w:pPr>
+              <w:spacing w:after="0"/>
+              <w:jc w:val="left"/>
+            </w:pPr>
+            <w:r>
+              <w:rPr>
+                <w:rFonts w:ascii="Arial" w:hAnsi="Arial" w:eastAsia="Arial"/>
+                <w:b w:val="0"/>
+                <w:color w:val="111827"/>
+                <w:sz w:val="17"/>
+              </w:rPr>
+              <w:t>Нужна observed validation строка.</w:t>
+            </w:r>
+          </w:p>
+        </w:tc>
+        <w:tc>
+          <w:tcPr>
+            <w:tcW w:type="dxa" w:w="3456"/>
+            <w:vAlign w:val="center"/>
+            <w:tcMar>
+              <w:top w:w="80" w:type="dxa"/>
+              <w:start w:w="120" w:type="dxa"/>
+              <w:bottom w:w="80" w:type="dxa"/>
+              <w:end w:w="120" w:type="dxa"/>
+            </w:tcMar>
+          </w:tcPr>
+          <w:p>
+            <w:pPr>
+              <w:spacing w:after="0"/>
+              <w:jc w:val="left"/>
+            </w:pPr>
+            <w:r>
+              <w:rPr>
+                <w:rFonts w:ascii="Arial" w:hAnsi="Arial" w:eastAsia="Arial"/>
+                <w:b w:val="0"/>
+                <w:color w:val="111827"/>
+                <w:sz w:val="17"/>
+              </w:rPr>
+              <w:t>оставить hold_validate</w:t>
+            </w:r>
+          </w:p>
+        </w:tc>
+      </w:tr>
+      <w:tr>
+        <w:tc>
+          <w:tcPr>
+            <w:tcW w:type="dxa" w:w="2448"/>
+            <w:vAlign w:val="center"/>
+            <w:tcMar>
+              <w:top w:w="80" w:type="dxa"/>
+              <w:start w:w="120" w:type="dxa"/>
+              <w:bottom w:w="80" w:type="dxa"/>
+              <w:end w:w="120" w:type="dxa"/>
+            </w:tcMar>
+            <w:shd w:fill="F8FAFC"/>
+          </w:tcPr>
+          <w:p>
+            <w:pPr>
+              <w:spacing w:after="0"/>
+              <w:jc w:val="left"/>
+            </w:pPr>
+            <w:r>
+              <w:rPr>
+                <w:rFonts w:ascii="Arial" w:hAnsi="Arial" w:eastAsia="Arial"/>
+                <w:b w:val="0"/>
+                <w:color w:val="111827"/>
+                <w:sz w:val="17"/>
+              </w:rPr>
+              <w:t>H6: продуктовое ядро можно определить</w:t>
+            </w:r>
+          </w:p>
+        </w:tc>
+        <w:tc>
+          <w:tcPr>
+            <w:tcW w:type="dxa" w:w="1440"/>
+            <w:vAlign w:val="center"/>
+            <w:tcMar>
+              <w:top w:w="80" w:type="dxa"/>
+              <w:start w:w="120" w:type="dxa"/>
+              <w:bottom w:w="80" w:type="dxa"/>
+              <w:end w:w="120" w:type="dxa"/>
+            </w:tcMar>
+            <w:shd w:fill="F8FAFC"/>
+          </w:tcPr>
+          <w:p>
+            <w:pPr>
+              <w:spacing w:after="0"/>
+              <w:jc w:val="left"/>
+            </w:pPr>
+            <w:r>
+              <w:rPr>
+                <w:rFonts w:ascii="Arial" w:hAnsi="Arial" w:eastAsia="Arial"/>
+                <w:b w:val="0"/>
+                <w:color w:val="111827"/>
+                <w:sz w:val="17"/>
+              </w:rPr>
+              <w:t>начато, но доказательств недостаточно; completed 16 / 80; success 0 / 32</w:t>
+            </w:r>
+          </w:p>
+        </w:tc>
+        <w:tc>
+          <w:tcPr>
+            <w:tcW w:type="dxa" w:w="2016"/>
+            <w:vAlign w:val="center"/>
+            <w:tcMar>
+              <w:top w:w="80" w:type="dxa"/>
+              <w:start w:w="120" w:type="dxa"/>
+              <w:bottom w:w="80" w:type="dxa"/>
+              <w:end w:w="120" w:type="dxa"/>
+            </w:tcMar>
+            <w:shd w:fill="F8FAFC"/>
+          </w:tcPr>
+          <w:p>
+            <w:pPr>
+              <w:spacing w:after="0"/>
+              <w:jc w:val="left"/>
+            </w:pPr>
+            <w:r>
+              <w:rPr>
+                <w:rFonts w:ascii="Arial" w:hAnsi="Arial" w:eastAsia="Arial"/>
+                <w:b w:val="0"/>
+                <w:color w:val="111827"/>
+                <w:sz w:val="17"/>
+              </w:rPr>
+              <w:t>Нужна observed validation строка.</w:t>
+            </w:r>
+          </w:p>
+        </w:tc>
+        <w:tc>
+          <w:tcPr>
+            <w:tcW w:type="dxa" w:w="3456"/>
+            <w:vAlign w:val="center"/>
+            <w:tcMar>
+              <w:top w:w="80" w:type="dxa"/>
+              <w:start w:w="120" w:type="dxa"/>
+              <w:bottom w:w="80" w:type="dxa"/>
+              <w:end w:w="120" w:type="dxa"/>
+            </w:tcMar>
+            <w:shd w:fill="F8FAFC"/>
+          </w:tcPr>
+          <w:p>
+            <w:pPr>
+              <w:spacing w:after="0"/>
+              <w:jc w:val="left"/>
+            </w:pPr>
+            <w:r>
+              <w:rPr>
+                <w:rFonts w:ascii="Arial" w:hAnsi="Arial" w:eastAsia="Arial"/>
+                <w:b w:val="0"/>
+                <w:color w:val="111827"/>
+                <w:sz w:val="17"/>
+              </w:rPr>
+              <w:t>оставить hold_validate</w:t>
+            </w:r>
+          </w:p>
+        </w:tc>
+      </w:tr>
+    </w:tbl>
+    <w:p/>
     <w:p>
       <w:r>
         <w:t>Чтобы масштаб базы не читался как одинаковое качество источников, отдельно добавлен source-quality audit по пяти рынкам. Он показывает, где coverage ближе к прямым consumer-app конкурентам, где это скорее Steam/itch mechanics benchmark, а где нужны source-native lanes из backlog. Это защищает отчет от ложного вывода “много строк = все доказано”.</w:t>
@@ -25982,7 +28202,7 @@
                 <w:color w:val="111827"/>
                 <w:sz w:val="16"/>
               </w:rPr>
-              <w:t>raw=67525; dedup=36694; dedup50_status=open; source_refs=239871; source_quality_rows=5</w:t>
+              <w:t>raw=67525; dedup=36694; dedup50_status=open; source_refs=239888; source_quality_rows=5</w:t>
             </w:r>
           </w:p>
         </w:tc>
@@ -26650,7 +28870,7 @@
                 <w:color w:val="111827"/>
                 <w:sz w:val="16"/>
               </w:rPr>
-              <w:t>global report md=yes; pdf=yes; docx=yes; executive_md=yes; executive_pdf=yes; readability_audit_rows=8; storyline_rows=10</w:t>
+              <w:t>global report md=yes; pdf=yes; docx=yes; executive_md=yes; executive_pdf=yes; readability_audit_rows=9; storyline_rows=10; dashboard_rows=16</w:t>
             </w:r>
           </w:p>
         </w:tc>
@@ -26816,7 +29036,7 @@
                 <w:color w:val="111827"/>
                 <w:sz w:val="16"/>
               </w:rPr>
-              <w:t>manifest=501; missing=0; docs=126; scripts=113</w:t>
+              <w:t>manifest=504; missing=0; docs=127; scripts=114</w:t>
             </w:r>
           </w:p>
         </w:tc>
@@ -27396,7 +29616,7 @@
                 <w:color w:val="111827"/>
                 <w:sz w:val="16"/>
               </w:rPr>
-              <w:t>source_base=67,525 raw; dedup=36,694; manifest=501; sample_style=yes</w:t>
+              <w:t>source_base=67,525 raw; dedup=36,694; manifest=504; sample_style=yes</w:t>
             </w:r>
           </w:p>
         </w:tc>
@@ -28901,7 +31121,7 @@
                 <w:color w:val="111827"/>
                 <w:sz w:val="16"/>
               </w:rPr>
-              <w:t>manifest=501; readability_rows=8; source_appendix=data_processed/global_hypothesis_source_appendix.csv</w:t>
+              <w:t>manifest=504; readability_rows=9; source_appendix=data_processed/global_hypothesis_source_appendix.csv</w:t>
             </w:r>
           </w:p>
         </w:tc>
@@ -29503,7 +31723,7 @@
                 <w:color w:val="111827"/>
                 <w:sz w:val="16"/>
               </w:rPr>
-              <w:t>markdown_table_rows=217</w:t>
+              <w:t>markdown_table_rows=241</w:t>
             </w:r>
           </w:p>
         </w:tc>
@@ -29782,7 +32002,7 @@
                 <w:color w:val="111827"/>
                 <w:sz w:val="16"/>
               </w:rPr>
-              <w:t>technical_english_hits=361</w:t>
+              <w:t>technical_english_hits=399</w:t>
             </w:r>
           </w:p>
         </w:tc>
@@ -30231,6 +32451,143 @@
                 <w:sz w:val="16"/>
               </w:rPr>
               <w:t>Держать STORY_01-STORY_10 как редакционный каркас перед каждой внешней сборкой PDF/DOCX.</w:t>
+            </w:r>
+          </w:p>
+        </w:tc>
+      </w:tr>
+      <w:tr>
+        <w:tc>
+          <w:tcPr>
+            <w:tcW w:type="dxa" w:w="2376"/>
+            <w:vAlign w:val="center"/>
+            <w:tcMar>
+              <w:top w:w="80" w:type="dxa"/>
+              <w:start w:w="120" w:type="dxa"/>
+              <w:bottom w:w="80" w:type="dxa"/>
+              <w:end w:w="120" w:type="dxa"/>
+            </w:tcMar>
+          </w:tcPr>
+          <w:p>
+            <w:pPr>
+              <w:spacing w:after="0"/>
+              <w:jc w:val="left"/>
+            </w:pPr>
+            <w:r>
+              <w:rPr>
+                <w:rFonts w:ascii="Arial" w:hAnsi="Arial" w:eastAsia="Arial"/>
+                <w:b w:val="0"/>
+                <w:color w:val="111827"/>
+                <w:sz w:val="16"/>
+              </w:rPr>
+              <w:t>Первые управленческие числа</w:t>
+            </w:r>
+          </w:p>
+        </w:tc>
+        <w:tc>
+          <w:tcPr>
+            <w:tcW w:type="dxa" w:w="1224"/>
+            <w:vAlign w:val="center"/>
+            <w:tcMar>
+              <w:top w:w="80" w:type="dxa"/>
+              <w:start w:w="120" w:type="dxa"/>
+              <w:bottom w:w="80" w:type="dxa"/>
+              <w:end w:w="120" w:type="dxa"/>
+            </w:tcMar>
+          </w:tcPr>
+          <w:p>
+            <w:pPr>
+              <w:spacing w:after="0"/>
+              <w:jc w:val="left"/>
+            </w:pPr>
+            <w:r>
+              <w:rPr>
+                <w:rFonts w:ascii="Arial" w:hAnsi="Arial" w:eastAsia="Arial"/>
+                <w:b w:val="0"/>
+                <w:color w:val="111827"/>
+                <w:sz w:val="16"/>
+              </w:rPr>
+              <w:t>складно</w:t>
+            </w:r>
+          </w:p>
+        </w:tc>
+        <w:tc>
+          <w:tcPr>
+            <w:tcW w:type="dxa" w:w="1224"/>
+            <w:vAlign w:val="center"/>
+            <w:tcMar>
+              <w:top w:w="80" w:type="dxa"/>
+              <w:start w:w="120" w:type="dxa"/>
+              <w:bottom w:w="80" w:type="dxa"/>
+              <w:end w:w="120" w:type="dxa"/>
+            </w:tcMar>
+          </w:tcPr>
+          <w:p>
+            <w:pPr>
+              <w:spacing w:after="0"/>
+              <w:jc w:val="left"/>
+            </w:pPr>
+            <w:r>
+              <w:rPr>
+                <w:rFonts w:ascii="Arial" w:hAnsi="Arial" w:eastAsia="Arial"/>
+                <w:b w:val="0"/>
+                <w:color w:val="111827"/>
+                <w:sz w:val="16"/>
+              </w:rPr>
+              <w:t>низкая</w:t>
+            </w:r>
+          </w:p>
+        </w:tc>
+        <w:tc>
+          <w:tcPr>
+            <w:tcW w:type="dxa" w:w="1944"/>
+            <w:vAlign w:val="center"/>
+            <w:tcMar>
+              <w:top w:w="80" w:type="dxa"/>
+              <w:start w:w="120" w:type="dxa"/>
+              <w:bottom w:w="80" w:type="dxa"/>
+              <w:end w:w="120" w:type="dxa"/>
+            </w:tcMar>
+          </w:tcPr>
+          <w:p>
+            <w:pPr>
+              <w:spacing w:after="0"/>
+              <w:jc w:val="left"/>
+            </w:pPr>
+            <w:r>
+              <w:rPr>
+                <w:rFonts w:ascii="Arial" w:hAnsi="Arial" w:eastAsia="Arial"/>
+                <w:b w:val="0"/>
+                <w:color w:val="111827"/>
+                <w:sz w:val="16"/>
+              </w:rPr>
+              <w:t>dashboard_rows=16; section_present=yes</w:t>
+            </w:r>
+          </w:p>
+        </w:tc>
+        <w:tc>
+          <w:tcPr>
+            <w:tcW w:type="dxa" w:w="2592"/>
+            <w:vAlign w:val="center"/>
+            <w:tcMar>
+              <w:top w:w="80" w:type="dxa"/>
+              <w:start w:w="120" w:type="dxa"/>
+              <w:bottom w:w="80" w:type="dxa"/>
+              <w:end w:w="120" w:type="dxa"/>
+            </w:tcMar>
+          </w:tcPr>
+          <w:p>
+            <w:pPr>
+              <w:spacing w:after="0"/>
+              <w:jc w:val="left"/>
+            </w:pPr>
+            <w:r>
+              <w:rPr>
+                <w:rFonts w:ascii="Arial" w:hAnsi="Arial" w:eastAsia="Arial"/>
+                <w:b w:val="0"/>
+                <w:color w:val="111827"/>
+                <w:sz w:val="16"/>
+              </w:rPr>
+              <w:t>Оставлять frontmatter dashboard в начале полного отчета и executive narrative; тяжелые детализации держать ниже.</w:t>
             </w:r>
           </w:p>
         </w:tc>
@@ -31357,7 +33714,7 @@
                 <w:color w:val="111827"/>
                 <w:sz w:val="16"/>
               </w:rPr>
-              <w:t>501 manifest artifacts; missing=0</w:t>
+              <w:t>504 manifest artifacts; missing=0</w:t>
             </w:r>
           </w:p>
         </w:tc>
@@ -31777,7 +34134,7 @@
                 <w:color w:val="111827"/>
                 <w:sz w:val="16"/>
               </w:rPr>
-              <w:t>8 readability audit rows</w:t>
+              <w:t>9 readability audit rows</w:t>
             </w:r>
           </w:p>
         </w:tc>
@@ -32222,6 +34579,148 @@
                 <w:sz w:val="16"/>
               </w:rPr>
               <w:t>Storyline карта управляет формой и переходами отчета; она не усиливает рыночные, конкурентные или продуктовые claims без observed evidence.</w:t>
+            </w:r>
+          </w:p>
+        </w:tc>
+      </w:tr>
+      <w:tr>
+        <w:tc>
+          <w:tcPr>
+            <w:tcW w:type="dxa" w:w="2376"/>
+            <w:vAlign w:val="center"/>
+            <w:tcMar>
+              <w:top w:w="80" w:type="dxa"/>
+              <w:start w:w="120" w:type="dxa"/>
+              <w:bottom w:w="80" w:type="dxa"/>
+              <w:end w:w="120" w:type="dxa"/>
+            </w:tcMar>
+            <w:shd w:fill="F8FAFC"/>
+          </w:tcPr>
+          <w:p>
+            <w:pPr>
+              <w:spacing w:after="0"/>
+              <w:jc w:val="left"/>
+            </w:pPr>
+            <w:r>
+              <w:rPr>
+                <w:rFonts w:ascii="Arial" w:hAnsi="Arial" w:eastAsia="Arial"/>
+                <w:b w:val="0"/>
+                <w:color w:val="111827"/>
+                <w:sz w:val="16"/>
+              </w:rPr>
+              <w:t>SRC_14_FRONTMATTER_DASHBOARD</w:t>
+            </w:r>
+          </w:p>
+        </w:tc>
+        <w:tc>
+          <w:tcPr>
+            <w:tcW w:type="dxa" w:w="1224"/>
+            <w:vAlign w:val="center"/>
+            <w:tcMar>
+              <w:top w:w="80" w:type="dxa"/>
+              <w:start w:w="120" w:type="dxa"/>
+              <w:bottom w:w="80" w:type="dxa"/>
+              <w:end w:w="120" w:type="dxa"/>
+            </w:tcMar>
+            <w:shd w:fill="F8FAFC"/>
+          </w:tcPr>
+          <w:p>
+            <w:pPr>
+              <w:spacing w:after="0"/>
+              <w:jc w:val="left"/>
+            </w:pPr>
+            <w:r>
+              <w:rPr>
+                <w:rFonts w:ascii="Arial" w:hAnsi="Arial" w:eastAsia="Arial"/>
+                <w:b w:val="0"/>
+                <w:color w:val="111827"/>
+                <w:sz w:val="16"/>
+              </w:rPr>
+              <w:t>Первые управленческие числа</w:t>
+            </w:r>
+          </w:p>
+        </w:tc>
+        <w:tc>
+          <w:tcPr>
+            <w:tcW w:type="dxa" w:w="1224"/>
+            <w:vAlign w:val="center"/>
+            <w:tcMar>
+              <w:top w:w="80" w:type="dxa"/>
+              <w:start w:w="120" w:type="dxa"/>
+              <w:bottom w:w="80" w:type="dxa"/>
+              <w:end w:w="120" w:type="dxa"/>
+            </w:tcMar>
+            <w:shd w:fill="F8FAFC"/>
+          </w:tcPr>
+          <w:p>
+            <w:pPr>
+              <w:spacing w:after="0"/>
+              <w:jc w:val="left"/>
+            </w:pPr>
+            <w:r>
+              <w:rPr>
+                <w:rFonts w:ascii="Arial" w:hAnsi="Arial" w:eastAsia="Arial"/>
+                <w:b w:val="0"/>
+                <w:color w:val="111827"/>
+                <w:sz w:val="16"/>
+              </w:rPr>
+              <w:t>проверено frontmatter dashboard, не market proof</w:t>
+            </w:r>
+          </w:p>
+        </w:tc>
+        <w:tc>
+          <w:tcPr>
+            <w:tcW w:type="dxa" w:w="1944"/>
+            <w:vAlign w:val="center"/>
+            <w:tcMar>
+              <w:top w:w="80" w:type="dxa"/>
+              <w:start w:w="120" w:type="dxa"/>
+              <w:bottom w:w="80" w:type="dxa"/>
+              <w:end w:w="120" w:type="dxa"/>
+            </w:tcMar>
+            <w:shd w:fill="F8FAFC"/>
+          </w:tcPr>
+          <w:p>
+            <w:pPr>
+              <w:spacing w:after="0"/>
+              <w:jc w:val="left"/>
+            </w:pPr>
+            <w:r>
+              <w:rPr>
+                <w:rFonts w:ascii="Arial" w:hAnsi="Arial" w:eastAsia="Arial"/>
+                <w:b w:val="0"/>
+                <w:color w:val="111827"/>
+                <w:sz w:val="16"/>
+              </w:rPr>
+              <w:t>16 dashboard rows</w:t>
+            </w:r>
+          </w:p>
+        </w:tc>
+        <w:tc>
+          <w:tcPr>
+            <w:tcW w:type="dxa" w:w="2592"/>
+            <w:vAlign w:val="center"/>
+            <w:tcMar>
+              <w:top w:w="80" w:type="dxa"/>
+              <w:start w:w="120" w:type="dxa"/>
+              <w:bottom w:w="80" w:type="dxa"/>
+              <w:end w:w="120" w:type="dxa"/>
+            </w:tcMar>
+            <w:shd w:fill="F8FAFC"/>
+          </w:tcPr>
+          <w:p>
+            <w:pPr>
+              <w:spacing w:after="0"/>
+              <w:jc w:val="left"/>
+            </w:pPr>
+            <w:r>
+              <w:rPr>
+                <w:rFonts w:ascii="Arial" w:hAnsi="Arial" w:eastAsia="Arial"/>
+                <w:b w:val="0"/>
+                <w:color w:val="111827"/>
+                <w:sz w:val="16"/>
+              </w:rPr>
+              <w:t>Dashboard улучшает читаемость и видимость счетчиков; он не превращает coverage, source volume или TAM/SAM/SOM в доказанный спрос.</w:t>
             </w:r>
           </w:p>
         </w:tc>
@@ -32386,6 +34885,15 @@
       </w:pPr>
       <w:r>
         <w:t>data_processed/russian_sequential_storyline.csv</w:t>
+      </w:r>
+    </w:p>
+    <w:p>
+      <w:pPr>
+        <w:pStyle w:val="ListBullet"/>
+        <w:spacing w:after="80"/>
+      </w:pPr>
+      <w:r>
+        <w:t>data_processed/russian_frontmatter_dashboard.csv</w:t>
       </w:r>
     </w:p>
     <w:p>

</xml_diff>

<commit_message>
Deepen AURA avatar and product core analysis
</commit_message>
<xml_diff>
--- a/output/docx/alina-global-hypothesis-report-v1.docx
+++ b/output/docx/alina-global-hypothesis-report-v1.docx
@@ -12494,7 +12494,7 @@
                 <w:color w:val="111827"/>
                 <w:sz w:val="16"/>
               </w:rPr>
-              <w:t>Score</w:t>
+              <w:t>Оценка</w:t>
             </w:r>
           </w:p>
         </w:tc>
@@ -14859,7 +14859,7 @@
                 <w:color w:val="111827"/>
                 <w:sz w:val="16"/>
               </w:rPr>
-              <w:t>маленький validation business, полезен для проверки, но не для venture-вывод</w:t>
+              <w:t>маленький проверочный бизнес, полезен для проверки, но не для venture-вывод</w:t>
             </w:r>
           </w:p>
         </w:tc>
@@ -18959,8 +18959,3233 @@
     </w:tbl>
     <w:p/>
     <w:p>
+      <w:pPr>
+        <w:pStyle w:val="Heading2"/>
+      </w:pPr>
       <w:r>
-        <w:t>Гипотеза №3: востребованным может стать не отдельный mindfulness, habit, astrology или avatar product, а связанная система, где смысл быстро превращается в действие, а действие становится видимым. Главный риск для этой гипотезы - скрытый прямой клон внутри onboarding P0-конкурентов, прежде всего Shepherd: Spiritual Bible BFF.</w:t>
+        <w:t>Что видно внутри приложений и отзывов</w:t>
+      </w:r>
+    </w:p>
+    <w:p>
+      <w:r>
+        <w:t>Если смотреть не только на категории приложений, а на то, за что пользователи хвалят и ругают близкие продукты, картина становится конкретнее. Люди возвращаются не просто “в wellness” или “в коучинг”. Они ищут ежедневный якорь, ощущение движения, эмоциональную поддержку, персонализацию и доказательство, что маленькое действие действительно что-то меняет. Поэтому АУРА должна конкурировать не количеством функций, а качеством одной понятной петли.</w:t>
+      </w:r>
+    </w:p>
+    <w:tbl>
+      <w:tblPr>
+        <w:tblW w:type="dxa" w:w="9360"/>
+        <w:jc w:val="left"/>
+        <w:tblLayout w:type="fixed"/>
+        <w:tblLook w:firstColumn="1" w:firstRow="1" w:lastColumn="0" w:lastRow="0" w:noHBand="0" w:noVBand="1" w:val="04A0"/>
+        <w:tblInd w:w="120" w:type="dxa"/>
+        <w:tblBorders>
+          <w:top w:val="single" w:sz="4" w:space="0" w:color="CBD5E1"/>
+          <w:left w:val="single" w:sz="4" w:space="0" w:color="CBD5E1"/>
+          <w:bottom w:val="single" w:sz="4" w:space="0" w:color="CBD5E1"/>
+          <w:right w:val="single" w:sz="4" w:space="0" w:color="CBD5E1"/>
+          <w:insideH w:val="single" w:sz="4" w:space="0" w:color="CBD5E1"/>
+          <w:insideV w:val="single" w:sz="4" w:space="0" w:color="CBD5E1"/>
+        </w:tblBorders>
+      </w:tblPr>
+      <w:tblGrid>
+        <w:gridCol w:w="3120"/>
+        <w:gridCol w:w="3120"/>
+        <w:gridCol w:w="3120"/>
+      </w:tblGrid>
+      <w:tr>
+        <w:tc>
+          <w:tcPr>
+            <w:tcW w:type="dxa" w:w="2448"/>
+            <w:vAlign w:val="center"/>
+            <w:tcMar>
+              <w:top w:w="80" w:type="dxa"/>
+              <w:start w:w="120" w:type="dxa"/>
+              <w:bottom w:w="80" w:type="dxa"/>
+              <w:end w:w="120" w:type="dxa"/>
+            </w:tcMar>
+            <w:shd w:fill="E8EEF5"/>
+          </w:tcPr>
+          <w:p>
+            <w:pPr>
+              <w:spacing w:after="0"/>
+              <w:jc w:val="left"/>
+            </w:pPr>
+            <w:r>
+              <w:rPr>
+                <w:rFonts w:ascii="Arial" w:hAnsi="Arial" w:eastAsia="Arial"/>
+                <w:b/>
+                <w:color w:val="111827"/>
+                <w:sz w:val="17"/>
+              </w:rPr>
+              <w:t>Что повторяется в отзывах</w:t>
+            </w:r>
+          </w:p>
+        </w:tc>
+        <w:tc>
+          <w:tcPr>
+            <w:tcW w:type="dxa" w:w="1440"/>
+            <w:vAlign w:val="center"/>
+            <w:tcMar>
+              <w:top w:w="80" w:type="dxa"/>
+              <w:start w:w="120" w:type="dxa"/>
+              <w:bottom w:w="80" w:type="dxa"/>
+              <w:end w:w="120" w:type="dxa"/>
+            </w:tcMar>
+            <w:shd w:fill="E8EEF5"/>
+          </w:tcPr>
+          <w:p>
+            <w:pPr>
+              <w:spacing w:after="0"/>
+              <w:jc w:val="left"/>
+            </w:pPr>
+            <w:r>
+              <w:rPr>
+                <w:rFonts w:ascii="Arial" w:hAnsi="Arial" w:eastAsia="Arial"/>
+                <w:b/>
+                <w:color w:val="111827"/>
+                <w:sz w:val="17"/>
+              </w:rPr>
+              <w:t>Сигналов</w:t>
+            </w:r>
+          </w:p>
+        </w:tc>
+        <w:tc>
+          <w:tcPr>
+            <w:tcW w:type="dxa" w:w="5472"/>
+            <w:vAlign w:val="center"/>
+            <w:tcMar>
+              <w:top w:w="80" w:type="dxa"/>
+              <w:start w:w="120" w:type="dxa"/>
+              <w:bottom w:w="80" w:type="dxa"/>
+              <w:end w:w="120" w:type="dxa"/>
+            </w:tcMar>
+            <w:shd w:fill="E8EEF5"/>
+          </w:tcPr>
+          <w:p>
+            <w:pPr>
+              <w:spacing w:after="0"/>
+              <w:jc w:val="left"/>
+            </w:pPr>
+            <w:r>
+              <w:rPr>
+                <w:rFonts w:ascii="Arial" w:hAnsi="Arial" w:eastAsia="Arial"/>
+                <w:b/>
+                <w:color w:val="111827"/>
+                <w:sz w:val="17"/>
+              </w:rPr>
+              <w:t>Что это значит для АУРЫ</w:t>
+            </w:r>
+          </w:p>
+        </w:tc>
+      </w:tr>
+      <w:tr>
+        <w:tc>
+          <w:tcPr>
+            <w:tcW w:type="dxa" w:w="2448"/>
+            <w:vAlign w:val="center"/>
+            <w:tcMar>
+              <w:top w:w="80" w:type="dxa"/>
+              <w:start w:w="120" w:type="dxa"/>
+              <w:bottom w:w="80" w:type="dxa"/>
+              <w:end w:w="120" w:type="dxa"/>
+            </w:tcMar>
+          </w:tcPr>
+          <w:p>
+            <w:pPr>
+              <w:spacing w:after="0"/>
+              <w:jc w:val="left"/>
+            </w:pPr>
+            <w:r>
+              <w:rPr>
+                <w:rFonts w:ascii="Arial" w:hAnsi="Arial" w:eastAsia="Arial"/>
+                <w:b w:val="0"/>
+                <w:color w:val="111827"/>
+                <w:sz w:val="17"/>
+              </w:rPr>
+              <w:t>люди просят больше глубины, настроек и персонализации</w:t>
+            </w:r>
+          </w:p>
+        </w:tc>
+        <w:tc>
+          <w:tcPr>
+            <w:tcW w:type="dxa" w:w="1440"/>
+            <w:vAlign w:val="center"/>
+            <w:tcMar>
+              <w:top w:w="80" w:type="dxa"/>
+              <w:start w:w="120" w:type="dxa"/>
+              <w:bottom w:w="80" w:type="dxa"/>
+              <w:end w:w="120" w:type="dxa"/>
+            </w:tcMar>
+          </w:tcPr>
+          <w:p>
+            <w:pPr>
+              <w:spacing w:after="0"/>
+              <w:jc w:val="left"/>
+            </w:pPr>
+            <w:r>
+              <w:rPr>
+                <w:rFonts w:ascii="Arial" w:hAnsi="Arial" w:eastAsia="Arial"/>
+                <w:b w:val="0"/>
+                <w:color w:val="111827"/>
+                <w:sz w:val="17"/>
+              </w:rPr>
+              <w:t>156</w:t>
+            </w:r>
+          </w:p>
+        </w:tc>
+        <w:tc>
+          <w:tcPr>
+            <w:tcW w:type="dxa" w:w="5472"/>
+            <w:vAlign w:val="center"/>
+            <w:tcMar>
+              <w:top w:w="80" w:type="dxa"/>
+              <w:start w:w="120" w:type="dxa"/>
+              <w:bottom w:w="80" w:type="dxa"/>
+              <w:end w:w="120" w:type="dxa"/>
+            </w:tcMar>
+          </w:tcPr>
+          <w:p>
+            <w:pPr>
+              <w:spacing w:after="0"/>
+              <w:jc w:val="left"/>
+            </w:pPr>
+            <w:r>
+              <w:rPr>
+                <w:rFonts w:ascii="Arial" w:hAnsi="Arial" w:eastAsia="Arial"/>
+                <w:b w:val="0"/>
+                <w:color w:val="111827"/>
+                <w:sz w:val="17"/>
+              </w:rPr>
+              <w:t>после первого момента ценности пользователи хотят больше глубины, настроек и персонализации.</w:t>
+            </w:r>
+          </w:p>
+        </w:tc>
+      </w:tr>
+      <w:tr>
+        <w:tc>
+          <w:tcPr>
+            <w:tcW w:type="dxa" w:w="2448"/>
+            <w:vAlign w:val="center"/>
+            <w:tcMar>
+              <w:top w:w="80" w:type="dxa"/>
+              <w:start w:w="120" w:type="dxa"/>
+              <w:bottom w:w="80" w:type="dxa"/>
+              <w:end w:w="120" w:type="dxa"/>
+            </w:tcMar>
+            <w:shd w:fill="F8FAFC"/>
+          </w:tcPr>
+          <w:p>
+            <w:pPr>
+              <w:spacing w:after="0"/>
+              <w:jc w:val="left"/>
+            </w:pPr>
+            <w:r>
+              <w:rPr>
+                <w:rFonts w:ascii="Arial" w:hAnsi="Arial" w:eastAsia="Arial"/>
+                <w:b w:val="0"/>
+                <w:color w:val="111827"/>
+                <w:sz w:val="17"/>
+              </w:rPr>
+              <w:t>пользователям нравится ежедневный ритуал</w:t>
+            </w:r>
+          </w:p>
+        </w:tc>
+        <w:tc>
+          <w:tcPr>
+            <w:tcW w:type="dxa" w:w="1440"/>
+            <w:vAlign w:val="center"/>
+            <w:tcMar>
+              <w:top w:w="80" w:type="dxa"/>
+              <w:start w:w="120" w:type="dxa"/>
+              <w:bottom w:w="80" w:type="dxa"/>
+              <w:end w:w="120" w:type="dxa"/>
+            </w:tcMar>
+            <w:shd w:fill="F8FAFC"/>
+          </w:tcPr>
+          <w:p>
+            <w:pPr>
+              <w:spacing w:after="0"/>
+              <w:jc w:val="left"/>
+            </w:pPr>
+            <w:r>
+              <w:rPr>
+                <w:rFonts w:ascii="Arial" w:hAnsi="Arial" w:eastAsia="Arial"/>
+                <w:b w:val="0"/>
+                <w:color w:val="111827"/>
+                <w:sz w:val="17"/>
+              </w:rPr>
+              <w:t>127</w:t>
+            </w:r>
+          </w:p>
+        </w:tc>
+        <w:tc>
+          <w:tcPr>
+            <w:tcW w:type="dxa" w:w="5472"/>
+            <w:vAlign w:val="center"/>
+            <w:tcMar>
+              <w:top w:w="80" w:type="dxa"/>
+              <w:start w:w="120" w:type="dxa"/>
+              <w:bottom w:w="80" w:type="dxa"/>
+              <w:end w:w="120" w:type="dxa"/>
+            </w:tcMar>
+            <w:shd w:fill="F8FAFC"/>
+          </w:tcPr>
+          <w:p>
+            <w:pPr>
+              <w:spacing w:after="0"/>
+              <w:jc w:val="left"/>
+            </w:pPr>
+            <w:r>
+              <w:rPr>
+                <w:rFonts w:ascii="Arial" w:hAnsi="Arial" w:eastAsia="Arial"/>
+                <w:b w:val="0"/>
+                <w:color w:val="111827"/>
+                <w:sz w:val="17"/>
+              </w:rPr>
+              <w:t>это повторяющийся сигнал из отзывов и конкурентных карточек.</w:t>
+            </w:r>
+          </w:p>
+        </w:tc>
+      </w:tr>
+      <w:tr>
+        <w:tc>
+          <w:tcPr>
+            <w:tcW w:type="dxa" w:w="2448"/>
+            <w:vAlign w:val="center"/>
+            <w:tcMar>
+              <w:top w:w="80" w:type="dxa"/>
+              <w:start w:w="120" w:type="dxa"/>
+              <w:bottom w:w="80" w:type="dxa"/>
+              <w:end w:w="120" w:type="dxa"/>
+            </w:tcMar>
+          </w:tcPr>
+          <w:p>
+            <w:pPr>
+              <w:spacing w:after="0"/>
+              <w:jc w:val="left"/>
+            </w:pPr>
+            <w:r>
+              <w:rPr>
+                <w:rFonts w:ascii="Arial" w:hAnsi="Arial" w:eastAsia="Arial"/>
+                <w:b w:val="0"/>
+                <w:color w:val="111827"/>
+                <w:sz w:val="17"/>
+              </w:rPr>
+              <w:t>есть жалобы на цену или подписку</w:t>
+            </w:r>
+          </w:p>
+        </w:tc>
+        <w:tc>
+          <w:tcPr>
+            <w:tcW w:type="dxa" w:w="1440"/>
+            <w:vAlign w:val="center"/>
+            <w:tcMar>
+              <w:top w:w="80" w:type="dxa"/>
+              <w:start w:w="120" w:type="dxa"/>
+              <w:bottom w:w="80" w:type="dxa"/>
+              <w:end w:w="120" w:type="dxa"/>
+            </w:tcMar>
+          </w:tcPr>
+          <w:p>
+            <w:pPr>
+              <w:spacing w:after="0"/>
+              <w:jc w:val="left"/>
+            </w:pPr>
+            <w:r>
+              <w:rPr>
+                <w:rFonts w:ascii="Arial" w:hAnsi="Arial" w:eastAsia="Arial"/>
+                <w:b w:val="0"/>
+                <w:color w:val="111827"/>
+                <w:sz w:val="17"/>
+              </w:rPr>
+              <w:t>98</w:t>
+            </w:r>
+          </w:p>
+        </w:tc>
+        <w:tc>
+          <w:tcPr>
+            <w:tcW w:type="dxa" w:w="5472"/>
+            <w:vAlign w:val="center"/>
+            <w:tcMar>
+              <w:top w:w="80" w:type="dxa"/>
+              <w:start w:w="120" w:type="dxa"/>
+              <w:bottom w:w="80" w:type="dxa"/>
+              <w:end w:w="120" w:type="dxa"/>
+            </w:tcMar>
+          </w:tcPr>
+          <w:p>
+            <w:pPr>
+              <w:spacing w:after="0"/>
+              <w:jc w:val="left"/>
+            </w:pPr>
+            <w:r>
+              <w:rPr>
+                <w:rFonts w:ascii="Arial" w:hAnsi="Arial" w:eastAsia="Arial"/>
+                <w:b w:val="0"/>
+                <w:color w:val="111827"/>
+                <w:sz w:val="17"/>
+              </w:rPr>
+              <w:t>платная модель должна появляться после понятной ценности, иначе вызывает сопротивление.</w:t>
+            </w:r>
+          </w:p>
+        </w:tc>
+      </w:tr>
+      <w:tr>
+        <w:tc>
+          <w:tcPr>
+            <w:tcW w:type="dxa" w:w="2448"/>
+            <w:vAlign w:val="center"/>
+            <w:tcMar>
+              <w:top w:w="80" w:type="dxa"/>
+              <w:start w:w="120" w:type="dxa"/>
+              <w:bottom w:w="80" w:type="dxa"/>
+              <w:end w:w="120" w:type="dxa"/>
+            </w:tcMar>
+            <w:shd w:fill="F8FAFC"/>
+          </w:tcPr>
+          <w:p>
+            <w:pPr>
+              <w:spacing w:after="0"/>
+              <w:jc w:val="left"/>
+            </w:pPr>
+            <w:r>
+              <w:rPr>
+                <w:rFonts w:ascii="Arial" w:hAnsi="Arial" w:eastAsia="Arial"/>
+                <w:b w:val="0"/>
+                <w:color w:val="111827"/>
+                <w:sz w:val="17"/>
+              </w:rPr>
+              <w:t>пользователям нравится avatar/progress feedback</w:t>
+            </w:r>
+          </w:p>
+        </w:tc>
+        <w:tc>
+          <w:tcPr>
+            <w:tcW w:type="dxa" w:w="1440"/>
+            <w:vAlign w:val="center"/>
+            <w:tcMar>
+              <w:top w:w="80" w:type="dxa"/>
+              <w:start w:w="120" w:type="dxa"/>
+              <w:bottom w:w="80" w:type="dxa"/>
+              <w:end w:w="120" w:type="dxa"/>
+            </w:tcMar>
+            <w:shd w:fill="F8FAFC"/>
+          </w:tcPr>
+          <w:p>
+            <w:pPr>
+              <w:spacing w:after="0"/>
+              <w:jc w:val="left"/>
+            </w:pPr>
+            <w:r>
+              <w:rPr>
+                <w:rFonts w:ascii="Arial" w:hAnsi="Arial" w:eastAsia="Arial"/>
+                <w:b w:val="0"/>
+                <w:color w:val="111827"/>
+                <w:sz w:val="17"/>
+              </w:rPr>
+              <w:t>70</w:t>
+            </w:r>
+          </w:p>
+        </w:tc>
+        <w:tc>
+          <w:tcPr>
+            <w:tcW w:type="dxa" w:w="5472"/>
+            <w:vAlign w:val="center"/>
+            <w:tcMar>
+              <w:top w:w="80" w:type="dxa"/>
+              <w:start w:w="120" w:type="dxa"/>
+              <w:bottom w:w="80" w:type="dxa"/>
+              <w:end w:w="120" w:type="dxa"/>
+            </w:tcMar>
+            <w:shd w:fill="F8FAFC"/>
+          </w:tcPr>
+          <w:p>
+            <w:pPr>
+              <w:spacing w:after="0"/>
+              <w:jc w:val="left"/>
+            </w:pPr>
+            <w:r>
+              <w:rPr>
+                <w:rFonts w:ascii="Arial" w:hAnsi="Arial" w:eastAsia="Arial"/>
+                <w:b w:val="0"/>
+                <w:color w:val="111827"/>
+                <w:sz w:val="17"/>
+              </w:rPr>
+              <w:t>avatar/progress уже считывается пользователями как ценность, но только если он не декоративный.</w:t>
+            </w:r>
+          </w:p>
+        </w:tc>
+      </w:tr>
+      <w:tr>
+        <w:tc>
+          <w:tcPr>
+            <w:tcW w:type="dxa" w:w="2448"/>
+            <w:vAlign w:val="center"/>
+            <w:tcMar>
+              <w:top w:w="80" w:type="dxa"/>
+              <w:start w:w="120" w:type="dxa"/>
+              <w:bottom w:w="80" w:type="dxa"/>
+              <w:end w:w="120" w:type="dxa"/>
+            </w:tcMar>
+          </w:tcPr>
+          <w:p>
+            <w:pPr>
+              <w:spacing w:after="0"/>
+              <w:jc w:val="left"/>
+            </w:pPr>
+            <w:r>
+              <w:rPr>
+                <w:rFonts w:ascii="Arial" w:hAnsi="Arial" w:eastAsia="Arial"/>
+                <w:b w:val="0"/>
+                <w:color w:val="111827"/>
+                <w:sz w:val="17"/>
+              </w:rPr>
+              <w:t>ценится эмоциональная поддержка</w:t>
+            </w:r>
+          </w:p>
+        </w:tc>
+        <w:tc>
+          <w:tcPr>
+            <w:tcW w:type="dxa" w:w="1440"/>
+            <w:vAlign w:val="center"/>
+            <w:tcMar>
+              <w:top w:w="80" w:type="dxa"/>
+              <w:start w:w="120" w:type="dxa"/>
+              <w:bottom w:w="80" w:type="dxa"/>
+              <w:end w:w="120" w:type="dxa"/>
+            </w:tcMar>
+          </w:tcPr>
+          <w:p>
+            <w:pPr>
+              <w:spacing w:after="0"/>
+              <w:jc w:val="left"/>
+            </w:pPr>
+            <w:r>
+              <w:rPr>
+                <w:rFonts w:ascii="Arial" w:hAnsi="Arial" w:eastAsia="Arial"/>
+                <w:b w:val="0"/>
+                <w:color w:val="111827"/>
+                <w:sz w:val="17"/>
+              </w:rPr>
+              <w:t>57</w:t>
+            </w:r>
+          </w:p>
+        </w:tc>
+        <w:tc>
+          <w:tcPr>
+            <w:tcW w:type="dxa" w:w="5472"/>
+            <w:vAlign w:val="center"/>
+            <w:tcMar>
+              <w:top w:w="80" w:type="dxa"/>
+              <w:start w:w="120" w:type="dxa"/>
+              <w:bottom w:w="80" w:type="dxa"/>
+              <w:end w:w="120" w:type="dxa"/>
+            </w:tcMar>
+          </w:tcPr>
+          <w:p>
+            <w:pPr>
+              <w:spacing w:after="0"/>
+              <w:jc w:val="left"/>
+            </w:pPr>
+            <w:r>
+              <w:rPr>
+                <w:rFonts w:ascii="Arial" w:hAnsi="Arial" w:eastAsia="Arial"/>
+                <w:b w:val="0"/>
+                <w:color w:val="111827"/>
+                <w:sz w:val="17"/>
+              </w:rPr>
+              <w:t>это повторяющийся сигнал из отзывов и конкурентных карточек.</w:t>
+            </w:r>
+          </w:p>
+        </w:tc>
+      </w:tr>
+      <w:tr>
+        <w:tc>
+          <w:tcPr>
+            <w:tcW w:type="dxa" w:w="2448"/>
+            <w:vAlign w:val="center"/>
+            <w:tcMar>
+              <w:top w:w="80" w:type="dxa"/>
+              <w:start w:w="120" w:type="dxa"/>
+              <w:bottom w:w="80" w:type="dxa"/>
+              <w:end w:w="120" w:type="dxa"/>
+            </w:tcMar>
+            <w:shd w:fill="F8FAFC"/>
+          </w:tcPr>
+          <w:p>
+            <w:pPr>
+              <w:spacing w:after="0"/>
+              <w:jc w:val="left"/>
+            </w:pPr>
+            <w:r>
+              <w:rPr>
+                <w:rFonts w:ascii="Arial" w:hAnsi="Arial" w:eastAsia="Arial"/>
+                <w:b w:val="0"/>
+                <w:color w:val="111827"/>
+                <w:sz w:val="17"/>
+              </w:rPr>
+              <w:t>видны причины оттока</w:t>
+            </w:r>
+          </w:p>
+        </w:tc>
+        <w:tc>
+          <w:tcPr>
+            <w:tcW w:type="dxa" w:w="1440"/>
+            <w:vAlign w:val="center"/>
+            <w:tcMar>
+              <w:top w:w="80" w:type="dxa"/>
+              <w:start w:w="120" w:type="dxa"/>
+              <w:bottom w:w="80" w:type="dxa"/>
+              <w:end w:w="120" w:type="dxa"/>
+            </w:tcMar>
+            <w:shd w:fill="F8FAFC"/>
+          </w:tcPr>
+          <w:p>
+            <w:pPr>
+              <w:spacing w:after="0"/>
+              <w:jc w:val="left"/>
+            </w:pPr>
+            <w:r>
+              <w:rPr>
+                <w:rFonts w:ascii="Arial" w:hAnsi="Arial" w:eastAsia="Arial"/>
+                <w:b w:val="0"/>
+                <w:color w:val="111827"/>
+                <w:sz w:val="17"/>
+              </w:rPr>
+              <w:t>22</w:t>
+            </w:r>
+          </w:p>
+        </w:tc>
+        <w:tc>
+          <w:tcPr>
+            <w:tcW w:type="dxa" w:w="5472"/>
+            <w:vAlign w:val="center"/>
+            <w:tcMar>
+              <w:top w:w="80" w:type="dxa"/>
+              <w:start w:w="120" w:type="dxa"/>
+              <w:bottom w:w="80" w:type="dxa"/>
+              <w:end w:w="120" w:type="dxa"/>
+            </w:tcMar>
+            <w:shd w:fill="F8FAFC"/>
+          </w:tcPr>
+          <w:p>
+            <w:pPr>
+              <w:spacing w:after="0"/>
+              <w:jc w:val="left"/>
+            </w:pPr>
+            <w:r>
+              <w:rPr>
+                <w:rFonts w:ascii="Arial" w:hAnsi="Arial" w:eastAsia="Arial"/>
+                <w:b w:val="0"/>
+                <w:color w:val="111827"/>
+                <w:sz w:val="17"/>
+              </w:rPr>
+              <w:t>это повторяющийся сигнал из отзывов и конкурентных карточек.</w:t>
+            </w:r>
+          </w:p>
+        </w:tc>
+      </w:tr>
+      <w:tr>
+        <w:tc>
+          <w:tcPr>
+            <w:tcW w:type="dxa" w:w="2448"/>
+            <w:vAlign w:val="center"/>
+            <w:tcMar>
+              <w:top w:w="80" w:type="dxa"/>
+              <w:start w:w="120" w:type="dxa"/>
+              <w:bottom w:w="80" w:type="dxa"/>
+              <w:end w:w="120" w:type="dxa"/>
+            </w:tcMar>
+          </w:tcPr>
+          <w:p>
+            <w:pPr>
+              <w:spacing w:after="0"/>
+              <w:jc w:val="left"/>
+            </w:pPr>
+            <w:r>
+              <w:rPr>
+                <w:rFonts w:ascii="Arial" w:hAnsi="Arial" w:eastAsia="Arial"/>
+                <w:b w:val="0"/>
+                <w:color w:val="111827"/>
+                <w:sz w:val="17"/>
+              </w:rPr>
+              <w:t>сбои ломают доверие и ритуал</w:t>
+            </w:r>
+          </w:p>
+        </w:tc>
+        <w:tc>
+          <w:tcPr>
+            <w:tcW w:type="dxa" w:w="1440"/>
+            <w:vAlign w:val="center"/>
+            <w:tcMar>
+              <w:top w:w="80" w:type="dxa"/>
+              <w:start w:w="120" w:type="dxa"/>
+              <w:bottom w:w="80" w:type="dxa"/>
+              <w:end w:w="120" w:type="dxa"/>
+            </w:tcMar>
+          </w:tcPr>
+          <w:p>
+            <w:pPr>
+              <w:spacing w:after="0"/>
+              <w:jc w:val="left"/>
+            </w:pPr>
+            <w:r>
+              <w:rPr>
+                <w:rFonts w:ascii="Arial" w:hAnsi="Arial" w:eastAsia="Arial"/>
+                <w:b w:val="0"/>
+                <w:color w:val="111827"/>
+                <w:sz w:val="17"/>
+              </w:rPr>
+              <w:t>10</w:t>
+            </w:r>
+          </w:p>
+        </w:tc>
+        <w:tc>
+          <w:tcPr>
+            <w:tcW w:type="dxa" w:w="5472"/>
+            <w:vAlign w:val="center"/>
+            <w:tcMar>
+              <w:top w:w="80" w:type="dxa"/>
+              <w:start w:w="120" w:type="dxa"/>
+              <w:bottom w:w="80" w:type="dxa"/>
+              <w:end w:w="120" w:type="dxa"/>
+            </w:tcMar>
+          </w:tcPr>
+          <w:p>
+            <w:pPr>
+              <w:spacing w:after="0"/>
+              <w:jc w:val="left"/>
+            </w:pPr>
+            <w:r>
+              <w:rPr>
+                <w:rFonts w:ascii="Arial" w:hAnsi="Arial" w:eastAsia="Arial"/>
+                <w:b w:val="0"/>
+                <w:color w:val="111827"/>
+                <w:sz w:val="17"/>
+              </w:rPr>
+              <w:t>это повторяющийся сигнал из отзывов и конкурентных карточек.</w:t>
+            </w:r>
+          </w:p>
+        </w:tc>
+      </w:tr>
+      <w:tr>
+        <w:tc>
+          <w:tcPr>
+            <w:tcW w:type="dxa" w:w="2448"/>
+            <w:vAlign w:val="center"/>
+            <w:tcMar>
+              <w:top w:w="80" w:type="dxa"/>
+              <w:start w:w="120" w:type="dxa"/>
+              <w:bottom w:w="80" w:type="dxa"/>
+              <w:end w:w="120" w:type="dxa"/>
+            </w:tcMar>
+            <w:shd w:fill="F8FAFC"/>
+          </w:tcPr>
+          <w:p>
+            <w:pPr>
+              <w:spacing w:after="0"/>
+              <w:jc w:val="left"/>
+            </w:pPr>
+            <w:r>
+              <w:rPr>
+                <w:rFonts w:ascii="Arial" w:hAnsi="Arial" w:eastAsia="Arial"/>
+                <w:b w:val="0"/>
+                <w:color w:val="111827"/>
+                <w:sz w:val="17"/>
+              </w:rPr>
+              <w:t>есть жалобы на точность и доверие</w:t>
+            </w:r>
+          </w:p>
+        </w:tc>
+        <w:tc>
+          <w:tcPr>
+            <w:tcW w:type="dxa" w:w="1440"/>
+            <w:vAlign w:val="center"/>
+            <w:tcMar>
+              <w:top w:w="80" w:type="dxa"/>
+              <w:start w:w="120" w:type="dxa"/>
+              <w:bottom w:w="80" w:type="dxa"/>
+              <w:end w:w="120" w:type="dxa"/>
+            </w:tcMar>
+            <w:shd w:fill="F8FAFC"/>
+          </w:tcPr>
+          <w:p>
+            <w:pPr>
+              <w:spacing w:after="0"/>
+              <w:jc w:val="left"/>
+            </w:pPr>
+            <w:r>
+              <w:rPr>
+                <w:rFonts w:ascii="Arial" w:hAnsi="Arial" w:eastAsia="Arial"/>
+                <w:b w:val="0"/>
+                <w:color w:val="111827"/>
+                <w:sz w:val="17"/>
+              </w:rPr>
+              <w:t>4</w:t>
+            </w:r>
+          </w:p>
+        </w:tc>
+        <w:tc>
+          <w:tcPr>
+            <w:tcW w:type="dxa" w:w="5472"/>
+            <w:vAlign w:val="center"/>
+            <w:tcMar>
+              <w:top w:w="80" w:type="dxa"/>
+              <w:start w:w="120" w:type="dxa"/>
+              <w:bottom w:w="80" w:type="dxa"/>
+              <w:end w:w="120" w:type="dxa"/>
+            </w:tcMar>
+            <w:shd w:fill="F8FAFC"/>
+          </w:tcPr>
+          <w:p>
+            <w:pPr>
+              <w:spacing w:after="0"/>
+              <w:jc w:val="left"/>
+            </w:pPr>
+            <w:r>
+              <w:rPr>
+                <w:rFonts w:ascii="Arial" w:hAnsi="Arial" w:eastAsia="Arial"/>
+                <w:b w:val="0"/>
+                <w:color w:val="111827"/>
+                <w:sz w:val="17"/>
+              </w:rPr>
+              <w:t>это повторяющийся сигнал из отзывов и конкурентных карточек.</w:t>
+            </w:r>
+          </w:p>
+        </w:tc>
+      </w:tr>
+    </w:tbl>
+    <w:p/>
+    <w:tbl>
+      <w:tblPr>
+        <w:tblW w:type="dxa" w:w="9360"/>
+        <w:jc w:val="left"/>
+        <w:tblLayout w:type="fixed"/>
+        <w:tblLook w:firstColumn="1" w:firstRow="1" w:lastColumn="0" w:lastRow="0" w:noHBand="0" w:noVBand="1" w:val="04A0"/>
+        <w:tblInd w:w="120" w:type="dxa"/>
+        <w:tblBorders>
+          <w:top w:val="single" w:sz="4" w:space="0" w:color="CBD5E1"/>
+          <w:left w:val="single" w:sz="4" w:space="0" w:color="CBD5E1"/>
+          <w:bottom w:val="single" w:sz="4" w:space="0" w:color="CBD5E1"/>
+          <w:right w:val="single" w:sz="4" w:space="0" w:color="CBD5E1"/>
+          <w:insideH w:val="single" w:sz="4" w:space="0" w:color="CBD5E1"/>
+          <w:insideV w:val="single" w:sz="4" w:space="0" w:color="CBD5E1"/>
+        </w:tblBorders>
+      </w:tblPr>
+      <w:tblGrid>
+        <w:gridCol w:w="3120"/>
+        <w:gridCol w:w="3120"/>
+        <w:gridCol w:w="3120"/>
+      </w:tblGrid>
+      <w:tr>
+        <w:tc>
+          <w:tcPr>
+            <w:tcW w:type="dxa" w:w="2448"/>
+            <w:vAlign w:val="center"/>
+            <w:tcMar>
+              <w:top w:w="80" w:type="dxa"/>
+              <w:start w:w="120" w:type="dxa"/>
+              <w:bottom w:w="80" w:type="dxa"/>
+              <w:end w:w="120" w:type="dxa"/>
+            </w:tcMar>
+            <w:shd w:fill="E8EEF5"/>
+          </w:tcPr>
+          <w:p>
+            <w:pPr>
+              <w:spacing w:after="0"/>
+              <w:jc w:val="left"/>
+            </w:pPr>
+            <w:r>
+              <w:rPr>
+                <w:rFonts w:ascii="Arial" w:hAnsi="Arial" w:eastAsia="Arial"/>
+                <w:b/>
+                <w:color w:val="111827"/>
+                <w:sz w:val="17"/>
+              </w:rPr>
+              <w:t>Что человек пытается сделать</w:t>
+            </w:r>
+          </w:p>
+        </w:tc>
+        <w:tc>
+          <w:tcPr>
+            <w:tcW w:type="dxa" w:w="1440"/>
+            <w:vAlign w:val="center"/>
+            <w:tcMar>
+              <w:top w:w="80" w:type="dxa"/>
+              <w:start w:w="120" w:type="dxa"/>
+              <w:bottom w:w="80" w:type="dxa"/>
+              <w:end w:w="120" w:type="dxa"/>
+            </w:tcMar>
+            <w:shd w:fill="E8EEF5"/>
+          </w:tcPr>
+          <w:p>
+            <w:pPr>
+              <w:spacing w:after="0"/>
+              <w:jc w:val="left"/>
+            </w:pPr>
+            <w:r>
+              <w:rPr>
+                <w:rFonts w:ascii="Arial" w:hAnsi="Arial" w:eastAsia="Arial"/>
+                <w:b/>
+                <w:color w:val="111827"/>
+                <w:sz w:val="17"/>
+              </w:rPr>
+              <w:t>Сигналов</w:t>
+            </w:r>
+          </w:p>
+        </w:tc>
+        <w:tc>
+          <w:tcPr>
+            <w:tcW w:type="dxa" w:w="5472"/>
+            <w:vAlign w:val="center"/>
+            <w:tcMar>
+              <w:top w:w="80" w:type="dxa"/>
+              <w:start w:w="120" w:type="dxa"/>
+              <w:bottom w:w="80" w:type="dxa"/>
+              <w:end w:w="120" w:type="dxa"/>
+            </w:tcMar>
+            <w:shd w:fill="E8EEF5"/>
+          </w:tcPr>
+          <w:p>
+            <w:pPr>
+              <w:spacing w:after="0"/>
+              <w:jc w:val="left"/>
+            </w:pPr>
+            <w:r>
+              <w:rPr>
+                <w:rFonts w:ascii="Arial" w:hAnsi="Arial" w:eastAsia="Arial"/>
+                <w:b/>
+                <w:color w:val="111827"/>
+                <w:sz w:val="17"/>
+              </w:rPr>
+              <w:t>Как это влияет на продукт</w:t>
+            </w:r>
+          </w:p>
+        </w:tc>
+      </w:tr>
+      <w:tr>
+        <w:tc>
+          <w:tcPr>
+            <w:tcW w:type="dxa" w:w="2448"/>
+            <w:vAlign w:val="center"/>
+            <w:tcMar>
+              <w:top w:w="80" w:type="dxa"/>
+              <w:start w:w="120" w:type="dxa"/>
+              <w:bottom w:w="80" w:type="dxa"/>
+              <w:end w:w="120" w:type="dxa"/>
+            </w:tcMar>
+          </w:tcPr>
+          <w:p>
+            <w:pPr>
+              <w:spacing w:after="0"/>
+              <w:jc w:val="left"/>
+            </w:pPr>
+            <w:r>
+              <w:rPr>
+                <w:rFonts w:ascii="Arial" w:hAnsi="Arial" w:eastAsia="Arial"/>
+                <w:b w:val="0"/>
+                <w:color w:val="111827"/>
+                <w:sz w:val="17"/>
+              </w:rPr>
+              <w:t>получить ежедневный якорь</w:t>
+            </w:r>
+          </w:p>
+        </w:tc>
+        <w:tc>
+          <w:tcPr>
+            <w:tcW w:type="dxa" w:w="1440"/>
+            <w:vAlign w:val="center"/>
+            <w:tcMar>
+              <w:top w:w="80" w:type="dxa"/>
+              <w:start w:w="120" w:type="dxa"/>
+              <w:bottom w:w="80" w:type="dxa"/>
+              <w:end w:w="120" w:type="dxa"/>
+            </w:tcMar>
+          </w:tcPr>
+          <w:p>
+            <w:pPr>
+              <w:spacing w:after="0"/>
+              <w:jc w:val="left"/>
+            </w:pPr>
+            <w:r>
+              <w:rPr>
+                <w:rFonts w:ascii="Arial" w:hAnsi="Arial" w:eastAsia="Arial"/>
+                <w:b w:val="0"/>
+                <w:color w:val="111827"/>
+                <w:sz w:val="17"/>
+              </w:rPr>
+              <w:t>143</w:t>
+            </w:r>
+          </w:p>
+        </w:tc>
+        <w:tc>
+          <w:tcPr>
+            <w:tcW w:type="dxa" w:w="5472"/>
+            <w:vAlign w:val="center"/>
+            <w:tcMar>
+              <w:top w:w="80" w:type="dxa"/>
+              <w:start w:w="120" w:type="dxa"/>
+              <w:bottom w:w="80" w:type="dxa"/>
+              <w:end w:w="120" w:type="dxa"/>
+            </w:tcMar>
+          </w:tcPr>
+          <w:p>
+            <w:pPr>
+              <w:spacing w:after="0"/>
+              <w:jc w:val="left"/>
+            </w:pPr>
+            <w:r>
+              <w:rPr>
+                <w:rFonts w:ascii="Arial" w:hAnsi="Arial" w:eastAsia="Arial"/>
+                <w:b w:val="0"/>
+                <w:color w:val="111827"/>
+                <w:sz w:val="17"/>
+              </w:rPr>
+              <w:t>продукт должен быть коротким ежедневным ритуалом, а не тяжелой системой.</w:t>
+            </w:r>
+          </w:p>
+        </w:tc>
+      </w:tr>
+      <w:tr>
+        <w:tc>
+          <w:tcPr>
+            <w:tcW w:type="dxa" w:w="2448"/>
+            <w:vAlign w:val="center"/>
+            <w:tcMar>
+              <w:top w:w="80" w:type="dxa"/>
+              <w:start w:w="120" w:type="dxa"/>
+              <w:bottom w:w="80" w:type="dxa"/>
+              <w:end w:w="120" w:type="dxa"/>
+            </w:tcMar>
+            <w:shd w:fill="F8FAFC"/>
+          </w:tcPr>
+          <w:p>
+            <w:pPr>
+              <w:spacing w:after="0"/>
+              <w:jc w:val="left"/>
+            </w:pPr>
+            <w:r>
+              <w:rPr>
+                <w:rFonts w:ascii="Arial" w:hAnsi="Arial" w:eastAsia="Arial"/>
+                <w:b w:val="0"/>
+                <w:color w:val="111827"/>
+                <w:sz w:val="17"/>
+              </w:rPr>
+              <w:t>структурировать саморазвитие</w:t>
+            </w:r>
+          </w:p>
+        </w:tc>
+        <w:tc>
+          <w:tcPr>
+            <w:tcW w:type="dxa" w:w="1440"/>
+            <w:vAlign w:val="center"/>
+            <w:tcMar>
+              <w:top w:w="80" w:type="dxa"/>
+              <w:start w:w="120" w:type="dxa"/>
+              <w:bottom w:w="80" w:type="dxa"/>
+              <w:end w:w="120" w:type="dxa"/>
+            </w:tcMar>
+            <w:shd w:fill="F8FAFC"/>
+          </w:tcPr>
+          <w:p>
+            <w:pPr>
+              <w:spacing w:after="0"/>
+              <w:jc w:val="left"/>
+            </w:pPr>
+            <w:r>
+              <w:rPr>
+                <w:rFonts w:ascii="Arial" w:hAnsi="Arial" w:eastAsia="Arial"/>
+                <w:b w:val="0"/>
+                <w:color w:val="111827"/>
+                <w:sz w:val="17"/>
+              </w:rPr>
+              <w:t>119</w:t>
+            </w:r>
+          </w:p>
+        </w:tc>
+        <w:tc>
+          <w:tcPr>
+            <w:tcW w:type="dxa" w:w="5472"/>
+            <w:vAlign w:val="center"/>
+            <w:tcMar>
+              <w:top w:w="80" w:type="dxa"/>
+              <w:start w:w="120" w:type="dxa"/>
+              <w:bottom w:w="80" w:type="dxa"/>
+              <w:end w:w="120" w:type="dxa"/>
+            </w:tcMar>
+            <w:shd w:fill="F8FAFC"/>
+          </w:tcPr>
+          <w:p>
+            <w:pPr>
+              <w:spacing w:after="0"/>
+              <w:jc w:val="left"/>
+            </w:pPr>
+            <w:r>
+              <w:rPr>
+                <w:rFonts w:ascii="Arial" w:hAnsi="Arial" w:eastAsia="Arial"/>
+                <w:b w:val="0"/>
+                <w:color w:val="111827"/>
+                <w:sz w:val="17"/>
+              </w:rPr>
+              <w:t>это поведенческая задача, которую уже закрывают соседние продукты.</w:t>
+            </w:r>
+          </w:p>
+        </w:tc>
+      </w:tr>
+      <w:tr>
+        <w:tc>
+          <w:tcPr>
+            <w:tcW w:type="dxa" w:w="2448"/>
+            <w:vAlign w:val="center"/>
+            <w:tcMar>
+              <w:top w:w="80" w:type="dxa"/>
+              <w:start w:w="120" w:type="dxa"/>
+              <w:bottom w:w="80" w:type="dxa"/>
+              <w:end w:w="120" w:type="dxa"/>
+            </w:tcMar>
+          </w:tcPr>
+          <w:p>
+            <w:pPr>
+              <w:spacing w:after="0"/>
+              <w:jc w:val="left"/>
+            </w:pPr>
+            <w:r>
+              <w:rPr>
+                <w:rFonts w:ascii="Arial" w:hAnsi="Arial" w:eastAsia="Arial"/>
+                <w:b w:val="0"/>
+                <w:color w:val="111827"/>
+                <w:sz w:val="17"/>
+              </w:rPr>
+              <w:t>сделать рост видимым</w:t>
+            </w:r>
+          </w:p>
+        </w:tc>
+        <w:tc>
+          <w:tcPr>
+            <w:tcW w:type="dxa" w:w="1440"/>
+            <w:vAlign w:val="center"/>
+            <w:tcMar>
+              <w:top w:w="80" w:type="dxa"/>
+              <w:start w:w="120" w:type="dxa"/>
+              <w:bottom w:w="80" w:type="dxa"/>
+              <w:end w:w="120" w:type="dxa"/>
+            </w:tcMar>
+          </w:tcPr>
+          <w:p>
+            <w:pPr>
+              <w:spacing w:after="0"/>
+              <w:jc w:val="left"/>
+            </w:pPr>
+            <w:r>
+              <w:rPr>
+                <w:rFonts w:ascii="Arial" w:hAnsi="Arial" w:eastAsia="Arial"/>
+                <w:b w:val="0"/>
+                <w:color w:val="111827"/>
+                <w:sz w:val="17"/>
+              </w:rPr>
+              <w:t>70</w:t>
+            </w:r>
+          </w:p>
+        </w:tc>
+        <w:tc>
+          <w:tcPr>
+            <w:tcW w:type="dxa" w:w="5472"/>
+            <w:vAlign w:val="center"/>
+            <w:tcMar>
+              <w:top w:w="80" w:type="dxa"/>
+              <w:start w:w="120" w:type="dxa"/>
+              <w:bottom w:w="80" w:type="dxa"/>
+              <w:end w:w="120" w:type="dxa"/>
+            </w:tcMar>
+          </w:tcPr>
+          <w:p>
+            <w:pPr>
+              <w:spacing w:after="0"/>
+              <w:jc w:val="left"/>
+            </w:pPr>
+            <w:r>
+              <w:rPr>
+                <w:rFonts w:ascii="Arial" w:hAnsi="Arial" w:eastAsia="Arial"/>
+                <w:b w:val="0"/>
+                <w:color w:val="111827"/>
+                <w:sz w:val="17"/>
+              </w:rPr>
+              <w:t>главный мост к avatar-механике: человек хочет видеть, что движение произошло.</w:t>
+            </w:r>
+          </w:p>
+        </w:tc>
+      </w:tr>
+      <w:tr>
+        <w:tc>
+          <w:tcPr>
+            <w:tcW w:type="dxa" w:w="2448"/>
+            <w:vAlign w:val="center"/>
+            <w:tcMar>
+              <w:top w:w="80" w:type="dxa"/>
+              <w:start w:w="120" w:type="dxa"/>
+              <w:bottom w:w="80" w:type="dxa"/>
+              <w:end w:w="120" w:type="dxa"/>
+            </w:tcMar>
+            <w:shd w:fill="F8FAFC"/>
+          </w:tcPr>
+          <w:p>
+            <w:pPr>
+              <w:spacing w:after="0"/>
+              <w:jc w:val="left"/>
+            </w:pPr>
+            <w:r>
+              <w:rPr>
+                <w:rFonts w:ascii="Arial" w:hAnsi="Arial" w:eastAsia="Arial"/>
+                <w:b w:val="0"/>
+                <w:color w:val="111827"/>
+                <w:sz w:val="17"/>
+              </w:rPr>
+              <w:t>чувствовать поддержку и ответственность</w:t>
+            </w:r>
+          </w:p>
+        </w:tc>
+        <w:tc>
+          <w:tcPr>
+            <w:tcW w:type="dxa" w:w="1440"/>
+            <w:vAlign w:val="center"/>
+            <w:tcMar>
+              <w:top w:w="80" w:type="dxa"/>
+              <w:start w:w="120" w:type="dxa"/>
+              <w:bottom w:w="80" w:type="dxa"/>
+              <w:end w:w="120" w:type="dxa"/>
+            </w:tcMar>
+            <w:shd w:fill="F8FAFC"/>
+          </w:tcPr>
+          <w:p>
+            <w:pPr>
+              <w:spacing w:after="0"/>
+              <w:jc w:val="left"/>
+            </w:pPr>
+            <w:r>
+              <w:rPr>
+                <w:rFonts w:ascii="Arial" w:hAnsi="Arial" w:eastAsia="Arial"/>
+                <w:b w:val="0"/>
+                <w:color w:val="111827"/>
+                <w:sz w:val="17"/>
+              </w:rPr>
+              <w:t>42</w:t>
+            </w:r>
+          </w:p>
+        </w:tc>
+        <w:tc>
+          <w:tcPr>
+            <w:tcW w:type="dxa" w:w="5472"/>
+            <w:vAlign w:val="center"/>
+            <w:tcMar>
+              <w:top w:w="80" w:type="dxa"/>
+              <w:start w:w="120" w:type="dxa"/>
+              <w:bottom w:w="80" w:type="dxa"/>
+              <w:end w:w="120" w:type="dxa"/>
+            </w:tcMar>
+            <w:shd w:fill="F8FAFC"/>
+          </w:tcPr>
+          <w:p>
+            <w:pPr>
+              <w:spacing w:after="0"/>
+              <w:jc w:val="left"/>
+            </w:pPr>
+            <w:r>
+              <w:rPr>
+                <w:rFonts w:ascii="Arial" w:hAnsi="Arial" w:eastAsia="Arial"/>
+                <w:b w:val="0"/>
+                <w:color w:val="111827"/>
+                <w:sz w:val="17"/>
+              </w:rPr>
+              <w:t>это поведенческая задача, которую уже закрывают соседние продукты.</w:t>
+            </w:r>
+          </w:p>
+        </w:tc>
+      </w:tr>
+      <w:tr>
+        <w:tc>
+          <w:tcPr>
+            <w:tcW w:type="dxa" w:w="2448"/>
+            <w:vAlign w:val="center"/>
+            <w:tcMar>
+              <w:top w:w="80" w:type="dxa"/>
+              <w:start w:w="120" w:type="dxa"/>
+              <w:bottom w:w="80" w:type="dxa"/>
+              <w:end w:w="120" w:type="dxa"/>
+            </w:tcMar>
+          </w:tcPr>
+          <w:p>
+            <w:pPr>
+              <w:spacing w:after="0"/>
+              <w:jc w:val="left"/>
+            </w:pPr>
+            <w:r>
+              <w:rPr>
+                <w:rFonts w:ascii="Arial" w:hAnsi="Arial" w:eastAsia="Arial"/>
+                <w:b w:val="0"/>
+                <w:color w:val="111827"/>
+                <w:sz w:val="17"/>
+              </w:rPr>
+              <w:t>быстро эмоционально перезагрузиться</w:t>
+            </w:r>
+          </w:p>
+        </w:tc>
+        <w:tc>
+          <w:tcPr>
+            <w:tcW w:type="dxa" w:w="1440"/>
+            <w:vAlign w:val="center"/>
+            <w:tcMar>
+              <w:top w:w="80" w:type="dxa"/>
+              <w:start w:w="120" w:type="dxa"/>
+              <w:bottom w:w="80" w:type="dxa"/>
+              <w:end w:w="120" w:type="dxa"/>
+            </w:tcMar>
+          </w:tcPr>
+          <w:p>
+            <w:pPr>
+              <w:spacing w:after="0"/>
+              <w:jc w:val="left"/>
+            </w:pPr>
+            <w:r>
+              <w:rPr>
+                <w:rFonts w:ascii="Arial" w:hAnsi="Arial" w:eastAsia="Arial"/>
+                <w:b w:val="0"/>
+                <w:color w:val="111827"/>
+                <w:sz w:val="17"/>
+              </w:rPr>
+              <w:t>15</w:t>
+            </w:r>
+          </w:p>
+        </w:tc>
+        <w:tc>
+          <w:tcPr>
+            <w:tcW w:type="dxa" w:w="5472"/>
+            <w:vAlign w:val="center"/>
+            <w:tcMar>
+              <w:top w:w="80" w:type="dxa"/>
+              <w:start w:w="120" w:type="dxa"/>
+              <w:bottom w:w="80" w:type="dxa"/>
+              <w:end w:w="120" w:type="dxa"/>
+            </w:tcMar>
+          </w:tcPr>
+          <w:p>
+            <w:pPr>
+              <w:spacing w:after="0"/>
+              <w:jc w:val="left"/>
+            </w:pPr>
+            <w:r>
+              <w:rPr>
+                <w:rFonts w:ascii="Arial" w:hAnsi="Arial" w:eastAsia="Arial"/>
+                <w:b w:val="0"/>
+                <w:color w:val="111827"/>
+                <w:sz w:val="17"/>
+              </w:rPr>
+              <w:t>это поведенческая задача, которую уже закрывают соседние продукты.</w:t>
+            </w:r>
+          </w:p>
+        </w:tc>
+      </w:tr>
+      <w:tr>
+        <w:tc>
+          <w:tcPr>
+            <w:tcW w:type="dxa" w:w="2448"/>
+            <w:vAlign w:val="center"/>
+            <w:tcMar>
+              <w:top w:w="80" w:type="dxa"/>
+              <w:start w:w="120" w:type="dxa"/>
+              <w:bottom w:w="80" w:type="dxa"/>
+              <w:end w:w="120" w:type="dxa"/>
+            </w:tcMar>
+            <w:shd w:fill="F8FAFC"/>
+          </w:tcPr>
+          <w:p>
+            <w:pPr>
+              <w:spacing w:after="0"/>
+              <w:jc w:val="left"/>
+            </w:pPr>
+            <w:r>
+              <w:rPr>
+                <w:rFonts w:ascii="Arial" w:hAnsi="Arial" w:eastAsia="Arial"/>
+                <w:b w:val="0"/>
+                <w:color w:val="111827"/>
+                <w:sz w:val="17"/>
+              </w:rPr>
+              <w:t>почувствовать, что продукт видит именно меня</w:t>
+            </w:r>
+          </w:p>
+        </w:tc>
+        <w:tc>
+          <w:tcPr>
+            <w:tcW w:type="dxa" w:w="1440"/>
+            <w:vAlign w:val="center"/>
+            <w:tcMar>
+              <w:top w:w="80" w:type="dxa"/>
+              <w:start w:w="120" w:type="dxa"/>
+              <w:bottom w:w="80" w:type="dxa"/>
+              <w:end w:w="120" w:type="dxa"/>
+            </w:tcMar>
+            <w:shd w:fill="F8FAFC"/>
+          </w:tcPr>
+          <w:p>
+            <w:pPr>
+              <w:spacing w:after="0"/>
+              <w:jc w:val="left"/>
+            </w:pPr>
+            <w:r>
+              <w:rPr>
+                <w:rFonts w:ascii="Arial" w:hAnsi="Arial" w:eastAsia="Arial"/>
+                <w:b w:val="0"/>
+                <w:color w:val="111827"/>
+                <w:sz w:val="17"/>
+              </w:rPr>
+              <w:t>5</w:t>
+            </w:r>
+          </w:p>
+        </w:tc>
+        <w:tc>
+          <w:tcPr>
+            <w:tcW w:type="dxa" w:w="5472"/>
+            <w:vAlign w:val="center"/>
+            <w:tcMar>
+              <w:top w:w="80" w:type="dxa"/>
+              <w:start w:w="120" w:type="dxa"/>
+              <w:bottom w:w="80" w:type="dxa"/>
+              <w:end w:w="120" w:type="dxa"/>
+            </w:tcMar>
+            <w:shd w:fill="F8FAFC"/>
+          </w:tcPr>
+          <w:p>
+            <w:pPr>
+              <w:spacing w:after="0"/>
+              <w:jc w:val="left"/>
+            </w:pPr>
+            <w:r>
+              <w:rPr>
+                <w:rFonts w:ascii="Arial" w:hAnsi="Arial" w:eastAsia="Arial"/>
+                <w:b w:val="0"/>
+                <w:color w:val="111827"/>
+                <w:sz w:val="17"/>
+              </w:rPr>
+              <w:t>персонализация должна ощущаться точной, но не предсказательной и не небезопасной.</w:t>
+            </w:r>
+          </w:p>
+        </w:tc>
+      </w:tr>
+    </w:tbl>
+    <w:p/>
+    <w:tbl>
+      <w:tblPr>
+        <w:tblW w:type="dxa" w:w="9360"/>
+        <w:jc w:val="left"/>
+        <w:tblLayout w:type="fixed"/>
+        <w:tblLook w:firstColumn="1" w:firstRow="1" w:lastColumn="0" w:lastRow="0" w:noHBand="0" w:noVBand="1" w:val="04A0"/>
+        <w:tblInd w:w="120" w:type="dxa"/>
+        <w:tblBorders>
+          <w:top w:val="single" w:sz="4" w:space="0" w:color="CBD5E1"/>
+          <w:left w:val="single" w:sz="4" w:space="0" w:color="CBD5E1"/>
+          <w:bottom w:val="single" w:sz="4" w:space="0" w:color="CBD5E1"/>
+          <w:right w:val="single" w:sz="4" w:space="0" w:color="CBD5E1"/>
+          <w:insideH w:val="single" w:sz="4" w:space="0" w:color="CBD5E1"/>
+          <w:insideV w:val="single" w:sz="4" w:space="0" w:color="CBD5E1"/>
+        </w:tblBorders>
+      </w:tblPr>
+      <w:tblGrid>
+        <w:gridCol w:w="3120"/>
+        <w:gridCol w:w="3120"/>
+        <w:gridCol w:w="3120"/>
+      </w:tblGrid>
+      <w:tr>
+        <w:tc>
+          <w:tcPr>
+            <w:tcW w:type="dxa" w:w="2448"/>
+            <w:vAlign w:val="center"/>
+            <w:tcMar>
+              <w:top w:w="80" w:type="dxa"/>
+              <w:start w:w="120" w:type="dxa"/>
+              <w:bottom w:w="80" w:type="dxa"/>
+              <w:end w:w="120" w:type="dxa"/>
+            </w:tcMar>
+            <w:shd w:fill="E8EEF5"/>
+          </w:tcPr>
+          <w:p>
+            <w:pPr>
+              <w:spacing w:after="0"/>
+              <w:jc w:val="left"/>
+            </w:pPr>
+            <w:r>
+              <w:rPr>
+                <w:rFonts w:ascii="Arial" w:hAnsi="Arial" w:eastAsia="Arial"/>
+                <w:b/>
+                <w:color w:val="111827"/>
+                <w:sz w:val="17"/>
+              </w:rPr>
+              <w:t>Что раздражает или ломает опыт</w:t>
+            </w:r>
+          </w:p>
+        </w:tc>
+        <w:tc>
+          <w:tcPr>
+            <w:tcW w:type="dxa" w:w="1440"/>
+            <w:vAlign w:val="center"/>
+            <w:tcMar>
+              <w:top w:w="80" w:type="dxa"/>
+              <w:start w:w="120" w:type="dxa"/>
+              <w:bottom w:w="80" w:type="dxa"/>
+              <w:end w:w="120" w:type="dxa"/>
+            </w:tcMar>
+            <w:shd w:fill="E8EEF5"/>
+          </w:tcPr>
+          <w:p>
+            <w:pPr>
+              <w:spacing w:after="0"/>
+              <w:jc w:val="left"/>
+            </w:pPr>
+            <w:r>
+              <w:rPr>
+                <w:rFonts w:ascii="Arial" w:hAnsi="Arial" w:eastAsia="Arial"/>
+                <w:b/>
+                <w:color w:val="111827"/>
+                <w:sz w:val="17"/>
+              </w:rPr>
+              <w:t>Сигналов</w:t>
+            </w:r>
+          </w:p>
+        </w:tc>
+        <w:tc>
+          <w:tcPr>
+            <w:tcW w:type="dxa" w:w="5472"/>
+            <w:vAlign w:val="center"/>
+            <w:tcMar>
+              <w:top w:w="80" w:type="dxa"/>
+              <w:start w:w="120" w:type="dxa"/>
+              <w:bottom w:w="80" w:type="dxa"/>
+              <w:end w:w="120" w:type="dxa"/>
+            </w:tcMar>
+            <w:shd w:fill="E8EEF5"/>
+          </w:tcPr>
+          <w:p>
+            <w:pPr>
+              <w:spacing w:after="0"/>
+              <w:jc w:val="left"/>
+            </w:pPr>
+            <w:r>
+              <w:rPr>
+                <w:rFonts w:ascii="Arial" w:hAnsi="Arial" w:eastAsia="Arial"/>
+                <w:b/>
+                <w:color w:val="111827"/>
+                <w:sz w:val="17"/>
+              </w:rPr>
+              <w:t>Что нельзя повторить в АУРЕ</w:t>
+            </w:r>
+          </w:p>
+        </w:tc>
+      </w:tr>
+      <w:tr>
+        <w:tc>
+          <w:tcPr>
+            <w:tcW w:type="dxa" w:w="2448"/>
+            <w:vAlign w:val="center"/>
+            <w:tcMar>
+              <w:top w:w="80" w:type="dxa"/>
+              <w:start w:w="120" w:type="dxa"/>
+              <w:bottom w:w="80" w:type="dxa"/>
+              <w:end w:w="120" w:type="dxa"/>
+            </w:tcMar>
+          </w:tcPr>
+          <w:p>
+            <w:pPr>
+              <w:spacing w:after="0"/>
+              <w:jc w:val="left"/>
+            </w:pPr>
+            <w:r>
+              <w:rPr>
+                <w:rFonts w:ascii="Arial" w:hAnsi="Arial" w:eastAsia="Arial"/>
+                <w:b w:val="0"/>
+                <w:color w:val="111827"/>
+                <w:sz w:val="17"/>
+              </w:rPr>
+              <w:t>не хватает глубины и кастомизации</w:t>
+            </w:r>
+          </w:p>
+        </w:tc>
+        <w:tc>
+          <w:tcPr>
+            <w:tcW w:type="dxa" w:w="1440"/>
+            <w:vAlign w:val="center"/>
+            <w:tcMar>
+              <w:top w:w="80" w:type="dxa"/>
+              <w:start w:w="120" w:type="dxa"/>
+              <w:bottom w:w="80" w:type="dxa"/>
+              <w:end w:w="120" w:type="dxa"/>
+            </w:tcMar>
+          </w:tcPr>
+          <w:p>
+            <w:pPr>
+              <w:spacing w:after="0"/>
+              <w:jc w:val="left"/>
+            </w:pPr>
+            <w:r>
+              <w:rPr>
+                <w:rFonts w:ascii="Arial" w:hAnsi="Arial" w:eastAsia="Arial"/>
+                <w:b w:val="0"/>
+                <w:color w:val="111827"/>
+                <w:sz w:val="17"/>
+              </w:rPr>
+              <w:t>160</w:t>
+            </w:r>
+          </w:p>
+        </w:tc>
+        <w:tc>
+          <w:tcPr>
+            <w:tcW w:type="dxa" w:w="5472"/>
+            <w:vAlign w:val="center"/>
+            <w:tcMar>
+              <w:top w:w="80" w:type="dxa"/>
+              <w:start w:w="120" w:type="dxa"/>
+              <w:bottom w:w="80" w:type="dxa"/>
+              <w:end w:w="120" w:type="dxa"/>
+            </w:tcMar>
+          </w:tcPr>
+          <w:p>
+            <w:pPr>
+              <w:spacing w:after="0"/>
+              <w:jc w:val="left"/>
+            </w:pPr>
+            <w:r>
+              <w:rPr>
+                <w:rFonts w:ascii="Arial" w:hAnsi="Arial" w:eastAsia="Arial"/>
+                <w:b w:val="0"/>
+                <w:color w:val="111827"/>
+                <w:sz w:val="17"/>
+              </w:rPr>
+              <w:t>это риск, который должен быть учтен в MVP и первых интервью.</w:t>
+            </w:r>
+          </w:p>
+        </w:tc>
+      </w:tr>
+      <w:tr>
+        <w:tc>
+          <w:tcPr>
+            <w:tcW w:type="dxa" w:w="2448"/>
+            <w:vAlign w:val="center"/>
+            <w:tcMar>
+              <w:top w:w="80" w:type="dxa"/>
+              <w:start w:w="120" w:type="dxa"/>
+              <w:bottom w:w="80" w:type="dxa"/>
+              <w:end w:w="120" w:type="dxa"/>
+            </w:tcMar>
+            <w:shd w:fill="F8FAFC"/>
+          </w:tcPr>
+          <w:p>
+            <w:pPr>
+              <w:spacing w:after="0"/>
+              <w:jc w:val="left"/>
+            </w:pPr>
+            <w:r>
+              <w:rPr>
+                <w:rFonts w:ascii="Arial" w:hAnsi="Arial" w:eastAsia="Arial"/>
+                <w:b w:val="0"/>
+                <w:color w:val="111827"/>
+                <w:sz w:val="17"/>
+              </w:rPr>
+              <w:t>подписка не кажется достаточно ценной</w:t>
+            </w:r>
+          </w:p>
+        </w:tc>
+        <w:tc>
+          <w:tcPr>
+            <w:tcW w:type="dxa" w:w="1440"/>
+            <w:vAlign w:val="center"/>
+            <w:tcMar>
+              <w:top w:w="80" w:type="dxa"/>
+              <w:start w:w="120" w:type="dxa"/>
+              <w:bottom w:w="80" w:type="dxa"/>
+              <w:end w:w="120" w:type="dxa"/>
+            </w:tcMar>
+            <w:shd w:fill="F8FAFC"/>
+          </w:tcPr>
+          <w:p>
+            <w:pPr>
+              <w:spacing w:after="0"/>
+              <w:jc w:val="left"/>
+            </w:pPr>
+            <w:r>
+              <w:rPr>
+                <w:rFonts w:ascii="Arial" w:hAnsi="Arial" w:eastAsia="Arial"/>
+                <w:b w:val="0"/>
+                <w:color w:val="111827"/>
+                <w:sz w:val="17"/>
+              </w:rPr>
+              <w:t>100</w:t>
+            </w:r>
+          </w:p>
+        </w:tc>
+        <w:tc>
+          <w:tcPr>
+            <w:tcW w:type="dxa" w:w="5472"/>
+            <w:vAlign w:val="center"/>
+            <w:tcMar>
+              <w:top w:w="80" w:type="dxa"/>
+              <w:start w:w="120" w:type="dxa"/>
+              <w:bottom w:w="80" w:type="dxa"/>
+              <w:end w:w="120" w:type="dxa"/>
+            </w:tcMar>
+            <w:shd w:fill="F8FAFC"/>
+          </w:tcPr>
+          <w:p>
+            <w:pPr>
+              <w:spacing w:after="0"/>
+              <w:jc w:val="left"/>
+            </w:pPr>
+            <w:r>
+              <w:rPr>
+                <w:rFonts w:ascii="Arial" w:hAnsi="Arial" w:eastAsia="Arial"/>
+                <w:b w:val="0"/>
+                <w:color w:val="111827"/>
+                <w:sz w:val="17"/>
+              </w:rPr>
+              <w:t>подписка должна продавать глубину после понятной бесплатной петли.</w:t>
+            </w:r>
+          </w:p>
+        </w:tc>
+      </w:tr>
+      <w:tr>
+        <w:tc>
+          <w:tcPr>
+            <w:tcW w:type="dxa" w:w="2448"/>
+            <w:vAlign w:val="center"/>
+            <w:tcMar>
+              <w:top w:w="80" w:type="dxa"/>
+              <w:start w:w="120" w:type="dxa"/>
+              <w:bottom w:w="80" w:type="dxa"/>
+              <w:end w:w="120" w:type="dxa"/>
+            </w:tcMar>
+          </w:tcPr>
+          <w:p>
+            <w:pPr>
+              <w:spacing w:after="0"/>
+              <w:jc w:val="left"/>
+            </w:pPr>
+            <w:r>
+              <w:rPr>
+                <w:rFonts w:ascii="Arial" w:hAnsi="Arial" w:eastAsia="Arial"/>
+                <w:b w:val="0"/>
+                <w:color w:val="111827"/>
+                <w:sz w:val="17"/>
+              </w:rPr>
+              <w:t>вход и доступ создают трение</w:t>
+            </w:r>
+          </w:p>
+        </w:tc>
+        <w:tc>
+          <w:tcPr>
+            <w:tcW w:type="dxa" w:w="1440"/>
+            <w:vAlign w:val="center"/>
+            <w:tcMar>
+              <w:top w:w="80" w:type="dxa"/>
+              <w:start w:w="120" w:type="dxa"/>
+              <w:bottom w:w="80" w:type="dxa"/>
+              <w:end w:w="120" w:type="dxa"/>
+            </w:tcMar>
+          </w:tcPr>
+          <w:p>
+            <w:pPr>
+              <w:spacing w:after="0"/>
+              <w:jc w:val="left"/>
+            </w:pPr>
+            <w:r>
+              <w:rPr>
+                <w:rFonts w:ascii="Arial" w:hAnsi="Arial" w:eastAsia="Arial"/>
+                <w:b w:val="0"/>
+                <w:color w:val="111827"/>
+                <w:sz w:val="17"/>
+              </w:rPr>
+              <w:t>45</w:t>
+            </w:r>
+          </w:p>
+        </w:tc>
+        <w:tc>
+          <w:tcPr>
+            <w:tcW w:type="dxa" w:w="5472"/>
+            <w:vAlign w:val="center"/>
+            <w:tcMar>
+              <w:top w:w="80" w:type="dxa"/>
+              <w:start w:w="120" w:type="dxa"/>
+              <w:bottom w:w="80" w:type="dxa"/>
+              <w:end w:w="120" w:type="dxa"/>
+            </w:tcMar>
+          </w:tcPr>
+          <w:p>
+            <w:pPr>
+              <w:spacing w:after="0"/>
+              <w:jc w:val="left"/>
+            </w:pPr>
+            <w:r>
+              <w:rPr>
+                <w:rFonts w:ascii="Arial" w:hAnsi="Arial" w:eastAsia="Arial"/>
+                <w:b w:val="0"/>
+                <w:color w:val="111827"/>
+                <w:sz w:val="17"/>
+              </w:rPr>
+              <w:t>это риск, который должен быть учтен в MVP и первых интервью.</w:t>
+            </w:r>
+          </w:p>
+        </w:tc>
+      </w:tr>
+      <w:tr>
+        <w:tc>
+          <w:tcPr>
+            <w:tcW w:type="dxa" w:w="2448"/>
+            <w:vAlign w:val="center"/>
+            <w:tcMar>
+              <w:top w:w="80" w:type="dxa"/>
+              <w:start w:w="120" w:type="dxa"/>
+              <w:bottom w:w="80" w:type="dxa"/>
+              <w:end w:w="120" w:type="dxa"/>
+            </w:tcMar>
+            <w:shd w:fill="F8FAFC"/>
+          </w:tcPr>
+          <w:p>
+            <w:pPr>
+              <w:spacing w:after="0"/>
+              <w:jc w:val="left"/>
+            </w:pPr>
+            <w:r>
+              <w:rPr>
+                <w:rFonts w:ascii="Arial" w:hAnsi="Arial" w:eastAsia="Arial"/>
+                <w:b w:val="0"/>
+                <w:color w:val="111827"/>
+                <w:sz w:val="17"/>
+              </w:rPr>
+              <w:t>сбои ломают ежедневный ритуал</w:t>
+            </w:r>
+          </w:p>
+        </w:tc>
+        <w:tc>
+          <w:tcPr>
+            <w:tcW w:type="dxa" w:w="1440"/>
+            <w:vAlign w:val="center"/>
+            <w:tcMar>
+              <w:top w:w="80" w:type="dxa"/>
+              <w:start w:w="120" w:type="dxa"/>
+              <w:bottom w:w="80" w:type="dxa"/>
+              <w:end w:w="120" w:type="dxa"/>
+            </w:tcMar>
+            <w:shd w:fill="F8FAFC"/>
+          </w:tcPr>
+          <w:p>
+            <w:pPr>
+              <w:spacing w:after="0"/>
+              <w:jc w:val="left"/>
+            </w:pPr>
+            <w:r>
+              <w:rPr>
+                <w:rFonts w:ascii="Arial" w:hAnsi="Arial" w:eastAsia="Arial"/>
+                <w:b w:val="0"/>
+                <w:color w:val="111827"/>
+                <w:sz w:val="17"/>
+              </w:rPr>
+              <w:t>24</w:t>
+            </w:r>
+          </w:p>
+        </w:tc>
+        <w:tc>
+          <w:tcPr>
+            <w:tcW w:type="dxa" w:w="5472"/>
+            <w:vAlign w:val="center"/>
+            <w:tcMar>
+              <w:top w:w="80" w:type="dxa"/>
+              <w:start w:w="120" w:type="dxa"/>
+              <w:bottom w:w="80" w:type="dxa"/>
+              <w:end w:w="120" w:type="dxa"/>
+            </w:tcMar>
+            <w:shd w:fill="F8FAFC"/>
+          </w:tcPr>
+          <w:p>
+            <w:pPr>
+              <w:spacing w:after="0"/>
+              <w:jc w:val="left"/>
+            </w:pPr>
+            <w:r>
+              <w:rPr>
+                <w:rFonts w:ascii="Arial" w:hAnsi="Arial" w:eastAsia="Arial"/>
+                <w:b w:val="0"/>
+                <w:color w:val="111827"/>
+                <w:sz w:val="17"/>
+              </w:rPr>
+              <w:t>если ежедневный ритуал ломается технически, доверие к эмоциональному продукту падает сильнее.</w:t>
+            </w:r>
+          </w:p>
+        </w:tc>
+      </w:tr>
+      <w:tr>
+        <w:tc>
+          <w:tcPr>
+            <w:tcW w:type="dxa" w:w="2448"/>
+            <w:vAlign w:val="center"/>
+            <w:tcMar>
+              <w:top w:w="80" w:type="dxa"/>
+              <w:start w:w="120" w:type="dxa"/>
+              <w:bottom w:w="80" w:type="dxa"/>
+              <w:end w:w="120" w:type="dxa"/>
+            </w:tcMar>
+          </w:tcPr>
+          <w:p>
+            <w:pPr>
+              <w:spacing w:after="0"/>
+              <w:jc w:val="left"/>
+            </w:pPr>
+            <w:r>
+              <w:rPr>
+                <w:rFonts w:ascii="Arial" w:hAnsi="Arial" w:eastAsia="Arial"/>
+                <w:b w:val="0"/>
+                <w:color w:val="111827"/>
+                <w:sz w:val="17"/>
+              </w:rPr>
+              <w:t>есть риск доверия, точности и безопасности</w:t>
+            </w:r>
+          </w:p>
+        </w:tc>
+        <w:tc>
+          <w:tcPr>
+            <w:tcW w:type="dxa" w:w="1440"/>
+            <w:vAlign w:val="center"/>
+            <w:tcMar>
+              <w:top w:w="80" w:type="dxa"/>
+              <w:start w:w="120" w:type="dxa"/>
+              <w:bottom w:w="80" w:type="dxa"/>
+              <w:end w:w="120" w:type="dxa"/>
+            </w:tcMar>
+          </w:tcPr>
+          <w:p>
+            <w:pPr>
+              <w:spacing w:after="0"/>
+              <w:jc w:val="left"/>
+            </w:pPr>
+            <w:r>
+              <w:rPr>
+                <w:rFonts w:ascii="Arial" w:hAnsi="Arial" w:eastAsia="Arial"/>
+                <w:b w:val="0"/>
+                <w:color w:val="111827"/>
+                <w:sz w:val="17"/>
+              </w:rPr>
+              <w:t>20</w:t>
+            </w:r>
+          </w:p>
+        </w:tc>
+        <w:tc>
+          <w:tcPr>
+            <w:tcW w:type="dxa" w:w="5472"/>
+            <w:vAlign w:val="center"/>
+            <w:tcMar>
+              <w:top w:w="80" w:type="dxa"/>
+              <w:start w:w="120" w:type="dxa"/>
+              <w:bottom w:w="80" w:type="dxa"/>
+              <w:end w:w="120" w:type="dxa"/>
+            </w:tcMar>
+          </w:tcPr>
+          <w:p>
+            <w:pPr>
+              <w:spacing w:after="0"/>
+              <w:jc w:val="left"/>
+            </w:pPr>
+            <w:r>
+              <w:rPr>
+                <w:rFonts w:ascii="Arial" w:hAnsi="Arial" w:eastAsia="Arial"/>
+                <w:b w:val="0"/>
+                <w:color w:val="111827"/>
+                <w:sz w:val="17"/>
+              </w:rPr>
+              <w:t>AI/spiritual/identity слой обязан иметь мягкие границы и не обещать лишнего.</w:t>
+            </w:r>
+          </w:p>
+        </w:tc>
+      </w:tr>
+    </w:tbl>
+    <w:p/>
+    <w:p>
+      <w:r>
+        <w:t>Практический вывод из этого слоя: пользователю мало получить “красивый инсайт”. Он должен увидеть, что инсайт превратился в действие, действие было достаточно маленьким, а результат стал видимым. Именно здесь avatar становится не украшением, а способом доказать пользователю изменение.</w:t>
+      </w:r>
+    </w:p>
+    <w:p>
+      <w:pPr>
+        <w:pStyle w:val="Heading2"/>
+      </w:pPr>
+      <w:r>
+        <w:t>Avatar / identity как центральная ставка</w:t>
+      </w:r>
+    </w:p>
+    <w:p>
+      <w:r>
+        <w:t>Avatar в АУРЕ должен быть не картинкой профиля и не косметической наградой. Его роль - визуализировать будущую версию пользователя и связывать ежедневные действия с видимым изменением. В конкурентных карточках регулярно встречаются обратная связь через avatar/progress, уровни, XP, streak, квесты, дневник и напоминания. Но главный вопрос остается открытым: меняется ли образ пользователя именно потому, что он сделал действие, или просто потому, что приложение хочет удержать его еще на день.</w:t>
+      </w:r>
+    </w:p>
+    <w:tbl>
+      <w:tblPr>
+        <w:tblW w:type="dxa" w:w="9360"/>
+        <w:jc w:val="left"/>
+        <w:tblLayout w:type="fixed"/>
+        <w:tblLook w:firstColumn="1" w:firstRow="1" w:lastColumn="0" w:lastRow="0" w:noHBand="0" w:noVBand="1" w:val="04A0"/>
+        <w:tblInd w:w="120" w:type="dxa"/>
+        <w:tblBorders>
+          <w:top w:val="single" w:sz="4" w:space="0" w:color="CBD5E1"/>
+          <w:left w:val="single" w:sz="4" w:space="0" w:color="CBD5E1"/>
+          <w:bottom w:val="single" w:sz="4" w:space="0" w:color="CBD5E1"/>
+          <w:right w:val="single" w:sz="4" w:space="0" w:color="CBD5E1"/>
+          <w:insideH w:val="single" w:sz="4" w:space="0" w:color="CBD5E1"/>
+          <w:insideV w:val="single" w:sz="4" w:space="0" w:color="CBD5E1"/>
+        </w:tblBorders>
+      </w:tblPr>
+      <w:tblGrid>
+        <w:gridCol w:w="2340"/>
+        <w:gridCol w:w="2340"/>
+        <w:gridCol w:w="2340"/>
+        <w:gridCol w:w="2340"/>
+      </w:tblGrid>
+      <w:tr>
+        <w:tc>
+          <w:tcPr>
+            <w:tcW w:type="dxa" w:w="2448"/>
+            <w:vAlign w:val="center"/>
+            <w:tcMar>
+              <w:top w:w="80" w:type="dxa"/>
+              <w:start w:w="120" w:type="dxa"/>
+              <w:bottom w:w="80" w:type="dxa"/>
+              <w:end w:w="120" w:type="dxa"/>
+            </w:tcMar>
+            <w:shd w:fill="E8EEF5"/>
+          </w:tcPr>
+          <w:p>
+            <w:pPr>
+              <w:spacing w:after="0"/>
+              <w:jc w:val="left"/>
+            </w:pPr>
+            <w:r>
+              <w:rPr>
+                <w:rFonts w:ascii="Arial" w:hAnsi="Arial" w:eastAsia="Arial"/>
+                <w:b/>
+                <w:color w:val="111827"/>
+                <w:sz w:val="17"/>
+              </w:rPr>
+              <w:t>Пример</w:t>
+            </w:r>
+          </w:p>
+        </w:tc>
+        <w:tc>
+          <w:tcPr>
+            <w:tcW w:type="dxa" w:w="1440"/>
+            <w:vAlign w:val="center"/>
+            <w:tcMar>
+              <w:top w:w="80" w:type="dxa"/>
+              <w:start w:w="120" w:type="dxa"/>
+              <w:bottom w:w="80" w:type="dxa"/>
+              <w:end w:w="120" w:type="dxa"/>
+            </w:tcMar>
+            <w:shd w:fill="E8EEF5"/>
+          </w:tcPr>
+          <w:p>
+            <w:pPr>
+              <w:spacing w:after="0"/>
+              <w:jc w:val="left"/>
+            </w:pPr>
+            <w:r>
+              <w:rPr>
+                <w:rFonts w:ascii="Arial" w:hAnsi="Arial" w:eastAsia="Arial"/>
+                <w:b/>
+                <w:color w:val="111827"/>
+                <w:sz w:val="17"/>
+              </w:rPr>
+              <w:t>Что видно в отзывах</w:t>
+            </w:r>
+          </w:p>
+        </w:tc>
+        <w:tc>
+          <w:tcPr>
+            <w:tcW w:type="dxa" w:w="2016"/>
+            <w:vAlign w:val="center"/>
+            <w:tcMar>
+              <w:top w:w="80" w:type="dxa"/>
+              <w:start w:w="120" w:type="dxa"/>
+              <w:bottom w:w="80" w:type="dxa"/>
+              <w:end w:w="120" w:type="dxa"/>
+            </w:tcMar>
+            <w:shd w:fill="E8EEF5"/>
+          </w:tcPr>
+          <w:p>
+            <w:pPr>
+              <w:spacing w:after="0"/>
+              <w:jc w:val="left"/>
+            </w:pPr>
+            <w:r>
+              <w:rPr>
+                <w:rFonts w:ascii="Arial" w:hAnsi="Arial" w:eastAsia="Arial"/>
+                <w:b/>
+                <w:color w:val="111827"/>
+                <w:sz w:val="17"/>
+              </w:rPr>
+              <w:t>Механики возврата</w:t>
+            </w:r>
+          </w:p>
+        </w:tc>
+        <w:tc>
+          <w:tcPr>
+            <w:tcW w:type="dxa" w:w="3456"/>
+            <w:vAlign w:val="center"/>
+            <w:tcMar>
+              <w:top w:w="80" w:type="dxa"/>
+              <w:start w:w="120" w:type="dxa"/>
+              <w:bottom w:w="80" w:type="dxa"/>
+              <w:end w:w="120" w:type="dxa"/>
+            </w:tcMar>
+            <w:shd w:fill="E8EEF5"/>
+          </w:tcPr>
+          <w:p>
+            <w:pPr>
+              <w:spacing w:after="0"/>
+              <w:jc w:val="left"/>
+            </w:pPr>
+            <w:r>
+              <w:rPr>
+                <w:rFonts w:ascii="Arial" w:hAnsi="Arial" w:eastAsia="Arial"/>
+                <w:b/>
+                <w:color w:val="111827"/>
+                <w:sz w:val="17"/>
+              </w:rPr>
+              <w:t>Вывод для АУРЫ</w:t>
+            </w:r>
+          </w:p>
+        </w:tc>
+      </w:tr>
+      <w:tr>
+        <w:tc>
+          <w:tcPr>
+            <w:tcW w:type="dxa" w:w="2448"/>
+            <w:vAlign w:val="center"/>
+            <w:tcMar>
+              <w:top w:w="80" w:type="dxa"/>
+              <w:start w:w="120" w:type="dxa"/>
+              <w:bottom w:w="80" w:type="dxa"/>
+              <w:end w:w="120" w:type="dxa"/>
+            </w:tcMar>
+          </w:tcPr>
+          <w:p>
+            <w:pPr>
+              <w:spacing w:after="0"/>
+              <w:jc w:val="left"/>
+            </w:pPr>
+            <w:r>
+              <w:rPr>
+                <w:rFonts w:ascii="Arial" w:hAnsi="Arial" w:eastAsia="Arial"/>
+                <w:b w:val="0"/>
+                <w:color w:val="111827"/>
+                <w:sz w:val="17"/>
+              </w:rPr>
+              <w:t>Shepherd: Spiritual Bible BFF</w:t>
+            </w:r>
+          </w:p>
+        </w:tc>
+        <w:tc>
+          <w:tcPr>
+            <w:tcW w:type="dxa" w:w="1440"/>
+            <w:vAlign w:val="center"/>
+            <w:tcMar>
+              <w:top w:w="80" w:type="dxa"/>
+              <w:start w:w="120" w:type="dxa"/>
+              <w:bottom w:w="80" w:type="dxa"/>
+              <w:end w:w="120" w:type="dxa"/>
+            </w:tcMar>
+          </w:tcPr>
+          <w:p>
+            <w:pPr>
+              <w:spacing w:after="0"/>
+              <w:jc w:val="left"/>
+            </w:pPr>
+            <w:r>
+              <w:rPr>
+                <w:rFonts w:ascii="Arial" w:hAnsi="Arial" w:eastAsia="Arial"/>
+                <w:b w:val="0"/>
+                <w:color w:val="111827"/>
+                <w:sz w:val="17"/>
+              </w:rPr>
+              <w:t>люди просят больше глубины, настроек и персонализации (20); пользователям нравится ежедневный ритуал (10); сбои ломают доверие и ритуал (8)</w:t>
+            </w:r>
+          </w:p>
+        </w:tc>
+        <w:tc>
+          <w:tcPr>
+            <w:tcW w:type="dxa" w:w="2016"/>
+            <w:vAlign w:val="center"/>
+            <w:tcMar>
+              <w:top w:w="80" w:type="dxa"/>
+              <w:start w:w="120" w:type="dxa"/>
+              <w:bottom w:w="80" w:type="dxa"/>
+              <w:end w:w="120" w:type="dxa"/>
+            </w:tcMar>
+          </w:tcPr>
+          <w:p>
+            <w:pPr>
+              <w:spacing w:after="0"/>
+              <w:jc w:val="left"/>
+            </w:pPr>
+            <w:r>
+              <w:rPr>
+                <w:rFonts w:ascii="Arial" w:hAnsi="Arial" w:eastAsia="Arial"/>
+                <w:b w:val="0"/>
+                <w:color w:val="111827"/>
+                <w:sz w:val="17"/>
+              </w:rPr>
+              <w:t>ежедневная петля, streak, уровни/XP, avatar feedback, дневник и рефлексия</w:t>
+            </w:r>
+          </w:p>
+        </w:tc>
+        <w:tc>
+          <w:tcPr>
+            <w:tcW w:type="dxa" w:w="3456"/>
+            <w:vAlign w:val="center"/>
+            <w:tcMar>
+              <w:top w:w="80" w:type="dxa"/>
+              <w:start w:w="120" w:type="dxa"/>
+              <w:bottom w:w="80" w:type="dxa"/>
+              <w:end w:w="120" w:type="dxa"/>
+            </w:tcMar>
+          </w:tcPr>
+          <w:p>
+            <w:pPr>
+              <w:spacing w:after="0"/>
+              <w:jc w:val="left"/>
+            </w:pPr>
+            <w:r>
+              <w:rPr>
+                <w:rFonts w:ascii="Arial" w:hAnsi="Arial" w:eastAsia="Arial"/>
+                <w:b w:val="0"/>
+                <w:color w:val="111827"/>
+                <w:sz w:val="17"/>
+              </w:rPr>
+              <w:t>Отличаться более широким identity/spiritual контуром, мягкими границами безопасности и надежной связкой действия с видимым прогрессом.</w:t>
+            </w:r>
+          </w:p>
+        </w:tc>
+      </w:tr>
+      <w:tr>
+        <w:tc>
+          <w:tcPr>
+            <w:tcW w:type="dxa" w:w="2448"/>
+            <w:vAlign w:val="center"/>
+            <w:tcMar>
+              <w:top w:w="80" w:type="dxa"/>
+              <w:start w:w="120" w:type="dxa"/>
+              <w:bottom w:w="80" w:type="dxa"/>
+              <w:end w:w="120" w:type="dxa"/>
+            </w:tcMar>
+            <w:shd w:fill="F8FAFC"/>
+          </w:tcPr>
+          <w:p>
+            <w:pPr>
+              <w:spacing w:after="0"/>
+              <w:jc w:val="left"/>
+            </w:pPr>
+            <w:r>
+              <w:rPr>
+                <w:rFonts w:ascii="Arial" w:hAnsi="Arial" w:eastAsia="Arial"/>
+                <w:b w:val="0"/>
+                <w:color w:val="111827"/>
+                <w:sz w:val="17"/>
+              </w:rPr>
+              <w:t>Zing AI: Home &amp; Gym Workouts</w:t>
+            </w:r>
+          </w:p>
+        </w:tc>
+        <w:tc>
+          <w:tcPr>
+            <w:tcW w:type="dxa" w:w="1440"/>
+            <w:vAlign w:val="center"/>
+            <w:tcMar>
+              <w:top w:w="80" w:type="dxa"/>
+              <w:start w:w="120" w:type="dxa"/>
+              <w:bottom w:w="80" w:type="dxa"/>
+              <w:end w:w="120" w:type="dxa"/>
+            </w:tcMar>
+            <w:shd w:fill="F8FAFC"/>
+          </w:tcPr>
+          <w:p>
+            <w:pPr>
+              <w:spacing w:after="0"/>
+              <w:jc w:val="left"/>
+            </w:pPr>
+            <w:r>
+              <w:rPr>
+                <w:rFonts w:ascii="Arial" w:hAnsi="Arial" w:eastAsia="Arial"/>
+                <w:b w:val="0"/>
+                <w:color w:val="111827"/>
+                <w:sz w:val="17"/>
+              </w:rPr>
+              <w:t>люди просят больше глубины, настроек и персонализации (16); пользователям нравится ежедневный ритуал (8); есть жалобы на цену или подписку (8)</w:t>
+            </w:r>
+          </w:p>
+        </w:tc>
+        <w:tc>
+          <w:tcPr>
+            <w:tcW w:type="dxa" w:w="2016"/>
+            <w:vAlign w:val="center"/>
+            <w:tcMar>
+              <w:top w:w="80" w:type="dxa"/>
+              <w:start w:w="120" w:type="dxa"/>
+              <w:bottom w:w="80" w:type="dxa"/>
+              <w:end w:w="120" w:type="dxa"/>
+            </w:tcMar>
+            <w:shd w:fill="F8FAFC"/>
+          </w:tcPr>
+          <w:p>
+            <w:pPr>
+              <w:spacing w:after="0"/>
+              <w:jc w:val="left"/>
+            </w:pPr>
+            <w:r>
+              <w:rPr>
+                <w:rFonts w:ascii="Arial" w:hAnsi="Arial" w:eastAsia="Arial"/>
+                <w:b w:val="0"/>
+                <w:color w:val="111827"/>
+                <w:sz w:val="17"/>
+              </w:rPr>
+              <w:t>ежедневная петля, streak, уровни/XP, квесты и челленджи, avatar feedback</w:t>
+            </w:r>
+          </w:p>
+        </w:tc>
+        <w:tc>
+          <w:tcPr>
+            <w:tcW w:type="dxa" w:w="3456"/>
+            <w:vAlign w:val="center"/>
+            <w:tcMar>
+              <w:top w:w="80" w:type="dxa"/>
+              <w:start w:w="120" w:type="dxa"/>
+              <w:bottom w:w="80" w:type="dxa"/>
+              <w:end w:w="120" w:type="dxa"/>
+            </w:tcMar>
+            <w:shd w:fill="F8FAFC"/>
+          </w:tcPr>
+          <w:p>
+            <w:pPr>
+              <w:spacing w:after="0"/>
+              <w:jc w:val="left"/>
+            </w:pPr>
+            <w:r>
+              <w:rPr>
+                <w:rFonts w:ascii="Arial" w:hAnsi="Arial" w:eastAsia="Arial"/>
+                <w:b w:val="0"/>
+                <w:color w:val="111827"/>
+                <w:sz w:val="17"/>
+              </w:rPr>
+              <w:t>Сделать так, чтобы avatar причинно реагировал на завершенное действие, а не существовал как декоративный профиль.</w:t>
+            </w:r>
+          </w:p>
+        </w:tc>
+      </w:tr>
+      <w:tr>
+        <w:tc>
+          <w:tcPr>
+            <w:tcW w:type="dxa" w:w="2448"/>
+            <w:vAlign w:val="center"/>
+            <w:tcMar>
+              <w:top w:w="80" w:type="dxa"/>
+              <w:start w:w="120" w:type="dxa"/>
+              <w:bottom w:w="80" w:type="dxa"/>
+              <w:end w:w="120" w:type="dxa"/>
+            </w:tcMar>
+          </w:tcPr>
+          <w:p>
+            <w:pPr>
+              <w:spacing w:after="0"/>
+              <w:jc w:val="left"/>
+            </w:pPr>
+            <w:r>
+              <w:rPr>
+                <w:rFonts w:ascii="Arial" w:hAnsi="Arial" w:eastAsia="Arial"/>
+                <w:b w:val="0"/>
+                <w:color w:val="111827"/>
+                <w:sz w:val="17"/>
+              </w:rPr>
+              <w:t>Miracle Morning Routine</w:t>
+            </w:r>
+          </w:p>
+        </w:tc>
+        <w:tc>
+          <w:tcPr>
+            <w:tcW w:type="dxa" w:w="1440"/>
+            <w:vAlign w:val="center"/>
+            <w:tcMar>
+              <w:top w:w="80" w:type="dxa"/>
+              <w:start w:w="120" w:type="dxa"/>
+              <w:bottom w:w="80" w:type="dxa"/>
+              <w:end w:w="120" w:type="dxa"/>
+            </w:tcMar>
+          </w:tcPr>
+          <w:p>
+            <w:pPr>
+              <w:spacing w:after="0"/>
+              <w:jc w:val="left"/>
+            </w:pPr>
+            <w:r>
+              <w:rPr>
+                <w:rFonts w:ascii="Arial" w:hAnsi="Arial" w:eastAsia="Arial"/>
+                <w:b w:val="0"/>
+                <w:color w:val="111827"/>
+                <w:sz w:val="17"/>
+              </w:rPr>
+              <w:t>пользователям нравится ежедневный ритуал (17); люди просят больше глубины, настроек и персонализации (13); пользователям нравится avatar/progress feedback (9)</w:t>
+            </w:r>
+          </w:p>
+        </w:tc>
+        <w:tc>
+          <w:tcPr>
+            <w:tcW w:type="dxa" w:w="2016"/>
+            <w:vAlign w:val="center"/>
+            <w:tcMar>
+              <w:top w:w="80" w:type="dxa"/>
+              <w:start w:w="120" w:type="dxa"/>
+              <w:bottom w:w="80" w:type="dxa"/>
+              <w:end w:w="120" w:type="dxa"/>
+            </w:tcMar>
+          </w:tcPr>
+          <w:p>
+            <w:pPr>
+              <w:spacing w:after="0"/>
+              <w:jc w:val="left"/>
+            </w:pPr>
+            <w:r>
+              <w:rPr>
+                <w:rFonts w:ascii="Arial" w:hAnsi="Arial" w:eastAsia="Arial"/>
+                <w:b w:val="0"/>
+                <w:color w:val="111827"/>
+                <w:sz w:val="17"/>
+              </w:rPr>
+              <w:t>ежедневная петля, streak, уровни/XP, квесты и челленджи, avatar feedback</w:t>
+            </w:r>
+          </w:p>
+        </w:tc>
+        <w:tc>
+          <w:tcPr>
+            <w:tcW w:type="dxa" w:w="3456"/>
+            <w:vAlign w:val="center"/>
+            <w:tcMar>
+              <w:top w:w="80" w:type="dxa"/>
+              <w:start w:w="120" w:type="dxa"/>
+              <w:bottom w:w="80" w:type="dxa"/>
+              <w:end w:w="120" w:type="dxa"/>
+            </w:tcMar>
+          </w:tcPr>
+          <w:p>
+            <w:pPr>
+              <w:spacing w:after="0"/>
+              <w:jc w:val="left"/>
+            </w:pPr>
+            <w:r>
+              <w:rPr>
+                <w:rFonts w:ascii="Arial" w:hAnsi="Arial" w:eastAsia="Arial"/>
+                <w:b w:val="0"/>
+                <w:color w:val="111827"/>
+                <w:sz w:val="17"/>
+              </w:rPr>
+              <w:t>Сделать так, чтобы avatar причинно реагировал на завершенное действие, а не существовал как декоративный профиль.</w:t>
+            </w:r>
+          </w:p>
+        </w:tc>
+      </w:tr>
+      <w:tr>
+        <w:tc>
+          <w:tcPr>
+            <w:tcW w:type="dxa" w:w="2448"/>
+            <w:vAlign w:val="center"/>
+            <w:tcMar>
+              <w:top w:w="80" w:type="dxa"/>
+              <w:start w:w="120" w:type="dxa"/>
+              <w:bottom w:w="80" w:type="dxa"/>
+              <w:end w:w="120" w:type="dxa"/>
+            </w:tcMar>
+            <w:shd w:fill="F8FAFC"/>
+          </w:tcPr>
+          <w:p>
+            <w:pPr>
+              <w:spacing w:after="0"/>
+              <w:jc w:val="left"/>
+            </w:pPr>
+            <w:r>
+              <w:rPr>
+                <w:rFonts w:ascii="Arial" w:hAnsi="Arial" w:eastAsia="Arial"/>
+                <w:b w:val="0"/>
+                <w:color w:val="111827"/>
+                <w:sz w:val="17"/>
+              </w:rPr>
+              <w:t>EVOLVE: Transform Your Life</w:t>
+            </w:r>
+          </w:p>
+        </w:tc>
+        <w:tc>
+          <w:tcPr>
+            <w:tcW w:type="dxa" w:w="1440"/>
+            <w:vAlign w:val="center"/>
+            <w:tcMar>
+              <w:top w:w="80" w:type="dxa"/>
+              <w:start w:w="120" w:type="dxa"/>
+              <w:bottom w:w="80" w:type="dxa"/>
+              <w:end w:w="120" w:type="dxa"/>
+            </w:tcMar>
+            <w:shd w:fill="F8FAFC"/>
+          </w:tcPr>
+          <w:p>
+            <w:pPr>
+              <w:spacing w:after="0"/>
+              <w:jc w:val="left"/>
+            </w:pPr>
+            <w:r>
+              <w:rPr>
+                <w:rFonts w:ascii="Arial" w:hAnsi="Arial" w:eastAsia="Arial"/>
+                <w:b w:val="0"/>
+                <w:color w:val="111827"/>
+                <w:sz w:val="17"/>
+              </w:rPr>
+              <w:t>пользователям нравится ежедневный ритуал (13); есть жалобы на цену или подписку (11); люди просят больше глубины, настроек и персонализации (10)</w:t>
+            </w:r>
+          </w:p>
+        </w:tc>
+        <w:tc>
+          <w:tcPr>
+            <w:tcW w:type="dxa" w:w="2016"/>
+            <w:vAlign w:val="center"/>
+            <w:tcMar>
+              <w:top w:w="80" w:type="dxa"/>
+              <w:start w:w="120" w:type="dxa"/>
+              <w:bottom w:w="80" w:type="dxa"/>
+              <w:end w:w="120" w:type="dxa"/>
+            </w:tcMar>
+            <w:shd w:fill="F8FAFC"/>
+          </w:tcPr>
+          <w:p>
+            <w:pPr>
+              <w:spacing w:after="0"/>
+              <w:jc w:val="left"/>
+            </w:pPr>
+            <w:r>
+              <w:rPr>
+                <w:rFonts w:ascii="Arial" w:hAnsi="Arial" w:eastAsia="Arial"/>
+                <w:b w:val="0"/>
+                <w:color w:val="111827"/>
+                <w:sz w:val="17"/>
+              </w:rPr>
+              <w:t>ежедневная петля, streak, avatar feedback, дневник и рефлексия, напоминания и привычки</w:t>
+            </w:r>
+          </w:p>
+        </w:tc>
+        <w:tc>
+          <w:tcPr>
+            <w:tcW w:type="dxa" w:w="3456"/>
+            <w:vAlign w:val="center"/>
+            <w:tcMar>
+              <w:top w:w="80" w:type="dxa"/>
+              <w:start w:w="120" w:type="dxa"/>
+              <w:bottom w:w="80" w:type="dxa"/>
+              <w:end w:w="120" w:type="dxa"/>
+            </w:tcMar>
+            <w:shd w:fill="F8FAFC"/>
+          </w:tcPr>
+          <w:p>
+            <w:pPr>
+              <w:spacing w:after="0"/>
+              <w:jc w:val="left"/>
+            </w:pPr>
+            <w:r>
+              <w:rPr>
+                <w:rFonts w:ascii="Arial" w:hAnsi="Arial" w:eastAsia="Arial"/>
+                <w:b w:val="0"/>
+                <w:color w:val="111827"/>
+                <w:sz w:val="17"/>
+              </w:rPr>
+              <w:t>Сделать так, чтобы avatar причинно реагировал на завершенное действие, а не существовал как декоративный профиль.</w:t>
+            </w:r>
+          </w:p>
+        </w:tc>
+      </w:tr>
+      <w:tr>
+        <w:tc>
+          <w:tcPr>
+            <w:tcW w:type="dxa" w:w="2448"/>
+            <w:vAlign w:val="center"/>
+            <w:tcMar>
+              <w:top w:w="80" w:type="dxa"/>
+              <w:start w:w="120" w:type="dxa"/>
+              <w:bottom w:w="80" w:type="dxa"/>
+              <w:end w:w="120" w:type="dxa"/>
+            </w:tcMar>
+          </w:tcPr>
+          <w:p>
+            <w:pPr>
+              <w:spacing w:after="0"/>
+              <w:jc w:val="left"/>
+            </w:pPr>
+            <w:r>
+              <w:rPr>
+                <w:rFonts w:ascii="Arial" w:hAnsi="Arial" w:eastAsia="Arial"/>
+                <w:b w:val="0"/>
+                <w:color w:val="111827"/>
+                <w:sz w:val="17"/>
+              </w:rPr>
+              <w:t>Daily Yoga: Yoga for Fitness®</w:t>
+            </w:r>
+          </w:p>
+        </w:tc>
+        <w:tc>
+          <w:tcPr>
+            <w:tcW w:type="dxa" w:w="1440"/>
+            <w:vAlign w:val="center"/>
+            <w:tcMar>
+              <w:top w:w="80" w:type="dxa"/>
+              <w:start w:w="120" w:type="dxa"/>
+              <w:bottom w:w="80" w:type="dxa"/>
+              <w:end w:w="120" w:type="dxa"/>
+            </w:tcMar>
+          </w:tcPr>
+          <w:p>
+            <w:pPr>
+              <w:spacing w:after="0"/>
+              <w:jc w:val="left"/>
+            </w:pPr>
+            <w:r>
+              <w:rPr>
+                <w:rFonts w:ascii="Arial" w:hAnsi="Arial" w:eastAsia="Arial"/>
+                <w:b w:val="0"/>
+                <w:color w:val="111827"/>
+                <w:sz w:val="17"/>
+              </w:rPr>
+              <w:t>пользователям нравится avatar/progress feedback (6); пользователям нравится ежедневный ритуал (6); люди просят больше глубины, настроек и персонализации (6)</w:t>
+            </w:r>
+          </w:p>
+        </w:tc>
+        <w:tc>
+          <w:tcPr>
+            <w:tcW w:type="dxa" w:w="2016"/>
+            <w:vAlign w:val="center"/>
+            <w:tcMar>
+              <w:top w:w="80" w:type="dxa"/>
+              <w:start w:w="120" w:type="dxa"/>
+              <w:bottom w:w="80" w:type="dxa"/>
+              <w:end w:w="120" w:type="dxa"/>
+            </w:tcMar>
+          </w:tcPr>
+          <w:p>
+            <w:pPr>
+              <w:spacing w:after="0"/>
+              <w:jc w:val="left"/>
+            </w:pPr>
+            <w:r>
+              <w:rPr>
+                <w:rFonts w:ascii="Arial" w:hAnsi="Arial" w:eastAsia="Arial"/>
+                <w:b w:val="0"/>
+                <w:color w:val="111827"/>
+                <w:sz w:val="17"/>
+              </w:rPr>
+              <w:t>ежедневная петля, streak, квесты и челленджи, avatar feedback, социальная поддержка</w:t>
+            </w:r>
+          </w:p>
+        </w:tc>
+        <w:tc>
+          <w:tcPr>
+            <w:tcW w:type="dxa" w:w="3456"/>
+            <w:vAlign w:val="center"/>
+            <w:tcMar>
+              <w:top w:w="80" w:type="dxa"/>
+              <w:start w:w="120" w:type="dxa"/>
+              <w:bottom w:w="80" w:type="dxa"/>
+              <w:end w:w="120" w:type="dxa"/>
+            </w:tcMar>
+          </w:tcPr>
+          <w:p>
+            <w:pPr>
+              <w:spacing w:after="0"/>
+              <w:jc w:val="left"/>
+            </w:pPr>
+            <w:r>
+              <w:rPr>
+                <w:rFonts w:ascii="Arial" w:hAnsi="Arial" w:eastAsia="Arial"/>
+                <w:b w:val="0"/>
+                <w:color w:val="111827"/>
+                <w:sz w:val="17"/>
+              </w:rPr>
+              <w:t>Сделать так, чтобы avatar причинно реагировал на завершенное действие, а не существовал как декоративный профиль.</w:t>
+            </w:r>
+          </w:p>
+        </w:tc>
+      </w:tr>
+      <w:tr>
+        <w:tc>
+          <w:tcPr>
+            <w:tcW w:type="dxa" w:w="2448"/>
+            <w:vAlign w:val="center"/>
+            <w:tcMar>
+              <w:top w:w="80" w:type="dxa"/>
+              <w:start w:w="120" w:type="dxa"/>
+              <w:bottom w:w="80" w:type="dxa"/>
+              <w:end w:w="120" w:type="dxa"/>
+            </w:tcMar>
+            <w:shd w:fill="F8FAFC"/>
+          </w:tcPr>
+          <w:p>
+            <w:pPr>
+              <w:spacing w:after="0"/>
+              <w:jc w:val="left"/>
+            </w:pPr>
+            <w:r>
+              <w:rPr>
+                <w:rFonts w:ascii="Arial" w:hAnsi="Arial" w:eastAsia="Arial"/>
+                <w:b w:val="0"/>
+                <w:color w:val="111827"/>
+                <w:sz w:val="17"/>
+              </w:rPr>
+              <w:t>Daily Burn: Workout Coach</w:t>
+            </w:r>
+          </w:p>
+        </w:tc>
+        <w:tc>
+          <w:tcPr>
+            <w:tcW w:type="dxa" w:w="1440"/>
+            <w:vAlign w:val="center"/>
+            <w:tcMar>
+              <w:top w:w="80" w:type="dxa"/>
+              <w:start w:w="120" w:type="dxa"/>
+              <w:bottom w:w="80" w:type="dxa"/>
+              <w:end w:w="120" w:type="dxa"/>
+            </w:tcMar>
+            <w:shd w:fill="F8FAFC"/>
+          </w:tcPr>
+          <w:p>
+            <w:pPr>
+              <w:spacing w:after="0"/>
+              <w:jc w:val="left"/>
+            </w:pPr>
+            <w:r>
+              <w:rPr>
+                <w:rFonts w:ascii="Arial" w:hAnsi="Arial" w:eastAsia="Arial"/>
+                <w:b w:val="0"/>
+                <w:color w:val="111827"/>
+                <w:sz w:val="17"/>
+              </w:rPr>
+              <w:t>пользователям нравится ежедневный ритуал (16); люди просят больше глубины, настроек и персонализации (15); есть жалобы на цену или подписку (14)</w:t>
+            </w:r>
+          </w:p>
+        </w:tc>
+        <w:tc>
+          <w:tcPr>
+            <w:tcW w:type="dxa" w:w="2016"/>
+            <w:vAlign w:val="center"/>
+            <w:tcMar>
+              <w:top w:w="80" w:type="dxa"/>
+              <w:start w:w="120" w:type="dxa"/>
+              <w:bottom w:w="80" w:type="dxa"/>
+              <w:end w:w="120" w:type="dxa"/>
+            </w:tcMar>
+            <w:shd w:fill="F8FAFC"/>
+          </w:tcPr>
+          <w:p>
+            <w:pPr>
+              <w:spacing w:after="0"/>
+              <w:jc w:val="left"/>
+            </w:pPr>
+            <w:r>
+              <w:rPr>
+                <w:rFonts w:ascii="Arial" w:hAnsi="Arial" w:eastAsia="Arial"/>
+                <w:b w:val="0"/>
+                <w:color w:val="111827"/>
+                <w:sz w:val="17"/>
+              </w:rPr>
+              <w:t>ежедневная петля, streak, уровни/XP, avatar feedback, социальная поддержка</w:t>
+            </w:r>
+          </w:p>
+        </w:tc>
+        <w:tc>
+          <w:tcPr>
+            <w:tcW w:type="dxa" w:w="3456"/>
+            <w:vAlign w:val="center"/>
+            <w:tcMar>
+              <w:top w:w="80" w:type="dxa"/>
+              <w:start w:w="120" w:type="dxa"/>
+              <w:bottom w:w="80" w:type="dxa"/>
+              <w:end w:w="120" w:type="dxa"/>
+            </w:tcMar>
+            <w:shd w:fill="F8FAFC"/>
+          </w:tcPr>
+          <w:p>
+            <w:pPr>
+              <w:spacing w:after="0"/>
+              <w:jc w:val="left"/>
+            </w:pPr>
+            <w:r>
+              <w:rPr>
+                <w:rFonts w:ascii="Arial" w:hAnsi="Arial" w:eastAsia="Arial"/>
+                <w:b w:val="0"/>
+                <w:color w:val="111827"/>
+                <w:sz w:val="17"/>
+              </w:rPr>
+              <w:t>Сделать так, чтобы avatar причинно реагировал на завершенное действие, а не существовал как декоративный профиль.</w:t>
+            </w:r>
+          </w:p>
+        </w:tc>
+      </w:tr>
+      <w:tr>
+        <w:tc>
+          <w:tcPr>
+            <w:tcW w:type="dxa" w:w="2448"/>
+            <w:vAlign w:val="center"/>
+            <w:tcMar>
+              <w:top w:w="80" w:type="dxa"/>
+              <w:start w:w="120" w:type="dxa"/>
+              <w:bottom w:w="80" w:type="dxa"/>
+              <w:end w:w="120" w:type="dxa"/>
+            </w:tcMar>
+          </w:tcPr>
+          <w:p>
+            <w:pPr>
+              <w:spacing w:after="0"/>
+              <w:jc w:val="left"/>
+            </w:pPr>
+            <w:r>
+              <w:rPr>
+                <w:rFonts w:ascii="Arial" w:hAnsi="Arial" w:eastAsia="Arial"/>
+                <w:b w:val="0"/>
+                <w:color w:val="111827"/>
+                <w:sz w:val="17"/>
+              </w:rPr>
+              <w:t>Myla : Manifest &amp; Vision Board</w:t>
+            </w:r>
+          </w:p>
+        </w:tc>
+        <w:tc>
+          <w:tcPr>
+            <w:tcW w:type="dxa" w:w="1440"/>
+            <w:vAlign w:val="center"/>
+            <w:tcMar>
+              <w:top w:w="80" w:type="dxa"/>
+              <w:start w:w="120" w:type="dxa"/>
+              <w:bottom w:w="80" w:type="dxa"/>
+              <w:end w:w="120" w:type="dxa"/>
+            </w:tcMar>
+          </w:tcPr>
+          <w:p>
+            <w:pPr>
+              <w:spacing w:after="0"/>
+              <w:jc w:val="left"/>
+            </w:pPr>
+            <w:r>
+              <w:rPr>
+                <w:rFonts w:ascii="Arial" w:hAnsi="Arial" w:eastAsia="Arial"/>
+                <w:b w:val="0"/>
+                <w:color w:val="111827"/>
+                <w:sz w:val="17"/>
+              </w:rPr>
+              <w:t>пользователям нравится ежедневный ритуал (15); люди просят больше глубины, настроек и персонализации (12); есть жалобы на цену или подписку (8)</w:t>
+            </w:r>
+          </w:p>
+        </w:tc>
+        <w:tc>
+          <w:tcPr>
+            <w:tcW w:type="dxa" w:w="2016"/>
+            <w:vAlign w:val="center"/>
+            <w:tcMar>
+              <w:top w:w="80" w:type="dxa"/>
+              <w:start w:w="120" w:type="dxa"/>
+              <w:bottom w:w="80" w:type="dxa"/>
+              <w:end w:w="120" w:type="dxa"/>
+            </w:tcMar>
+          </w:tcPr>
+          <w:p>
+            <w:pPr>
+              <w:spacing w:after="0"/>
+              <w:jc w:val="left"/>
+            </w:pPr>
+            <w:r>
+              <w:rPr>
+                <w:rFonts w:ascii="Arial" w:hAnsi="Arial" w:eastAsia="Arial"/>
+                <w:b w:val="0"/>
+                <w:color w:val="111827"/>
+                <w:sz w:val="17"/>
+              </w:rPr>
+              <w:t>ежедневная петля, streak, avatar feedback, дневник и рефлексия, напоминания и привычки</w:t>
+            </w:r>
+          </w:p>
+        </w:tc>
+        <w:tc>
+          <w:tcPr>
+            <w:tcW w:type="dxa" w:w="3456"/>
+            <w:vAlign w:val="center"/>
+            <w:tcMar>
+              <w:top w:w="80" w:type="dxa"/>
+              <w:start w:w="120" w:type="dxa"/>
+              <w:bottom w:w="80" w:type="dxa"/>
+              <w:end w:w="120" w:type="dxa"/>
+            </w:tcMar>
+          </w:tcPr>
+          <w:p>
+            <w:pPr>
+              <w:spacing w:after="0"/>
+              <w:jc w:val="left"/>
+            </w:pPr>
+            <w:r>
+              <w:rPr>
+                <w:rFonts w:ascii="Arial" w:hAnsi="Arial" w:eastAsia="Arial"/>
+                <w:b w:val="0"/>
+                <w:color w:val="111827"/>
+                <w:sz w:val="17"/>
+              </w:rPr>
+              <w:t>Сделать так, чтобы avatar причинно реагировал на завершенное действие, а не существовал как декоративный профиль.</w:t>
+            </w:r>
+          </w:p>
+        </w:tc>
+      </w:tr>
+      <w:tr>
+        <w:tc>
+          <w:tcPr>
+            <w:tcW w:type="dxa" w:w="2448"/>
+            <w:vAlign w:val="center"/>
+            <w:tcMar>
+              <w:top w:w="80" w:type="dxa"/>
+              <w:start w:w="120" w:type="dxa"/>
+              <w:bottom w:w="80" w:type="dxa"/>
+              <w:end w:w="120" w:type="dxa"/>
+            </w:tcMar>
+            <w:shd w:fill="F8FAFC"/>
+          </w:tcPr>
+          <w:p>
+            <w:pPr>
+              <w:spacing w:after="0"/>
+              <w:jc w:val="left"/>
+            </w:pPr>
+            <w:r>
+              <w:rPr>
+                <w:rFonts w:ascii="Arial" w:hAnsi="Arial" w:eastAsia="Arial"/>
+                <w:b w:val="0"/>
+                <w:color w:val="111827"/>
+                <w:sz w:val="17"/>
+              </w:rPr>
+              <w:t>Rosebud: AI Journal &amp; Diary</w:t>
+            </w:r>
+          </w:p>
+        </w:tc>
+        <w:tc>
+          <w:tcPr>
+            <w:tcW w:type="dxa" w:w="1440"/>
+            <w:vAlign w:val="center"/>
+            <w:tcMar>
+              <w:top w:w="80" w:type="dxa"/>
+              <w:start w:w="120" w:type="dxa"/>
+              <w:bottom w:w="80" w:type="dxa"/>
+              <w:end w:w="120" w:type="dxa"/>
+            </w:tcMar>
+            <w:shd w:fill="F8FAFC"/>
+          </w:tcPr>
+          <w:p>
+            <w:pPr>
+              <w:spacing w:after="0"/>
+              <w:jc w:val="left"/>
+            </w:pPr>
+            <w:r>
+              <w:rPr>
+                <w:rFonts w:ascii="Arial" w:hAnsi="Arial" w:eastAsia="Arial"/>
+                <w:b w:val="0"/>
+                <w:color w:val="111827"/>
+                <w:sz w:val="17"/>
+              </w:rPr>
+              <w:t>люди просят больше глубины, настроек и персонализации (17); ценится эмоциональная поддержка (13); есть жалобы на цену или подписку (9)</w:t>
+            </w:r>
+          </w:p>
+        </w:tc>
+        <w:tc>
+          <w:tcPr>
+            <w:tcW w:type="dxa" w:w="2016"/>
+            <w:vAlign w:val="center"/>
+            <w:tcMar>
+              <w:top w:w="80" w:type="dxa"/>
+              <w:start w:w="120" w:type="dxa"/>
+              <w:bottom w:w="80" w:type="dxa"/>
+              <w:end w:w="120" w:type="dxa"/>
+            </w:tcMar>
+            <w:shd w:fill="F8FAFC"/>
+          </w:tcPr>
+          <w:p>
+            <w:pPr>
+              <w:spacing w:after="0"/>
+              <w:jc w:val="left"/>
+            </w:pPr>
+            <w:r>
+              <w:rPr>
+                <w:rFonts w:ascii="Arial" w:hAnsi="Arial" w:eastAsia="Arial"/>
+                <w:b w:val="0"/>
+                <w:color w:val="111827"/>
+                <w:sz w:val="17"/>
+              </w:rPr>
+              <w:t>ежедневная петля, streak, уровни/XP, дневник и рефлексия, напоминания и привычки</w:t>
+            </w:r>
+          </w:p>
+        </w:tc>
+        <w:tc>
+          <w:tcPr>
+            <w:tcW w:type="dxa" w:w="3456"/>
+            <w:vAlign w:val="center"/>
+            <w:tcMar>
+              <w:top w:w="80" w:type="dxa"/>
+              <w:start w:w="120" w:type="dxa"/>
+              <w:bottom w:w="80" w:type="dxa"/>
+              <w:end w:w="120" w:type="dxa"/>
+            </w:tcMar>
+            <w:shd w:fill="F8FAFC"/>
+          </w:tcPr>
+          <w:p>
+            <w:pPr>
+              <w:spacing w:after="0"/>
+              <w:jc w:val="left"/>
+            </w:pPr>
+            <w:r>
+              <w:rPr>
+                <w:rFonts w:ascii="Arial" w:hAnsi="Arial" w:eastAsia="Arial"/>
+                <w:b w:val="0"/>
+                <w:color w:val="111827"/>
+                <w:sz w:val="17"/>
+              </w:rPr>
+              <w:t>Сначала показать ценность ежедневной петли, а платную глубину строить на расширенной персонализации.</w:t>
+            </w:r>
+          </w:p>
+        </w:tc>
+      </w:tr>
+      <w:tr>
+        <w:tc>
+          <w:tcPr>
+            <w:tcW w:type="dxa" w:w="2448"/>
+            <w:vAlign w:val="center"/>
+            <w:tcMar>
+              <w:top w:w="80" w:type="dxa"/>
+              <w:start w:w="120" w:type="dxa"/>
+              <w:bottom w:w="80" w:type="dxa"/>
+              <w:end w:w="120" w:type="dxa"/>
+            </w:tcMar>
+          </w:tcPr>
+          <w:p>
+            <w:pPr>
+              <w:spacing w:after="0"/>
+              <w:jc w:val="left"/>
+            </w:pPr>
+            <w:r>
+              <w:rPr>
+                <w:rFonts w:ascii="Arial" w:hAnsi="Arial" w:eastAsia="Arial"/>
+                <w:b w:val="0"/>
+                <w:color w:val="111827"/>
+                <w:sz w:val="17"/>
+              </w:rPr>
+              <w:t>Habit Tracker : Haby</w:t>
+            </w:r>
+          </w:p>
+        </w:tc>
+        <w:tc>
+          <w:tcPr>
+            <w:tcW w:type="dxa" w:w="1440"/>
+            <w:vAlign w:val="center"/>
+            <w:tcMar>
+              <w:top w:w="80" w:type="dxa"/>
+              <w:start w:w="120" w:type="dxa"/>
+              <w:bottom w:w="80" w:type="dxa"/>
+              <w:end w:w="120" w:type="dxa"/>
+            </w:tcMar>
+          </w:tcPr>
+          <w:p>
+            <w:pPr>
+              <w:spacing w:after="0"/>
+              <w:jc w:val="left"/>
+            </w:pPr>
+            <w:r>
+              <w:rPr>
+                <w:rFonts w:ascii="Arial" w:hAnsi="Arial" w:eastAsia="Arial"/>
+                <w:b w:val="0"/>
+                <w:color w:val="111827"/>
+                <w:sz w:val="17"/>
+              </w:rPr>
+              <w:t>пользователям нравится ежедневный ритуал (15); люди просят больше глубины, настроек и персонализации (10); есть жалобы на цену или подписку (9)</w:t>
+            </w:r>
+          </w:p>
+        </w:tc>
+        <w:tc>
+          <w:tcPr>
+            <w:tcW w:type="dxa" w:w="2016"/>
+            <w:vAlign w:val="center"/>
+            <w:tcMar>
+              <w:top w:w="80" w:type="dxa"/>
+              <w:start w:w="120" w:type="dxa"/>
+              <w:bottom w:w="80" w:type="dxa"/>
+              <w:end w:w="120" w:type="dxa"/>
+            </w:tcMar>
+          </w:tcPr>
+          <w:p>
+            <w:pPr>
+              <w:spacing w:after="0"/>
+              <w:jc w:val="left"/>
+            </w:pPr>
+            <w:r>
+              <w:rPr>
+                <w:rFonts w:ascii="Arial" w:hAnsi="Arial" w:eastAsia="Arial"/>
+                <w:b w:val="0"/>
+                <w:color w:val="111827"/>
+                <w:sz w:val="17"/>
+              </w:rPr>
+              <w:t>streak, уровни/XP, avatar feedback, дневник и рефлексия, напоминания и привычки</w:t>
+            </w:r>
+          </w:p>
+        </w:tc>
+        <w:tc>
+          <w:tcPr>
+            <w:tcW w:type="dxa" w:w="3456"/>
+            <w:vAlign w:val="center"/>
+            <w:tcMar>
+              <w:top w:w="80" w:type="dxa"/>
+              <w:start w:w="120" w:type="dxa"/>
+              <w:bottom w:w="80" w:type="dxa"/>
+              <w:end w:w="120" w:type="dxa"/>
+            </w:tcMar>
+          </w:tcPr>
+          <w:p>
+            <w:pPr>
+              <w:spacing w:after="0"/>
+              <w:jc w:val="left"/>
+            </w:pPr>
+            <w:r>
+              <w:rPr>
+                <w:rFonts w:ascii="Arial" w:hAnsi="Arial" w:eastAsia="Arial"/>
+                <w:b w:val="0"/>
+                <w:color w:val="111827"/>
+                <w:sz w:val="17"/>
+              </w:rPr>
+              <w:t>Сделать так, чтобы avatar причинно реагировал на завершенное действие, а не существовал как декоративный профиль.</w:t>
+            </w:r>
+          </w:p>
+        </w:tc>
+      </w:tr>
+      <w:tr>
+        <w:tc>
+          <w:tcPr>
+            <w:tcW w:type="dxa" w:w="2448"/>
+            <w:vAlign w:val="center"/>
+            <w:tcMar>
+              <w:top w:w="80" w:type="dxa"/>
+              <w:start w:w="120" w:type="dxa"/>
+              <w:bottom w:w="80" w:type="dxa"/>
+              <w:end w:w="120" w:type="dxa"/>
+            </w:tcMar>
+            <w:shd w:fill="F8FAFC"/>
+          </w:tcPr>
+          <w:p>
+            <w:pPr>
+              <w:spacing w:after="0"/>
+              <w:jc w:val="left"/>
+            </w:pPr>
+            <w:r>
+              <w:rPr>
+                <w:rFonts w:ascii="Arial" w:hAnsi="Arial" w:eastAsia="Arial"/>
+                <w:b w:val="0"/>
+                <w:color w:val="111827"/>
+                <w:sz w:val="17"/>
+              </w:rPr>
+              <w:t>Goddess・Women's Wellness Coach</w:t>
+            </w:r>
+          </w:p>
+        </w:tc>
+        <w:tc>
+          <w:tcPr>
+            <w:tcW w:type="dxa" w:w="1440"/>
+            <w:vAlign w:val="center"/>
+            <w:tcMar>
+              <w:top w:w="80" w:type="dxa"/>
+              <w:start w:w="120" w:type="dxa"/>
+              <w:bottom w:w="80" w:type="dxa"/>
+              <w:end w:w="120" w:type="dxa"/>
+            </w:tcMar>
+            <w:shd w:fill="F8FAFC"/>
+          </w:tcPr>
+          <w:p>
+            <w:pPr>
+              <w:spacing w:after="0"/>
+              <w:jc w:val="left"/>
+            </w:pPr>
+            <w:r>
+              <w:rPr>
+                <w:rFonts w:ascii="Arial" w:hAnsi="Arial" w:eastAsia="Arial"/>
+                <w:b w:val="0"/>
+                <w:color w:val="111827"/>
+                <w:sz w:val="17"/>
+              </w:rPr>
+              <w:t>люди просят больше глубины, настроек и персонализации (12); есть жалобы на цену или подписку (10); ценится эмоциональная поддержка (9)</w:t>
+            </w:r>
+          </w:p>
+        </w:tc>
+        <w:tc>
+          <w:tcPr>
+            <w:tcW w:type="dxa" w:w="2016"/>
+            <w:vAlign w:val="center"/>
+            <w:tcMar>
+              <w:top w:w="80" w:type="dxa"/>
+              <w:start w:w="120" w:type="dxa"/>
+              <w:bottom w:w="80" w:type="dxa"/>
+              <w:end w:w="120" w:type="dxa"/>
+            </w:tcMar>
+            <w:shd w:fill="F8FAFC"/>
+          </w:tcPr>
+          <w:p>
+            <w:pPr>
+              <w:spacing w:after="0"/>
+              <w:jc w:val="left"/>
+            </w:pPr>
+            <w:r>
+              <w:rPr>
+                <w:rFonts w:ascii="Arial" w:hAnsi="Arial" w:eastAsia="Arial"/>
+                <w:b w:val="0"/>
+                <w:color w:val="111827"/>
+                <w:sz w:val="17"/>
+              </w:rPr>
+              <w:t>ежедневная петля, streak, уровни/XP, avatar feedback, дневник и рефлексия</w:t>
+            </w:r>
+          </w:p>
+        </w:tc>
+        <w:tc>
+          <w:tcPr>
+            <w:tcW w:type="dxa" w:w="3456"/>
+            <w:vAlign w:val="center"/>
+            <w:tcMar>
+              <w:top w:w="80" w:type="dxa"/>
+              <w:start w:w="120" w:type="dxa"/>
+              <w:bottom w:w="80" w:type="dxa"/>
+              <w:end w:w="120" w:type="dxa"/>
+            </w:tcMar>
+            <w:shd w:fill="F8FAFC"/>
+          </w:tcPr>
+          <w:p>
+            <w:pPr>
+              <w:spacing w:after="0"/>
+              <w:jc w:val="left"/>
+            </w:pPr>
+            <w:r>
+              <w:rPr>
+                <w:rFonts w:ascii="Arial" w:hAnsi="Arial" w:eastAsia="Arial"/>
+                <w:b w:val="0"/>
+                <w:color w:val="111827"/>
+                <w:sz w:val="17"/>
+              </w:rPr>
+              <w:t>Сделать так, чтобы avatar причинно реагировал на завершенное действие, а не существовал как декоративный профиль.</w:t>
+            </w:r>
+          </w:p>
+        </w:tc>
+      </w:tr>
+    </w:tbl>
+    <w:p/>
+    <w:p>
+      <w:r>
+        <w:t>Из avatar-spec следует рабочая модель: пользователь дает входной сигнал дня, выбирает маленькое действие, проходит короткий reset, а avatar отвечает как “лучшая версия себя” и меняется микроскопически, но причинно. Важно не обещать магического преображения и не уходить в диагнозы. Avatar должен показывать: “ты сделал шаг, и это стало частью твоей версии себя”.</w:t>
+      </w:r>
+    </w:p>
+    <w:p>
+      <w:r>
+        <w:t>Гипотеза №3: востребованной может стать не отдельная медитация, привычка, astrology-механика или avatar-продукт, а связанная система, где смысл быстро превращается в действие, а действие становится видимым. Главный риск для этой гипотезы - скрытый прямой клон внутри первого пользовательского опыта P0-конкурентов, прежде всего Shepherd: Spiritual Bible BFF.</w:t>
       </w:r>
     </w:p>
     <w:p>
@@ -18973,7 +22198,7 @@
     </w:p>
     <w:p>
       <w:r>
-        <w:t>Конкурентная карта не доказывает, что поле свободно. Наоборот, она показывает плотную среду, где почти каждая часть петли уже кем-то закрывается. Сила гипотезы АУРА появляется только в более узкой формулировке: возможно, рынок занят отдельными функциями, но не занят причинной daily-loop системой.</w:t>
+        <w:t>Конкурентная карта не доказывает, что поле свободно. Наоборот, она показывает плотную среду, где почти каждая часть петли уже кем-то закрывается. Сила гипотезы АУРА появляется только в более узкой формулировке: возможно, рынок занят отдельными функциями, но не занят причинной системой ежедневного ритуала.</w:t>
       </w:r>
     </w:p>
     <w:p>
@@ -19687,7 +22912,7 @@
     <w:p/>
     <w:p>
       <w:r>
-        <w:t>Наиболее перспективная формулировка белого пятна: не “новый wellness app”, а короткая трансформационная петля с причинным visual feedback. Если прогресс меняется произвольно, продукт станет декоративным avatar toy. Если действие никак не связано со смыслом, продукт станет обычным habit tracker. Если reset живет отдельно, продукт станет библиотекой практик. Поэтому отличие должно проверяться именно на связке, а не на отдельных функциях.</w:t>
+        <w:t>Наиболее перспективная формулировка белого пятна: не “новое wellness-приложение”, а короткая трансформационная петля с причинной визуальной обратной связью. Если прогресс меняется произвольно, продукт станет декоративной avatar-игрушкой. Если действие никак не связано со смыслом, продукт станет обычным трекером привычек. Если reset живет отдельно, продукт станет библиотекой практик. Поэтому отличие должно проверяться именно на связке, а не на отдельных функциях.</w:t>
       </w:r>
     </w:p>
     <w:p>
@@ -19700,7 +22925,7 @@
     </w:p>
     <w:p>
       <w:r>
-        <w:t>Белое пятно нельзя оценивать отдельно от аудитории. Даже если full-loop candidates редки, это становится продуктовой возможностью только там, где есть люди с недавним поведением, текущими обходными решениями и языком боли. Поэтому следующий слой соединяет H3 и H5: по каждому мировому направлению видно, какой разрыв найден в конкурентной среде, какой ICP туда ложится и какой первый шаг проверки нужен.</w:t>
+        <w:t>Белое пятно нельзя оценивать отдельно от аудитории. Даже если кандидаты с похожей полной петлей редки, это становится продуктовой возможностью только там, где есть люди с недавним поведением, текущими обходными решениями и языком боли. Поэтому следующий слой соединяет H3 и H5: по каждому мировому направлению видно, какой разрыв найден в конкурентной среде, какой сегмент туда ложится и какой первый шаг проверки нужен.</w:t>
       </w:r>
     </w:p>
     <w:tbl>
@@ -19946,7 +23171,7 @@
                 <w:color w:val="111827"/>
                 <w:sz w:val="16"/>
               </w:rPr>
-              <w:t>узкое белое пятно выглядит правдоподобно: full-loop candidates редки, но нужен P0 ручную проверку</w:t>
+              <w:t>узкое белое пятно выглядит правдоподобно: кандидаты с похожей полной петлей редки, но нужна P0-ручная проверка</w:t>
             </w:r>
           </w:p>
         </w:tc>
@@ -20000,7 +23225,7 @@
                 <w:color w:val="111827"/>
                 <w:sz w:val="16"/>
               </w:rPr>
-              <w:t>сначала проверить P0-аудиторию через интервью о недавнем поведении, затем ручную проверку high-risk конкурентов</w:t>
+              <w:t>сначала проверить P0-аудиторию через интервью о недавнем поведении, затем ручную проверку конкурентов высокого риска</w:t>
             </w:r>
           </w:p>
         </w:tc>
@@ -20086,7 +23311,7 @@
                 <w:color w:val="111827"/>
                 <w:sz w:val="16"/>
               </w:rPr>
-              <w:t>узкое белое пятно выглядит правдоподобно: full-loop candidates редки, но нужен P0 ручную проверку</w:t>
+              <w:t>узкое белое пятно выглядит правдоподобно: кандидаты с похожей полной петлей редки, но нужна P0-ручная проверка</w:t>
             </w:r>
           </w:p>
         </w:tc>
@@ -20142,7 +23367,7 @@
                 <w:color w:val="111827"/>
                 <w:sz w:val="16"/>
               </w:rPr>
-              <w:t>использовать как compare-сегмент после P0 ICP и high-risk competitor ручную проверку</w:t>
+              <w:t>использовать как сегмент для сравнения после P0 ICP и ручную проверку конкурентов высокого риска</w:t>
             </w:r>
           </w:p>
         </w:tc>
@@ -20421,7 +23646,7 @@
                 <w:color w:val="111827"/>
                 <w:sz w:val="16"/>
               </w:rPr>
-              <w:t>сначала проверить P0-аудиторию через интервью о недавнем поведении, затем ручную проверку high-risk конкурентов</w:t>
+              <w:t>сначала проверить P0-аудиторию через интервью о недавнем поведении, затем ручную проверку конкурентов высокого риска</w:t>
             </w:r>
           </w:p>
         </w:tc>
@@ -20558,7 +23783,7 @@
                 <w:color w:val="111827"/>
                 <w:sz w:val="16"/>
               </w:rPr>
-              <w:t>сначала проверить P0-аудиторию через интервью о недавнем поведении, затем ручную проверку high-risk конкурентов</w:t>
+              <w:t>сначала проверить P0-аудиторию через интервью о недавнем поведении, затем ручную проверку конкурентов высокого риска</w:t>
             </w:r>
           </w:p>
         </w:tc>
@@ -20567,7 +23792,7 @@
     <w:p/>
     <w:p>
       <w:r>
-        <w:t>Практический вывод: mindfulness и avatar/identity выглядят как самые чистые whitespace-поля по редкости full-loop candidates, но они все равно требуют ручную проверку. Astrology/esoterics и coaching дают сильную аудиторию и деньги, но full-loop rate выше, поэтому вывод о белом пятне там слабее. Gaming остается бенчмарк механик, а не прямой рынок.</w:t>
+        <w:t>Практический вывод: mindfulness/reset и avatar/identity выглядят как самые чистые поля белого пятна по редкости кандидатов с похожей полной петлей, но они все равно требуют ручной проверки. Astrology/esoterics и coaching дают сильную аудиторию и деньги, но доля полной петли выше, поэтому вывод о белом пятне там слабее. Gaming остается источником механик, а не прямым рынком.</w:t>
       </w:r>
     </w:p>
     <w:p>
@@ -20580,12 +23805,12 @@
     </w:p>
     <w:p>
       <w:r>
-        <w:t>Белое пятно выглядит не как пустой рынок, а как узкая недособранная петля. Это более сильная и более честная формулировка: АУРА не должна победить все wellness, coaching, astrology, avatar и gaming-продукты; ей нужно доказать, что связка смысл -&gt; tiny действие -&gt; reset -&gt; видимый прогресс дает пользователю другой опыт.</w:t>
+        <w:t>Белое пятно выглядит не как пустой рынок, а как узкая недособранная петля. Это более сильная и более честная формулировка: АУРА не должна победить все wellness, coaching, astrology, avatar и gaming-продукты; ей нужно доказать, что связка смысл -&gt; маленькое действие -&gt; reset -&gt; видимый прогресс дает пользователю другой опыт.</w:t>
       </w:r>
     </w:p>
     <w:p>
       <w:r>
-        <w:t>Но даже хороший whitespace ничего не стоит без аудитории с недавнее поведение. Поэтому следующий блок отвечает на вопрос: кто уже живет рядом с этой задачей, какие текущие решения использует и с кого начинать интервью.</w:t>
+        <w:t>Но даже хорошее белое пятно ничего не стоит без аудитории с недавним поведением. Поэтому следующий блок отвечает на вопрос: кто уже живет рядом с этой задачей, какие текущие решения использует и с кого начинать интервью.</w:t>
       </w:r>
     </w:p>
     <w:p>
@@ -20704,7 +23929,7 @@
                 <w:color w:val="111827"/>
                 <w:sz w:val="17"/>
               </w:rPr>
-              <w:t>Score</w:t>
+              <w:t>Оценка</w:t>
             </w:r>
           </w:p>
         </w:tc>
@@ -21413,12 +24638,12 @@
     <w:p/>
     <w:p>
       <w:r>
-        <w:t>Первые интервью и прототипные сессии нужно начинать с двух P0-сегментов: Spiritual self-improvers и Habit and progress users. Первый проверяет, доверяет ли пользователь личному смыслу достаточно, чтобы перейти к действию. Второй проверяет, может ли прогресс, связанный с действием заменить обычный checklist или streak pressure.</w:t>
+        <w:t>Первые интервью и прототипные сессии нужно начинать с двух P0-сегментов: Spiritual self-improvers и Habit and progress users. Первый проверяет, доверяет ли пользователь личному смыслу настолько, чтобы перейти к действию. Второй проверяет, может ли прогресс, связанный с действием, заменить обычный чеклист или давление streak.</w:t>
       </w:r>
     </w:p>
     <w:p>
       <w:r>
-        <w:t>Гипотеза №4: первичная аудитория АУРА находится среди людей, которые уже имеют недавнее поведение вокруг ежедневного ритуала, прогресса, reset или личный смысл, и которым нужна не новая функция, а более короткий и связанный цикл изменения.</w:t>
+        <w:t>Гипотеза №4: первичная аудитория АУРА находится среди людей, у которых уже есть недавнее поведение вокруг ежедневного ритуала, прогресса, reset или личного смысла, и которым нужна не новая функция, а более короткий и связанный цикл изменения.</w:t>
       </w:r>
     </w:p>
     <w:p>
@@ -21503,7 +24728,7 @@
                 <w:color w:val="111827"/>
                 <w:sz w:val="17"/>
               </w:rPr>
-              <w:t>Signals</w:t>
+              <w:t>Сигналов</w:t>
             </w:r>
           </w:p>
         </w:tc>
@@ -22229,7 +25454,7 @@
     </w:p>
     <w:p>
       <w:r>
-        <w:t>Пока самая рабочая аудитория описывается как digital ritual users, но это не финальный ICP. Это набор людей, у которых уже есть поведение рядом с проблемой: они возвращаются к приложениям, ищут смысл или reset, используют трекеры, paid guidance или персонализацию и могут рассказать конкретный последний эпизод.</w:t>
+        <w:t>Пока самая рабочая аудитория описывается как digital ritual users, но это не финальный ICP. Это набор людей, у которых уже есть поведение рядом с проблемой: они возвращаются к приложениям, ищут смысл или reset, используют трекеры, платные подсказки или персонализацию и могут рассказать конкретный последний эпизод.</w:t>
       </w:r>
     </w:p>
     <w:p>
@@ -22247,7 +25472,12 @@
     </w:p>
     <w:p>
       <w:r>
-        <w:t>По текущим данным продуктовая модель должна опираться на несколько столпов. Первый столп - персональное отражение дня, которое не выглядит generic motivation. Второй - одно маленькое действие, связанное со смыслом. Третий - короткий reset, который снижает трение перед действием. Четвертый - видимый прогресс или avatar/identity feedback, который меняется причинно. Пятый - мягкий next-day hook без наказания и streak anxiety.</w:t>
+        <w:t>По текущим данным продуктовая модель должна опираться на несколько столпов. Первый столп - персональное отражение дня, которое не выглядит общей мотивационной фразой. Второй - одно маленькое действие, связанное со смыслом. Третий - короткий reset, который снижает трение перед действием. Четвертый - видимый прогресс или avatar/identity feedback, который меняется причинно. Пятый - мягкая причина вернуться завтра без наказания и тревоги из-за streak.</w:t>
+      </w:r>
+    </w:p>
+    <w:p>
+      <w:r>
+        <w:t>Если расширять ядро, его стоит описывать не как набор экранов, а как последовательность внутренних состояний пользователя. Сначала человек должен почувствовать: “это про меня сегодня”. Затем он должен увидеть одно действие, которое реально можно сделать. После этого ему нужен короткий reset, чтобы снизить сопротивление. И только затем появляется avatar/progress: не как приз, а как доказательство, что действие стало частью новой версии себя.</w:t>
       </w:r>
     </w:p>
     <w:tbl>
@@ -22297,7 +25527,7 @@
                 <w:color w:val="111827"/>
                 <w:sz w:val="17"/>
               </w:rPr>
-              <w:t>Шаг</w:t>
+              <w:t>Слой ядра</w:t>
             </w:r>
           </w:p>
         </w:tc>
@@ -22325,7 +25555,7 @@
                 <w:color w:val="111827"/>
                 <w:sz w:val="17"/>
               </w:rPr>
-              <w:t>Экран</w:t>
+              <w:t>Что происходит у пользователя</w:t>
             </w:r>
           </w:p>
         </w:tc>
@@ -22353,7 +25583,7 @@
                 <w:color w:val="111827"/>
                 <w:sz w:val="17"/>
               </w:rPr>
-              <w:t>Роль</w:t>
+              <w:t>Что должна делать АУРА</w:t>
             </w:r>
           </w:p>
         </w:tc>
@@ -22381,7 +25611,7 @@
                 <w:color w:val="111827"/>
                 <w:sz w:val="17"/>
               </w:rPr>
-              <w:t>Что должно сработать</w:t>
+              <w:t>Что сломает гипотезу</w:t>
             </w:r>
           </w:p>
         </w:tc>
@@ -22410,7 +25640,7 @@
                 <w:color w:val="111827"/>
                 <w:sz w:val="17"/>
               </w:rPr>
-              <w:t>1</w:t>
+              <w:t>1. Личное отражение</w:t>
             </w:r>
           </w:p>
         </w:tc>
@@ -22437,7 +25667,7 @@
                 <w:color w:val="111827"/>
                 <w:sz w:val="17"/>
               </w:rPr>
-              <w:t>Daily смысл entry</w:t>
+              <w:t>Пользователь ищет не общий совет, а точное попадание в состояние дня.</w:t>
             </w:r>
           </w:p>
         </w:tc>
@@ -22464,7 +25694,7 @@
                 <w:color w:val="111827"/>
                 <w:sz w:val="17"/>
               </w:rPr>
-              <w:t>Вход в личный смысл: пользователь должен почувствовать, что это не generic motivation и не жесткое предсказание.</w:t>
+              <w:t>АУРА дает мягкий смысловой вход: тема дня, короткий вопрос, один эмоциональный фокус.</w:t>
             </w:r>
           </w:p>
         </w:tc>
@@ -22491,7 +25721,7 @@
                 <w:color w:val="111827"/>
                 <w:sz w:val="17"/>
               </w:rPr>
-              <w:t>Participant can explain why this is personal rather than generic content.</w:t>
+              <w:t>Если звучит слишком общо или слишком эзотерически, доверие падает сразу.</w:t>
             </w:r>
           </w:p>
         </w:tc>
@@ -22521,7 +25751,7 @@
                 <w:color w:val="111827"/>
                 <w:sz w:val="17"/>
               </w:rPr>
-              <w:t>2</w:t>
+              <w:t>2. Маленькое действие</w:t>
             </w:r>
           </w:p>
         </w:tc>
@@ -22549,7 +25779,7 @@
                 <w:color w:val="111827"/>
                 <w:sz w:val="17"/>
               </w:rPr>
-              <w:t>Tiny context prompt</w:t>
+              <w:t>Пользователь не хочет обслуживать большую систему, ему нужен один посильный шаг.</w:t>
             </w:r>
           </w:p>
         </w:tc>
@@ -22577,7 +25807,7 @@
                 <w:color w:val="111827"/>
                 <w:sz w:val="17"/>
               </w:rPr>
-              <w:t>Минимальный контекст: петля получает живую точку дня, но не превращается в длинный onboarding.</w:t>
+              <w:t>Продукт переводит смысл в действие, которое можно выполнить сейчас или сегодня.</w:t>
             </w:r>
           </w:p>
         </w:tc>
@@ -22605,7 +25835,7 @@
                 <w:color w:val="111827"/>
                 <w:sz w:val="17"/>
               </w:rPr>
-              <w:t>Participant supplies a concrete lived moment or emotional target.</w:t>
+              <w:t>Если действие выглядит случайной задачей, АУРА превращается в habit tracker.</w:t>
             </w:r>
           </w:p>
         </w:tc>
@@ -22634,7 +25864,7 @@
                 <w:color w:val="111827"/>
                 <w:sz w:val="17"/>
               </w:rPr>
-              <w:t>3</w:t>
+              <w:t>3. Короткий reset</w:t>
             </w:r>
           </w:p>
         </w:tc>
@@ -22661,7 +25891,7 @@
                 <w:color w:val="111827"/>
                 <w:sz w:val="17"/>
               </w:rPr>
-              <w:t>One grounded действие</w:t>
+              <w:t>Перед действием часто есть тревога, усталость или внутреннее сопротивление.</w:t>
             </w:r>
           </w:p>
         </w:tc>
@@ -22688,7 +25918,7 @@
                 <w:color w:val="111827"/>
                 <w:sz w:val="17"/>
               </w:rPr>
-              <w:t>Перевод смысла в действие: центральная проверка, что АУРА не остается чтением или дневником.</w:t>
+              <w:t>Reset снижает трение и помогает перейти от мысли к движению.</w:t>
             </w:r>
           </w:p>
         </w:tc>
@@ -22715,7 +25945,7 @@
                 <w:color w:val="111827"/>
                 <w:sz w:val="17"/>
               </w:rPr>
-              <w:t>Participant sees the действие as doable and causally linked to the chosen theme.</w:t>
+              <w:t>Если reset живет отдельно, продукт становится очередной библиотекой практик.</w:t>
             </w:r>
           </w:p>
         </w:tc>
@@ -22745,7 +25975,7 @@
                 <w:color w:val="111827"/>
                 <w:sz w:val="17"/>
               </w:rPr>
-              <w:t>4</w:t>
+              <w:t>4. Avatar/progress</w:t>
             </w:r>
           </w:p>
         </w:tc>
@@ -22773,7 +26003,7 @@
                 <w:color w:val="111827"/>
                 <w:sz w:val="17"/>
               </w:rPr>
-              <w:t>Short reset</w:t>
+              <w:t>Пользователь хочет видеть, что шаг что-то изменил.</w:t>
             </w:r>
           </w:p>
         </w:tc>
@@ -22801,7 +26031,7 @@
                 <w:color w:val="111827"/>
                 <w:sz w:val="17"/>
               </w:rPr>
-              <w:t>Снижение трения: reset должен помогать начать действие, а не выглядеть как отдельная медитация ради медитации.</w:t>
+              <w:t>Avatar меняется причинно: маленький визуальный сдвиг связан с выполненным действием.</w:t>
             </w:r>
           </w:p>
         </w:tc>
@@ -22829,7 +26059,7 @@
                 <w:color w:val="111827"/>
                 <w:sz w:val="17"/>
               </w:rPr>
-              <w:t>Participant feels the reset makes действие easier without feeling clinical.</w:t>
+              <w:t>Если avatar меняется произвольно, он становится декорацией и теряет силу.</w:t>
             </w:r>
           </w:p>
         </w:tc>
@@ -22858,7 +26088,7 @@
                 <w:color w:val="111827"/>
                 <w:sz w:val="17"/>
               </w:rPr>
-              <w:t>5</w:t>
+              <w:t>5. Возврат завтра</w:t>
             </w:r>
           </w:p>
         </w:tc>
@@ -22885,7 +26115,7 @@
                 <w:color w:val="111827"/>
                 <w:sz w:val="17"/>
               </w:rPr>
-              <w:t>Доказательство действия</w:t>
+              <w:t>Пользователь должен понимать, зачем возвращаться, но без наказания за пропуск.</w:t>
             </w:r>
           </w:p>
         </w:tc>
@@ -22912,7 +26142,7 @@
                 <w:color w:val="111827"/>
                 <w:sz w:val="17"/>
               </w:rPr>
-              <w:t>Легкое доказательство действия: самоотчет должен быть достаточным и не ощущаться как контроль.</w:t>
+              <w:t>АУРА показывает мягкую историю движения: что изменилось сегодня и какой следующий шаг может быть завтра.</w:t>
             </w:r>
           </w:p>
         </w:tc>
@@ -22939,7 +26169,7 @@
                 <w:color w:val="111827"/>
                 <w:sz w:val="17"/>
               </w:rPr>
-              <w:t>Participant accepts lightweight самоотчет as enough evidence.</w:t>
+              <w:t>Если добавить давление streak, продукт попадет в отвергаемый productivity-паттерн.</w:t>
             </w:r>
           </w:p>
         </w:tc>
@@ -22969,7 +26199,7 @@
                 <w:color w:val="111827"/>
                 <w:sz w:val="17"/>
               </w:rPr>
-              <w:t>6</w:t>
+              <w:t>6. Платная глубина</w:t>
             </w:r>
           </w:p>
         </w:tc>
@@ -22997,7 +26227,7 @@
                 <w:color w:val="111827"/>
                 <w:sz w:val="17"/>
               </w:rPr>
-              <w:t>Identity/avatar feedback</w:t>
+              <w:t>Платить готовы не за обещание, а за глубину после понятного первого момента ценности.</w:t>
             </w:r>
           </w:p>
         </w:tc>
@@ -23025,7 +26255,7 @@
                 <w:color w:val="111827"/>
                 <w:sz w:val="17"/>
               </w:rPr>
-              <w:t>Причинная видимость прогресса: ключевой момент H4/H6, где действие должно объяснять изменение identity/avatar.</w:t>
+              <w:t>Платная часть может давать историю изменений, более богатый выбор avatar-настроек, персональные ритуалы и расширенную рефлексию.</w:t>
             </w:r>
           </w:p>
         </w:tc>
@@ -23053,7 +26283,150 @@
                 <w:color w:val="111827"/>
                 <w:sz w:val="17"/>
               </w:rPr>
-              <w:t>Participant understands действие -&gt; identity/avatar causality.</w:t>
+              <w:t>Если paywall появляется до ценности, денежный аргумент ослабевает.</w:t>
+            </w:r>
+          </w:p>
+        </w:tc>
+      </w:tr>
+    </w:tbl>
+    <w:p/>
+    <w:p>
+      <w:r>
+        <w:t>В таком виде центральная продуктовая ставка звучит жестче: АУРА должна доказать не “у нас есть avatar”, а “avatar показывает изменение личности через действие”. Это разные продукты. Первый конкурирует с редактором аватарок и игровыми наградами. Второй конкурирует за глубинную пользовательскую задачу: увидеть, что маленький шаг сегодня меняет мою траекторию.</w:t>
+      </w:r>
+    </w:p>
+    <w:tbl>
+      <w:tblPr>
+        <w:tblW w:type="dxa" w:w="9360"/>
+        <w:jc w:val="left"/>
+        <w:tblLayout w:type="fixed"/>
+        <w:tblLook w:firstColumn="1" w:firstRow="1" w:lastColumn="0" w:lastRow="0" w:noHBand="0" w:noVBand="1" w:val="04A0"/>
+        <w:tblInd w:w="120" w:type="dxa"/>
+        <w:tblBorders>
+          <w:top w:val="single" w:sz="4" w:space="0" w:color="CBD5E1"/>
+          <w:left w:val="single" w:sz="4" w:space="0" w:color="CBD5E1"/>
+          <w:bottom w:val="single" w:sz="4" w:space="0" w:color="CBD5E1"/>
+          <w:right w:val="single" w:sz="4" w:space="0" w:color="CBD5E1"/>
+          <w:insideH w:val="single" w:sz="4" w:space="0" w:color="CBD5E1"/>
+          <w:insideV w:val="single" w:sz="4" w:space="0" w:color="CBD5E1"/>
+        </w:tblBorders>
+      </w:tblPr>
+      <w:tblGrid>
+        <w:gridCol w:w="2340"/>
+        <w:gridCol w:w="2340"/>
+        <w:gridCol w:w="2340"/>
+        <w:gridCol w:w="2340"/>
+      </w:tblGrid>
+      <w:tr>
+        <w:tc>
+          <w:tcPr>
+            <w:tcW w:type="dxa" w:w="2448"/>
+            <w:vAlign w:val="center"/>
+            <w:tcMar>
+              <w:top w:w="80" w:type="dxa"/>
+              <w:start w:w="120" w:type="dxa"/>
+              <w:bottom w:w="80" w:type="dxa"/>
+              <w:end w:w="120" w:type="dxa"/>
+            </w:tcMar>
+            <w:shd w:fill="E8EEF5"/>
+          </w:tcPr>
+          <w:p>
+            <w:pPr>
+              <w:spacing w:after="0"/>
+              <w:jc w:val="left"/>
+            </w:pPr>
+            <w:r>
+              <w:rPr>
+                <w:rFonts w:ascii="Arial" w:hAnsi="Arial" w:eastAsia="Arial"/>
+                <w:b/>
+                <w:color w:val="111827"/>
+                <w:sz w:val="17"/>
+              </w:rPr>
+              <w:t>Шаг</w:t>
+            </w:r>
+          </w:p>
+        </w:tc>
+        <w:tc>
+          <w:tcPr>
+            <w:tcW w:type="dxa" w:w="1440"/>
+            <w:vAlign w:val="center"/>
+            <w:tcMar>
+              <w:top w:w="80" w:type="dxa"/>
+              <w:start w:w="120" w:type="dxa"/>
+              <w:bottom w:w="80" w:type="dxa"/>
+              <w:end w:w="120" w:type="dxa"/>
+            </w:tcMar>
+            <w:shd w:fill="E8EEF5"/>
+          </w:tcPr>
+          <w:p>
+            <w:pPr>
+              <w:spacing w:after="0"/>
+              <w:jc w:val="left"/>
+            </w:pPr>
+            <w:r>
+              <w:rPr>
+                <w:rFonts w:ascii="Arial" w:hAnsi="Arial" w:eastAsia="Arial"/>
+                <w:b/>
+                <w:color w:val="111827"/>
+                <w:sz w:val="17"/>
+              </w:rPr>
+              <w:t>Экран</w:t>
+            </w:r>
+          </w:p>
+        </w:tc>
+        <w:tc>
+          <w:tcPr>
+            <w:tcW w:type="dxa" w:w="2016"/>
+            <w:vAlign w:val="center"/>
+            <w:tcMar>
+              <w:top w:w="80" w:type="dxa"/>
+              <w:start w:w="120" w:type="dxa"/>
+              <w:bottom w:w="80" w:type="dxa"/>
+              <w:end w:w="120" w:type="dxa"/>
+            </w:tcMar>
+            <w:shd w:fill="E8EEF5"/>
+          </w:tcPr>
+          <w:p>
+            <w:pPr>
+              <w:spacing w:after="0"/>
+              <w:jc w:val="left"/>
+            </w:pPr>
+            <w:r>
+              <w:rPr>
+                <w:rFonts w:ascii="Arial" w:hAnsi="Arial" w:eastAsia="Arial"/>
+                <w:b/>
+                <w:color w:val="111827"/>
+                <w:sz w:val="17"/>
+              </w:rPr>
+              <w:t>Роль</w:t>
+            </w:r>
+          </w:p>
+        </w:tc>
+        <w:tc>
+          <w:tcPr>
+            <w:tcW w:type="dxa" w:w="3456"/>
+            <w:vAlign w:val="center"/>
+            <w:tcMar>
+              <w:top w:w="80" w:type="dxa"/>
+              <w:start w:w="120" w:type="dxa"/>
+              <w:bottom w:w="80" w:type="dxa"/>
+              <w:end w:w="120" w:type="dxa"/>
+            </w:tcMar>
+            <w:shd w:fill="E8EEF5"/>
+          </w:tcPr>
+          <w:p>
+            <w:pPr>
+              <w:spacing w:after="0"/>
+              <w:jc w:val="left"/>
+            </w:pPr>
+            <w:r>
+              <w:rPr>
+                <w:rFonts w:ascii="Arial" w:hAnsi="Arial" w:eastAsia="Arial"/>
+                <w:b/>
+                <w:color w:val="111827"/>
+                <w:sz w:val="17"/>
+              </w:rPr>
+              <w:t>Что должно сработать</w:t>
             </w:r>
           </w:p>
         </w:tc>
@@ -23082,7 +26455,7 @@
                 <w:color w:val="111827"/>
                 <w:sz w:val="17"/>
               </w:rPr>
-              <w:t>7</w:t>
+              <w:t>1</w:t>
             </w:r>
           </w:p>
         </w:tc>
@@ -23109,7 +26482,7 @@
                 <w:color w:val="111827"/>
                 <w:sz w:val="17"/>
               </w:rPr>
-              <w:t>Next-day hook</w:t>
+              <w:t>Вход в смысл дня</w:t>
             </w:r>
           </w:p>
         </w:tc>
@@ -23136,7 +26509,7 @@
                 <w:color w:val="111827"/>
                 <w:sz w:val="17"/>
               </w:rPr>
-              <w:t>Возврат без наказания: continuity должен поддерживать привычку без streak anxiety.</w:t>
+              <w:t>Вход в личный смысл: пользователь должен почувствовать, что это не общая мотивационная фраза и не жесткое предсказание.</w:t>
             </w:r>
           </w:p>
         </w:tc>
@@ -23163,7 +26536,7 @@
                 <w:color w:val="111827"/>
                 <w:sz w:val="17"/>
               </w:rPr>
-              <w:t>Participant wants to return and understands continuity.</w:t>
+              <w:t>Участник может объяснить, почему это ощущается личным, а не общей мотивационной фразой.</w:t>
             </w:r>
           </w:p>
         </w:tc>
@@ -23193,6 +26566,678 @@
                 <w:color w:val="111827"/>
                 <w:sz w:val="17"/>
               </w:rPr>
+              <w:t>2</w:t>
+            </w:r>
+          </w:p>
+        </w:tc>
+        <w:tc>
+          <w:tcPr>
+            <w:tcW w:type="dxa" w:w="1440"/>
+            <w:vAlign w:val="center"/>
+            <w:tcMar>
+              <w:top w:w="80" w:type="dxa"/>
+              <w:start w:w="120" w:type="dxa"/>
+              <w:bottom w:w="80" w:type="dxa"/>
+              <w:end w:w="120" w:type="dxa"/>
+            </w:tcMar>
+            <w:shd w:fill="F8FAFC"/>
+          </w:tcPr>
+          <w:p>
+            <w:pPr>
+              <w:spacing w:after="0"/>
+              <w:jc w:val="left"/>
+            </w:pPr>
+            <w:r>
+              <w:rPr>
+                <w:rFonts w:ascii="Arial" w:hAnsi="Arial" w:eastAsia="Arial"/>
+                <w:b w:val="0"/>
+                <w:color w:val="111827"/>
+                <w:sz w:val="17"/>
+              </w:rPr>
+              <w:t>Короткий контекст</w:t>
+            </w:r>
+          </w:p>
+        </w:tc>
+        <w:tc>
+          <w:tcPr>
+            <w:tcW w:type="dxa" w:w="2016"/>
+            <w:vAlign w:val="center"/>
+            <w:tcMar>
+              <w:top w:w="80" w:type="dxa"/>
+              <w:start w:w="120" w:type="dxa"/>
+              <w:bottom w:w="80" w:type="dxa"/>
+              <w:end w:w="120" w:type="dxa"/>
+            </w:tcMar>
+            <w:shd w:fill="F8FAFC"/>
+          </w:tcPr>
+          <w:p>
+            <w:pPr>
+              <w:spacing w:after="0"/>
+              <w:jc w:val="left"/>
+            </w:pPr>
+            <w:r>
+              <w:rPr>
+                <w:rFonts w:ascii="Arial" w:hAnsi="Arial" w:eastAsia="Arial"/>
+                <w:b w:val="0"/>
+                <w:color w:val="111827"/>
+                <w:sz w:val="17"/>
+              </w:rPr>
+              <w:t>Минимальный контекст: петля получает живую точку дня, но не превращается в длинный onboarding.</w:t>
+            </w:r>
+          </w:p>
+        </w:tc>
+        <w:tc>
+          <w:tcPr>
+            <w:tcW w:type="dxa" w:w="3456"/>
+            <w:vAlign w:val="center"/>
+            <w:tcMar>
+              <w:top w:w="80" w:type="dxa"/>
+              <w:start w:w="120" w:type="dxa"/>
+              <w:bottom w:w="80" w:type="dxa"/>
+              <w:end w:w="120" w:type="dxa"/>
+            </w:tcMar>
+            <w:shd w:fill="F8FAFC"/>
+          </w:tcPr>
+          <w:p>
+            <w:pPr>
+              <w:spacing w:after="0"/>
+              <w:jc w:val="left"/>
+            </w:pPr>
+            <w:r>
+              <w:rPr>
+                <w:rFonts w:ascii="Arial" w:hAnsi="Arial" w:eastAsia="Arial"/>
+                <w:b w:val="0"/>
+                <w:color w:val="111827"/>
+                <w:sz w:val="17"/>
+              </w:rPr>
+              <w:t>Участник дает конкретный эпизод дня или эмоциональную цель.</w:t>
+            </w:r>
+          </w:p>
+        </w:tc>
+      </w:tr>
+      <w:tr>
+        <w:tc>
+          <w:tcPr>
+            <w:tcW w:type="dxa" w:w="2448"/>
+            <w:vAlign w:val="center"/>
+            <w:tcMar>
+              <w:top w:w="80" w:type="dxa"/>
+              <w:start w:w="120" w:type="dxa"/>
+              <w:bottom w:w="80" w:type="dxa"/>
+              <w:end w:w="120" w:type="dxa"/>
+            </w:tcMar>
+          </w:tcPr>
+          <w:p>
+            <w:pPr>
+              <w:spacing w:after="0"/>
+              <w:jc w:val="left"/>
+            </w:pPr>
+            <w:r>
+              <w:rPr>
+                <w:rFonts w:ascii="Arial" w:hAnsi="Arial" w:eastAsia="Arial"/>
+                <w:b w:val="0"/>
+                <w:color w:val="111827"/>
+                <w:sz w:val="17"/>
+              </w:rPr>
+              <w:t>3</w:t>
+            </w:r>
+          </w:p>
+        </w:tc>
+        <w:tc>
+          <w:tcPr>
+            <w:tcW w:type="dxa" w:w="1440"/>
+            <w:vAlign w:val="center"/>
+            <w:tcMar>
+              <w:top w:w="80" w:type="dxa"/>
+              <w:start w:w="120" w:type="dxa"/>
+              <w:bottom w:w="80" w:type="dxa"/>
+              <w:end w:w="120" w:type="dxa"/>
+            </w:tcMar>
+          </w:tcPr>
+          <w:p>
+            <w:pPr>
+              <w:spacing w:after="0"/>
+              <w:jc w:val="left"/>
+            </w:pPr>
+            <w:r>
+              <w:rPr>
+                <w:rFonts w:ascii="Arial" w:hAnsi="Arial" w:eastAsia="Arial"/>
+                <w:b w:val="0"/>
+                <w:color w:val="111827"/>
+                <w:sz w:val="17"/>
+              </w:rPr>
+              <w:t>Одно конкретное действие</w:t>
+            </w:r>
+          </w:p>
+        </w:tc>
+        <w:tc>
+          <w:tcPr>
+            <w:tcW w:type="dxa" w:w="2016"/>
+            <w:vAlign w:val="center"/>
+            <w:tcMar>
+              <w:top w:w="80" w:type="dxa"/>
+              <w:start w:w="120" w:type="dxa"/>
+              <w:bottom w:w="80" w:type="dxa"/>
+              <w:end w:w="120" w:type="dxa"/>
+            </w:tcMar>
+          </w:tcPr>
+          <w:p>
+            <w:pPr>
+              <w:spacing w:after="0"/>
+              <w:jc w:val="left"/>
+            </w:pPr>
+            <w:r>
+              <w:rPr>
+                <w:rFonts w:ascii="Arial" w:hAnsi="Arial" w:eastAsia="Arial"/>
+                <w:b w:val="0"/>
+                <w:color w:val="111827"/>
+                <w:sz w:val="17"/>
+              </w:rPr>
+              <w:t>Перевод смысла в действие: центральная проверка, что АУРА не остается чтением или дневником.</w:t>
+            </w:r>
+          </w:p>
+        </w:tc>
+        <w:tc>
+          <w:tcPr>
+            <w:tcW w:type="dxa" w:w="3456"/>
+            <w:vAlign w:val="center"/>
+            <w:tcMar>
+              <w:top w:w="80" w:type="dxa"/>
+              <w:start w:w="120" w:type="dxa"/>
+              <w:bottom w:w="80" w:type="dxa"/>
+              <w:end w:w="120" w:type="dxa"/>
+            </w:tcMar>
+          </w:tcPr>
+          <w:p>
+            <w:pPr>
+              <w:spacing w:after="0"/>
+              <w:jc w:val="left"/>
+            </w:pPr>
+            <w:r>
+              <w:rPr>
+                <w:rFonts w:ascii="Arial" w:hAnsi="Arial" w:eastAsia="Arial"/>
+                <w:b w:val="0"/>
+                <w:color w:val="111827"/>
+                <w:sz w:val="17"/>
+              </w:rPr>
+              <w:t>Участник видит действие как посильное и связанное с выбранной темой.</w:t>
+            </w:r>
+          </w:p>
+        </w:tc>
+      </w:tr>
+      <w:tr>
+        <w:tc>
+          <w:tcPr>
+            <w:tcW w:type="dxa" w:w="2448"/>
+            <w:vAlign w:val="center"/>
+            <w:tcMar>
+              <w:top w:w="80" w:type="dxa"/>
+              <w:start w:w="120" w:type="dxa"/>
+              <w:bottom w:w="80" w:type="dxa"/>
+              <w:end w:w="120" w:type="dxa"/>
+            </w:tcMar>
+            <w:shd w:fill="F8FAFC"/>
+          </w:tcPr>
+          <w:p>
+            <w:pPr>
+              <w:spacing w:after="0"/>
+              <w:jc w:val="left"/>
+            </w:pPr>
+            <w:r>
+              <w:rPr>
+                <w:rFonts w:ascii="Arial" w:hAnsi="Arial" w:eastAsia="Arial"/>
+                <w:b w:val="0"/>
+                <w:color w:val="111827"/>
+                <w:sz w:val="17"/>
+              </w:rPr>
+              <w:t>4</w:t>
+            </w:r>
+          </w:p>
+        </w:tc>
+        <w:tc>
+          <w:tcPr>
+            <w:tcW w:type="dxa" w:w="1440"/>
+            <w:vAlign w:val="center"/>
+            <w:tcMar>
+              <w:top w:w="80" w:type="dxa"/>
+              <w:start w:w="120" w:type="dxa"/>
+              <w:bottom w:w="80" w:type="dxa"/>
+              <w:end w:w="120" w:type="dxa"/>
+            </w:tcMar>
+            <w:shd w:fill="F8FAFC"/>
+          </w:tcPr>
+          <w:p>
+            <w:pPr>
+              <w:spacing w:after="0"/>
+              <w:jc w:val="left"/>
+            </w:pPr>
+            <w:r>
+              <w:rPr>
+                <w:rFonts w:ascii="Arial" w:hAnsi="Arial" w:eastAsia="Arial"/>
+                <w:b w:val="0"/>
+                <w:color w:val="111827"/>
+                <w:sz w:val="17"/>
+              </w:rPr>
+              <w:t>Короткий reset</w:t>
+            </w:r>
+          </w:p>
+        </w:tc>
+        <w:tc>
+          <w:tcPr>
+            <w:tcW w:type="dxa" w:w="2016"/>
+            <w:vAlign w:val="center"/>
+            <w:tcMar>
+              <w:top w:w="80" w:type="dxa"/>
+              <w:start w:w="120" w:type="dxa"/>
+              <w:bottom w:w="80" w:type="dxa"/>
+              <w:end w:w="120" w:type="dxa"/>
+            </w:tcMar>
+            <w:shd w:fill="F8FAFC"/>
+          </w:tcPr>
+          <w:p>
+            <w:pPr>
+              <w:spacing w:after="0"/>
+              <w:jc w:val="left"/>
+            </w:pPr>
+            <w:r>
+              <w:rPr>
+                <w:rFonts w:ascii="Arial" w:hAnsi="Arial" w:eastAsia="Arial"/>
+                <w:b w:val="0"/>
+                <w:color w:val="111827"/>
+                <w:sz w:val="17"/>
+              </w:rPr>
+              <w:t>Снижение трения: reset должен помогать начать действие, а не выглядеть как отдельная медитация ради медитации.</w:t>
+            </w:r>
+          </w:p>
+        </w:tc>
+        <w:tc>
+          <w:tcPr>
+            <w:tcW w:type="dxa" w:w="3456"/>
+            <w:vAlign w:val="center"/>
+            <w:tcMar>
+              <w:top w:w="80" w:type="dxa"/>
+              <w:start w:w="120" w:type="dxa"/>
+              <w:bottom w:w="80" w:type="dxa"/>
+              <w:end w:w="120" w:type="dxa"/>
+            </w:tcMar>
+            <w:shd w:fill="F8FAFC"/>
+          </w:tcPr>
+          <w:p>
+            <w:pPr>
+              <w:spacing w:after="0"/>
+              <w:jc w:val="left"/>
+            </w:pPr>
+            <w:r>
+              <w:rPr>
+                <w:rFonts w:ascii="Arial" w:hAnsi="Arial" w:eastAsia="Arial"/>
+                <w:b w:val="0"/>
+                <w:color w:val="111827"/>
+                <w:sz w:val="17"/>
+              </w:rPr>
+              <w:t>Участник чувствует, что reset облегчает действие и не выглядит клиническим.</w:t>
+            </w:r>
+          </w:p>
+        </w:tc>
+      </w:tr>
+      <w:tr>
+        <w:tc>
+          <w:tcPr>
+            <w:tcW w:type="dxa" w:w="2448"/>
+            <w:vAlign w:val="center"/>
+            <w:tcMar>
+              <w:top w:w="80" w:type="dxa"/>
+              <w:start w:w="120" w:type="dxa"/>
+              <w:bottom w:w="80" w:type="dxa"/>
+              <w:end w:w="120" w:type="dxa"/>
+            </w:tcMar>
+          </w:tcPr>
+          <w:p>
+            <w:pPr>
+              <w:spacing w:after="0"/>
+              <w:jc w:val="left"/>
+            </w:pPr>
+            <w:r>
+              <w:rPr>
+                <w:rFonts w:ascii="Arial" w:hAnsi="Arial" w:eastAsia="Arial"/>
+                <w:b w:val="0"/>
+                <w:color w:val="111827"/>
+                <w:sz w:val="17"/>
+              </w:rPr>
+              <w:t>5</w:t>
+            </w:r>
+          </w:p>
+        </w:tc>
+        <w:tc>
+          <w:tcPr>
+            <w:tcW w:type="dxa" w:w="1440"/>
+            <w:vAlign w:val="center"/>
+            <w:tcMar>
+              <w:top w:w="80" w:type="dxa"/>
+              <w:start w:w="120" w:type="dxa"/>
+              <w:bottom w:w="80" w:type="dxa"/>
+              <w:end w:w="120" w:type="dxa"/>
+            </w:tcMar>
+          </w:tcPr>
+          <w:p>
+            <w:pPr>
+              <w:spacing w:after="0"/>
+              <w:jc w:val="left"/>
+            </w:pPr>
+            <w:r>
+              <w:rPr>
+                <w:rFonts w:ascii="Arial" w:hAnsi="Arial" w:eastAsia="Arial"/>
+                <w:b w:val="0"/>
+                <w:color w:val="111827"/>
+                <w:sz w:val="17"/>
+              </w:rPr>
+              <w:t>Подтверждение действия</w:t>
+            </w:r>
+          </w:p>
+        </w:tc>
+        <w:tc>
+          <w:tcPr>
+            <w:tcW w:type="dxa" w:w="2016"/>
+            <w:vAlign w:val="center"/>
+            <w:tcMar>
+              <w:top w:w="80" w:type="dxa"/>
+              <w:start w:w="120" w:type="dxa"/>
+              <w:bottom w:w="80" w:type="dxa"/>
+              <w:end w:w="120" w:type="dxa"/>
+            </w:tcMar>
+          </w:tcPr>
+          <w:p>
+            <w:pPr>
+              <w:spacing w:after="0"/>
+              <w:jc w:val="left"/>
+            </w:pPr>
+            <w:r>
+              <w:rPr>
+                <w:rFonts w:ascii="Arial" w:hAnsi="Arial" w:eastAsia="Arial"/>
+                <w:b w:val="0"/>
+                <w:color w:val="111827"/>
+                <w:sz w:val="17"/>
+              </w:rPr>
+              <w:t>Легкое доказательство действия: самоотчет должен быть достаточным и не ощущаться как контроль.</w:t>
+            </w:r>
+          </w:p>
+        </w:tc>
+        <w:tc>
+          <w:tcPr>
+            <w:tcW w:type="dxa" w:w="3456"/>
+            <w:vAlign w:val="center"/>
+            <w:tcMar>
+              <w:top w:w="80" w:type="dxa"/>
+              <w:start w:w="120" w:type="dxa"/>
+              <w:bottom w:w="80" w:type="dxa"/>
+              <w:end w:w="120" w:type="dxa"/>
+            </w:tcMar>
+          </w:tcPr>
+          <w:p>
+            <w:pPr>
+              <w:spacing w:after="0"/>
+              <w:jc w:val="left"/>
+            </w:pPr>
+            <w:r>
+              <w:rPr>
+                <w:rFonts w:ascii="Arial" w:hAnsi="Arial" w:eastAsia="Arial"/>
+                <w:b w:val="0"/>
+                <w:color w:val="111827"/>
+                <w:sz w:val="17"/>
+              </w:rPr>
+              <w:t>Участник принимает легкий самоотчет как достаточное подтверждение действия.</w:t>
+            </w:r>
+          </w:p>
+        </w:tc>
+      </w:tr>
+      <w:tr>
+        <w:tc>
+          <w:tcPr>
+            <w:tcW w:type="dxa" w:w="2448"/>
+            <w:vAlign w:val="center"/>
+            <w:tcMar>
+              <w:top w:w="80" w:type="dxa"/>
+              <w:start w:w="120" w:type="dxa"/>
+              <w:bottom w:w="80" w:type="dxa"/>
+              <w:end w:w="120" w:type="dxa"/>
+            </w:tcMar>
+            <w:shd w:fill="F8FAFC"/>
+          </w:tcPr>
+          <w:p>
+            <w:pPr>
+              <w:spacing w:after="0"/>
+              <w:jc w:val="left"/>
+            </w:pPr>
+            <w:r>
+              <w:rPr>
+                <w:rFonts w:ascii="Arial" w:hAnsi="Arial" w:eastAsia="Arial"/>
+                <w:b w:val="0"/>
+                <w:color w:val="111827"/>
+                <w:sz w:val="17"/>
+              </w:rPr>
+              <w:t>6</w:t>
+            </w:r>
+          </w:p>
+        </w:tc>
+        <w:tc>
+          <w:tcPr>
+            <w:tcW w:type="dxa" w:w="1440"/>
+            <w:vAlign w:val="center"/>
+            <w:tcMar>
+              <w:top w:w="80" w:type="dxa"/>
+              <w:start w:w="120" w:type="dxa"/>
+              <w:bottom w:w="80" w:type="dxa"/>
+              <w:end w:w="120" w:type="dxa"/>
+            </w:tcMar>
+            <w:shd w:fill="F8FAFC"/>
+          </w:tcPr>
+          <w:p>
+            <w:pPr>
+              <w:spacing w:after="0"/>
+              <w:jc w:val="left"/>
+            </w:pPr>
+            <w:r>
+              <w:rPr>
+                <w:rFonts w:ascii="Arial" w:hAnsi="Arial" w:eastAsia="Arial"/>
+                <w:b w:val="0"/>
+                <w:color w:val="111827"/>
+                <w:sz w:val="17"/>
+              </w:rPr>
+              <w:t>Обратная связь через identity/avatar</w:t>
+            </w:r>
+          </w:p>
+        </w:tc>
+        <w:tc>
+          <w:tcPr>
+            <w:tcW w:type="dxa" w:w="2016"/>
+            <w:vAlign w:val="center"/>
+            <w:tcMar>
+              <w:top w:w="80" w:type="dxa"/>
+              <w:start w:w="120" w:type="dxa"/>
+              <w:bottom w:w="80" w:type="dxa"/>
+              <w:end w:w="120" w:type="dxa"/>
+            </w:tcMar>
+            <w:shd w:fill="F8FAFC"/>
+          </w:tcPr>
+          <w:p>
+            <w:pPr>
+              <w:spacing w:after="0"/>
+              <w:jc w:val="left"/>
+            </w:pPr>
+            <w:r>
+              <w:rPr>
+                <w:rFonts w:ascii="Arial" w:hAnsi="Arial" w:eastAsia="Arial"/>
+                <w:b w:val="0"/>
+                <w:color w:val="111827"/>
+                <w:sz w:val="17"/>
+              </w:rPr>
+              <w:t>Причинная видимость прогресса: ключевой момент H4/H6, где действие должно объяснять изменение identity/avatar.</w:t>
+            </w:r>
+          </w:p>
+        </w:tc>
+        <w:tc>
+          <w:tcPr>
+            <w:tcW w:type="dxa" w:w="3456"/>
+            <w:vAlign w:val="center"/>
+            <w:tcMar>
+              <w:top w:w="80" w:type="dxa"/>
+              <w:start w:w="120" w:type="dxa"/>
+              <w:bottom w:w="80" w:type="dxa"/>
+              <w:end w:w="120" w:type="dxa"/>
+            </w:tcMar>
+            <w:shd w:fill="F8FAFC"/>
+          </w:tcPr>
+          <w:p>
+            <w:pPr>
+              <w:spacing w:after="0"/>
+              <w:jc w:val="left"/>
+            </w:pPr>
+            <w:r>
+              <w:rPr>
+                <w:rFonts w:ascii="Arial" w:hAnsi="Arial" w:eastAsia="Arial"/>
+                <w:b w:val="0"/>
+                <w:color w:val="111827"/>
+                <w:sz w:val="17"/>
+              </w:rPr>
+              <w:t>Участник понимает причинность: действие меняет identity/avatar.</w:t>
+            </w:r>
+          </w:p>
+        </w:tc>
+      </w:tr>
+      <w:tr>
+        <w:tc>
+          <w:tcPr>
+            <w:tcW w:type="dxa" w:w="2448"/>
+            <w:vAlign w:val="center"/>
+            <w:tcMar>
+              <w:top w:w="80" w:type="dxa"/>
+              <w:start w:w="120" w:type="dxa"/>
+              <w:bottom w:w="80" w:type="dxa"/>
+              <w:end w:w="120" w:type="dxa"/>
+            </w:tcMar>
+          </w:tcPr>
+          <w:p>
+            <w:pPr>
+              <w:spacing w:after="0"/>
+              <w:jc w:val="left"/>
+            </w:pPr>
+            <w:r>
+              <w:rPr>
+                <w:rFonts w:ascii="Arial" w:hAnsi="Arial" w:eastAsia="Arial"/>
+                <w:b w:val="0"/>
+                <w:color w:val="111827"/>
+                <w:sz w:val="17"/>
+              </w:rPr>
+              <w:t>7</w:t>
+            </w:r>
+          </w:p>
+        </w:tc>
+        <w:tc>
+          <w:tcPr>
+            <w:tcW w:type="dxa" w:w="1440"/>
+            <w:vAlign w:val="center"/>
+            <w:tcMar>
+              <w:top w:w="80" w:type="dxa"/>
+              <w:start w:w="120" w:type="dxa"/>
+              <w:bottom w:w="80" w:type="dxa"/>
+              <w:end w:w="120" w:type="dxa"/>
+            </w:tcMar>
+          </w:tcPr>
+          <w:p>
+            <w:pPr>
+              <w:spacing w:after="0"/>
+              <w:jc w:val="left"/>
+            </w:pPr>
+            <w:r>
+              <w:rPr>
+                <w:rFonts w:ascii="Arial" w:hAnsi="Arial" w:eastAsia="Arial"/>
+                <w:b w:val="0"/>
+                <w:color w:val="111827"/>
+                <w:sz w:val="17"/>
+              </w:rPr>
+              <w:t>Причина вернуться завтра</w:t>
+            </w:r>
+          </w:p>
+        </w:tc>
+        <w:tc>
+          <w:tcPr>
+            <w:tcW w:type="dxa" w:w="2016"/>
+            <w:vAlign w:val="center"/>
+            <w:tcMar>
+              <w:top w:w="80" w:type="dxa"/>
+              <w:start w:w="120" w:type="dxa"/>
+              <w:bottom w:w="80" w:type="dxa"/>
+              <w:end w:w="120" w:type="dxa"/>
+            </w:tcMar>
+          </w:tcPr>
+          <w:p>
+            <w:pPr>
+              <w:spacing w:after="0"/>
+              <w:jc w:val="left"/>
+            </w:pPr>
+            <w:r>
+              <w:rPr>
+                <w:rFonts w:ascii="Arial" w:hAnsi="Arial" w:eastAsia="Arial"/>
+                <w:b w:val="0"/>
+                <w:color w:val="111827"/>
+                <w:sz w:val="17"/>
+              </w:rPr>
+              <w:t>Возврат без наказания: continuity должен поддерживать привычку без streak anxiety.</w:t>
+            </w:r>
+          </w:p>
+        </w:tc>
+        <w:tc>
+          <w:tcPr>
+            <w:tcW w:type="dxa" w:w="3456"/>
+            <w:vAlign w:val="center"/>
+            <w:tcMar>
+              <w:top w:w="80" w:type="dxa"/>
+              <w:start w:w="120" w:type="dxa"/>
+              <w:bottom w:w="80" w:type="dxa"/>
+              <w:end w:w="120" w:type="dxa"/>
+            </w:tcMar>
+          </w:tcPr>
+          <w:p>
+            <w:pPr>
+              <w:spacing w:after="0"/>
+              <w:jc w:val="left"/>
+            </w:pPr>
+            <w:r>
+              <w:rPr>
+                <w:rFonts w:ascii="Arial" w:hAnsi="Arial" w:eastAsia="Arial"/>
+                <w:b w:val="0"/>
+                <w:color w:val="111827"/>
+                <w:sz w:val="17"/>
+              </w:rPr>
+              <w:t>Участник хочет вернуться и понимает продолжение петли.</w:t>
+            </w:r>
+          </w:p>
+        </w:tc>
+      </w:tr>
+      <w:tr>
+        <w:tc>
+          <w:tcPr>
+            <w:tcW w:type="dxa" w:w="2448"/>
+            <w:vAlign w:val="center"/>
+            <w:tcMar>
+              <w:top w:w="80" w:type="dxa"/>
+              <w:start w:w="120" w:type="dxa"/>
+              <w:bottom w:w="80" w:type="dxa"/>
+              <w:end w:w="120" w:type="dxa"/>
+            </w:tcMar>
+            <w:shd w:fill="F8FAFC"/>
+          </w:tcPr>
+          <w:p>
+            <w:pPr>
+              <w:spacing w:after="0"/>
+              <w:jc w:val="left"/>
+            </w:pPr>
+            <w:r>
+              <w:rPr>
+                <w:rFonts w:ascii="Arial" w:hAnsi="Arial" w:eastAsia="Arial"/>
+                <w:b w:val="0"/>
+                <w:color w:val="111827"/>
+                <w:sz w:val="17"/>
+              </w:rPr>
               <w:t>8</w:t>
             </w:r>
           </w:p>
@@ -23221,7 +27266,7 @@
                 <w:color w:val="111827"/>
                 <w:sz w:val="17"/>
               </w:rPr>
-              <w:t>Immediate value check</w:t>
+              <w:t>Проверка ценности сразу после петли</w:t>
             </w:r>
           </w:p>
         </w:tc>
@@ -23277,7 +27322,7 @@
                 <w:color w:val="111827"/>
                 <w:sz w:val="17"/>
               </w:rPr>
-              <w:t>Participant names the integrated loop in their own words.</w:t>
+              <w:t>Участник своими словами называет связанную петлю продукта.</w:t>
             </w:r>
           </w:p>
         </w:tc>
@@ -23608,7 +27653,7 @@
                 <w:color w:val="111827"/>
                 <w:sz w:val="16"/>
               </w:rPr>
-              <w:t>Минимум пять P0-приложений вручную прошли все ручную проверку-слоты, и полный скрытый клон АУРА не найден.</w:t>
+              <w:t>Минимум пять P0-приложений вручную прошли все слоты ручной проверки, и полный скрытый клон АУРА не найден.</w:t>
             </w:r>
           </w:p>
         </w:tc>
@@ -23749,7 +27794,7 @@
                 <w:color w:val="111827"/>
                 <w:sz w:val="16"/>
               </w:rPr>
-              <w:t>Для крупном платном конкурентов подтверждены цена, trial, граница paywall и связь платной глубины с похожей пользовательской работой.</w:t>
+              <w:t>Для крупных платных конкурентов подтверждены цена, trial, граница paywall и связь платной глубины с похожей пользовательской работой.</w:t>
             </w:r>
           </w:p>
         </w:tc>
@@ -23887,7 +27932,7 @@
                 <w:color w:val="111827"/>
                 <w:sz w:val="16"/>
               </w:rPr>
-              <w:t>участник называет платную глубину после free момента ценности и может объяснить продукт своими словами</w:t>
+              <w:t>участник называет платную глубину после бесплатного момента ценности и может объяснить продукт своими словами</w:t>
             </w:r>
           </w:p>
         </w:tc>
@@ -23914,7 +27959,7 @@
                 <w:color w:val="111827"/>
                 <w:sz w:val="16"/>
               </w:rPr>
-              <w:t>вся ценность ожидается бесплатно, платную глубину не связана с loop, или продукт невозможно пересказать</w:t>
+              <w:t>вся ценность ожидается бесплатно, платная глубина не связана с loop, или продукт невозможно пересказать</w:t>
             </w:r>
           </w:p>
         </w:tc>
@@ -24000,7 +28045,7 @@
                 <w:color w:val="111827"/>
                 <w:sz w:val="16"/>
               </w:rPr>
-              <w:t>После ручную проверку конкурента выпиши, что именно он закрывает: смысл, действие, reset, visual progress, identity/avatar, causality. Где петля разрывается?</w:t>
+              <w:t>После ручной проверки конкурента выпиши, что именно он закрывает: смысл, действие, reset, visual progress, identity/avatar, causality. Где петля разрывается?</w:t>
             </w:r>
           </w:p>
         </w:tc>
@@ -24028,7 +28073,7 @@
                 <w:color w:val="111827"/>
                 <w:sz w:val="16"/>
               </w:rPr>
-              <w:t>Ручной ручную проверку подтверждает, что behavior-tied identity/avatar progression остается редкой среди high-risk substitutes.</w:t>
+              <w:t>Ручная проверка подтверждает, что identity/avatar progress, связанный с действием, остается редкой среди близких конкурентов высокого риска.</w:t>
             </w:r>
           </w:p>
         </w:tc>
@@ -24056,7 +28101,7 @@
                 <w:color w:val="111827"/>
                 <w:sz w:val="16"/>
               </w:rPr>
-              <w:t>Walkthrough показывает распространенные full-loop substitutes или подтверждает скрытый клон.</w:t>
+              <w:t>Ручная проверка показывает распространенных конкурентов с полной петлей или подтверждает скрытый клон.</w:t>
             </w:r>
           </w:p>
         </w:tc>
@@ -24391,7 +28436,7 @@
                 <w:color w:val="111827"/>
                 <w:sz w:val="16"/>
               </w:rPr>
-              <w:t>Аудитория и текущими обходными решениями</w:t>
+              <w:t>Аудитория и текущие обходные решения</w:t>
             </w:r>
           </w:p>
         </w:tc>
@@ -24445,7 +28490,7 @@
                 <w:color w:val="111827"/>
                 <w:sz w:val="16"/>
               </w:rPr>
-              <w:t>участник рассказывает конкретный эпизод, текущими обходными решениями и язык боли без наводки</w:t>
+              <w:t>участник рассказывает конкретный эпизод, текущее обходное решение и язык боли без наводки</w:t>
             </w:r>
           </w:p>
         </w:tc>
@@ -24586,7 +28631,7 @@
                 <w:color w:val="111827"/>
                 <w:sz w:val="16"/>
               </w:rPr>
-              <w:t>MVP-петля остается понятной после прототипных сессий и обновления конкурентных ручную проверку.</w:t>
+              <w:t>MVP-петля остается понятной после прототипных сессий и обновления ручной проверки конкурентов.</w:t>
             </w:r>
           </w:p>
         </w:tc>
@@ -26122,7 +30167,7 @@
                 <w:color w:val="111827"/>
                 <w:sz w:val="16"/>
               </w:rPr>
-              <w:t>Первичная аудитория должна выбираться по недавнее поведение, а не по демографии.</w:t>
+              <w:t>Первичная аудитория должна выбираться по недавнему поведению, а не по демографии.</w:t>
             </w:r>
           </w:p>
         </w:tc>

</xml_diff>

<commit_message>
Add AURA product concept variants
</commit_message>
<xml_diff>
--- a/output/docx/alina-global-hypothesis-report-v1.docx
+++ b/output/docx/alina-global-hypothesis-report-v1.docx
@@ -25478,6 +25478,1170 @@
     <w:p>
       <w:r>
         <w:t>Если расширять ядро, его стоит описывать не как набор экранов, а как последовательность внутренних состояний пользователя. Сначала человек должен почувствовать: “это про меня сегодня”. Затем он должен увидеть одно действие, которое реально можно сделать. После этого ему нужен короткий reset, чтобы снизить сопротивление. И только затем появляется avatar/progress: не как приз, а как доказательство, что действие стало частью новой версии себя.</w:t>
+      </w:r>
+    </w:p>
+    <w:p>
+      <w:pPr>
+        <w:pStyle w:val="Heading2"/>
+      </w:pPr>
+      <w:r>
+        <w:t>Рабочие концепции приложения</w:t>
+      </w:r>
+    </w:p>
+    <w:p>
+      <w:r>
+        <w:t>Чтобы идея стала понятной для презентации, ее можно разложить на несколько продуктовых концепций. Во всех вариантах стартовый вход может быть очень простым: дата рождения, имя, время или место рождения, текущий запрос дня, настроение и короткий личный контекст. Важно, что дата рождения здесь не должна продаваться как жесткое предсказание. Она работает как символический и персональный вход: человек чувствует “это про меня”, но ценность появляется только тогда, когда этот вход превращается в действие, reset и видимый avatar/progress.</w:t>
+      </w:r>
+    </w:p>
+    <w:tbl>
+      <w:tblPr>
+        <w:tblW w:type="dxa" w:w="9360"/>
+        <w:jc w:val="left"/>
+        <w:tblLayout w:type="fixed"/>
+        <w:tblLook w:firstColumn="1" w:firstRow="1" w:lastColumn="0" w:lastRow="0" w:noHBand="0" w:noVBand="1" w:val="04A0"/>
+        <w:tblInd w:w="120" w:type="dxa"/>
+        <w:tblBorders>
+          <w:top w:val="single" w:sz="4" w:space="0" w:color="CBD5E1"/>
+          <w:left w:val="single" w:sz="4" w:space="0" w:color="CBD5E1"/>
+          <w:bottom w:val="single" w:sz="4" w:space="0" w:color="CBD5E1"/>
+          <w:right w:val="single" w:sz="4" w:space="0" w:color="CBD5E1"/>
+          <w:insideH w:val="single" w:sz="4" w:space="0" w:color="CBD5E1"/>
+          <w:insideV w:val="single" w:sz="4" w:space="0" w:color="CBD5E1"/>
+        </w:tblBorders>
+      </w:tblPr>
+      <w:tblGrid>
+        <w:gridCol w:w="1872"/>
+        <w:gridCol w:w="1872"/>
+        <w:gridCol w:w="1872"/>
+        <w:gridCol w:w="1872"/>
+        <w:gridCol w:w="1872"/>
+      </w:tblGrid>
+      <w:tr>
+        <w:tc>
+          <w:tcPr>
+            <w:tcW w:type="dxa" w:w="2376"/>
+            <w:vAlign w:val="center"/>
+            <w:tcMar>
+              <w:top w:w="80" w:type="dxa"/>
+              <w:start w:w="120" w:type="dxa"/>
+              <w:bottom w:w="80" w:type="dxa"/>
+              <w:end w:w="120" w:type="dxa"/>
+            </w:tcMar>
+            <w:shd w:fill="E8EEF5"/>
+          </w:tcPr>
+          <w:p>
+            <w:pPr>
+              <w:spacing w:after="0"/>
+              <w:jc w:val="left"/>
+            </w:pPr>
+            <w:r>
+              <w:rPr>
+                <w:rFonts w:ascii="Arial" w:hAnsi="Arial" w:eastAsia="Arial"/>
+                <w:b/>
+                <w:color w:val="111827"/>
+                <w:sz w:val="16"/>
+              </w:rPr>
+              <w:t>Концепция</w:t>
+            </w:r>
+          </w:p>
+        </w:tc>
+        <w:tc>
+          <w:tcPr>
+            <w:tcW w:type="dxa" w:w="1224"/>
+            <w:vAlign w:val="center"/>
+            <w:tcMar>
+              <w:top w:w="80" w:type="dxa"/>
+              <w:start w:w="120" w:type="dxa"/>
+              <w:bottom w:w="80" w:type="dxa"/>
+              <w:end w:w="120" w:type="dxa"/>
+            </w:tcMar>
+            <w:shd w:fill="E8EEF5"/>
+          </w:tcPr>
+          <w:p>
+            <w:pPr>
+              <w:spacing w:after="0"/>
+              <w:jc w:val="left"/>
+            </w:pPr>
+            <w:r>
+              <w:rPr>
+                <w:rFonts w:ascii="Arial" w:hAnsi="Arial" w:eastAsia="Arial"/>
+                <w:b/>
+                <w:color w:val="111827"/>
+                <w:sz w:val="16"/>
+              </w:rPr>
+              <w:t>Что вводит человек</w:t>
+            </w:r>
+          </w:p>
+        </w:tc>
+        <w:tc>
+          <w:tcPr>
+            <w:tcW w:type="dxa" w:w="1224"/>
+            <w:vAlign w:val="center"/>
+            <w:tcMar>
+              <w:top w:w="80" w:type="dxa"/>
+              <w:start w:w="120" w:type="dxa"/>
+              <w:bottom w:w="80" w:type="dxa"/>
+              <w:end w:w="120" w:type="dxa"/>
+            </w:tcMar>
+            <w:shd w:fill="E8EEF5"/>
+          </w:tcPr>
+          <w:p>
+            <w:pPr>
+              <w:spacing w:after="0"/>
+              <w:jc w:val="left"/>
+            </w:pPr>
+            <w:r>
+              <w:rPr>
+                <w:rFonts w:ascii="Arial" w:hAnsi="Arial" w:eastAsia="Arial"/>
+                <w:b/>
+                <w:color w:val="111827"/>
+                <w:sz w:val="16"/>
+              </w:rPr>
+              <w:t>Что получает</w:t>
+            </w:r>
+          </w:p>
+        </w:tc>
+        <w:tc>
+          <w:tcPr>
+            <w:tcW w:type="dxa" w:w="1944"/>
+            <w:vAlign w:val="center"/>
+            <w:tcMar>
+              <w:top w:w="80" w:type="dxa"/>
+              <w:start w:w="120" w:type="dxa"/>
+              <w:bottom w:w="80" w:type="dxa"/>
+              <w:end w:w="120" w:type="dxa"/>
+            </w:tcMar>
+            <w:shd w:fill="E8EEF5"/>
+          </w:tcPr>
+          <w:p>
+            <w:pPr>
+              <w:spacing w:after="0"/>
+              <w:jc w:val="left"/>
+            </w:pPr>
+            <w:r>
+              <w:rPr>
+                <w:rFonts w:ascii="Arial" w:hAnsi="Arial" w:eastAsia="Arial"/>
+                <w:b/>
+                <w:color w:val="111827"/>
+                <w:sz w:val="16"/>
+              </w:rPr>
+              <w:t>Как соединяется с АУРОЙ</w:t>
+            </w:r>
+          </w:p>
+        </w:tc>
+        <w:tc>
+          <w:tcPr>
+            <w:tcW w:type="dxa" w:w="2592"/>
+            <w:vAlign w:val="center"/>
+            <w:tcMar>
+              <w:top w:w="80" w:type="dxa"/>
+              <w:start w:w="120" w:type="dxa"/>
+              <w:bottom w:w="80" w:type="dxa"/>
+              <w:end w:w="120" w:type="dxa"/>
+            </w:tcMar>
+            <w:shd w:fill="E8EEF5"/>
+          </w:tcPr>
+          <w:p>
+            <w:pPr>
+              <w:spacing w:after="0"/>
+              <w:jc w:val="left"/>
+            </w:pPr>
+            <w:r>
+              <w:rPr>
+                <w:rFonts w:ascii="Arial" w:hAnsi="Arial" w:eastAsia="Arial"/>
+                <w:b/>
+                <w:color w:val="111827"/>
+                <w:sz w:val="16"/>
+              </w:rPr>
+              <w:t>Почему это может работать</w:t>
+            </w:r>
+          </w:p>
+        </w:tc>
+      </w:tr>
+      <w:tr>
+        <w:tc>
+          <w:tcPr>
+            <w:tcW w:type="dxa" w:w="2376"/>
+            <w:vAlign w:val="center"/>
+            <w:tcMar>
+              <w:top w:w="80" w:type="dxa"/>
+              <w:start w:w="120" w:type="dxa"/>
+              <w:bottom w:w="80" w:type="dxa"/>
+              <w:end w:w="120" w:type="dxa"/>
+            </w:tcMar>
+          </w:tcPr>
+          <w:p>
+            <w:pPr>
+              <w:spacing w:after="0"/>
+              <w:jc w:val="left"/>
+            </w:pPr>
+            <w:r>
+              <w:rPr>
+                <w:rFonts w:ascii="Arial" w:hAnsi="Arial" w:eastAsia="Arial"/>
+                <w:b w:val="0"/>
+                <w:color w:val="111827"/>
+                <w:sz w:val="16"/>
+              </w:rPr>
+              <w:t>1. Daily Aura Code</w:t>
+            </w:r>
+          </w:p>
+        </w:tc>
+        <w:tc>
+          <w:tcPr>
+            <w:tcW w:type="dxa" w:w="1224"/>
+            <w:vAlign w:val="center"/>
+            <w:tcMar>
+              <w:top w:w="80" w:type="dxa"/>
+              <w:start w:w="120" w:type="dxa"/>
+              <w:bottom w:w="80" w:type="dxa"/>
+              <w:end w:w="120" w:type="dxa"/>
+            </w:tcMar>
+          </w:tcPr>
+          <w:p>
+            <w:pPr>
+              <w:spacing w:after="0"/>
+              <w:jc w:val="left"/>
+            </w:pPr>
+            <w:r>
+              <w:rPr>
+                <w:rFonts w:ascii="Arial" w:hAnsi="Arial" w:eastAsia="Arial"/>
+                <w:b w:val="0"/>
+                <w:color w:val="111827"/>
+                <w:sz w:val="16"/>
+              </w:rPr>
+              <w:t>Дата рождения + короткий вопрос “что сегодня хочется изменить?”</w:t>
+            </w:r>
+          </w:p>
+        </w:tc>
+        <w:tc>
+          <w:tcPr>
+            <w:tcW w:type="dxa" w:w="1224"/>
+            <w:vAlign w:val="center"/>
+            <w:tcMar>
+              <w:top w:w="80" w:type="dxa"/>
+              <w:start w:w="120" w:type="dxa"/>
+              <w:bottom w:w="80" w:type="dxa"/>
+              <w:end w:w="120" w:type="dxa"/>
+            </w:tcMar>
+          </w:tcPr>
+          <w:p>
+            <w:pPr>
+              <w:spacing w:after="0"/>
+              <w:jc w:val="left"/>
+            </w:pPr>
+            <w:r>
+              <w:rPr>
+                <w:rFonts w:ascii="Arial" w:hAnsi="Arial" w:eastAsia="Arial"/>
+                <w:b w:val="0"/>
+                <w:color w:val="111827"/>
+                <w:sz w:val="16"/>
+              </w:rPr>
+              <w:t>Персональный код дня: тема, риск дня, ресурс дня и одно маленькое действие.</w:t>
+            </w:r>
+          </w:p>
+        </w:tc>
+        <w:tc>
+          <w:tcPr>
+            <w:tcW w:type="dxa" w:w="1944"/>
+            <w:vAlign w:val="center"/>
+            <w:tcMar>
+              <w:top w:w="80" w:type="dxa"/>
+              <w:start w:w="120" w:type="dxa"/>
+              <w:bottom w:w="80" w:type="dxa"/>
+              <w:end w:w="120" w:type="dxa"/>
+            </w:tcMar>
+          </w:tcPr>
+          <w:p>
+            <w:pPr>
+              <w:spacing w:after="0"/>
+              <w:jc w:val="left"/>
+            </w:pPr>
+            <w:r>
+              <w:rPr>
+                <w:rFonts w:ascii="Arial" w:hAnsi="Arial" w:eastAsia="Arial"/>
+                <w:b w:val="0"/>
+                <w:color w:val="111827"/>
+                <w:sz w:val="16"/>
+              </w:rPr>
+              <w:t>Смысл дня превращается в действие; после выполнения avatar получает маленький визуальный слой.</w:t>
+            </w:r>
+          </w:p>
+        </w:tc>
+        <w:tc>
+          <w:tcPr>
+            <w:tcW w:type="dxa" w:w="2592"/>
+            <w:vAlign w:val="center"/>
+            <w:tcMar>
+              <w:top w:w="80" w:type="dxa"/>
+              <w:start w:w="120" w:type="dxa"/>
+              <w:bottom w:w="80" w:type="dxa"/>
+              <w:end w:w="120" w:type="dxa"/>
+            </w:tcMar>
+          </w:tcPr>
+          <w:p>
+            <w:pPr>
+              <w:spacing w:after="0"/>
+              <w:jc w:val="left"/>
+            </w:pPr>
+            <w:r>
+              <w:rPr>
+                <w:rFonts w:ascii="Arial" w:hAnsi="Arial" w:eastAsia="Arial"/>
+                <w:b w:val="0"/>
+                <w:color w:val="111827"/>
+                <w:sz w:val="16"/>
+              </w:rPr>
+              <w:t>Подходит как самый простой первый экран: быстро, лично, без тяжелого onboarding.</w:t>
+            </w:r>
+          </w:p>
+        </w:tc>
+      </w:tr>
+      <w:tr>
+        <w:tc>
+          <w:tcPr>
+            <w:tcW w:type="dxa" w:w="2376"/>
+            <w:vAlign w:val="center"/>
+            <w:tcMar>
+              <w:top w:w="80" w:type="dxa"/>
+              <w:start w:w="120" w:type="dxa"/>
+              <w:bottom w:w="80" w:type="dxa"/>
+              <w:end w:w="120" w:type="dxa"/>
+            </w:tcMar>
+            <w:shd w:fill="F8FAFC"/>
+          </w:tcPr>
+          <w:p>
+            <w:pPr>
+              <w:spacing w:after="0"/>
+              <w:jc w:val="left"/>
+            </w:pPr>
+            <w:r>
+              <w:rPr>
+                <w:rFonts w:ascii="Arial" w:hAnsi="Arial" w:eastAsia="Arial"/>
+                <w:b w:val="0"/>
+                <w:color w:val="111827"/>
+                <w:sz w:val="16"/>
+              </w:rPr>
+              <w:t>2. Future Self Avatar</w:t>
+            </w:r>
+          </w:p>
+        </w:tc>
+        <w:tc>
+          <w:tcPr>
+            <w:tcW w:type="dxa" w:w="1224"/>
+            <w:vAlign w:val="center"/>
+            <w:tcMar>
+              <w:top w:w="80" w:type="dxa"/>
+              <w:start w:w="120" w:type="dxa"/>
+              <w:bottom w:w="80" w:type="dxa"/>
+              <w:end w:w="120" w:type="dxa"/>
+            </w:tcMar>
+            <w:shd w:fill="F8FAFC"/>
+          </w:tcPr>
+          <w:p>
+            <w:pPr>
+              <w:spacing w:after="0"/>
+              <w:jc w:val="left"/>
+            </w:pPr>
+            <w:r>
+              <w:rPr>
+                <w:rFonts w:ascii="Arial" w:hAnsi="Arial" w:eastAsia="Arial"/>
+                <w:b w:val="0"/>
+                <w:color w:val="111827"/>
+                <w:sz w:val="16"/>
+              </w:rPr>
+              <w:t>Дата рождения + цель пользователя: спокойствие, уверенность, фокус, отношения, тело, деньги.</w:t>
+            </w:r>
+          </w:p>
+        </w:tc>
+        <w:tc>
+          <w:tcPr>
+            <w:tcW w:type="dxa" w:w="1224"/>
+            <w:vAlign w:val="center"/>
+            <w:tcMar>
+              <w:top w:w="80" w:type="dxa"/>
+              <w:start w:w="120" w:type="dxa"/>
+              <w:bottom w:w="80" w:type="dxa"/>
+              <w:end w:w="120" w:type="dxa"/>
+            </w:tcMar>
+            <w:shd w:fill="F8FAFC"/>
+          </w:tcPr>
+          <w:p>
+            <w:pPr>
+              <w:spacing w:after="0"/>
+              <w:jc w:val="left"/>
+            </w:pPr>
+            <w:r>
+              <w:rPr>
+                <w:rFonts w:ascii="Arial" w:hAnsi="Arial" w:eastAsia="Arial"/>
+                <w:b w:val="0"/>
+                <w:color w:val="111827"/>
+                <w:sz w:val="16"/>
+              </w:rPr>
+              <w:t>Образ будущей версии себя и карта качеств, которые человек постепенно “прокачивает”.</w:t>
+            </w:r>
+          </w:p>
+        </w:tc>
+        <w:tc>
+          <w:tcPr>
+            <w:tcW w:type="dxa" w:w="1944"/>
+            <w:vAlign w:val="center"/>
+            <w:tcMar>
+              <w:top w:w="80" w:type="dxa"/>
+              <w:start w:w="120" w:type="dxa"/>
+              <w:bottom w:w="80" w:type="dxa"/>
+              <w:end w:w="120" w:type="dxa"/>
+            </w:tcMar>
+            <w:shd w:fill="F8FAFC"/>
+          </w:tcPr>
+          <w:p>
+            <w:pPr>
+              <w:spacing w:after="0"/>
+              <w:jc w:val="left"/>
+            </w:pPr>
+            <w:r>
+              <w:rPr>
+                <w:rFonts w:ascii="Arial" w:hAnsi="Arial" w:eastAsia="Arial"/>
+                <w:b w:val="0"/>
+                <w:color w:val="111827"/>
+                <w:sz w:val="16"/>
+              </w:rPr>
+              <w:t>Каждое действие усиливает конкретное качество avatar: ясность, смелость, мягкость, дисциплина.</w:t>
+            </w:r>
+          </w:p>
+        </w:tc>
+        <w:tc>
+          <w:tcPr>
+            <w:tcW w:type="dxa" w:w="2592"/>
+            <w:vAlign w:val="center"/>
+            <w:tcMar>
+              <w:top w:w="80" w:type="dxa"/>
+              <w:start w:w="120" w:type="dxa"/>
+              <w:bottom w:w="80" w:type="dxa"/>
+              <w:end w:w="120" w:type="dxa"/>
+            </w:tcMar>
+            <w:shd w:fill="F8FAFC"/>
+          </w:tcPr>
+          <w:p>
+            <w:pPr>
+              <w:spacing w:after="0"/>
+              <w:jc w:val="left"/>
+            </w:pPr>
+            <w:r>
+              <w:rPr>
+                <w:rFonts w:ascii="Arial" w:hAnsi="Arial" w:eastAsia="Arial"/>
+                <w:b w:val="0"/>
+                <w:color w:val="111827"/>
+                <w:sz w:val="16"/>
+              </w:rPr>
+              <w:t>Делает avatar центральной механикой, а не украшением профиля.</w:t>
+            </w:r>
+          </w:p>
+        </w:tc>
+      </w:tr>
+      <w:tr>
+        <w:tc>
+          <w:tcPr>
+            <w:tcW w:type="dxa" w:w="2376"/>
+            <w:vAlign w:val="center"/>
+            <w:tcMar>
+              <w:top w:w="80" w:type="dxa"/>
+              <w:start w:w="120" w:type="dxa"/>
+              <w:bottom w:w="80" w:type="dxa"/>
+              <w:end w:w="120" w:type="dxa"/>
+            </w:tcMar>
+          </w:tcPr>
+          <w:p>
+            <w:pPr>
+              <w:spacing w:after="0"/>
+              <w:jc w:val="left"/>
+            </w:pPr>
+            <w:r>
+              <w:rPr>
+                <w:rFonts w:ascii="Arial" w:hAnsi="Arial" w:eastAsia="Arial"/>
+                <w:b w:val="0"/>
+                <w:color w:val="111827"/>
+                <w:sz w:val="16"/>
+              </w:rPr>
+              <w:t>3. Ritual of the Day</w:t>
+            </w:r>
+          </w:p>
+        </w:tc>
+        <w:tc>
+          <w:tcPr>
+            <w:tcW w:type="dxa" w:w="1224"/>
+            <w:vAlign w:val="center"/>
+            <w:tcMar>
+              <w:top w:w="80" w:type="dxa"/>
+              <w:start w:w="120" w:type="dxa"/>
+              <w:bottom w:w="80" w:type="dxa"/>
+              <w:end w:w="120" w:type="dxa"/>
+            </w:tcMar>
+          </w:tcPr>
+          <w:p>
+            <w:pPr>
+              <w:spacing w:after="0"/>
+              <w:jc w:val="left"/>
+            </w:pPr>
+            <w:r>
+              <w:rPr>
+                <w:rFonts w:ascii="Arial" w:hAnsi="Arial" w:eastAsia="Arial"/>
+                <w:b w:val="0"/>
+                <w:color w:val="111827"/>
+                <w:sz w:val="16"/>
+              </w:rPr>
+              <w:t>Дата рождения + состояние сейчас: тревожно, устало, расфокусировано, пусто, вдохновленно.</w:t>
+            </w:r>
+          </w:p>
+        </w:tc>
+        <w:tc>
+          <w:tcPr>
+            <w:tcW w:type="dxa" w:w="1224"/>
+            <w:vAlign w:val="center"/>
+            <w:tcMar>
+              <w:top w:w="80" w:type="dxa"/>
+              <w:start w:w="120" w:type="dxa"/>
+              <w:bottom w:w="80" w:type="dxa"/>
+              <w:end w:w="120" w:type="dxa"/>
+            </w:tcMar>
+          </w:tcPr>
+          <w:p>
+            <w:pPr>
+              <w:spacing w:after="0"/>
+              <w:jc w:val="left"/>
+            </w:pPr>
+            <w:r>
+              <w:rPr>
+                <w:rFonts w:ascii="Arial" w:hAnsi="Arial" w:eastAsia="Arial"/>
+                <w:b w:val="0"/>
+                <w:color w:val="111827"/>
+                <w:sz w:val="16"/>
+              </w:rPr>
+              <w:t>Короткий ежедневный ритуал: смысловая подсказка, 30-60 секунд reset и действие на сегодня.</w:t>
+            </w:r>
+          </w:p>
+        </w:tc>
+        <w:tc>
+          <w:tcPr>
+            <w:tcW w:type="dxa" w:w="1944"/>
+            <w:vAlign w:val="center"/>
+            <w:tcMar>
+              <w:top w:w="80" w:type="dxa"/>
+              <w:start w:w="120" w:type="dxa"/>
+              <w:bottom w:w="80" w:type="dxa"/>
+              <w:end w:w="120" w:type="dxa"/>
+            </w:tcMar>
+          </w:tcPr>
+          <w:p>
+            <w:pPr>
+              <w:spacing w:after="0"/>
+              <w:jc w:val="left"/>
+            </w:pPr>
+            <w:r>
+              <w:rPr>
+                <w:rFonts w:ascii="Arial" w:hAnsi="Arial" w:eastAsia="Arial"/>
+                <w:b w:val="0"/>
+                <w:color w:val="111827"/>
+                <w:sz w:val="16"/>
+              </w:rPr>
+              <w:t>Reset снижает сопротивление, действие завершает ритуал, прогресс фиксируется без наказания за пропуск.</w:t>
+            </w:r>
+          </w:p>
+        </w:tc>
+        <w:tc>
+          <w:tcPr>
+            <w:tcW w:type="dxa" w:w="2592"/>
+            <w:vAlign w:val="center"/>
+            <w:tcMar>
+              <w:top w:w="80" w:type="dxa"/>
+              <w:start w:w="120" w:type="dxa"/>
+              <w:bottom w:w="80" w:type="dxa"/>
+              <w:end w:w="120" w:type="dxa"/>
+            </w:tcMar>
+          </w:tcPr>
+          <w:p>
+            <w:pPr>
+              <w:spacing w:after="0"/>
+              <w:jc w:val="left"/>
+            </w:pPr>
+            <w:r>
+              <w:rPr>
+                <w:rFonts w:ascii="Arial" w:hAnsi="Arial" w:eastAsia="Arial"/>
+                <w:b w:val="0"/>
+                <w:color w:val="111827"/>
+                <w:sz w:val="16"/>
+              </w:rPr>
+              <w:t>Связывает spiritual/wellness вход с практической ежедневной привычкой.</w:t>
+            </w:r>
+          </w:p>
+        </w:tc>
+      </w:tr>
+      <w:tr>
+        <w:tc>
+          <w:tcPr>
+            <w:tcW w:type="dxa" w:w="2376"/>
+            <w:vAlign w:val="center"/>
+            <w:tcMar>
+              <w:top w:w="80" w:type="dxa"/>
+              <w:start w:w="120" w:type="dxa"/>
+              <w:bottom w:w="80" w:type="dxa"/>
+              <w:end w:w="120" w:type="dxa"/>
+            </w:tcMar>
+            <w:shd w:fill="F8FAFC"/>
+          </w:tcPr>
+          <w:p>
+            <w:pPr>
+              <w:spacing w:after="0"/>
+              <w:jc w:val="left"/>
+            </w:pPr>
+            <w:r>
+              <w:rPr>
+                <w:rFonts w:ascii="Arial" w:hAnsi="Arial" w:eastAsia="Arial"/>
+                <w:b w:val="0"/>
+                <w:color w:val="111827"/>
+                <w:sz w:val="16"/>
+              </w:rPr>
+              <w:t>4. Symbol to Action</w:t>
+            </w:r>
+          </w:p>
+        </w:tc>
+        <w:tc>
+          <w:tcPr>
+            <w:tcW w:type="dxa" w:w="1224"/>
+            <w:vAlign w:val="center"/>
+            <w:tcMar>
+              <w:top w:w="80" w:type="dxa"/>
+              <w:start w:w="120" w:type="dxa"/>
+              <w:bottom w:w="80" w:type="dxa"/>
+              <w:end w:w="120" w:type="dxa"/>
+            </w:tcMar>
+            <w:shd w:fill="F8FAFC"/>
+          </w:tcPr>
+          <w:p>
+            <w:pPr>
+              <w:spacing w:after="0"/>
+              <w:jc w:val="left"/>
+            </w:pPr>
+            <w:r>
+              <w:rPr>
+                <w:rFonts w:ascii="Arial" w:hAnsi="Arial" w:eastAsia="Arial"/>
+                <w:b w:val="0"/>
+                <w:color w:val="111827"/>
+                <w:sz w:val="16"/>
+              </w:rPr>
+              <w:t>Дата рождения + выбранный символ дня: архетип, стихия, карта, цвет, энергия, настроение.</w:t>
+            </w:r>
+          </w:p>
+        </w:tc>
+        <w:tc>
+          <w:tcPr>
+            <w:tcW w:type="dxa" w:w="1224"/>
+            <w:vAlign w:val="center"/>
+            <w:tcMar>
+              <w:top w:w="80" w:type="dxa"/>
+              <w:start w:w="120" w:type="dxa"/>
+              <w:bottom w:w="80" w:type="dxa"/>
+              <w:end w:w="120" w:type="dxa"/>
+            </w:tcMar>
+            <w:shd w:fill="F8FAFC"/>
+          </w:tcPr>
+          <w:p>
+            <w:pPr>
+              <w:spacing w:after="0"/>
+              <w:jc w:val="left"/>
+            </w:pPr>
+            <w:r>
+              <w:rPr>
+                <w:rFonts w:ascii="Arial" w:hAnsi="Arial" w:eastAsia="Arial"/>
+                <w:b w:val="0"/>
+                <w:color w:val="111827"/>
+                <w:sz w:val="16"/>
+              </w:rPr>
+              <w:t>Символическая интерпретация без жестких обещаний и три варианта действия разной сложности.</w:t>
+            </w:r>
+          </w:p>
+        </w:tc>
+        <w:tc>
+          <w:tcPr>
+            <w:tcW w:type="dxa" w:w="1944"/>
+            <w:vAlign w:val="center"/>
+            <w:tcMar>
+              <w:top w:w="80" w:type="dxa"/>
+              <w:start w:w="120" w:type="dxa"/>
+              <w:bottom w:w="80" w:type="dxa"/>
+              <w:end w:w="120" w:type="dxa"/>
+            </w:tcMar>
+            <w:shd w:fill="F8FAFC"/>
+          </w:tcPr>
+          <w:p>
+            <w:pPr>
+              <w:spacing w:after="0"/>
+              <w:jc w:val="left"/>
+            </w:pPr>
+            <w:r>
+              <w:rPr>
+                <w:rFonts w:ascii="Arial" w:hAnsi="Arial" w:eastAsia="Arial"/>
+                <w:b w:val="0"/>
+                <w:color w:val="111827"/>
+                <w:sz w:val="16"/>
+              </w:rPr>
+              <w:t>Пользователь выбирает действие, делает его и видит, как символ дня становится частью avatar/progress.</w:t>
+            </w:r>
+          </w:p>
+        </w:tc>
+        <w:tc>
+          <w:tcPr>
+            <w:tcW w:type="dxa" w:w="2592"/>
+            <w:vAlign w:val="center"/>
+            <w:tcMar>
+              <w:top w:w="80" w:type="dxa"/>
+              <w:start w:w="120" w:type="dxa"/>
+              <w:bottom w:w="80" w:type="dxa"/>
+              <w:end w:w="120" w:type="dxa"/>
+            </w:tcMar>
+            <w:shd w:fill="F8FAFC"/>
+          </w:tcPr>
+          <w:p>
+            <w:pPr>
+              <w:spacing w:after="0"/>
+              <w:jc w:val="left"/>
+            </w:pPr>
+            <w:r>
+              <w:rPr>
+                <w:rFonts w:ascii="Arial" w:hAnsi="Arial" w:eastAsia="Arial"/>
+                <w:b w:val="0"/>
+                <w:color w:val="111827"/>
+                <w:sz w:val="16"/>
+              </w:rPr>
+              <w:t>Использует интерес к astrology/esoterics, но выводит его из чтения в поведение.</w:t>
+            </w:r>
+          </w:p>
+        </w:tc>
+      </w:tr>
+      <w:tr>
+        <w:tc>
+          <w:tcPr>
+            <w:tcW w:type="dxa" w:w="2376"/>
+            <w:vAlign w:val="center"/>
+            <w:tcMar>
+              <w:top w:w="80" w:type="dxa"/>
+              <w:start w:w="120" w:type="dxa"/>
+              <w:bottom w:w="80" w:type="dxa"/>
+              <w:end w:w="120" w:type="dxa"/>
+            </w:tcMar>
+          </w:tcPr>
+          <w:p>
+            <w:pPr>
+              <w:spacing w:after="0"/>
+              <w:jc w:val="left"/>
+            </w:pPr>
+            <w:r>
+              <w:rPr>
+                <w:rFonts w:ascii="Arial" w:hAnsi="Arial" w:eastAsia="Arial"/>
+                <w:b w:val="0"/>
+                <w:color w:val="111827"/>
+                <w:sz w:val="16"/>
+              </w:rPr>
+              <w:t>5. Inner Weather</w:t>
+            </w:r>
+          </w:p>
+        </w:tc>
+        <w:tc>
+          <w:tcPr>
+            <w:tcW w:type="dxa" w:w="1224"/>
+            <w:vAlign w:val="center"/>
+            <w:tcMar>
+              <w:top w:w="80" w:type="dxa"/>
+              <w:start w:w="120" w:type="dxa"/>
+              <w:bottom w:w="80" w:type="dxa"/>
+              <w:end w:w="120" w:type="dxa"/>
+            </w:tcMar>
+          </w:tcPr>
+          <w:p>
+            <w:pPr>
+              <w:spacing w:after="0"/>
+              <w:jc w:val="left"/>
+            </w:pPr>
+            <w:r>
+              <w:rPr>
+                <w:rFonts w:ascii="Arial" w:hAnsi="Arial" w:eastAsia="Arial"/>
+                <w:b w:val="0"/>
+                <w:color w:val="111827"/>
+                <w:sz w:val="16"/>
+              </w:rPr>
+              <w:t>Дата рождения + быстрый чек-ин: энергия, напряжение, ясность, желание контакта.</w:t>
+            </w:r>
+          </w:p>
+        </w:tc>
+        <w:tc>
+          <w:tcPr>
+            <w:tcW w:type="dxa" w:w="1224"/>
+            <w:vAlign w:val="center"/>
+            <w:tcMar>
+              <w:top w:w="80" w:type="dxa"/>
+              <w:start w:w="120" w:type="dxa"/>
+              <w:bottom w:w="80" w:type="dxa"/>
+              <w:end w:w="120" w:type="dxa"/>
+            </w:tcMar>
+          </w:tcPr>
+          <w:p>
+            <w:pPr>
+              <w:spacing w:after="0"/>
+              <w:jc w:val="left"/>
+            </w:pPr>
+            <w:r>
+              <w:rPr>
+                <w:rFonts w:ascii="Arial" w:hAnsi="Arial" w:eastAsia="Arial"/>
+                <w:b w:val="0"/>
+                <w:color w:val="111827"/>
+                <w:sz w:val="16"/>
+              </w:rPr>
+              <w:t>“Внутренняя погода” дня: что поддерживает, что может мешать, какой шаг будет самым мягким.</w:t>
+            </w:r>
+          </w:p>
+        </w:tc>
+        <w:tc>
+          <w:tcPr>
+            <w:tcW w:type="dxa" w:w="1944"/>
+            <w:vAlign w:val="center"/>
+            <w:tcMar>
+              <w:top w:w="80" w:type="dxa"/>
+              <w:start w:w="120" w:type="dxa"/>
+              <w:bottom w:w="80" w:type="dxa"/>
+              <w:end w:w="120" w:type="dxa"/>
+            </w:tcMar>
+          </w:tcPr>
+          <w:p>
+            <w:pPr>
+              <w:spacing w:after="0"/>
+              <w:jc w:val="left"/>
+            </w:pPr>
+            <w:r>
+              <w:rPr>
+                <w:rFonts w:ascii="Arial" w:hAnsi="Arial" w:eastAsia="Arial"/>
+                <w:b w:val="0"/>
+                <w:color w:val="111827"/>
+                <w:sz w:val="16"/>
+              </w:rPr>
+              <w:t>Продукт не говорит “кто ты навсегда”, а помогает прожить один день осознаннее и увидеть сдвиг.</w:t>
+            </w:r>
+          </w:p>
+        </w:tc>
+        <w:tc>
+          <w:tcPr>
+            <w:tcW w:type="dxa" w:w="2592"/>
+            <w:vAlign w:val="center"/>
+            <w:tcMar>
+              <w:top w:w="80" w:type="dxa"/>
+              <w:start w:w="120" w:type="dxa"/>
+              <w:bottom w:w="80" w:type="dxa"/>
+              <w:end w:w="120" w:type="dxa"/>
+            </w:tcMar>
+          </w:tcPr>
+          <w:p>
+            <w:pPr>
+              <w:spacing w:after="0"/>
+              <w:jc w:val="left"/>
+            </w:pPr>
+            <w:r>
+              <w:rPr>
+                <w:rFonts w:ascii="Arial" w:hAnsi="Arial" w:eastAsia="Arial"/>
+                <w:b w:val="0"/>
+                <w:color w:val="111827"/>
+                <w:sz w:val="16"/>
+              </w:rPr>
+              <w:t>Снижает риск недоверия: это не диагноз и не судьба, а мягкая навигация по состоянию.</w:t>
+            </w:r>
+          </w:p>
+        </w:tc>
+      </w:tr>
+      <w:tr>
+        <w:tc>
+          <w:tcPr>
+            <w:tcW w:type="dxa" w:w="2376"/>
+            <w:vAlign w:val="center"/>
+            <w:tcMar>
+              <w:top w:w="80" w:type="dxa"/>
+              <w:start w:w="120" w:type="dxa"/>
+              <w:bottom w:w="80" w:type="dxa"/>
+              <w:end w:w="120" w:type="dxa"/>
+            </w:tcMar>
+            <w:shd w:fill="F8FAFC"/>
+          </w:tcPr>
+          <w:p>
+            <w:pPr>
+              <w:spacing w:after="0"/>
+              <w:jc w:val="left"/>
+            </w:pPr>
+            <w:r>
+              <w:rPr>
+                <w:rFonts w:ascii="Arial" w:hAnsi="Arial" w:eastAsia="Arial"/>
+                <w:b w:val="0"/>
+                <w:color w:val="111827"/>
+                <w:sz w:val="16"/>
+              </w:rPr>
+              <w:t>6. Compatibility With Myself</w:t>
+            </w:r>
+          </w:p>
+        </w:tc>
+        <w:tc>
+          <w:tcPr>
+            <w:tcW w:type="dxa" w:w="1224"/>
+            <w:vAlign w:val="center"/>
+            <w:tcMar>
+              <w:top w:w="80" w:type="dxa"/>
+              <w:start w:w="120" w:type="dxa"/>
+              <w:bottom w:w="80" w:type="dxa"/>
+              <w:end w:w="120" w:type="dxa"/>
+            </w:tcMar>
+            <w:shd w:fill="F8FAFC"/>
+          </w:tcPr>
+          <w:p>
+            <w:pPr>
+              <w:spacing w:after="0"/>
+              <w:jc w:val="left"/>
+            </w:pPr>
+            <w:r>
+              <w:rPr>
+                <w:rFonts w:ascii="Arial" w:hAnsi="Arial" w:eastAsia="Arial"/>
+                <w:b w:val="0"/>
+                <w:color w:val="111827"/>
+                <w:sz w:val="16"/>
+              </w:rPr>
+              <w:t>Дата рождения + конфликт дня: хочу одно, делаю другое; хочу начать, но откладываю.</w:t>
+            </w:r>
+          </w:p>
+        </w:tc>
+        <w:tc>
+          <w:tcPr>
+            <w:tcW w:type="dxa" w:w="1224"/>
+            <w:vAlign w:val="center"/>
+            <w:tcMar>
+              <w:top w:w="80" w:type="dxa"/>
+              <w:start w:w="120" w:type="dxa"/>
+              <w:bottom w:w="80" w:type="dxa"/>
+              <w:end w:w="120" w:type="dxa"/>
+            </w:tcMar>
+            <w:shd w:fill="F8FAFC"/>
+          </w:tcPr>
+          <w:p>
+            <w:pPr>
+              <w:spacing w:after="0"/>
+              <w:jc w:val="left"/>
+            </w:pPr>
+            <w:r>
+              <w:rPr>
+                <w:rFonts w:ascii="Arial" w:hAnsi="Arial" w:eastAsia="Arial"/>
+                <w:b w:val="0"/>
+                <w:color w:val="111827"/>
+                <w:sz w:val="16"/>
+              </w:rPr>
+              <w:t>Разбор внутреннего конфликта: какая часть хочет роста, какая защищается, какой шаг их примиряет.</w:t>
+            </w:r>
+          </w:p>
+        </w:tc>
+        <w:tc>
+          <w:tcPr>
+            <w:tcW w:type="dxa" w:w="1944"/>
+            <w:vAlign w:val="center"/>
+            <w:tcMar>
+              <w:top w:w="80" w:type="dxa"/>
+              <w:start w:w="120" w:type="dxa"/>
+              <w:bottom w:w="80" w:type="dxa"/>
+              <w:end w:w="120" w:type="dxa"/>
+            </w:tcMar>
+            <w:shd w:fill="F8FAFC"/>
+          </w:tcPr>
+          <w:p>
+            <w:pPr>
+              <w:spacing w:after="0"/>
+              <w:jc w:val="left"/>
+            </w:pPr>
+            <w:r>
+              <w:rPr>
+                <w:rFonts w:ascii="Arial" w:hAnsi="Arial" w:eastAsia="Arial"/>
+                <w:b w:val="0"/>
+                <w:color w:val="111827"/>
+                <w:sz w:val="16"/>
+              </w:rPr>
+              <w:t>После действия avatar показывает не “уровень”, а согласованность: человек чуть ближе к себе.</w:t>
+            </w:r>
+          </w:p>
+        </w:tc>
+        <w:tc>
+          <w:tcPr>
+            <w:tcW w:type="dxa" w:w="2592"/>
+            <w:vAlign w:val="center"/>
+            <w:tcMar>
+              <w:top w:w="80" w:type="dxa"/>
+              <w:start w:w="120" w:type="dxa"/>
+              <w:bottom w:w="80" w:type="dxa"/>
+              <w:end w:w="120" w:type="dxa"/>
+            </w:tcMar>
+            <w:shd w:fill="F8FAFC"/>
+          </w:tcPr>
+          <w:p>
+            <w:pPr>
+              <w:spacing w:after="0"/>
+              <w:jc w:val="left"/>
+            </w:pPr>
+            <w:r>
+              <w:rPr>
+                <w:rFonts w:ascii="Arial" w:hAnsi="Arial" w:eastAsia="Arial"/>
+                <w:b w:val="0"/>
+                <w:color w:val="111827"/>
+                <w:sz w:val="16"/>
+              </w:rPr>
+              <w:t>Хорошо раскрывает эмоциональную глубину и может стать платной персональной механикой.</w:t>
+            </w:r>
+          </w:p>
+        </w:tc>
+      </w:tr>
+      <w:tr>
+        <w:tc>
+          <w:tcPr>
+            <w:tcW w:type="dxa" w:w="2376"/>
+            <w:vAlign w:val="center"/>
+            <w:tcMar>
+              <w:top w:w="80" w:type="dxa"/>
+              <w:start w:w="120" w:type="dxa"/>
+              <w:bottom w:w="80" w:type="dxa"/>
+              <w:end w:w="120" w:type="dxa"/>
+            </w:tcMar>
+          </w:tcPr>
+          <w:p>
+            <w:pPr>
+              <w:spacing w:after="0"/>
+              <w:jc w:val="left"/>
+            </w:pPr>
+            <w:r>
+              <w:rPr>
+                <w:rFonts w:ascii="Arial" w:hAnsi="Arial" w:eastAsia="Arial"/>
+                <w:b w:val="0"/>
+                <w:color w:val="111827"/>
+                <w:sz w:val="16"/>
+              </w:rPr>
+              <w:t>7. Life Path Quests</w:t>
+            </w:r>
+          </w:p>
+        </w:tc>
+        <w:tc>
+          <w:tcPr>
+            <w:tcW w:type="dxa" w:w="1224"/>
+            <w:vAlign w:val="center"/>
+            <w:tcMar>
+              <w:top w:w="80" w:type="dxa"/>
+              <w:start w:w="120" w:type="dxa"/>
+              <w:bottom w:w="80" w:type="dxa"/>
+              <w:end w:w="120" w:type="dxa"/>
+            </w:tcMar>
+          </w:tcPr>
+          <w:p>
+            <w:pPr>
+              <w:spacing w:after="0"/>
+              <w:jc w:val="left"/>
+            </w:pPr>
+            <w:r>
+              <w:rPr>
+                <w:rFonts w:ascii="Arial" w:hAnsi="Arial" w:eastAsia="Arial"/>
+                <w:b w:val="0"/>
+                <w:color w:val="111827"/>
+                <w:sz w:val="16"/>
+              </w:rPr>
+              <w:t>Дата рождения + выбранное направление: отношения, карьера, тело, дом, творчество, уверенность.</w:t>
+            </w:r>
+          </w:p>
+        </w:tc>
+        <w:tc>
+          <w:tcPr>
+            <w:tcW w:type="dxa" w:w="1224"/>
+            <w:vAlign w:val="center"/>
+            <w:tcMar>
+              <w:top w:w="80" w:type="dxa"/>
+              <w:start w:w="120" w:type="dxa"/>
+              <w:bottom w:w="80" w:type="dxa"/>
+              <w:end w:w="120" w:type="dxa"/>
+            </w:tcMar>
+          </w:tcPr>
+          <w:p>
+            <w:pPr>
+              <w:spacing w:after="0"/>
+              <w:jc w:val="left"/>
+            </w:pPr>
+            <w:r>
+              <w:rPr>
+                <w:rFonts w:ascii="Arial" w:hAnsi="Arial" w:eastAsia="Arial"/>
+                <w:b w:val="0"/>
+                <w:color w:val="111827"/>
+                <w:sz w:val="16"/>
+              </w:rPr>
+              <w:t>Мягкая серия микро-квестов на неделю, где каждый день связан с одной темой и одним действием.</w:t>
+            </w:r>
+          </w:p>
+        </w:tc>
+        <w:tc>
+          <w:tcPr>
+            <w:tcW w:type="dxa" w:w="1944"/>
+            <w:vAlign w:val="center"/>
+            <w:tcMar>
+              <w:top w:w="80" w:type="dxa"/>
+              <w:start w:w="120" w:type="dxa"/>
+              <w:bottom w:w="80" w:type="dxa"/>
+              <w:end w:w="120" w:type="dxa"/>
+            </w:tcMar>
+          </w:tcPr>
+          <w:p>
+            <w:pPr>
+              <w:spacing w:after="0"/>
+              <w:jc w:val="left"/>
+            </w:pPr>
+            <w:r>
+              <w:rPr>
+                <w:rFonts w:ascii="Arial" w:hAnsi="Arial" w:eastAsia="Arial"/>
+                <w:b w:val="0"/>
+                <w:color w:val="111827"/>
+                <w:sz w:val="16"/>
+              </w:rPr>
+              <w:t>Неделя собирается в историю: avatar меняется не от streak, а от накопленных доказательств действий.</w:t>
+            </w:r>
+          </w:p>
+        </w:tc>
+        <w:tc>
+          <w:tcPr>
+            <w:tcW w:type="dxa" w:w="2592"/>
+            <w:vAlign w:val="center"/>
+            <w:tcMar>
+              <w:top w:w="80" w:type="dxa"/>
+              <w:start w:w="120" w:type="dxa"/>
+              <w:bottom w:w="80" w:type="dxa"/>
+              <w:end w:w="120" w:type="dxa"/>
+            </w:tcMar>
+          </w:tcPr>
+          <w:p>
+            <w:pPr>
+              <w:spacing w:after="0"/>
+              <w:jc w:val="left"/>
+            </w:pPr>
+            <w:r>
+              <w:rPr>
+                <w:rFonts w:ascii="Arial" w:hAnsi="Arial" w:eastAsia="Arial"/>
+                <w:b w:val="0"/>
+                <w:color w:val="111827"/>
+                <w:sz w:val="16"/>
+              </w:rPr>
+              <w:t>Дает возврат без давления: человек возвращается ради истории изменения, а не ради наказания.</w:t>
+            </w:r>
+          </w:p>
+        </w:tc>
+      </w:tr>
+    </w:tbl>
+    <w:p/>
+    <w:p>
+      <w:r>
+        <w:t>Из этих концепций самая сильная базовая версия для MVP выглядит как связка Daily Aura Code + Future Self Avatar + Ritual of the Day. Человек вводит дату рождения и короткий запрос дня, получает персональный смысловой вход, выбирает одно действие, проходит короткий reset и видит, как avatar меняется из-за выполненного шага. Остальные концепции можно рассматривать как расширения: Symbol to Action усиливает spiritual/astrology слой, Inner Weather делает продукт безопаснее и мягче, Compatibility With Myself добавляет эмоциональную глубину, а Life Path Quests дает недельную историю и возврат.</w:t>
+      </w:r>
+    </w:p>
+    <w:p>
+      <w:r>
+        <w:t>Главная граница для всех концепций: АУРА не должна обещать судьбу, диагноз или точное предсказание по дате рождения. Рабочая формулировка честнее: дата рождения и символический профиль помогают создать личный язык входа, но продукт доказывает ценность только тогда, когда пользователь совершает маленькое действие и видит понятный сдвиг.</w:t>
       </w:r>
     </w:p>
     <w:tbl>

</xml_diff>

<commit_message>
Strengthen AURA life series product concept
</commit_message>
<xml_diff>
--- a/output/docx/alina-global-hypothesis-report-v1.docx
+++ b/output/docx/alina-global-hypothesis-report-v1.docx
@@ -25481,6 +25481,821 @@
       </w:r>
     </w:p>
     <w:p>
+      <w:r>
+        <w:t>Более сильная продуктовая формулировка: АУРА может быть не “приложением с аватаром”, а персональным сериалом о собственной жизни. Каждый день становится коротким эпизодом, где у пользователя есть тема, внутренний конфликт, маленькое действие и изменение героя. Avatar в такой модели - не картинка и не скин, а главный персонаж этого сериала: будущая версия пользователя, которая меняется не от кликов, а от прожитых решений. Тогда возврат строится не только на streak, а на желании узнать: какой я сегодня, какой эпизод моей жизни сейчас идет, что изменится в моем персонаже, если я сделаю один шаг.</w:t>
+      </w:r>
+    </w:p>
+    <w:tbl>
+      <w:tblPr>
+        <w:tblW w:type="dxa" w:w="9360"/>
+        <w:jc w:val="left"/>
+        <w:tblLayout w:type="fixed"/>
+        <w:tblLook w:firstColumn="1" w:firstRow="1" w:lastColumn="0" w:lastRow="0" w:noHBand="0" w:noVBand="1" w:val="04A0"/>
+        <w:tblInd w:w="120" w:type="dxa"/>
+        <w:tblBorders>
+          <w:top w:val="single" w:sz="4" w:space="0" w:color="CBD5E1"/>
+          <w:left w:val="single" w:sz="4" w:space="0" w:color="CBD5E1"/>
+          <w:bottom w:val="single" w:sz="4" w:space="0" w:color="CBD5E1"/>
+          <w:right w:val="single" w:sz="4" w:space="0" w:color="CBD5E1"/>
+          <w:insideH w:val="single" w:sz="4" w:space="0" w:color="CBD5E1"/>
+          <w:insideV w:val="single" w:sz="4" w:space="0" w:color="CBD5E1"/>
+        </w:tblBorders>
+      </w:tblPr>
+      <w:tblGrid>
+        <w:gridCol w:w="2340"/>
+        <w:gridCol w:w="2340"/>
+        <w:gridCol w:w="2340"/>
+        <w:gridCol w:w="2340"/>
+      </w:tblGrid>
+      <w:tr>
+        <w:tc>
+          <w:tcPr>
+            <w:tcW w:type="dxa" w:w="2448"/>
+            <w:vAlign w:val="center"/>
+            <w:tcMar>
+              <w:top w:w="80" w:type="dxa"/>
+              <w:start w:w="120" w:type="dxa"/>
+              <w:bottom w:w="80" w:type="dxa"/>
+              <w:end w:w="120" w:type="dxa"/>
+            </w:tcMar>
+            <w:shd w:fill="E8EEF5"/>
+          </w:tcPr>
+          <w:p>
+            <w:pPr>
+              <w:spacing w:after="0"/>
+              <w:jc w:val="left"/>
+            </w:pPr>
+            <w:r>
+              <w:rPr>
+                <w:rFonts w:ascii="Arial" w:hAnsi="Arial" w:eastAsia="Arial"/>
+                <w:b/>
+                <w:color w:val="111827"/>
+                <w:sz w:val="17"/>
+              </w:rPr>
+              <w:t>Слой личного сериала</w:t>
+            </w:r>
+          </w:p>
+        </w:tc>
+        <w:tc>
+          <w:tcPr>
+            <w:tcW w:type="dxa" w:w="1440"/>
+            <w:vAlign w:val="center"/>
+            <w:tcMar>
+              <w:top w:w="80" w:type="dxa"/>
+              <w:start w:w="120" w:type="dxa"/>
+              <w:bottom w:w="80" w:type="dxa"/>
+              <w:end w:w="120" w:type="dxa"/>
+            </w:tcMar>
+            <w:shd w:fill="E8EEF5"/>
+          </w:tcPr>
+          <w:p>
+            <w:pPr>
+              <w:spacing w:after="0"/>
+              <w:jc w:val="left"/>
+            </w:pPr>
+            <w:r>
+              <w:rPr>
+                <w:rFonts w:ascii="Arial" w:hAnsi="Arial" w:eastAsia="Arial"/>
+                <w:b/>
+                <w:color w:val="111827"/>
+                <w:sz w:val="17"/>
+              </w:rPr>
+              <w:t>Что это значит для пользователя</w:t>
+            </w:r>
+          </w:p>
+        </w:tc>
+        <w:tc>
+          <w:tcPr>
+            <w:tcW w:type="dxa" w:w="2016"/>
+            <w:vAlign w:val="center"/>
+            <w:tcMar>
+              <w:top w:w="80" w:type="dxa"/>
+              <w:start w:w="120" w:type="dxa"/>
+              <w:bottom w:w="80" w:type="dxa"/>
+              <w:end w:w="120" w:type="dxa"/>
+            </w:tcMar>
+            <w:shd w:fill="E8EEF5"/>
+          </w:tcPr>
+          <w:p>
+            <w:pPr>
+              <w:spacing w:after="0"/>
+              <w:jc w:val="left"/>
+            </w:pPr>
+            <w:r>
+              <w:rPr>
+                <w:rFonts w:ascii="Arial" w:hAnsi="Arial" w:eastAsia="Arial"/>
+                <w:b/>
+                <w:color w:val="111827"/>
+                <w:sz w:val="17"/>
+              </w:rPr>
+              <w:t>Как это делает АУРА</w:t>
+            </w:r>
+          </w:p>
+        </w:tc>
+        <w:tc>
+          <w:tcPr>
+            <w:tcW w:type="dxa" w:w="3456"/>
+            <w:vAlign w:val="center"/>
+            <w:tcMar>
+              <w:top w:w="80" w:type="dxa"/>
+              <w:start w:w="120" w:type="dxa"/>
+              <w:bottom w:w="80" w:type="dxa"/>
+              <w:end w:w="120" w:type="dxa"/>
+            </w:tcMar>
+            <w:shd w:fill="E8EEF5"/>
+          </w:tcPr>
+          <w:p>
+            <w:pPr>
+              <w:spacing w:after="0"/>
+              <w:jc w:val="left"/>
+            </w:pPr>
+            <w:r>
+              <w:rPr>
+                <w:rFonts w:ascii="Arial" w:hAnsi="Arial" w:eastAsia="Arial"/>
+                <w:b/>
+                <w:color w:val="111827"/>
+                <w:sz w:val="17"/>
+              </w:rPr>
+              <w:t>Что сломает идею</w:t>
+            </w:r>
+          </w:p>
+        </w:tc>
+      </w:tr>
+      <w:tr>
+        <w:tc>
+          <w:tcPr>
+            <w:tcW w:type="dxa" w:w="2448"/>
+            <w:vAlign w:val="center"/>
+            <w:tcMar>
+              <w:top w:w="80" w:type="dxa"/>
+              <w:start w:w="120" w:type="dxa"/>
+              <w:bottom w:w="80" w:type="dxa"/>
+              <w:end w:w="120" w:type="dxa"/>
+            </w:tcMar>
+          </w:tcPr>
+          <w:p>
+            <w:pPr>
+              <w:spacing w:after="0"/>
+              <w:jc w:val="left"/>
+            </w:pPr>
+            <w:r>
+              <w:rPr>
+                <w:rFonts w:ascii="Arial" w:hAnsi="Arial" w:eastAsia="Arial"/>
+                <w:b w:val="0"/>
+                <w:color w:val="111827"/>
+                <w:sz w:val="17"/>
+              </w:rPr>
+              <w:t>Сезон</w:t>
+            </w:r>
+          </w:p>
+        </w:tc>
+        <w:tc>
+          <w:tcPr>
+            <w:tcW w:type="dxa" w:w="1440"/>
+            <w:vAlign w:val="center"/>
+            <w:tcMar>
+              <w:top w:w="80" w:type="dxa"/>
+              <w:start w:w="120" w:type="dxa"/>
+              <w:bottom w:w="80" w:type="dxa"/>
+              <w:end w:w="120" w:type="dxa"/>
+            </w:tcMar>
+          </w:tcPr>
+          <w:p>
+            <w:pPr>
+              <w:spacing w:after="0"/>
+              <w:jc w:val="left"/>
+            </w:pPr>
+            <w:r>
+              <w:rPr>
+                <w:rFonts w:ascii="Arial" w:hAnsi="Arial" w:eastAsia="Arial"/>
+                <w:b w:val="0"/>
+                <w:color w:val="111827"/>
+                <w:sz w:val="17"/>
+              </w:rPr>
+              <w:t>Большая жизненная тема на 7-14 дней: уверенность, отношения, тело, деньги, дом, творчество, спокойствие.</w:t>
+            </w:r>
+          </w:p>
+        </w:tc>
+        <w:tc>
+          <w:tcPr>
+            <w:tcW w:type="dxa" w:w="2016"/>
+            <w:vAlign w:val="center"/>
+            <w:tcMar>
+              <w:top w:w="80" w:type="dxa"/>
+              <w:start w:w="120" w:type="dxa"/>
+              <w:bottom w:w="80" w:type="dxa"/>
+              <w:end w:w="120" w:type="dxa"/>
+            </w:tcMar>
+          </w:tcPr>
+          <w:p>
+            <w:pPr>
+              <w:spacing w:after="0"/>
+              <w:jc w:val="left"/>
+            </w:pPr>
+            <w:r>
+              <w:rPr>
+                <w:rFonts w:ascii="Arial" w:hAnsi="Arial" w:eastAsia="Arial"/>
+                <w:b w:val="0"/>
+                <w:color w:val="111827"/>
+                <w:sz w:val="17"/>
+              </w:rPr>
+              <w:t>АУРА собирает серию эпизодов вокруг одной темы и показывает, как меняется герой за период.</w:t>
+            </w:r>
+          </w:p>
+        </w:tc>
+        <w:tc>
+          <w:tcPr>
+            <w:tcW w:type="dxa" w:w="3456"/>
+            <w:vAlign w:val="center"/>
+            <w:tcMar>
+              <w:top w:w="80" w:type="dxa"/>
+              <w:start w:w="120" w:type="dxa"/>
+              <w:bottom w:w="80" w:type="dxa"/>
+              <w:end w:w="120" w:type="dxa"/>
+            </w:tcMar>
+          </w:tcPr>
+          <w:p>
+            <w:pPr>
+              <w:spacing w:after="0"/>
+              <w:jc w:val="left"/>
+            </w:pPr>
+            <w:r>
+              <w:rPr>
+                <w:rFonts w:ascii="Arial" w:hAnsi="Arial" w:eastAsia="Arial"/>
+                <w:b w:val="0"/>
+                <w:color w:val="111827"/>
+                <w:sz w:val="17"/>
+              </w:rPr>
+              <w:t>Если нет сезона, продукт распадается на случайные ежедневные подсказки.</w:t>
+            </w:r>
+          </w:p>
+        </w:tc>
+      </w:tr>
+      <w:tr>
+        <w:tc>
+          <w:tcPr>
+            <w:tcW w:type="dxa" w:w="2448"/>
+            <w:vAlign w:val="center"/>
+            <w:tcMar>
+              <w:top w:w="80" w:type="dxa"/>
+              <w:start w:w="120" w:type="dxa"/>
+              <w:bottom w:w="80" w:type="dxa"/>
+              <w:end w:w="120" w:type="dxa"/>
+            </w:tcMar>
+            <w:shd w:fill="F8FAFC"/>
+          </w:tcPr>
+          <w:p>
+            <w:pPr>
+              <w:spacing w:after="0"/>
+              <w:jc w:val="left"/>
+            </w:pPr>
+            <w:r>
+              <w:rPr>
+                <w:rFonts w:ascii="Arial" w:hAnsi="Arial" w:eastAsia="Arial"/>
+                <w:b w:val="0"/>
+                <w:color w:val="111827"/>
+                <w:sz w:val="17"/>
+              </w:rPr>
+              <w:t>Эпизод дня</w:t>
+            </w:r>
+          </w:p>
+        </w:tc>
+        <w:tc>
+          <w:tcPr>
+            <w:tcW w:type="dxa" w:w="1440"/>
+            <w:vAlign w:val="center"/>
+            <w:tcMar>
+              <w:top w:w="80" w:type="dxa"/>
+              <w:start w:w="120" w:type="dxa"/>
+              <w:bottom w:w="80" w:type="dxa"/>
+              <w:end w:w="120" w:type="dxa"/>
+            </w:tcMar>
+            <w:shd w:fill="F8FAFC"/>
+          </w:tcPr>
+          <w:p>
+            <w:pPr>
+              <w:spacing w:after="0"/>
+              <w:jc w:val="left"/>
+            </w:pPr>
+            <w:r>
+              <w:rPr>
+                <w:rFonts w:ascii="Arial" w:hAnsi="Arial" w:eastAsia="Arial"/>
+                <w:b w:val="0"/>
+                <w:color w:val="111827"/>
+                <w:sz w:val="17"/>
+              </w:rPr>
+              <w:t>Короткая история сегодняшнего состояния: что происходит, где напряжение, какой выбор важен.</w:t>
+            </w:r>
+          </w:p>
+        </w:tc>
+        <w:tc>
+          <w:tcPr>
+            <w:tcW w:type="dxa" w:w="2016"/>
+            <w:vAlign w:val="center"/>
+            <w:tcMar>
+              <w:top w:w="80" w:type="dxa"/>
+              <w:start w:w="120" w:type="dxa"/>
+              <w:bottom w:w="80" w:type="dxa"/>
+              <w:end w:w="120" w:type="dxa"/>
+            </w:tcMar>
+            <w:shd w:fill="F8FAFC"/>
+          </w:tcPr>
+          <w:p>
+            <w:pPr>
+              <w:spacing w:after="0"/>
+              <w:jc w:val="left"/>
+            </w:pPr>
+            <w:r>
+              <w:rPr>
+                <w:rFonts w:ascii="Arial" w:hAnsi="Arial" w:eastAsia="Arial"/>
+                <w:b w:val="0"/>
+                <w:color w:val="111827"/>
+                <w:sz w:val="17"/>
+              </w:rPr>
+              <w:t>Дата рождения и чек-ин дают персональный вход, но эпизод всегда привязан к сегодняшнему запросу.</w:t>
+            </w:r>
+          </w:p>
+        </w:tc>
+        <w:tc>
+          <w:tcPr>
+            <w:tcW w:type="dxa" w:w="3456"/>
+            <w:vAlign w:val="center"/>
+            <w:tcMar>
+              <w:top w:w="80" w:type="dxa"/>
+              <w:start w:w="120" w:type="dxa"/>
+              <w:bottom w:w="80" w:type="dxa"/>
+              <w:end w:w="120" w:type="dxa"/>
+            </w:tcMar>
+            <w:shd w:fill="F8FAFC"/>
+          </w:tcPr>
+          <w:p>
+            <w:pPr>
+              <w:spacing w:after="0"/>
+              <w:jc w:val="left"/>
+            </w:pPr>
+            <w:r>
+              <w:rPr>
+                <w:rFonts w:ascii="Arial" w:hAnsi="Arial" w:eastAsia="Arial"/>
+                <w:b w:val="0"/>
+                <w:color w:val="111827"/>
+                <w:sz w:val="17"/>
+              </w:rPr>
+              <w:t>Если эпизод звучит абстрактно, пользователь не чувствует “это про меня”.</w:t>
+            </w:r>
+          </w:p>
+        </w:tc>
+      </w:tr>
+      <w:tr>
+        <w:tc>
+          <w:tcPr>
+            <w:tcW w:type="dxa" w:w="2448"/>
+            <w:vAlign w:val="center"/>
+            <w:tcMar>
+              <w:top w:w="80" w:type="dxa"/>
+              <w:start w:w="120" w:type="dxa"/>
+              <w:bottom w:w="80" w:type="dxa"/>
+              <w:end w:w="120" w:type="dxa"/>
+            </w:tcMar>
+          </w:tcPr>
+          <w:p>
+            <w:pPr>
+              <w:spacing w:after="0"/>
+              <w:jc w:val="left"/>
+            </w:pPr>
+            <w:r>
+              <w:rPr>
+                <w:rFonts w:ascii="Arial" w:hAnsi="Arial" w:eastAsia="Arial"/>
+                <w:b w:val="0"/>
+                <w:color w:val="111827"/>
+                <w:sz w:val="17"/>
+              </w:rPr>
+              <w:t>Сцена действия</w:t>
+            </w:r>
+          </w:p>
+        </w:tc>
+        <w:tc>
+          <w:tcPr>
+            <w:tcW w:type="dxa" w:w="1440"/>
+            <w:vAlign w:val="center"/>
+            <w:tcMar>
+              <w:top w:w="80" w:type="dxa"/>
+              <w:start w:w="120" w:type="dxa"/>
+              <w:bottom w:w="80" w:type="dxa"/>
+              <w:end w:w="120" w:type="dxa"/>
+            </w:tcMar>
+          </w:tcPr>
+          <w:p>
+            <w:pPr>
+              <w:spacing w:after="0"/>
+              <w:jc w:val="left"/>
+            </w:pPr>
+            <w:r>
+              <w:rPr>
+                <w:rFonts w:ascii="Arial" w:hAnsi="Arial" w:eastAsia="Arial"/>
+                <w:b w:val="0"/>
+                <w:color w:val="111827"/>
+                <w:sz w:val="17"/>
+              </w:rPr>
+              <w:t>Один маленький поступок, который можно сделать в реальной жизни.</w:t>
+            </w:r>
+          </w:p>
+        </w:tc>
+        <w:tc>
+          <w:tcPr>
+            <w:tcW w:type="dxa" w:w="2016"/>
+            <w:vAlign w:val="center"/>
+            <w:tcMar>
+              <w:top w:w="80" w:type="dxa"/>
+              <w:start w:w="120" w:type="dxa"/>
+              <w:bottom w:w="80" w:type="dxa"/>
+              <w:end w:w="120" w:type="dxa"/>
+            </w:tcMar>
+          </w:tcPr>
+          <w:p>
+            <w:pPr>
+              <w:spacing w:after="0"/>
+              <w:jc w:val="left"/>
+            </w:pPr>
+            <w:r>
+              <w:rPr>
+                <w:rFonts w:ascii="Arial" w:hAnsi="Arial" w:eastAsia="Arial"/>
+                <w:b w:val="0"/>
+                <w:color w:val="111827"/>
+                <w:sz w:val="17"/>
+              </w:rPr>
+              <w:t>Приложение превращает смысл в действие: написать сообщение, выйти на прогулку, разобрать угол, сказать честную фразу.</w:t>
+            </w:r>
+          </w:p>
+        </w:tc>
+        <w:tc>
+          <w:tcPr>
+            <w:tcW w:type="dxa" w:w="3456"/>
+            <w:vAlign w:val="center"/>
+            <w:tcMar>
+              <w:top w:w="80" w:type="dxa"/>
+              <w:start w:w="120" w:type="dxa"/>
+              <w:bottom w:w="80" w:type="dxa"/>
+              <w:end w:w="120" w:type="dxa"/>
+            </w:tcMar>
+          </w:tcPr>
+          <w:p>
+            <w:pPr>
+              <w:spacing w:after="0"/>
+              <w:jc w:val="left"/>
+            </w:pPr>
+            <w:r>
+              <w:rPr>
+                <w:rFonts w:ascii="Arial" w:hAnsi="Arial" w:eastAsia="Arial"/>
+                <w:b w:val="0"/>
+                <w:color w:val="111827"/>
+                <w:sz w:val="17"/>
+              </w:rPr>
+              <w:t>Если действия нет, АУРА остается чтением, а не продуктом изменения.</w:t>
+            </w:r>
+          </w:p>
+        </w:tc>
+      </w:tr>
+      <w:tr>
+        <w:tc>
+          <w:tcPr>
+            <w:tcW w:type="dxa" w:w="2448"/>
+            <w:vAlign w:val="center"/>
+            <w:tcMar>
+              <w:top w:w="80" w:type="dxa"/>
+              <w:start w:w="120" w:type="dxa"/>
+              <w:bottom w:w="80" w:type="dxa"/>
+              <w:end w:w="120" w:type="dxa"/>
+            </w:tcMar>
+            <w:shd w:fill="F8FAFC"/>
+          </w:tcPr>
+          <w:p>
+            <w:pPr>
+              <w:spacing w:after="0"/>
+              <w:jc w:val="left"/>
+            </w:pPr>
+            <w:r>
+              <w:rPr>
+                <w:rFonts w:ascii="Arial" w:hAnsi="Arial" w:eastAsia="Arial"/>
+                <w:b w:val="0"/>
+                <w:color w:val="111827"/>
+                <w:sz w:val="17"/>
+              </w:rPr>
+              <w:t>Герой/avatar</w:t>
+            </w:r>
+          </w:p>
+        </w:tc>
+        <w:tc>
+          <w:tcPr>
+            <w:tcW w:type="dxa" w:w="1440"/>
+            <w:vAlign w:val="center"/>
+            <w:tcMar>
+              <w:top w:w="80" w:type="dxa"/>
+              <w:start w:w="120" w:type="dxa"/>
+              <w:bottom w:w="80" w:type="dxa"/>
+              <w:end w:w="120" w:type="dxa"/>
+            </w:tcMar>
+            <w:shd w:fill="F8FAFC"/>
+          </w:tcPr>
+          <w:p>
+            <w:pPr>
+              <w:spacing w:after="0"/>
+              <w:jc w:val="left"/>
+            </w:pPr>
+            <w:r>
+              <w:rPr>
+                <w:rFonts w:ascii="Arial" w:hAnsi="Arial" w:eastAsia="Arial"/>
+                <w:b w:val="0"/>
+                <w:color w:val="111827"/>
+                <w:sz w:val="17"/>
+              </w:rPr>
+              <w:t>Визуальная версия пользователя, которая постепенно набирает черты, предметы, свет, состояние и историю.</w:t>
+            </w:r>
+          </w:p>
+        </w:tc>
+        <w:tc>
+          <w:tcPr>
+            <w:tcW w:type="dxa" w:w="2016"/>
+            <w:vAlign w:val="center"/>
+            <w:tcMar>
+              <w:top w:w="80" w:type="dxa"/>
+              <w:start w:w="120" w:type="dxa"/>
+              <w:bottom w:w="80" w:type="dxa"/>
+              <w:end w:w="120" w:type="dxa"/>
+            </w:tcMar>
+            <w:shd w:fill="F8FAFC"/>
+          </w:tcPr>
+          <w:p>
+            <w:pPr>
+              <w:spacing w:after="0"/>
+              <w:jc w:val="left"/>
+            </w:pPr>
+            <w:r>
+              <w:rPr>
+                <w:rFonts w:ascii="Arial" w:hAnsi="Arial" w:eastAsia="Arial"/>
+                <w:b w:val="0"/>
+                <w:color w:val="111827"/>
+                <w:sz w:val="17"/>
+              </w:rPr>
+              <w:t>Avatar меняется после эпизода: не “получил награду”, а “в герое появилась новая черта”.</w:t>
+            </w:r>
+          </w:p>
+        </w:tc>
+        <w:tc>
+          <w:tcPr>
+            <w:tcW w:type="dxa" w:w="3456"/>
+            <w:vAlign w:val="center"/>
+            <w:tcMar>
+              <w:top w:w="80" w:type="dxa"/>
+              <w:start w:w="120" w:type="dxa"/>
+              <w:bottom w:w="80" w:type="dxa"/>
+              <w:end w:w="120" w:type="dxa"/>
+            </w:tcMar>
+            <w:shd w:fill="F8FAFC"/>
+          </w:tcPr>
+          <w:p>
+            <w:pPr>
+              <w:spacing w:after="0"/>
+              <w:jc w:val="left"/>
+            </w:pPr>
+            <w:r>
+              <w:rPr>
+                <w:rFonts w:ascii="Arial" w:hAnsi="Arial" w:eastAsia="Arial"/>
+                <w:b w:val="0"/>
+                <w:color w:val="111827"/>
+                <w:sz w:val="17"/>
+              </w:rPr>
+              <w:t>Если avatar не связан с поступком, он выглядит как декоративный редактор внешности.</w:t>
+            </w:r>
+          </w:p>
+        </w:tc>
+      </w:tr>
+      <w:tr>
+        <w:tc>
+          <w:tcPr>
+            <w:tcW w:type="dxa" w:w="2448"/>
+            <w:vAlign w:val="center"/>
+            <w:tcMar>
+              <w:top w:w="80" w:type="dxa"/>
+              <w:start w:w="120" w:type="dxa"/>
+              <w:bottom w:w="80" w:type="dxa"/>
+              <w:end w:w="120" w:type="dxa"/>
+            </w:tcMar>
+          </w:tcPr>
+          <w:p>
+            <w:pPr>
+              <w:spacing w:after="0"/>
+              <w:jc w:val="left"/>
+            </w:pPr>
+            <w:r>
+              <w:rPr>
+                <w:rFonts w:ascii="Arial" w:hAnsi="Arial" w:eastAsia="Arial"/>
+                <w:b w:val="0"/>
+                <w:color w:val="111827"/>
+                <w:sz w:val="17"/>
+              </w:rPr>
+              <w:t>Память сериала</w:t>
+            </w:r>
+          </w:p>
+        </w:tc>
+        <w:tc>
+          <w:tcPr>
+            <w:tcW w:type="dxa" w:w="1440"/>
+            <w:vAlign w:val="center"/>
+            <w:tcMar>
+              <w:top w:w="80" w:type="dxa"/>
+              <w:start w:w="120" w:type="dxa"/>
+              <w:bottom w:w="80" w:type="dxa"/>
+              <w:end w:w="120" w:type="dxa"/>
+            </w:tcMar>
+          </w:tcPr>
+          <w:p>
+            <w:pPr>
+              <w:spacing w:after="0"/>
+              <w:jc w:val="left"/>
+            </w:pPr>
+            <w:r>
+              <w:rPr>
+                <w:rFonts w:ascii="Arial" w:hAnsi="Arial" w:eastAsia="Arial"/>
+                <w:b w:val="0"/>
+                <w:color w:val="111827"/>
+                <w:sz w:val="17"/>
+              </w:rPr>
+              <w:t>Лента прошлых эпизодов: что человек прожил, какие выборы сделал, какие темы повторяются.</w:t>
+            </w:r>
+          </w:p>
+        </w:tc>
+        <w:tc>
+          <w:tcPr>
+            <w:tcW w:type="dxa" w:w="2016"/>
+            <w:vAlign w:val="center"/>
+            <w:tcMar>
+              <w:top w:w="80" w:type="dxa"/>
+              <w:start w:w="120" w:type="dxa"/>
+              <w:bottom w:w="80" w:type="dxa"/>
+              <w:end w:w="120" w:type="dxa"/>
+            </w:tcMar>
+          </w:tcPr>
+          <w:p>
+            <w:pPr>
+              <w:spacing w:after="0"/>
+              <w:jc w:val="left"/>
+            </w:pPr>
+            <w:r>
+              <w:rPr>
+                <w:rFonts w:ascii="Arial" w:hAnsi="Arial" w:eastAsia="Arial"/>
+                <w:b w:val="0"/>
+                <w:color w:val="111827"/>
+                <w:sz w:val="17"/>
+              </w:rPr>
+              <w:t>АУРА показывает не статистику ради статистики, а личную историю изменения.</w:t>
+            </w:r>
+          </w:p>
+        </w:tc>
+        <w:tc>
+          <w:tcPr>
+            <w:tcW w:type="dxa" w:w="3456"/>
+            <w:vAlign w:val="center"/>
+            <w:tcMar>
+              <w:top w:w="80" w:type="dxa"/>
+              <w:start w:w="120" w:type="dxa"/>
+              <w:bottom w:w="80" w:type="dxa"/>
+              <w:end w:w="120" w:type="dxa"/>
+            </w:tcMar>
+          </w:tcPr>
+          <w:p>
+            <w:pPr>
+              <w:spacing w:after="0"/>
+              <w:jc w:val="left"/>
+            </w:pPr>
+            <w:r>
+              <w:rPr>
+                <w:rFonts w:ascii="Arial" w:hAnsi="Arial" w:eastAsia="Arial"/>
+                <w:b w:val="0"/>
+                <w:color w:val="111827"/>
+                <w:sz w:val="17"/>
+              </w:rPr>
+              <w:t>Если нет памяти, продукт не создает эмоциональной привязанности.</w:t>
+            </w:r>
+          </w:p>
+        </w:tc>
+      </w:tr>
+      <w:tr>
+        <w:tc>
+          <w:tcPr>
+            <w:tcW w:type="dxa" w:w="2448"/>
+            <w:vAlign w:val="center"/>
+            <w:tcMar>
+              <w:top w:w="80" w:type="dxa"/>
+              <w:start w:w="120" w:type="dxa"/>
+              <w:bottom w:w="80" w:type="dxa"/>
+              <w:end w:w="120" w:type="dxa"/>
+            </w:tcMar>
+            <w:shd w:fill="F8FAFC"/>
+          </w:tcPr>
+          <w:p>
+            <w:pPr>
+              <w:spacing w:after="0"/>
+              <w:jc w:val="left"/>
+            </w:pPr>
+            <w:r>
+              <w:rPr>
+                <w:rFonts w:ascii="Arial" w:hAnsi="Arial" w:eastAsia="Arial"/>
+                <w:b w:val="0"/>
+                <w:color w:val="111827"/>
+                <w:sz w:val="17"/>
+              </w:rPr>
+              <w:t>Следующая серия</w:t>
+            </w:r>
+          </w:p>
+        </w:tc>
+        <w:tc>
+          <w:tcPr>
+            <w:tcW w:type="dxa" w:w="1440"/>
+            <w:vAlign w:val="center"/>
+            <w:tcMar>
+              <w:top w:w="80" w:type="dxa"/>
+              <w:start w:w="120" w:type="dxa"/>
+              <w:bottom w:w="80" w:type="dxa"/>
+              <w:end w:w="120" w:type="dxa"/>
+            </w:tcMar>
+            <w:shd w:fill="F8FAFC"/>
+          </w:tcPr>
+          <w:p>
+            <w:pPr>
+              <w:spacing w:after="0"/>
+              <w:jc w:val="left"/>
+            </w:pPr>
+            <w:r>
+              <w:rPr>
+                <w:rFonts w:ascii="Arial" w:hAnsi="Arial" w:eastAsia="Arial"/>
+                <w:b w:val="0"/>
+                <w:color w:val="111827"/>
+                <w:sz w:val="17"/>
+              </w:rPr>
+              <w:t>Мягкое ожидание завтрашнего эпизода без наказания за пропуск.</w:t>
+            </w:r>
+          </w:p>
+        </w:tc>
+        <w:tc>
+          <w:tcPr>
+            <w:tcW w:type="dxa" w:w="2016"/>
+            <w:vAlign w:val="center"/>
+            <w:tcMar>
+              <w:top w:w="80" w:type="dxa"/>
+              <w:start w:w="120" w:type="dxa"/>
+              <w:bottom w:w="80" w:type="dxa"/>
+              <w:end w:w="120" w:type="dxa"/>
+            </w:tcMar>
+            <w:shd w:fill="F8FAFC"/>
+          </w:tcPr>
+          <w:p>
+            <w:pPr>
+              <w:spacing w:after="0"/>
+              <w:jc w:val="left"/>
+            </w:pPr>
+            <w:r>
+              <w:rPr>
+                <w:rFonts w:ascii="Arial" w:hAnsi="Arial" w:eastAsia="Arial"/>
+                <w:b w:val="0"/>
+                <w:color w:val="111827"/>
+                <w:sz w:val="17"/>
+              </w:rPr>
+              <w:t>Возврат звучит как “продолжим твою историю”, а не как “ты потеряешь streak”.</w:t>
+            </w:r>
+          </w:p>
+        </w:tc>
+        <w:tc>
+          <w:tcPr>
+            <w:tcW w:type="dxa" w:w="3456"/>
+            <w:vAlign w:val="center"/>
+            <w:tcMar>
+              <w:top w:w="80" w:type="dxa"/>
+              <w:start w:w="120" w:type="dxa"/>
+              <w:bottom w:w="80" w:type="dxa"/>
+              <w:end w:w="120" w:type="dxa"/>
+            </w:tcMar>
+            <w:shd w:fill="F8FAFC"/>
+          </w:tcPr>
+          <w:p>
+            <w:pPr>
+              <w:spacing w:after="0"/>
+              <w:jc w:val="left"/>
+            </w:pPr>
+            <w:r>
+              <w:rPr>
+                <w:rFonts w:ascii="Arial" w:hAnsi="Arial" w:eastAsia="Arial"/>
+                <w:b w:val="0"/>
+                <w:color w:val="111827"/>
+                <w:sz w:val="17"/>
+              </w:rPr>
+              <w:t>Если возврат строится только на давлении, продукт попадает в отвергаемый productivity-паттерн.</w:t>
+            </w:r>
+          </w:p>
+        </w:tc>
+      </w:tr>
+    </w:tbl>
+    <w:p/>
+    <w:p>
       <w:pPr>
         <w:pStyle w:val="Heading2"/>
       </w:pPr>
@@ -25490,7 +26305,7 @@
     </w:p>
     <w:p>
       <w:r>
-        <w:t>Чтобы идея стала понятной для презентации, ее можно разложить на несколько продуктовых концепций. Во всех вариантах стартовый вход может быть очень простым: дата рождения, имя, время или место рождения, текущий запрос дня, настроение и короткий личный контекст. Важно, что дата рождения здесь не должна продаваться как жесткое предсказание. Она работает как символический и персональный вход: человек чувствует “это про меня”, но ценность появляется только тогда, когда этот вход превращается в действие, reset и видимый avatar/progress.</w:t>
+        <w:t>Чтобы идея стала понятной для презентации, ее можно разложить не на список функций, а на несколько рабочих продуктовых концепций. Во всех вариантах стартовый вход может быть очень простым: дата рождения, имя, время или место рождения, текущий запрос дня, настроение и короткий личный контекст. Важно, что дата рождения здесь не должна продаваться как жесткое предсказание. Она работает как символический и персональный вход: человек чувствует “это про меня”, но ценность появляется только тогда, когда этот вход запускает эпизод, действие, reset и изменение avatar.</w:t>
       </w:r>
     </w:p>
     <w:tbl>
@@ -25682,7 +26497,7 @@
                 <w:color w:val="111827"/>
                 <w:sz w:val="16"/>
               </w:rPr>
-              <w:t>1. Daily Aura Code</w:t>
+              <w:t>1. Life Series / сериал о себе</w:t>
             </w:r>
           </w:p>
         </w:tc>
@@ -25709,7 +26524,7 @@
                 <w:color w:val="111827"/>
                 <w:sz w:val="16"/>
               </w:rPr>
-              <w:t>Дата рождения + короткий вопрос “что сегодня хочется изменить?”</w:t>
+              <w:t>Дата рождения + выбранная жизненная тема сезона.</w:t>
             </w:r>
           </w:p>
         </w:tc>
@@ -25736,7 +26551,7 @@
                 <w:color w:val="111827"/>
                 <w:sz w:val="16"/>
               </w:rPr>
-              <w:t>Персональный код дня: тема, риск дня, ресурс дня и одно маленькое действие.</w:t>
+              <w:t>Персональный сезон из 7-14 коротких эпизодов: каждый день раскрывает одну сцену жизни.</w:t>
             </w:r>
           </w:p>
         </w:tc>
@@ -25763,7 +26578,7 @@
                 <w:color w:val="111827"/>
                 <w:sz w:val="16"/>
               </w:rPr>
-              <w:t>Смысл дня превращается в действие; после выполнения avatar получает маленький визуальный слой.</w:t>
+              <w:t>Каждый эпизод дает смысл, действие, reset и изменение героя/avatar; история накапливается как сериал.</w:t>
             </w:r>
           </w:p>
         </w:tc>
@@ -25790,7 +26605,7 @@
                 <w:color w:val="111827"/>
                 <w:sz w:val="16"/>
               </w:rPr>
-              <w:t>Подходит как самый простой первый экран: быстро, лично, без тяжелого onboarding.</w:t>
+              <w:t>Это самая сильная удерживающая рамка: человек возвращается не за советом, а за продолжением своей истории.</w:t>
             </w:r>
           </w:p>
         </w:tc>
@@ -25876,7 +26691,7 @@
                 <w:color w:val="111827"/>
                 <w:sz w:val="16"/>
               </w:rPr>
-              <w:t>Образ будущей версии себя и карта качеств, которые человек постепенно “прокачивает”.</w:t>
+              <w:t>Главный герой сериала: будущая версия себя и карта качеств, которые человек постепенно проявляет.</w:t>
             </w:r>
           </w:p>
         </w:tc>
@@ -25904,7 +26719,7 @@
                 <w:color w:val="111827"/>
                 <w:sz w:val="16"/>
               </w:rPr>
-              <w:t>Каждое действие усиливает конкретное качество avatar: ясность, смелость, мягкость, дисциплина.</w:t>
+              <w:t>Каждое действие усиливает конкретную черту avatar: ясность, смелость, мягкость, дисциплина, открытость.</w:t>
             </w:r>
           </w:p>
         </w:tc>
@@ -25932,7 +26747,7 @@
                 <w:color w:val="111827"/>
                 <w:sz w:val="16"/>
               </w:rPr>
-              <w:t>Делает avatar центральной механикой, а не украшением профиля.</w:t>
+              <w:t>Делает avatar эмоциональным персонажем, а не украшением профиля.</w:t>
             </w:r>
           </w:p>
         </w:tc>
@@ -25961,7 +26776,7 @@
                 <w:color w:val="111827"/>
                 <w:sz w:val="16"/>
               </w:rPr>
-              <w:t>3. Ritual of the Day</w:t>
+              <w:t>3. Daily Aura Code</w:t>
             </w:r>
           </w:p>
         </w:tc>
@@ -25988,7 +26803,7 @@
                 <w:color w:val="111827"/>
                 <w:sz w:val="16"/>
               </w:rPr>
-              <w:t>Дата рождения + состояние сейчас: тревожно, устало, расфокусировано, пусто, вдохновленно.</w:t>
+              <w:t>Дата рождения + короткий вопрос “что сегодня хочется изменить?”</w:t>
             </w:r>
           </w:p>
         </w:tc>
@@ -26015,7 +26830,7 @@
                 <w:color w:val="111827"/>
                 <w:sz w:val="16"/>
               </w:rPr>
-              <w:t>Короткий ежедневный ритуал: смысловая подсказка, 30-60 секунд reset и действие на сегодня.</w:t>
+              <w:t>Персональный код дня: тема, риск дня, ресурс дня и одно маленькое действие.</w:t>
             </w:r>
           </w:p>
         </w:tc>
@@ -26042,7 +26857,7 @@
                 <w:color w:val="111827"/>
                 <w:sz w:val="16"/>
               </w:rPr>
-              <w:t>Reset снижает сопротивление, действие завершает ритуал, прогресс фиксируется без наказания за пропуск.</w:t>
+              <w:t>Код дня становится названием эпизода; после выполнения действия avatar получает новый след прожитого выбора.</w:t>
             </w:r>
           </w:p>
         </w:tc>
@@ -26069,7 +26884,7 @@
                 <w:color w:val="111827"/>
                 <w:sz w:val="16"/>
               </w:rPr>
-              <w:t>Связывает spiritual/wellness вход с практической ежедневной привычкой.</w:t>
+              <w:t>Подходит как самый простой daily-вход: быстро, лично, без тяжелого onboarding.</w:t>
             </w:r>
           </w:p>
         </w:tc>
@@ -26099,7 +26914,7 @@
                 <w:color w:val="111827"/>
                 <w:sz w:val="16"/>
               </w:rPr>
-              <w:t>4. Symbol to Action</w:t>
+              <w:t>4. Ritual of the Day</w:t>
             </w:r>
           </w:p>
         </w:tc>
@@ -26127,7 +26942,7 @@
                 <w:color w:val="111827"/>
                 <w:sz w:val="16"/>
               </w:rPr>
-              <w:t>Дата рождения + выбранный символ дня: архетип, стихия, карта, цвет, энергия, настроение.</w:t>
+              <w:t>Дата рождения + состояние сейчас: тревожно, устало, расфокусировано, пусто, вдохновленно.</w:t>
             </w:r>
           </w:p>
         </w:tc>
@@ -26155,7 +26970,7 @@
                 <w:color w:val="111827"/>
                 <w:sz w:val="16"/>
               </w:rPr>
-              <w:t>Символическая интерпретация без жестких обещаний и три варианта действия разной сложности.</w:t>
+              <w:t>Короткий ежедневный ритуал: смысловая подсказка, 30-60 секунд reset и действие на сегодня.</w:t>
             </w:r>
           </w:p>
         </w:tc>
@@ -26183,7 +26998,7 @@
                 <w:color w:val="111827"/>
                 <w:sz w:val="16"/>
               </w:rPr>
-              <w:t>Пользователь выбирает действие, делает его и видит, как символ дня становится частью avatar/progress.</w:t>
+              <w:t>Reset становится подготовкой к сцене действия, а не отдельной медитацией ради медитации.</w:t>
             </w:r>
           </w:p>
         </w:tc>
@@ -26211,7 +27026,7 @@
                 <w:color w:val="111827"/>
                 <w:sz w:val="16"/>
               </w:rPr>
-              <w:t>Использует интерес к astrology/esoterics, но выводит его из чтения в поведение.</w:t>
+              <w:t>Связывает spiritual/wellness вход с практической ежедневной привычкой.</w:t>
             </w:r>
           </w:p>
         </w:tc>
@@ -26240,7 +27055,7 @@
                 <w:color w:val="111827"/>
                 <w:sz w:val="16"/>
               </w:rPr>
-              <w:t>5. Inner Weather</w:t>
+              <w:t>5. Symbol to Action</w:t>
             </w:r>
           </w:p>
         </w:tc>
@@ -26267,7 +27082,7 @@
                 <w:color w:val="111827"/>
                 <w:sz w:val="16"/>
               </w:rPr>
-              <w:t>Дата рождения + быстрый чек-ин: энергия, напряжение, ясность, желание контакта.</w:t>
+              <w:t>Дата рождения + выбранный символ дня: архетип, стихия, карта, цвет, энергия, настроение.</w:t>
             </w:r>
           </w:p>
         </w:tc>
@@ -26294,7 +27109,7 @@
                 <w:color w:val="111827"/>
                 <w:sz w:val="16"/>
               </w:rPr>
-              <w:t>“Внутренняя погода” дня: что поддерживает, что может мешать, какой шаг будет самым мягким.</w:t>
+              <w:t>Символическая интерпретация без жестких обещаний и три варианта действия разной сложности.</w:t>
             </w:r>
           </w:p>
         </w:tc>
@@ -26321,7 +27136,7 @@
                 <w:color w:val="111827"/>
                 <w:sz w:val="16"/>
               </w:rPr>
-              <w:t>Продукт не говорит “кто ты навсегда”, а помогает прожить один день осознаннее и увидеть сдвиг.</w:t>
+              <w:t>Символ становится мотивом эпизода; действие доказывает, что это не просто чтение, а прожитая сцена.</w:t>
             </w:r>
           </w:p>
         </w:tc>
@@ -26348,7 +27163,7 @@
                 <w:color w:val="111827"/>
                 <w:sz w:val="16"/>
               </w:rPr>
-              <w:t>Снижает риск недоверия: это не диагноз и не судьба, а мягкая навигация по состоянию.</w:t>
+              <w:t>Использует интерес к astrology/esoterics, но выводит его из чтения в поведение.</w:t>
             </w:r>
           </w:p>
         </w:tc>
@@ -26378,7 +27193,7 @@
                 <w:color w:val="111827"/>
                 <w:sz w:val="16"/>
               </w:rPr>
-              <w:t>6. Compatibility With Myself</w:t>
+              <w:t>6. Inner Weather</w:t>
             </w:r>
           </w:p>
         </w:tc>
@@ -26406,7 +27221,7 @@
                 <w:color w:val="111827"/>
                 <w:sz w:val="16"/>
               </w:rPr>
-              <w:t>Дата рождения + конфликт дня: хочу одно, делаю другое; хочу начать, но откладываю.</w:t>
+              <w:t>Дата рождения + быстрый чек-ин: энергия, напряжение, ясность, желание контакта.</w:t>
             </w:r>
           </w:p>
         </w:tc>
@@ -26434,7 +27249,7 @@
                 <w:color w:val="111827"/>
                 <w:sz w:val="16"/>
               </w:rPr>
-              <w:t>Разбор внутреннего конфликта: какая часть хочет роста, какая защищается, какой шаг их примиряет.</w:t>
+              <w:t>“Внутренняя погода” дня: что поддерживает, что может мешать, какой шаг будет самым мягким.</w:t>
             </w:r>
           </w:p>
         </w:tc>
@@ -26462,7 +27277,7 @@
                 <w:color w:val="111827"/>
                 <w:sz w:val="16"/>
               </w:rPr>
-              <w:t>После действия avatar показывает не “уровень”, а согласованность: человек чуть ближе к себе.</w:t>
+              <w:t>Продукт не говорит “кто ты навсегда”, а помогает прожить один день осознаннее и увидеть сдвиг.</w:t>
             </w:r>
           </w:p>
         </w:tc>
@@ -26490,7 +27305,7 @@
                 <w:color w:val="111827"/>
                 <w:sz w:val="16"/>
               </w:rPr>
-              <w:t>Хорошо раскрывает эмоциональную глубину и может стать платной персональной механикой.</w:t>
+              <w:t>Снижает риск недоверия: это не диагноз и не судьба, а мягкая навигация по состоянию.</w:t>
             </w:r>
           </w:p>
         </w:tc>
@@ -26519,7 +27334,7 @@
                 <w:color w:val="111827"/>
                 <w:sz w:val="16"/>
               </w:rPr>
-              <w:t>7. Life Path Quests</w:t>
+              <w:t>7. Compatibility With Myself</w:t>
             </w:r>
           </w:p>
         </w:tc>
@@ -26546,7 +27361,7 @@
                 <w:color w:val="111827"/>
                 <w:sz w:val="16"/>
               </w:rPr>
-              <w:t>Дата рождения + выбранное направление: отношения, карьера, тело, дом, творчество, уверенность.</w:t>
+              <w:t>Дата рождения + конфликт дня: хочу одно, делаю другое; хочу начать, но откладываю.</w:t>
             </w:r>
           </w:p>
         </w:tc>
@@ -26573,7 +27388,7 @@
                 <w:color w:val="111827"/>
                 <w:sz w:val="16"/>
               </w:rPr>
-              <w:t>Мягкая серия микро-квестов на неделю, где каждый день связан с одной темой и одним действием.</w:t>
+              <w:t>Разбор внутреннего конфликта: какая часть хочет роста, какая защищается, какой шаг их примиряет.</w:t>
             </w:r>
           </w:p>
         </w:tc>
@@ -26600,7 +27415,7 @@
                 <w:color w:val="111827"/>
                 <w:sz w:val="16"/>
               </w:rPr>
-              <w:t>Неделя собирается в историю: avatar меняется не от streak, а от накопленных доказательств действий.</w:t>
+              <w:t>Эпизод строится вокруг внутреннего конфликта; после действия avatar показывает не “уровень”, а согласованность.</w:t>
             </w:r>
           </w:p>
         </w:tc>
@@ -26627,7 +27442,7 @@
                 <w:color w:val="111827"/>
                 <w:sz w:val="16"/>
               </w:rPr>
-              <w:t>Дает возврат без давления: человек возвращается ради истории изменения, а не ради наказания.</w:t>
+              <w:t>Хорошо раскрывает эмоциональную глубину и может стать платной персональной механикой.</w:t>
             </w:r>
           </w:p>
         </w:tc>
@@ -26636,12 +27451,17 @@
     <w:p/>
     <w:p>
       <w:r>
-        <w:t>Из этих концепций самая сильная базовая версия для MVP выглядит как связка Daily Aura Code + Future Self Avatar + Ritual of the Day. Человек вводит дату рождения и короткий запрос дня, получает персональный смысловой вход, выбирает одно действие, проходит короткий reset и видит, как avatar меняется из-за выполненного шага. Остальные концепции можно рассматривать как расширения: Symbol to Action усиливает spiritual/astrology слой, Inner Weather делает продукт безопаснее и мягче, Compatibility With Myself добавляет эмоциональную глубину, а Life Path Quests дает недельную историю и возврат.</w:t>
+        <w:t>Из этих концепций самая сильная базовая версия для MVP выглядит как связка Life Series + Future Self Avatar + Daily Aura Code + Ritual of the Day. Человек вводит дату рождения и короткий запрос дня, попадает в “серию” своей жизни, получает персональный смысловой вход, выбирает одно действие, проходит короткий reset и видит, как avatar меняется из-за выполненного шага. Остальные концепции можно рассматривать как расширения: Symbol to Action усиливает spiritual/astrology слой, Inner Weather делает продукт безопаснее и мягче, Compatibility With Myself добавляет эмоциональную глубину.</w:t>
       </w:r>
     </w:p>
     <w:p>
       <w:r>
         <w:t>Главная граница для всех концепций: АУРА не должна обещать судьбу, диагноз или точное предсказание по дате рождения. Рабочая формулировка честнее: дата рождения и символический профиль помогают создать личный язык входа, но продукт доказывает ценность только тогда, когда пользователь совершает маленькое действие и видит понятный сдвиг.</w:t>
+      </w:r>
+    </w:p>
+    <w:p>
+      <w:r>
+        <w:t>Пример первой пользовательской сессии: человек вводит дату рождения и пишет “я хочу перестать откладывать важный разговор”. АУРА не отвечает предсказанием. Она открывает эпизод дня: “серия про честность без давления”. Пользователь получает короткий reset, выбирает действие “написать одно честное сообщение без требования ответа”, отмечает выполнение, а avatar получает новую черту - не абстрактный XP, а след эпизода: больше ясности, света, прямоты. На следующий день приложение возвращает не наказанием за пропуск, а продолжением: “вчера ты сделал сцену честности; сегодня можно закрепить ее одним спокойным шагом”.</w:t>
       </w:r>
     </w:p>
     <w:tbl>

</xml_diff>